<commit_message>
docs(manuscript): add O3 One Health validation cohorts
Run MERIDIAN unmodified on two independent public ONT cohorts and record
the results as the O3 (independent-validation) resolution:
- Egyptian hospital wastewater vs tap water (PRJNA1266479, n=20)
- East Atlantic Flyway wetlands, impacted vs natural (PRJEB96272, n=24)

Adds a §3 portability paragraph, Table S1 (four-cohort summary), and a
Conclusion clause. Both cohorts completed 15/15 stages with biologically
coherent signals and graceful degradation on empty/single-group domains;
framed as portability/robustness, not output-for-output correctness.
Refreshes the tracked-changes docx (320 ins / 292 del vs v0.1.0).

Co-Authored-By: Claude Opus 4.8 <noreply@anthropic.com>
Claude-Session: https://claude.ai/code/session_011iYU9ZmVnXfPXhgvAmJ24Q
</commit_message>
<xml_diff>
--- a/docs/manuscript/applications_note_merged_tracked.docx
+++ b/docs/manuscript/applications_note_merged_tracked.docx
@@ -32,12 +32,12 @@
       <w:r>
         <w:t xml:space="preserve">Julio C. Ortega Cambara&lt;sup&gt;1&lt;/sup&gt;, Piotr </w:t>
       </w:r>
-      <w:del w:id="10001" w:author="Revision merge (HM+PL)" w:date="2026-09-03T14:58:09Z">
+      <w:del w:id="10001" w:author="Revision merge (HM+PL)" w:date="2026-09-07T13:07:41Z">
         <w:r>
           <w:delText xml:space="preserve">Cuber&lt;sup&gt;4&lt;/sup&gt;,</w:delText>
         </w:r>
       </w:del>
-      <w:ins w:id="10002" w:author="Revision merge (HM+PL)" w:date="2026-09-03T14:58:09Z">
+      <w:ins w:id="10002" w:author="Revision merge (HM+PL)" w:date="2026-09-07T13:07:41Z">
         <w:r>
           <w:t xml:space="preserve">Cuber&lt;sup&gt;2&lt;/sup&gt;,</w:t>
         </w:r>
@@ -45,7 +45,7 @@
       <w:r>
         <w:t xml:space="preserve"> Pedro Humberto Lebre&lt;sup&gt;1&lt;/sup&gt;, </w:t>
       </w:r>
-      <w:del w:id="10003" w:author="Revision merge (HM+PL)" w:date="2026-09-03T14:58:09Z">
+      <w:del w:id="10003" w:author="Revision merge (HM+PL)" w:date="2026-09-07T13:07:41Z">
         <w:r>
           <w:delText xml:space="preserve">Raju Misra&lt;sup&gt;2&lt;/sup&gt;, Timothy D. McHugh&lt;sup&gt;3&lt;/sup&gt;, Sylvia Rofael&lt;sup&gt;3&lt;/sup&gt;, David Lowe&lt;sup&gt;3&lt;/sup&gt;, </w:delText>
         </w:r>
@@ -53,7 +53,7 @@
       <w:r>
         <w:t xml:space="preserve">Hermine </w:t>
       </w:r>
-      <w:ins w:id="10004" w:author="Revision merge (HM+PL)" w:date="2026-09-03T14:58:09Z">
+      <w:ins w:id="10004" w:author="Revision merge (HM+PL)" w:date="2026-09-07T13:07:41Z">
         <w:r>
           <w:t xml:space="preserve">V </w:t>
         </w:r>
@@ -66,12 +66,12 @@
       <w:pPr>
         <w:spacing w:after="120"/>
       </w:pPr>
-      <w:del w:id="10005" w:author="Revision merge (HM+PL)" w:date="2026-09-03T14:58:09Z">
+      <w:del w:id="10005" w:author="Revision merge (HM+PL)" w:date="2026-09-07T13:07:41Z">
         <w:r>
           <w:delText xml:space="preserve">&lt;sup&gt;1&lt;/sup&gt;School</w:delText>
         </w:r>
       </w:del>
-      <w:ins w:id="10006" w:author="Revision merge (HM+PL)" w:date="2026-09-03T14:58:09Z">
+      <w:ins w:id="10006" w:author="Revision merge (HM+PL)" w:date="2026-09-07T13:07:41Z">
         <w:r>
           <w:t xml:space="preserve">&lt;sup&gt;1&lt;/sup&gt;Centre for Innovation in Genomics and Microbiome Sciences, School</w:t>
         </w:r>
@@ -79,12 +79,12 @@
       <w:r>
         <w:t xml:space="preserve"> of </w:t>
       </w:r>
-      <w:del w:id="10007" w:author="Revision merge (HM+PL)" w:date="2026-09-03T14:58:09Z">
+      <w:del w:id="10007" w:author="Revision merge (HM+PL)" w:date="2026-09-07T13:07:41Z">
         <w:r>
           <w:delText xml:space="preserve">Biomedical</w:delText>
         </w:r>
       </w:del>
-      <w:ins w:id="10008" w:author="Revision merge (HM+PL)" w:date="2026-09-03T14:58:09Z">
+      <w:ins w:id="10008" w:author="Revision merge (HM+PL)" w:date="2026-09-07T13:07:41Z">
         <w:r>
           <w:t xml:space="preserve">Medicine</w:t>
         </w:r>
@@ -92,12 +92,12 @@
       <w:r>
         <w:t xml:space="preserve"> </w:t>
       </w:r>
-      <w:del w:id="10009" w:author="Revision merge (HM+PL)" w:date="2026-09-03T14:58:09Z">
+      <w:del w:id="10009" w:author="Revision merge (HM+PL)" w:date="2026-09-07T13:07:41Z">
         <w:r>
           <w:delText xml:space="preserve">Science,</w:delText>
         </w:r>
       </w:del>
-      <w:ins w:id="10010" w:author="Revision merge (HM+PL)" w:date="2026-09-03T14:58:09Z">
+      <w:ins w:id="10010" w:author="Revision merge (HM+PL)" w:date="2026-09-07T13:07:41Z">
         <w:r>
           <w:t xml:space="preserve">and Bioscience,</w:t>
         </w:r>
@@ -105,12 +105,12 @@
       <w:r>
         <w:t xml:space="preserve"> University of West London, London, United Kingdom </w:t>
       </w:r>
-      <w:del w:id="10011" w:author="Revision merge (HM+PL)" w:date="2026-09-03T14:58:09Z">
+      <w:del w:id="10011" w:author="Revision merge (HM+PL)" w:date="2026-09-07T13:07:41Z">
         <w:r>
           <w:delText xml:space="preserve">&lt;sup&gt;2&lt;/sup&gt;UK Health Security Agency, London, United Kingdom &lt;sup&gt;3&lt;/sup&gt;Centre for Clinical Microbiology, University College London, London, United Kingdom &lt;sup&gt;4&lt;/sup&gt;Natural</w:delText>
         </w:r>
       </w:del>
-      <w:ins w:id="10012" w:author="Revision merge (HM+PL)" w:date="2026-09-03T14:58:09Z">
+      <w:ins w:id="10012" w:author="Revision merge (HM+PL)" w:date="2026-09-07T13:07:41Z">
         <w:r>
           <w:t xml:space="preserve">&lt;sup&gt;2&lt;/sup&gt;Natural</w:t>
         </w:r>
@@ -161,12 +161,12 @@
       <w:pPr>
         <w:spacing w:after="120"/>
       </w:pPr>
-      <w:del w:id="10013" w:author="Revision merge (HM+PL)" w:date="2026-09-03T14:58:09Z">
+      <w:del w:id="10013" w:author="Revision merge (HM+PL)" w:date="2026-09-07T13:07:41Z">
         <w:r>
           <w:delText xml:space="preserve">**Motivation.**</w:delText>
         </w:r>
       </w:del>
-      <w:ins w:id="10014" w:author="Revision merge (HM+PL)" w:date="2026-09-03T14:58:09Z">
+      <w:ins w:id="10014" w:author="Revision merge (HM+PL)" w:date="2026-09-07T13:07:41Z">
         <w:r>
           <w:t xml:space="preserve">**Background:**</w:t>
         </w:r>
@@ -174,12 +174,12 @@
       <w:r>
         <w:t xml:space="preserve"> Long-read shotgun metagenomics studies are </w:t>
       </w:r>
-      <w:del w:id="10015" w:author="Revision merge (HM+PL)" w:date="2026-09-03T14:58:09Z">
+      <w:del w:id="10015" w:author="Revision merge (HM+PL)" w:date="2026-09-07T13:07:41Z">
         <w:r>
           <w:delText xml:space="preserve">typically</w:delText>
         </w:r>
       </w:del>
-      <w:ins w:id="10016" w:author="Revision merge (HM+PL)" w:date="2026-09-03T14:58:09Z">
+      <w:ins w:id="10016" w:author="Revision merge (HM+PL)" w:date="2026-09-07T13:07:41Z">
         <w:r>
           <w:t xml:space="preserve">often</w:t>
         </w:r>
@@ -187,12 +187,12 @@
       <w:r>
         <w:t xml:space="preserve"> analysed </w:t>
       </w:r>
-      <w:del w:id="10017" w:author="Revision merge (HM+PL)" w:date="2026-09-03T14:58:09Z">
+      <w:del w:id="10017" w:author="Revision merge (HM+PL)" w:date="2026-09-07T13:07:41Z">
         <w:r>
           <w:delText xml:space="preserve">by</w:delText>
         </w:r>
       </w:del>
-      <w:ins w:id="10018" w:author="Revision merge (HM+PL)" w:date="2026-09-03T14:58:09Z">
+      <w:ins w:id="10018" w:author="Revision merge (HM+PL)" w:date="2026-09-07T13:07:41Z">
         <w:r>
           <w:t xml:space="preserve">using</w:t>
         </w:r>
@@ -200,12 +200,12 @@
       <w:r>
         <w:t xml:space="preserve"> </w:t>
       </w:r>
-      <w:del w:id="10019" w:author="Revision merge (HM+PL)" w:date="2026-09-03T14:58:09Z">
+      <w:del w:id="10019" w:author="Revision merge (HM+PL)" w:date="2026-09-07T13:07:41Z">
         <w:r>
           <w:delText xml:space="preserve">hand-editing</w:delText>
         </w:r>
       </w:del>
-      <w:ins w:id="10020" w:author="Revision merge (HM+PL)" w:date="2026-09-03T14:58:09Z">
+      <w:ins w:id="10020" w:author="Revision merge (HM+PL)" w:date="2026-09-07T13:07:41Z">
         <w:r>
           <w:t xml:space="preserve">project-specific</w:t>
         </w:r>
@@ -213,12 +213,12 @@
       <w:r>
         <w:t xml:space="preserve"> </w:t>
       </w:r>
-      <w:del w:id="10021" w:author="Revision merge (HM+PL)" w:date="2026-09-03T14:58:09Z">
+      <w:del w:id="10021" w:author="Revision merge (HM+PL)" w:date="2026-09-07T13:07:41Z">
         <w:r>
           <w:delText xml:space="preserve">dozens</w:delText>
         </w:r>
       </w:del>
-      <w:ins w:id="10022" w:author="Revision merge (HM+PL)" w:date="2026-09-03T14:58:09Z">
+      <w:ins w:id="10022" w:author="Revision merge (HM+PL)" w:date="2026-09-07T13:07:41Z">
         <w:r>
           <w:t xml:space="preserve">collections</w:t>
         </w:r>
@@ -226,7 +226,7 @@
       <w:r>
         <w:t xml:space="preserve"> of </w:t>
       </w:r>
-      <w:ins w:id="10023" w:author="Revision merge (HM+PL)" w:date="2026-09-03T14:58:09Z">
+      <w:ins w:id="10023" w:author="Revision merge (HM+PL)" w:date="2026-09-07T13:07:41Z">
         <w:r>
           <w:t xml:space="preserve">manually edited </w:t>
         </w:r>
@@ -234,12 +234,12 @@
       <w:r>
         <w:t xml:space="preserve">R </w:t>
       </w:r>
-      <w:del w:id="10024" w:author="Revision merge (HM+PL)" w:date="2026-09-03T14:58:09Z">
+      <w:del w:id="10024" w:author="Revision merge (HM+PL)" w:date="2026-09-07T13:07:41Z">
         <w:r>
           <w:delText xml:space="preserve">scripts</w:delText>
         </w:r>
       </w:del>
-      <w:ins w:id="10025" w:author="Revision merge (HM+PL)" w:date="2026-09-03T14:58:09Z">
+      <w:ins w:id="10025" w:author="Revision merge (HM+PL)" w:date="2026-09-07T13:07:41Z">
         <w:r>
           <w:t xml:space="preserve">scripts,</w:t>
         </w:r>
@@ -247,12 +247,12 @@
       <w:r>
         <w:t xml:space="preserve"> </w:t>
       </w:r>
-      <w:del w:id="10026" w:author="Revision merge (HM+PL)" w:date="2026-09-03T14:58:09Z">
+      <w:del w:id="10026" w:author="Revision merge (HM+PL)" w:date="2026-09-07T13:07:41Z">
         <w:r>
           <w:delText xml:space="preserve">per</w:delText>
         </w:r>
       </w:del>
-      <w:ins w:id="10027" w:author="Revision merge (HM+PL)" w:date="2026-09-03T14:58:09Z">
+      <w:ins w:id="10027" w:author="Revision merge (HM+PL)" w:date="2026-09-07T13:07:41Z">
         <w:r>
           <w:t xml:space="preserve">requiring</w:t>
         </w:r>
@@ -260,12 +260,12 @@
       <w:r>
         <w:t xml:space="preserve"> </w:t>
       </w:r>
-      <w:del w:id="10028" w:author="Revision merge (HM+PL)" w:date="2026-09-03T14:58:09Z">
+      <w:del w:id="10028" w:author="Revision merge (HM+PL)" w:date="2026-09-07T13:07:41Z">
         <w:r>
           <w:delText xml:space="preserve">project</w:delText>
         </w:r>
       </w:del>
-      <w:ins w:id="10029" w:author="Revision merge (HM+PL)" w:date="2026-09-03T14:58:09Z">
+      <w:ins w:id="10029" w:author="Revision merge (HM+PL)" w:date="2026-09-07T13:07:41Z">
         <w:r>
           <w:t xml:space="preserve">repeated</w:t>
         </w:r>
@@ -273,12 +273,12 @@
       <w:r>
         <w:t xml:space="preserve"> </w:t>
       </w:r>
-      <w:del w:id="10030" w:author="Revision merge (HM+PL)" w:date="2026-09-03T14:58:09Z">
+      <w:del w:id="10030" w:author="Revision merge (HM+PL)" w:date="2026-09-07T13:07:41Z">
         <w:r>
           <w:delText xml:space="preserve">—</w:delText>
         </w:r>
       </w:del>
-      <w:ins w:id="10031" w:author="Revision merge (HM+PL)" w:date="2026-09-03T14:58:09Z">
+      <w:ins w:id="10031" w:author="Revision merge (HM+PL)" w:date="2026-09-07T13:07:41Z">
         <w:r>
           <w:t xml:space="preserve">modifications</w:t>
         </w:r>
@@ -286,12 +286,12 @@
       <w:r>
         <w:t xml:space="preserve"> </w:t>
       </w:r>
-      <w:del w:id="10032" w:author="Revision merge (HM+PL)" w:date="2026-09-03T14:58:09Z">
+      <w:del w:id="10032" w:author="Revision merge (HM+PL)" w:date="2026-09-07T13:07:41Z">
         <w:r>
           <w:delText xml:space="preserve">pasting</w:delText>
         </w:r>
       </w:del>
-      <w:ins w:id="10033" w:author="Revision merge (HM+PL)" w:date="2026-09-03T14:58:09Z">
+      <w:ins w:id="10033" w:author="Revision merge (HM+PL)" w:date="2026-09-07T13:07:41Z">
         <w:r>
           <w:t xml:space="preserve">of</w:t>
         </w:r>
@@ -299,12 +299,12 @@
       <w:r>
         <w:t xml:space="preserve"> sample identifiers, </w:t>
       </w:r>
-      <w:del w:id="10034" w:author="Revision merge (HM+PL)" w:date="2026-09-03T14:58:09Z">
+      <w:del w:id="10034" w:author="Revision merge (HM+PL)" w:date="2026-09-07T13:07:41Z">
         <w:r>
           <w:delText xml:space="preserve">patching</w:delText>
         </w:r>
       </w:del>
-      <w:ins w:id="10035" w:author="Revision merge (HM+PL)" w:date="2026-09-03T14:58:09Z">
+      <w:ins w:id="10035" w:author="Revision merge (HM+PL)" w:date="2026-09-07T13:07:41Z">
         <w:r>
           <w:t xml:space="preserve">taxonomic</w:t>
         </w:r>
@@ -312,12 +312,12 @@
       <w:r>
         <w:t xml:space="preserve"> </w:t>
       </w:r>
-      <w:del w:id="10036" w:author="Revision merge (HM+PL)" w:date="2026-09-03T14:58:09Z">
+      <w:del w:id="10036" w:author="Revision merge (HM+PL)" w:date="2026-09-07T13:07:41Z">
         <w:r>
           <w:delText xml:space="preserve">taxonomy strings</w:delText>
         </w:r>
       </w:del>
-      <w:ins w:id="10037" w:author="Revision merge (HM+PL)" w:date="2026-09-03T14:58:09Z">
+      <w:ins w:id="10037" w:author="Revision merge (HM+PL)" w:date="2026-09-07T13:07:41Z">
         <w:r>
           <w:t xml:space="preserve">annotations</w:t>
         </w:r>
@@ -325,12 +325,12 @@
       <w:r>
         <w:t xml:space="preserve"> and </w:t>
       </w:r>
-      <w:del w:id="10038" w:author="Revision merge (HM+PL)" w:date="2026-09-03T14:58:09Z">
+      <w:del w:id="10038" w:author="Revision merge (HM+PL)" w:date="2026-09-07T13:07:41Z">
         <w:r>
           <w:delText xml:space="preserve">copying</w:delText>
         </w:r>
       </w:del>
-      <w:ins w:id="10039" w:author="Revision merge (HM+PL)" w:date="2026-09-03T14:58:09Z">
+      <w:ins w:id="10039" w:author="Revision merge (HM+PL)" w:date="2026-09-07T13:07:41Z">
         <w:r>
           <w:t xml:space="preserve">analysis</w:t>
         </w:r>
@@ -338,12 +338,12 @@
       <w:r>
         <w:t xml:space="preserve"> </w:t>
       </w:r>
-      <w:del w:id="10040" w:author="Revision merge (HM+PL)" w:date="2026-09-03T14:58:09Z">
+      <w:del w:id="10040" w:author="Revision merge (HM+PL)" w:date="2026-09-07T13:07:41Z">
         <w:r>
           <w:delText xml:space="preserve">chunks</w:delText>
         </w:r>
       </w:del>
-      <w:ins w:id="10041" w:author="Revision merge (HM+PL)" w:date="2026-09-03T14:58:09Z">
+      <w:ins w:id="10041" w:author="Revision merge (HM+PL)" w:date="2026-09-07T13:07:41Z">
         <w:r>
           <w:t xml:space="preserve">parameters,</w:t>
         </w:r>
@@ -351,12 +351,12 @@
       <w:r>
         <w:t xml:space="preserve"> </w:t>
       </w:r>
-      <w:del w:id="10042" w:author="Revision merge (HM+PL)" w:date="2026-09-03T14:58:09Z">
+      <w:del w:id="10042" w:author="Revision merge (HM+PL)" w:date="2026-09-07T13:07:41Z">
         <w:r>
           <w:delText xml:space="preserve">between</w:delText>
         </w:r>
       </w:del>
-      <w:ins w:id="10043" w:author="Revision merge (HM+PL)" w:date="2026-09-03T14:58:09Z">
+      <w:ins w:id="10043" w:author="Revision merge (HM+PL)" w:date="2026-09-07T13:07:41Z">
         <w:r>
           <w:t xml:space="preserve">or</w:t>
         </w:r>
@@ -364,12 +364,12 @@
       <w:r>
         <w:t xml:space="preserve"> </w:t>
       </w:r>
-      <w:del w:id="10044" w:author="Revision merge (HM+PL)" w:date="2026-09-03T14:58:09Z">
+      <w:del w:id="10044" w:author="Revision merge (HM+PL)" w:date="2026-09-07T13:07:41Z">
         <w:r>
           <w:delText xml:space="preserve">studies.</w:delText>
         </w:r>
       </w:del>
-      <w:ins w:id="10045" w:author="Revision merge (HM+PL)" w:date="2026-09-03T14:58:09Z">
+      <w:ins w:id="10045" w:author="Revision merge (HM+PL)" w:date="2026-09-07T13:07:41Z">
         <w:r>
           <w:t xml:space="preserve">else rely on resource-heavy pipelines that require access to high-performance computing (HPC) infrastructure.</w:t>
         </w:r>
@@ -377,12 +377,12 @@
       <w:r>
         <w:t xml:space="preserve"> Existing R workflows </w:t>
       </w:r>
-      <w:del w:id="10046" w:author="Revision merge (HM+PL)" w:date="2026-09-03T14:58:09Z">
+      <w:del w:id="10046" w:author="Revision merge (HM+PL)" w:date="2026-09-07T13:07:41Z">
         <w:r>
           <w:delText xml:space="preserve">largely</w:delText>
         </w:r>
       </w:del>
-      <w:ins w:id="10047" w:author="Revision merge (HM+PL)" w:date="2026-09-03T14:58:09Z">
+      <w:ins w:id="10047" w:author="Revision merge (HM+PL)" w:date="2026-09-07T13:07:41Z">
         <w:r>
           <w:t xml:space="preserve">predominantly</w:t>
         </w:r>
@@ -390,12 +390,12 @@
       <w:r>
         <w:t xml:space="preserve"> </w:t>
       </w:r>
-      <w:del w:id="10048" w:author="Revision merge (HM+PL)" w:date="2026-09-03T14:58:09Z">
+      <w:del w:id="10048" w:author="Revision merge (HM+PL)" w:date="2026-09-07T13:07:41Z">
         <w:r>
           <w:delText xml:space="preserve">target</w:delText>
         </w:r>
       </w:del>
-      <w:ins w:id="10049" w:author="Revision merge (HM+PL)" w:date="2026-09-03T14:58:09Z">
+      <w:ins w:id="10049" w:author="Revision merge (HM+PL)" w:date="2026-09-07T13:07:41Z">
         <w:r>
           <w:t xml:space="preserve">focus on</w:t>
         </w:r>
@@ -403,12 +403,12 @@
       <w:r>
         <w:t xml:space="preserve"> short-read amplicon data or </w:t>
       </w:r>
-      <w:del w:id="10050" w:author="Revision merge (HM+PL)" w:date="2026-09-03T14:58:09Z">
+      <w:del w:id="10050" w:author="Revision merge (HM+PL)" w:date="2026-09-07T13:07:41Z">
         <w:r>
           <w:delText xml:space="preserve">a</w:delText>
         </w:r>
       </w:del>
-      <w:ins w:id="10051" w:author="Revision merge (HM+PL)" w:date="2026-09-03T14:58:09Z">
+      <w:ins w:id="10051" w:author="Revision merge (HM+PL)" w:date="2026-09-07T13:07:41Z">
         <w:r>
           <w:t xml:space="preserve">isolated</w:t>
         </w:r>
@@ -416,12 +416,12 @@
       <w:r>
         <w:t xml:space="preserve"> </w:t>
       </w:r>
-      <w:del w:id="10052" w:author="Revision merge (HM+PL)" w:date="2026-09-03T14:58:09Z">
+      <w:del w:id="10052" w:author="Revision merge (HM+PL)" w:date="2026-09-07T13:07:41Z">
         <w:r>
           <w:delText xml:space="preserve">single</w:delText>
         </w:r>
       </w:del>
-      <w:ins w:id="10053" w:author="Revision merge (HM+PL)" w:date="2026-09-03T14:58:09Z">
+      <w:ins w:id="10053" w:author="Revision merge (HM+PL)" w:date="2026-09-07T13:07:41Z">
         <w:r>
           <w:t xml:space="preserve">analytical</w:t>
         </w:r>
@@ -429,12 +429,12 @@
       <w:r>
         <w:t xml:space="preserve"> </w:t>
       </w:r>
-      <w:del w:id="10054" w:author="Revision merge (HM+PL)" w:date="2026-09-03T14:58:09Z">
+      <w:del w:id="10054" w:author="Revision merge (HM+PL)" w:date="2026-09-07T13:07:41Z">
         <w:r>
           <w:delText xml:space="preserve">analysis</w:delText>
         </w:r>
       </w:del>
-      <w:ins w:id="10055" w:author="Revision merge (HM+PL)" w:date="2026-09-03T14:58:09Z">
+      <w:ins w:id="10055" w:author="Revision merge (HM+PL)" w:date="2026-09-07T13:07:41Z">
         <w:r>
           <w:t xml:space="preserve">tasks,</w:t>
         </w:r>
@@ -442,12 +442,12 @@
       <w:r>
         <w:t xml:space="preserve"> </w:t>
       </w:r>
-      <w:del w:id="10056" w:author="Revision merge (HM+PL)" w:date="2026-09-03T14:58:09Z">
+      <w:del w:id="10056" w:author="Revision merge (HM+PL)" w:date="2026-09-07T13:07:41Z">
         <w:r>
           <w:delText xml:space="preserve">(e.g.</w:delText>
         </w:r>
       </w:del>
-      <w:ins w:id="10057" w:author="Revision merge (HM+PL)" w:date="2026-09-03T14:58:09Z">
+      <w:ins w:id="10057" w:author="Revision merge (HM+PL)" w:date="2026-09-07T13:07:41Z">
         <w:r>
           <w:t xml:space="preserve">such as</w:t>
         </w:r>
@@ -455,12 +455,12 @@
       <w:r>
         <w:t xml:space="preserve"> resistome </w:t>
       </w:r>
-      <w:del w:id="10058" w:author="Revision merge (HM+PL)" w:date="2026-09-03T14:58:09Z">
+      <w:del w:id="10058" w:author="Revision merge (HM+PL)" w:date="2026-09-07T13:07:41Z">
         <w:r>
           <w:delText xml:space="preserve">risk scoring),</w:delText>
         </w:r>
       </w:del>
-      <w:ins w:id="10059" w:author="Revision merge (HM+PL)" w:date="2026-09-03T14:58:09Z">
+      <w:ins w:id="10059" w:author="Revision merge (HM+PL)" w:date="2026-09-07T13:07:41Z">
         <w:r>
           <w:t xml:space="preserve">profiling,</w:t>
         </w:r>
@@ -468,7 +468,7 @@
       <w:r>
         <w:t xml:space="preserve"> leaving</w:t>
       </w:r>
-      <w:ins w:id="10060" w:author="Revision merge (HM+PL)" w:date="2026-09-03T14:58:09Z">
+      <w:ins w:id="10060" w:author="Revision merge (HM+PL)" w:date="2026-09-07T13:07:41Z">
         <w:r>
           <w:t xml:space="preserve"> a gap in integrated, reproducible and sustainable solutions for</w:t>
         </w:r>
@@ -476,12 +476,12 @@
       <w:r>
         <w:t xml:space="preserve"> long-read shotgun </w:t>
       </w:r>
-      <w:del w:id="10061" w:author="Revision merge (HM+PL)" w:date="2026-09-03T14:58:09Z">
+      <w:del w:id="10061" w:author="Revision merge (HM+PL)" w:date="2026-09-07T13:07:41Z">
         <w:r>
           <w:delText xml:space="preserve">studies</w:delText>
         </w:r>
       </w:del>
-      <w:ins w:id="10062" w:author="Revision merge (HM+PL)" w:date="2026-09-03T14:58:09Z">
+      <w:ins w:id="10062" w:author="Revision merge (HM+PL)" w:date="2026-09-07T13:07:41Z">
         <w:r>
           <w:t xml:space="preserve">metagenomics.</w:t>
         </w:r>
@@ -489,12 +489,12 @@
       <w:r>
         <w:t xml:space="preserve"> </w:t>
       </w:r>
-      <w:del w:id="10063" w:author="Revision merge (HM+PL)" w:date="2026-09-03T14:58:09Z">
+      <w:del w:id="10063" w:author="Revision merge (HM+PL)" w:date="2026-09-07T13:07:41Z">
         <w:r>
           <w:delText xml:space="preserve">without</w:delText>
         </w:r>
       </w:del>
-      <w:ins w:id="10064" w:author="Revision merge (HM+PL)" w:date="2026-09-03T14:58:09Z">
+      <w:ins w:id="10064" w:author="Revision merge (HM+PL)" w:date="2026-09-07T13:07:41Z">
         <w:r>
           <w:t xml:space="preserve">Consequently,</w:t>
         </w:r>
@@ -502,12 +502,12 @@
       <w:r>
         <w:t xml:space="preserve"> </w:t>
       </w:r>
-      <w:del w:id="10065" w:author="Revision merge (HM+PL)" w:date="2026-09-03T14:58:09Z">
+      <w:del w:id="10065" w:author="Revision merge (HM+PL)" w:date="2026-09-07T13:07:41Z">
         <w:r>
           <w:delText xml:space="preserve">an</w:delText>
         </w:r>
       </w:del>
-      <w:ins w:id="10066" w:author="Revision merge (HM+PL)" w:date="2026-09-03T14:58:09Z">
+      <w:ins w:id="10066" w:author="Revision merge (HM+PL)" w:date="2026-09-07T13:07:41Z">
         <w:r>
           <w:t xml:space="preserve">researchers</w:t>
         </w:r>
@@ -515,12 +515,12 @@
       <w:r>
         <w:t xml:space="preserve"> </w:t>
       </w:r>
-      <w:del w:id="10067" w:author="Revision merge (HM+PL)" w:date="2026-09-03T14:58:09Z">
+      <w:del w:id="10067" w:author="Revision merge (HM+PL)" w:date="2026-09-07T13:07:41Z">
         <w:r>
           <w:delText xml:space="preserve">integrated,</w:delText>
         </w:r>
       </w:del>
-      <w:ins w:id="10068" w:author="Revision merge (HM+PL)" w:date="2026-09-03T14:58:09Z">
+      <w:ins w:id="10068" w:author="Revision merge (HM+PL)" w:date="2026-09-07T13:07:41Z">
         <w:r>
           <w:t xml:space="preserve">frequently</w:t>
         </w:r>
@@ -528,12 +528,12 @@
       <w:r>
         <w:t xml:space="preserve"> </w:t>
       </w:r>
-      <w:del w:id="10069" w:author="Revision merge (HM+PL)" w:date="2026-09-03T14:58:09Z">
+      <w:del w:id="10069" w:author="Revision merge (HM+PL)" w:date="2026-09-07T13:07:41Z">
         <w:r>
           <w:delText xml:space="preserve">configuration-driven</w:delText>
         </w:r>
       </w:del>
-      <w:ins w:id="10070" w:author="Revision merge (HM+PL)" w:date="2026-09-03T14:58:09Z">
+      <w:ins w:id="10070" w:author="Revision merge (HM+PL)" w:date="2026-09-07T13:07:41Z">
         <w:r>
           <w:t xml:space="preserve">rely</w:t>
         </w:r>
@@ -541,12 +541,12 @@
       <w:r>
         <w:t xml:space="preserve"> </w:t>
       </w:r>
-      <w:del w:id="10071" w:author="Revision merge (HM+PL)" w:date="2026-09-03T14:58:09Z">
+      <w:del w:id="10071" w:author="Revision merge (HM+PL)" w:date="2026-09-07T13:07:41Z">
         <w:r>
           <w:delText xml:space="preserve">option.</w:delText>
         </w:r>
       </w:del>
-      <w:ins w:id="10072" w:author="Revision merge (HM+PL)" w:date="2026-09-03T14:58:09Z">
+      <w:ins w:id="10072" w:author="Revision merge (HM+PL)" w:date="2026-09-07T13:07:41Z">
         <w:r>
           <w:t xml:space="preserve">on ad hoc scripting approaches that limit scalability, standardisation and reproducibility for efficient cross-study comparison.</w:t>
         </w:r>
@@ -556,12 +556,12 @@
       <w:pPr>
         <w:spacing w:after="120"/>
       </w:pPr>
-      <w:del w:id="10073" w:author="Revision merge (HM+PL)" w:date="2026-09-03T14:58:09Z">
+      <w:del w:id="10073" w:author="Revision merge (HM+PL)" w:date="2026-09-07T13:07:41Z">
         <w:r>
           <w:delText xml:space="preserve">**Results.**</w:delText>
         </w:r>
       </w:del>
-      <w:ins w:id="10074" w:author="Revision merge (HM+PL)" w:date="2026-09-03T14:58:09Z">
+      <w:ins w:id="10074" w:author="Revision merge (HM+PL)" w:date="2026-09-07T13:07:41Z">
         <w:r>
           <w:t xml:space="preserve">**Results:**</w:t>
         </w:r>
@@ -569,12 +569,12 @@
       <w:r>
         <w:t xml:space="preserve"> We present **MERIDIAN** (*Metagenomic Evaluation of Resistance, Identity &amp; Diversity through Integrated Analysis of Nanopore sequencing*), a modular R workflow </w:t>
       </w:r>
-      <w:del w:id="10075" w:author="Revision merge (HM+PL)" w:date="2026-09-03T14:58:09Z">
+      <w:del w:id="10075" w:author="Revision merge (HM+PL)" w:date="2026-09-07T13:07:41Z">
         <w:r>
           <w:delText xml:space="preserve">that</w:delText>
         </w:r>
       </w:del>
-      <w:ins w:id="10076" w:author="Revision merge (HM+PL)" w:date="2026-09-03T14:58:09Z">
+      <w:ins w:id="10076" w:author="Revision merge (HM+PL)" w:date="2026-09-07T13:07:41Z">
         <w:r>
           <w:t xml:space="preserve">designed</w:t>
         </w:r>
@@ -582,12 +582,12 @@
       <w:r>
         <w:t xml:space="preserve"> </w:t>
       </w:r>
-      <w:del w:id="10077" w:author="Revision merge (HM+PL)" w:date="2026-09-03T14:58:09Z">
+      <w:del w:id="10077" w:author="Revision merge (HM+PL)" w:date="2026-09-07T13:07:41Z">
         <w:r>
           <w:delText xml:space="preserve">consumes</w:delText>
         </w:r>
       </w:del>
-      <w:ins w:id="10078" w:author="Revision merge (HM+PL)" w:date="2026-09-03T14:58:09Z">
+      <w:ins w:id="10078" w:author="Revision merge (HM+PL)" w:date="2026-09-07T13:07:41Z">
         <w:r>
           <w:t xml:space="preserve">to standardise and automate downstream analysis of long-read metagenomic sequencing datasets. By consolidating outputs from multiple</w:t>
         </w:r>
@@ -595,12 +595,12 @@
       <w:r>
         <w:t xml:space="preserve"> bioinformatics </w:t>
       </w:r>
-      <w:del w:id="10079" w:author="Revision merge (HM+PL)" w:date="2026-09-03T14:58:09Z">
+      <w:del w:id="10079" w:author="Revision merge (HM+PL)" w:date="2026-09-07T13:07:41Z">
         <w:r>
           <w:delText xml:space="preserve">tools</w:delText>
         </w:r>
       </w:del>
-      <w:ins w:id="10080" w:author="Revision merge (HM+PL)" w:date="2026-09-03T14:58:09Z">
+      <w:ins w:id="10080" w:author="Revision merge (HM+PL)" w:date="2026-09-07T13:07:41Z">
         <w:r>
           <w:t xml:space="preserve">tools,</w:t>
         </w:r>
@@ -608,12 +608,12 @@
       <w:r>
         <w:t xml:space="preserve"> </w:t>
       </w:r>
-      <w:del w:id="10081" w:author="Revision merge (HM+PL)" w:date="2026-09-03T14:58:09Z">
+      <w:del w:id="10081" w:author="Revision merge (HM+PL)" w:date="2026-09-07T13:07:41Z">
         <w:r>
           <w:delText xml:space="preserve">outputs</w:delText>
         </w:r>
       </w:del>
-      <w:ins w:id="10082" w:author="Revision merge (HM+PL)" w:date="2026-09-03T14:58:09Z">
+      <w:ins w:id="10082" w:author="Revision merge (HM+PL)" w:date="2026-09-07T13:07:41Z">
         <w:r>
           <w:t xml:space="preserve">MERIDIAN</w:t>
         </w:r>
@@ -621,12 +621,12 @@
       <w:r>
         <w:t xml:space="preserve"> </w:t>
       </w:r>
-      <w:del w:id="10083" w:author="Revision merge (HM+PL)" w:date="2026-09-03T14:58:09Z">
+      <w:del w:id="10083" w:author="Revision merge (HM+PL)" w:date="2026-09-07T13:07:41Z">
         <w:r>
           <w:delText xml:space="preserve">and produces</w:delText>
         </w:r>
       </w:del>
-      <w:ins w:id="10084" w:author="Revision merge (HM+PL)" w:date="2026-09-03T14:58:09Z">
+      <w:ins w:id="10084" w:author="Revision merge (HM+PL)" w:date="2026-09-07T13:07:41Z">
         <w:r>
           <w:t xml:space="preserve">delivers</w:t>
         </w:r>
@@ -634,12 +634,12 @@
       <w:r>
         <w:t xml:space="preserve"> a </w:t>
       </w:r>
-      <w:del w:id="10085" w:author="Revision merge (HM+PL)" w:date="2026-09-03T14:58:09Z">
+      <w:del w:id="10085" w:author="Revision merge (HM+PL)" w:date="2026-09-07T13:07:41Z">
         <w:r>
           <w:delText xml:space="preserve">single</w:delText>
         </w:r>
       </w:del>
-      <w:ins w:id="10086" w:author="Revision merge (HM+PL)" w:date="2026-09-03T14:58:09Z">
+      <w:ins w:id="10086" w:author="Revision merge (HM+PL)" w:date="2026-09-07T13:07:41Z">
         <w:r>
           <w:t xml:space="preserve">comprehensive</w:t>
         </w:r>
@@ -647,7 +647,7 @@
       <w:r>
         <w:t xml:space="preserve"> Quarto HTML dashboard, publication-ready </w:t>
       </w:r>
-      <w:del w:id="10087" w:author="Revision merge (HM+PL)" w:date="2026-09-03T14:58:09Z">
+      <w:del w:id="10087" w:author="Revision merge (HM+PL)" w:date="2026-09-07T13:07:41Z">
         <w:r>
           <w:delText xml:space="preserve">composite </w:delText>
         </w:r>
@@ -655,7 +655,7 @@
       <w:r>
         <w:t xml:space="preserve">figures and </w:t>
       </w:r>
-      <w:del w:id="10088" w:author="Revision merge (HM+PL)" w:date="2026-09-03T14:58:09Z">
+      <w:del w:id="10088" w:author="Revision merge (HM+PL)" w:date="2026-09-07T13:07:41Z">
         <w:r>
           <w:delText xml:space="preserve">a </w:delText>
         </w:r>
@@ -663,12 +663,12 @@
       <w:r>
         <w:t xml:space="preserve">supplementary </w:t>
       </w:r>
-      <w:del w:id="10089" w:author="Revision merge (HM+PL)" w:date="2026-09-03T14:58:09Z">
+      <w:del w:id="10089" w:author="Revision merge (HM+PL)" w:date="2026-09-07T13:07:41Z">
         <w:r>
           <w:delText xml:space="preserve">tables</w:delText>
         </w:r>
       </w:del>
-      <w:ins w:id="10090" w:author="Revision merge (HM+PL)" w:date="2026-09-03T14:58:09Z">
+      <w:ins w:id="10090" w:author="Revision merge (HM+PL)" w:date="2026-09-07T13:07:41Z">
         <w:r>
           <w:t xml:space="preserve">result</w:t>
         </w:r>
@@ -676,12 +676,12 @@
       <w:r>
         <w:t xml:space="preserve"> </w:t>
       </w:r>
-      <w:del w:id="10091" w:author="Revision merge (HM+PL)" w:date="2026-09-03T14:58:09Z">
+      <w:del w:id="10091" w:author="Revision merge (HM+PL)" w:date="2026-09-07T13:07:41Z">
         <w:r>
           <w:delText xml:space="preserve">workbook.</w:delText>
         </w:r>
       </w:del>
-      <w:ins w:id="10092" w:author="Revision merge (HM+PL)" w:date="2026-09-03T14:58:09Z">
+      <w:ins w:id="10092" w:author="Revision merge (HM+PL)" w:date="2026-09-07T13:07:41Z">
         <w:r>
           <w:t xml:space="preserve">tables.</w:t>
         </w:r>
@@ -689,12 +689,12 @@
       <w:r>
         <w:t xml:space="preserve"> The workflow </w:t>
       </w:r>
-      <w:del w:id="10093" w:author="Revision merge (HM+PL)" w:date="2026-09-03T14:58:09Z">
+      <w:del w:id="10093" w:author="Revision merge (HM+PL)" w:date="2026-09-07T13:07:41Z">
         <w:r>
           <w:delText xml:space="preserve">covers</w:delText>
         </w:r>
       </w:del>
-      <w:ins w:id="10094" w:author="Revision merge (HM+PL)" w:date="2026-09-03T14:58:09Z">
+      <w:ins w:id="10094" w:author="Revision merge (HM+PL)" w:date="2026-09-07T13:07:41Z">
         <w:r>
           <w:t xml:space="preserve">supports end-to-end metagenomic characterisation, encompassing</w:t>
         </w:r>
@@ -702,12 +702,12 @@
       <w:r>
         <w:t xml:space="preserve"> decontamination, TPM normalisation, </w:t>
       </w:r>
-      <w:del w:id="10095" w:author="Revision merge (HM+PL)" w:date="2026-09-03T14:58:09Z">
+      <w:del w:id="10095" w:author="Revision merge (HM+PL)" w:date="2026-09-07T13:07:41Z">
         <w:r>
           <w:delText xml:space="preserve">taxonomy,</w:delText>
         </w:r>
       </w:del>
-      <w:ins w:id="10096" w:author="Revision merge (HM+PL)" w:date="2026-09-03T14:58:09Z">
+      <w:ins w:id="10096" w:author="Revision merge (HM+PL)" w:date="2026-09-07T13:07:41Z">
         <w:r>
           <w:t xml:space="preserve">taxonomic</w:t>
         </w:r>
@@ -715,12 +715,12 @@
       <w:r>
         <w:t xml:space="preserve"> </w:t>
       </w:r>
-      <w:del w:id="10097" w:author="Revision merge (HM+PL)" w:date="2026-09-03T14:58:09Z">
+      <w:del w:id="10097" w:author="Revision merge (HM+PL)" w:date="2026-09-07T13:07:41Z">
         <w:r>
           <w:delText xml:space="preserve">alpha/beta</w:delText>
         </w:r>
       </w:del>
-      <w:ins w:id="10098" w:author="Revision merge (HM+PL)" w:date="2026-09-03T14:58:09Z">
+      <w:ins w:id="10098" w:author="Revision merge (HM+PL)" w:date="2026-09-07T13:07:41Z">
         <w:r>
           <w:t xml:space="preserve">profiling, alpha and beta</w:t>
         </w:r>
@@ -728,7 +728,7 @@
       <w:r>
         <w:t xml:space="preserve"> diversity</w:t>
       </w:r>
-      <w:ins w:id="10099" w:author="Revision merge (HM+PL)" w:date="2026-09-03T14:58:09Z">
+      <w:ins w:id="10099" w:author="Revision merge (HM+PL)" w:date="2026-09-07T13:07:41Z">
         <w:r>
           <w:t xml:space="preserve"> analysis</w:t>
         </w:r>
@@ -736,12 +736,12 @@
       <w:r>
         <w:t xml:space="preserve"> with PERMANOVA, two-level ALDEx2 differential </w:t>
       </w:r>
-      <w:del w:id="10100" w:author="Revision merge (HM+PL)" w:date="2026-09-03T14:58:09Z">
+      <w:del w:id="10100" w:author="Revision merge (HM+PL)" w:date="2026-09-07T13:07:41Z">
         <w:r>
           <w:delText xml:space="preserve">abundance,</w:delText>
         </w:r>
       </w:del>
-      <w:ins w:id="10101" w:author="Revision merge (HM+PL)" w:date="2026-09-03T14:58:09Z">
+      <w:ins w:id="10101" w:author="Revision merge (HM+PL)" w:date="2026-09-07T13:07:41Z">
         <w:r>
           <w:t xml:space="preserve">abundance</w:t>
         </w:r>
@@ -749,12 +749,12 @@
       <w:r>
         <w:t xml:space="preserve"> </w:t>
       </w:r>
-      <w:del w:id="10102" w:author="Revision merge (HM+PL)" w:date="2026-09-03T14:58:09Z">
+      <w:del w:id="10102" w:author="Revision merge (HM+PL)" w:date="2026-09-07T13:07:41Z">
         <w:r>
           <w:delText xml:space="preserve">resistome, virulome,</w:delText>
         </w:r>
       </w:del>
-      <w:ins w:id="10103" w:author="Revision merge (HM+PL)" w:date="2026-09-03T14:58:09Z">
+      <w:ins w:id="10103" w:author="Revision merge (HM+PL)" w:date="2026-09-07T13:07:41Z">
         <w:r>
           <w:t xml:space="preserve">testing,</w:t>
         </w:r>
@@ -762,12 +762,12 @@
       <w:r>
         <w:t xml:space="preserve"> and </w:t>
       </w:r>
-      <w:del w:id="10104" w:author="Revision merge (HM+PL)" w:date="2026-09-03T14:58:09Z">
+      <w:del w:id="10104" w:author="Revision merge (HM+PL)" w:date="2026-09-07T13:07:41Z">
         <w:r>
           <w:delText xml:space="preserve">mobilome</w:delText>
         </w:r>
       </w:del>
-      <w:ins w:id="10105" w:author="Revision merge (HM+PL)" w:date="2026-09-03T14:58:09Z">
+      <w:ins w:id="10105" w:author="Revision merge (HM+PL)" w:date="2026-09-07T13:07:41Z">
         <w:r>
           <w:t xml:space="preserve">functional</w:t>
         </w:r>
@@ -775,12 +775,12 @@
       <w:r>
         <w:t xml:space="preserve"> </w:t>
       </w:r>
-      <w:del w:id="10106" w:author="Revision merge (HM+PL)" w:date="2026-09-03T14:58:09Z">
+      <w:del w:id="10106" w:author="Revision merge (HM+PL)" w:date="2026-09-07T13:07:41Z">
         <w:r>
           <w:delText xml:space="preserve">profiling,</w:delText>
         </w:r>
       </w:del>
-      <w:ins w:id="10107" w:author="Revision merge (HM+PL)" w:date="2026-09-03T14:58:09Z">
+      <w:ins w:id="10107" w:author="Revision merge (HM+PL)" w:date="2026-09-07T13:07:41Z">
         <w:r>
           <w:t xml:space="preserve">profiling of antimicrobial resistance (AMR), virulence</w:t>
         </w:r>
@@ -788,7 +788,7 @@
       <w:r>
         <w:t xml:space="preserve"> and</w:t>
       </w:r>
-      <w:ins w:id="10108" w:author="Revision merge (HM+PL)" w:date="2026-09-03T14:58:09Z">
+      <w:ins w:id="10108" w:author="Revision merge (HM+PL)" w:date="2026-09-07T13:07:41Z">
         <w:r>
           <w:t xml:space="preserve"> mobile genetic element repertoires. In addition, MERIDIAN infers</w:t>
         </w:r>
@@ -796,12 +796,12 @@
       <w:r>
         <w:t xml:space="preserve"> a tripartite sample × taxon × gene </w:t>
       </w:r>
-      <w:del w:id="10109" w:author="Revision merge (HM+PL)" w:date="2026-09-03T14:58:09Z">
+      <w:del w:id="10109" w:author="Revision merge (HM+PL)" w:date="2026-09-07T13:07:41Z">
         <w:r>
           <w:delText xml:space="preserve">network</w:delText>
         </w:r>
       </w:del>
-      <w:ins w:id="10110" w:author="Revision merge (HM+PL)" w:date="2026-09-03T14:58:09Z">
+      <w:ins w:id="10110" w:author="Revision merge (HM+PL)" w:date="2026-09-07T13:07:41Z">
         <w:r>
           <w:t xml:space="preserve">network,</w:t>
         </w:r>
@@ -809,12 +809,12 @@
       <w:r>
         <w:t xml:space="preserve"> </w:t>
       </w:r>
-      <w:del w:id="10111" w:author="Revision merge (HM+PL)" w:date="2026-09-03T14:58:09Z">
+      <w:del w:id="10111" w:author="Revision merge (HM+PL)" w:date="2026-09-07T13:07:41Z">
         <w:r>
           <w:delText xml:space="preserve">reconstruction.</w:delText>
         </w:r>
       </w:del>
-      <w:ins w:id="10112" w:author="Revision merge (HM+PL)" w:date="2026-09-03T14:58:09Z">
+      <w:ins w:id="10112" w:author="Revision merge (HM+PL)" w:date="2026-09-07T13:07:41Z">
         <w:r>
           <w:t xml:space="preserve">enabling</w:t>
         </w:r>
@@ -822,12 +822,12 @@
       <w:r>
         <w:t xml:space="preserve"> </w:t>
       </w:r>
-      <w:del w:id="10113" w:author="Revision merge (HM+PL)" w:date="2026-09-03T14:58:09Z">
+      <w:del w:id="10113" w:author="Revision merge (HM+PL)" w:date="2026-09-07T13:07:41Z">
         <w:r>
           <w:delText xml:space="preserve">A</w:delText>
         </w:r>
       </w:del>
-      <w:ins w:id="10114" w:author="Revision merge (HM+PL)" w:date="2026-09-03T14:58:09Z">
+      <w:ins w:id="10114" w:author="Revision merge (HM+PL)" w:date="2026-09-07T13:07:41Z">
         <w:r>
           <w:t xml:space="preserve">integrated</w:t>
         </w:r>
@@ -835,12 +835,12 @@
       <w:r>
         <w:t xml:space="preserve"> </w:t>
       </w:r>
-      <w:del w:id="10115" w:author="Revision merge (HM+PL)" w:date="2026-09-03T14:58:09Z">
+      <w:del w:id="10115" w:author="Revision merge (HM+PL)" w:date="2026-09-07T13:07:41Z">
         <w:r>
           <w:delText xml:space="preserve">study</w:delText>
         </w:r>
       </w:del>
-      <w:ins w:id="10116" w:author="Revision merge (HM+PL)" w:date="2026-09-03T14:58:09Z">
+      <w:ins w:id="10116" w:author="Revision merge (HM+PL)" w:date="2026-09-07T13:07:41Z">
         <w:r>
           <w:t xml:space="preserve">interrogation of taxonomic composition and functional gene distributions. Workflow execution</w:t>
         </w:r>
@@ -848,12 +848,12 @@
       <w:r>
         <w:t xml:space="preserve"> is </w:t>
       </w:r>
-      <w:del w:id="10117" w:author="Revision merge (HM+PL)" w:date="2026-09-03T14:58:09Z">
+      <w:del w:id="10117" w:author="Revision merge (HM+PL)" w:date="2026-09-07T13:07:41Z">
         <w:r>
           <w:delText xml:space="preserve">parameterised</w:delText>
         </w:r>
       </w:del>
-      <w:ins w:id="10118" w:author="Revision merge (HM+PL)" w:date="2026-09-03T14:58:09Z">
+      <w:ins w:id="10118" w:author="Revision merge (HM+PL)" w:date="2026-09-07T13:07:41Z">
         <w:r>
           <w:t xml:space="preserve">controlled</w:t>
         </w:r>
@@ -861,12 +861,12 @@
       <w:r>
         <w:t xml:space="preserve"> </w:t>
       </w:r>
-      <w:del w:id="10119" w:author="Revision merge (HM+PL)" w:date="2026-09-03T14:58:09Z">
+      <w:del w:id="10119" w:author="Revision merge (HM+PL)" w:date="2026-09-07T13:07:41Z">
         <w:r>
           <w:delText xml:space="preserve">by</w:delText>
         </w:r>
       </w:del>
-      <w:ins w:id="10120" w:author="Revision merge (HM+PL)" w:date="2026-09-03T14:58:09Z">
+      <w:ins w:id="10120" w:author="Revision merge (HM+PL)" w:date="2026-09-07T13:07:41Z">
         <w:r>
           <w:t xml:space="preserve">through</w:t>
         </w:r>
@@ -874,12 +874,12 @@
       <w:r>
         <w:t xml:space="preserve"> a single YAML </w:t>
       </w:r>
-      <w:del w:id="10121" w:author="Revision merge (HM+PL)" w:date="2026-09-03T14:58:09Z">
+      <w:del w:id="10121" w:author="Revision merge (HM+PL)" w:date="2026-09-07T13:07:41Z">
         <w:r>
           <w:delText xml:space="preserve">file;</w:delText>
         </w:r>
       </w:del>
-      <w:ins w:id="10122" w:author="Revision merge (HM+PL)" w:date="2026-09-03T14:58:09Z">
+      <w:ins w:id="10122" w:author="Revision merge (HM+PL)" w:date="2026-09-07T13:07:41Z">
         <w:r>
           <w:t xml:space="preserve">configuration</w:t>
         </w:r>
@@ -887,12 +887,12 @@
       <w:r>
         <w:t xml:space="preserve"> </w:t>
       </w:r>
-      <w:del w:id="10123" w:author="Revision merge (HM+PL)" w:date="2026-09-03T14:58:09Z">
+      <w:del w:id="10123" w:author="Revision merge (HM+PL)" w:date="2026-09-07T13:07:41Z">
         <w:r>
           <w:delText xml:space="preserve">module</w:delText>
         </w:r>
       </w:del>
-      <w:ins w:id="10124" w:author="Revision merge (HM+PL)" w:date="2026-09-03T14:58:09Z">
+      <w:ins w:id="10124" w:author="Revision merge (HM+PL)" w:date="2026-09-07T13:07:41Z">
         <w:r>
           <w:t xml:space="preserve">file,</w:t>
         </w:r>
@@ -900,12 +900,12 @@
       <w:r>
         <w:t xml:space="preserve"> </w:t>
       </w:r>
-      <w:del w:id="10125" w:author="Revision merge (HM+PL)" w:date="2026-09-03T14:58:09Z">
+      <w:del w:id="10125" w:author="Revision merge (HM+PL)" w:date="2026-09-07T13:07:41Z">
         <w:r>
           <w:delText xml:space="preserve">code</w:delText>
         </w:r>
       </w:del>
-      <w:ins w:id="10126" w:author="Revision merge (HM+PL)" w:date="2026-09-03T14:58:09Z">
+      <w:ins w:id="10126" w:author="Revision merge (HM+PL)" w:date="2026-09-07T13:07:41Z">
         <w:r>
           <w:t xml:space="preserve">ensuring</w:t>
         </w:r>
@@ -913,12 +913,12 @@
       <w:r>
         <w:t xml:space="preserve"> </w:t>
       </w:r>
-      <w:del w:id="10127" w:author="Revision merge (HM+PL)" w:date="2026-09-03T14:58:09Z">
+      <w:del w:id="10127" w:author="Revision merge (HM+PL)" w:date="2026-09-07T13:07:41Z">
         <w:r>
           <w:delText xml:space="preserve">is</w:delText>
         </w:r>
       </w:del>
-      <w:ins w:id="10128" w:author="Revision merge (HM+PL)" w:date="2026-09-03T14:58:09Z">
+      <w:ins w:id="10128" w:author="Revision merge (HM+PL)" w:date="2026-09-07T13:07:41Z">
         <w:r>
           <w:t xml:space="preserve">reproducible</w:t>
         </w:r>
@@ -926,12 +926,12 @@
       <w:r>
         <w:t xml:space="preserve"> </w:t>
       </w:r>
-      <w:del w:id="10129" w:author="Revision merge (HM+PL)" w:date="2026-09-03T14:58:09Z">
+      <w:del w:id="10129" w:author="Revision merge (HM+PL)" w:date="2026-09-07T13:07:41Z">
         <w:r>
           <w:delText xml:space="preserve">not</w:delText>
         </w:r>
       </w:del>
-      <w:ins w:id="10130" w:author="Revision merge (HM+PL)" w:date="2026-09-03T14:58:09Z">
+      <w:ins w:id="10130" w:author="Revision merge (HM+PL)" w:date="2026-09-07T13:07:41Z">
         <w:r>
           <w:t xml:space="preserve">execution</w:t>
         </w:r>
@@ -939,12 +939,12 @@
       <w:r>
         <w:t xml:space="preserve"> </w:t>
       </w:r>
-      <w:del w:id="10131" w:author="Revision merge (HM+PL)" w:date="2026-09-03T14:58:09Z">
+      <w:del w:id="10131" w:author="Revision merge (HM+PL)" w:date="2026-09-07T13:07:41Z">
         <w:r>
           <w:delText xml:space="preserve">edited</w:delText>
         </w:r>
       </w:del>
-      <w:ins w:id="10132" w:author="Revision merge (HM+PL)" w:date="2026-09-03T14:58:09Z">
+      <w:ins w:id="10132" w:author="Revision merge (HM+PL)" w:date="2026-09-07T13:07:41Z">
         <w:r>
           <w:t xml:space="preserve">without</w:t>
         </w:r>
@@ -952,12 +952,12 @@
       <w:r>
         <w:t xml:space="preserve"> </w:t>
       </w:r>
-      <w:del w:id="10133" w:author="Revision merge (HM+PL)" w:date="2026-09-03T14:58:09Z">
+      <w:del w:id="10133" w:author="Revision merge (HM+PL)" w:date="2026-09-07T13:07:41Z">
         <w:r>
           <w:delText xml:space="preserve">per</w:delText>
         </w:r>
       </w:del>
-      <w:ins w:id="10134" w:author="Revision merge (HM+PL)" w:date="2026-09-03T14:58:09Z">
+      <w:ins w:id="10134" w:author="Revision merge (HM+PL)" w:date="2026-09-07T13:07:41Z">
         <w:r>
           <w:t xml:space="preserve">modification</w:t>
         </w:r>
@@ -965,12 +965,12 @@
       <w:r>
         <w:t xml:space="preserve"> </w:t>
       </w:r>
-      <w:del w:id="10135" w:author="Revision merge (HM+PL)" w:date="2026-09-03T14:58:09Z">
+      <w:del w:id="10135" w:author="Revision merge (HM+PL)" w:date="2026-09-07T13:07:41Z">
         <w:r>
           <w:delText xml:space="preserve">project,</w:delText>
         </w:r>
       </w:del>
-      <w:ins w:id="10136" w:author="Revision merge (HM+PL)" w:date="2026-09-03T14:58:09Z">
+      <w:ins w:id="10136" w:author="Revision merge (HM+PL)" w:date="2026-09-07T13:07:41Z">
         <w:r>
           <w:t xml:space="preserve">of</w:t>
         </w:r>
@@ -978,12 +978,12 @@
       <w:r>
         <w:t xml:space="preserve"> </w:t>
       </w:r>
-      <w:del w:id="10137" w:author="Revision merge (HM+PL)" w:date="2026-09-03T14:58:09Z">
+      <w:del w:id="10137" w:author="Revision merge (HM+PL)" w:date="2026-09-07T13:07:41Z">
         <w:r>
           <w:delText xml:space="preserve">and</w:delText>
         </w:r>
       </w:del>
-      <w:ins w:id="10138" w:author="Revision merge (HM+PL)" w:date="2026-09-03T14:58:09Z">
+      <w:ins w:id="10138" w:author="Revision merge (HM+PL)" w:date="2026-09-07T13:07:41Z">
         <w:r>
           <w:t xml:space="preserve">source</w:t>
         </w:r>
@@ -991,12 +991,12 @@
       <w:r>
         <w:t xml:space="preserve"> </w:t>
       </w:r>
-      <w:del w:id="10139" w:author="Revision merge (HM+PL)" w:date="2026-09-03T14:58:09Z">
+      <w:del w:id="10139" w:author="Revision merge (HM+PL)" w:date="2026-09-07T13:07:41Z">
         <w:r>
           <w:delText xml:space="preserve">every</w:delText>
         </w:r>
       </w:del>
-      <w:ins w:id="10140" w:author="Revision merge (HM+PL)" w:date="2026-09-03T14:58:09Z">
+      <w:ins w:id="10140" w:author="Revision merge (HM+PL)" w:date="2026-09-07T13:07:41Z">
         <w:r>
           <w:t xml:space="preserve">code.</w:t>
         </w:r>
@@ -1004,12 +1004,12 @@
       <w:r>
         <w:t xml:space="preserve"> </w:t>
       </w:r>
-      <w:del w:id="10141" w:author="Revision merge (HM+PL)" w:date="2026-09-03T14:58:09Z">
+      <w:del w:id="10141" w:author="Revision merge (HM+PL)" w:date="2026-09-07T13:07:41Z">
         <w:r>
           <w:delText xml:space="preserve">run</w:delText>
         </w:r>
       </w:del>
-      <w:ins w:id="10142" w:author="Revision merge (HM+PL)" w:date="2026-09-03T14:58:09Z">
+      <w:ins w:id="10142" w:author="Revision merge (HM+PL)" w:date="2026-09-07T13:07:41Z">
         <w:r>
           <w:t xml:space="preserve">Each</w:t>
         </w:r>
@@ -1017,12 +1017,12 @@
       <w:r>
         <w:t xml:space="preserve"> </w:t>
       </w:r>
-      <w:del w:id="10143" w:author="Revision merge (HM+PL)" w:date="2026-09-03T14:58:09Z">
+      <w:del w:id="10143" w:author="Revision merge (HM+PL)" w:date="2026-09-07T13:07:41Z">
         <w:r>
           <w:delText xml:space="preserve">emits</w:delText>
         </w:r>
       </w:del>
-      <w:ins w:id="10144" w:author="Revision merge (HM+PL)" w:date="2026-09-03T14:58:09Z">
+      <w:ins w:id="10144" w:author="Revision merge (HM+PL)" w:date="2026-09-07T13:07:41Z">
         <w:r>
           <w:t xml:space="preserve">analysis automatically generates</w:t>
         </w:r>
@@ -1030,12 +1030,12 @@
       <w:r>
         <w:t xml:space="preserve"> a `manifest.json` artefact </w:t>
       </w:r>
-      <w:del w:id="10145" w:author="Revision merge (HM+PL)" w:date="2026-09-03T14:58:09Z">
+      <w:del w:id="10145" w:author="Revision merge (HM+PL)" w:date="2026-09-07T13:07:41Z">
         <w:r>
           <w:delText xml:space="preserve">catalogue</w:delText>
         </w:r>
       </w:del>
-      <w:ins w:id="10146" w:author="Revision merge (HM+PL)" w:date="2026-09-03T14:58:09Z">
+      <w:ins w:id="10146" w:author="Revision merge (HM+PL)" w:date="2026-09-07T13:07:41Z">
         <w:r>
           <w:t xml:space="preserve">catalogue,</w:t>
         </w:r>
@@ -1043,12 +1043,12 @@
       <w:r>
         <w:t xml:space="preserve"> </w:t>
       </w:r>
-      <w:del w:id="10147" w:author="Revision merge (HM+PL)" w:date="2026-09-03T14:58:09Z">
+      <w:del w:id="10147" w:author="Revision merge (HM+PL)" w:date="2026-09-07T13:07:41Z">
         <w:r>
           <w:delText xml:space="preserve">for</w:delText>
         </w:r>
       </w:del>
-      <w:ins w:id="10148" w:author="Revision merge (HM+PL)" w:date="2026-09-03T14:58:09Z">
+      <w:ins w:id="10148" w:author="Revision merge (HM+PL)" w:date="2026-09-07T13:07:41Z">
         <w:r>
           <w:t xml:space="preserve">thereby supporting reproducibility and</w:t>
         </w:r>
@@ -1056,7 +1056,7 @@
       <w:r>
         <w:t xml:space="preserve"> downstream </w:t>
       </w:r>
-      <w:ins w:id="10149" w:author="Revision merge (HM+PL)" w:date="2026-09-03T14:58:09Z">
+      <w:ins w:id="10149" w:author="Revision merge (HM+PL)" w:date="2026-09-07T13:07:41Z">
         <w:r>
           <w:t xml:space="preserve">computational </w:t>
         </w:r>
@@ -1072,7 +1072,7 @@
       <w:r>
         <w:t xml:space="preserve">**Availability and Implementation.** </w:t>
       </w:r>
-      <w:ins w:id="10150" w:author="Revision merge (HM+PL)" w:date="2026-09-03T14:58:09Z">
+      <w:ins w:id="10150" w:author="Revision merge (HM+PL)" w:date="2026-09-07T13:07:41Z">
         <w:r>
           <w:t xml:space="preserve">MERIDIAN is implemented in R and distributed under the MIT licence. </w:t>
         </w:r>
@@ -1080,7 +1080,7 @@
       <w:r>
         <w:t xml:space="preserve">Source</w:t>
       </w:r>
-      <w:ins w:id="10151" w:author="Revision merge (HM+PL)" w:date="2026-09-03T14:58:09Z">
+      <w:ins w:id="10151" w:author="Revision merge (HM+PL)" w:date="2026-09-07T13:07:41Z">
         <w:r>
           <w:t xml:space="preserve"> code and documentation are available</w:t>
         </w:r>
@@ -1088,12 +1088,12 @@
       <w:r>
         <w:t xml:space="preserve"> at </w:t>
       </w:r>
-      <w:del w:id="10152" w:author="Revision merge (HM+PL)" w:date="2026-09-03T14:58:09Z">
+      <w:del w:id="10152" w:author="Revision merge (HM+PL)" w:date="2026-09-07T13:07:41Z">
         <w:r>
           <w:delText xml:space="preserve">https://github.com/Julio92-C/Metagenomics_pipeline_automation (MIT).</w:delText>
         </w:r>
       </w:del>
-      <w:ins w:id="10153" w:author="Revision merge (HM+PL)" w:date="2026-09-03T14:58:09Z">
+      <w:ins w:id="10153" w:author="Revision merge (HM+PL)" w:date="2026-09-07T13:07:41Z">
         <w:r>
           <w:t xml:space="preserve">https://github.com/Julio92-C/Metagenomics_pipeline_automation.</w:t>
         </w:r>
@@ -1101,12 +1101,12 @@
       <w:r>
         <w:t xml:space="preserve"> This note describes release **v0.1.0** (https://github.com/Julio92-C/Metagenomics_pipeline_automation/releases/tag/v0.1.0). </w:t>
       </w:r>
-      <w:del w:id="10154" w:author="Revision merge (HM+PL)" w:date="2026-09-03T14:58:09Z">
+      <w:del w:id="10154" w:author="Revision merge (HM+PL)" w:date="2026-09-07T13:07:41Z">
         <w:r>
           <w:delText xml:space="preserve">Run</w:delText>
         </w:r>
       </w:del>
-      <w:ins w:id="10155" w:author="Revision merge (HM+PL)" w:date="2026-09-03T14:58:09Z">
+      <w:ins w:id="10155" w:author="Revision merge (HM+PL)" w:date="2026-09-07T13:07:41Z">
         <w:r>
           <w:t xml:space="preserve">Reproducible execution is supported through the R environment package `renv`; after restoring dependencies</w:t>
         </w:r>
@@ -1114,12 +1114,12 @@
       <w:r>
         <w:t xml:space="preserve"> with </w:t>
       </w:r>
-      <w:del w:id="10156" w:author="Revision merge (HM+PL)" w:date="2026-09-03T14:58:09Z">
+      <w:del w:id="10156" w:author="Revision merge (HM+PL)" w:date="2026-09-07T13:07:41Z">
         <w:r>
           <w:delText xml:space="preserve">`git</w:delText>
         </w:r>
       </w:del>
-      <w:ins w:id="10157" w:author="Revision merge (HM+PL)" w:date="2026-09-03T14:58:09Z">
+      <w:ins w:id="10157" w:author="Revision merge (HM+PL)" w:date="2026-09-07T13:07:41Z">
         <w:r>
           <w:t xml:space="preserve">`renv::restore()`,</w:t>
         </w:r>
@@ -1127,12 +1127,12 @@
       <w:r>
         <w:t xml:space="preserve"> </w:t>
       </w:r>
-      <w:del w:id="10158" w:author="Revision merge (HM+PL)" w:date="2026-09-03T14:58:09Z">
+      <w:del w:id="10158" w:author="Revision merge (HM+PL)" w:date="2026-09-07T13:07:41Z">
         <w:r>
           <w:delText xml:space="preserve">clone</w:delText>
         </w:r>
       </w:del>
-      <w:ins w:id="10159" w:author="Revision merge (HM+PL)" w:date="2026-09-03T14:58:09Z">
+      <w:ins w:id="10159" w:author="Revision merge (HM+PL)" w:date="2026-09-07T13:07:41Z">
         <w:r>
           <w:t xml:space="preserve">the</w:t>
         </w:r>
@@ -1140,12 +1140,12 @@
       <w:r>
         <w:t xml:space="preserve"> </w:t>
       </w:r>
-      <w:del w:id="10160" w:author="Revision merge (HM+PL)" w:date="2026-09-03T14:58:09Z">
+      <w:del w:id="10160" w:author="Revision merge (HM+PL)" w:date="2026-09-07T13:07:41Z">
         <w:r>
           <w:delText xml:space="preserve">--branch</w:delText>
         </w:r>
       </w:del>
-      <w:ins w:id="10161" w:author="Revision merge (HM+PL)" w:date="2026-09-03T14:58:09Z">
+      <w:ins w:id="10161" w:author="Revision merge (HM+PL)" w:date="2026-09-07T13:07:41Z">
         <w:r>
           <w:t xml:space="preserve">pipeline</w:t>
         </w:r>
@@ -1153,12 +1153,12 @@
       <w:r>
         <w:t xml:space="preserve"> </w:t>
       </w:r>
-      <w:del w:id="10162" w:author="Revision merge (HM+PL)" w:date="2026-09-03T14:58:09Z">
+      <w:del w:id="10162" w:author="Revision merge (HM+PL)" w:date="2026-09-07T13:07:41Z">
         <w:r>
           <w:delText xml:space="preserve">v0.1.0</w:delText>
         </w:r>
       </w:del>
-      <w:ins w:id="10163" w:author="Revision merge (HM+PL)" w:date="2026-09-03T14:58:09Z">
+      <w:ins w:id="10163" w:author="Revision merge (HM+PL)" w:date="2026-09-07T13:07:41Z">
         <w:r>
           <w:t xml:space="preserve">is</w:t>
         </w:r>
@@ -1166,12 +1166,12 @@
       <w:r>
         <w:t xml:space="preserve"> </w:t>
       </w:r>
-      <w:del w:id="10164" w:author="Revision merge (HM+PL)" w:date="2026-09-03T14:58:09Z">
+      <w:del w:id="10164" w:author="Revision merge (HM+PL)" w:date="2026-09-07T13:07:41Z">
         <w:r>
           <w:delText xml:space="preserve">&lt;repo&gt;</w:delText>
         </w:r>
       </w:del>
-      <w:ins w:id="10165" w:author="Revision merge (HM+PL)" w:date="2026-09-03T14:58:09Z">
+      <w:ins w:id="10165" w:author="Revision merge (HM+PL)" w:date="2026-09-07T13:07:41Z">
         <w:r>
           <w:t xml:space="preserve">launched</w:t>
         </w:r>
@@ -1179,12 +1179,12 @@
       <w:r>
         <w:t xml:space="preserve"> </w:t>
       </w:r>
-      <w:del w:id="10166" w:author="Revision merge (HM+PL)" w:date="2026-09-03T14:58:09Z">
+      <w:del w:id="10166" w:author="Revision merge (HM+PL)" w:date="2026-09-07T13:07:41Z">
         <w:r>
           <w:delText xml:space="preserve">&amp;&amp;</w:delText>
         </w:r>
       </w:del>
-      <w:ins w:id="10167" w:author="Revision merge (HM+PL)" w:date="2026-09-03T14:58:09Z">
+      <w:ins w:id="10167" w:author="Revision merge (HM+PL)" w:date="2026-09-07T13:07:41Z">
         <w:r>
           <w:t xml:space="preserve">with</w:t>
         </w:r>
@@ -1192,12 +1192,12 @@
       <w:r>
         <w:t xml:space="preserve"> </w:t>
       </w:r>
-      <w:del w:id="10168" w:author="Revision merge (HM+PL)" w:date="2026-09-03T14:58:09Z">
+      <w:del w:id="10168" w:author="Revision merge (HM+PL)" w:date="2026-09-07T13:07:41Z">
         <w:r>
           <w:delText xml:space="preserve">Rscript</w:delText>
         </w:r>
       </w:del>
-      <w:ins w:id="10169" w:author="Revision merge (HM+PL)" w:date="2026-09-03T14:58:09Z">
+      <w:ins w:id="10169" w:author="Revision merge (HM+PL)" w:date="2026-09-07T13:07:41Z">
         <w:r>
           <w:t xml:space="preserve">`Rscript</w:t>
         </w:r>
@@ -1205,12 +1205,12 @@
       <w:r>
         <w:t xml:space="preserve"> run_pipeline.R </w:t>
       </w:r>
-      <w:del w:id="10170" w:author="Revision merge (HM+PL)" w:date="2026-09-03T14:58:09Z">
+      <w:del w:id="10170" w:author="Revision merge (HM+PL)" w:date="2026-09-07T13:07:41Z">
         <w:r>
           <w:delText xml:space="preserve">config.yaml` after `renv::restore()`.</w:delText>
         </w:r>
       </w:del>
-      <w:ins w:id="10171" w:author="Revision merge (HM+PL)" w:date="2026-09-03T14:58:09Z">
+      <w:ins w:id="10171" w:author="Revision merge (HM+PL)" w:date="2026-09-07T13:07:41Z">
         <w:r>
           <w:t xml:space="preserve">config.yaml`.</w:t>
         </w:r>
@@ -1220,12 +1220,12 @@
       <w:pPr>
         <w:spacing w:after="120"/>
       </w:pPr>
-      <w:del w:id="10172" w:author="Revision merge (HM+PL)" w:date="2026-09-03T14:58:09Z">
+      <w:del w:id="10172" w:author="Revision merge (HM+PL)" w:date="2026-09-07T13:07:41Z">
         <w:r>
           <w:delText xml:space="preserve">**Contact.**</w:delText>
         </w:r>
       </w:del>
-      <w:ins w:id="10173" w:author="Revision merge (HM+PL)" w:date="2026-09-03T14:58:09Z">
+      <w:ins w:id="10173" w:author="Revision merge (HM+PL)" w:date="2026-09-07T13:07:41Z">
         <w:r>
           <w:t xml:space="preserve">**Corresponding author:**</w:t>
         </w:r>
@@ -1263,12 +1263,12 @@
       <w:r>
         <w:t xml:space="preserve">Long-read shotgun </w:t>
       </w:r>
-      <w:del w:id="10174" w:author="Revision merge (HM+PL)" w:date="2026-09-03T14:58:09Z">
+      <w:del w:id="10174" w:author="Revision merge (HM+PL)" w:date="2026-09-07T13:07:41Z">
         <w:r>
           <w:delText xml:space="preserve">metagenomics</w:delText>
         </w:r>
       </w:del>
-      <w:ins w:id="10175" w:author="Revision merge (HM+PL)" w:date="2026-09-03T14:58:09Z">
+      <w:ins w:id="10175" w:author="Revision merge (HM+PL)" w:date="2026-09-07T13:07:41Z">
         <w:r>
           <w:t xml:space="preserve">metagenomics,</w:t>
         </w:r>
@@ -1276,12 +1276,12 @@
       <w:r>
         <w:t xml:space="preserve"> </w:t>
       </w:r>
-      <w:del w:id="10176" w:author="Revision merge (HM+PL)" w:date="2026-09-03T14:58:09Z">
+      <w:del w:id="10176" w:author="Revision merge (HM+PL)" w:date="2026-09-07T13:07:41Z">
         <w:r>
           <w:delText xml:space="preserve">(Oxford</w:delText>
         </w:r>
       </w:del>
-      <w:ins w:id="10177" w:author="Revision merge (HM+PL)" w:date="2026-09-03T14:58:09Z">
+      <w:ins w:id="10177" w:author="Revision merge (HM+PL)" w:date="2026-09-07T13:07:41Z">
         <w:r>
           <w:t xml:space="preserve">enabled</w:t>
         </w:r>
@@ -1289,12 +1289,12 @@
       <w:r>
         <w:t xml:space="preserve"> </w:t>
       </w:r>
-      <w:del w:id="10178" w:author="Revision merge (HM+PL)" w:date="2026-09-03T14:58:09Z">
+      <w:del w:id="10178" w:author="Revision merge (HM+PL)" w:date="2026-09-07T13:07:41Z">
         <w:r>
           <w:delText xml:space="preserve">Nanopore,</w:delText>
         </w:r>
       </w:del>
-      <w:ins w:id="10179" w:author="Revision merge (HM+PL)" w:date="2026-09-03T14:58:09Z">
+      <w:ins w:id="10179" w:author="Revision merge (HM+PL)" w:date="2026-09-07T13:07:41Z">
         <w:r>
           <w:t xml:space="preserve">by</w:t>
         </w:r>
@@ -1302,12 +1302,12 @@
       <w:r>
         <w:t xml:space="preserve"> </w:t>
       </w:r>
-      <w:del w:id="10180" w:author="Revision merge (HM+PL)" w:date="2026-09-03T14:58:09Z">
+      <w:del w:id="10180" w:author="Revision merge (HM+PL)" w:date="2026-09-07T13:07:41Z">
         <w:r>
           <w:delText xml:space="preserve">PacBio)</w:delText>
         </w:r>
       </w:del>
-      <w:ins w:id="10181" w:author="Revision merge (HM+PL)" w:date="2026-09-03T14:58:09Z">
+      <w:ins w:id="10181" w:author="Revision merge (HM+PL)" w:date="2026-09-07T13:07:41Z">
         <w:r>
           <w:t xml:space="preserve">Oxford Nanopore and PacBio sequencing technologies,</w:t>
         </w:r>
@@ -1315,7 +1315,7 @@
       <w:r>
         <w:t xml:space="preserve"> is</w:t>
       </w:r>
-      <w:del w:id="10182" w:author="Revision merge (HM+PL)" w:date="2026-09-03T14:58:09Z">
+      <w:del w:id="10182" w:author="Revision merge (HM+PL)" w:date="2026-09-07T13:07:41Z">
         <w:r>
           <w:delText xml:space="preserve"> increasingly</w:delText>
         </w:r>
@@ -1323,12 +1323,12 @@
       <w:r>
         <w:t xml:space="preserve"> central to One Health surveillance, where </w:t>
       </w:r>
-      <w:del w:id="10183" w:author="Revision merge (HM+PL)" w:date="2026-09-03T14:58:09Z">
+      <w:del w:id="10183" w:author="Revision merge (HM+PL)" w:date="2026-09-07T13:07:41Z">
         <w:r>
           <w:delText xml:space="preserve">threats</w:delText>
         </w:r>
       </w:del>
-      <w:ins w:id="10184" w:author="Revision merge (HM+PL)" w:date="2026-09-03T14:58:09Z">
+      <w:ins w:id="10184" w:author="Revision merge (HM+PL)" w:date="2026-09-07T13:07:41Z">
         <w:r>
           <w:t xml:space="preserve">the</w:t>
         </w:r>
@@ -1336,12 +1336,12 @@
       <w:r>
         <w:t xml:space="preserve"> </w:t>
       </w:r>
-      <w:del w:id="10185" w:author="Revision merge (HM+PL)" w:date="2026-09-03T14:58:09Z">
+      <w:del w:id="10185" w:author="Revision merge (HM+PL)" w:date="2026-09-07T13:07:41Z">
         <w:r>
           <w:delText xml:space="preserve">intersect humans, animals</w:delText>
         </w:r>
       </w:del>
-      <w:ins w:id="10186" w:author="Revision merge (HM+PL)" w:date="2026-09-03T14:58:09Z">
+      <w:ins w:id="10186" w:author="Revision merge (HM+PL)" w:date="2026-09-07T13:07:41Z">
         <w:r>
           <w:t xml:space="preserve">emergence</w:t>
         </w:r>
@@ -1349,12 +1349,12 @@
       <w:r>
         <w:t xml:space="preserve"> and </w:t>
       </w:r>
-      <w:del w:id="10187" w:author="Revision merge (HM+PL)" w:date="2026-09-03T14:58:09Z">
+      <w:del w:id="10187" w:author="Revision merge (HM+PL)" w:date="2026-09-07T13:07:41Z">
         <w:r>
           <w:delText xml:space="preserve">ecosystems</w:delText>
         </w:r>
       </w:del>
-      <w:ins w:id="10188" w:author="Revision merge (HM+PL)" w:date="2026-09-03T14:58:09Z">
+      <w:ins w:id="10188" w:author="Revision merge (HM+PL)" w:date="2026-09-07T13:07:41Z">
         <w:r>
           <w:t xml:space="preserve">dissemination of biological threats occur at the interface of human, animal and environmental systems</w:t>
         </w:r>
@@ -1362,12 +1362,12 @@
       <w:r>
         <w:t xml:space="preserve"> [1]. </w:t>
       </w:r>
-      <w:del w:id="10189" w:author="Revision merge (HM+PL)" w:date="2026-09-03T14:58:09Z">
+      <w:del w:id="10189" w:author="Revision merge (HM+PL)" w:date="2026-09-07T13:07:41Z">
         <w:r>
           <w:delText xml:space="preserve">By</w:delText>
         </w:r>
       </w:del>
-      <w:ins w:id="10190" w:author="Revision merge (HM+PL)" w:date="2026-09-03T14:58:09Z">
+      <w:ins w:id="10190" w:author="Revision merge (HM+PL)" w:date="2026-09-07T13:07:41Z">
         <w:r>
           <w:t xml:space="preserve">Unlike</w:t>
         </w:r>
@@ -1375,12 +1375,12 @@
       <w:r>
         <w:t xml:space="preserve"> </w:t>
       </w:r>
-      <w:del w:id="10191" w:author="Revision merge (HM+PL)" w:date="2026-09-03T14:58:09Z">
+      <w:del w:id="10191" w:author="Revision merge (HM+PL)" w:date="2026-09-07T13:07:41Z">
         <w:r>
           <w:delText xml:space="preserve">profiling</w:delText>
         </w:r>
       </w:del>
-      <w:ins w:id="10192" w:author="Revision merge (HM+PL)" w:date="2026-09-03T14:58:09Z">
+      <w:ins w:id="10192" w:author="Revision merge (HM+PL)" w:date="2026-09-07T13:07:41Z">
         <w:r>
           <w:t xml:space="preserve">targeted approaches, shotgun metagenomics enables simultaneous characterisation of</w:t>
         </w:r>
@@ -1388,12 +1388,12 @@
       <w:r>
         <w:t xml:space="preserve"> microbial </w:t>
       </w:r>
-      <w:del w:id="10193" w:author="Revision merge (HM+PL)" w:date="2026-09-03T14:58:09Z">
+      <w:del w:id="10193" w:author="Revision merge (HM+PL)" w:date="2026-09-07T13:07:41Z">
         <w:r>
           <w:delText xml:space="preserve">communities</w:delText>
         </w:r>
       </w:del>
-      <w:ins w:id="10194" w:author="Revision merge (HM+PL)" w:date="2026-09-03T14:58:09Z">
+      <w:ins w:id="10194" w:author="Revision merge (HM+PL)" w:date="2026-09-07T13:07:41Z">
         <w:r>
           <w:t xml:space="preserve">community composition</w:t>
         </w:r>
@@ -1401,7 +1401,7 @@
       <w:r>
         <w:t xml:space="preserve"> and</w:t>
       </w:r>
-      <w:del w:id="10195" w:author="Revision merge (HM+PL)" w:date="2026-09-03T14:58:09Z">
+      <w:del w:id="10195" w:author="Revision merge (HM+PL)" w:date="2026-09-07T13:07:41Z">
         <w:r>
           <w:delText xml:space="preserve"> their</w:delText>
         </w:r>
@@ -1409,12 +1409,12 @@
       <w:r>
         <w:t xml:space="preserve"> functional genetic </w:t>
       </w:r>
-      <w:del w:id="10196" w:author="Revision merge (HM+PL)" w:date="2026-09-03T14:58:09Z">
+      <w:del w:id="10196" w:author="Revision merge (HM+PL)" w:date="2026-09-07T13:07:41Z">
         <w:r>
           <w:delText xml:space="preserve">elements</w:delText>
         </w:r>
       </w:del>
-      <w:ins w:id="10197" w:author="Revision merge (HM+PL)" w:date="2026-09-03T14:58:09Z">
+      <w:ins w:id="10197" w:author="Revision merge (HM+PL)" w:date="2026-09-07T13:07:41Z">
         <w:r>
           <w:t xml:space="preserve">content,</w:t>
         </w:r>
@@ -1422,12 +1422,12 @@
       <w:r>
         <w:t xml:space="preserve"> </w:t>
       </w:r>
-      <w:del w:id="10198" w:author="Revision merge (HM+PL)" w:date="2026-09-03T14:58:09Z">
+      <w:del w:id="10198" w:author="Revision merge (HM+PL)" w:date="2026-09-07T13:07:41Z">
         <w:r>
           <w:delText xml:space="preserve">in</w:delText>
         </w:r>
       </w:del>
-      <w:ins w:id="10199" w:author="Revision merge (HM+PL)" w:date="2026-09-03T14:58:09Z">
+      <w:ins w:id="10199" w:author="Revision merge (HM+PL)" w:date="2026-09-07T13:07:41Z">
         <w:r>
           <w:t xml:space="preserve">thereby</w:t>
         </w:r>
@@ -1435,12 +1435,12 @@
       <w:r>
         <w:t xml:space="preserve"> </w:t>
       </w:r>
-      <w:del w:id="10200" w:author="Revision merge (HM+PL)" w:date="2026-09-03T14:58:09Z">
+      <w:del w:id="10200" w:author="Revision merge (HM+PL)" w:date="2026-09-07T13:07:41Z">
         <w:r>
           <w:delText xml:space="preserve">a single experiment, it links</w:delText>
         </w:r>
       </w:del>
-      <w:ins w:id="10201" w:author="Revision merge (HM+PL)" w:date="2026-09-03T14:58:09Z">
+      <w:ins w:id="10201" w:author="Revision merge (HM+PL)" w:date="2026-09-07T13:07:41Z">
         <w:r>
           <w:t xml:space="preserve">linking</w:t>
         </w:r>
@@ -1448,7 +1448,7 @@
       <w:r>
         <w:t xml:space="preserve"> taxonomic identity to</w:t>
       </w:r>
-      <w:del w:id="10202" w:author="Revision merge (HM+PL)" w:date="2026-09-03T14:58:09Z">
+      <w:del w:id="10202" w:author="Revision merge (HM+PL)" w:date="2026-09-07T13:07:41Z">
         <w:r>
           <w:delText xml:space="preserve"> determinants of resistance, virulence, and mobility across environmental, clinical, and livestock matrices. The downstream analysis stack is well established — Kraken2 [2] and Bracken [3] for taxonomic assignment and abundance estimation, ABRicate [4] for screening</w:delText>
         </w:r>
@@ -1456,7 +1456,7 @@
       <w:r>
         <w:t xml:space="preserve"> antimicrobial resistance genes (ARGs), virulence factors (VFs) and mobile genetic elements (MGEs) </w:t>
       </w:r>
-      <w:ins w:id="10203" w:author="Revision merge (HM+PL)" w:date="2026-09-03T14:58:09Z">
+      <w:ins w:id="10203" w:author="Revision merge (HM+PL)" w:date="2026-09-07T13:07:41Z">
         <w:r>
           <w:t xml:space="preserve">within a single experiment. This capability is particularly valuable for tracking the ecology and transmission of high-risk microorganisms and their associated genetic determinants across clinical, agricultural and environmental reservoirs. The downstream analysis supporting long-read metagenomics is now well established. Widely adopted tools include Kraken2 [2] and Bracken [3] for taxonomic classification and abundance estimation, ABRicate [4] for screening ARGs, VFs and MGEs </w:t>
         </w:r>
@@ -1464,7 +1464,7 @@
       <w:r>
         <w:t xml:space="preserve">against</w:t>
       </w:r>
-      <w:ins w:id="10204" w:author="Revision merge (HM+PL)" w:date="2026-09-03T14:58:09Z">
+      <w:ins w:id="10204" w:author="Revision merge (HM+PL)" w:date="2026-09-07T13:07:41Z">
         <w:r>
           <w:t xml:space="preserve"> databases such as</w:t>
         </w:r>
@@ -1472,12 +1472,12 @@
       <w:r>
         <w:t xml:space="preserve"> CARD [5], VFDB [6] and PlasmidFinder [7], Re-centrifuge [8] for contamination assessment, and R packages </w:t>
       </w:r>
-      <w:del w:id="10205" w:author="Revision merge (HM+PL)" w:date="2026-09-03T14:58:09Z">
+      <w:del w:id="10205" w:author="Revision merge (HM+PL)" w:date="2026-09-07T13:07:41Z">
         <w:r>
           <w:delText xml:space="preserve">such as</w:delText>
         </w:r>
       </w:del>
-      <w:ins w:id="10206" w:author="Revision merge (HM+PL)" w:date="2026-09-03T14:58:09Z">
+      <w:ins w:id="10206" w:author="Revision merge (HM+PL)" w:date="2026-09-07T13:07:41Z">
         <w:r>
           <w:t xml:space="preserve">including</w:t>
         </w:r>
@@ -1485,12 +1485,12 @@
       <w:r>
         <w:t xml:space="preserve"> vegan [9] and ALDEx2 [10] for ecological and differential </w:t>
       </w:r>
-      <w:del w:id="10207" w:author="Revision merge (HM+PL)" w:date="2026-09-03T14:58:09Z">
+      <w:del w:id="10207" w:author="Revision merge (HM+PL)" w:date="2026-09-07T13:07:41Z">
         <w:r>
           <w:delText xml:space="preserve">analyses</w:delText>
         </w:r>
       </w:del>
-      <w:ins w:id="10208" w:author="Revision merge (HM+PL)" w:date="2026-09-03T14:58:09Z">
+      <w:ins w:id="10208" w:author="Revision merge (HM+PL)" w:date="2026-09-07T13:07:41Z">
         <w:r>
           <w:t xml:space="preserve">abundance</w:t>
         </w:r>
@@ -1498,12 +1498,12 @@
       <w:r>
         <w:t xml:space="preserve"> </w:t>
       </w:r>
-      <w:del w:id="10209" w:author="Revision merge (HM+PL)" w:date="2026-09-03T14:58:09Z">
+      <w:del w:id="10209" w:author="Revision merge (HM+PL)" w:date="2026-09-07T13:07:41Z">
         <w:r>
           <w:delText xml:space="preserve">—</w:delText>
         </w:r>
       </w:del>
-      <w:ins w:id="10210" w:author="Revision merge (HM+PL)" w:date="2026-09-03T14:58:09Z">
+      <w:ins w:id="10210" w:author="Revision merge (HM+PL)" w:date="2026-09-07T13:07:41Z">
         <w:r>
           <w:t xml:space="preserve">analyses.</w:t>
         </w:r>
@@ -1511,12 +1511,12 @@
       <w:r>
         <w:t xml:space="preserve"> </w:t>
       </w:r>
-      <w:del w:id="10211" w:author="Revision merge (HM+PL)" w:date="2026-09-03T14:58:09Z">
+      <w:del w:id="10211" w:author="Revision merge (HM+PL)" w:date="2026-09-07T13:07:41Z">
         <w:r>
           <w:delText xml:space="preserve">but</w:delText>
         </w:r>
       </w:del>
-      <w:ins w:id="10212" w:author="Revision merge (HM+PL)" w:date="2026-09-03T14:58:09Z">
+      <w:ins w:id="10212" w:author="Revision merge (HM+PL)" w:date="2026-09-07T13:07:41Z">
         <w:r>
           <w:t xml:space="preserve">However,</w:t>
         </w:r>
@@ -1524,12 +1524,12 @@
       <w:r>
         <w:t xml:space="preserve"> </w:t>
       </w:r>
-      <w:del w:id="10213" w:author="Revision merge (HM+PL)" w:date="2026-09-03T14:58:09Z">
+      <w:del w:id="10213" w:author="Revision merge (HM+PL)" w:date="2026-09-07T13:07:41Z">
         <w:r>
           <w:delText xml:space="preserve">the</w:delText>
         </w:r>
       </w:del>
-      <w:ins w:id="10214" w:author="Revision merge (HM+PL)" w:date="2026-09-03T14:58:09Z">
+      <w:ins w:id="10214" w:author="Revision merge (HM+PL)" w:date="2026-09-07T13:07:41Z">
         <w:r>
           <w:t xml:space="preserve">while these tools are individually well established, their</w:t>
         </w:r>
@@ -1537,12 +1537,12 @@
       <w:r>
         <w:t xml:space="preserve"> integration </w:t>
       </w:r>
-      <w:del w:id="10215" w:author="Revision merge (HM+PL)" w:date="2026-09-03T14:58:09Z">
+      <w:del w:id="10215" w:author="Revision merge (HM+PL)" w:date="2026-09-07T13:07:41Z">
         <w:r>
           <w:delText xml:space="preserve">between</w:delText>
         </w:r>
       </w:del>
-      <w:ins w:id="10216" w:author="Revision merge (HM+PL)" w:date="2026-09-03T14:58:09Z">
+      <w:ins w:id="10216" w:author="Revision merge (HM+PL)" w:date="2026-09-07T13:07:41Z">
         <w:r>
           <w:t xml:space="preserve">into</w:t>
         </w:r>
@@ -1550,12 +1550,12 @@
       <w:r>
         <w:t xml:space="preserve"> </w:t>
       </w:r>
-      <w:del w:id="10217" w:author="Revision merge (HM+PL)" w:date="2026-09-03T14:58:09Z">
+      <w:del w:id="10217" w:author="Revision merge (HM+PL)" w:date="2026-09-07T13:07:41Z">
         <w:r>
           <w:delText xml:space="preserve">them</w:delText>
         </w:r>
       </w:del>
-      <w:ins w:id="10218" w:author="Revision merge (HM+PL)" w:date="2026-09-03T14:58:09Z">
+      <w:ins w:id="10218" w:author="Revision merge (HM+PL)" w:date="2026-09-07T13:07:41Z">
         <w:r>
           <w:t xml:space="preserve">reproducible</w:t>
         </w:r>
@@ -1563,12 +1563,12 @@
       <w:r>
         <w:t xml:space="preserve"> </w:t>
       </w:r>
-      <w:del w:id="10219" w:author="Revision merge (HM+PL)" w:date="2026-09-03T14:58:09Z">
+      <w:del w:id="10219" w:author="Revision merge (HM+PL)" w:date="2026-09-07T13:07:41Z">
         <w:r>
           <w:delText xml:space="preserve">is</w:delText>
         </w:r>
       </w:del>
-      <w:ins w:id="10220" w:author="Revision merge (HM+PL)" w:date="2026-09-03T14:58:09Z">
+      <w:ins w:id="10220" w:author="Revision merge (HM+PL)" w:date="2026-09-07T13:07:41Z">
         <w:r>
           <w:t xml:space="preserve">and</w:t>
         </w:r>
@@ -1576,12 +1576,12 @@
       <w:r>
         <w:t xml:space="preserve"> </w:t>
       </w:r>
-      <w:del w:id="10221" w:author="Revision merge (HM+PL)" w:date="2026-09-03T14:58:09Z">
+      <w:del w:id="10221" w:author="Revision merge (HM+PL)" w:date="2026-09-07T13:07:41Z">
         <w:r>
           <w:delText xml:space="preserve">not.</w:delText>
         </w:r>
       </w:del>
-      <w:ins w:id="10222" w:author="Revision merge (HM+PL)" w:date="2026-09-03T14:58:09Z">
+      <w:ins w:id="10222" w:author="Revision merge (HM+PL)" w:date="2026-09-07T13:07:41Z">
         <w:r>
           <w:t xml:space="preserve">reusable workflows remains limited.</w:t>
         </w:r>
@@ -1594,12 +1594,12 @@
       <w:r>
         <w:t xml:space="preserve">In practice, </w:t>
       </w:r>
-      <w:del w:id="10223" w:author="Revision merge (HM+PL)" w:date="2026-09-03T14:58:09Z">
+      <w:del w:id="10223" w:author="Revision merge (HM+PL)" w:date="2026-09-07T13:07:41Z">
         <w:r>
           <w:delText xml:space="preserve">each</w:delText>
         </w:r>
       </w:del>
-      <w:ins w:id="10224" w:author="Revision merge (HM+PL)" w:date="2026-09-03T14:58:09Z">
+      <w:ins w:id="10224" w:author="Revision merge (HM+PL)" w:date="2026-09-07T13:07:41Z">
         <w:r>
           <w:t xml:space="preserve">downstream</w:t>
         </w:r>
@@ -1607,12 +1607,12 @@
       <w:r>
         <w:t xml:space="preserve"> </w:t>
       </w:r>
-      <w:del w:id="10225" w:author="Revision merge (HM+PL)" w:date="2026-09-03T14:58:09Z">
+      <w:del w:id="10225" w:author="Revision merge (HM+PL)" w:date="2026-09-07T13:07:41Z">
         <w:r>
           <w:delText xml:space="preserve">new</w:delText>
         </w:r>
       </w:del>
-      <w:ins w:id="10226" w:author="Revision merge (HM+PL)" w:date="2026-09-03T14:58:09Z">
+      <w:ins w:id="10226" w:author="Revision merge (HM+PL)" w:date="2026-09-07T13:07:41Z">
         <w:r>
           <w:t xml:space="preserve">analyses</w:t>
         </w:r>
@@ -1620,12 +1620,12 @@
       <w:r>
         <w:t xml:space="preserve"> </w:t>
       </w:r>
-      <w:del w:id="10227" w:author="Revision merge (HM+PL)" w:date="2026-09-03T14:58:09Z">
+      <w:del w:id="10227" w:author="Revision merge (HM+PL)" w:date="2026-09-07T13:07:41Z">
         <w:r>
           <w:delText xml:space="preserve">study</w:delText>
         </w:r>
       </w:del>
-      <w:ins w:id="10228" w:author="Revision merge (HM+PL)" w:date="2026-09-03T14:58:09Z">
+      <w:ins w:id="10228" w:author="Revision merge (HM+PL)" w:date="2026-09-07T13:07:41Z">
         <w:r>
           <w:t xml:space="preserve">continue</w:t>
         </w:r>
@@ -1633,12 +1633,12 @@
       <w:r>
         <w:t xml:space="preserve"> </w:t>
       </w:r>
-      <w:del w:id="10229" w:author="Revision merge (HM+PL)" w:date="2026-09-03T14:58:09Z">
+      <w:del w:id="10229" w:author="Revision merge (HM+PL)" w:date="2026-09-07T13:07:41Z">
         <w:r>
           <w:delText xml:space="preserve">is</w:delText>
         </w:r>
       </w:del>
-      <w:ins w:id="10230" w:author="Revision merge (HM+PL)" w:date="2026-09-03T14:58:09Z">
+      <w:ins w:id="10230" w:author="Revision merge (HM+PL)" w:date="2026-09-07T13:07:41Z">
         <w:r>
           <w:t xml:space="preserve">to</w:t>
         </w:r>
@@ -1646,12 +1646,12 @@
       <w:r>
         <w:t xml:space="preserve"> </w:t>
       </w:r>
-      <w:del w:id="10231" w:author="Revision merge (HM+PL)" w:date="2026-09-03T14:58:09Z">
+      <w:del w:id="10231" w:author="Revision merge (HM+PL)" w:date="2026-09-07T13:07:41Z">
         <w:r>
           <w:delText xml:space="preserve">analysed</w:delText>
         </w:r>
       </w:del>
-      <w:ins w:id="10232" w:author="Revision merge (HM+PL)" w:date="2026-09-03T14:58:09Z">
+      <w:ins w:id="10232" w:author="Revision merge (HM+PL)" w:date="2026-09-07T13:07:41Z">
         <w:r>
           <w:t xml:space="preserve">rely</w:t>
         </w:r>
@@ -1659,12 +1659,12 @@
       <w:r>
         <w:t xml:space="preserve"> </w:t>
       </w:r>
-      <w:del w:id="10233" w:author="Revision merge (HM+PL)" w:date="2026-09-03T14:58:09Z">
+      <w:del w:id="10233" w:author="Revision merge (HM+PL)" w:date="2026-09-07T13:07:41Z">
         <w:r>
           <w:delText xml:space="preserve">by adapting</w:delText>
         </w:r>
       </w:del>
-      <w:ins w:id="10234" w:author="Revision merge (HM+PL)" w:date="2026-09-03T14:58:09Z">
+      <w:ins w:id="10234" w:author="Revision merge (HM+PL)" w:date="2026-09-07T13:07:41Z">
         <w:r>
           <w:t xml:space="preserve">on</w:t>
         </w:r>
@@ -1672,12 +1672,12 @@
       <w:r>
         <w:t xml:space="preserve"> a set of bespoke R </w:t>
       </w:r>
-      <w:del w:id="10235" w:author="Revision merge (HM+PL)" w:date="2026-09-03T14:58:09Z">
+      <w:del w:id="10235" w:author="Revision merge (HM+PL)" w:date="2026-09-07T13:07:41Z">
         <w:r>
           <w:delText xml:space="preserve">scripts:</w:delText>
         </w:r>
       </w:del>
-      <w:ins w:id="10236" w:author="Revision merge (HM+PL)" w:date="2026-09-03T14:58:09Z">
+      <w:ins w:id="10236" w:author="Revision merge (HM+PL)" w:date="2026-09-07T13:07:41Z">
         <w:r>
           <w:t xml:space="preserve">scripts that have evolved incrementally over successive projects. These scripts frequently contain</w:t>
         </w:r>
@@ -1685,12 +1685,12 @@
       <w:r>
         <w:t xml:space="preserve"> hard-coded input paths, sample-identifier filters embedded as literal strings, per-study negative-control renames, and taxonomy fixes patched by row index. </w:t>
       </w:r>
-      <w:del w:id="10237" w:author="Revision merge (HM+PL)" w:date="2026-09-03T14:58:09Z">
+      <w:del w:id="10237" w:author="Revision merge (HM+PL)" w:date="2026-09-07T13:07:41Z">
         <w:r>
           <w:delText xml:space="preserve">Consequently,</w:delText>
         </w:r>
       </w:del>
-      <w:ins w:id="10238" w:author="Revision merge (HM+PL)" w:date="2026-09-03T14:58:09Z">
+      <w:ins w:id="10238" w:author="Revision merge (HM+PL)" w:date="2026-09-07T13:07:41Z">
         <w:r>
           <w:t xml:space="preserve">As a result,</w:t>
         </w:r>
@@ -1698,12 +1698,12 @@
       <w:r>
         <w:t xml:space="preserve"> individual script copies </w:t>
       </w:r>
-      <w:del w:id="10239" w:author="Revision merge (HM+PL)" w:date="2026-09-03T14:58:09Z">
+      <w:del w:id="10239" w:author="Revision merge (HM+PL)" w:date="2026-09-07T13:07:41Z">
         <w:r>
           <w:delText xml:space="preserve">diverge,</w:delText>
         </w:r>
       </w:del>
-      <w:ins w:id="10240" w:author="Revision merge (HM+PL)" w:date="2026-09-03T14:58:09Z">
+      <w:ins w:id="10240" w:author="Revision merge (HM+PL)" w:date="2026-09-07T13:07:41Z">
         <w:r>
           <w:t xml:space="preserve">diverge over time, reducing reproducibility and limiting portability,</w:t>
         </w:r>
@@ -1711,12 +1711,12 @@
       <w:r>
         <w:t xml:space="preserve"> and the </w:t>
       </w:r>
-      <w:del w:id="10241" w:author="Revision merge (HM+PL)" w:date="2026-09-03T14:58:09Z">
+      <w:del w:id="10241" w:author="Revision merge (HM+PL)" w:date="2026-09-07T13:07:41Z">
         <w:r>
           <w:delText xml:space="preserve">lack</w:delText>
         </w:r>
       </w:del>
-      <w:ins w:id="10242" w:author="Revision merge (HM+PL)" w:date="2026-09-03T14:58:09Z">
+      <w:ins w:id="10242" w:author="Revision merge (HM+PL)" w:date="2026-09-07T13:07:41Z">
         <w:r>
           <w:t xml:space="preserve">absence</w:t>
         </w:r>
@@ -1724,12 +1724,12 @@
       <w:r>
         <w:t xml:space="preserve"> of a shared interface prevents automated output logging. Comparing different studies requires manual reconciliation of both code and data. The reference cohort for the present work (`Chicken Batch 1`; ~46 hand-edited scripts) </w:t>
       </w:r>
-      <w:del w:id="10243" w:author="Revision merge (HM+PL)" w:date="2026-09-03T14:58:09Z">
+      <w:del w:id="10243" w:author="Revision merge (HM+PL)" w:date="2026-09-07T13:07:41Z">
         <w:r>
           <w:delText xml:space="preserve">typifies</w:delText>
         </w:r>
       </w:del>
-      <w:ins w:id="10244" w:author="Revision merge (HM+PL)" w:date="2026-09-03T14:58:09Z">
+      <w:ins w:id="10244" w:author="Revision merge (HM+PL)" w:date="2026-09-07T13:07:41Z">
         <w:r>
           <w:t xml:space="preserve">exemplifies</w:t>
         </w:r>
@@ -1737,12 +1737,12 @@
       <w:r>
         <w:t xml:space="preserve"> this pattern. The L-ARRAP pipeline [11] </w:t>
       </w:r>
-      <w:del w:id="10245" w:author="Revision merge (HM+PL)" w:date="2026-09-03T14:58:09Z">
+      <w:del w:id="10245" w:author="Revision merge (HM+PL)" w:date="2026-09-07T13:07:41Z">
         <w:r>
           <w:delText xml:space="preserve">addresses</w:delText>
         </w:r>
       </w:del>
-      <w:ins w:id="10246" w:author="Revision merge (HM+PL)" w:date="2026-09-03T14:58:09Z">
+      <w:ins w:id="10246" w:author="Revision merge (HM+PL)" w:date="2026-09-07T13:07:41Z">
         <w:r>
           <w:t xml:space="preserve">provides</w:t>
         </w:r>
@@ -1750,12 +1750,12 @@
       <w:r>
         <w:t xml:space="preserve"> </w:t>
       </w:r>
-      <w:del w:id="10247" w:author="Revision merge (HM+PL)" w:date="2026-09-03T14:58:09Z">
+      <w:del w:id="10247" w:author="Revision merge (HM+PL)" w:date="2026-09-07T13:07:41Z">
         <w:r>
           <w:delText xml:space="preserve">one</w:delText>
         </w:r>
       </w:del>
-      <w:ins w:id="10248" w:author="Revision merge (HM+PL)" w:date="2026-09-03T14:58:09Z">
+      <w:ins w:id="10248" w:author="Revision merge (HM+PL)" w:date="2026-09-07T13:07:41Z">
         <w:r>
           <w:t xml:space="preserve">a</w:t>
         </w:r>
@@ -1763,12 +1763,12 @@
       <w:r>
         <w:t xml:space="preserve"> </w:t>
       </w:r>
-      <w:del w:id="10249" w:author="Revision merge (HM+PL)" w:date="2026-09-03T14:58:09Z">
+      <w:del w:id="10249" w:author="Revision merge (HM+PL)" w:date="2026-09-07T13:07:41Z">
         <w:r>
           <w:delText xml:space="preserve">slice of this problem</w:delText>
         </w:r>
       </w:del>
-      <w:ins w:id="10250" w:author="Revision merge (HM+PL)" w:date="2026-09-03T14:58:09Z">
+      <w:ins w:id="10250" w:author="Revision merge (HM+PL)" w:date="2026-09-07T13:07:41Z">
         <w:r>
           <w:t xml:space="preserve">framework</w:t>
         </w:r>
@@ -1776,12 +1776,12 @@
       <w:r>
         <w:t xml:space="preserve"> for long-read resistome risk assessment, </w:t>
       </w:r>
-      <w:del w:id="10251" w:author="Revision merge (HM+PL)" w:date="2026-09-03T14:58:09Z">
+      <w:del w:id="10251" w:author="Revision merge (HM+PL)" w:date="2026-09-07T13:07:41Z">
         <w:r>
           <w:delText xml:space="preserve">and</w:delText>
         </w:r>
       </w:del>
-      <w:ins w:id="10252" w:author="Revision merge (HM+PL)" w:date="2026-09-03T14:58:09Z">
+      <w:ins w:id="10252" w:author="Revision merge (HM+PL)" w:date="2026-09-07T13:07:41Z">
         <w:r>
           <w:t xml:space="preserve">while</w:t>
         </w:r>
@@ -1789,12 +1789,12 @@
       <w:r>
         <w:t xml:space="preserve"> the rANOMALY workflow [12] demonstrates the </w:t>
       </w:r>
-      <w:del w:id="10253" w:author="Revision merge (HM+PL)" w:date="2026-09-03T14:58:09Z">
+      <w:del w:id="10253" w:author="Revision merge (HM+PL)" w:date="2026-09-07T13:07:41Z">
         <w:r>
           <w:delText xml:space="preserve">value</w:delText>
         </w:r>
       </w:del>
-      <w:ins w:id="10254" w:author="Revision merge (HM+PL)" w:date="2026-09-03T14:58:09Z">
+      <w:ins w:id="10254" w:author="Revision merge (HM+PL)" w:date="2026-09-07T13:07:41Z">
         <w:r>
           <w:t xml:space="preserve">advantages</w:t>
         </w:r>
@@ -1802,12 +1802,12 @@
       <w:r>
         <w:t xml:space="preserve"> of a </w:t>
       </w:r>
-      <w:del w:id="10255" w:author="Revision merge (HM+PL)" w:date="2026-09-03T14:58:09Z">
+      <w:del w:id="10255" w:author="Revision merge (HM+PL)" w:date="2026-09-07T13:07:41Z">
         <w:r>
           <w:delText xml:space="preserve">config-driven</w:delText>
         </w:r>
       </w:del>
-      <w:ins w:id="10256" w:author="Revision merge (HM+PL)" w:date="2026-09-03T14:58:09Z">
+      <w:ins w:id="10256" w:author="Revision merge (HM+PL)" w:date="2026-09-07T13:07:41Z">
         <w:r>
           <w:t xml:space="preserve">configuration-driven</w:t>
         </w:r>
@@ -1815,12 +1815,12 @@
       <w:r>
         <w:t xml:space="preserve"> R workflow with auto-generated reports for amplicon data. To our knowledge, no </w:t>
       </w:r>
-      <w:del w:id="10257" w:author="Revision merge (HM+PL)" w:date="2026-09-03T14:58:09Z">
+      <w:del w:id="10257" w:author="Revision merge (HM+PL)" w:date="2026-09-07T13:07:41Z">
         <w:r>
           <w:delText xml:space="preserve">comparable</w:delText>
         </w:r>
       </w:del>
-      <w:ins w:id="10258" w:author="Revision merge (HM+PL)" w:date="2026-09-03T14:58:09Z">
+      <w:ins w:id="10258" w:author="Revision merge (HM+PL)" w:date="2026-09-07T13:07:41Z">
         <w:r>
           <w:t xml:space="preserve">integrated end-to-end R</w:t>
         </w:r>
@@ -1828,12 +1828,12 @@
       <w:r>
         <w:t xml:space="preserve"> workflow </w:t>
       </w:r>
-      <w:del w:id="10259" w:author="Revision merge (HM+PL)" w:date="2026-09-03T14:58:09Z">
+      <w:del w:id="10259" w:author="Revision merge (HM+PL)" w:date="2026-09-07T13:07:41Z">
         <w:r>
           <w:delText xml:space="preserve">exists for end-to-end</w:delText>
         </w:r>
       </w:del>
-      <w:ins w:id="10260" w:author="Revision merge (HM+PL)" w:date="2026-09-03T14:58:09Z">
+      <w:ins w:id="10260" w:author="Revision merge (HM+PL)" w:date="2026-09-07T13:07:41Z">
         <w:r>
           <w:t xml:space="preserve">covers</w:t>
         </w:r>
@@ -1841,12 +1841,12 @@
       <w:r>
         <w:t xml:space="preserve"> long-read shotgun </w:t>
       </w:r>
-      <w:del w:id="10261" w:author="Revision merge (HM+PL)" w:date="2026-09-03T14:58:09Z">
+      <w:del w:id="10261" w:author="Revision merge (HM+PL)" w:date="2026-09-07T13:07:41Z">
         <w:r>
           <w:delText xml:space="preserve">metagenomics</w:delText>
         </w:r>
       </w:del>
-      <w:ins w:id="10262" w:author="Revision merge (HM+PL)" w:date="2026-09-03T14:58:09Z">
+      <w:ins w:id="10262" w:author="Revision merge (HM+PL)" w:date="2026-09-07T13:07:41Z">
         <w:r>
           <w:t xml:space="preserve">metagenomic</w:t>
         </w:r>
@@ -1854,12 +1854,12 @@
       <w:r>
         <w:t xml:space="preserve"> </w:t>
       </w:r>
-      <w:del w:id="10263" w:author="Revision merge (HM+PL)" w:date="2026-09-03T14:58:09Z">
+      <w:del w:id="10263" w:author="Revision merge (HM+PL)" w:date="2026-09-07T13:07:41Z">
         <w:r>
           <w:delText xml:space="preserve">that</w:delText>
         </w:r>
       </w:del>
-      <w:ins w:id="10264" w:author="Revision merge (HM+PL)" w:date="2026-09-03T14:58:09Z">
+      <w:ins w:id="10264" w:author="Revision merge (HM+PL)" w:date="2026-09-07T13:07:41Z">
         <w:r>
           <w:t xml:space="preserve">data</w:t>
         </w:r>
@@ -1867,12 +1867,12 @@
       <w:r>
         <w:t xml:space="preserve"> </w:t>
       </w:r>
-      <w:del w:id="10265" w:author="Revision merge (HM+PL)" w:date="2026-09-03T14:58:09Z">
+      <w:del w:id="10265" w:author="Revision merge (HM+PL)" w:date="2026-09-07T13:07:41Z">
         <w:r>
           <w:delText xml:space="preserve">covers</w:delText>
         </w:r>
       </w:del>
-      <w:ins w:id="10266" w:author="Revision merge (HM+PL)" w:date="2026-09-03T14:58:09Z">
+      <w:ins w:id="10266" w:author="Revision merge (HM+PL)" w:date="2026-09-07T13:07:41Z">
         <w:r>
           <w:t xml:space="preserve">spanning</w:t>
         </w:r>
@@ -1880,12 +1880,12 @@
       <w:r>
         <w:t xml:space="preserve"> </w:t>
       </w:r>
-      <w:del w:id="10267" w:author="Revision merge (HM+PL)" w:date="2026-09-03T14:58:09Z">
+      <w:del w:id="10267" w:author="Revision merge (HM+PL)" w:date="2026-09-07T13:07:41Z">
         <w:r>
           <w:delText xml:space="preserve">taxonomy,</w:delText>
         </w:r>
       </w:del>
-      <w:ins w:id="10268" w:author="Revision merge (HM+PL)" w:date="2026-09-03T14:58:09Z">
+      <w:ins w:id="10268" w:author="Revision merge (HM+PL)" w:date="2026-09-07T13:07:41Z">
         <w:r>
           <w:t xml:space="preserve">taxonomic composition, microbial</w:t>
         </w:r>
@@ -1893,12 +1893,12 @@
       <w:r>
         <w:t xml:space="preserve"> diversity, differential abundance, and </w:t>
       </w:r>
-      <w:del w:id="10269" w:author="Revision merge (HM+PL)" w:date="2026-09-03T14:58:09Z">
+      <w:del w:id="10269" w:author="Revision merge (HM+PL)" w:date="2026-09-07T13:07:41Z">
         <w:r>
           <w:delText xml:space="preserve">full</w:delText>
         </w:r>
       </w:del>
-      <w:ins w:id="10270" w:author="Revision merge (HM+PL)" w:date="2026-09-03T14:58:09Z">
+      <w:ins w:id="10270" w:author="Revision merge (HM+PL)" w:date="2026-09-07T13:07:41Z">
         <w:r>
           <w:t xml:space="preserve">comprehensive</w:t>
         </w:r>
@@ -1911,12 +1911,12 @@
       <w:pPr>
         <w:spacing w:after="120"/>
       </w:pPr>
-      <w:del w:id="10271" w:author="Revision merge (HM+PL)" w:date="2026-09-03T14:58:09Z">
+      <w:del w:id="10271" w:author="Revision merge (HM+PL)" w:date="2026-09-07T13:07:41Z">
         <w:r>
           <w:delText xml:space="preserve">We</w:delText>
         </w:r>
       </w:del>
-      <w:ins w:id="10272" w:author="Revision merge (HM+PL)" w:date="2026-09-03T14:58:09Z">
+      <w:ins w:id="10272" w:author="Revision merge (HM+PL)" w:date="2026-09-07T13:07:41Z">
         <w:r>
           <w:t xml:space="preserve">To</w:t>
         </w:r>
@@ -1924,12 +1924,12 @@
       <w:r>
         <w:t xml:space="preserve"> </w:t>
       </w:r>
-      <w:del w:id="10273" w:author="Revision merge (HM+PL)" w:date="2026-09-03T14:58:09Z">
+      <w:del w:id="10273" w:author="Revision merge (HM+PL)" w:date="2026-09-07T13:07:41Z">
         <w:r>
           <w:delText xml:space="preserve">present</w:delText>
         </w:r>
       </w:del>
-      <w:ins w:id="10274" w:author="Revision merge (HM+PL)" w:date="2026-09-03T14:58:09Z">
+      <w:ins w:id="10274" w:author="Revision merge (HM+PL)" w:date="2026-09-07T13:07:41Z">
         <w:r>
           <w:t xml:space="preserve">address this gap, we have developed</w:t>
         </w:r>
@@ -1937,12 +1937,12 @@
       <w:r>
         <w:t xml:space="preserve"> an alpha-stage R </w:t>
       </w:r>
-      <w:del w:id="10275" w:author="Revision merge (HM+PL)" w:date="2026-09-03T14:58:09Z">
+      <w:del w:id="10275" w:author="Revision merge (HM+PL)" w:date="2026-09-07T13:07:41Z">
         <w:r>
           <w:delText xml:space="preserve">workflow</w:delText>
         </w:r>
       </w:del>
-      <w:ins w:id="10276" w:author="Revision merge (HM+PL)" w:date="2026-09-03T14:58:09Z">
+      <w:ins w:id="10276" w:author="Revision merge (HM+PL)" w:date="2026-09-07T13:07:41Z">
         <w:r>
           <w:t xml:space="preserve">workflow.</w:t>
         </w:r>
@@ -1950,12 +1950,12 @@
       <w:r>
         <w:t xml:space="preserve"> </w:t>
       </w:r>
-      <w:del w:id="10277" w:author="Revision merge (HM+PL)" w:date="2026-09-03T14:58:09Z">
+      <w:del w:id="10277" w:author="Revision merge (HM+PL)" w:date="2026-09-07T13:07:41Z">
         <w:r>
           <w:delText xml:space="preserve">that</w:delText>
         </w:r>
       </w:del>
-      <w:ins w:id="10278" w:author="Revision merge (HM+PL)" w:date="2026-09-03T14:58:09Z">
+      <w:ins w:id="10278" w:author="Revision merge (HM+PL)" w:date="2026-09-07T13:07:41Z">
         <w:r>
           <w:t xml:space="preserve">Here,</w:t>
         </w:r>
@@ -1963,12 +1963,12 @@
       <w:r>
         <w:t xml:space="preserve"> </w:t>
       </w:r>
-      <w:del w:id="10279" w:author="Revision merge (HM+PL)" w:date="2026-09-03T14:58:09Z">
+      <w:del w:id="10279" w:author="Revision merge (HM+PL)" w:date="2026-09-07T13:07:41Z">
         <w:r>
           <w:delText xml:space="preserve">fills</w:delText>
         </w:r>
       </w:del>
-      <w:ins w:id="10280" w:author="Revision merge (HM+PL)" w:date="2026-09-03T14:58:09Z">
+      <w:ins w:id="10280" w:author="Revision merge (HM+PL)" w:date="2026-09-07T13:07:41Z">
         <w:r>
           <w:t xml:space="preserve">we</w:t>
         </w:r>
@@ -1976,12 +1976,12 @@
       <w:r>
         <w:t xml:space="preserve"> </w:t>
       </w:r>
-      <w:del w:id="10281" w:author="Revision merge (HM+PL)" w:date="2026-09-03T14:58:09Z">
+      <w:del w:id="10281" w:author="Revision merge (HM+PL)" w:date="2026-09-07T13:07:41Z">
         <w:r>
           <w:delText xml:space="preserve">this</w:delText>
         </w:r>
       </w:del>
-      <w:ins w:id="10282" w:author="Revision merge (HM+PL)" w:date="2026-09-03T14:58:09Z">
+      <w:ins w:id="10282" w:author="Revision merge (HM+PL)" w:date="2026-09-07T13:07:41Z">
         <w:r>
           <w:t xml:space="preserve">describe</w:t>
         </w:r>
@@ -1989,12 +1989,12 @@
       <w:r>
         <w:t xml:space="preserve"> </w:t>
       </w:r>
-      <w:del w:id="10283" w:author="Revision merge (HM+PL)" w:date="2026-09-03T14:58:09Z">
+      <w:del w:id="10283" w:author="Revision merge (HM+PL)" w:date="2026-09-07T13:07:41Z">
         <w:r>
           <w:delText xml:space="preserve">gap.</w:delText>
         </w:r>
       </w:del>
-      <w:ins w:id="10284" w:author="Revision merge (HM+PL)" w:date="2026-09-03T14:58:09Z">
+      <w:ins w:id="10284" w:author="Revision merge (HM+PL)" w:date="2026-09-07T13:07:41Z">
         <w:r>
           <w:t xml:space="preserve">the</w:t>
         </w:r>
@@ -2002,12 +2002,12 @@
       <w:r>
         <w:t xml:space="preserve"> </w:t>
       </w:r>
-      <w:del w:id="10285" w:author="Revision merge (HM+PL)" w:date="2026-09-03T14:58:09Z">
+      <w:del w:id="10285" w:author="Revision merge (HM+PL)" w:date="2026-09-07T13:07:41Z">
         <w:r>
           <w:delText xml:space="preserve">The tool is in active development; this note describes its</w:delText>
         </w:r>
       </w:del>
-      <w:ins w:id="10286" w:author="Revision merge (HM+PL)" w:date="2026-09-03T14:58:09Z">
+      <w:ins w:id="10286" w:author="Revision merge (HM+PL)" w:date="2026-09-07T13:07:41Z">
         <w:r>
           <w:t xml:space="preserve">workflow's</w:t>
         </w:r>
@@ -2015,12 +2015,12 @@
       <w:r>
         <w:t xml:space="preserve"> design, current scope, and the real-data validation strategy </w:t>
       </w:r>
-      <w:del w:id="10287" w:author="Revision merge (HM+PL)" w:date="2026-09-03T14:58:09Z">
+      <w:del w:id="10287" w:author="Revision merge (HM+PL)" w:date="2026-09-07T13:07:41Z">
         <w:r>
           <w:delText xml:space="preserve">we</w:delText>
         </w:r>
       </w:del>
-      <w:ins w:id="10288" w:author="Revision merge (HM+PL)" w:date="2026-09-03T14:58:09Z">
+      <w:ins w:id="10288" w:author="Revision merge (HM+PL)" w:date="2026-09-07T13:07:41Z">
         <w:r>
           <w:t xml:space="preserve">enabling</w:t>
         </w:r>
@@ -2028,12 +2028,12 @@
       <w:r>
         <w:t xml:space="preserve"> </w:t>
       </w:r>
-      <w:del w:id="10289" w:author="Revision merge (HM+PL)" w:date="2026-09-03T14:58:09Z">
+      <w:del w:id="10289" w:author="Revision merge (HM+PL)" w:date="2026-09-07T13:07:41Z">
         <w:r>
           <w:delText xml:space="preserve">are</w:delText>
         </w:r>
       </w:del>
-      <w:ins w:id="10290" w:author="Revision merge (HM+PL)" w:date="2026-09-03T14:58:09Z">
+      <w:ins w:id="10290" w:author="Revision merge (HM+PL)" w:date="2026-09-07T13:07:41Z">
         <w:r>
           <w:t xml:space="preserve">the</w:t>
         </w:r>
@@ -2041,12 +2041,12 @@
       <w:r>
         <w:t xml:space="preserve"> </w:t>
       </w:r>
-      <w:del w:id="10291" w:author="Revision merge (HM+PL)" w:date="2026-09-03T14:58:09Z">
+      <w:del w:id="10291" w:author="Revision merge (HM+PL)" w:date="2026-09-07T13:07:41Z">
         <w:r>
           <w:delText xml:space="preserve">using</w:delText>
         </w:r>
       </w:del>
-      <w:ins w:id="10292" w:author="Revision merge (HM+PL)" w:date="2026-09-03T14:58:09Z">
+      <w:ins w:id="10292" w:author="Revision merge (HM+PL)" w:date="2026-09-07T13:07:41Z">
         <w:r>
           <w:t xml:space="preserve">assessment</w:t>
         </w:r>
@@ -2054,12 +2054,12 @@
       <w:r>
         <w:t xml:space="preserve"> </w:t>
       </w:r>
-      <w:del w:id="10293" w:author="Revision merge (HM+PL)" w:date="2026-09-03T14:58:09Z">
+      <w:del w:id="10293" w:author="Revision merge (HM+PL)" w:date="2026-09-07T13:07:41Z">
         <w:r>
           <w:delText xml:space="preserve">to</w:delText>
         </w:r>
       </w:del>
-      <w:ins w:id="10294" w:author="Revision merge (HM+PL)" w:date="2026-09-03T14:58:09Z">
+      <w:ins w:id="10294" w:author="Revision merge (HM+PL)" w:date="2026-09-07T13:07:41Z">
         <w:r>
           <w:t xml:space="preserve">of</w:t>
         </w:r>
@@ -2067,12 +2067,12 @@
       <w:r>
         <w:t xml:space="preserve"> </w:t>
       </w:r>
-      <w:del w:id="10295" w:author="Revision merge (HM+PL)" w:date="2026-09-03T14:58:09Z">
+      <w:del w:id="10295" w:author="Revision merge (HM+PL)" w:date="2026-09-07T13:07:41Z">
         <w:r>
           <w:delText xml:space="preserve">harden</w:delText>
         </w:r>
       </w:del>
-      <w:ins w:id="10296" w:author="Revision merge (HM+PL)" w:date="2026-09-03T14:58:09Z">
+      <w:ins w:id="10296" w:author="Revision merge (HM+PL)" w:date="2026-09-07T13:07:41Z">
         <w:r>
           <w:t xml:space="preserve">its</w:t>
         </w:r>
@@ -2080,12 +2080,12 @@
       <w:r>
         <w:t xml:space="preserve"> </w:t>
       </w:r>
-      <w:del w:id="10297" w:author="Revision merge (HM+PL)" w:date="2026-09-03T14:58:09Z">
+      <w:del w:id="10297" w:author="Revision merge (HM+PL)" w:date="2026-09-07T13:07:41Z">
         <w:r>
           <w:delText xml:space="preserve">each stage.</w:delText>
         </w:r>
       </w:del>
-      <w:ins w:id="10298" w:author="Revision merge (HM+PL)" w:date="2026-09-03T14:58:09Z">
+      <w:ins w:id="10298" w:author="Revision merge (HM+PL)" w:date="2026-09-07T13:07:41Z">
         <w:r>
           <w:t xml:space="preserve">performance.</w:t>
         </w:r>
@@ -2113,7 +2113,7 @@
       <w:r>
         <w:t xml:space="preserve">The workflow is</w:t>
       </w:r>
-      <w:ins w:id="10299" w:author="Revision merge (HM+PL)" w:date="2026-09-03T14:58:09Z">
+      <w:ins w:id="10299" w:author="Revision merge (HM+PL)" w:date="2026-09-07T13:07:41Z">
         <w:r>
           <w:t xml:space="preserve"> implemented as</w:t>
         </w:r>
@@ -2121,12 +2121,12 @@
       <w:r>
         <w:t xml:space="preserve"> a stand-alone R project, </w:t>
       </w:r>
-      <w:del w:id="10300" w:author="Revision merge (HM+PL)" w:date="2026-09-03T14:58:09Z">
+      <w:del w:id="10300" w:author="Revision merge (HM+PL)" w:date="2026-09-07T13:07:41Z">
         <w:r>
           <w:delText xml:space="preserve">not</w:delText>
         </w:r>
       </w:del>
-      <w:ins w:id="10301" w:author="Revision merge (HM+PL)" w:date="2026-09-03T14:58:09Z">
+      <w:ins w:id="10301" w:author="Revision merge (HM+PL)" w:date="2026-09-07T13:07:41Z">
         <w:r>
           <w:t xml:space="preserve">rather than</w:t>
         </w:r>
@@ -2134,7 +2134,7 @@
       <w:r>
         <w:t xml:space="preserve"> an installable </w:t>
       </w:r>
-      <w:ins w:id="10302" w:author="Revision merge (HM+PL)" w:date="2026-09-03T14:58:09Z">
+      <w:ins w:id="10302" w:author="Revision merge (HM+PL)" w:date="2026-09-07T13:07:41Z">
         <w:r>
           <w:t xml:space="preserve">software </w:t>
         </w:r>
@@ -2142,12 +2142,12 @@
       <w:r>
         <w:t xml:space="preserve">package. </w:t>
       </w:r>
-      <w:del w:id="10303" w:author="Revision merge (HM+PL)" w:date="2026-09-03T14:58:09Z">
+      <w:del w:id="10303" w:author="Revision merge (HM+PL)" w:date="2026-09-07T13:07:41Z">
         <w:r>
           <w:delText xml:space="preserve">A</w:delText>
         </w:r>
       </w:del>
-      <w:ins w:id="10304" w:author="Revision merge (HM+PL)" w:date="2026-09-03T14:58:09Z">
+      <w:ins w:id="10304" w:author="Revision merge (HM+PL)" w:date="2026-09-07T13:07:41Z">
         <w:r>
           <w:t xml:space="preserve">Execution is initiated through a</w:t>
         </w:r>
@@ -2155,12 +2155,12 @@
       <w:r>
         <w:t xml:space="preserve"> single entry </w:t>
       </w:r>
-      <w:del w:id="10305" w:author="Revision merge (HM+PL)" w:date="2026-09-03T14:58:09Z">
+      <w:del w:id="10305" w:author="Revision merge (HM+PL)" w:date="2026-09-07T13:07:41Z">
         <w:r>
           <w:delText xml:space="preserve">point</w:delText>
         </w:r>
       </w:del>
-      <w:ins w:id="10306" w:author="Revision merge (HM+PL)" w:date="2026-09-03T14:58:09Z">
+      <w:ins w:id="10306" w:author="Revision merge (HM+PL)" w:date="2026-09-07T13:07:41Z">
         <w:r>
           <w:t xml:space="preserve">script</w:t>
         </w:r>
@@ -2168,12 +2168,12 @@
       <w:r>
         <w:t xml:space="preserve"> (`run_pipeline.R`) </w:t>
       </w:r>
-      <w:del w:id="10307" w:author="Revision merge (HM+PL)" w:date="2026-09-03T14:58:09Z">
+      <w:del w:id="10307" w:author="Revision merge (HM+PL)" w:date="2026-09-07T13:07:41Z">
         <w:r>
           <w:delText xml:space="preserve">consumes</w:delText>
         </w:r>
       </w:del>
-      <w:ins w:id="10308" w:author="Revision merge (HM+PL)" w:date="2026-09-03T14:58:09Z">
+      <w:ins w:id="10308" w:author="Revision merge (HM+PL)" w:date="2026-09-07T13:07:41Z">
         <w:r>
           <w:t xml:space="preserve">that reads</w:t>
         </w:r>
@@ -2181,12 +2181,12 @@
       <w:r>
         <w:t xml:space="preserve"> one YAML configuration file </w:t>
       </w:r>
-      <w:del w:id="10309" w:author="Revision merge (HM+PL)" w:date="2026-09-03T14:58:09Z">
+      <w:del w:id="10309" w:author="Revision merge (HM+PL)" w:date="2026-09-07T13:07:41Z">
         <w:r>
           <w:delText xml:space="preserve">per</w:delText>
         </w:r>
       </w:del>
-      <w:ins w:id="10310" w:author="Revision merge (HM+PL)" w:date="2026-09-03T14:58:09Z">
+      <w:ins w:id="10310" w:author="Revision merge (HM+PL)" w:date="2026-09-07T13:07:41Z">
         <w:r>
           <w:t xml:space="preserve">for each</w:t>
         </w:r>
@@ -2194,12 +2194,12 @@
       <w:r>
         <w:t xml:space="preserve"> study and dispatches </w:t>
       </w:r>
-      <w:del w:id="10311" w:author="Revision merge (HM+PL)" w:date="2026-09-03T14:58:09Z">
+      <w:del w:id="10311" w:author="Revision merge (HM+PL)" w:date="2026-09-07T13:07:41Z">
         <w:r>
           <w:delText xml:space="preserve">to</w:delText>
         </w:r>
       </w:del>
-      <w:ins w:id="10312" w:author="Revision merge (HM+PL)" w:date="2026-09-03T14:58:09Z">
+      <w:ins w:id="10312" w:author="Revision merge (HM+PL)" w:date="2026-09-07T13:07:41Z">
         <w:r>
           <w:t xml:space="preserve">the workflow across</w:t>
         </w:r>
@@ -2207,12 +2207,12 @@
       <w:r>
         <w:t xml:space="preserve"> fifteen modules (`R/00_setup.R` through `R/13_panels.R`; plus the manifest stage </w:t>
       </w:r>
-      <w:del w:id="10313" w:author="Revision merge (HM+PL)" w:date="2026-09-03T14:58:09Z">
+      <w:del w:id="10313" w:author="Revision merge (HM+PL)" w:date="2026-09-07T13:07:41Z">
         <w:r>
           <w:delText xml:space="preserve">`R/14`</w:delText>
         </w:r>
       </w:del>
-      <w:ins w:id="10314" w:author="Revision merge (HM+PL)" w:date="2026-09-03T14:58:09Z">
+      <w:ins w:id="10314" w:author="Revision merge (HM+PL)" w:date="2026-09-07T13:07:41Z">
         <w:r>
           <w:t xml:space="preserve">`R/14`,</w:t>
         </w:r>
@@ -2220,12 +2220,12 @@
       <w:r>
         <w:t xml:space="preserve"> which runs </w:t>
       </w:r>
-      <w:del w:id="10315" w:author="Revision merge (HM+PL)" w:date="2026-09-03T14:58:09Z">
+      <w:del w:id="10315" w:author="Revision merge (HM+PL)" w:date="2026-09-07T13:07:41Z">
         <w:r>
           <w:delText xml:space="preserve">last);</w:delText>
         </w:r>
       </w:del>
-      <w:ins w:id="10316" w:author="Revision merge (HM+PL)" w:date="2026-09-03T14:58:09Z">
+      <w:ins w:id="10316" w:author="Revision merge (HM+PL)" w:date="2026-09-07T13:07:41Z">
         <w:r>
           <w:t xml:space="preserve">last).</w:t>
         </w:r>
@@ -2233,12 +2233,12 @@
       <w:r>
         <w:t xml:space="preserve"> </w:t>
       </w:r>
-      <w:del w:id="10317" w:author="Revision merge (HM+PL)" w:date="2026-09-03T14:58:09Z">
+      <w:del w:id="10317" w:author="Revision merge (HM+PL)" w:date="2026-09-07T13:07:41Z">
         <w:r>
           <w:delText xml:space="preserve">a</w:delText>
         </w:r>
       </w:del>
-      <w:ins w:id="10318" w:author="Revision merge (HM+PL)" w:date="2026-09-03T14:58:09Z">
+      <w:ins w:id="10318" w:author="Revision merge (HM+PL)" w:date="2026-09-07T13:07:41Z">
         <w:r>
           <w:t xml:space="preserve">A</w:t>
         </w:r>
@@ -2246,12 +2246,12 @@
       <w:r>
         <w:t xml:space="preserve"> Quarto dashboard template (`templates/report.qmd`) renders all outputs into a single multi-page HTML </w:t>
       </w:r>
-      <w:del w:id="10319" w:author="Revision merge (HM+PL)" w:date="2026-09-03T14:58:09Z">
+      <w:del w:id="10319" w:author="Revision merge (HM+PL)" w:date="2026-09-07T13:07:41Z">
         <w:r>
           <w:delText xml:space="preserve">deliverable,</w:delText>
         </w:r>
       </w:del>
-      <w:ins w:id="10320" w:author="Revision merge (HM+PL)" w:date="2026-09-03T14:58:09Z">
+      <w:ins w:id="10320" w:author="Revision merge (HM+PL)" w:date="2026-09-07T13:07:41Z">
         <w:r>
           <w:t xml:space="preserve">deliverable.</w:t>
         </w:r>
@@ -2259,12 +2259,12 @@
       <w:r>
         <w:t xml:space="preserve"> </w:t>
       </w:r>
-      <w:del w:id="10321" w:author="Revision merge (HM+PL)" w:date="2026-09-03T14:58:09Z">
+      <w:del w:id="10321" w:author="Revision merge (HM+PL)" w:date="2026-09-07T13:07:41Z">
         <w:r>
           <w:delText xml:space="preserve">a</w:delText>
         </w:r>
       </w:del>
-      <w:ins w:id="10322" w:author="Revision merge (HM+PL)" w:date="2026-09-03T14:58:09Z">
+      <w:ins w:id="10322" w:author="Revision merge (HM+PL)" w:date="2026-09-07T13:07:41Z">
         <w:r>
           <w:t xml:space="preserve">A subsequent</w:t>
         </w:r>
@@ -2272,7 +2272,7 @@
       <w:r>
         <w:t xml:space="preserve"> publication-panels stage assembles </w:t>
       </w:r>
-      <w:ins w:id="10323" w:author="Revision merge (HM+PL)" w:date="2026-09-03T14:58:09Z">
+      <w:ins w:id="10323" w:author="Revision merge (HM+PL)" w:date="2026-09-07T13:07:41Z">
         <w:r>
           <w:t xml:space="preserve">publication-ready composite figures for the </w:t>
         </w:r>
@@ -2280,12 +2280,12 @@
       <w:r>
         <w:t xml:space="preserve">main and supplementary </w:t>
       </w:r>
-      <w:del w:id="10324" w:author="Revision merge (HM+PL)" w:date="2026-09-03T14:58:09Z">
+      <w:del w:id="10324" w:author="Revision merge (HM+PL)" w:date="2026-09-07T13:07:41Z">
         <w:r>
           <w:delText xml:space="preserve">composite</w:delText>
         </w:r>
       </w:del>
-      <w:ins w:id="10325" w:author="Revision merge (HM+PL)" w:date="2026-09-03T14:58:09Z">
+      <w:ins w:id="10325" w:author="Revision merge (HM+PL)" w:date="2026-09-07T13:07:41Z">
         <w:r>
           <w:t xml:space="preserve">datasets</w:t>
         </w:r>
@@ -2293,12 +2293,12 @@
       <w:r>
         <w:t xml:space="preserve"> </w:t>
       </w:r>
-      <w:del w:id="10326" w:author="Revision merge (HM+PL)" w:date="2026-09-03T14:58:09Z">
+      <w:del w:id="10326" w:author="Revision merge (HM+PL)" w:date="2026-09-07T13:07:41Z">
         <w:r>
           <w:delText xml:space="preserve">figures</w:delText>
         </w:r>
       </w:del>
-      <w:ins w:id="10327" w:author="Revision merge (HM+PL)" w:date="2026-09-03T14:58:09Z">
+      <w:ins w:id="10327" w:author="Revision merge (HM+PL)" w:date="2026-09-07T13:07:41Z">
         <w:r>
           <w:t xml:space="preserve">and</w:t>
         </w:r>
@@ -2306,12 +2306,12 @@
       <w:r>
         <w:t xml:space="preserve"> </w:t>
       </w:r>
-      <w:del w:id="10328" w:author="Revision merge (HM+PL)" w:date="2026-09-03T14:58:09Z">
+      <w:del w:id="10328" w:author="Revision merge (HM+PL)" w:date="2026-09-07T13:07:41Z">
         <w:r>
           <w:delText xml:space="preserve">plus</w:delText>
         </w:r>
       </w:del>
-      <w:ins w:id="10329" w:author="Revision merge (HM+PL)" w:date="2026-09-03T14:58:09Z">
+      <w:ins w:id="10329" w:author="Revision merge (HM+PL)" w:date="2026-09-07T13:07:41Z">
         <w:r>
           <w:t xml:space="preserve">compiles</w:t>
         </w:r>
@@ -2319,12 +2319,12 @@
       <w:r>
         <w:t xml:space="preserve"> </w:t>
       </w:r>
-      <w:del w:id="10330" w:author="Revision merge (HM+PL)" w:date="2026-09-03T14:58:09Z">
+      <w:del w:id="10330" w:author="Revision merge (HM+PL)" w:date="2026-09-07T13:07:41Z">
         <w:r>
           <w:delText xml:space="preserve">a</w:delText>
         </w:r>
       </w:del>
-      <w:ins w:id="10331" w:author="Revision merge (HM+PL)" w:date="2026-09-03T14:58:09Z">
+      <w:ins w:id="10331" w:author="Revision merge (HM+PL)" w:date="2026-09-07T13:07:41Z">
         <w:r>
           <w:t xml:space="preserve">the accompanying</w:t>
         </w:r>
@@ -2332,12 +2332,12 @@
       <w:r>
         <w:t xml:space="preserve"> supplementary tables </w:t>
       </w:r>
-      <w:del w:id="10332" w:author="Revision merge (HM+PL)" w:date="2026-09-03T14:58:09Z">
+      <w:del w:id="10332" w:author="Revision merge (HM+PL)" w:date="2026-09-07T13:07:41Z">
         <w:r>
           <w:delText xml:space="preserve">workbook,</w:delText>
         </w:r>
       </w:del>
-      <w:ins w:id="10333" w:author="Revision merge (HM+PL)" w:date="2026-09-03T14:58:09Z">
+      <w:ins w:id="10333" w:author="Revision merge (HM+PL)" w:date="2026-09-07T13:07:41Z">
         <w:r>
           <w:t xml:space="preserve">into</w:t>
         </w:r>
@@ -2345,12 +2345,12 @@
       <w:r>
         <w:t xml:space="preserve"> </w:t>
       </w:r>
-      <w:del w:id="10334" w:author="Revision merge (HM+PL)" w:date="2026-09-03T14:58:09Z">
+      <w:del w:id="10334" w:author="Revision merge (HM+PL)" w:date="2026-09-07T13:07:41Z">
         <w:r>
           <w:delText xml:space="preserve">and</w:delText>
         </w:r>
       </w:del>
-      <w:ins w:id="10335" w:author="Revision merge (HM+PL)" w:date="2026-09-03T14:58:09Z">
+      <w:ins w:id="10335" w:author="Revision merge (HM+PL)" w:date="2026-09-07T13:07:41Z">
         <w:r>
           <w:t xml:space="preserve">a workbook. The pipeline concludes with the generation of</w:t>
         </w:r>
@@ -2358,7 +2358,7 @@
       <w:r>
         <w:t xml:space="preserve"> a final </w:t>
       </w:r>
-      <w:del w:id="10336" w:author="Revision merge (HM+PL)" w:date="2026-09-03T14:58:09Z">
+      <w:del w:id="10336" w:author="Revision merge (HM+PL)" w:date="2026-09-07T13:07:41Z">
         <w:r>
           <w:delText xml:space="preserve">manifest stage emits </w:delText>
         </w:r>
@@ -2366,12 +2366,12 @@
       <w:r>
         <w:t xml:space="preserve">`manifest.json` </w:t>
       </w:r>
-      <w:del w:id="10337" w:author="Revision merge (HM+PL)" w:date="2026-09-03T14:58:09Z">
+      <w:del w:id="10337" w:author="Revision merge (HM+PL)" w:date="2026-09-07T13:07:41Z">
         <w:r>
           <w:delText xml:space="preserve">describing</w:delText>
         </w:r>
       </w:del>
-      <w:ins w:id="10338" w:author="Revision merge (HM+PL)" w:date="2026-09-03T14:58:09Z">
+      <w:ins w:id="10338" w:author="Revision merge (HM+PL)" w:date="2026-09-07T13:07:41Z">
         <w:r>
           <w:t xml:space="preserve">file,</w:t>
         </w:r>
@@ -2379,12 +2379,12 @@
       <w:r>
         <w:t xml:space="preserve"> </w:t>
       </w:r>
-      <w:del w:id="10339" w:author="Revision merge (HM+PL)" w:date="2026-09-03T14:58:09Z">
+      <w:del w:id="10339" w:author="Revision merge (HM+PL)" w:date="2026-09-07T13:07:41Z">
         <w:r>
           <w:delText xml:space="preserve">every</w:delText>
         </w:r>
       </w:del>
-      <w:ins w:id="10340" w:author="Revision merge (HM+PL)" w:date="2026-09-03T14:58:09Z">
+      <w:ins w:id="10340" w:author="Revision merge (HM+PL)" w:date="2026-09-07T13:07:41Z">
         <w:r>
           <w:t xml:space="preserve">providing</w:t>
         </w:r>
@@ -2392,12 +2392,12 @@
       <w:r>
         <w:t xml:space="preserve"> </w:t>
       </w:r>
-      <w:del w:id="10341" w:author="Revision merge (HM+PL)" w:date="2026-09-03T14:58:09Z">
+      <w:del w:id="10341" w:author="Revision merge (HM+PL)" w:date="2026-09-07T13:07:41Z">
         <w:r>
           <w:delText xml:space="preserve">artefact</w:delText>
         </w:r>
       </w:del>
-      <w:ins w:id="10342" w:author="Revision merge (HM+PL)" w:date="2026-09-03T14:58:09Z">
+      <w:ins w:id="10342" w:author="Revision merge (HM+PL)" w:date="2026-09-07T13:07:41Z">
         <w:r>
           <w:t xml:space="preserve">a complete record of all artefacts</w:t>
         </w:r>
@@ -2413,12 +2413,12 @@
       <w:r>
         <w:t xml:space="preserve">[FIGURE] **Figure 1.** MERIDIAN workflow. A single `config.yaml` drives fifteen R modules (R/00–R/14) </w:t>
       </w:r>
-      <w:del w:id="10343" w:author="Revision merge (HM+PL)" w:date="2026-09-03T14:58:09Z">
+      <w:del w:id="10343" w:author="Revision merge (HM+PL)" w:date="2026-09-07T13:07:41Z">
         <w:r>
           <w:delText xml:space="preserve">consuming</w:delText>
         </w:r>
       </w:del>
-      <w:ins w:id="10344" w:author="Revision merge (HM+PL)" w:date="2026-09-03T14:58:09Z">
+      <w:ins w:id="10344" w:author="Revision merge (HM+PL)" w:date="2026-09-07T13:07:41Z">
         <w:r>
           <w:t xml:space="preserve">that load</w:t>
         </w:r>
@@ -2434,12 +2434,12 @@
       <w:r>
         <w:t xml:space="preserve">**Configuration-driven.** </w:t>
       </w:r>
-      <w:del w:id="10345" w:author="Revision merge (HM+PL)" w:date="2026-09-03T14:58:09Z">
+      <w:del w:id="10345" w:author="Revision merge (HM+PL)" w:date="2026-09-07T13:07:41Z">
         <w:r>
           <w:delText xml:space="preserve">Everything</w:delText>
         </w:r>
       </w:del>
-      <w:ins w:id="10346" w:author="Revision merge (HM+PL)" w:date="2026-09-03T14:58:09Z">
+      <w:ins w:id="10346" w:author="Revision merge (HM+PL)" w:date="2026-09-07T13:07:41Z">
         <w:r>
           <w:t xml:space="preserve">All</w:t>
         </w:r>
@@ -2447,12 +2447,12 @@
       <w:r>
         <w:t xml:space="preserve"> </w:t>
       </w:r>
-      <w:del w:id="10347" w:author="Revision merge (HM+PL)" w:date="2026-09-03T14:58:09Z">
+      <w:del w:id="10347" w:author="Revision merge (HM+PL)" w:date="2026-09-07T13:07:41Z">
         <w:r>
           <w:delText xml:space="preserve">that</w:delText>
         </w:r>
       </w:del>
-      <w:ins w:id="10348" w:author="Revision merge (HM+PL)" w:date="2026-09-03T14:58:09Z">
+      <w:ins w:id="10348" w:author="Revision merge (HM+PL)" w:date="2026-09-07T13:07:41Z">
         <w:r>
           <w:t xml:space="preserve">study-specific</w:t>
         </w:r>
@@ -2460,12 +2460,12 @@
       <w:r>
         <w:t xml:space="preserve"> </w:t>
       </w:r>
-      <w:del w:id="10349" w:author="Revision merge (HM+PL)" w:date="2026-09-03T14:58:09Z">
+      <w:del w:id="10349" w:author="Revision merge (HM+PL)" w:date="2026-09-07T13:07:41Z">
         <w:r>
           <w:delText xml:space="preserve">varies between studies</w:delText>
         </w:r>
       </w:del>
-      <w:ins w:id="10350" w:author="Revision merge (HM+PL)" w:date="2026-09-03T14:58:09Z">
+      <w:ins w:id="10350" w:author="Revision merge (HM+PL)" w:date="2026-09-07T13:07:41Z">
         <w:r>
           <w:t xml:space="preserve">parameters</w:t>
         </w:r>
@@ -2473,12 +2473,12 @@
       <w:r>
         <w:t xml:space="preserve"> — metadata file </w:t>
       </w:r>
-      <w:del w:id="10351" w:author="Revision merge (HM+PL)" w:date="2026-09-03T14:58:09Z">
+      <w:del w:id="10351" w:author="Revision merge (HM+PL)" w:date="2026-09-07T13:07:41Z">
         <w:r>
           <w:delText xml:space="preserve">path,</w:delText>
         </w:r>
       </w:del>
-      <w:ins w:id="10352" w:author="Revision merge (HM+PL)" w:date="2026-09-03T14:58:09Z">
+      <w:ins w:id="10352" w:author="Revision merge (HM+PL)" w:date="2026-09-07T13:07:41Z">
         <w:r>
           <w:t xml:space="preserve">locations, sample</w:t>
         </w:r>
@@ -2486,12 +2486,12 @@
       <w:r>
         <w:t xml:space="preserve"> grouping </w:t>
       </w:r>
-      <w:del w:id="10353" w:author="Revision merge (HM+PL)" w:date="2026-09-03T14:58:09Z">
+      <w:del w:id="10353" w:author="Revision merge (HM+PL)" w:date="2026-09-07T13:07:41Z">
         <w:r>
           <w:delText xml:space="preserve">columns,</w:delText>
         </w:r>
       </w:del>
-      <w:ins w:id="10354" w:author="Revision merge (HM+PL)" w:date="2026-09-03T14:58:09Z">
+      <w:ins w:id="10354" w:author="Revision merge (HM+PL)" w:date="2026-09-07T13:07:41Z">
         <w:r>
           <w:t xml:space="preserve">variables,</w:t>
         </w:r>
@@ -2499,7 +2499,7 @@
       <w:r>
         <w:t xml:space="preserve"> negative-control identifiers, abundance </w:t>
       </w:r>
-      <w:ins w:id="10355" w:author="Revision merge (HM+PL)" w:date="2026-09-03T14:58:09Z">
+      <w:ins w:id="10355" w:author="Revision merge (HM+PL)" w:date="2026-09-07T13:07:41Z">
         <w:r>
           <w:t xml:space="preserve">filtering </w:t>
         </w:r>
@@ -2507,7 +2507,7 @@
       <w:r>
         <w:t xml:space="preserve">thresholds,</w:t>
       </w:r>
-      <w:ins w:id="10356" w:author="Revision merge (HM+PL)" w:date="2026-09-03T14:58:09Z">
+      <w:ins w:id="10356" w:author="Revision merge (HM+PL)" w:date="2026-09-07T13:07:41Z">
         <w:r>
           <w:t xml:space="preserve"> and</w:t>
         </w:r>
@@ -2515,7 +2515,7 @@
       <w:r>
         <w:t xml:space="preserve"> sample selection </w:t>
       </w:r>
-      <w:ins w:id="10357" w:author="Revision merge (HM+PL)" w:date="2026-09-03T14:58:09Z">
+      <w:ins w:id="10357" w:author="Revision merge (HM+PL)" w:date="2026-09-07T13:07:41Z">
         <w:r>
           <w:t xml:space="preserve">criteria </w:t>
         </w:r>
@@ -2523,12 +2523,12 @@
       <w:r>
         <w:t xml:space="preserve">— </w:t>
       </w:r>
-      <w:del w:id="10358" w:author="Revision merge (HM+PL)" w:date="2026-09-03T14:58:09Z">
+      <w:del w:id="10358" w:author="Revision merge (HM+PL)" w:date="2026-09-07T13:07:41Z">
         <w:r>
           <w:delText xml:space="preserve">is</w:delText>
         </w:r>
       </w:del>
-      <w:ins w:id="10359" w:author="Revision merge (HM+PL)" w:date="2026-09-03T14:58:09Z">
+      <w:ins w:id="10359" w:author="Revision merge (HM+PL)" w:date="2026-09-07T13:07:41Z">
         <w:r>
           <w:t xml:space="preserve">are</w:t>
         </w:r>
@@ -2536,12 +2536,12 @@
       <w:r>
         <w:t xml:space="preserve"> </w:t>
       </w:r>
-      <w:del w:id="10360" w:author="Revision merge (HM+PL)" w:date="2026-09-03T14:58:09Z">
+      <w:del w:id="10360" w:author="Revision merge (HM+PL)" w:date="2026-09-07T13:07:41Z">
         <w:r>
           <w:delText xml:space="preserve">declared</w:delText>
         </w:r>
       </w:del>
-      <w:ins w:id="10361" w:author="Revision merge (HM+PL)" w:date="2026-09-03T14:58:09Z">
+      <w:ins w:id="10361" w:author="Revision merge (HM+PL)" w:date="2026-09-07T13:07:41Z">
         <w:r>
           <w:t xml:space="preserve">defined</w:t>
         </w:r>
@@ -2549,12 +2549,12 @@
       <w:r>
         <w:t xml:space="preserve"> in `config.yaml`. </w:t>
       </w:r>
-      <w:del w:id="10362" w:author="Revision merge (HM+PL)" w:date="2026-09-03T14:58:09Z">
+      <w:del w:id="10362" w:author="Revision merge (HM+PL)" w:date="2026-09-07T13:07:41Z">
         <w:r>
           <w:delText xml:space="preserve">Module</w:delText>
         </w:r>
       </w:del>
-      <w:ins w:id="10363" w:author="Revision merge (HM+PL)" w:date="2026-09-03T14:58:09Z">
+      <w:ins w:id="10363" w:author="Revision merge (HM+PL)" w:date="2026-09-07T13:07:41Z">
         <w:r>
           <w:t xml:space="preserve">Consequently, module</w:t>
         </w:r>
@@ -2562,12 +2562,12 @@
       <w:r>
         <w:t xml:space="preserve"> code </w:t>
       </w:r>
-      <w:del w:id="10364" w:author="Revision merge (HM+PL)" w:date="2026-09-03T14:58:09Z">
+      <w:del w:id="10364" w:author="Revision merge (HM+PL)" w:date="2026-09-07T13:07:41Z">
         <w:r>
           <w:delText xml:space="preserve">is</w:delText>
         </w:r>
       </w:del>
-      <w:ins w:id="10365" w:author="Revision merge (HM+PL)" w:date="2026-09-03T14:58:09Z">
+      <w:ins w:id="10365" w:author="Revision merge (HM+PL)" w:date="2026-09-07T13:07:41Z">
         <w:r>
           <w:t xml:space="preserve">remains</w:t>
         </w:r>
@@ -2575,12 +2575,12 @@
       <w:r>
         <w:t xml:space="preserve"> </w:t>
       </w:r>
-      <w:del w:id="10366" w:author="Revision merge (HM+PL)" w:date="2026-09-03T14:58:09Z">
+      <w:del w:id="10366" w:author="Revision merge (HM+PL)" w:date="2026-09-07T13:07:41Z">
         <w:r>
           <w:delText xml:space="preserve">not</w:delText>
         </w:r>
       </w:del>
-      <w:ins w:id="10367" w:author="Revision merge (HM+PL)" w:date="2026-09-03T14:58:09Z">
+      <w:ins w:id="10367" w:author="Revision merge (HM+PL)" w:date="2026-09-07T13:07:41Z">
         <w:r>
           <w:t xml:space="preserve">invariant</w:t>
         </w:r>
@@ -2588,12 +2588,12 @@
       <w:r>
         <w:t xml:space="preserve"> </w:t>
       </w:r>
-      <w:del w:id="10368" w:author="Revision merge (HM+PL)" w:date="2026-09-03T14:58:09Z">
+      <w:del w:id="10368" w:author="Revision merge (HM+PL)" w:date="2026-09-07T13:07:41Z">
         <w:r>
           <w:delText xml:space="preserve">edited</w:delText>
         </w:r>
       </w:del>
-      <w:ins w:id="10369" w:author="Revision merge (HM+PL)" w:date="2026-09-03T14:58:09Z">
+      <w:ins w:id="10369" w:author="Revision merge (HM+PL)" w:date="2026-09-07T13:07:41Z">
         <w:r>
           <w:t xml:space="preserve">across</w:t>
         </w:r>
@@ -2601,12 +2601,12 @@
       <w:r>
         <w:t xml:space="preserve"> </w:t>
       </w:r>
-      <w:del w:id="10370" w:author="Revision merge (HM+PL)" w:date="2026-09-03T14:58:09Z">
+      <w:del w:id="10370" w:author="Revision merge (HM+PL)" w:date="2026-09-07T13:07:41Z">
         <w:r>
           <w:delText xml:space="preserve">per-project;</w:delText>
         </w:r>
       </w:del>
-      <w:ins w:id="10371" w:author="Revision merge (HM+PL)" w:date="2026-09-03T14:58:09Z">
+      <w:ins w:id="10371" w:author="Revision merge (HM+PL)" w:date="2026-09-07T13:07:41Z">
         <w:r>
           <w:t xml:space="preserve">projects, with</w:t>
         </w:r>
@@ -2614,12 +2614,12 @@
       <w:r>
         <w:t xml:space="preserve"> dataset-specific </w:t>
       </w:r>
-      <w:del w:id="10372" w:author="Revision merge (HM+PL)" w:date="2026-09-03T14:58:09Z">
+      <w:del w:id="10372" w:author="Revision merge (HM+PL)" w:date="2026-09-07T13:07:41Z">
         <w:r>
           <w:delText xml:space="preserve">adjustments</w:delText>
         </w:r>
       </w:del>
-      <w:ins w:id="10373" w:author="Revision merge (HM+PL)" w:date="2026-09-03T14:58:09Z">
+      <w:ins w:id="10373" w:author="Revision merge (HM+PL)" w:date="2026-09-07T13:07:41Z">
         <w:r>
           <w:t xml:space="preserve">customisation</w:t>
         </w:r>
@@ -2627,12 +2627,12 @@
       <w:r>
         <w:t xml:space="preserve"> </w:t>
       </w:r>
-      <w:del w:id="10374" w:author="Revision merge (HM+PL)" w:date="2026-09-03T14:58:09Z">
+      <w:del w:id="10374" w:author="Revision merge (HM+PL)" w:date="2026-09-07T13:07:41Z">
         <w:r>
           <w:delText xml:space="preserve">live</w:delText>
         </w:r>
       </w:del>
-      <w:ins w:id="10375" w:author="Revision merge (HM+PL)" w:date="2026-09-03T14:58:09Z">
+      <w:ins w:id="10375" w:author="Revision merge (HM+PL)" w:date="2026-09-07T13:07:41Z">
         <w:r>
           <w:t xml:space="preserve">implemented</w:t>
         </w:r>
@@ -2640,12 +2640,12 @@
       <w:r>
         <w:t xml:space="preserve"> </w:t>
       </w:r>
-      <w:del w:id="10376" w:author="Revision merge (HM+PL)" w:date="2026-09-03T14:58:09Z">
+      <w:del w:id="10376" w:author="Revision merge (HM+PL)" w:date="2026-09-07T13:07:41Z">
         <w:r>
           <w:delText xml:space="preserve">in</w:delText>
         </w:r>
       </w:del>
-      <w:ins w:id="10377" w:author="Revision merge (HM+PL)" w:date="2026-09-03T14:58:09Z">
+      <w:ins w:id="10377" w:author="Revision merge (HM+PL)" w:date="2026-09-07T13:07:41Z">
         <w:r>
           <w:t xml:space="preserve">exclusively through</w:t>
         </w:r>
@@ -2653,7 +2653,7 @@
       <w:r>
         <w:t xml:space="preserve"> `config.yaml` </w:t>
       </w:r>
-      <w:ins w:id="10378" w:author="Revision merge (HM+PL)" w:date="2026-09-03T14:58:09Z">
+      <w:ins w:id="10378" w:author="Revision merge (HM+PL)" w:date="2026-09-07T13:07:41Z">
         <w:r>
           <w:t xml:space="preserve">settings </w:t>
         </w:r>
@@ -2661,7 +2661,7 @@
       <w:r>
         <w:t xml:space="preserve">or</w:t>
       </w:r>
-      <w:del w:id="10379" w:author="Revision merge (HM+PL)" w:date="2026-09-03T14:58:09Z">
+      <w:del w:id="10379" w:author="Revision merge (HM+PL)" w:date="2026-09-07T13:07:41Z">
         <w:r>
           <w:delText xml:space="preserve"> in</w:delText>
         </w:r>
@@ -2669,12 +2669,12 @@
       <w:r>
         <w:t xml:space="preserve"> the structured fix tables it references. R/00 (setup) and R/01 (input loading) </w:t>
       </w:r>
-      <w:del w:id="10380" w:author="Revision merge (HM+PL)" w:date="2026-09-03T14:58:09Z">
+      <w:del w:id="10380" w:author="Revision merge (HM+PL)" w:date="2026-09-07T13:07:41Z">
         <w:r>
           <w:delText xml:space="preserve">run</w:delText>
         </w:r>
       </w:del>
-      <w:ins w:id="10381" w:author="Revision merge (HM+PL)" w:date="2026-09-03T14:58:09Z">
+      <w:ins w:id="10381" w:author="Revision merge (HM+PL)" w:date="2026-09-07T13:07:41Z">
         <w:r>
           <w:t xml:space="preserve">are executed</w:t>
         </w:r>
@@ -2682,12 +2682,12 @@
       <w:r>
         <w:t xml:space="preserve"> by </w:t>
       </w:r>
-      <w:del w:id="10382" w:author="Revision merge (HM+PL)" w:date="2026-09-03T14:58:09Z">
+      <w:del w:id="10382" w:author="Revision merge (HM+PL)" w:date="2026-09-07T13:07:41Z">
         <w:r>
           <w:delText xml:space="preserve">default;</w:delText>
         </w:r>
       </w:del>
-      <w:ins w:id="10383" w:author="Revision merge (HM+PL)" w:date="2026-09-03T14:58:09Z">
+      <w:ins w:id="10383" w:author="Revision merge (HM+PL)" w:date="2026-09-07T13:07:41Z">
         <w:r>
           <w:t xml:space="preserve">default,</w:t>
         </w:r>
@@ -2695,12 +2695,12 @@
       <w:r>
         <w:t xml:space="preserve"> </w:t>
       </w:r>
-      <w:del w:id="10384" w:author="Revision merge (HM+PL)" w:date="2026-09-03T14:58:09Z">
+      <w:del w:id="10384" w:author="Revision merge (HM+PL)" w:date="2026-09-07T13:07:41Z">
         <w:r>
           <w:delText xml:space="preserve">every</w:delText>
         </w:r>
       </w:del>
-      <w:ins w:id="10385" w:author="Revision merge (HM+PL)" w:date="2026-09-03T14:58:09Z">
+      <w:ins w:id="10385" w:author="Revision merge (HM+PL)" w:date="2026-09-07T13:07:41Z">
         <w:r>
           <w:t xml:space="preserve">whereas</w:t>
         </w:r>
@@ -2708,12 +2708,12 @@
       <w:r>
         <w:t xml:space="preserve"> </w:t>
       </w:r>
-      <w:del w:id="10386" w:author="Revision merge (HM+PL)" w:date="2026-09-03T14:58:09Z">
+      <w:del w:id="10386" w:author="Revision merge (HM+PL)" w:date="2026-09-07T13:07:41Z">
         <w:r>
           <w:delText xml:space="preserve">subsequent</w:delText>
         </w:r>
       </w:del>
-      <w:ins w:id="10387" w:author="Revision merge (HM+PL)" w:date="2026-09-03T14:58:09Z">
+      <w:ins w:id="10387" w:author="Revision merge (HM+PL)" w:date="2026-09-07T13:07:41Z">
         <w:r>
           <w:t xml:space="preserve">all</w:t>
         </w:r>
@@ -2721,12 +2721,12 @@
       <w:r>
         <w:t xml:space="preserve"> </w:t>
       </w:r>
-      <w:del w:id="10388" w:author="Revision merge (HM+PL)" w:date="2026-09-03T14:58:09Z">
+      <w:del w:id="10388" w:author="Revision merge (HM+PL)" w:date="2026-09-07T13:07:41Z">
         <w:r>
           <w:delText xml:space="preserve">stage</w:delText>
         </w:r>
       </w:del>
-      <w:ins w:id="10389" w:author="Revision merge (HM+PL)" w:date="2026-09-03T14:58:09Z">
+      <w:ins w:id="10389" w:author="Revision merge (HM+PL)" w:date="2026-09-07T13:07:41Z">
         <w:r>
           <w:t xml:space="preserve">downstream modules</w:t>
         </w:r>
@@ -2734,12 +2734,12 @@
       <w:r>
         <w:t xml:space="preserve"> can be </w:t>
       </w:r>
-      <w:del w:id="10390" w:author="Revision merge (HM+PL)" w:date="2026-09-03T14:58:09Z">
+      <w:del w:id="10390" w:author="Revision merge (HM+PL)" w:date="2026-09-07T13:07:41Z">
         <w:r>
           <w:delText xml:space="preserve">toggled</w:delText>
         </w:r>
       </w:del>
-      <w:ins w:id="10391" w:author="Revision merge (HM+PL)" w:date="2026-09-03T14:58:09Z">
+      <w:ins w:id="10391" w:author="Revision merge (HM+PL)" w:date="2026-09-07T13:07:41Z">
         <w:r>
           <w:t xml:space="preserve">selectively enabled or disabled</w:t>
         </w:r>
@@ -2747,12 +2747,12 @@
       <w:r>
         <w:t xml:space="preserve"> via `cfg$stages$*` </w:t>
       </w:r>
-      <w:del w:id="10392" w:author="Revision merge (HM+PL)" w:date="2026-09-03T14:58:09Z">
+      <w:del w:id="10392" w:author="Revision merge (HM+PL)" w:date="2026-09-07T13:07:41Z">
         <w:r>
           <w:delText xml:space="preserve">flags,</w:delText>
         </w:r>
       </w:del>
-      <w:ins w:id="10393" w:author="Revision merge (HM+PL)" w:date="2026-09-03T14:58:09Z">
+      <w:ins w:id="10393" w:author="Revision merge (HM+PL)" w:date="2026-09-07T13:07:41Z">
         <w:r>
           <w:t xml:space="preserve">flags;</w:t>
         </w:r>
@@ -2760,12 +2760,12 @@
       <w:r>
         <w:t xml:space="preserve"> </w:t>
       </w:r>
-      <w:del w:id="10394" w:author="Revision merge (HM+PL)" w:date="2026-09-03T14:58:09Z">
+      <w:del w:id="10394" w:author="Revision merge (HM+PL)" w:date="2026-09-07T13:07:41Z">
         <w:r>
           <w:delText xml:space="preserve">e.g,</w:delText>
         </w:r>
       </w:del>
-      <w:ins w:id="10395" w:author="Revision merge (HM+PL)" w:date="2026-09-03T14:58:09Z">
+      <w:ins w:id="10395" w:author="Revision merge (HM+PL)" w:date="2026-09-07T13:07:41Z">
         <w:r>
           <w:t xml:space="preserve">for example,</w:t>
         </w:r>
@@ -2773,12 +2773,12 @@
       <w:r>
         <w:t xml:space="preserve"> users can re-run only the resistome modules after revising thresholds. TPM normalisation (R/03) and all gene-element stages (R/09–R/11) </w:t>
       </w:r>
-      <w:del w:id="10396" w:author="Revision merge (HM+PL)" w:date="2026-09-03T14:58:09Z">
+      <w:del w:id="10396" w:author="Revision merge (HM+PL)" w:date="2026-09-07T13:07:41Z">
         <w:r>
           <w:delText xml:space="preserve">require</w:delText>
         </w:r>
       </w:del>
-      <w:ins w:id="10397" w:author="Revision merge (HM+PL)" w:date="2026-09-03T14:58:09Z">
+      <w:ins w:id="10397" w:author="Revision merge (HM+PL)" w:date="2026-09-07T13:07:41Z">
         <w:r>
           <w:t xml:space="preserve">are contingent upon</w:t>
         </w:r>
@@ -2786,12 +2786,12 @@
       <w:r>
         <w:t xml:space="preserve"> ABRicate outputs and are </w:t>
       </w:r>
-      <w:del w:id="10398" w:author="Revision merge (HM+PL)" w:date="2026-09-03T14:58:09Z">
+      <w:del w:id="10398" w:author="Revision merge (HM+PL)" w:date="2026-09-07T13:07:41Z">
         <w:r>
           <w:delText xml:space="preserve">skipped</w:delText>
         </w:r>
       </w:del>
-      <w:ins w:id="10399" w:author="Revision merge (HM+PL)" w:date="2026-09-03T14:58:09Z">
+      <w:ins w:id="10399" w:author="Revision merge (HM+PL)" w:date="2026-09-07T13:07:41Z">
         <w:r>
           <w:t xml:space="preserve">automatically</w:t>
         </w:r>
@@ -2799,12 +2799,12 @@
       <w:r>
         <w:t xml:space="preserve"> </w:t>
       </w:r>
-      <w:del w:id="10400" w:author="Revision merge (HM+PL)" w:date="2026-09-03T14:58:09Z">
+      <w:del w:id="10400" w:author="Revision merge (HM+PL)" w:date="2026-09-07T13:07:41Z">
         <w:r>
           <w:delText xml:space="preserve">otherwise.</w:delText>
         </w:r>
       </w:del>
-      <w:ins w:id="10401" w:author="Revision merge (HM+PL)" w:date="2026-09-03T14:58:09Z">
+      <w:ins w:id="10401" w:author="Revision merge (HM+PL)" w:date="2026-09-07T13:07:41Z">
         <w:r>
           <w:t xml:space="preserve">omitted</w:t>
         </w:r>
@@ -2812,12 +2812,12 @@
       <w:r>
         <w:t xml:space="preserve"> </w:t>
       </w:r>
-      <w:del w:id="10402" w:author="Revision merge (HM+PL)" w:date="2026-09-03T14:58:09Z">
+      <w:del w:id="10402" w:author="Revision merge (HM+PL)" w:date="2026-09-07T13:07:41Z">
         <w:r>
           <w:delText xml:space="preserve">Per-study</w:delText>
         </w:r>
       </w:del>
-      <w:ins w:id="10403" w:author="Revision merge (HM+PL)" w:date="2026-09-03T14:58:09Z">
+      <w:ins w:id="10403" w:author="Revision merge (HM+PL)" w:date="2026-09-07T13:07:41Z">
         <w:r>
           <w:t xml:space="preserve">when such inputs are absent. Study-specific corrections to</w:t>
         </w:r>
@@ -2825,12 +2825,12 @@
       <w:r>
         <w:t xml:space="preserve"> NCBI taxonomy </w:t>
       </w:r>
-      <w:del w:id="10404" w:author="Revision merge (HM+PL)" w:date="2026-09-03T14:58:09Z">
+      <w:del w:id="10404" w:author="Revision merge (HM+PL)" w:date="2026-09-07T13:07:41Z">
         <w:r>
           <w:delText xml:space="preserve">fixes,</w:delText>
         </w:r>
       </w:del>
-      <w:ins w:id="10405" w:author="Revision merge (HM+PL)" w:date="2026-09-03T14:58:09Z">
+      <w:ins w:id="10405" w:author="Revision merge (HM+PL)" w:date="2026-09-07T13:07:41Z">
         <w:r>
           <w:t xml:space="preserve">assignments,</w:t>
         </w:r>
@@ -2838,12 +2838,12 @@
       <w:r>
         <w:t xml:space="preserve"> </w:t>
       </w:r>
-      <w:del w:id="10406" w:author="Revision merge (HM+PL)" w:date="2026-09-03T14:58:09Z">
+      <w:del w:id="10406" w:author="Revision merge (HM+PL)" w:date="2026-09-07T13:07:41Z">
         <w:r>
           <w:delText xml:space="preserve">when</w:delText>
         </w:r>
       </w:del>
-      <w:ins w:id="10407" w:author="Revision merge (HM+PL)" w:date="2026-09-03T14:58:09Z">
+      <w:ins w:id="10407" w:author="Revision merge (HM+PL)" w:date="2026-09-07T13:07:41Z">
         <w:r>
           <w:t xml:space="preserve">where</w:t>
         </w:r>
@@ -2851,12 +2851,12 @@
       <w:r>
         <w:t xml:space="preserve"> </w:t>
       </w:r>
-      <w:del w:id="10408" w:author="Revision merge (HM+PL)" w:date="2026-09-03T14:58:09Z">
+      <w:del w:id="10408" w:author="Revision merge (HM+PL)" w:date="2026-09-07T13:07:41Z">
         <w:r>
           <w:delText xml:space="preserve">needed,</w:delText>
         </w:r>
       </w:del>
-      <w:ins w:id="10409" w:author="Revision merge (HM+PL)" w:date="2026-09-03T14:58:09Z">
+      <w:ins w:id="10409" w:author="Revision merge (HM+PL)" w:date="2026-09-07T13:07:41Z">
         <w:r>
           <w:t xml:space="preserve">required,</w:t>
         </w:r>
@@ -2864,12 +2864,12 @@
       <w:r>
         <w:t xml:space="preserve"> are </w:t>
       </w:r>
-      <w:del w:id="10410" w:author="Revision merge (HM+PL)" w:date="2026-09-03T14:58:09Z">
+      <w:del w:id="10410" w:author="Revision merge (HM+PL)" w:date="2026-09-07T13:07:41Z">
         <w:r>
           <w:delText xml:space="preserve">declared</w:delText>
         </w:r>
       </w:del>
-      <w:ins w:id="10411" w:author="Revision merge (HM+PL)" w:date="2026-09-03T14:58:09Z">
+      <w:ins w:id="10411" w:author="Revision merge (HM+PL)" w:date="2026-09-07T13:07:41Z">
         <w:r>
           <w:t xml:space="preserve">encoded</w:t>
         </w:r>
@@ -2877,7 +2877,7 @@
       <w:r>
         <w:t xml:space="preserve"> in a structured `taxid_fixes.csv` </w:t>
       </w:r>
-      <w:ins w:id="10412" w:author="Revision merge (HM+PL)" w:date="2026-09-03T14:58:09Z">
+      <w:ins w:id="10412" w:author="Revision merge (HM+PL)" w:date="2026-09-07T13:07:41Z">
         <w:r>
           <w:t xml:space="preserve">table </w:t>
         </w:r>
@@ -2885,7 +2885,7 @@
       <w:r>
         <w:t xml:space="preserve">rather than</w:t>
       </w:r>
-      <w:ins w:id="10413" w:author="Revision merge (HM+PL)" w:date="2026-09-03T14:58:09Z">
+      <w:ins w:id="10413" w:author="Revision merge (HM+PL)" w:date="2026-09-07T13:07:41Z">
         <w:r>
           <w:t xml:space="preserve"> implemented</w:t>
         </w:r>
@@ -2893,12 +2893,12 @@
       <w:r>
         <w:t xml:space="preserve"> as row-index edits. </w:t>
       </w:r>
-      <w:del w:id="10414" w:author="Revision merge (HM+PL)" w:date="2026-09-03T14:58:09Z">
+      <w:del w:id="10414" w:author="Revision merge (HM+PL)" w:date="2026-09-07T13:07:41Z">
         <w:r>
           <w:delText xml:space="preserve">A</w:delText>
         </w:r>
       </w:del>
-      <w:ins w:id="10415" w:author="Revision merge (HM+PL)" w:date="2026-09-03T14:58:09Z">
+      <w:ins w:id="10415" w:author="Revision merge (HM+PL)" w:date="2026-09-07T13:07:41Z">
         <w:r>
           <w:t xml:space="preserve">Multiple-testing</w:t>
         </w:r>
@@ -2906,12 +2906,12 @@
       <w:r>
         <w:t xml:space="preserve"> </w:t>
       </w:r>
-      <w:del w:id="10416" w:author="Revision merge (HM+PL)" w:date="2026-09-03T14:58:09Z">
+      <w:del w:id="10416" w:author="Revision merge (HM+PL)" w:date="2026-09-07T13:07:41Z">
         <w:r>
           <w:delText xml:space="preserve">single</w:delText>
         </w:r>
       </w:del>
-      <w:ins w:id="10417" w:author="Revision merge (HM+PL)" w:date="2026-09-03T14:58:09Z">
+      <w:ins w:id="10417" w:author="Revision merge (HM+PL)" w:date="2026-09-07T13:07:41Z">
         <w:r>
           <w:t xml:space="preserve">correction is controlled through the</w:t>
         </w:r>
@@ -2919,12 +2919,12 @@
       <w:r>
         <w:t xml:space="preserve"> `cfg$stats$padjust_method` </w:t>
       </w:r>
-      <w:del w:id="10418" w:author="Revision merge (HM+PL)" w:date="2026-09-03T14:58:09Z">
+      <w:del w:id="10418" w:author="Revision merge (HM+PL)" w:date="2026-09-07T13:07:41Z">
         <w:r>
           <w:delText xml:space="preserve">knob</w:delText>
         </w:r>
       </w:del>
-      <w:ins w:id="10419" w:author="Revision merge (HM+PL)" w:date="2026-09-03T14:58:09Z">
+      <w:ins w:id="10419" w:author="Revision merge (HM+PL)" w:date="2026-09-07T13:07:41Z">
         <w:r>
           <w:t xml:space="preserve">parameter,</w:t>
         </w:r>
@@ -2932,12 +2932,12 @@
       <w:r>
         <w:t xml:space="preserve"> </w:t>
       </w:r>
-      <w:del w:id="10420" w:author="Revision merge (HM+PL)" w:date="2026-09-03T14:58:09Z">
+      <w:del w:id="10420" w:author="Revision merge (HM+PL)" w:date="2026-09-07T13:07:41Z">
         <w:r>
           <w:delText xml:space="preserve">(Benjamini-Hochberg</w:delText>
         </w:r>
       </w:del>
-      <w:ins w:id="10421" w:author="Revision merge (HM+PL)" w:date="2026-09-03T14:58:09Z">
+      <w:ins w:id="10421" w:author="Revision merge (HM+PL)" w:date="2026-09-07T13:07:41Z">
         <w:r>
           <w:t xml:space="preserve">ensuring consistent application of the selected adjustment throughout the pipeline. The Benjamini-Hochberg false discovery rate</w:t>
         </w:r>
@@ -2945,12 +2945,12 @@
       <w:r>
         <w:t xml:space="preserve"> is used by </w:t>
       </w:r>
-      <w:del w:id="10422" w:author="Revision merge (HM+PL)" w:date="2026-09-03T14:58:09Z">
+      <w:del w:id="10422" w:author="Revision merge (HM+PL)" w:date="2026-09-07T13:07:41Z">
         <w:r>
           <w:delText xml:space="preserve">default;</w:delText>
         </w:r>
       </w:del>
-      <w:ins w:id="10423" w:author="Revision merge (HM+PL)" w:date="2026-09-03T14:58:09Z">
+      <w:ins w:id="10423" w:author="Revision merge (HM+PL)" w:date="2026-09-07T13:07:41Z">
         <w:r>
           <w:t xml:space="preserve">default,</w:t>
         </w:r>
@@ -2958,12 +2958,12 @@
       <w:r>
         <w:t xml:space="preserve"> </w:t>
       </w:r>
-      <w:del w:id="10424" w:author="Revision merge (HM+PL)" w:date="2026-09-03T14:58:09Z">
+      <w:del w:id="10424" w:author="Revision merge (HM+PL)" w:date="2026-09-07T13:07:41Z">
         <w:r>
           <w:delText xml:space="preserve">full</w:delText>
         </w:r>
       </w:del>
-      <w:ins w:id="10425" w:author="Revision merge (HM+PL)" w:date="2026-09-03T14:58:09Z">
+      <w:ins w:id="10425" w:author="Revision merge (HM+PL)" w:date="2026-09-07T13:07:41Z">
         <w:r>
           <w:t xml:space="preserve">although</w:t>
         </w:r>
@@ -2971,12 +2971,12 @@
       <w:r>
         <w:t xml:space="preserve"> </w:t>
       </w:r>
-      <w:del w:id="10426" w:author="Revision merge (HM+PL)" w:date="2026-09-03T14:58:09Z">
+      <w:del w:id="10426" w:author="Revision merge (HM+PL)" w:date="2026-09-07T13:07:41Z">
         <w:r>
           <w:delText xml:space="preserve">list</w:delText>
         </w:r>
       </w:del>
-      <w:ins w:id="10427" w:author="Revision merge (HM+PL)" w:date="2026-09-03T14:58:09Z">
+      <w:ins w:id="10427" w:author="Revision merge (HM+PL)" w:date="2026-09-07T13:07:41Z">
         <w:r>
           <w:t xml:space="preserve">alternative correction methods are supported and documented</w:t>
         </w:r>
@@ -2984,12 +2984,12 @@
       <w:r>
         <w:t xml:space="preserve"> in </w:t>
       </w:r>
-      <w:del w:id="10428" w:author="Revision merge (HM+PL)" w:date="2026-09-03T14:58:09Z">
+      <w:del w:id="10428" w:author="Revision merge (HM+PL)" w:date="2026-09-07T13:07:41Z">
         <w:r>
           <w:delText xml:space="preserve">`docs/STATISTICS.md`) routes every multiple-testing correction across the pipeline.</w:delText>
         </w:r>
       </w:del>
-      <w:ins w:id="10429" w:author="Revision merge (HM+PL)" w:date="2026-09-03T14:58:09Z">
+      <w:ins w:id="10429" w:author="Revision merge (HM+PL)" w:date="2026-09-07T13:07:41Z">
         <w:r>
           <w:t xml:space="preserve">`docs/STATISTICS.md`.</w:t>
         </w:r>
@@ -3002,12 +3002,12 @@
       <w:r>
         <w:t xml:space="preserve">**Stages.** The pipeline </w:t>
       </w:r>
-      <w:del w:id="10430" w:author="Revision merge (HM+PL)" w:date="2026-09-03T14:58:09Z">
+      <w:del w:id="10430" w:author="Revision merge (HM+PL)" w:date="2026-09-07T13:07:41Z">
         <w:r>
           <w:delText xml:space="preserve">organises</w:delText>
         </w:r>
       </w:del>
-      <w:ins w:id="10431" w:author="Revision merge (HM+PL)" w:date="2026-09-03T14:58:09Z">
+      <w:ins w:id="10431" w:author="Revision merge (HM+PL)" w:date="2026-09-07T13:07:41Z">
         <w:r>
           <w:t xml:space="preserve">is</w:t>
         </w:r>
@@ -3015,12 +3015,12 @@
       <w:r>
         <w:t xml:space="preserve"> </w:t>
       </w:r>
-      <w:del w:id="10432" w:author="Revision merge (HM+PL)" w:date="2026-09-03T14:58:09Z">
+      <w:del w:id="10432" w:author="Revision merge (HM+PL)" w:date="2026-09-07T13:07:41Z">
         <w:r>
           <w:delText xml:space="preserve">its work</w:delText>
         </w:r>
       </w:del>
-      <w:ins w:id="10433" w:author="Revision merge (HM+PL)" w:date="2026-09-03T14:58:09Z">
+      <w:ins w:id="10433" w:author="Revision merge (HM+PL)" w:date="2026-09-07T13:07:41Z">
         <w:r>
           <w:t xml:space="preserve">organised</w:t>
         </w:r>
@@ -3028,12 +3028,12 @@
       <w:r>
         <w:t xml:space="preserve"> into five conceptual </w:t>
       </w:r>
-      <w:del w:id="10434" w:author="Revision merge (HM+PL)" w:date="2026-09-03T14:58:09Z">
+      <w:del w:id="10434" w:author="Revision merge (HM+PL)" w:date="2026-09-07T13:07:41Z">
         <w:r>
           <w:delText xml:space="preserve">blocks.</w:delText>
         </w:r>
       </w:del>
-      <w:ins w:id="10435" w:author="Revision merge (HM+PL)" w:date="2026-09-03T14:58:09Z">
+      <w:ins w:id="10435" w:author="Revision merge (HM+PL)" w:date="2026-09-07T13:07:41Z">
         <w:r>
           <w:t xml:space="preserve">stages.</w:t>
         </w:r>
@@ -3046,12 +3046,12 @@
       <w:r>
         <w:t xml:space="preserve">(1) </w:t>
       </w:r>
-      <w:del w:id="10436" w:author="Revision merge (HM+PL)" w:date="2026-09-03T14:58:09Z">
+      <w:del w:id="10436" w:author="Revision merge (HM+PL)" w:date="2026-09-07T13:07:41Z">
         <w:r>
           <w:delText xml:space="preserve">*Ingest</w:delText>
         </w:r>
       </w:del>
-      <w:ins w:id="10437" w:author="Revision merge (HM+PL)" w:date="2026-09-03T14:58:09Z">
+      <w:ins w:id="10437" w:author="Revision merge (HM+PL)" w:date="2026-09-07T13:07:41Z">
         <w:r>
           <w:t xml:space="preserve">*Data input</w:t>
         </w:r>
@@ -3059,12 +3059,12 @@
       <w:r>
         <w:t xml:space="preserve"> and </w:t>
       </w:r>
-      <w:del w:id="10438" w:author="Revision merge (HM+PL)" w:date="2026-09-03T14:58:09Z">
+      <w:del w:id="10438" w:author="Revision merge (HM+PL)" w:date="2026-09-07T13:07:41Z">
         <w:r>
           <w:delText xml:space="preserve">cleaning*</w:delText>
         </w:r>
       </w:del>
-      <w:ins w:id="10439" w:author="Revision merge (HM+PL)" w:date="2026-09-03T14:58:09Z">
+      <w:ins w:id="10439" w:author="Revision merge (HM+PL)" w:date="2026-09-07T13:07:41Z">
         <w:r>
           <w:t xml:space="preserve">decontamination*</w:t>
         </w:r>
@@ -3072,12 +3072,12 @@
       <w:r>
         <w:t xml:space="preserve"> </w:t>
       </w:r>
-      <w:del w:id="10440" w:author="Revision merge (HM+PL)" w:date="2026-09-03T14:58:09Z">
+      <w:del w:id="10440" w:author="Revision merge (HM+PL)" w:date="2026-09-07T13:07:41Z">
         <w:r>
           <w:delText xml:space="preserve">(R/00–R/02)</w:delText>
         </w:r>
       </w:del>
-      <w:ins w:id="10441" w:author="Revision merge (HM+PL)" w:date="2026-09-03T14:58:09Z">
+      <w:ins w:id="10441" w:author="Revision merge (HM+PL)" w:date="2026-09-07T13:07:41Z">
         <w:r>
           <w:t xml:space="preserve">(R/00–R/02).</w:t>
         </w:r>
@@ -3085,12 +3085,12 @@
       <w:r>
         <w:t xml:space="preserve"> </w:t>
       </w:r>
-      <w:del w:id="10442" w:author="Revision merge (HM+PL)" w:date="2026-09-03T14:58:09Z">
+      <w:del w:id="10442" w:author="Revision merge (HM+PL)" w:date="2026-09-07T13:07:41Z">
         <w:r>
           <w:delText xml:space="preserve">load</w:delText>
         </w:r>
       </w:del>
-      <w:ins w:id="10443" w:author="Revision merge (HM+PL)" w:date="2026-09-03T14:58:09Z">
+      <w:ins w:id="10443" w:author="Revision merge (HM+PL)" w:date="2026-09-07T13:07:41Z">
         <w:r>
           <w:t xml:space="preserve">The pipeline imports</w:t>
         </w:r>
@@ -3098,12 +3098,12 @@
       <w:r>
         <w:t xml:space="preserve"> upstream </w:t>
       </w:r>
-      <w:del w:id="10444" w:author="Revision merge (HM+PL)" w:date="2026-09-03T14:58:09Z">
+      <w:del w:id="10444" w:author="Revision merge (HM+PL)" w:date="2026-09-07T13:07:41Z">
         <w:r>
           <w:delText xml:space="preserve">tables</w:delText>
         </w:r>
       </w:del>
-      <w:ins w:id="10445" w:author="Revision merge (HM+PL)" w:date="2026-09-03T14:58:09Z">
+      <w:ins w:id="10445" w:author="Revision merge (HM+PL)" w:date="2026-09-07T13:07:41Z">
         <w:r>
           <w:t xml:space="preserve">outputs</w:t>
         </w:r>
@@ -3111,12 +3111,12 @@
       <w:r>
         <w:t xml:space="preserve"> — Kraken2/Bracken, ABRicate, Re-centrifuge contamination </w:t>
       </w:r>
-      <w:del w:id="10446" w:author="Revision merge (HM+PL)" w:date="2026-09-03T14:58:09Z">
+      <w:del w:id="10446" w:author="Revision merge (HM+PL)" w:date="2026-09-07T13:07:41Z">
         <w:r>
           <w:delText xml:space="preserve">tags,</w:delText>
         </w:r>
       </w:del>
-      <w:ins w:id="10447" w:author="Revision merge (HM+PL)" w:date="2026-09-03T14:58:09Z">
+      <w:ins w:id="10447" w:author="Revision merge (HM+PL)" w:date="2026-09-07T13:07:41Z">
         <w:r>
           <w:t xml:space="preserve">tags and</w:t>
         </w:r>
@@ -3124,7 +3124,7 @@
       <w:r>
         <w:t xml:space="preserve"> study metadata</w:t>
       </w:r>
-      <w:ins w:id="10448" w:author="Revision merge (HM+PL)" w:date="2026-09-03T14:58:09Z">
+      <w:ins w:id="10448" w:author="Revision merge (HM+PL)" w:date="2026-09-07T13:07:41Z">
         <w:r>
           <w:t xml:space="preserve"> tables</w:t>
         </w:r>
@@ -3132,12 +3132,12 @@
       <w:r>
         <w:t xml:space="preserve"> — accommodating per-project input shapes rather than assuming a fixed column layout, </w:t>
       </w:r>
-      <w:del w:id="10449" w:author="Revision merge (HM+PL)" w:date="2026-09-03T14:58:09Z">
+      <w:del w:id="10449" w:author="Revision merge (HM+PL)" w:date="2026-09-07T13:07:41Z">
         <w:r>
           <w:delText xml:space="preserve">apply</w:delText>
         </w:r>
       </w:del>
-      <w:ins w:id="10450" w:author="Revision merge (HM+PL)" w:date="2026-09-03T14:58:09Z">
+      <w:ins w:id="10450" w:author="Revision merge (HM+PL)" w:date="2026-09-07T13:07:41Z">
         <w:r>
           <w:t xml:space="preserve">applies</w:t>
         </w:r>
@@ -3145,12 +3145,12 @@
       <w:r>
         <w:t xml:space="preserve"> optional negative-control subtraction, </w:t>
       </w:r>
-      <w:del w:id="10451" w:author="Revision merge (HM+PL)" w:date="2026-09-03T14:58:09Z">
+      <w:del w:id="10451" w:author="Revision merge (HM+PL)" w:date="2026-09-07T13:07:41Z">
         <w:r>
           <w:delText xml:space="preserve">merge</w:delText>
         </w:r>
       </w:del>
-      <w:ins w:id="10452" w:author="Revision merge (HM+PL)" w:date="2026-09-03T14:58:09Z">
+      <w:ins w:id="10452" w:author="Revision merge (HM+PL)" w:date="2026-09-07T13:07:41Z">
         <w:r>
           <w:t xml:space="preserve">merges</w:t>
         </w:r>
@@ -3158,12 +3158,12 @@
       <w:r>
         <w:t xml:space="preserve"> Bracken counts with the metadata covariates declared in `cfg$metadata$fixed_effects` / `random_effect`, and </w:t>
       </w:r>
-      <w:del w:id="10453" w:author="Revision merge (HM+PL)" w:date="2026-09-03T14:58:09Z">
+      <w:del w:id="10453" w:author="Revision merge (HM+PL)" w:date="2026-09-07T13:07:41Z">
         <w:r>
           <w:delText xml:space="preserve">link</w:delText>
         </w:r>
       </w:del>
-      <w:ins w:id="10454" w:author="Revision merge (HM+PL)" w:date="2026-09-03T14:58:09Z">
+      <w:ins w:id="10454" w:author="Revision merge (HM+PL)" w:date="2026-09-07T13:07:41Z">
         <w:r>
           <w:t xml:space="preserve">links</w:t>
         </w:r>
@@ -3179,12 +3179,12 @@
       <w:r>
         <w:t xml:space="preserve">(2) *Gene-element normalisation* (R/03) computes per-(sample, GENE) TPM </w:t>
       </w:r>
-      <w:del w:id="10455" w:author="Revision merge (HM+PL)" w:date="2026-09-03T14:58:09Z">
+      <w:del w:id="10455" w:author="Revision merge (HM+PL)" w:date="2026-09-07T13:07:41Z">
         <w:r>
           <w:delText xml:space="preserve">from</w:delText>
         </w:r>
       </w:del>
-      <w:ins w:id="10456" w:author="Revision merge (HM+PL)" w:date="2026-09-03T14:58:09Z">
+      <w:ins w:id="10456" w:author="Revision merge (HM+PL)" w:date="2026-09-07T13:07:41Z">
         <w:r>
           <w:t xml:space="preserve">based on</w:t>
         </w:r>
@@ -3192,12 +3192,12 @@
       <w:r>
         <w:t xml:space="preserve"> ABRicate </w:t>
       </w:r>
-      <w:del w:id="10457" w:author="Revision merge (HM+PL)" w:date="2026-09-03T14:58:09Z">
+      <w:del w:id="10457" w:author="Revision merge (HM+PL)" w:date="2026-09-07T13:07:41Z">
         <w:r>
           <w:delText xml:space="preserve">hits</w:delText>
         </w:r>
       </w:del>
-      <w:ins w:id="10458" w:author="Revision merge (HM+PL)" w:date="2026-09-03T14:58:09Z">
+      <w:ins w:id="10458" w:author="Revision merge (HM+PL)" w:date="2026-09-07T13:07:41Z">
         <w:r>
           <w:t xml:space="preserve">hit counts</w:t>
         </w:r>
@@ -3205,7 +3205,7 @@
       <w:r>
         <w:t xml:space="preserve"> and</w:t>
       </w:r>
-      <w:ins w:id="10459" w:author="Revision merge (HM+PL)" w:date="2026-09-03T14:58:09Z">
+      <w:ins w:id="10459" w:author="Revision merge (HM+PL)" w:date="2026-09-07T13:07:41Z">
         <w:r>
           <w:t xml:space="preserve"> annotated</w:t>
         </w:r>
@@ -3221,7 +3221,7 @@
       <w:r>
         <w:t xml:space="preserve">(3) *Community analyses* (R/04–R/08) cover the standard taxonomic toolkit. </w:t>
       </w:r>
-      <w:ins w:id="10460" w:author="Revision merge (HM+PL)" w:date="2026-09-03T14:58:09Z">
+      <w:ins w:id="10460" w:author="Revision merge (HM+PL)" w:date="2026-09-07T13:07:41Z">
         <w:r>
           <w:t xml:space="preserve">Following standardisation and cleaning of shared taxon names, </w:t>
         </w:r>
@@ -3229,12 +3229,12 @@
       <w:r>
         <w:t xml:space="preserve">R/04–R/05 </w:t>
       </w:r>
-      <w:del w:id="10461" w:author="Revision merge (HM+PL)" w:date="2026-09-03T14:58:09Z">
+      <w:del w:id="10461" w:author="Revision merge (HM+PL)" w:date="2026-09-07T13:07:41Z">
         <w:r>
           <w:delText xml:space="preserve">produce</w:delText>
         </w:r>
       </w:del>
-      <w:ins w:id="10462" w:author="Revision merge (HM+PL)" w:date="2026-09-03T14:58:09Z">
+      <w:ins w:id="10462" w:author="Revision merge (HM+PL)" w:date="2026-09-07T13:07:41Z">
         <w:r>
           <w:t xml:space="preserve">generate</w:t>
         </w:r>
@@ -3242,12 +3242,12 @@
       <w:r>
         <w:t xml:space="preserve"> Venn </w:t>
       </w:r>
-      <w:del w:id="10463" w:author="Revision merge (HM+PL)" w:date="2026-09-03T14:58:09Z">
+      <w:del w:id="10463" w:author="Revision merge (HM+PL)" w:date="2026-09-07T13:07:41Z">
         <w:r>
           <w:delText xml:space="preserve">diagrams and</w:delText>
         </w:r>
       </w:del>
-      <w:ins w:id="10464" w:author="Revision merge (HM+PL)" w:date="2026-09-03T14:58:09Z">
+      <w:ins w:id="10464" w:author="Revision merge (HM+PL)" w:date="2026-09-07T13:07:41Z">
         <w:r>
           <w:t xml:space="preserve">diagrams,</w:t>
         </w:r>
@@ -3255,12 +3255,12 @@
       <w:r>
         <w:t xml:space="preserve"> annotated </w:t>
       </w:r>
-      <w:del w:id="10465" w:author="Revision merge (HM+PL)" w:date="2026-09-03T14:58:09Z">
+      <w:del w:id="10465" w:author="Revision merge (HM+PL)" w:date="2026-09-07T13:07:41Z">
         <w:r>
           <w:delText xml:space="preserve">heatmaps</w:delText>
         </w:r>
       </w:del>
-      <w:ins w:id="10466" w:author="Revision merge (HM+PL)" w:date="2026-09-03T14:58:09Z">
+      <w:ins w:id="10466" w:author="Revision merge (HM+PL)" w:date="2026-09-07T13:07:41Z">
         <w:r>
           <w:t xml:space="preserve">heatmaps,</w:t>
         </w:r>
@@ -3268,12 +3268,12 @@
       <w:r>
         <w:t xml:space="preserve"> </w:t>
       </w:r>
-      <w:del w:id="10467" w:author="Revision merge (HM+PL)" w:date="2026-09-03T14:58:09Z">
+      <w:del w:id="10467" w:author="Revision merge (HM+PL)" w:date="2026-09-07T13:07:41Z">
         <w:r>
           <w:delText xml:space="preserve">after a shared taxa-name cleanup, plus</w:delText>
         </w:r>
       </w:del>
-      <w:ins w:id="10468" w:author="Revision merge (HM+PL)" w:date="2026-09-03T14:58:09Z">
+      <w:ins w:id="10468" w:author="Revision merge (HM+PL)" w:date="2026-09-07T13:07:41Z">
         <w:r>
           <w:t xml:space="preserve">and</w:t>
         </w:r>
@@ -3281,12 +3281,12 @@
       <w:r>
         <w:t xml:space="preserve"> top-N stacked-bar relative-abundance plots (static PNG and interactive plotly HTML) with paired total-count and sample-prevalence panels. Alpha diversity (R/06) reports Shannon, Simpson, richness, Pielou, and Fisher metrics with Kruskal-Wallis tests and violin/bar plots, preferring a pre-computed indices CSV (e.g., Oxford Nanopore wf-metagenomics output) and falling back to the vegan R package. Beta diversity (R/07) </w:t>
       </w:r>
-      <w:del w:id="10469" w:author="Revision merge (HM+PL)" w:date="2026-09-03T14:58:09Z">
+      <w:del w:id="10469" w:author="Revision merge (HM+PL)" w:date="2026-09-07T13:07:41Z">
         <w:r>
           <w:delText xml:space="preserve">computes</w:delText>
         </w:r>
       </w:del>
-      <w:ins w:id="10470" w:author="Revision merge (HM+PL)" w:date="2026-09-03T14:58:09Z">
+      <w:ins w:id="10470" w:author="Revision merge (HM+PL)" w:date="2026-09-07T13:07:41Z">
         <w:r>
           <w:t xml:space="preserve">assesses between-sample community differences using</w:t>
         </w:r>
@@ -3294,12 +3294,12 @@
       <w:r>
         <w:t xml:space="preserve"> PCoA on Hellinger-transformed Bray-Curtis distances with PERMANOVA (`adonis2`, 9999 permutations) and PERMDISP (`betadisper`) overlaid on the ordination. </w:t>
       </w:r>
-      <w:del w:id="10471" w:author="Revision merge (HM+PL)" w:date="2026-09-03T14:58:09Z">
+      <w:del w:id="10471" w:author="Revision merge (HM+PL)" w:date="2026-09-07T13:07:41Z">
         <w:r>
           <w:delText xml:space="preserve">ALDEx2 differential</w:delText>
         </w:r>
       </w:del>
-      <w:ins w:id="10472" w:author="Revision merge (HM+PL)" w:date="2026-09-03T14:58:09Z">
+      <w:ins w:id="10472" w:author="Revision merge (HM+PL)" w:date="2026-09-07T13:07:41Z">
         <w:r>
           <w:t xml:space="preserve">Differential</w:t>
         </w:r>
@@ -3307,7 +3307,7 @@
       <w:r>
         <w:t xml:space="preserve"> abundance </w:t>
       </w:r>
-      <w:ins w:id="10473" w:author="Revision merge (HM+PL)" w:date="2026-09-03T14:58:09Z">
+      <w:ins w:id="10473" w:author="Revision merge (HM+PL)" w:date="2026-09-07T13:07:41Z">
         <w:r>
           <w:t xml:space="preserve">analysis </w:t>
         </w:r>
@@ -3315,12 +3315,12 @@
       <w:r>
         <w:t xml:space="preserve">(R/08) </w:t>
       </w:r>
-      <w:del w:id="10474" w:author="Revision merge (HM+PL)" w:date="2026-09-03T14:58:09Z">
+      <w:del w:id="10474" w:author="Revision merge (HM+PL)" w:date="2026-09-07T13:07:41Z">
         <w:r>
           <w:delText xml:space="preserve">runs</w:delText>
         </w:r>
       </w:del>
-      <w:ins w:id="10475" w:author="Revision merge (HM+PL)" w:date="2026-09-03T14:58:09Z">
+      <w:ins w:id="10475" w:author="Revision merge (HM+PL)" w:date="2026-09-07T13:07:41Z">
         <w:r>
           <w:t xml:space="preserve">is performed</w:t>
         </w:r>
@@ -3328,12 +3328,12 @@
       <w:r>
         <w:t xml:space="preserve"> at </w:t>
       </w:r>
-      <w:del w:id="10476" w:author="Revision merge (HM+PL)" w:date="2026-09-03T14:58:09Z">
+      <w:del w:id="10476" w:author="Revision merge (HM+PL)" w:date="2026-09-07T13:07:41Z">
         <w:r>
           <w:delText xml:space="preserve">two</w:delText>
         </w:r>
       </w:del>
-      <w:ins w:id="10477" w:author="Revision merge (HM+PL)" w:date="2026-09-03T14:58:09Z">
+      <w:ins w:id="10477" w:author="Revision merge (HM+PL)" w:date="2026-09-07T13:07:41Z">
         <w:r>
           <w:t xml:space="preserve">both</w:t>
         </w:r>
@@ -3341,12 +3341,12 @@
       <w:r>
         <w:t xml:space="preserve"> </w:t>
       </w:r>
-      <w:del w:id="10478" w:author="Revision merge (HM+PL)" w:date="2026-09-03T14:58:09Z">
+      <w:del w:id="10478" w:author="Revision merge (HM+PL)" w:date="2026-09-07T13:07:41Z">
         <w:r>
           <w:delText xml:space="preserve">levels</w:delText>
         </w:r>
       </w:del>
-      <w:ins w:id="10479" w:author="Revision merge (HM+PL)" w:date="2026-09-03T14:58:09Z">
+      <w:ins w:id="10479" w:author="Revision merge (HM+PL)" w:date="2026-09-07T13:07:41Z">
         <w:r>
           <w:t xml:space="preserve">the</w:t>
         </w:r>
@@ -3354,12 +3354,12 @@
       <w:r>
         <w:t xml:space="preserve"> </w:t>
       </w:r>
-      <w:del w:id="10480" w:author="Revision merge (HM+PL)" w:date="2026-09-03T14:58:09Z">
+      <w:del w:id="10480" w:author="Revision merge (HM+PL)" w:date="2026-09-07T13:07:41Z">
         <w:r>
           <w:delText xml:space="preserve">— taxa (Bracken counts)</w:delText>
         </w:r>
       </w:del>
-      <w:ins w:id="10481" w:author="Revision merge (HM+PL)" w:date="2026-09-03T14:58:09Z">
+      <w:ins w:id="10481" w:author="Revision merge (HM+PL)" w:date="2026-09-07T13:07:41Z">
         <w:r>
           <w:t xml:space="preserve">taxonomic</w:t>
         </w:r>
@@ -3367,12 +3367,12 @@
       <w:r>
         <w:t xml:space="preserve"> and </w:t>
       </w:r>
-      <w:del w:id="10482" w:author="Revision merge (HM+PL)" w:date="2026-09-03T14:58:09Z">
+      <w:del w:id="10482" w:author="Revision merge (HM+PL)" w:date="2026-09-07T13:07:41Z">
         <w:r>
           <w:delText xml:space="preserve">genes</w:delText>
         </w:r>
       </w:del>
-      <w:ins w:id="10483" w:author="Revision merge (HM+PL)" w:date="2026-09-03T14:58:09Z">
+      <w:ins w:id="10483" w:author="Revision merge (HM+PL)" w:date="2026-09-07T13:07:41Z">
         <w:r>
           <w:t xml:space="preserve">functional</w:t>
         </w:r>
@@ -3380,12 +3380,12 @@
       <w:r>
         <w:t xml:space="preserve"> </w:t>
       </w:r>
-      <w:del w:id="10484" w:author="Revision merge (HM+PL)" w:date="2026-09-03T14:58:09Z">
+      <w:del w:id="10484" w:author="Revision merge (HM+PL)" w:date="2026-09-07T13:07:41Z">
         <w:r>
           <w:delText xml:space="preserve">(ABRicate</w:delText>
         </w:r>
       </w:del>
-      <w:ins w:id="10485" w:author="Revision merge (HM+PL)" w:date="2026-09-03T14:58:09Z">
+      <w:ins w:id="10485" w:author="Revision merge (HM+PL)" w:date="2026-09-07T13:07:41Z">
         <w:r>
           <w:t xml:space="preserve">level using ALDEx2: taxonomic analysis uses Bracken counts, whereas gene-level analysis uses ABRicate</w:t>
         </w:r>
@@ -3393,12 +3393,12 @@
       <w:r>
         <w:t xml:space="preserve"> contig hits per (sample, </w:t>
       </w:r>
-      <w:del w:id="10486" w:author="Revision merge (HM+PL)" w:date="2026-09-03T14:58:09Z">
+      <w:del w:id="10486" w:author="Revision merge (HM+PL)" w:date="2026-09-07T13:07:41Z">
         <w:r>
           <w:delText xml:space="preserve">GENE)),</w:delText>
         </w:r>
       </w:del>
-      <w:ins w:id="10487" w:author="Revision merge (HM+PL)" w:date="2026-09-03T14:58:09Z">
+      <w:ins w:id="10487" w:author="Revision merge (HM+PL)" w:date="2026-09-07T13:07:41Z">
         <w:r>
           <w:t xml:space="preserve">GENE).</w:t>
         </w:r>
@@ -3406,12 +3406,12 @@
       <w:r>
         <w:t xml:space="preserve"> </w:t>
       </w:r>
-      <w:del w:id="10488" w:author="Revision merge (HM+PL)" w:date="2026-09-03T14:58:09Z">
+      <w:del w:id="10488" w:author="Revision merge (HM+PL)" w:date="2026-09-07T13:07:41Z">
         <w:r>
           <w:delText xml:space="preserve">combining</w:delText>
         </w:r>
       </w:del>
-      <w:ins w:id="10489" w:author="Revision merge (HM+PL)" w:date="2026-09-03T14:58:09Z">
+      <w:ins w:id="10489" w:author="Revision merge (HM+PL)" w:date="2026-09-07T13:07:41Z">
         <w:r>
           <w:t xml:space="preserve">The workflow combines</w:t>
         </w:r>
@@ -3419,7 +3419,7 @@
       <w:r>
         <w:t xml:space="preserve"> an omnibus Kruskal-Wallis </w:t>
       </w:r>
-      <w:ins w:id="10490" w:author="Revision merge (HM+PL)" w:date="2026-09-03T14:58:09Z">
+      <w:ins w:id="10490" w:author="Revision merge (HM+PL)" w:date="2026-09-07T13:07:41Z">
         <w:r>
           <w:t xml:space="preserve">test </w:t>
         </w:r>
@@ -3427,12 +3427,12 @@
       <w:r>
         <w:t xml:space="preserve">with pairwise Welch's </w:t>
       </w:r>
-      <w:del w:id="10491" w:author="Revision merge (HM+PL)" w:date="2026-09-03T14:58:09Z">
+      <w:del w:id="10491" w:author="Revision merge (HM+PL)" w:date="2026-09-07T13:07:41Z">
         <w:r>
           <w:delText xml:space="preserve">t tests,</w:delText>
         </w:r>
       </w:del>
-      <w:ins w:id="10492" w:author="Revision merge (HM+PL)" w:date="2026-09-03T14:58:09Z">
+      <w:ins w:id="10492" w:author="Revision merge (HM+PL)" w:date="2026-09-07T13:07:41Z">
         <w:r>
           <w:t xml:space="preserve">t-tests,</w:t>
         </w:r>
@@ -3440,7 +3440,7 @@
       <w:r>
         <w:t xml:space="preserve"> with an optional `aldex.glm` design path for covariate-adjusted models.</w:t>
       </w:r>
-      <w:ins w:id="10493" w:author="Revision merge (HM+PL)" w:date="2026-09-03T14:58:09Z">
+      <w:ins w:id="10493" w:author="Revision merge (HM+PL)" w:date="2026-09-07T13:07:41Z">
         <w:r>
           <w:t xml:space="preserve"> This compositional approach is deliberate: ALDEx2 models counts through a centred log-ratio (CLR) transformation, which accounts for the compositional nature of sequencing data and avoids the spurious correlations that arise when raw or total counts are compared directly [10]; gene-level features are additionally length-normalised as TPM (R/03) so that genes of differing length remain comparable.</w:t>
         </w:r>
@@ -3453,12 +3453,12 @@
       <w:r>
         <w:t xml:space="preserve">(4) *Functional profiling* (R/09–R/11) runs a shared analysis engine three times against domain-specific databases: </w:t>
       </w:r>
-      <w:del w:id="10494" w:author="Revision merge (HM+PL)" w:date="2026-09-03T14:58:09Z">
+      <w:del w:id="10494" w:author="Revision merge (HM+PL)" w:date="2026-09-07T13:07:41Z">
         <w:r>
           <w:delText xml:space="preserve">the</w:delText>
         </w:r>
       </w:del>
-      <w:ins w:id="10495" w:author="Revision merge (HM+PL)" w:date="2026-09-03T14:58:09Z">
+      <w:ins w:id="10495" w:author="Revision merge (HM+PL)" w:date="2026-09-07T13:07:41Z">
         <w:r>
           <w:t xml:space="preserve">(i)</w:t>
         </w:r>
@@ -3466,12 +3466,12 @@
       <w:r>
         <w:t xml:space="preserve"> resistome </w:t>
       </w:r>
-      <w:del w:id="10496" w:author="Revision merge (HM+PL)" w:date="2026-09-03T14:58:09Z">
+      <w:del w:id="10496" w:author="Revision merge (HM+PL)" w:date="2026-09-07T13:07:41Z">
         <w:r>
           <w:delText xml:space="preserve">(ABRicate/CARD,</w:delText>
         </w:r>
       </w:del>
-      <w:ins w:id="10497" w:author="Revision merge (HM+PL)" w:date="2026-09-03T14:58:09Z">
+      <w:ins w:id="10497" w:author="Revision merge (HM+PL)" w:date="2026-09-07T13:07:41Z">
         <w:r>
           <w:t xml:space="preserve">profiling</w:t>
         </w:r>
@@ -3479,12 +3479,12 @@
       <w:r>
         <w:t xml:space="preserve"> </w:t>
       </w:r>
-      <w:del w:id="10498" w:author="Revision merge (HM+PL)" w:date="2026-09-03T14:58:09Z">
+      <w:del w:id="10498" w:author="Revision merge (HM+PL)" w:date="2026-09-07T13:07:41Z">
         <w:r>
           <w:delText xml:space="preserve">with</w:delText>
         </w:r>
       </w:del>
-      <w:ins w:id="10499" w:author="Revision merge (HM+PL)" w:date="2026-09-03T14:58:09Z">
+      <w:ins w:id="10499" w:author="Revision merge (HM+PL)" w:date="2026-09-07T13:07:41Z">
         <w:r>
           <w:t xml:space="preserve">using ABRicate/CARD annotations, including</w:t>
         </w:r>
@@ -3492,12 +3492,12 @@
       <w:r>
         <w:t xml:space="preserve"> drug-class </w:t>
       </w:r>
-      <w:del w:id="10500" w:author="Revision merge (HM+PL)" w:date="2026-09-03T14:58:09Z">
+      <w:del w:id="10500" w:author="Revision merge (HM+PL)" w:date="2026-09-07T13:07:41Z">
         <w:r>
           <w:delText xml:space="preserve">classification),</w:delText>
         </w:r>
       </w:del>
-      <w:ins w:id="10501" w:author="Revision merge (HM+PL)" w:date="2026-09-03T14:58:09Z">
+      <w:ins w:id="10501" w:author="Revision merge (HM+PL)" w:date="2026-09-07T13:07:41Z">
         <w:r>
           <w:t xml:space="preserve">classification;</w:t>
         </w:r>
@@ -3505,12 +3505,12 @@
       <w:r>
         <w:t xml:space="preserve"> </w:t>
       </w:r>
-      <w:del w:id="10502" w:author="Revision merge (HM+PL)" w:date="2026-09-03T14:58:09Z">
+      <w:del w:id="10502" w:author="Revision merge (HM+PL)" w:date="2026-09-07T13:07:41Z">
         <w:r>
           <w:delText xml:space="preserve">the</w:delText>
         </w:r>
       </w:del>
-      <w:ins w:id="10503" w:author="Revision merge (HM+PL)" w:date="2026-09-03T14:58:09Z">
+      <w:ins w:id="10503" w:author="Revision merge (HM+PL)" w:date="2026-09-07T13:07:41Z">
         <w:r>
           <w:t xml:space="preserve">(ii)</w:t>
         </w:r>
@@ -3518,12 +3518,12 @@
       <w:r>
         <w:t xml:space="preserve"> virulome </w:t>
       </w:r>
-      <w:del w:id="10504" w:author="Revision merge (HM+PL)" w:date="2026-09-03T14:58:09Z">
+      <w:del w:id="10504" w:author="Revision merge (HM+PL)" w:date="2026-09-07T13:07:41Z">
         <w:r>
           <w:delText xml:space="preserve">(VFDB,</w:delText>
         </w:r>
       </w:del>
-      <w:ins w:id="10505" w:author="Revision merge (HM+PL)" w:date="2026-09-03T14:58:09Z">
+      <w:ins w:id="10505" w:author="Revision merge (HM+PL)" w:date="2026-09-07T13:07:41Z">
         <w:r>
           <w:t xml:space="preserve">profiling using VFDB,</w:t>
         </w:r>
@@ -3531,12 +3531,12 @@
       <w:r>
         <w:t xml:space="preserve"> with functional categories extracted from the ABRicate `PRODUCT` </w:t>
       </w:r>
-      <w:del w:id="10506" w:author="Revision merge (HM+PL)" w:date="2026-09-03T14:58:09Z">
+      <w:del w:id="10506" w:author="Revision merge (HM+PL)" w:date="2026-09-07T13:07:41Z">
         <w:r>
           <w:delText xml:space="preserve">field)</w:delText>
         </w:r>
       </w:del>
-      <w:ins w:id="10507" w:author="Revision merge (HM+PL)" w:date="2026-09-03T14:58:09Z">
+      <w:ins w:id="10507" w:author="Revision merge (HM+PL)" w:date="2026-09-07T13:07:41Z">
         <w:r>
           <w:t xml:space="preserve">field;</w:t>
         </w:r>
@@ -3544,12 +3544,12 @@
       <w:r>
         <w:t xml:space="preserve"> </w:t>
       </w:r>
-      <w:del w:id="10508" w:author="Revision merge (HM+PL)" w:date="2026-09-03T14:58:09Z">
+      <w:del w:id="10508" w:author="Revision merge (HM+PL)" w:date="2026-09-07T13:07:41Z">
         <w:r>
           <w:delText xml:space="preserve">and the</w:delText>
         </w:r>
       </w:del>
-      <w:ins w:id="10509" w:author="Revision merge (HM+PL)" w:date="2026-09-03T14:58:09Z">
+      <w:ins w:id="10509" w:author="Revision merge (HM+PL)" w:date="2026-09-07T13:07:41Z">
         <w:r>
           <w:t xml:space="preserve">(iii)</w:t>
         </w:r>
@@ -3557,12 +3557,12 @@
       <w:r>
         <w:t xml:space="preserve"> mobilome </w:t>
       </w:r>
-      <w:del w:id="10510" w:author="Revision merge (HM+PL)" w:date="2026-09-03T14:58:09Z">
+      <w:del w:id="10510" w:author="Revision merge (HM+PL)" w:date="2026-09-07T13:07:41Z">
         <w:r>
           <w:delText xml:space="preserve">(PlasmidFinder,</w:delText>
         </w:r>
       </w:del>
-      <w:ins w:id="10511" w:author="Revision merge (HM+PL)" w:date="2026-09-03T14:58:09Z">
+      <w:ins w:id="10511" w:author="Revision merge (HM+PL)" w:date="2026-09-07T13:07:41Z">
         <w:r>
           <w:t xml:space="preserve">profiling</w:t>
         </w:r>
@@ -3570,12 +3570,12 @@
       <w:r>
         <w:t xml:space="preserve"> </w:t>
       </w:r>
-      <w:del w:id="10512" w:author="Revision merge (HM+PL)" w:date="2026-09-03T14:58:09Z">
+      <w:del w:id="10512" w:author="Revision merge (HM+PL)" w:date="2026-09-07T13:07:41Z">
         <w:r>
           <w:delText xml:space="preserve">with</w:delText>
         </w:r>
       </w:del>
-      <w:ins w:id="10513" w:author="Revision merge (HM+PL)" w:date="2026-09-03T14:58:09Z">
+      <w:ins w:id="10513" w:author="Revision merge (HM+PL)" w:date="2026-09-07T13:07:41Z">
         <w:r>
           <w:t xml:space="preserve">using PlasmidFinder, incorporating</w:t>
         </w:r>
@@ -3583,12 +3583,12 @@
       <w:r>
         <w:t xml:space="preserve"> configurable replicon-family classification </w:t>
       </w:r>
-      <w:del w:id="10514" w:author="Revision merge (HM+PL)" w:date="2026-09-03T14:58:09Z">
+      <w:del w:id="10514" w:author="Revision merge (HM+PL)" w:date="2026-09-07T13:07:41Z">
         <w:r>
           <w:delText xml:space="preserve">— Col-like,</w:delText>
         </w:r>
       </w:del>
-      <w:ins w:id="10515" w:author="Revision merge (HM+PL)" w:date="2026-09-03T14:58:09Z">
+      <w:ins w:id="10515" w:author="Revision merge (HM+PL)" w:date="2026-09-07T13:07:41Z">
         <w:r>
           <w:t xml:space="preserve">(Col-like,</w:t>
         </w:r>
@@ -3596,12 +3596,12 @@
       <w:r>
         <w:t xml:space="preserve"> IncF, IncX, other Inc). </w:t>
       </w:r>
-      <w:del w:id="10516" w:author="Revision merge (HM+PL)" w:date="2026-09-03T14:58:09Z">
+      <w:del w:id="10516" w:author="Revision merge (HM+PL)" w:date="2026-09-07T13:07:41Z">
         <w:r>
           <w:delText xml:space="preserve">Each</w:delText>
         </w:r>
       </w:del>
-      <w:ins w:id="10517" w:author="Revision merge (HM+PL)" w:date="2026-09-03T14:58:09Z">
+      <w:ins w:id="10517" w:author="Revision merge (HM+PL)" w:date="2026-09-07T13:07:41Z">
         <w:r>
           <w:t xml:space="preserve">For</w:t>
         </w:r>
@@ -3609,12 +3609,12 @@
       <w:r>
         <w:t xml:space="preserve"> </w:t>
       </w:r>
-      <w:del w:id="10518" w:author="Revision merge (HM+PL)" w:date="2026-09-03T14:58:09Z">
+      <w:del w:id="10518" w:author="Revision merge (HM+PL)" w:date="2026-09-07T13:07:41Z">
         <w:r>
           <w:delText xml:space="preserve">domain</w:delText>
         </w:r>
       </w:del>
-      <w:ins w:id="10519" w:author="Revision merge (HM+PL)" w:date="2026-09-03T14:58:09Z">
+      <w:ins w:id="10519" w:author="Revision merge (HM+PL)" w:date="2026-09-07T13:07:41Z">
         <w:r>
           <w:t xml:space="preserve">each</w:t>
         </w:r>
@@ -3622,12 +3622,12 @@
       <w:r>
         <w:t xml:space="preserve"> </w:t>
       </w:r>
-      <w:del w:id="10520" w:author="Revision merge (HM+PL)" w:date="2026-09-03T14:58:09Z">
+      <w:del w:id="10520" w:author="Revision merge (HM+PL)" w:date="2026-09-07T13:07:41Z">
         <w:r>
           <w:delText xml:space="preserve">emits</w:delText>
         </w:r>
       </w:del>
-      <w:ins w:id="10521" w:author="Revision merge (HM+PL)" w:date="2026-09-03T14:58:09Z">
+      <w:ins w:id="10521" w:author="Revision merge (HM+PL)" w:date="2026-09-07T13:07:41Z">
         <w:r>
           <w:t xml:space="preserve">domain,</w:t>
         </w:r>
@@ -3635,12 +3635,12 @@
       <w:r>
         <w:t xml:space="preserve"> </w:t>
       </w:r>
-      <w:del w:id="10522" w:author="Revision merge (HM+PL)" w:date="2026-09-03T14:58:09Z">
+      <w:del w:id="10522" w:author="Revision merge (HM+PL)" w:date="2026-09-07T13:07:41Z">
         <w:r>
           <w:delText xml:space="preserve">its</w:delText>
         </w:r>
       </w:del>
-      <w:ins w:id="10523" w:author="Revision merge (HM+PL)" w:date="2026-09-03T14:58:09Z">
+      <w:ins w:id="10523" w:author="Revision merge (HM+PL)" w:date="2026-09-07T13:07:41Z">
         <w:r>
           <w:t xml:space="preserve">the</w:t>
         </w:r>
@@ -3648,12 +3648,12 @@
       <w:r>
         <w:t xml:space="preserve"> </w:t>
       </w:r>
-      <w:del w:id="10524" w:author="Revision merge (HM+PL)" w:date="2026-09-03T14:58:09Z">
+      <w:del w:id="10524" w:author="Revision merge (HM+PL)" w:date="2026-09-07T13:07:41Z">
         <w:r>
           <w:delText xml:space="preserve">own</w:delText>
         </w:r>
       </w:del>
-      <w:ins w:id="10525" w:author="Revision merge (HM+PL)" w:date="2026-09-03T14:58:09Z">
+      <w:ins w:id="10525" w:author="Revision merge (HM+PL)" w:date="2026-09-07T13:07:41Z">
         <w:r>
           <w:t xml:space="preserve">pipeline generates</w:t>
         </w:r>
@@ -3661,12 +3661,12 @@
       <w:r>
         <w:t xml:space="preserve"> alpha </w:t>
       </w:r>
-      <w:del w:id="10526" w:author="Revision merge (HM+PL)" w:date="2026-09-03T14:58:09Z">
+      <w:del w:id="10526" w:author="Revision merge (HM+PL)" w:date="2026-09-07T13:07:41Z">
         <w:r>
           <w:delText xml:space="preserve">diversity,</w:delText>
         </w:r>
       </w:del>
-      <w:ins w:id="10527" w:author="Revision merge (HM+PL)" w:date="2026-09-03T14:58:09Z">
+      <w:ins w:id="10527" w:author="Revision merge (HM+PL)" w:date="2026-09-07T13:07:41Z">
         <w:r>
           <w:t xml:space="preserve">diversity metrics,</w:t>
         </w:r>
@@ -3674,12 +3674,12 @@
       <w:r>
         <w:t xml:space="preserve"> Venn </w:t>
       </w:r>
-      <w:del w:id="10528" w:author="Revision merge (HM+PL)" w:date="2026-09-03T14:58:09Z">
+      <w:del w:id="10528" w:author="Revision merge (HM+PL)" w:date="2026-09-07T13:07:41Z">
         <w:r>
           <w:delText xml:space="preserve">diagram,</w:delText>
         </w:r>
       </w:del>
-      <w:ins w:id="10529" w:author="Revision merge (HM+PL)" w:date="2026-09-03T14:58:09Z">
+      <w:ins w:id="10529" w:author="Revision merge (HM+PL)" w:date="2026-09-07T13:07:41Z">
         <w:r>
           <w:t xml:space="preserve">diagrams,</w:t>
         </w:r>
@@ -3695,7 +3695,7 @@
       <w:r>
         <w:t xml:space="preserve">(5) *Integration, reporting and manifest* (R/12–R/14).</w:t>
       </w:r>
-      <w:ins w:id="10530" w:author="Revision merge (HM+PL)" w:date="2026-09-03T14:58:09Z">
+      <w:ins w:id="10530" w:author="Revision merge (HM+PL)" w:date="2026-09-07T13:07:41Z">
         <w:r>
           <w:t xml:space="preserve"> The final stage integrates results across all domains and produces the reporting outputs.</w:t>
         </w:r>
@@ -3711,12 +3711,12 @@
       <w:r>
         <w:t xml:space="preserve">**Reporting.** </w:t>
       </w:r>
-      <w:del w:id="10531" w:author="Revision merge (HM+PL)" w:date="2026-09-03T14:58:09Z">
+      <w:del w:id="10531" w:author="Revision merge (HM+PL)" w:date="2026-09-07T13:07:41Z">
         <w:r>
           <w:delText xml:space="preserve">The</w:delText>
         </w:r>
       </w:del>
-      <w:ins w:id="10532" w:author="Revision merge (HM+PL)" w:date="2026-09-03T14:58:09Z">
+      <w:ins w:id="10532" w:author="Revision merge (HM+PL)" w:date="2026-09-07T13:07:41Z">
         <w:r>
           <w:t xml:space="preserve">Results are rendered through a</w:t>
         </w:r>
@@ -3724,7 +3724,7 @@
       <w:r>
         <w:t xml:space="preserve"> Quarto template</w:t>
       </w:r>
-      <w:del w:id="10533" w:author="Revision merge (HM+PL)" w:date="2026-09-03T14:58:09Z">
+      <w:del w:id="10533" w:author="Revision merge (HM+PL)" w:date="2026-09-07T13:07:41Z">
         <w:r>
           <w:delText xml:space="preserve"> renders all outputs</w:delText>
         </w:r>
@@ -3732,12 +3732,12 @@
       <w:r>
         <w:t xml:space="preserve"> as a multi-page HTML dashboard </w:t>
       </w:r>
-      <w:del w:id="10534" w:author="Revision merge (HM+PL)" w:date="2026-09-03T14:58:09Z">
+      <w:del w:id="10534" w:author="Revision merge (HM+PL)" w:date="2026-09-07T13:07:41Z">
         <w:r>
           <w:delText xml:space="preserve">with</w:delText>
         </w:r>
       </w:del>
-      <w:ins w:id="10535" w:author="Revision merge (HM+PL)" w:date="2026-09-03T14:58:09Z">
+      <w:ins w:id="10535" w:author="Revision merge (HM+PL)" w:date="2026-09-07T13:07:41Z">
         <w:r>
           <w:t xml:space="preserve">containing</w:t>
         </w:r>
@@ -3745,12 +3745,12 @@
       <w:r>
         <w:t xml:space="preserve"> </w:t>
       </w:r>
-      <w:del w:id="10536" w:author="Revision merge (HM+PL)" w:date="2026-09-03T14:58:09Z">
+      <w:del w:id="10536" w:author="Revision merge (HM+PL)" w:date="2026-09-07T13:07:41Z">
         <w:r>
           <w:delText xml:space="preserve">per-domain</w:delText>
         </w:r>
       </w:del>
-      <w:ins w:id="10537" w:author="Revision merge (HM+PL)" w:date="2026-09-03T14:58:09Z">
+      <w:ins w:id="10537" w:author="Revision merge (HM+PL)" w:date="2026-09-07T13:07:41Z">
         <w:r>
           <w:t xml:space="preserve">dedicated</w:t>
         </w:r>
@@ -3758,12 +3758,12 @@
       <w:r>
         <w:t xml:space="preserve"> panels </w:t>
       </w:r>
-      <w:del w:id="10538" w:author="Revision merge (HM+PL)" w:date="2026-09-03T14:58:09Z">
+      <w:del w:id="10538" w:author="Revision merge (HM+PL)" w:date="2026-09-07T13:07:41Z">
         <w:r>
           <w:delText xml:space="preserve">(taxonomy,</w:delText>
         </w:r>
       </w:del>
-      <w:ins w:id="10539" w:author="Revision merge (HM+PL)" w:date="2026-09-03T14:58:09Z">
+      <w:ins w:id="10539" w:author="Revision merge (HM+PL)" w:date="2026-09-07T13:07:41Z">
         <w:r>
           <w:t xml:space="preserve">for taxonomy,</w:t>
         </w:r>
@@ -3771,12 +3771,12 @@
       <w:r>
         <w:t xml:space="preserve"> diversity, differential abundance, resistome, virulome, </w:t>
       </w:r>
-      <w:del w:id="10540" w:author="Revision merge (HM+PL)" w:date="2026-09-03T14:58:09Z">
+      <w:del w:id="10540" w:author="Revision merge (HM+PL)" w:date="2026-09-07T13:07:41Z">
         <w:r>
           <w:delText xml:space="preserve">mobilome, network)</w:delText>
         </w:r>
       </w:del>
-      <w:ins w:id="10541" w:author="Revision merge (HM+PL)" w:date="2026-09-03T14:58:09Z">
+      <w:ins w:id="10541" w:author="Revision merge (HM+PL)" w:date="2026-09-07T13:07:41Z">
         <w:r>
           <w:t xml:space="preserve">mobilome</w:t>
         </w:r>
@@ -3784,7 +3784,7 @@
       <w:r>
         <w:t xml:space="preserve"> and</w:t>
       </w:r>
-      <w:ins w:id="10542" w:author="Revision merge (HM+PL)" w:date="2026-09-03T14:58:09Z">
+      <w:ins w:id="10542" w:author="Revision merge (HM+PL)" w:date="2026-09-07T13:07:41Z">
         <w:r>
           <w:t xml:space="preserve"> network, plus</w:t>
         </w:r>
@@ -3792,7 +3792,7 @@
       <w:r>
         <w:t xml:space="preserve"> embedded download links. Dependencies are pinned via `renv`, and the project requires R ≥ 4.5; external command-line tools (Kraken2, Bracken, ABRicate, Re-centrifuge) are assumed to have been run upstream.</w:t>
       </w:r>
-      <w:ins w:id="10543" w:author="Revision merge (HM+PL)" w:date="2026-09-03T14:58:09Z">
+      <w:ins w:id="10543" w:author="Revision merge (HM+PL)" w:date="2026-09-07T13:07:41Z">
         <w:r>
           <w:t xml:space="preserve"> Because MERIDIAN consumes these pre-computed outputs rather than the raw reads, its own footprint is modest and single-threaded (peaking at ~1.5 GB; Section 3), and is therefore decoupled from the substantial memory required by upstream taxonomic classification (for example, a full Kraken2 database), which can be run separately on high-memory or cloud infrastructure.</w:t>
         </w:r>
@@ -3820,12 +3820,12 @@
       <w:r>
         <w:t xml:space="preserve">We </w:t>
       </w:r>
-      <w:del w:id="10544" w:author="Revision merge (HM+PL)" w:date="2026-09-03T14:58:09Z">
+      <w:del w:id="10544" w:author="Revision merge (HM+PL)" w:date="2026-09-07T13:07:41Z">
         <w:r>
           <w:delText xml:space="preserve">are validating</w:delText>
         </w:r>
       </w:del>
-      <w:ins w:id="10545" w:author="Revision merge (HM+PL)" w:date="2026-09-03T14:58:09Z">
+      <w:ins w:id="10545" w:author="Revision merge (HM+PL)" w:date="2026-09-07T13:07:41Z">
         <w:r>
           <w:t xml:space="preserve">validated</w:t>
         </w:r>
@@ -3833,7 +3833,7 @@
       <w:r>
         <w:t xml:space="preserve"> the pipeline against two </w:t>
       </w:r>
-      <w:del w:id="10546" w:author="Revision merge (HM+PL)" w:date="2026-09-03T14:58:09Z">
+      <w:del w:id="10546" w:author="Revision merge (HM+PL)" w:date="2026-09-07T13:07:41Z">
         <w:r>
           <w:delText xml:space="preserve">real </w:delText>
         </w:r>
@@ -3841,12 +3841,12 @@
       <w:r>
         <w:t xml:space="preserve">long-read chicken caecum </w:t>
       </w:r>
-      <w:del w:id="10547" w:author="Revision merge (HM+PL)" w:date="2026-09-03T14:58:09Z">
+      <w:del w:id="10547" w:author="Revision merge (HM+PL)" w:date="2026-09-07T13:07:41Z">
         <w:r>
           <w:delText xml:space="preserve">metagenomics</w:delText>
         </w:r>
       </w:del>
-      <w:ins w:id="10548" w:author="Revision merge (HM+PL)" w:date="2026-09-03T14:58:09Z">
+      <w:ins w:id="10548" w:author="Revision merge (HM+PL)" w:date="2026-09-07T13:07:41Z">
         <w:r>
           <w:t xml:space="preserve">metagenomic</w:t>
         </w:r>
@@ -3854,12 +3854,12 @@
       <w:r>
         <w:t xml:space="preserve"> studies. The </w:t>
       </w:r>
-      <w:del w:id="10549" w:author="Revision merge (HM+PL)" w:date="2026-09-03T14:58:09Z">
+      <w:del w:id="10549" w:author="Revision merge (HM+PL)" w:date="2026-09-07T13:07:41Z">
         <w:r>
           <w:delText xml:space="preserve">reference</w:delText>
         </w:r>
       </w:del>
-      <w:ins w:id="10550" w:author="Revision merge (HM+PL)" w:date="2026-09-03T14:58:09Z">
+      <w:ins w:id="10550" w:author="Revision merge (HM+PL)" w:date="2026-09-07T13:07:41Z">
         <w:r>
           <w:t xml:space="preserve">primary</w:t>
         </w:r>
@@ -3867,12 +3867,12 @@
       <w:r>
         <w:t xml:space="preserve"> </w:t>
       </w:r>
-      <w:del w:id="10551" w:author="Revision merge (HM+PL)" w:date="2026-09-03T14:58:09Z">
+      <w:del w:id="10551" w:author="Revision merge (HM+PL)" w:date="2026-09-07T13:07:41Z">
         <w:r>
           <w:delText xml:space="preserve">cohort</w:delText>
         </w:r>
       </w:del>
-      <w:ins w:id="10552" w:author="Revision merge (HM+PL)" w:date="2026-09-03T14:58:09Z">
+      <w:ins w:id="10552" w:author="Revision merge (HM+PL)" w:date="2026-09-07T13:07:41Z">
         <w:r>
           <w:t xml:space="preserve">dataset</w:t>
         </w:r>
@@ -3880,7 +3880,7 @@
       <w:r>
         <w:t xml:space="preserve"> (`Chicken batch 1`, PC_JC_2024-11-29; 18 samples; 3 dietary groups — Dulse, Reference diet, Soyabean meal) </w:t>
       </w:r>
-      <w:ins w:id="10553" w:author="Revision merge (HM+PL)" w:date="2026-09-03T14:58:09Z">
+      <w:ins w:id="10553" w:author="Revision merge (HM+PL)" w:date="2026-09-07T13:07:41Z">
         <w:r>
           <w:t xml:space="preserve">is publicly available under NCBI BioProject PRJNA1406192 and </w:t>
         </w:r>
@@ -3888,12 +3888,12 @@
       <w:r>
         <w:t xml:space="preserve">has approximately 46 hand-edited R scripts </w:t>
       </w:r>
-      <w:del w:id="10554" w:author="Revision merge (HM+PL)" w:date="2026-09-03T14:58:09Z">
+      <w:del w:id="10554" w:author="Revision merge (HM+PL)" w:date="2026-09-07T13:07:41Z">
         <w:r>
           <w:delText xml:space="preserve">and</w:delText>
         </w:r>
       </w:del>
-      <w:ins w:id="10555" w:author="Revision merge (HM+PL)" w:date="2026-09-03T14:58:09Z">
+      <w:ins w:id="10555" w:author="Revision merge (HM+PL)" w:date="2026-09-07T13:07:41Z">
         <w:r>
           <w:t xml:space="preserve">with</w:t>
         </w:r>
@@ -3901,12 +3901,12 @@
       <w:r>
         <w:t xml:space="preserve"> </w:t>
       </w:r>
-      <w:del w:id="10556" w:author="Revision merge (HM+PL)" w:date="2026-09-03T14:58:09Z">
+      <w:del w:id="10556" w:author="Revision merge (HM+PL)" w:date="2026-09-07T13:07:41Z">
         <w:r>
           <w:delText xml:space="preserve">known-good</w:delText>
         </w:r>
       </w:del>
-      <w:ins w:id="10557" w:author="Revision merge (HM+PL)" w:date="2026-09-03T14:58:09Z">
+      <w:ins w:id="10557" w:author="Revision merge (HM+PL)" w:date="2026-09-07T13:07:41Z">
         <w:r>
           <w:t xml:space="preserve">corresponding validated</w:t>
         </w:r>
@@ -3914,12 +3914,12 @@
       <w:r>
         <w:t xml:space="preserve"> figures and </w:t>
       </w:r>
-      <w:del w:id="10558" w:author="Revision merge (HM+PL)" w:date="2026-09-03T14:58:09Z">
+      <w:del w:id="10558" w:author="Revision merge (HM+PL)" w:date="2026-09-07T13:07:41Z">
         <w:r>
           <w:delText xml:space="preserve">tables already in place,</w:delText>
         </w:r>
       </w:del>
-      <w:ins w:id="10559" w:author="Revision merge (HM+PL)" w:date="2026-09-03T14:58:09Z">
+      <w:ins w:id="10559" w:author="Revision merge (HM+PL)" w:date="2026-09-07T13:07:41Z">
         <w:r>
           <w:t xml:space="preserve">tables,</w:t>
         </w:r>
@@ -3927,12 +3927,12 @@
       <w:r>
         <w:t xml:space="preserve"> so each stage can be compared output-for-output against the corresponding ground-truth artefact. The </w:t>
       </w:r>
-      <w:del w:id="10560" w:author="Revision merge (HM+PL)" w:date="2026-09-03T14:58:09Z">
+      <w:del w:id="10560" w:author="Revision merge (HM+PL)" w:date="2026-09-07T13:07:41Z">
         <w:r>
           <w:delText xml:space="preserve">scaling</w:delText>
         </w:r>
       </w:del>
-      <w:ins w:id="10561" w:author="Revision merge (HM+PL)" w:date="2026-09-03T14:58:09Z">
+      <w:ins w:id="10561" w:author="Revision merge (HM+PL)" w:date="2026-09-07T13:07:41Z">
         <w:r>
           <w:t xml:space="preserve">second</w:t>
         </w:r>
@@ -3940,12 +3940,12 @@
       <w:r>
         <w:t xml:space="preserve"> </w:t>
       </w:r>
-      <w:del w:id="10562" w:author="Revision merge (HM+PL)" w:date="2026-09-03T14:58:09Z">
+      <w:del w:id="10562" w:author="Revision merge (HM+PL)" w:date="2026-09-07T13:07:41Z">
         <w:r>
           <w:delText xml:space="preserve">and feature-coverage cohort</w:delText>
         </w:r>
       </w:del>
-      <w:ins w:id="10563" w:author="Revision merge (HM+PL)" w:date="2026-09-03T14:58:09Z">
+      <w:ins w:id="10563" w:author="Revision merge (HM+PL)" w:date="2026-09-07T13:07:41Z">
         <w:r>
           <w:t xml:space="preserve">dataset</w:t>
         </w:r>
@@ -3953,12 +3953,12 @@
       <w:r>
         <w:t xml:space="preserve"> (`Chicken batch 2`, JC_FL_2025-05-20; 32 </w:t>
       </w:r>
-      <w:del w:id="10564" w:author="Revision merge (HM+PL)" w:date="2026-09-03T14:58:09Z">
+      <w:del w:id="10564" w:author="Revision merge (HM+PL)" w:date="2026-09-07T13:07:41Z">
         <w:r>
           <w:delText xml:space="preserve">samples;</w:delText>
         </w:r>
       </w:del>
-      <w:ins w:id="10565" w:author="Revision merge (HM+PL)" w:date="2026-09-03T14:58:09Z">
+      <w:ins w:id="10565" w:author="Revision merge (HM+PL)" w:date="2026-09-07T13:07:41Z">
         <w:r>
           <w:t xml:space="preserve">samples), for which public release is pending publication of the associated study, was used for scalability and feature coverage: samples were organised into a</w:t>
         </w:r>
@@ -3966,12 +3966,12 @@
       <w:r>
         <w:t xml:space="preserve"> 4-level composite `Treatment_Bird` grouping </w:t>
       </w:r>
-      <w:del w:id="10566" w:author="Revision merge (HM+PL)" w:date="2026-09-03T14:58:09Z">
+      <w:del w:id="10566" w:author="Revision merge (HM+PL)" w:date="2026-09-07T13:07:41Z">
         <w:r>
           <w:delText xml:space="preserve">— Control_W4,</w:delText>
         </w:r>
       </w:del>
-      <w:ins w:id="10567" w:author="Revision merge (HM+PL)" w:date="2026-09-03T14:58:09Z">
+      <w:ins w:id="10567" w:author="Revision merge (HM+PL)" w:date="2026-09-07T13:07:41Z">
         <w:r>
           <w:t xml:space="preserve">(Control_W4,</w:t>
         </w:r>
@@ -3979,12 +3979,12 @@
       <w:r>
         <w:t xml:space="preserve"> Control_W5, Dulse_W4, Dulse_W5) </w:t>
       </w:r>
-      <w:del w:id="10568" w:author="Revision merge (HM+PL)" w:date="2026-09-03T14:58:09Z">
+      <w:del w:id="10568" w:author="Revision merge (HM+PL)" w:date="2026-09-07T13:07:41Z">
         <w:r>
           <w:delText xml:space="preserve">exercises</w:delText>
         </w:r>
       </w:del>
-      <w:ins w:id="10569" w:author="Revision merge (HM+PL)" w:date="2026-09-03T14:58:09Z">
+      <w:ins w:id="10569" w:author="Revision merge (HM+PL)" w:date="2026-09-07T13:07:41Z">
         <w:r>
           <w:t xml:space="preserve">with</w:t>
         </w:r>
@@ -4144,12 +4144,12 @@
       <w:r>
         <w:t xml:space="preserve">Across both </w:t>
       </w:r>
-      <w:del w:id="10570" w:author="Revision merge (HM+PL)" w:date="2026-09-03T14:58:09Z">
+      <w:del w:id="10570" w:author="Revision merge (HM+PL)" w:date="2026-09-07T13:07:41Z">
         <w:r>
           <w:delText xml:space="preserve">cohorts</w:delText>
         </w:r>
       </w:del>
-      <w:ins w:id="10571" w:author="Revision merge (HM+PL)" w:date="2026-09-03T14:58:09Z">
+      <w:ins w:id="10571" w:author="Revision merge (HM+PL)" w:date="2026-09-07T13:07:41Z">
         <w:r>
           <w:t xml:space="preserve">datasets</w:t>
         </w:r>
@@ -4157,12 +4157,12 @@
       <w:r>
         <w:t xml:space="preserve"> (**Table 1**), every enabled stage produced its expected primary artefact under identical settings. Feature counts scale with cohort size and grouping complexity: B2 (n=32, 4-level `Treatment_Bird`) yields ~1.5–2× the resistome (648 vs 348 rows), virulome (492 vs 320) and mobilome (137 vs 65) rows of B1, with 53 vs 31 differentially abundant taxa across 6 vs 3 pairwise contrasts and a denser integrated network (576 edges/210 nodes/modularity 0.40 vs 247/100/0.31). The pipeline closes cleanly on both runs, producing a contract-v1.2 `manifest.json` (~80–85 kB) and a Quarto HTML dashboard (~14–18 MB). The performance profile (**Figure 2**) illustrated that the end-to-end runtime grew from 6m 41s on B1 to 8m 19s on B2 (+24 %, sublinear in both sample count and pairwise-contrast count), dominated on both cohorts by ALDEx2 differential abundance (32 % of B1 total, 40 % of B2). Peak R-process memory tracks the same monotone </w:t>
       </w:r>
-      <w:del w:id="10572" w:author="Revision merge (HM+PL)" w:date="2026-09-03T14:58:09Z">
+      <w:del w:id="10572" w:author="Revision merge (HM+PL)" w:date="2026-09-07T13:07:41Z">
         <w:r>
           <w:delText xml:space="preserve">profile —</w:delText>
         </w:r>
       </w:del>
-      <w:ins w:id="10573" w:author="Revision merge (HM+PL)" w:date="2026-09-03T14:58:09Z">
+      <w:ins w:id="10573" w:author="Revision merge (HM+PL)" w:date="2026-09-07T13:07:41Z">
         <w:r>
           <w:t xml:space="preserve">profile,</w:t>
         </w:r>
@@ -4183,126 +4183,101 @@
       <w:pPr>
         <w:spacing w:after="120"/>
       </w:pPr>
-      <w:r>
-        <w:t xml:space="preserve">One </w:t>
-      </w:r>
-      <w:del w:id="10574" w:author="Revision merge (HM+PL)" w:date="2026-09-03T14:58:09Z">
-        <w:r>
-          <w:delText xml:space="preserve">expected</w:delText>
-        </w:r>
-      </w:del>
-      <w:ins w:id="10575" w:author="Revision merge (HM+PL)" w:date="2026-09-03T14:58:09Z">
-        <w:r>
-          <w:t xml:space="preserve">anticipated</w:t>
-        </w:r>
-      </w:ins>
-      <w:r>
-        <w:t xml:space="preserve"> and deliberate </w:t>
-      </w:r>
-      <w:del w:id="10576" w:author="Revision merge (HM+PL)" w:date="2026-09-03T14:58:09Z">
-        <w:r>
-          <w:delText xml:space="preserve">divergence</w:delText>
-        </w:r>
-      </w:del>
-      <w:ins w:id="10577" w:author="Revision merge (HM+PL)" w:date="2026-09-03T14:58:09Z">
-        <w:r>
-          <w:t xml:space="preserve">discrepancy</w:t>
-        </w:r>
-      </w:ins>
-      <w:r>
-        <w:t xml:space="preserve"> </w:t>
-      </w:r>
-      <w:del w:id="10578" w:author="Revision merge (HM+PL)" w:date="2026-09-03T14:58:09Z">
-        <w:r>
-          <w:delText xml:space="preserve">concerns</w:delText>
-        </w:r>
-      </w:del>
-      <w:ins w:id="10579" w:author="Revision merge (HM+PL)" w:date="2026-09-03T14:58:09Z">
-        <w:r>
-          <w:t xml:space="preserve">arises at</w:t>
-        </w:r>
-      </w:ins>
-      <w:r>
-        <w:t xml:space="preserve"> the resistome stage: the ground-truth `cleanData.R` misparses taxids carrying variant suffixes, dropping the corresponding ABRicate rows. R/02 </w:t>
-      </w:r>
-      <w:del w:id="10580" w:author="Revision merge (HM+PL)" w:date="2026-09-03T14:58:09Z">
-        <w:r>
-          <w:delText xml:space="preserve">fixes</w:delText>
-        </w:r>
-      </w:del>
-      <w:ins w:id="10581" w:author="Revision merge (HM+PL)" w:date="2026-09-03T14:58:09Z">
-        <w:r>
-          <w:t xml:space="preserve">corrects</w:t>
-        </w:r>
-      </w:ins>
-      <w:r>
-        <w:t xml:space="preserve"> this parsing </w:t>
-      </w:r>
-      <w:del w:id="10582" w:author="Revision merge (HM+PL)" w:date="2026-09-03T14:58:09Z">
-        <w:r>
-          <w:delText xml:space="preserve">bug,</w:delText>
-        </w:r>
-      </w:del>
-      <w:ins w:id="10583" w:author="Revision merge (HM+PL)" w:date="2026-09-03T14:58:09Z">
-        <w:r>
-          <w:t xml:space="preserve">issue,</w:t>
-        </w:r>
-      </w:ins>
-      <w:r>
-        <w:t xml:space="preserve"> so the pipeline retains 110 additional (sample, GENE) rows relative to the hand-edited output (`scripts/diff_normdata.R` on the 2026-06-23 B1 run: pipeline = 733 rows, ground truth = 623; 121 rows </w:t>
-      </w:r>
-      <w:del w:id="10584" w:author="Revision merge (HM+PL)" w:date="2026-09-03T14:58:09Z">
-        <w:r>
-          <w:delText xml:space="preserve">gained</w:delText>
-        </w:r>
-      </w:del>
-      <w:ins w:id="10585" w:author="Revision merge (HM+PL)" w:date="2026-09-03T14:58:09Z">
-        <w:r>
-          <w:t xml:space="preserve">recovered</w:t>
-        </w:r>
-      </w:ins>
-      <w:r>
-        <w:t xml:space="preserve"> by the parsing </w:t>
-      </w:r>
-      <w:del w:id="10586" w:author="Revision merge (HM+PL)" w:date="2026-09-03T14:58:09Z">
-        <w:r>
-          <w:delText xml:space="preserve">fix,</w:delText>
-        </w:r>
-      </w:del>
-      <w:ins w:id="10587" w:author="Revision merge (HM+PL)" w:date="2026-09-03T14:58:09Z">
-        <w:r>
-          <w:t xml:space="preserve">correction, and</w:t>
-        </w:r>
-      </w:ins>
-      <w:r>
-        <w:t xml:space="preserve"> 11 rows present in the ground truth that the pipeline currently </w:t>
-      </w:r>
-      <w:del w:id="10588" w:author="Revision merge (HM+PL)" w:date="2026-09-03T14:58:09Z">
-        <w:r>
-          <w:delText xml:space="preserve">drops —</w:delText>
-        </w:r>
-      </w:del>
-      <w:ins w:id="10589" w:author="Revision merge (HM+PL)" w:date="2026-09-03T14:58:09Z">
-        <w:r>
-          <w:t xml:space="preserve">drops,</w:t>
-        </w:r>
-      </w:ins>
-      <w:r>
-        <w:t xml:space="preserve"> concentrated in a handful of plasmid replicon and accessory resistance calls, queued for inspection rather than treated as a regression). Jaccard agreement on the `(sample, GENE)` key set is 0.82. </w:t>
-      </w:r>
-      <w:del w:id="10590" w:author="Revision merge (HM+PL)" w:date="2026-09-03T14:58:09Z">
-        <w:r>
-          <w:delText xml:space="preserve">Across the</w:delText>
-        </w:r>
-      </w:del>
-      <w:ins w:id="10591" w:author="Revision merge (HM+PL)" w:date="2026-09-03T14:58:09Z">
-        <w:r>
-          <w:t xml:space="preserve">For</w:t>
-        </w:r>
-      </w:ins>
-      <w:r>
-        <w:t xml:space="preserve"> other stages with directly comparable ground-truth artefacts, sample-set agreement is exact for alpha diversity (18/18), and Jaccard for the network Gephi exports against the most recent hand-edited snapshot is 0.85 (nodes) and 0.87 (edges). Per-stage comparisons against the remaining hand-edited artefacts — taxonomy, beta diversity, and differential abundance — are deferred to a separate validation effort. The Re-centrifuge column-slicing heuristic in R/02 is acknowledged as still coarse and is queued for rework.</w:t>
-      </w:r>
+      <w:del w:id="10574" w:author="Revision merge (HM+PL)" w:date="2026-09-07T13:07:41Z">
+        <w:r>
+          <w:delText xml:space="preserve">One expected and deliberate divergence concerns the resistome stage: the ground-truth `cleanData.R` misparses taxids carrying variant suffixes, dropping the corresponding ABRicate rows. R/02 fixes this parsing bug, so the pipeline retains 110 additional (sample, GENE) rows relative to the hand-edited output (`scripts/diff_normdata.R` on the 2026-06-23 B1 run: pipeline = 733 rows, ground truth = 623; 121 rows gained by the parsing fix, 11 rows present in the ground truth that the pipeline currently drops — concentrated in a handful of plasmid replicon and accessory resistance calls, queued for inspection rather than treated as a regression). Jaccard agreement on the `(sample, GENE)` key set is 0.82. Across the other stages with directly comparable ground-truth artefacts, sample-set agreement is exact for alpha diversity (18/18), and Jaccard for the network Gephi exports against the most recent hand-edited snapshot is 0.85 (nodes) and 0.87 (edges). Per-stage comparisons against the remaining hand-edited artefacts — taxonomy, beta diversity, and differential abundance — are deferred to a separate validation effort. The Re-centrifuge column-slicing heuristic in R/02 is acknowledged as still coarse and is queued for rework.</w:delText>
+        </w:r>
+      </w:del>
+    </w:p>
+    <w:p>
+      <w:pPr>
+        <w:spacing w:after="120"/>
+      </w:pPr>
+      <w:ins w:id="10575" w:author="Revision merge (HM+PL)" w:date="2026-09-07T13:07:41Z">
+        <w:r>
+          <w:t xml:space="preserve">One anticipated and deliberate discrepancy arises at the resistome stage: the ground-truth `cleanData.R` misparses taxids carrying variant suffixes, dropping the corresponding ABRicate rows. R/02 corrects this parsing issue, so the pipeline retains 110 additional (sample, GENE) rows relative to the hand-edited output (`scripts/diff_normdata.R` on the 2026-06-23 B1 run: pipeline = 733 rows, ground truth = 623; 121 rows recovered by the parsing correction, and 11 rows present in the ground truth that the pipeline currently drops, concentrated in a handful of plasmid replicon and accessory resistance calls, queued for inspection rather than treated as a regression). Jaccard agreement on the `(sample, GENE)` key set is 0.82. For other stages with directly comparable ground-truth artefacts, sample-set agreement is exact for alpha diversity (18/18), and Jaccard for the network Gephi exports against the most recent hand-edited snapshot is 0.85 (nodes) and 0.87 (edges). Per-stage comparisons against the remaining hand-edited artefacts — taxonomy, beta diversity, and differential abundance — are deferred to a separate validation effort. The Re-centrifuge column-slicing heuristic in R/02 is acknowledged as still coarse and is queued for rework.</w:t>
+        </w:r>
+      </w:ins>
+    </w:p>
+    <w:p>
+      <w:pPr>
+        <w:spacing w:after="120"/>
+      </w:pPr>
+      <w:ins w:id="10576" w:author="Revision merge (HM+PL)" w:date="2026-09-07T13:07:41Z">
+        <w:r>
+          <w:t xml:space="preserve">To assess portability beyond the development cohorts, we applied MERIDIAN unmodified — changing only `config.yaml` — to two independent, publicly available long-read (ONT) metagenomic studies spanning the One Health continuum: hospital wastewater versus tap water from five Egyptian hospitals (NCBI BioProject PRJNA1266479; 20 samples) and anthropogenically impacted versus natural wetland sites along the East Atlantic Flyway (ENA BioProject PRJEB96272; 24 samples). Both cohorts completed all fifteen stages in a single run (4m 08s and 5m 54s; peak 2.0 and 3.5 GB), each emitting a Quarto dashboard, publication panels and a contract-v1.2 `manifest.json`. The pipeline recovered biologically coherent structure: hospital wastewater was significantly richer and compositionally distinct from tap water (PERMANOVA R² = 0.18, p = 3 × 10⁻⁴), and wetland virulence-factor load was higher at anthropogenically impacted sites (PERMANOVA R² = 0.25, p_adj = 0.015), consistent with the source study. Both datasets also exercised edge cases absent from the chicken cohorts — a single-group resistome/mobilome (tap water carried essentially no ARGs) and a complete absence of PlasmidFinder hits (wetland water) — which the pipeline handled by skipping the affected sub-analyses with logged notices rather than failing. As these datasets lack hand-curated ground-truth artefacts, they demonstrate portability and robustness across sample types rather than output-for-output correctness.</w:t>
+        </w:r>
+      </w:ins>
+    </w:p>
+    <w:p>
+      <w:pPr>
+        <w:spacing w:after="120"/>
+      </w:pPr>
+      <w:ins w:id="10577" w:author="Revision merge (HM+PL)" w:date="2026-09-07T13:07:41Z">
+        <w:r>
+          <w:t xml:space="preserve">**Table S1.** MERIDIAN applied across four long-read metagenomic cohorts spanning the One Health continuum. B1/B2 are the poultry development cohorts; the Egyptian hospital-wastewater and East Atlantic Flyway wetland cohorts are independent public datasets analysed with configuration changes only.</w:t>
+        </w:r>
+      </w:ins>
+    </w:p>
+    <w:p>
+      <w:pPr>
+        <w:spacing w:after="120"/>
+      </w:pPr>
+      <w:ins w:id="10578" w:author="Revision merge (HM+PL)" w:date="2026-09-07T13:07:41Z">
+        <w:r>
+          <w:t xml:space="preserve">| Cohort | One Health axis | n | Primary contrast | Runtime | Peak RAM | Headline result |</w:t>
+        </w:r>
+      </w:ins>
+    </w:p>
+    <w:p>
+      <w:pPr>
+        <w:spacing w:after="120"/>
+      </w:pPr>
+      <w:ins w:id="10579" w:author="Revision merge (HM+PL)" w:date="2026-09-07T13:07:41Z">
+        <w:r>
+          <w:t xml:space="preserve">| --- | --- | --- | --- | --- | --- | --- |</w:t>
+        </w:r>
+      </w:ins>
+    </w:p>
+    <w:p>
+      <w:pPr>
+        <w:spacing w:after="120"/>
+      </w:pPr>
+      <w:ins w:id="10580" w:author="Revision merge (HM+PL)" w:date="2026-09-07T13:07:41Z">
+        <w:r>
+          <w:t xml:space="preserve">| Chicken batch 1 | Livestock (poultry caecum) | 18 | Diet (3 groups) | 6m 41s | 1.33 GB | Ground-truth reference; R/02 parsing fix recovers 110 (sample, GENE) rows |</w:t>
+        </w:r>
+      </w:ins>
+    </w:p>
+    <w:p>
+      <w:pPr>
+        <w:spacing w:after="120"/>
+      </w:pPr>
+      <w:ins w:id="10581" w:author="Revision merge (HM+PL)" w:date="2026-09-07T13:07:41Z">
+        <w:r>
+          <w:t xml:space="preserve">| Chicken batch 2 | Livestock (poultry caecum) | 32 | Treatment × week (4-level) | 8m 19s | 1.51 GB | Sublinear scaling; denser integrated network |</w:t>
+        </w:r>
+      </w:ins>
+    </w:p>
+    <w:p>
+      <w:pPr>
+        <w:spacing w:after="120"/>
+      </w:pPr>
+      <w:ins w:id="10582" w:author="Revision merge (HM+PL)" w:date="2026-09-07T13:07:41Z">
+        <w:r>
+          <w:t xml:space="preserve">| Hospital wastewater (EG) | Human-clinical + built environment | 20 | Wastewater vs tap water | 4m 08s | 1.98 GB | Wastewater richer and compositionally distinct (PERMANOVA R² = 0.18, p = 3 × 10⁻⁴) |</w:t>
+        </w:r>
+      </w:ins>
+    </w:p>
+    <w:p>
+      <w:pPr>
+        <w:spacing w:after="120"/>
+      </w:pPr>
+      <w:ins w:id="10583" w:author="Revision merge (HM+PL)" w:date="2026-09-07T13:07:41Z">
+        <w:r>
+          <w:t xml:space="preserve">| Wetlands (E. Atlantic Flyway) | Wildlife + environment | 24 | Impacted vs natural | 5m 54s | 3.46 GB | Higher virulome load at impacted sites (PERMANOVA R² = 0.25, p_adj = 0.015) |</w:t>
+        </w:r>
+      </w:ins>
     </w:p>
     <w:p>
       <w:pPr>
@@ -4326,12 +4301,12 @@
       <w:r>
         <w:t xml:space="preserve">MERIDIAN </w:t>
       </w:r>
-      <w:del w:id="10592" w:author="Revision merge (HM+PL)" w:date="2026-09-03T14:58:09Z">
+      <w:del w:id="10584" w:author="Revision merge (HM+PL)" w:date="2026-09-07T13:07:41Z">
         <w:r>
           <w:delText xml:space="preserve">consolidates</w:delText>
         </w:r>
       </w:del>
-      <w:ins w:id="10593" w:author="Revision merge (HM+PL)" w:date="2026-09-03T14:58:09Z">
+      <w:ins w:id="10585" w:author="Revision merge (HM+PL)" w:date="2026-09-07T13:07:41Z">
         <w:r>
           <w:t xml:space="preserve">integrates</w:t>
         </w:r>
@@ -4339,12 +4314,12 @@
       <w:r>
         <w:t xml:space="preserve"> community analyses, functional profiling, and an integrated network reconstruction into </w:t>
       </w:r>
-      <w:del w:id="10594" w:author="Revision merge (HM+PL)" w:date="2026-09-03T14:58:09Z">
+      <w:del w:id="10586" w:author="Revision merge (HM+PL)" w:date="2026-09-07T13:07:41Z">
         <w:r>
           <w:delText xml:space="preserve">one</w:delText>
         </w:r>
       </w:del>
-      <w:ins w:id="10595" w:author="Revision merge (HM+PL)" w:date="2026-09-03T14:58:09Z">
+      <w:ins w:id="10587" w:author="Revision merge (HM+PL)" w:date="2026-09-07T13:07:41Z">
         <w:r>
           <w:t xml:space="preserve">a single</w:t>
         </w:r>
@@ -4352,25 +4327,33 @@
       <w:r>
         <w:t xml:space="preserve"> configuration-driven R </w:t>
       </w:r>
-      <w:del w:id="10596" w:author="Revision merge (HM+PL)" w:date="2026-09-03T14:58:09Z">
+      <w:del w:id="10588" w:author="Revision merge (HM+PL)" w:date="2026-09-07T13:07:41Z">
         <w:r>
           <w:delText xml:space="preserve">project</w:delText>
         </w:r>
       </w:del>
-      <w:ins w:id="10597" w:author="Revision merge (HM+PL)" w:date="2026-09-03T14:58:09Z">
+      <w:ins w:id="10589" w:author="Revision merge (HM+PL)" w:date="2026-09-07T13:07:41Z">
         <w:r>
           <w:t xml:space="preserve">workflow</w:t>
         </w:r>
       </w:ins>
       <w:r>
-        <w:t xml:space="preserve"> for long-read shotgun metagenomics. Single-thread end-to-end execution completes in minutes with a low memory footprint, scaling sublinearly with cohort size and grouping complexity. It is </w:t>
-      </w:r>
-      <w:del w:id="10598" w:author="Revision merge (HM+PL)" w:date="2026-09-03T14:58:09Z">
+        <w:t xml:space="preserve"> for long-read shotgun metagenomics. Single-thread end-to-end execution completes in minutes with a low memory footprint, scaling sublinearly with cohort size and grouping complexity. </w:t>
+      </w:r>
+      <w:ins w:id="10590" w:author="Revision merge (HM+PL)" w:date="2026-09-07T13:07:41Z">
+        <w:r>
+          <w:t xml:space="preserve">Beyond the development cohorts, it has been applied without modification to two independent public cohorts spanning the One Health continuum (hospital wastewater and wetland surveillance). </w:t>
+        </w:r>
+      </w:ins>
+      <w:r>
+        <w:t xml:space="preserve">It is </w:t>
+      </w:r>
+      <w:del w:id="10591" w:author="Revision merge (HM+PL)" w:date="2026-09-07T13:07:41Z">
         <w:r>
           <w:delText xml:space="preserve">in</w:delText>
         </w:r>
       </w:del>
-      <w:ins w:id="10599" w:author="Revision merge (HM+PL)" w:date="2026-09-03T14:58:09Z">
+      <w:ins w:id="10592" w:author="Revision merge (HM+PL)" w:date="2026-09-07T13:07:41Z">
         <w:r>
           <w:t xml:space="preserve">currently under</w:t>
         </w:r>
@@ -4378,12 +4361,12 @@
       <w:r>
         <w:t xml:space="preserve"> active </w:t>
       </w:r>
-      <w:del w:id="10600" w:author="Revision merge (HM+PL)" w:date="2026-09-03T14:58:09Z">
+      <w:del w:id="10593" w:author="Revision merge (HM+PL)" w:date="2026-09-07T13:07:41Z">
         <w:r>
           <w:delText xml:space="preserve">development;</w:delText>
         </w:r>
       </w:del>
-      <w:ins w:id="10601" w:author="Revision merge (HM+PL)" w:date="2026-09-03T14:58:09Z">
+      <w:ins w:id="10594" w:author="Revision merge (HM+PL)" w:date="2026-09-07T13:07:41Z">
         <w:r>
           <w:t xml:space="preserve">development, and</w:t>
         </w:r>
@@ -4391,12 +4374,12 @@
       <w:r>
         <w:t xml:space="preserve"> we are releasing this </w:t>
       </w:r>
-      <w:del w:id="10602" w:author="Revision merge (HM+PL)" w:date="2026-09-03T14:58:09Z">
+      <w:del w:id="10595" w:author="Revision merge (HM+PL)" w:date="2026-09-07T13:07:41Z">
         <w:r>
           <w:delText xml:space="preserve">alpha-stage</w:delText>
         </w:r>
       </w:del>
-      <w:ins w:id="10603" w:author="Revision merge (HM+PL)" w:date="2026-09-03T14:58:09Z">
+      <w:ins w:id="10596" w:author="Revision merge (HM+PL)" w:date="2026-09-07T13:07:41Z">
         <w:r>
           <w:t xml:space="preserve">alpha</w:t>
         </w:r>
@@ -4404,12 +4387,12 @@
       <w:r>
         <w:t xml:space="preserve"> </w:t>
       </w:r>
-      <w:del w:id="10604" w:author="Revision merge (HM+PL)" w:date="2026-09-03T14:58:09Z">
+      <w:del w:id="10597" w:author="Revision merge (HM+PL)" w:date="2026-09-07T13:07:41Z">
         <w:r>
           <w:delText xml:space="preserve">workflow</w:delText>
         </w:r>
       </w:del>
-      <w:ins w:id="10605" w:author="Revision merge (HM+PL)" w:date="2026-09-03T14:58:09Z">
+      <w:ins w:id="10598" w:author="Revision merge (HM+PL)" w:date="2026-09-07T13:07:41Z">
         <w:r>
           <w:t xml:space="preserve">version</w:t>
         </w:r>
@@ -4417,7 +4400,7 @@
       <w:r>
         <w:t xml:space="preserve"> (v0.1.0) </w:t>
       </w:r>
-      <w:del w:id="10606" w:author="Revision merge (HM+PL)" w:date="2026-09-03T14:58:09Z">
+      <w:del w:id="10599" w:author="Revision merge (HM+PL)" w:date="2026-09-07T13:07:41Z">
         <w:r>
           <w:delText xml:space="preserve">now </w:delText>
         </w:r>
@@ -4425,12 +4408,12 @@
       <w:r>
         <w:t xml:space="preserve">to </w:t>
       </w:r>
-      <w:del w:id="10607" w:author="Revision merge (HM+PL)" w:date="2026-09-03T14:58:09Z">
+      <w:del w:id="10600" w:author="Revision merge (HM+PL)" w:date="2026-09-07T13:07:41Z">
         <w:r>
           <w:delText xml:space="preserve">invite</w:delText>
         </w:r>
       </w:del>
-      <w:ins w:id="10608" w:author="Revision merge (HM+PL)" w:date="2026-09-03T14:58:09Z">
+      <w:ins w:id="10601" w:author="Revision merge (HM+PL)" w:date="2026-09-07T13:07:41Z">
         <w:r>
           <w:t xml:space="preserve">solicit</w:t>
         </w:r>
@@ -4438,12 +4421,12 @@
       <w:r>
         <w:t xml:space="preserve"> feedback from </w:t>
       </w:r>
-      <w:del w:id="10609" w:author="Revision merge (HM+PL)" w:date="2026-09-03T14:58:09Z">
+      <w:del w:id="10602" w:author="Revision merge (HM+PL)" w:date="2026-09-07T13:07:41Z">
         <w:r>
           <w:delText xml:space="preserve">groups</w:delText>
         </w:r>
       </w:del>
-      <w:ins w:id="10610" w:author="Revision merge (HM+PL)" w:date="2026-09-03T14:58:09Z">
+      <w:ins w:id="10603" w:author="Revision merge (HM+PL)" w:date="2026-09-07T13:07:41Z">
         <w:r>
           <w:t xml:space="preserve">researchers</w:t>
         </w:r>
@@ -4451,12 +4434,12 @@
       <w:r>
         <w:t xml:space="preserve"> </w:t>
       </w:r>
-      <w:del w:id="10611" w:author="Revision merge (HM+PL)" w:date="2026-09-03T14:58:09Z">
+      <w:del w:id="10604" w:author="Revision merge (HM+PL)" w:date="2026-09-07T13:07:41Z">
         <w:r>
           <w:delText xml:space="preserve">running</w:delText>
         </w:r>
       </w:del>
-      <w:ins w:id="10612" w:author="Revision merge (HM+PL)" w:date="2026-09-03T14:58:09Z">
+      <w:ins w:id="10605" w:author="Revision merge (HM+PL)" w:date="2026-09-07T13:07:41Z">
         <w:r>
           <w:t xml:space="preserve">conducting</w:t>
         </w:r>
@@ -4464,12 +4447,12 @@
       <w:r>
         <w:t xml:space="preserve"> comparable </w:t>
       </w:r>
-      <w:del w:id="10613" w:author="Revision merge (HM+PL)" w:date="2026-09-03T14:58:09Z">
+      <w:del w:id="10606" w:author="Revision merge (HM+PL)" w:date="2026-09-07T13:07:41Z">
         <w:r>
           <w:delText xml:space="preserve">analyses.</w:delText>
         </w:r>
       </w:del>
-      <w:ins w:id="10614" w:author="Revision merge (HM+PL)" w:date="2026-09-03T14:58:09Z">
+      <w:ins w:id="10607" w:author="Revision merge (HM+PL)" w:date="2026-09-07T13:07:41Z">
         <w:r>
           <w:t xml:space="preserve">long-read metagenomic studies and to guide future development of the workflow.</w:t>
         </w:r>
@@ -4489,12 +4472,12 @@
       <w:r>
         <w:t xml:space="preserve">**Acknowledgements.** The authors thank the **Centre for Innovation in Genomics and Microbiome Sciences (CIGMiS)**, which generated the chicken caecum metagenomics datasets used to develop and validate the pipeline. We are grateful to **colleagues** for feedback on the configuration interface and Quarto report layout, and to the School of </w:t>
       </w:r>
-      <w:del w:id="10615" w:author="Revision merge (HM+PL)" w:date="2026-09-03T14:58:09Z">
+      <w:del w:id="10608" w:author="Revision merge (HM+PL)" w:date="2026-09-07T13:07:41Z">
         <w:r>
           <w:delText xml:space="preserve">Biomedical</w:delText>
         </w:r>
       </w:del>
-      <w:ins w:id="10616" w:author="Revision merge (HM+PL)" w:date="2026-09-03T14:58:09Z">
+      <w:ins w:id="10609" w:author="Revision merge (HM+PL)" w:date="2026-09-07T13:07:41Z">
         <w:r>
           <w:t xml:space="preserve">Medicine</w:t>
         </w:r>
@@ -4502,12 +4485,12 @@
       <w:r>
         <w:t xml:space="preserve"> </w:t>
       </w:r>
-      <w:del w:id="10617" w:author="Revision merge (HM+PL)" w:date="2026-09-03T14:58:09Z">
+      <w:del w:id="10610" w:author="Revision merge (HM+PL)" w:date="2026-09-07T13:07:41Z">
         <w:r>
           <w:delText xml:space="preserve">Science</w:delText>
         </w:r>
       </w:del>
-      <w:ins w:id="10618" w:author="Revision merge (HM+PL)" w:date="2026-09-03T14:58:09Z">
+      <w:ins w:id="10611" w:author="Revision merge (HM+PL)" w:date="2026-09-07T13:07:41Z">
         <w:r>
           <w:t xml:space="preserve">and Bioscience</w:t>
         </w:r>
@@ -4536,7 +4519,7 @@
       <w:pPr>
         <w:spacing w:after="120"/>
       </w:pPr>
-      <w:ins w:id="10619" w:author="Revision merge (HM+PL)" w:date="2026-09-03T14:58:09Z">
+      <w:ins w:id="10612" w:author="Revision merge (HM+PL)" w:date="2026-09-07T13:07:41Z">
         <w:r>
           <w:t xml:space="preserve">**Data Availability.** Sequence data for the primary validation cohort (`Chicken batch 1`) are available from NCBI under BioProject PRJNA1406192. Data for the second cohort (`Chicken batch 2`) will be released upon publication of the associated study. The MERIDIAN source code, documentation and configuration examples are available at https://github.com/Julio92-C/Metagenomics_pipeline_automation (release v0.1.0).</w:t>
         </w:r>

</xml_diff>

<commit_message>
docs(manuscript): scope wetlands functional claim to German subset
The wetlands ABRicate summary covers only the 10 German samples (CARD+VFDB);
France/Spain + GA3_1/GN3_2 are absent from the hits-only summary (genuine
zero-hits vs not-processed still to be verified upstream). Taxonomy/diversity/
DA are complete (all 24). Mobilome zero confirmed genuine (PlasmidFinder run,
no replicons — matches the source study).

- §3: scope the virulome contrast to the German sites, mark provisional
- §3: reword mobilome edge case as a genuine zero consistent with the source
- Table S1: annotate the wetlands headline "German subset, provisional"
- merge_log: record the coverage caveat + follow-up

Co-Authored-By: Claude Opus 4.8 <noreply@anthropic.com>
Claude-Session: https://claude.ai/code/session_011iYU9ZmVnXfPXhgvAmJ24Q
</commit_message>
<xml_diff>
--- a/docs/manuscript/applications_note_merged_tracked.docx
+++ b/docs/manuscript/applications_note_merged_tracked.docx
@@ -32,12 +32,12 @@
       <w:r>
         <w:t xml:space="preserve">Julio C. Ortega Cambara&lt;sup&gt;1&lt;/sup&gt;, Piotr </w:t>
       </w:r>
-      <w:del w:id="10001" w:author="Revision merge (HM+PL)" w:date="2026-09-07T13:07:41Z">
+      <w:del w:id="10001" w:author="Revision merge (HM+PL)" w:date="2026-09-07T16:18:28Z">
         <w:r>
           <w:delText xml:space="preserve">Cuber&lt;sup&gt;4&lt;/sup&gt;,</w:delText>
         </w:r>
       </w:del>
-      <w:ins w:id="10002" w:author="Revision merge (HM+PL)" w:date="2026-09-07T13:07:41Z">
+      <w:ins w:id="10002" w:author="Revision merge (HM+PL)" w:date="2026-09-07T16:18:28Z">
         <w:r>
           <w:t xml:space="preserve">Cuber&lt;sup&gt;2&lt;/sup&gt;,</w:t>
         </w:r>
@@ -45,7 +45,7 @@
       <w:r>
         <w:t xml:space="preserve"> Pedro Humberto Lebre&lt;sup&gt;1&lt;/sup&gt;, </w:t>
       </w:r>
-      <w:del w:id="10003" w:author="Revision merge (HM+PL)" w:date="2026-09-07T13:07:41Z">
+      <w:del w:id="10003" w:author="Revision merge (HM+PL)" w:date="2026-09-07T16:18:28Z">
         <w:r>
           <w:delText xml:space="preserve">Raju Misra&lt;sup&gt;2&lt;/sup&gt;, Timothy D. McHugh&lt;sup&gt;3&lt;/sup&gt;, Sylvia Rofael&lt;sup&gt;3&lt;/sup&gt;, David Lowe&lt;sup&gt;3&lt;/sup&gt;, </w:delText>
         </w:r>
@@ -53,7 +53,7 @@
       <w:r>
         <w:t xml:space="preserve">Hermine </w:t>
       </w:r>
-      <w:ins w:id="10004" w:author="Revision merge (HM+PL)" w:date="2026-09-07T13:07:41Z">
+      <w:ins w:id="10004" w:author="Revision merge (HM+PL)" w:date="2026-09-07T16:18:28Z">
         <w:r>
           <w:t xml:space="preserve">V </w:t>
         </w:r>
@@ -66,12 +66,12 @@
       <w:pPr>
         <w:spacing w:after="120"/>
       </w:pPr>
-      <w:del w:id="10005" w:author="Revision merge (HM+PL)" w:date="2026-09-07T13:07:41Z">
+      <w:del w:id="10005" w:author="Revision merge (HM+PL)" w:date="2026-09-07T16:18:28Z">
         <w:r>
           <w:delText xml:space="preserve">&lt;sup&gt;1&lt;/sup&gt;School</w:delText>
         </w:r>
       </w:del>
-      <w:ins w:id="10006" w:author="Revision merge (HM+PL)" w:date="2026-09-07T13:07:41Z">
+      <w:ins w:id="10006" w:author="Revision merge (HM+PL)" w:date="2026-09-07T16:18:28Z">
         <w:r>
           <w:t xml:space="preserve">&lt;sup&gt;1&lt;/sup&gt;Centre for Innovation in Genomics and Microbiome Sciences, School</w:t>
         </w:r>
@@ -79,12 +79,12 @@
       <w:r>
         <w:t xml:space="preserve"> of </w:t>
       </w:r>
-      <w:del w:id="10007" w:author="Revision merge (HM+PL)" w:date="2026-09-07T13:07:41Z">
+      <w:del w:id="10007" w:author="Revision merge (HM+PL)" w:date="2026-09-07T16:18:28Z">
         <w:r>
           <w:delText xml:space="preserve">Biomedical</w:delText>
         </w:r>
       </w:del>
-      <w:ins w:id="10008" w:author="Revision merge (HM+PL)" w:date="2026-09-07T13:07:41Z">
+      <w:ins w:id="10008" w:author="Revision merge (HM+PL)" w:date="2026-09-07T16:18:28Z">
         <w:r>
           <w:t xml:space="preserve">Medicine</w:t>
         </w:r>
@@ -92,12 +92,12 @@
       <w:r>
         <w:t xml:space="preserve"> </w:t>
       </w:r>
-      <w:del w:id="10009" w:author="Revision merge (HM+PL)" w:date="2026-09-07T13:07:41Z">
+      <w:del w:id="10009" w:author="Revision merge (HM+PL)" w:date="2026-09-07T16:18:28Z">
         <w:r>
           <w:delText xml:space="preserve">Science,</w:delText>
         </w:r>
       </w:del>
-      <w:ins w:id="10010" w:author="Revision merge (HM+PL)" w:date="2026-09-07T13:07:41Z">
+      <w:ins w:id="10010" w:author="Revision merge (HM+PL)" w:date="2026-09-07T16:18:28Z">
         <w:r>
           <w:t xml:space="preserve">and Bioscience,</w:t>
         </w:r>
@@ -105,12 +105,12 @@
       <w:r>
         <w:t xml:space="preserve"> University of West London, London, United Kingdom </w:t>
       </w:r>
-      <w:del w:id="10011" w:author="Revision merge (HM+PL)" w:date="2026-09-07T13:07:41Z">
+      <w:del w:id="10011" w:author="Revision merge (HM+PL)" w:date="2026-09-07T16:18:28Z">
         <w:r>
           <w:delText xml:space="preserve">&lt;sup&gt;2&lt;/sup&gt;UK Health Security Agency, London, United Kingdom &lt;sup&gt;3&lt;/sup&gt;Centre for Clinical Microbiology, University College London, London, United Kingdom &lt;sup&gt;4&lt;/sup&gt;Natural</w:delText>
         </w:r>
       </w:del>
-      <w:ins w:id="10012" w:author="Revision merge (HM+PL)" w:date="2026-09-07T13:07:41Z">
+      <w:ins w:id="10012" w:author="Revision merge (HM+PL)" w:date="2026-09-07T16:18:28Z">
         <w:r>
           <w:t xml:space="preserve">&lt;sup&gt;2&lt;/sup&gt;Natural</w:t>
         </w:r>
@@ -161,12 +161,12 @@
       <w:pPr>
         <w:spacing w:after="120"/>
       </w:pPr>
-      <w:del w:id="10013" w:author="Revision merge (HM+PL)" w:date="2026-09-07T13:07:41Z">
+      <w:del w:id="10013" w:author="Revision merge (HM+PL)" w:date="2026-09-07T16:18:28Z">
         <w:r>
           <w:delText xml:space="preserve">**Motivation.**</w:delText>
         </w:r>
       </w:del>
-      <w:ins w:id="10014" w:author="Revision merge (HM+PL)" w:date="2026-09-07T13:07:41Z">
+      <w:ins w:id="10014" w:author="Revision merge (HM+PL)" w:date="2026-09-07T16:18:28Z">
         <w:r>
           <w:t xml:space="preserve">**Background:**</w:t>
         </w:r>
@@ -174,12 +174,12 @@
       <w:r>
         <w:t xml:space="preserve"> Long-read shotgun metagenomics studies are </w:t>
       </w:r>
-      <w:del w:id="10015" w:author="Revision merge (HM+PL)" w:date="2026-09-07T13:07:41Z">
+      <w:del w:id="10015" w:author="Revision merge (HM+PL)" w:date="2026-09-07T16:18:28Z">
         <w:r>
           <w:delText xml:space="preserve">typically</w:delText>
         </w:r>
       </w:del>
-      <w:ins w:id="10016" w:author="Revision merge (HM+PL)" w:date="2026-09-07T13:07:41Z">
+      <w:ins w:id="10016" w:author="Revision merge (HM+PL)" w:date="2026-09-07T16:18:28Z">
         <w:r>
           <w:t xml:space="preserve">often</w:t>
         </w:r>
@@ -187,12 +187,12 @@
       <w:r>
         <w:t xml:space="preserve"> analysed </w:t>
       </w:r>
-      <w:del w:id="10017" w:author="Revision merge (HM+PL)" w:date="2026-09-07T13:07:41Z">
+      <w:del w:id="10017" w:author="Revision merge (HM+PL)" w:date="2026-09-07T16:18:28Z">
         <w:r>
           <w:delText xml:space="preserve">by</w:delText>
         </w:r>
       </w:del>
-      <w:ins w:id="10018" w:author="Revision merge (HM+PL)" w:date="2026-09-07T13:07:41Z">
+      <w:ins w:id="10018" w:author="Revision merge (HM+PL)" w:date="2026-09-07T16:18:28Z">
         <w:r>
           <w:t xml:space="preserve">using</w:t>
         </w:r>
@@ -200,12 +200,12 @@
       <w:r>
         <w:t xml:space="preserve"> </w:t>
       </w:r>
-      <w:del w:id="10019" w:author="Revision merge (HM+PL)" w:date="2026-09-07T13:07:41Z">
+      <w:del w:id="10019" w:author="Revision merge (HM+PL)" w:date="2026-09-07T16:18:28Z">
         <w:r>
           <w:delText xml:space="preserve">hand-editing</w:delText>
         </w:r>
       </w:del>
-      <w:ins w:id="10020" w:author="Revision merge (HM+PL)" w:date="2026-09-07T13:07:41Z">
+      <w:ins w:id="10020" w:author="Revision merge (HM+PL)" w:date="2026-09-07T16:18:28Z">
         <w:r>
           <w:t xml:space="preserve">project-specific</w:t>
         </w:r>
@@ -213,12 +213,12 @@
       <w:r>
         <w:t xml:space="preserve"> </w:t>
       </w:r>
-      <w:del w:id="10021" w:author="Revision merge (HM+PL)" w:date="2026-09-07T13:07:41Z">
+      <w:del w:id="10021" w:author="Revision merge (HM+PL)" w:date="2026-09-07T16:18:28Z">
         <w:r>
           <w:delText xml:space="preserve">dozens</w:delText>
         </w:r>
       </w:del>
-      <w:ins w:id="10022" w:author="Revision merge (HM+PL)" w:date="2026-09-07T13:07:41Z">
+      <w:ins w:id="10022" w:author="Revision merge (HM+PL)" w:date="2026-09-07T16:18:28Z">
         <w:r>
           <w:t xml:space="preserve">collections</w:t>
         </w:r>
@@ -226,7 +226,7 @@
       <w:r>
         <w:t xml:space="preserve"> of </w:t>
       </w:r>
-      <w:ins w:id="10023" w:author="Revision merge (HM+PL)" w:date="2026-09-07T13:07:41Z">
+      <w:ins w:id="10023" w:author="Revision merge (HM+PL)" w:date="2026-09-07T16:18:28Z">
         <w:r>
           <w:t xml:space="preserve">manually edited </w:t>
         </w:r>
@@ -234,12 +234,12 @@
       <w:r>
         <w:t xml:space="preserve">R </w:t>
       </w:r>
-      <w:del w:id="10024" w:author="Revision merge (HM+PL)" w:date="2026-09-07T13:07:41Z">
+      <w:del w:id="10024" w:author="Revision merge (HM+PL)" w:date="2026-09-07T16:18:28Z">
         <w:r>
           <w:delText xml:space="preserve">scripts</w:delText>
         </w:r>
       </w:del>
-      <w:ins w:id="10025" w:author="Revision merge (HM+PL)" w:date="2026-09-07T13:07:41Z">
+      <w:ins w:id="10025" w:author="Revision merge (HM+PL)" w:date="2026-09-07T16:18:28Z">
         <w:r>
           <w:t xml:space="preserve">scripts,</w:t>
         </w:r>
@@ -247,12 +247,12 @@
       <w:r>
         <w:t xml:space="preserve"> </w:t>
       </w:r>
-      <w:del w:id="10026" w:author="Revision merge (HM+PL)" w:date="2026-09-07T13:07:41Z">
+      <w:del w:id="10026" w:author="Revision merge (HM+PL)" w:date="2026-09-07T16:18:28Z">
         <w:r>
           <w:delText xml:space="preserve">per</w:delText>
         </w:r>
       </w:del>
-      <w:ins w:id="10027" w:author="Revision merge (HM+PL)" w:date="2026-09-07T13:07:41Z">
+      <w:ins w:id="10027" w:author="Revision merge (HM+PL)" w:date="2026-09-07T16:18:28Z">
         <w:r>
           <w:t xml:space="preserve">requiring</w:t>
         </w:r>
@@ -260,12 +260,12 @@
       <w:r>
         <w:t xml:space="preserve"> </w:t>
       </w:r>
-      <w:del w:id="10028" w:author="Revision merge (HM+PL)" w:date="2026-09-07T13:07:41Z">
+      <w:del w:id="10028" w:author="Revision merge (HM+PL)" w:date="2026-09-07T16:18:28Z">
         <w:r>
           <w:delText xml:space="preserve">project</w:delText>
         </w:r>
       </w:del>
-      <w:ins w:id="10029" w:author="Revision merge (HM+PL)" w:date="2026-09-07T13:07:41Z">
+      <w:ins w:id="10029" w:author="Revision merge (HM+PL)" w:date="2026-09-07T16:18:28Z">
         <w:r>
           <w:t xml:space="preserve">repeated</w:t>
         </w:r>
@@ -273,12 +273,12 @@
       <w:r>
         <w:t xml:space="preserve"> </w:t>
       </w:r>
-      <w:del w:id="10030" w:author="Revision merge (HM+PL)" w:date="2026-09-07T13:07:41Z">
+      <w:del w:id="10030" w:author="Revision merge (HM+PL)" w:date="2026-09-07T16:18:28Z">
         <w:r>
           <w:delText xml:space="preserve">—</w:delText>
         </w:r>
       </w:del>
-      <w:ins w:id="10031" w:author="Revision merge (HM+PL)" w:date="2026-09-07T13:07:41Z">
+      <w:ins w:id="10031" w:author="Revision merge (HM+PL)" w:date="2026-09-07T16:18:28Z">
         <w:r>
           <w:t xml:space="preserve">modifications</w:t>
         </w:r>
@@ -286,12 +286,12 @@
       <w:r>
         <w:t xml:space="preserve"> </w:t>
       </w:r>
-      <w:del w:id="10032" w:author="Revision merge (HM+PL)" w:date="2026-09-07T13:07:41Z">
+      <w:del w:id="10032" w:author="Revision merge (HM+PL)" w:date="2026-09-07T16:18:28Z">
         <w:r>
           <w:delText xml:space="preserve">pasting</w:delText>
         </w:r>
       </w:del>
-      <w:ins w:id="10033" w:author="Revision merge (HM+PL)" w:date="2026-09-07T13:07:41Z">
+      <w:ins w:id="10033" w:author="Revision merge (HM+PL)" w:date="2026-09-07T16:18:28Z">
         <w:r>
           <w:t xml:space="preserve">of</w:t>
         </w:r>
@@ -299,12 +299,12 @@
       <w:r>
         <w:t xml:space="preserve"> sample identifiers, </w:t>
       </w:r>
-      <w:del w:id="10034" w:author="Revision merge (HM+PL)" w:date="2026-09-07T13:07:41Z">
+      <w:del w:id="10034" w:author="Revision merge (HM+PL)" w:date="2026-09-07T16:18:28Z">
         <w:r>
           <w:delText xml:space="preserve">patching</w:delText>
         </w:r>
       </w:del>
-      <w:ins w:id="10035" w:author="Revision merge (HM+PL)" w:date="2026-09-07T13:07:41Z">
+      <w:ins w:id="10035" w:author="Revision merge (HM+PL)" w:date="2026-09-07T16:18:28Z">
         <w:r>
           <w:t xml:space="preserve">taxonomic</w:t>
         </w:r>
@@ -312,12 +312,12 @@
       <w:r>
         <w:t xml:space="preserve"> </w:t>
       </w:r>
-      <w:del w:id="10036" w:author="Revision merge (HM+PL)" w:date="2026-09-07T13:07:41Z">
+      <w:del w:id="10036" w:author="Revision merge (HM+PL)" w:date="2026-09-07T16:18:28Z">
         <w:r>
           <w:delText xml:space="preserve">taxonomy strings</w:delText>
         </w:r>
       </w:del>
-      <w:ins w:id="10037" w:author="Revision merge (HM+PL)" w:date="2026-09-07T13:07:41Z">
+      <w:ins w:id="10037" w:author="Revision merge (HM+PL)" w:date="2026-09-07T16:18:28Z">
         <w:r>
           <w:t xml:space="preserve">annotations</w:t>
         </w:r>
@@ -325,12 +325,12 @@
       <w:r>
         <w:t xml:space="preserve"> and </w:t>
       </w:r>
-      <w:del w:id="10038" w:author="Revision merge (HM+PL)" w:date="2026-09-07T13:07:41Z">
+      <w:del w:id="10038" w:author="Revision merge (HM+PL)" w:date="2026-09-07T16:18:28Z">
         <w:r>
           <w:delText xml:space="preserve">copying</w:delText>
         </w:r>
       </w:del>
-      <w:ins w:id="10039" w:author="Revision merge (HM+PL)" w:date="2026-09-07T13:07:41Z">
+      <w:ins w:id="10039" w:author="Revision merge (HM+PL)" w:date="2026-09-07T16:18:28Z">
         <w:r>
           <w:t xml:space="preserve">analysis</w:t>
         </w:r>
@@ -338,12 +338,12 @@
       <w:r>
         <w:t xml:space="preserve"> </w:t>
       </w:r>
-      <w:del w:id="10040" w:author="Revision merge (HM+PL)" w:date="2026-09-07T13:07:41Z">
+      <w:del w:id="10040" w:author="Revision merge (HM+PL)" w:date="2026-09-07T16:18:28Z">
         <w:r>
           <w:delText xml:space="preserve">chunks</w:delText>
         </w:r>
       </w:del>
-      <w:ins w:id="10041" w:author="Revision merge (HM+PL)" w:date="2026-09-07T13:07:41Z">
+      <w:ins w:id="10041" w:author="Revision merge (HM+PL)" w:date="2026-09-07T16:18:28Z">
         <w:r>
           <w:t xml:space="preserve">parameters,</w:t>
         </w:r>
@@ -351,12 +351,12 @@
       <w:r>
         <w:t xml:space="preserve"> </w:t>
       </w:r>
-      <w:del w:id="10042" w:author="Revision merge (HM+PL)" w:date="2026-09-07T13:07:41Z">
+      <w:del w:id="10042" w:author="Revision merge (HM+PL)" w:date="2026-09-07T16:18:28Z">
         <w:r>
           <w:delText xml:space="preserve">between</w:delText>
         </w:r>
       </w:del>
-      <w:ins w:id="10043" w:author="Revision merge (HM+PL)" w:date="2026-09-07T13:07:41Z">
+      <w:ins w:id="10043" w:author="Revision merge (HM+PL)" w:date="2026-09-07T16:18:28Z">
         <w:r>
           <w:t xml:space="preserve">or</w:t>
         </w:r>
@@ -364,12 +364,12 @@
       <w:r>
         <w:t xml:space="preserve"> </w:t>
       </w:r>
-      <w:del w:id="10044" w:author="Revision merge (HM+PL)" w:date="2026-09-07T13:07:41Z">
+      <w:del w:id="10044" w:author="Revision merge (HM+PL)" w:date="2026-09-07T16:18:28Z">
         <w:r>
           <w:delText xml:space="preserve">studies.</w:delText>
         </w:r>
       </w:del>
-      <w:ins w:id="10045" w:author="Revision merge (HM+PL)" w:date="2026-09-07T13:07:41Z">
+      <w:ins w:id="10045" w:author="Revision merge (HM+PL)" w:date="2026-09-07T16:18:28Z">
         <w:r>
           <w:t xml:space="preserve">else rely on resource-heavy pipelines that require access to high-performance computing (HPC) infrastructure.</w:t>
         </w:r>
@@ -377,12 +377,12 @@
       <w:r>
         <w:t xml:space="preserve"> Existing R workflows </w:t>
       </w:r>
-      <w:del w:id="10046" w:author="Revision merge (HM+PL)" w:date="2026-09-07T13:07:41Z">
+      <w:del w:id="10046" w:author="Revision merge (HM+PL)" w:date="2026-09-07T16:18:28Z">
         <w:r>
           <w:delText xml:space="preserve">largely</w:delText>
         </w:r>
       </w:del>
-      <w:ins w:id="10047" w:author="Revision merge (HM+PL)" w:date="2026-09-07T13:07:41Z">
+      <w:ins w:id="10047" w:author="Revision merge (HM+PL)" w:date="2026-09-07T16:18:28Z">
         <w:r>
           <w:t xml:space="preserve">predominantly</w:t>
         </w:r>
@@ -390,12 +390,12 @@
       <w:r>
         <w:t xml:space="preserve"> </w:t>
       </w:r>
-      <w:del w:id="10048" w:author="Revision merge (HM+PL)" w:date="2026-09-07T13:07:41Z">
+      <w:del w:id="10048" w:author="Revision merge (HM+PL)" w:date="2026-09-07T16:18:28Z">
         <w:r>
           <w:delText xml:space="preserve">target</w:delText>
         </w:r>
       </w:del>
-      <w:ins w:id="10049" w:author="Revision merge (HM+PL)" w:date="2026-09-07T13:07:41Z">
+      <w:ins w:id="10049" w:author="Revision merge (HM+PL)" w:date="2026-09-07T16:18:28Z">
         <w:r>
           <w:t xml:space="preserve">focus on</w:t>
         </w:r>
@@ -403,12 +403,12 @@
       <w:r>
         <w:t xml:space="preserve"> short-read amplicon data or </w:t>
       </w:r>
-      <w:del w:id="10050" w:author="Revision merge (HM+PL)" w:date="2026-09-07T13:07:41Z">
+      <w:del w:id="10050" w:author="Revision merge (HM+PL)" w:date="2026-09-07T16:18:28Z">
         <w:r>
           <w:delText xml:space="preserve">a</w:delText>
         </w:r>
       </w:del>
-      <w:ins w:id="10051" w:author="Revision merge (HM+PL)" w:date="2026-09-07T13:07:41Z">
+      <w:ins w:id="10051" w:author="Revision merge (HM+PL)" w:date="2026-09-07T16:18:28Z">
         <w:r>
           <w:t xml:space="preserve">isolated</w:t>
         </w:r>
@@ -416,12 +416,12 @@
       <w:r>
         <w:t xml:space="preserve"> </w:t>
       </w:r>
-      <w:del w:id="10052" w:author="Revision merge (HM+PL)" w:date="2026-09-07T13:07:41Z">
+      <w:del w:id="10052" w:author="Revision merge (HM+PL)" w:date="2026-09-07T16:18:28Z">
         <w:r>
           <w:delText xml:space="preserve">single</w:delText>
         </w:r>
       </w:del>
-      <w:ins w:id="10053" w:author="Revision merge (HM+PL)" w:date="2026-09-07T13:07:41Z">
+      <w:ins w:id="10053" w:author="Revision merge (HM+PL)" w:date="2026-09-07T16:18:28Z">
         <w:r>
           <w:t xml:space="preserve">analytical</w:t>
         </w:r>
@@ -429,12 +429,12 @@
       <w:r>
         <w:t xml:space="preserve"> </w:t>
       </w:r>
-      <w:del w:id="10054" w:author="Revision merge (HM+PL)" w:date="2026-09-07T13:07:41Z">
+      <w:del w:id="10054" w:author="Revision merge (HM+PL)" w:date="2026-09-07T16:18:28Z">
         <w:r>
           <w:delText xml:space="preserve">analysis</w:delText>
         </w:r>
       </w:del>
-      <w:ins w:id="10055" w:author="Revision merge (HM+PL)" w:date="2026-09-07T13:07:41Z">
+      <w:ins w:id="10055" w:author="Revision merge (HM+PL)" w:date="2026-09-07T16:18:28Z">
         <w:r>
           <w:t xml:space="preserve">tasks,</w:t>
         </w:r>
@@ -442,12 +442,12 @@
       <w:r>
         <w:t xml:space="preserve"> </w:t>
       </w:r>
-      <w:del w:id="10056" w:author="Revision merge (HM+PL)" w:date="2026-09-07T13:07:41Z">
+      <w:del w:id="10056" w:author="Revision merge (HM+PL)" w:date="2026-09-07T16:18:28Z">
         <w:r>
           <w:delText xml:space="preserve">(e.g.</w:delText>
         </w:r>
       </w:del>
-      <w:ins w:id="10057" w:author="Revision merge (HM+PL)" w:date="2026-09-07T13:07:41Z">
+      <w:ins w:id="10057" w:author="Revision merge (HM+PL)" w:date="2026-09-07T16:18:28Z">
         <w:r>
           <w:t xml:space="preserve">such as</w:t>
         </w:r>
@@ -455,12 +455,12 @@
       <w:r>
         <w:t xml:space="preserve"> resistome </w:t>
       </w:r>
-      <w:del w:id="10058" w:author="Revision merge (HM+PL)" w:date="2026-09-07T13:07:41Z">
+      <w:del w:id="10058" w:author="Revision merge (HM+PL)" w:date="2026-09-07T16:18:28Z">
         <w:r>
           <w:delText xml:space="preserve">risk scoring),</w:delText>
         </w:r>
       </w:del>
-      <w:ins w:id="10059" w:author="Revision merge (HM+PL)" w:date="2026-09-07T13:07:41Z">
+      <w:ins w:id="10059" w:author="Revision merge (HM+PL)" w:date="2026-09-07T16:18:28Z">
         <w:r>
           <w:t xml:space="preserve">profiling,</w:t>
         </w:r>
@@ -468,7 +468,7 @@
       <w:r>
         <w:t xml:space="preserve"> leaving</w:t>
       </w:r>
-      <w:ins w:id="10060" w:author="Revision merge (HM+PL)" w:date="2026-09-07T13:07:41Z">
+      <w:ins w:id="10060" w:author="Revision merge (HM+PL)" w:date="2026-09-07T16:18:28Z">
         <w:r>
           <w:t xml:space="preserve"> a gap in integrated, reproducible and sustainable solutions for</w:t>
         </w:r>
@@ -476,12 +476,12 @@
       <w:r>
         <w:t xml:space="preserve"> long-read shotgun </w:t>
       </w:r>
-      <w:del w:id="10061" w:author="Revision merge (HM+PL)" w:date="2026-09-07T13:07:41Z">
+      <w:del w:id="10061" w:author="Revision merge (HM+PL)" w:date="2026-09-07T16:18:28Z">
         <w:r>
           <w:delText xml:space="preserve">studies</w:delText>
         </w:r>
       </w:del>
-      <w:ins w:id="10062" w:author="Revision merge (HM+PL)" w:date="2026-09-07T13:07:41Z">
+      <w:ins w:id="10062" w:author="Revision merge (HM+PL)" w:date="2026-09-07T16:18:28Z">
         <w:r>
           <w:t xml:space="preserve">metagenomics.</w:t>
         </w:r>
@@ -489,12 +489,12 @@
       <w:r>
         <w:t xml:space="preserve"> </w:t>
       </w:r>
-      <w:del w:id="10063" w:author="Revision merge (HM+PL)" w:date="2026-09-07T13:07:41Z">
+      <w:del w:id="10063" w:author="Revision merge (HM+PL)" w:date="2026-09-07T16:18:28Z">
         <w:r>
           <w:delText xml:space="preserve">without</w:delText>
         </w:r>
       </w:del>
-      <w:ins w:id="10064" w:author="Revision merge (HM+PL)" w:date="2026-09-07T13:07:41Z">
+      <w:ins w:id="10064" w:author="Revision merge (HM+PL)" w:date="2026-09-07T16:18:28Z">
         <w:r>
           <w:t xml:space="preserve">Consequently,</w:t>
         </w:r>
@@ -502,12 +502,12 @@
       <w:r>
         <w:t xml:space="preserve"> </w:t>
       </w:r>
-      <w:del w:id="10065" w:author="Revision merge (HM+PL)" w:date="2026-09-07T13:07:41Z">
+      <w:del w:id="10065" w:author="Revision merge (HM+PL)" w:date="2026-09-07T16:18:28Z">
         <w:r>
           <w:delText xml:space="preserve">an</w:delText>
         </w:r>
       </w:del>
-      <w:ins w:id="10066" w:author="Revision merge (HM+PL)" w:date="2026-09-07T13:07:41Z">
+      <w:ins w:id="10066" w:author="Revision merge (HM+PL)" w:date="2026-09-07T16:18:28Z">
         <w:r>
           <w:t xml:space="preserve">researchers</w:t>
         </w:r>
@@ -515,12 +515,12 @@
       <w:r>
         <w:t xml:space="preserve"> </w:t>
       </w:r>
-      <w:del w:id="10067" w:author="Revision merge (HM+PL)" w:date="2026-09-07T13:07:41Z">
+      <w:del w:id="10067" w:author="Revision merge (HM+PL)" w:date="2026-09-07T16:18:28Z">
         <w:r>
           <w:delText xml:space="preserve">integrated,</w:delText>
         </w:r>
       </w:del>
-      <w:ins w:id="10068" w:author="Revision merge (HM+PL)" w:date="2026-09-07T13:07:41Z">
+      <w:ins w:id="10068" w:author="Revision merge (HM+PL)" w:date="2026-09-07T16:18:28Z">
         <w:r>
           <w:t xml:space="preserve">frequently</w:t>
         </w:r>
@@ -528,12 +528,12 @@
       <w:r>
         <w:t xml:space="preserve"> </w:t>
       </w:r>
-      <w:del w:id="10069" w:author="Revision merge (HM+PL)" w:date="2026-09-07T13:07:41Z">
+      <w:del w:id="10069" w:author="Revision merge (HM+PL)" w:date="2026-09-07T16:18:28Z">
         <w:r>
           <w:delText xml:space="preserve">configuration-driven</w:delText>
         </w:r>
       </w:del>
-      <w:ins w:id="10070" w:author="Revision merge (HM+PL)" w:date="2026-09-07T13:07:41Z">
+      <w:ins w:id="10070" w:author="Revision merge (HM+PL)" w:date="2026-09-07T16:18:28Z">
         <w:r>
           <w:t xml:space="preserve">rely</w:t>
         </w:r>
@@ -541,12 +541,12 @@
       <w:r>
         <w:t xml:space="preserve"> </w:t>
       </w:r>
-      <w:del w:id="10071" w:author="Revision merge (HM+PL)" w:date="2026-09-07T13:07:41Z">
+      <w:del w:id="10071" w:author="Revision merge (HM+PL)" w:date="2026-09-07T16:18:28Z">
         <w:r>
           <w:delText xml:space="preserve">option.</w:delText>
         </w:r>
       </w:del>
-      <w:ins w:id="10072" w:author="Revision merge (HM+PL)" w:date="2026-09-07T13:07:41Z">
+      <w:ins w:id="10072" w:author="Revision merge (HM+PL)" w:date="2026-09-07T16:18:28Z">
         <w:r>
           <w:t xml:space="preserve">on ad hoc scripting approaches that limit scalability, standardisation and reproducibility for efficient cross-study comparison.</w:t>
         </w:r>
@@ -556,12 +556,12 @@
       <w:pPr>
         <w:spacing w:after="120"/>
       </w:pPr>
-      <w:del w:id="10073" w:author="Revision merge (HM+PL)" w:date="2026-09-07T13:07:41Z">
+      <w:del w:id="10073" w:author="Revision merge (HM+PL)" w:date="2026-09-07T16:18:28Z">
         <w:r>
           <w:delText xml:space="preserve">**Results.**</w:delText>
         </w:r>
       </w:del>
-      <w:ins w:id="10074" w:author="Revision merge (HM+PL)" w:date="2026-09-07T13:07:41Z">
+      <w:ins w:id="10074" w:author="Revision merge (HM+PL)" w:date="2026-09-07T16:18:28Z">
         <w:r>
           <w:t xml:space="preserve">**Results:**</w:t>
         </w:r>
@@ -569,12 +569,12 @@
       <w:r>
         <w:t xml:space="preserve"> We present **MERIDIAN** (*Metagenomic Evaluation of Resistance, Identity &amp; Diversity through Integrated Analysis of Nanopore sequencing*), a modular R workflow </w:t>
       </w:r>
-      <w:del w:id="10075" w:author="Revision merge (HM+PL)" w:date="2026-09-07T13:07:41Z">
+      <w:del w:id="10075" w:author="Revision merge (HM+PL)" w:date="2026-09-07T16:18:28Z">
         <w:r>
           <w:delText xml:space="preserve">that</w:delText>
         </w:r>
       </w:del>
-      <w:ins w:id="10076" w:author="Revision merge (HM+PL)" w:date="2026-09-07T13:07:41Z">
+      <w:ins w:id="10076" w:author="Revision merge (HM+PL)" w:date="2026-09-07T16:18:28Z">
         <w:r>
           <w:t xml:space="preserve">designed</w:t>
         </w:r>
@@ -582,12 +582,12 @@
       <w:r>
         <w:t xml:space="preserve"> </w:t>
       </w:r>
-      <w:del w:id="10077" w:author="Revision merge (HM+PL)" w:date="2026-09-07T13:07:41Z">
+      <w:del w:id="10077" w:author="Revision merge (HM+PL)" w:date="2026-09-07T16:18:28Z">
         <w:r>
           <w:delText xml:space="preserve">consumes</w:delText>
         </w:r>
       </w:del>
-      <w:ins w:id="10078" w:author="Revision merge (HM+PL)" w:date="2026-09-07T13:07:41Z">
+      <w:ins w:id="10078" w:author="Revision merge (HM+PL)" w:date="2026-09-07T16:18:28Z">
         <w:r>
           <w:t xml:space="preserve">to standardise and automate downstream analysis of long-read metagenomic sequencing datasets. By consolidating outputs from multiple</w:t>
         </w:r>
@@ -595,12 +595,12 @@
       <w:r>
         <w:t xml:space="preserve"> bioinformatics </w:t>
       </w:r>
-      <w:del w:id="10079" w:author="Revision merge (HM+PL)" w:date="2026-09-07T13:07:41Z">
+      <w:del w:id="10079" w:author="Revision merge (HM+PL)" w:date="2026-09-07T16:18:28Z">
         <w:r>
           <w:delText xml:space="preserve">tools</w:delText>
         </w:r>
       </w:del>
-      <w:ins w:id="10080" w:author="Revision merge (HM+PL)" w:date="2026-09-07T13:07:41Z">
+      <w:ins w:id="10080" w:author="Revision merge (HM+PL)" w:date="2026-09-07T16:18:28Z">
         <w:r>
           <w:t xml:space="preserve">tools,</w:t>
         </w:r>
@@ -608,12 +608,12 @@
       <w:r>
         <w:t xml:space="preserve"> </w:t>
       </w:r>
-      <w:del w:id="10081" w:author="Revision merge (HM+PL)" w:date="2026-09-07T13:07:41Z">
+      <w:del w:id="10081" w:author="Revision merge (HM+PL)" w:date="2026-09-07T16:18:28Z">
         <w:r>
           <w:delText xml:space="preserve">outputs</w:delText>
         </w:r>
       </w:del>
-      <w:ins w:id="10082" w:author="Revision merge (HM+PL)" w:date="2026-09-07T13:07:41Z">
+      <w:ins w:id="10082" w:author="Revision merge (HM+PL)" w:date="2026-09-07T16:18:28Z">
         <w:r>
           <w:t xml:space="preserve">MERIDIAN</w:t>
         </w:r>
@@ -621,12 +621,12 @@
       <w:r>
         <w:t xml:space="preserve"> </w:t>
       </w:r>
-      <w:del w:id="10083" w:author="Revision merge (HM+PL)" w:date="2026-09-07T13:07:41Z">
+      <w:del w:id="10083" w:author="Revision merge (HM+PL)" w:date="2026-09-07T16:18:28Z">
         <w:r>
           <w:delText xml:space="preserve">and produces</w:delText>
         </w:r>
       </w:del>
-      <w:ins w:id="10084" w:author="Revision merge (HM+PL)" w:date="2026-09-07T13:07:41Z">
+      <w:ins w:id="10084" w:author="Revision merge (HM+PL)" w:date="2026-09-07T16:18:28Z">
         <w:r>
           <w:t xml:space="preserve">delivers</w:t>
         </w:r>
@@ -634,12 +634,12 @@
       <w:r>
         <w:t xml:space="preserve"> a </w:t>
       </w:r>
-      <w:del w:id="10085" w:author="Revision merge (HM+PL)" w:date="2026-09-07T13:07:41Z">
+      <w:del w:id="10085" w:author="Revision merge (HM+PL)" w:date="2026-09-07T16:18:28Z">
         <w:r>
           <w:delText xml:space="preserve">single</w:delText>
         </w:r>
       </w:del>
-      <w:ins w:id="10086" w:author="Revision merge (HM+PL)" w:date="2026-09-07T13:07:41Z">
+      <w:ins w:id="10086" w:author="Revision merge (HM+PL)" w:date="2026-09-07T16:18:28Z">
         <w:r>
           <w:t xml:space="preserve">comprehensive</w:t>
         </w:r>
@@ -647,7 +647,7 @@
       <w:r>
         <w:t xml:space="preserve"> Quarto HTML dashboard, publication-ready </w:t>
       </w:r>
-      <w:del w:id="10087" w:author="Revision merge (HM+PL)" w:date="2026-09-07T13:07:41Z">
+      <w:del w:id="10087" w:author="Revision merge (HM+PL)" w:date="2026-09-07T16:18:28Z">
         <w:r>
           <w:delText xml:space="preserve">composite </w:delText>
         </w:r>
@@ -655,7 +655,7 @@
       <w:r>
         <w:t xml:space="preserve">figures and </w:t>
       </w:r>
-      <w:del w:id="10088" w:author="Revision merge (HM+PL)" w:date="2026-09-07T13:07:41Z">
+      <w:del w:id="10088" w:author="Revision merge (HM+PL)" w:date="2026-09-07T16:18:28Z">
         <w:r>
           <w:delText xml:space="preserve">a </w:delText>
         </w:r>
@@ -663,12 +663,12 @@
       <w:r>
         <w:t xml:space="preserve">supplementary </w:t>
       </w:r>
-      <w:del w:id="10089" w:author="Revision merge (HM+PL)" w:date="2026-09-07T13:07:41Z">
+      <w:del w:id="10089" w:author="Revision merge (HM+PL)" w:date="2026-09-07T16:18:28Z">
         <w:r>
           <w:delText xml:space="preserve">tables</w:delText>
         </w:r>
       </w:del>
-      <w:ins w:id="10090" w:author="Revision merge (HM+PL)" w:date="2026-09-07T13:07:41Z">
+      <w:ins w:id="10090" w:author="Revision merge (HM+PL)" w:date="2026-09-07T16:18:28Z">
         <w:r>
           <w:t xml:space="preserve">result</w:t>
         </w:r>
@@ -676,12 +676,12 @@
       <w:r>
         <w:t xml:space="preserve"> </w:t>
       </w:r>
-      <w:del w:id="10091" w:author="Revision merge (HM+PL)" w:date="2026-09-07T13:07:41Z">
+      <w:del w:id="10091" w:author="Revision merge (HM+PL)" w:date="2026-09-07T16:18:28Z">
         <w:r>
           <w:delText xml:space="preserve">workbook.</w:delText>
         </w:r>
       </w:del>
-      <w:ins w:id="10092" w:author="Revision merge (HM+PL)" w:date="2026-09-07T13:07:41Z">
+      <w:ins w:id="10092" w:author="Revision merge (HM+PL)" w:date="2026-09-07T16:18:28Z">
         <w:r>
           <w:t xml:space="preserve">tables.</w:t>
         </w:r>
@@ -689,12 +689,12 @@
       <w:r>
         <w:t xml:space="preserve"> The workflow </w:t>
       </w:r>
-      <w:del w:id="10093" w:author="Revision merge (HM+PL)" w:date="2026-09-07T13:07:41Z">
+      <w:del w:id="10093" w:author="Revision merge (HM+PL)" w:date="2026-09-07T16:18:28Z">
         <w:r>
           <w:delText xml:space="preserve">covers</w:delText>
         </w:r>
       </w:del>
-      <w:ins w:id="10094" w:author="Revision merge (HM+PL)" w:date="2026-09-07T13:07:41Z">
+      <w:ins w:id="10094" w:author="Revision merge (HM+PL)" w:date="2026-09-07T16:18:28Z">
         <w:r>
           <w:t xml:space="preserve">supports end-to-end metagenomic characterisation, encompassing</w:t>
         </w:r>
@@ -702,12 +702,12 @@
       <w:r>
         <w:t xml:space="preserve"> decontamination, TPM normalisation, </w:t>
       </w:r>
-      <w:del w:id="10095" w:author="Revision merge (HM+PL)" w:date="2026-09-07T13:07:41Z">
+      <w:del w:id="10095" w:author="Revision merge (HM+PL)" w:date="2026-09-07T16:18:28Z">
         <w:r>
           <w:delText xml:space="preserve">taxonomy,</w:delText>
         </w:r>
       </w:del>
-      <w:ins w:id="10096" w:author="Revision merge (HM+PL)" w:date="2026-09-07T13:07:41Z">
+      <w:ins w:id="10096" w:author="Revision merge (HM+PL)" w:date="2026-09-07T16:18:28Z">
         <w:r>
           <w:t xml:space="preserve">taxonomic</w:t>
         </w:r>
@@ -715,12 +715,12 @@
       <w:r>
         <w:t xml:space="preserve"> </w:t>
       </w:r>
-      <w:del w:id="10097" w:author="Revision merge (HM+PL)" w:date="2026-09-07T13:07:41Z">
+      <w:del w:id="10097" w:author="Revision merge (HM+PL)" w:date="2026-09-07T16:18:28Z">
         <w:r>
           <w:delText xml:space="preserve">alpha/beta</w:delText>
         </w:r>
       </w:del>
-      <w:ins w:id="10098" w:author="Revision merge (HM+PL)" w:date="2026-09-07T13:07:41Z">
+      <w:ins w:id="10098" w:author="Revision merge (HM+PL)" w:date="2026-09-07T16:18:28Z">
         <w:r>
           <w:t xml:space="preserve">profiling, alpha and beta</w:t>
         </w:r>
@@ -728,7 +728,7 @@
       <w:r>
         <w:t xml:space="preserve"> diversity</w:t>
       </w:r>
-      <w:ins w:id="10099" w:author="Revision merge (HM+PL)" w:date="2026-09-07T13:07:41Z">
+      <w:ins w:id="10099" w:author="Revision merge (HM+PL)" w:date="2026-09-07T16:18:28Z">
         <w:r>
           <w:t xml:space="preserve"> analysis</w:t>
         </w:r>
@@ -736,12 +736,12 @@
       <w:r>
         <w:t xml:space="preserve"> with PERMANOVA, two-level ALDEx2 differential </w:t>
       </w:r>
-      <w:del w:id="10100" w:author="Revision merge (HM+PL)" w:date="2026-09-07T13:07:41Z">
+      <w:del w:id="10100" w:author="Revision merge (HM+PL)" w:date="2026-09-07T16:18:28Z">
         <w:r>
           <w:delText xml:space="preserve">abundance,</w:delText>
         </w:r>
       </w:del>
-      <w:ins w:id="10101" w:author="Revision merge (HM+PL)" w:date="2026-09-07T13:07:41Z">
+      <w:ins w:id="10101" w:author="Revision merge (HM+PL)" w:date="2026-09-07T16:18:28Z">
         <w:r>
           <w:t xml:space="preserve">abundance</w:t>
         </w:r>
@@ -749,12 +749,12 @@
       <w:r>
         <w:t xml:space="preserve"> </w:t>
       </w:r>
-      <w:del w:id="10102" w:author="Revision merge (HM+PL)" w:date="2026-09-07T13:07:41Z">
+      <w:del w:id="10102" w:author="Revision merge (HM+PL)" w:date="2026-09-07T16:18:28Z">
         <w:r>
           <w:delText xml:space="preserve">resistome, virulome,</w:delText>
         </w:r>
       </w:del>
-      <w:ins w:id="10103" w:author="Revision merge (HM+PL)" w:date="2026-09-07T13:07:41Z">
+      <w:ins w:id="10103" w:author="Revision merge (HM+PL)" w:date="2026-09-07T16:18:28Z">
         <w:r>
           <w:t xml:space="preserve">testing,</w:t>
         </w:r>
@@ -762,12 +762,12 @@
       <w:r>
         <w:t xml:space="preserve"> and </w:t>
       </w:r>
-      <w:del w:id="10104" w:author="Revision merge (HM+PL)" w:date="2026-09-07T13:07:41Z">
+      <w:del w:id="10104" w:author="Revision merge (HM+PL)" w:date="2026-09-07T16:18:28Z">
         <w:r>
           <w:delText xml:space="preserve">mobilome</w:delText>
         </w:r>
       </w:del>
-      <w:ins w:id="10105" w:author="Revision merge (HM+PL)" w:date="2026-09-07T13:07:41Z">
+      <w:ins w:id="10105" w:author="Revision merge (HM+PL)" w:date="2026-09-07T16:18:28Z">
         <w:r>
           <w:t xml:space="preserve">functional</w:t>
         </w:r>
@@ -775,12 +775,12 @@
       <w:r>
         <w:t xml:space="preserve"> </w:t>
       </w:r>
-      <w:del w:id="10106" w:author="Revision merge (HM+PL)" w:date="2026-09-07T13:07:41Z">
+      <w:del w:id="10106" w:author="Revision merge (HM+PL)" w:date="2026-09-07T16:18:28Z">
         <w:r>
           <w:delText xml:space="preserve">profiling,</w:delText>
         </w:r>
       </w:del>
-      <w:ins w:id="10107" w:author="Revision merge (HM+PL)" w:date="2026-09-07T13:07:41Z">
+      <w:ins w:id="10107" w:author="Revision merge (HM+PL)" w:date="2026-09-07T16:18:28Z">
         <w:r>
           <w:t xml:space="preserve">profiling of antimicrobial resistance (AMR), virulence</w:t>
         </w:r>
@@ -788,7 +788,7 @@
       <w:r>
         <w:t xml:space="preserve"> and</w:t>
       </w:r>
-      <w:ins w:id="10108" w:author="Revision merge (HM+PL)" w:date="2026-09-07T13:07:41Z">
+      <w:ins w:id="10108" w:author="Revision merge (HM+PL)" w:date="2026-09-07T16:18:28Z">
         <w:r>
           <w:t xml:space="preserve"> mobile genetic element repertoires. In addition, MERIDIAN infers</w:t>
         </w:r>
@@ -796,12 +796,12 @@
       <w:r>
         <w:t xml:space="preserve"> a tripartite sample × taxon × gene </w:t>
       </w:r>
-      <w:del w:id="10109" w:author="Revision merge (HM+PL)" w:date="2026-09-07T13:07:41Z">
+      <w:del w:id="10109" w:author="Revision merge (HM+PL)" w:date="2026-09-07T16:18:28Z">
         <w:r>
           <w:delText xml:space="preserve">network</w:delText>
         </w:r>
       </w:del>
-      <w:ins w:id="10110" w:author="Revision merge (HM+PL)" w:date="2026-09-07T13:07:41Z">
+      <w:ins w:id="10110" w:author="Revision merge (HM+PL)" w:date="2026-09-07T16:18:28Z">
         <w:r>
           <w:t xml:space="preserve">network,</w:t>
         </w:r>
@@ -809,12 +809,12 @@
       <w:r>
         <w:t xml:space="preserve"> </w:t>
       </w:r>
-      <w:del w:id="10111" w:author="Revision merge (HM+PL)" w:date="2026-09-07T13:07:41Z">
+      <w:del w:id="10111" w:author="Revision merge (HM+PL)" w:date="2026-09-07T16:18:28Z">
         <w:r>
           <w:delText xml:space="preserve">reconstruction.</w:delText>
         </w:r>
       </w:del>
-      <w:ins w:id="10112" w:author="Revision merge (HM+PL)" w:date="2026-09-07T13:07:41Z">
+      <w:ins w:id="10112" w:author="Revision merge (HM+PL)" w:date="2026-09-07T16:18:28Z">
         <w:r>
           <w:t xml:space="preserve">enabling</w:t>
         </w:r>
@@ -822,12 +822,12 @@
       <w:r>
         <w:t xml:space="preserve"> </w:t>
       </w:r>
-      <w:del w:id="10113" w:author="Revision merge (HM+PL)" w:date="2026-09-07T13:07:41Z">
+      <w:del w:id="10113" w:author="Revision merge (HM+PL)" w:date="2026-09-07T16:18:28Z">
         <w:r>
           <w:delText xml:space="preserve">A</w:delText>
         </w:r>
       </w:del>
-      <w:ins w:id="10114" w:author="Revision merge (HM+PL)" w:date="2026-09-07T13:07:41Z">
+      <w:ins w:id="10114" w:author="Revision merge (HM+PL)" w:date="2026-09-07T16:18:28Z">
         <w:r>
           <w:t xml:space="preserve">integrated</w:t>
         </w:r>
@@ -835,12 +835,12 @@
       <w:r>
         <w:t xml:space="preserve"> </w:t>
       </w:r>
-      <w:del w:id="10115" w:author="Revision merge (HM+PL)" w:date="2026-09-07T13:07:41Z">
+      <w:del w:id="10115" w:author="Revision merge (HM+PL)" w:date="2026-09-07T16:18:28Z">
         <w:r>
           <w:delText xml:space="preserve">study</w:delText>
         </w:r>
       </w:del>
-      <w:ins w:id="10116" w:author="Revision merge (HM+PL)" w:date="2026-09-07T13:07:41Z">
+      <w:ins w:id="10116" w:author="Revision merge (HM+PL)" w:date="2026-09-07T16:18:28Z">
         <w:r>
           <w:t xml:space="preserve">interrogation of taxonomic composition and functional gene distributions. Workflow execution</w:t>
         </w:r>
@@ -848,12 +848,12 @@
       <w:r>
         <w:t xml:space="preserve"> is </w:t>
       </w:r>
-      <w:del w:id="10117" w:author="Revision merge (HM+PL)" w:date="2026-09-07T13:07:41Z">
+      <w:del w:id="10117" w:author="Revision merge (HM+PL)" w:date="2026-09-07T16:18:28Z">
         <w:r>
           <w:delText xml:space="preserve">parameterised</w:delText>
         </w:r>
       </w:del>
-      <w:ins w:id="10118" w:author="Revision merge (HM+PL)" w:date="2026-09-07T13:07:41Z">
+      <w:ins w:id="10118" w:author="Revision merge (HM+PL)" w:date="2026-09-07T16:18:28Z">
         <w:r>
           <w:t xml:space="preserve">controlled</w:t>
         </w:r>
@@ -861,12 +861,12 @@
       <w:r>
         <w:t xml:space="preserve"> </w:t>
       </w:r>
-      <w:del w:id="10119" w:author="Revision merge (HM+PL)" w:date="2026-09-07T13:07:41Z">
+      <w:del w:id="10119" w:author="Revision merge (HM+PL)" w:date="2026-09-07T16:18:28Z">
         <w:r>
           <w:delText xml:space="preserve">by</w:delText>
         </w:r>
       </w:del>
-      <w:ins w:id="10120" w:author="Revision merge (HM+PL)" w:date="2026-09-07T13:07:41Z">
+      <w:ins w:id="10120" w:author="Revision merge (HM+PL)" w:date="2026-09-07T16:18:28Z">
         <w:r>
           <w:t xml:space="preserve">through</w:t>
         </w:r>
@@ -874,12 +874,12 @@
       <w:r>
         <w:t xml:space="preserve"> a single YAML </w:t>
       </w:r>
-      <w:del w:id="10121" w:author="Revision merge (HM+PL)" w:date="2026-09-07T13:07:41Z">
+      <w:del w:id="10121" w:author="Revision merge (HM+PL)" w:date="2026-09-07T16:18:28Z">
         <w:r>
           <w:delText xml:space="preserve">file;</w:delText>
         </w:r>
       </w:del>
-      <w:ins w:id="10122" w:author="Revision merge (HM+PL)" w:date="2026-09-07T13:07:41Z">
+      <w:ins w:id="10122" w:author="Revision merge (HM+PL)" w:date="2026-09-07T16:18:28Z">
         <w:r>
           <w:t xml:space="preserve">configuration</w:t>
         </w:r>
@@ -887,12 +887,12 @@
       <w:r>
         <w:t xml:space="preserve"> </w:t>
       </w:r>
-      <w:del w:id="10123" w:author="Revision merge (HM+PL)" w:date="2026-09-07T13:07:41Z">
+      <w:del w:id="10123" w:author="Revision merge (HM+PL)" w:date="2026-09-07T16:18:28Z">
         <w:r>
           <w:delText xml:space="preserve">module</w:delText>
         </w:r>
       </w:del>
-      <w:ins w:id="10124" w:author="Revision merge (HM+PL)" w:date="2026-09-07T13:07:41Z">
+      <w:ins w:id="10124" w:author="Revision merge (HM+PL)" w:date="2026-09-07T16:18:28Z">
         <w:r>
           <w:t xml:space="preserve">file,</w:t>
         </w:r>
@@ -900,12 +900,12 @@
       <w:r>
         <w:t xml:space="preserve"> </w:t>
       </w:r>
-      <w:del w:id="10125" w:author="Revision merge (HM+PL)" w:date="2026-09-07T13:07:41Z">
+      <w:del w:id="10125" w:author="Revision merge (HM+PL)" w:date="2026-09-07T16:18:28Z">
         <w:r>
           <w:delText xml:space="preserve">code</w:delText>
         </w:r>
       </w:del>
-      <w:ins w:id="10126" w:author="Revision merge (HM+PL)" w:date="2026-09-07T13:07:41Z">
+      <w:ins w:id="10126" w:author="Revision merge (HM+PL)" w:date="2026-09-07T16:18:28Z">
         <w:r>
           <w:t xml:space="preserve">ensuring</w:t>
         </w:r>
@@ -913,12 +913,12 @@
       <w:r>
         <w:t xml:space="preserve"> </w:t>
       </w:r>
-      <w:del w:id="10127" w:author="Revision merge (HM+PL)" w:date="2026-09-07T13:07:41Z">
+      <w:del w:id="10127" w:author="Revision merge (HM+PL)" w:date="2026-09-07T16:18:28Z">
         <w:r>
           <w:delText xml:space="preserve">is</w:delText>
         </w:r>
       </w:del>
-      <w:ins w:id="10128" w:author="Revision merge (HM+PL)" w:date="2026-09-07T13:07:41Z">
+      <w:ins w:id="10128" w:author="Revision merge (HM+PL)" w:date="2026-09-07T16:18:28Z">
         <w:r>
           <w:t xml:space="preserve">reproducible</w:t>
         </w:r>
@@ -926,12 +926,12 @@
       <w:r>
         <w:t xml:space="preserve"> </w:t>
       </w:r>
-      <w:del w:id="10129" w:author="Revision merge (HM+PL)" w:date="2026-09-07T13:07:41Z">
+      <w:del w:id="10129" w:author="Revision merge (HM+PL)" w:date="2026-09-07T16:18:28Z">
         <w:r>
           <w:delText xml:space="preserve">not</w:delText>
         </w:r>
       </w:del>
-      <w:ins w:id="10130" w:author="Revision merge (HM+PL)" w:date="2026-09-07T13:07:41Z">
+      <w:ins w:id="10130" w:author="Revision merge (HM+PL)" w:date="2026-09-07T16:18:28Z">
         <w:r>
           <w:t xml:space="preserve">execution</w:t>
         </w:r>
@@ -939,12 +939,12 @@
       <w:r>
         <w:t xml:space="preserve"> </w:t>
       </w:r>
-      <w:del w:id="10131" w:author="Revision merge (HM+PL)" w:date="2026-09-07T13:07:41Z">
+      <w:del w:id="10131" w:author="Revision merge (HM+PL)" w:date="2026-09-07T16:18:28Z">
         <w:r>
           <w:delText xml:space="preserve">edited</w:delText>
         </w:r>
       </w:del>
-      <w:ins w:id="10132" w:author="Revision merge (HM+PL)" w:date="2026-09-07T13:07:41Z">
+      <w:ins w:id="10132" w:author="Revision merge (HM+PL)" w:date="2026-09-07T16:18:28Z">
         <w:r>
           <w:t xml:space="preserve">without</w:t>
         </w:r>
@@ -952,12 +952,12 @@
       <w:r>
         <w:t xml:space="preserve"> </w:t>
       </w:r>
-      <w:del w:id="10133" w:author="Revision merge (HM+PL)" w:date="2026-09-07T13:07:41Z">
+      <w:del w:id="10133" w:author="Revision merge (HM+PL)" w:date="2026-09-07T16:18:28Z">
         <w:r>
           <w:delText xml:space="preserve">per</w:delText>
         </w:r>
       </w:del>
-      <w:ins w:id="10134" w:author="Revision merge (HM+PL)" w:date="2026-09-07T13:07:41Z">
+      <w:ins w:id="10134" w:author="Revision merge (HM+PL)" w:date="2026-09-07T16:18:28Z">
         <w:r>
           <w:t xml:space="preserve">modification</w:t>
         </w:r>
@@ -965,12 +965,12 @@
       <w:r>
         <w:t xml:space="preserve"> </w:t>
       </w:r>
-      <w:del w:id="10135" w:author="Revision merge (HM+PL)" w:date="2026-09-07T13:07:41Z">
+      <w:del w:id="10135" w:author="Revision merge (HM+PL)" w:date="2026-09-07T16:18:28Z">
         <w:r>
           <w:delText xml:space="preserve">project,</w:delText>
         </w:r>
       </w:del>
-      <w:ins w:id="10136" w:author="Revision merge (HM+PL)" w:date="2026-09-07T13:07:41Z">
+      <w:ins w:id="10136" w:author="Revision merge (HM+PL)" w:date="2026-09-07T16:18:28Z">
         <w:r>
           <w:t xml:space="preserve">of</w:t>
         </w:r>
@@ -978,12 +978,12 @@
       <w:r>
         <w:t xml:space="preserve"> </w:t>
       </w:r>
-      <w:del w:id="10137" w:author="Revision merge (HM+PL)" w:date="2026-09-07T13:07:41Z">
+      <w:del w:id="10137" w:author="Revision merge (HM+PL)" w:date="2026-09-07T16:18:28Z">
         <w:r>
           <w:delText xml:space="preserve">and</w:delText>
         </w:r>
       </w:del>
-      <w:ins w:id="10138" w:author="Revision merge (HM+PL)" w:date="2026-09-07T13:07:41Z">
+      <w:ins w:id="10138" w:author="Revision merge (HM+PL)" w:date="2026-09-07T16:18:28Z">
         <w:r>
           <w:t xml:space="preserve">source</w:t>
         </w:r>
@@ -991,12 +991,12 @@
       <w:r>
         <w:t xml:space="preserve"> </w:t>
       </w:r>
-      <w:del w:id="10139" w:author="Revision merge (HM+PL)" w:date="2026-09-07T13:07:41Z">
+      <w:del w:id="10139" w:author="Revision merge (HM+PL)" w:date="2026-09-07T16:18:28Z">
         <w:r>
           <w:delText xml:space="preserve">every</w:delText>
         </w:r>
       </w:del>
-      <w:ins w:id="10140" w:author="Revision merge (HM+PL)" w:date="2026-09-07T13:07:41Z">
+      <w:ins w:id="10140" w:author="Revision merge (HM+PL)" w:date="2026-09-07T16:18:28Z">
         <w:r>
           <w:t xml:space="preserve">code.</w:t>
         </w:r>
@@ -1004,12 +1004,12 @@
       <w:r>
         <w:t xml:space="preserve"> </w:t>
       </w:r>
-      <w:del w:id="10141" w:author="Revision merge (HM+PL)" w:date="2026-09-07T13:07:41Z">
+      <w:del w:id="10141" w:author="Revision merge (HM+PL)" w:date="2026-09-07T16:18:28Z">
         <w:r>
           <w:delText xml:space="preserve">run</w:delText>
         </w:r>
       </w:del>
-      <w:ins w:id="10142" w:author="Revision merge (HM+PL)" w:date="2026-09-07T13:07:41Z">
+      <w:ins w:id="10142" w:author="Revision merge (HM+PL)" w:date="2026-09-07T16:18:28Z">
         <w:r>
           <w:t xml:space="preserve">Each</w:t>
         </w:r>
@@ -1017,12 +1017,12 @@
       <w:r>
         <w:t xml:space="preserve"> </w:t>
       </w:r>
-      <w:del w:id="10143" w:author="Revision merge (HM+PL)" w:date="2026-09-07T13:07:41Z">
+      <w:del w:id="10143" w:author="Revision merge (HM+PL)" w:date="2026-09-07T16:18:28Z">
         <w:r>
           <w:delText xml:space="preserve">emits</w:delText>
         </w:r>
       </w:del>
-      <w:ins w:id="10144" w:author="Revision merge (HM+PL)" w:date="2026-09-07T13:07:41Z">
+      <w:ins w:id="10144" w:author="Revision merge (HM+PL)" w:date="2026-09-07T16:18:28Z">
         <w:r>
           <w:t xml:space="preserve">analysis automatically generates</w:t>
         </w:r>
@@ -1030,12 +1030,12 @@
       <w:r>
         <w:t xml:space="preserve"> a `manifest.json` artefact </w:t>
       </w:r>
-      <w:del w:id="10145" w:author="Revision merge (HM+PL)" w:date="2026-09-07T13:07:41Z">
+      <w:del w:id="10145" w:author="Revision merge (HM+PL)" w:date="2026-09-07T16:18:28Z">
         <w:r>
           <w:delText xml:space="preserve">catalogue</w:delText>
         </w:r>
       </w:del>
-      <w:ins w:id="10146" w:author="Revision merge (HM+PL)" w:date="2026-09-07T13:07:41Z">
+      <w:ins w:id="10146" w:author="Revision merge (HM+PL)" w:date="2026-09-07T16:18:28Z">
         <w:r>
           <w:t xml:space="preserve">catalogue,</w:t>
         </w:r>
@@ -1043,12 +1043,12 @@
       <w:r>
         <w:t xml:space="preserve"> </w:t>
       </w:r>
-      <w:del w:id="10147" w:author="Revision merge (HM+PL)" w:date="2026-09-07T13:07:41Z">
+      <w:del w:id="10147" w:author="Revision merge (HM+PL)" w:date="2026-09-07T16:18:28Z">
         <w:r>
           <w:delText xml:space="preserve">for</w:delText>
         </w:r>
       </w:del>
-      <w:ins w:id="10148" w:author="Revision merge (HM+PL)" w:date="2026-09-07T13:07:41Z">
+      <w:ins w:id="10148" w:author="Revision merge (HM+PL)" w:date="2026-09-07T16:18:28Z">
         <w:r>
           <w:t xml:space="preserve">thereby supporting reproducibility and</w:t>
         </w:r>
@@ -1056,7 +1056,7 @@
       <w:r>
         <w:t xml:space="preserve"> downstream </w:t>
       </w:r>
-      <w:ins w:id="10149" w:author="Revision merge (HM+PL)" w:date="2026-09-07T13:07:41Z">
+      <w:ins w:id="10149" w:author="Revision merge (HM+PL)" w:date="2026-09-07T16:18:28Z">
         <w:r>
           <w:t xml:space="preserve">computational </w:t>
         </w:r>
@@ -1072,7 +1072,7 @@
       <w:r>
         <w:t xml:space="preserve">**Availability and Implementation.** </w:t>
       </w:r>
-      <w:ins w:id="10150" w:author="Revision merge (HM+PL)" w:date="2026-09-07T13:07:41Z">
+      <w:ins w:id="10150" w:author="Revision merge (HM+PL)" w:date="2026-09-07T16:18:28Z">
         <w:r>
           <w:t xml:space="preserve">MERIDIAN is implemented in R and distributed under the MIT licence. </w:t>
         </w:r>
@@ -1080,7 +1080,7 @@
       <w:r>
         <w:t xml:space="preserve">Source</w:t>
       </w:r>
-      <w:ins w:id="10151" w:author="Revision merge (HM+PL)" w:date="2026-09-07T13:07:41Z">
+      <w:ins w:id="10151" w:author="Revision merge (HM+PL)" w:date="2026-09-07T16:18:28Z">
         <w:r>
           <w:t xml:space="preserve"> code and documentation are available</w:t>
         </w:r>
@@ -1088,12 +1088,12 @@
       <w:r>
         <w:t xml:space="preserve"> at </w:t>
       </w:r>
-      <w:del w:id="10152" w:author="Revision merge (HM+PL)" w:date="2026-09-07T13:07:41Z">
+      <w:del w:id="10152" w:author="Revision merge (HM+PL)" w:date="2026-09-07T16:18:28Z">
         <w:r>
           <w:delText xml:space="preserve">https://github.com/Julio92-C/Metagenomics_pipeline_automation (MIT).</w:delText>
         </w:r>
       </w:del>
-      <w:ins w:id="10153" w:author="Revision merge (HM+PL)" w:date="2026-09-07T13:07:41Z">
+      <w:ins w:id="10153" w:author="Revision merge (HM+PL)" w:date="2026-09-07T16:18:28Z">
         <w:r>
           <w:t xml:space="preserve">https://github.com/Julio92-C/Metagenomics_pipeline_automation.</w:t>
         </w:r>
@@ -1101,12 +1101,12 @@
       <w:r>
         <w:t xml:space="preserve"> This note describes release **v0.1.0** (https://github.com/Julio92-C/Metagenomics_pipeline_automation/releases/tag/v0.1.0). </w:t>
       </w:r>
-      <w:del w:id="10154" w:author="Revision merge (HM+PL)" w:date="2026-09-07T13:07:41Z">
+      <w:del w:id="10154" w:author="Revision merge (HM+PL)" w:date="2026-09-07T16:18:28Z">
         <w:r>
           <w:delText xml:space="preserve">Run</w:delText>
         </w:r>
       </w:del>
-      <w:ins w:id="10155" w:author="Revision merge (HM+PL)" w:date="2026-09-07T13:07:41Z">
+      <w:ins w:id="10155" w:author="Revision merge (HM+PL)" w:date="2026-09-07T16:18:28Z">
         <w:r>
           <w:t xml:space="preserve">Reproducible execution is supported through the R environment package `renv`; after restoring dependencies</w:t>
         </w:r>
@@ -1114,12 +1114,12 @@
       <w:r>
         <w:t xml:space="preserve"> with </w:t>
       </w:r>
-      <w:del w:id="10156" w:author="Revision merge (HM+PL)" w:date="2026-09-07T13:07:41Z">
+      <w:del w:id="10156" w:author="Revision merge (HM+PL)" w:date="2026-09-07T16:18:28Z">
         <w:r>
           <w:delText xml:space="preserve">`git</w:delText>
         </w:r>
       </w:del>
-      <w:ins w:id="10157" w:author="Revision merge (HM+PL)" w:date="2026-09-07T13:07:41Z">
+      <w:ins w:id="10157" w:author="Revision merge (HM+PL)" w:date="2026-09-07T16:18:28Z">
         <w:r>
           <w:t xml:space="preserve">`renv::restore()`,</w:t>
         </w:r>
@@ -1127,12 +1127,12 @@
       <w:r>
         <w:t xml:space="preserve"> </w:t>
       </w:r>
-      <w:del w:id="10158" w:author="Revision merge (HM+PL)" w:date="2026-09-07T13:07:41Z">
+      <w:del w:id="10158" w:author="Revision merge (HM+PL)" w:date="2026-09-07T16:18:28Z">
         <w:r>
           <w:delText xml:space="preserve">clone</w:delText>
         </w:r>
       </w:del>
-      <w:ins w:id="10159" w:author="Revision merge (HM+PL)" w:date="2026-09-07T13:07:41Z">
+      <w:ins w:id="10159" w:author="Revision merge (HM+PL)" w:date="2026-09-07T16:18:28Z">
         <w:r>
           <w:t xml:space="preserve">the</w:t>
         </w:r>
@@ -1140,12 +1140,12 @@
       <w:r>
         <w:t xml:space="preserve"> </w:t>
       </w:r>
-      <w:del w:id="10160" w:author="Revision merge (HM+PL)" w:date="2026-09-07T13:07:41Z">
+      <w:del w:id="10160" w:author="Revision merge (HM+PL)" w:date="2026-09-07T16:18:28Z">
         <w:r>
           <w:delText xml:space="preserve">--branch</w:delText>
         </w:r>
       </w:del>
-      <w:ins w:id="10161" w:author="Revision merge (HM+PL)" w:date="2026-09-07T13:07:41Z">
+      <w:ins w:id="10161" w:author="Revision merge (HM+PL)" w:date="2026-09-07T16:18:28Z">
         <w:r>
           <w:t xml:space="preserve">pipeline</w:t>
         </w:r>
@@ -1153,12 +1153,12 @@
       <w:r>
         <w:t xml:space="preserve"> </w:t>
       </w:r>
-      <w:del w:id="10162" w:author="Revision merge (HM+PL)" w:date="2026-09-07T13:07:41Z">
+      <w:del w:id="10162" w:author="Revision merge (HM+PL)" w:date="2026-09-07T16:18:28Z">
         <w:r>
           <w:delText xml:space="preserve">v0.1.0</w:delText>
         </w:r>
       </w:del>
-      <w:ins w:id="10163" w:author="Revision merge (HM+PL)" w:date="2026-09-07T13:07:41Z">
+      <w:ins w:id="10163" w:author="Revision merge (HM+PL)" w:date="2026-09-07T16:18:28Z">
         <w:r>
           <w:t xml:space="preserve">is</w:t>
         </w:r>
@@ -1166,12 +1166,12 @@
       <w:r>
         <w:t xml:space="preserve"> </w:t>
       </w:r>
-      <w:del w:id="10164" w:author="Revision merge (HM+PL)" w:date="2026-09-07T13:07:41Z">
+      <w:del w:id="10164" w:author="Revision merge (HM+PL)" w:date="2026-09-07T16:18:28Z">
         <w:r>
           <w:delText xml:space="preserve">&lt;repo&gt;</w:delText>
         </w:r>
       </w:del>
-      <w:ins w:id="10165" w:author="Revision merge (HM+PL)" w:date="2026-09-07T13:07:41Z">
+      <w:ins w:id="10165" w:author="Revision merge (HM+PL)" w:date="2026-09-07T16:18:28Z">
         <w:r>
           <w:t xml:space="preserve">launched</w:t>
         </w:r>
@@ -1179,12 +1179,12 @@
       <w:r>
         <w:t xml:space="preserve"> </w:t>
       </w:r>
-      <w:del w:id="10166" w:author="Revision merge (HM+PL)" w:date="2026-09-07T13:07:41Z">
+      <w:del w:id="10166" w:author="Revision merge (HM+PL)" w:date="2026-09-07T16:18:28Z">
         <w:r>
           <w:delText xml:space="preserve">&amp;&amp;</w:delText>
         </w:r>
       </w:del>
-      <w:ins w:id="10167" w:author="Revision merge (HM+PL)" w:date="2026-09-07T13:07:41Z">
+      <w:ins w:id="10167" w:author="Revision merge (HM+PL)" w:date="2026-09-07T16:18:28Z">
         <w:r>
           <w:t xml:space="preserve">with</w:t>
         </w:r>
@@ -1192,12 +1192,12 @@
       <w:r>
         <w:t xml:space="preserve"> </w:t>
       </w:r>
-      <w:del w:id="10168" w:author="Revision merge (HM+PL)" w:date="2026-09-07T13:07:41Z">
+      <w:del w:id="10168" w:author="Revision merge (HM+PL)" w:date="2026-09-07T16:18:28Z">
         <w:r>
           <w:delText xml:space="preserve">Rscript</w:delText>
         </w:r>
       </w:del>
-      <w:ins w:id="10169" w:author="Revision merge (HM+PL)" w:date="2026-09-07T13:07:41Z">
+      <w:ins w:id="10169" w:author="Revision merge (HM+PL)" w:date="2026-09-07T16:18:28Z">
         <w:r>
           <w:t xml:space="preserve">`Rscript</w:t>
         </w:r>
@@ -1205,12 +1205,12 @@
       <w:r>
         <w:t xml:space="preserve"> run_pipeline.R </w:t>
       </w:r>
-      <w:del w:id="10170" w:author="Revision merge (HM+PL)" w:date="2026-09-07T13:07:41Z">
+      <w:del w:id="10170" w:author="Revision merge (HM+PL)" w:date="2026-09-07T16:18:28Z">
         <w:r>
           <w:delText xml:space="preserve">config.yaml` after `renv::restore()`.</w:delText>
         </w:r>
       </w:del>
-      <w:ins w:id="10171" w:author="Revision merge (HM+PL)" w:date="2026-09-07T13:07:41Z">
+      <w:ins w:id="10171" w:author="Revision merge (HM+PL)" w:date="2026-09-07T16:18:28Z">
         <w:r>
           <w:t xml:space="preserve">config.yaml`.</w:t>
         </w:r>
@@ -1220,12 +1220,12 @@
       <w:pPr>
         <w:spacing w:after="120"/>
       </w:pPr>
-      <w:del w:id="10172" w:author="Revision merge (HM+PL)" w:date="2026-09-07T13:07:41Z">
+      <w:del w:id="10172" w:author="Revision merge (HM+PL)" w:date="2026-09-07T16:18:28Z">
         <w:r>
           <w:delText xml:space="preserve">**Contact.**</w:delText>
         </w:r>
       </w:del>
-      <w:ins w:id="10173" w:author="Revision merge (HM+PL)" w:date="2026-09-07T13:07:41Z">
+      <w:ins w:id="10173" w:author="Revision merge (HM+PL)" w:date="2026-09-07T16:18:28Z">
         <w:r>
           <w:t xml:space="preserve">**Corresponding author:**</w:t>
         </w:r>
@@ -1263,12 +1263,12 @@
       <w:r>
         <w:t xml:space="preserve">Long-read shotgun </w:t>
       </w:r>
-      <w:del w:id="10174" w:author="Revision merge (HM+PL)" w:date="2026-09-07T13:07:41Z">
+      <w:del w:id="10174" w:author="Revision merge (HM+PL)" w:date="2026-09-07T16:18:28Z">
         <w:r>
           <w:delText xml:space="preserve">metagenomics</w:delText>
         </w:r>
       </w:del>
-      <w:ins w:id="10175" w:author="Revision merge (HM+PL)" w:date="2026-09-07T13:07:41Z">
+      <w:ins w:id="10175" w:author="Revision merge (HM+PL)" w:date="2026-09-07T16:18:28Z">
         <w:r>
           <w:t xml:space="preserve">metagenomics,</w:t>
         </w:r>
@@ -1276,12 +1276,12 @@
       <w:r>
         <w:t xml:space="preserve"> </w:t>
       </w:r>
-      <w:del w:id="10176" w:author="Revision merge (HM+PL)" w:date="2026-09-07T13:07:41Z">
+      <w:del w:id="10176" w:author="Revision merge (HM+PL)" w:date="2026-09-07T16:18:28Z">
         <w:r>
           <w:delText xml:space="preserve">(Oxford</w:delText>
         </w:r>
       </w:del>
-      <w:ins w:id="10177" w:author="Revision merge (HM+PL)" w:date="2026-09-07T13:07:41Z">
+      <w:ins w:id="10177" w:author="Revision merge (HM+PL)" w:date="2026-09-07T16:18:28Z">
         <w:r>
           <w:t xml:space="preserve">enabled</w:t>
         </w:r>
@@ -1289,12 +1289,12 @@
       <w:r>
         <w:t xml:space="preserve"> </w:t>
       </w:r>
-      <w:del w:id="10178" w:author="Revision merge (HM+PL)" w:date="2026-09-07T13:07:41Z">
+      <w:del w:id="10178" w:author="Revision merge (HM+PL)" w:date="2026-09-07T16:18:28Z">
         <w:r>
           <w:delText xml:space="preserve">Nanopore,</w:delText>
         </w:r>
       </w:del>
-      <w:ins w:id="10179" w:author="Revision merge (HM+PL)" w:date="2026-09-07T13:07:41Z">
+      <w:ins w:id="10179" w:author="Revision merge (HM+PL)" w:date="2026-09-07T16:18:28Z">
         <w:r>
           <w:t xml:space="preserve">by</w:t>
         </w:r>
@@ -1302,12 +1302,12 @@
       <w:r>
         <w:t xml:space="preserve"> </w:t>
       </w:r>
-      <w:del w:id="10180" w:author="Revision merge (HM+PL)" w:date="2026-09-07T13:07:41Z">
+      <w:del w:id="10180" w:author="Revision merge (HM+PL)" w:date="2026-09-07T16:18:28Z">
         <w:r>
           <w:delText xml:space="preserve">PacBio)</w:delText>
         </w:r>
       </w:del>
-      <w:ins w:id="10181" w:author="Revision merge (HM+PL)" w:date="2026-09-07T13:07:41Z">
+      <w:ins w:id="10181" w:author="Revision merge (HM+PL)" w:date="2026-09-07T16:18:28Z">
         <w:r>
           <w:t xml:space="preserve">Oxford Nanopore and PacBio sequencing technologies,</w:t>
         </w:r>
@@ -1315,7 +1315,7 @@
       <w:r>
         <w:t xml:space="preserve"> is</w:t>
       </w:r>
-      <w:del w:id="10182" w:author="Revision merge (HM+PL)" w:date="2026-09-07T13:07:41Z">
+      <w:del w:id="10182" w:author="Revision merge (HM+PL)" w:date="2026-09-07T16:18:28Z">
         <w:r>
           <w:delText xml:space="preserve"> increasingly</w:delText>
         </w:r>
@@ -1323,12 +1323,12 @@
       <w:r>
         <w:t xml:space="preserve"> central to One Health surveillance, where </w:t>
       </w:r>
-      <w:del w:id="10183" w:author="Revision merge (HM+PL)" w:date="2026-09-07T13:07:41Z">
+      <w:del w:id="10183" w:author="Revision merge (HM+PL)" w:date="2026-09-07T16:18:28Z">
         <w:r>
           <w:delText xml:space="preserve">threats</w:delText>
         </w:r>
       </w:del>
-      <w:ins w:id="10184" w:author="Revision merge (HM+PL)" w:date="2026-09-07T13:07:41Z">
+      <w:ins w:id="10184" w:author="Revision merge (HM+PL)" w:date="2026-09-07T16:18:28Z">
         <w:r>
           <w:t xml:space="preserve">the</w:t>
         </w:r>
@@ -1336,12 +1336,12 @@
       <w:r>
         <w:t xml:space="preserve"> </w:t>
       </w:r>
-      <w:del w:id="10185" w:author="Revision merge (HM+PL)" w:date="2026-09-07T13:07:41Z">
+      <w:del w:id="10185" w:author="Revision merge (HM+PL)" w:date="2026-09-07T16:18:28Z">
         <w:r>
           <w:delText xml:space="preserve">intersect humans, animals</w:delText>
         </w:r>
       </w:del>
-      <w:ins w:id="10186" w:author="Revision merge (HM+PL)" w:date="2026-09-07T13:07:41Z">
+      <w:ins w:id="10186" w:author="Revision merge (HM+PL)" w:date="2026-09-07T16:18:28Z">
         <w:r>
           <w:t xml:space="preserve">emergence</w:t>
         </w:r>
@@ -1349,12 +1349,12 @@
       <w:r>
         <w:t xml:space="preserve"> and </w:t>
       </w:r>
-      <w:del w:id="10187" w:author="Revision merge (HM+PL)" w:date="2026-09-07T13:07:41Z">
+      <w:del w:id="10187" w:author="Revision merge (HM+PL)" w:date="2026-09-07T16:18:28Z">
         <w:r>
           <w:delText xml:space="preserve">ecosystems</w:delText>
         </w:r>
       </w:del>
-      <w:ins w:id="10188" w:author="Revision merge (HM+PL)" w:date="2026-09-07T13:07:41Z">
+      <w:ins w:id="10188" w:author="Revision merge (HM+PL)" w:date="2026-09-07T16:18:28Z">
         <w:r>
           <w:t xml:space="preserve">dissemination of biological threats occur at the interface of human, animal and environmental systems</w:t>
         </w:r>
@@ -1362,12 +1362,12 @@
       <w:r>
         <w:t xml:space="preserve"> [1]. </w:t>
       </w:r>
-      <w:del w:id="10189" w:author="Revision merge (HM+PL)" w:date="2026-09-07T13:07:41Z">
+      <w:del w:id="10189" w:author="Revision merge (HM+PL)" w:date="2026-09-07T16:18:28Z">
         <w:r>
           <w:delText xml:space="preserve">By</w:delText>
         </w:r>
       </w:del>
-      <w:ins w:id="10190" w:author="Revision merge (HM+PL)" w:date="2026-09-07T13:07:41Z">
+      <w:ins w:id="10190" w:author="Revision merge (HM+PL)" w:date="2026-09-07T16:18:28Z">
         <w:r>
           <w:t xml:space="preserve">Unlike</w:t>
         </w:r>
@@ -1375,12 +1375,12 @@
       <w:r>
         <w:t xml:space="preserve"> </w:t>
       </w:r>
-      <w:del w:id="10191" w:author="Revision merge (HM+PL)" w:date="2026-09-07T13:07:41Z">
+      <w:del w:id="10191" w:author="Revision merge (HM+PL)" w:date="2026-09-07T16:18:28Z">
         <w:r>
           <w:delText xml:space="preserve">profiling</w:delText>
         </w:r>
       </w:del>
-      <w:ins w:id="10192" w:author="Revision merge (HM+PL)" w:date="2026-09-07T13:07:41Z">
+      <w:ins w:id="10192" w:author="Revision merge (HM+PL)" w:date="2026-09-07T16:18:28Z">
         <w:r>
           <w:t xml:space="preserve">targeted approaches, shotgun metagenomics enables simultaneous characterisation of</w:t>
         </w:r>
@@ -1388,12 +1388,12 @@
       <w:r>
         <w:t xml:space="preserve"> microbial </w:t>
       </w:r>
-      <w:del w:id="10193" w:author="Revision merge (HM+PL)" w:date="2026-09-07T13:07:41Z">
+      <w:del w:id="10193" w:author="Revision merge (HM+PL)" w:date="2026-09-07T16:18:28Z">
         <w:r>
           <w:delText xml:space="preserve">communities</w:delText>
         </w:r>
       </w:del>
-      <w:ins w:id="10194" w:author="Revision merge (HM+PL)" w:date="2026-09-07T13:07:41Z">
+      <w:ins w:id="10194" w:author="Revision merge (HM+PL)" w:date="2026-09-07T16:18:28Z">
         <w:r>
           <w:t xml:space="preserve">community composition</w:t>
         </w:r>
@@ -1401,7 +1401,7 @@
       <w:r>
         <w:t xml:space="preserve"> and</w:t>
       </w:r>
-      <w:del w:id="10195" w:author="Revision merge (HM+PL)" w:date="2026-09-07T13:07:41Z">
+      <w:del w:id="10195" w:author="Revision merge (HM+PL)" w:date="2026-09-07T16:18:28Z">
         <w:r>
           <w:delText xml:space="preserve"> their</w:delText>
         </w:r>
@@ -1409,12 +1409,12 @@
       <w:r>
         <w:t xml:space="preserve"> functional genetic </w:t>
       </w:r>
-      <w:del w:id="10196" w:author="Revision merge (HM+PL)" w:date="2026-09-07T13:07:41Z">
+      <w:del w:id="10196" w:author="Revision merge (HM+PL)" w:date="2026-09-07T16:18:28Z">
         <w:r>
           <w:delText xml:space="preserve">elements</w:delText>
         </w:r>
       </w:del>
-      <w:ins w:id="10197" w:author="Revision merge (HM+PL)" w:date="2026-09-07T13:07:41Z">
+      <w:ins w:id="10197" w:author="Revision merge (HM+PL)" w:date="2026-09-07T16:18:28Z">
         <w:r>
           <w:t xml:space="preserve">content,</w:t>
         </w:r>
@@ -1422,12 +1422,12 @@
       <w:r>
         <w:t xml:space="preserve"> </w:t>
       </w:r>
-      <w:del w:id="10198" w:author="Revision merge (HM+PL)" w:date="2026-09-07T13:07:41Z">
+      <w:del w:id="10198" w:author="Revision merge (HM+PL)" w:date="2026-09-07T16:18:28Z">
         <w:r>
           <w:delText xml:space="preserve">in</w:delText>
         </w:r>
       </w:del>
-      <w:ins w:id="10199" w:author="Revision merge (HM+PL)" w:date="2026-09-07T13:07:41Z">
+      <w:ins w:id="10199" w:author="Revision merge (HM+PL)" w:date="2026-09-07T16:18:28Z">
         <w:r>
           <w:t xml:space="preserve">thereby</w:t>
         </w:r>
@@ -1435,12 +1435,12 @@
       <w:r>
         <w:t xml:space="preserve"> </w:t>
       </w:r>
-      <w:del w:id="10200" w:author="Revision merge (HM+PL)" w:date="2026-09-07T13:07:41Z">
+      <w:del w:id="10200" w:author="Revision merge (HM+PL)" w:date="2026-09-07T16:18:28Z">
         <w:r>
           <w:delText xml:space="preserve">a single experiment, it links</w:delText>
         </w:r>
       </w:del>
-      <w:ins w:id="10201" w:author="Revision merge (HM+PL)" w:date="2026-09-07T13:07:41Z">
+      <w:ins w:id="10201" w:author="Revision merge (HM+PL)" w:date="2026-09-07T16:18:28Z">
         <w:r>
           <w:t xml:space="preserve">linking</w:t>
         </w:r>
@@ -1448,7 +1448,7 @@
       <w:r>
         <w:t xml:space="preserve"> taxonomic identity to</w:t>
       </w:r>
-      <w:del w:id="10202" w:author="Revision merge (HM+PL)" w:date="2026-09-07T13:07:41Z">
+      <w:del w:id="10202" w:author="Revision merge (HM+PL)" w:date="2026-09-07T16:18:28Z">
         <w:r>
           <w:delText xml:space="preserve"> determinants of resistance, virulence, and mobility across environmental, clinical, and livestock matrices. The downstream analysis stack is well established — Kraken2 [2] and Bracken [3] for taxonomic assignment and abundance estimation, ABRicate [4] for screening</w:delText>
         </w:r>
@@ -1456,7 +1456,7 @@
       <w:r>
         <w:t xml:space="preserve"> antimicrobial resistance genes (ARGs), virulence factors (VFs) and mobile genetic elements (MGEs) </w:t>
       </w:r>
-      <w:ins w:id="10203" w:author="Revision merge (HM+PL)" w:date="2026-09-07T13:07:41Z">
+      <w:ins w:id="10203" w:author="Revision merge (HM+PL)" w:date="2026-09-07T16:18:28Z">
         <w:r>
           <w:t xml:space="preserve">within a single experiment. This capability is particularly valuable for tracking the ecology and transmission of high-risk microorganisms and their associated genetic determinants across clinical, agricultural and environmental reservoirs. The downstream analysis supporting long-read metagenomics is now well established. Widely adopted tools include Kraken2 [2] and Bracken [3] for taxonomic classification and abundance estimation, ABRicate [4] for screening ARGs, VFs and MGEs </w:t>
         </w:r>
@@ -1464,7 +1464,7 @@
       <w:r>
         <w:t xml:space="preserve">against</w:t>
       </w:r>
-      <w:ins w:id="10204" w:author="Revision merge (HM+PL)" w:date="2026-09-07T13:07:41Z">
+      <w:ins w:id="10204" w:author="Revision merge (HM+PL)" w:date="2026-09-07T16:18:28Z">
         <w:r>
           <w:t xml:space="preserve"> databases such as</w:t>
         </w:r>
@@ -1472,12 +1472,12 @@
       <w:r>
         <w:t xml:space="preserve"> CARD [5], VFDB [6] and PlasmidFinder [7], Re-centrifuge [8] for contamination assessment, and R packages </w:t>
       </w:r>
-      <w:del w:id="10205" w:author="Revision merge (HM+PL)" w:date="2026-09-07T13:07:41Z">
+      <w:del w:id="10205" w:author="Revision merge (HM+PL)" w:date="2026-09-07T16:18:28Z">
         <w:r>
           <w:delText xml:space="preserve">such as</w:delText>
         </w:r>
       </w:del>
-      <w:ins w:id="10206" w:author="Revision merge (HM+PL)" w:date="2026-09-07T13:07:41Z">
+      <w:ins w:id="10206" w:author="Revision merge (HM+PL)" w:date="2026-09-07T16:18:28Z">
         <w:r>
           <w:t xml:space="preserve">including</w:t>
         </w:r>
@@ -1485,12 +1485,12 @@
       <w:r>
         <w:t xml:space="preserve"> vegan [9] and ALDEx2 [10] for ecological and differential </w:t>
       </w:r>
-      <w:del w:id="10207" w:author="Revision merge (HM+PL)" w:date="2026-09-07T13:07:41Z">
+      <w:del w:id="10207" w:author="Revision merge (HM+PL)" w:date="2026-09-07T16:18:28Z">
         <w:r>
           <w:delText xml:space="preserve">analyses</w:delText>
         </w:r>
       </w:del>
-      <w:ins w:id="10208" w:author="Revision merge (HM+PL)" w:date="2026-09-07T13:07:41Z">
+      <w:ins w:id="10208" w:author="Revision merge (HM+PL)" w:date="2026-09-07T16:18:28Z">
         <w:r>
           <w:t xml:space="preserve">abundance</w:t>
         </w:r>
@@ -1498,12 +1498,12 @@
       <w:r>
         <w:t xml:space="preserve"> </w:t>
       </w:r>
-      <w:del w:id="10209" w:author="Revision merge (HM+PL)" w:date="2026-09-07T13:07:41Z">
+      <w:del w:id="10209" w:author="Revision merge (HM+PL)" w:date="2026-09-07T16:18:28Z">
         <w:r>
           <w:delText xml:space="preserve">—</w:delText>
         </w:r>
       </w:del>
-      <w:ins w:id="10210" w:author="Revision merge (HM+PL)" w:date="2026-09-07T13:07:41Z">
+      <w:ins w:id="10210" w:author="Revision merge (HM+PL)" w:date="2026-09-07T16:18:28Z">
         <w:r>
           <w:t xml:space="preserve">analyses.</w:t>
         </w:r>
@@ -1511,12 +1511,12 @@
       <w:r>
         <w:t xml:space="preserve"> </w:t>
       </w:r>
-      <w:del w:id="10211" w:author="Revision merge (HM+PL)" w:date="2026-09-07T13:07:41Z">
+      <w:del w:id="10211" w:author="Revision merge (HM+PL)" w:date="2026-09-07T16:18:28Z">
         <w:r>
           <w:delText xml:space="preserve">but</w:delText>
         </w:r>
       </w:del>
-      <w:ins w:id="10212" w:author="Revision merge (HM+PL)" w:date="2026-09-07T13:07:41Z">
+      <w:ins w:id="10212" w:author="Revision merge (HM+PL)" w:date="2026-09-07T16:18:28Z">
         <w:r>
           <w:t xml:space="preserve">However,</w:t>
         </w:r>
@@ -1524,12 +1524,12 @@
       <w:r>
         <w:t xml:space="preserve"> </w:t>
       </w:r>
-      <w:del w:id="10213" w:author="Revision merge (HM+PL)" w:date="2026-09-07T13:07:41Z">
+      <w:del w:id="10213" w:author="Revision merge (HM+PL)" w:date="2026-09-07T16:18:28Z">
         <w:r>
           <w:delText xml:space="preserve">the</w:delText>
         </w:r>
       </w:del>
-      <w:ins w:id="10214" w:author="Revision merge (HM+PL)" w:date="2026-09-07T13:07:41Z">
+      <w:ins w:id="10214" w:author="Revision merge (HM+PL)" w:date="2026-09-07T16:18:28Z">
         <w:r>
           <w:t xml:space="preserve">while these tools are individually well established, their</w:t>
         </w:r>
@@ -1537,12 +1537,12 @@
       <w:r>
         <w:t xml:space="preserve"> integration </w:t>
       </w:r>
-      <w:del w:id="10215" w:author="Revision merge (HM+PL)" w:date="2026-09-07T13:07:41Z">
+      <w:del w:id="10215" w:author="Revision merge (HM+PL)" w:date="2026-09-07T16:18:28Z">
         <w:r>
           <w:delText xml:space="preserve">between</w:delText>
         </w:r>
       </w:del>
-      <w:ins w:id="10216" w:author="Revision merge (HM+PL)" w:date="2026-09-07T13:07:41Z">
+      <w:ins w:id="10216" w:author="Revision merge (HM+PL)" w:date="2026-09-07T16:18:28Z">
         <w:r>
           <w:t xml:space="preserve">into</w:t>
         </w:r>
@@ -1550,12 +1550,12 @@
       <w:r>
         <w:t xml:space="preserve"> </w:t>
       </w:r>
-      <w:del w:id="10217" w:author="Revision merge (HM+PL)" w:date="2026-09-07T13:07:41Z">
+      <w:del w:id="10217" w:author="Revision merge (HM+PL)" w:date="2026-09-07T16:18:28Z">
         <w:r>
           <w:delText xml:space="preserve">them</w:delText>
         </w:r>
       </w:del>
-      <w:ins w:id="10218" w:author="Revision merge (HM+PL)" w:date="2026-09-07T13:07:41Z">
+      <w:ins w:id="10218" w:author="Revision merge (HM+PL)" w:date="2026-09-07T16:18:28Z">
         <w:r>
           <w:t xml:space="preserve">reproducible</w:t>
         </w:r>
@@ -1563,12 +1563,12 @@
       <w:r>
         <w:t xml:space="preserve"> </w:t>
       </w:r>
-      <w:del w:id="10219" w:author="Revision merge (HM+PL)" w:date="2026-09-07T13:07:41Z">
+      <w:del w:id="10219" w:author="Revision merge (HM+PL)" w:date="2026-09-07T16:18:28Z">
         <w:r>
           <w:delText xml:space="preserve">is</w:delText>
         </w:r>
       </w:del>
-      <w:ins w:id="10220" w:author="Revision merge (HM+PL)" w:date="2026-09-07T13:07:41Z">
+      <w:ins w:id="10220" w:author="Revision merge (HM+PL)" w:date="2026-09-07T16:18:28Z">
         <w:r>
           <w:t xml:space="preserve">and</w:t>
         </w:r>
@@ -1576,12 +1576,12 @@
       <w:r>
         <w:t xml:space="preserve"> </w:t>
       </w:r>
-      <w:del w:id="10221" w:author="Revision merge (HM+PL)" w:date="2026-09-07T13:07:41Z">
+      <w:del w:id="10221" w:author="Revision merge (HM+PL)" w:date="2026-09-07T16:18:28Z">
         <w:r>
           <w:delText xml:space="preserve">not.</w:delText>
         </w:r>
       </w:del>
-      <w:ins w:id="10222" w:author="Revision merge (HM+PL)" w:date="2026-09-07T13:07:41Z">
+      <w:ins w:id="10222" w:author="Revision merge (HM+PL)" w:date="2026-09-07T16:18:28Z">
         <w:r>
           <w:t xml:space="preserve">reusable workflows remains limited.</w:t>
         </w:r>
@@ -1594,12 +1594,12 @@
       <w:r>
         <w:t xml:space="preserve">In practice, </w:t>
       </w:r>
-      <w:del w:id="10223" w:author="Revision merge (HM+PL)" w:date="2026-09-07T13:07:41Z">
+      <w:del w:id="10223" w:author="Revision merge (HM+PL)" w:date="2026-09-07T16:18:28Z">
         <w:r>
           <w:delText xml:space="preserve">each</w:delText>
         </w:r>
       </w:del>
-      <w:ins w:id="10224" w:author="Revision merge (HM+PL)" w:date="2026-09-07T13:07:41Z">
+      <w:ins w:id="10224" w:author="Revision merge (HM+PL)" w:date="2026-09-07T16:18:28Z">
         <w:r>
           <w:t xml:space="preserve">downstream</w:t>
         </w:r>
@@ -1607,12 +1607,12 @@
       <w:r>
         <w:t xml:space="preserve"> </w:t>
       </w:r>
-      <w:del w:id="10225" w:author="Revision merge (HM+PL)" w:date="2026-09-07T13:07:41Z">
+      <w:del w:id="10225" w:author="Revision merge (HM+PL)" w:date="2026-09-07T16:18:28Z">
         <w:r>
           <w:delText xml:space="preserve">new</w:delText>
         </w:r>
       </w:del>
-      <w:ins w:id="10226" w:author="Revision merge (HM+PL)" w:date="2026-09-07T13:07:41Z">
+      <w:ins w:id="10226" w:author="Revision merge (HM+PL)" w:date="2026-09-07T16:18:28Z">
         <w:r>
           <w:t xml:space="preserve">analyses</w:t>
         </w:r>
@@ -1620,12 +1620,12 @@
       <w:r>
         <w:t xml:space="preserve"> </w:t>
       </w:r>
-      <w:del w:id="10227" w:author="Revision merge (HM+PL)" w:date="2026-09-07T13:07:41Z">
+      <w:del w:id="10227" w:author="Revision merge (HM+PL)" w:date="2026-09-07T16:18:28Z">
         <w:r>
           <w:delText xml:space="preserve">study</w:delText>
         </w:r>
       </w:del>
-      <w:ins w:id="10228" w:author="Revision merge (HM+PL)" w:date="2026-09-07T13:07:41Z">
+      <w:ins w:id="10228" w:author="Revision merge (HM+PL)" w:date="2026-09-07T16:18:28Z">
         <w:r>
           <w:t xml:space="preserve">continue</w:t>
         </w:r>
@@ -1633,12 +1633,12 @@
       <w:r>
         <w:t xml:space="preserve"> </w:t>
       </w:r>
-      <w:del w:id="10229" w:author="Revision merge (HM+PL)" w:date="2026-09-07T13:07:41Z">
+      <w:del w:id="10229" w:author="Revision merge (HM+PL)" w:date="2026-09-07T16:18:28Z">
         <w:r>
           <w:delText xml:space="preserve">is</w:delText>
         </w:r>
       </w:del>
-      <w:ins w:id="10230" w:author="Revision merge (HM+PL)" w:date="2026-09-07T13:07:41Z">
+      <w:ins w:id="10230" w:author="Revision merge (HM+PL)" w:date="2026-09-07T16:18:28Z">
         <w:r>
           <w:t xml:space="preserve">to</w:t>
         </w:r>
@@ -1646,12 +1646,12 @@
       <w:r>
         <w:t xml:space="preserve"> </w:t>
       </w:r>
-      <w:del w:id="10231" w:author="Revision merge (HM+PL)" w:date="2026-09-07T13:07:41Z">
+      <w:del w:id="10231" w:author="Revision merge (HM+PL)" w:date="2026-09-07T16:18:28Z">
         <w:r>
           <w:delText xml:space="preserve">analysed</w:delText>
         </w:r>
       </w:del>
-      <w:ins w:id="10232" w:author="Revision merge (HM+PL)" w:date="2026-09-07T13:07:41Z">
+      <w:ins w:id="10232" w:author="Revision merge (HM+PL)" w:date="2026-09-07T16:18:28Z">
         <w:r>
           <w:t xml:space="preserve">rely</w:t>
         </w:r>
@@ -1659,12 +1659,12 @@
       <w:r>
         <w:t xml:space="preserve"> </w:t>
       </w:r>
-      <w:del w:id="10233" w:author="Revision merge (HM+PL)" w:date="2026-09-07T13:07:41Z">
+      <w:del w:id="10233" w:author="Revision merge (HM+PL)" w:date="2026-09-07T16:18:28Z">
         <w:r>
           <w:delText xml:space="preserve">by adapting</w:delText>
         </w:r>
       </w:del>
-      <w:ins w:id="10234" w:author="Revision merge (HM+PL)" w:date="2026-09-07T13:07:41Z">
+      <w:ins w:id="10234" w:author="Revision merge (HM+PL)" w:date="2026-09-07T16:18:28Z">
         <w:r>
           <w:t xml:space="preserve">on</w:t>
         </w:r>
@@ -1672,12 +1672,12 @@
       <w:r>
         <w:t xml:space="preserve"> a set of bespoke R </w:t>
       </w:r>
-      <w:del w:id="10235" w:author="Revision merge (HM+PL)" w:date="2026-09-07T13:07:41Z">
+      <w:del w:id="10235" w:author="Revision merge (HM+PL)" w:date="2026-09-07T16:18:28Z">
         <w:r>
           <w:delText xml:space="preserve">scripts:</w:delText>
         </w:r>
       </w:del>
-      <w:ins w:id="10236" w:author="Revision merge (HM+PL)" w:date="2026-09-07T13:07:41Z">
+      <w:ins w:id="10236" w:author="Revision merge (HM+PL)" w:date="2026-09-07T16:18:28Z">
         <w:r>
           <w:t xml:space="preserve">scripts that have evolved incrementally over successive projects. These scripts frequently contain</w:t>
         </w:r>
@@ -1685,12 +1685,12 @@
       <w:r>
         <w:t xml:space="preserve"> hard-coded input paths, sample-identifier filters embedded as literal strings, per-study negative-control renames, and taxonomy fixes patched by row index. </w:t>
       </w:r>
-      <w:del w:id="10237" w:author="Revision merge (HM+PL)" w:date="2026-09-07T13:07:41Z">
+      <w:del w:id="10237" w:author="Revision merge (HM+PL)" w:date="2026-09-07T16:18:28Z">
         <w:r>
           <w:delText xml:space="preserve">Consequently,</w:delText>
         </w:r>
       </w:del>
-      <w:ins w:id="10238" w:author="Revision merge (HM+PL)" w:date="2026-09-07T13:07:41Z">
+      <w:ins w:id="10238" w:author="Revision merge (HM+PL)" w:date="2026-09-07T16:18:28Z">
         <w:r>
           <w:t xml:space="preserve">As a result,</w:t>
         </w:r>
@@ -1698,12 +1698,12 @@
       <w:r>
         <w:t xml:space="preserve"> individual script copies </w:t>
       </w:r>
-      <w:del w:id="10239" w:author="Revision merge (HM+PL)" w:date="2026-09-07T13:07:41Z">
+      <w:del w:id="10239" w:author="Revision merge (HM+PL)" w:date="2026-09-07T16:18:28Z">
         <w:r>
           <w:delText xml:space="preserve">diverge,</w:delText>
         </w:r>
       </w:del>
-      <w:ins w:id="10240" w:author="Revision merge (HM+PL)" w:date="2026-09-07T13:07:41Z">
+      <w:ins w:id="10240" w:author="Revision merge (HM+PL)" w:date="2026-09-07T16:18:28Z">
         <w:r>
           <w:t xml:space="preserve">diverge over time, reducing reproducibility and limiting portability,</w:t>
         </w:r>
@@ -1711,12 +1711,12 @@
       <w:r>
         <w:t xml:space="preserve"> and the </w:t>
       </w:r>
-      <w:del w:id="10241" w:author="Revision merge (HM+PL)" w:date="2026-09-07T13:07:41Z">
+      <w:del w:id="10241" w:author="Revision merge (HM+PL)" w:date="2026-09-07T16:18:28Z">
         <w:r>
           <w:delText xml:space="preserve">lack</w:delText>
         </w:r>
       </w:del>
-      <w:ins w:id="10242" w:author="Revision merge (HM+PL)" w:date="2026-09-07T13:07:41Z">
+      <w:ins w:id="10242" w:author="Revision merge (HM+PL)" w:date="2026-09-07T16:18:28Z">
         <w:r>
           <w:t xml:space="preserve">absence</w:t>
         </w:r>
@@ -1724,12 +1724,12 @@
       <w:r>
         <w:t xml:space="preserve"> of a shared interface prevents automated output logging. Comparing different studies requires manual reconciliation of both code and data. The reference cohort for the present work (`Chicken Batch 1`; ~46 hand-edited scripts) </w:t>
       </w:r>
-      <w:del w:id="10243" w:author="Revision merge (HM+PL)" w:date="2026-09-07T13:07:41Z">
+      <w:del w:id="10243" w:author="Revision merge (HM+PL)" w:date="2026-09-07T16:18:28Z">
         <w:r>
           <w:delText xml:space="preserve">typifies</w:delText>
         </w:r>
       </w:del>
-      <w:ins w:id="10244" w:author="Revision merge (HM+PL)" w:date="2026-09-07T13:07:41Z">
+      <w:ins w:id="10244" w:author="Revision merge (HM+PL)" w:date="2026-09-07T16:18:28Z">
         <w:r>
           <w:t xml:space="preserve">exemplifies</w:t>
         </w:r>
@@ -1737,12 +1737,12 @@
       <w:r>
         <w:t xml:space="preserve"> this pattern. The L-ARRAP pipeline [11] </w:t>
       </w:r>
-      <w:del w:id="10245" w:author="Revision merge (HM+PL)" w:date="2026-09-07T13:07:41Z">
+      <w:del w:id="10245" w:author="Revision merge (HM+PL)" w:date="2026-09-07T16:18:28Z">
         <w:r>
           <w:delText xml:space="preserve">addresses</w:delText>
         </w:r>
       </w:del>
-      <w:ins w:id="10246" w:author="Revision merge (HM+PL)" w:date="2026-09-07T13:07:41Z">
+      <w:ins w:id="10246" w:author="Revision merge (HM+PL)" w:date="2026-09-07T16:18:28Z">
         <w:r>
           <w:t xml:space="preserve">provides</w:t>
         </w:r>
@@ -1750,12 +1750,12 @@
       <w:r>
         <w:t xml:space="preserve"> </w:t>
       </w:r>
-      <w:del w:id="10247" w:author="Revision merge (HM+PL)" w:date="2026-09-07T13:07:41Z">
+      <w:del w:id="10247" w:author="Revision merge (HM+PL)" w:date="2026-09-07T16:18:28Z">
         <w:r>
           <w:delText xml:space="preserve">one</w:delText>
         </w:r>
       </w:del>
-      <w:ins w:id="10248" w:author="Revision merge (HM+PL)" w:date="2026-09-07T13:07:41Z">
+      <w:ins w:id="10248" w:author="Revision merge (HM+PL)" w:date="2026-09-07T16:18:28Z">
         <w:r>
           <w:t xml:space="preserve">a</w:t>
         </w:r>
@@ -1763,12 +1763,12 @@
       <w:r>
         <w:t xml:space="preserve"> </w:t>
       </w:r>
-      <w:del w:id="10249" w:author="Revision merge (HM+PL)" w:date="2026-09-07T13:07:41Z">
+      <w:del w:id="10249" w:author="Revision merge (HM+PL)" w:date="2026-09-07T16:18:28Z">
         <w:r>
           <w:delText xml:space="preserve">slice of this problem</w:delText>
         </w:r>
       </w:del>
-      <w:ins w:id="10250" w:author="Revision merge (HM+PL)" w:date="2026-09-07T13:07:41Z">
+      <w:ins w:id="10250" w:author="Revision merge (HM+PL)" w:date="2026-09-07T16:18:28Z">
         <w:r>
           <w:t xml:space="preserve">framework</w:t>
         </w:r>
@@ -1776,12 +1776,12 @@
       <w:r>
         <w:t xml:space="preserve"> for long-read resistome risk assessment, </w:t>
       </w:r>
-      <w:del w:id="10251" w:author="Revision merge (HM+PL)" w:date="2026-09-07T13:07:41Z">
+      <w:del w:id="10251" w:author="Revision merge (HM+PL)" w:date="2026-09-07T16:18:28Z">
         <w:r>
           <w:delText xml:space="preserve">and</w:delText>
         </w:r>
       </w:del>
-      <w:ins w:id="10252" w:author="Revision merge (HM+PL)" w:date="2026-09-07T13:07:41Z">
+      <w:ins w:id="10252" w:author="Revision merge (HM+PL)" w:date="2026-09-07T16:18:28Z">
         <w:r>
           <w:t xml:space="preserve">while</w:t>
         </w:r>
@@ -1789,12 +1789,12 @@
       <w:r>
         <w:t xml:space="preserve"> the rANOMALY workflow [12] demonstrates the </w:t>
       </w:r>
-      <w:del w:id="10253" w:author="Revision merge (HM+PL)" w:date="2026-09-07T13:07:41Z">
+      <w:del w:id="10253" w:author="Revision merge (HM+PL)" w:date="2026-09-07T16:18:28Z">
         <w:r>
           <w:delText xml:space="preserve">value</w:delText>
         </w:r>
       </w:del>
-      <w:ins w:id="10254" w:author="Revision merge (HM+PL)" w:date="2026-09-07T13:07:41Z">
+      <w:ins w:id="10254" w:author="Revision merge (HM+PL)" w:date="2026-09-07T16:18:28Z">
         <w:r>
           <w:t xml:space="preserve">advantages</w:t>
         </w:r>
@@ -1802,12 +1802,12 @@
       <w:r>
         <w:t xml:space="preserve"> of a </w:t>
       </w:r>
-      <w:del w:id="10255" w:author="Revision merge (HM+PL)" w:date="2026-09-07T13:07:41Z">
+      <w:del w:id="10255" w:author="Revision merge (HM+PL)" w:date="2026-09-07T16:18:28Z">
         <w:r>
           <w:delText xml:space="preserve">config-driven</w:delText>
         </w:r>
       </w:del>
-      <w:ins w:id="10256" w:author="Revision merge (HM+PL)" w:date="2026-09-07T13:07:41Z">
+      <w:ins w:id="10256" w:author="Revision merge (HM+PL)" w:date="2026-09-07T16:18:28Z">
         <w:r>
           <w:t xml:space="preserve">configuration-driven</w:t>
         </w:r>
@@ -1815,12 +1815,12 @@
       <w:r>
         <w:t xml:space="preserve"> R workflow with auto-generated reports for amplicon data. To our knowledge, no </w:t>
       </w:r>
-      <w:del w:id="10257" w:author="Revision merge (HM+PL)" w:date="2026-09-07T13:07:41Z">
+      <w:del w:id="10257" w:author="Revision merge (HM+PL)" w:date="2026-09-07T16:18:28Z">
         <w:r>
           <w:delText xml:space="preserve">comparable</w:delText>
         </w:r>
       </w:del>
-      <w:ins w:id="10258" w:author="Revision merge (HM+PL)" w:date="2026-09-07T13:07:41Z">
+      <w:ins w:id="10258" w:author="Revision merge (HM+PL)" w:date="2026-09-07T16:18:28Z">
         <w:r>
           <w:t xml:space="preserve">integrated end-to-end R</w:t>
         </w:r>
@@ -1828,12 +1828,12 @@
       <w:r>
         <w:t xml:space="preserve"> workflow </w:t>
       </w:r>
-      <w:del w:id="10259" w:author="Revision merge (HM+PL)" w:date="2026-09-07T13:07:41Z">
+      <w:del w:id="10259" w:author="Revision merge (HM+PL)" w:date="2026-09-07T16:18:28Z">
         <w:r>
           <w:delText xml:space="preserve">exists for end-to-end</w:delText>
         </w:r>
       </w:del>
-      <w:ins w:id="10260" w:author="Revision merge (HM+PL)" w:date="2026-09-07T13:07:41Z">
+      <w:ins w:id="10260" w:author="Revision merge (HM+PL)" w:date="2026-09-07T16:18:28Z">
         <w:r>
           <w:t xml:space="preserve">covers</w:t>
         </w:r>
@@ -1841,12 +1841,12 @@
       <w:r>
         <w:t xml:space="preserve"> long-read shotgun </w:t>
       </w:r>
-      <w:del w:id="10261" w:author="Revision merge (HM+PL)" w:date="2026-09-07T13:07:41Z">
+      <w:del w:id="10261" w:author="Revision merge (HM+PL)" w:date="2026-09-07T16:18:28Z">
         <w:r>
           <w:delText xml:space="preserve">metagenomics</w:delText>
         </w:r>
       </w:del>
-      <w:ins w:id="10262" w:author="Revision merge (HM+PL)" w:date="2026-09-07T13:07:41Z">
+      <w:ins w:id="10262" w:author="Revision merge (HM+PL)" w:date="2026-09-07T16:18:28Z">
         <w:r>
           <w:t xml:space="preserve">metagenomic</w:t>
         </w:r>
@@ -1854,12 +1854,12 @@
       <w:r>
         <w:t xml:space="preserve"> </w:t>
       </w:r>
-      <w:del w:id="10263" w:author="Revision merge (HM+PL)" w:date="2026-09-07T13:07:41Z">
+      <w:del w:id="10263" w:author="Revision merge (HM+PL)" w:date="2026-09-07T16:18:28Z">
         <w:r>
           <w:delText xml:space="preserve">that</w:delText>
         </w:r>
       </w:del>
-      <w:ins w:id="10264" w:author="Revision merge (HM+PL)" w:date="2026-09-07T13:07:41Z">
+      <w:ins w:id="10264" w:author="Revision merge (HM+PL)" w:date="2026-09-07T16:18:28Z">
         <w:r>
           <w:t xml:space="preserve">data</w:t>
         </w:r>
@@ -1867,12 +1867,12 @@
       <w:r>
         <w:t xml:space="preserve"> </w:t>
       </w:r>
-      <w:del w:id="10265" w:author="Revision merge (HM+PL)" w:date="2026-09-07T13:07:41Z">
+      <w:del w:id="10265" w:author="Revision merge (HM+PL)" w:date="2026-09-07T16:18:28Z">
         <w:r>
           <w:delText xml:space="preserve">covers</w:delText>
         </w:r>
       </w:del>
-      <w:ins w:id="10266" w:author="Revision merge (HM+PL)" w:date="2026-09-07T13:07:41Z">
+      <w:ins w:id="10266" w:author="Revision merge (HM+PL)" w:date="2026-09-07T16:18:28Z">
         <w:r>
           <w:t xml:space="preserve">spanning</w:t>
         </w:r>
@@ -1880,12 +1880,12 @@
       <w:r>
         <w:t xml:space="preserve"> </w:t>
       </w:r>
-      <w:del w:id="10267" w:author="Revision merge (HM+PL)" w:date="2026-09-07T13:07:41Z">
+      <w:del w:id="10267" w:author="Revision merge (HM+PL)" w:date="2026-09-07T16:18:28Z">
         <w:r>
           <w:delText xml:space="preserve">taxonomy,</w:delText>
         </w:r>
       </w:del>
-      <w:ins w:id="10268" w:author="Revision merge (HM+PL)" w:date="2026-09-07T13:07:41Z">
+      <w:ins w:id="10268" w:author="Revision merge (HM+PL)" w:date="2026-09-07T16:18:28Z">
         <w:r>
           <w:t xml:space="preserve">taxonomic composition, microbial</w:t>
         </w:r>
@@ -1893,12 +1893,12 @@
       <w:r>
         <w:t xml:space="preserve"> diversity, differential abundance, and </w:t>
       </w:r>
-      <w:del w:id="10269" w:author="Revision merge (HM+PL)" w:date="2026-09-07T13:07:41Z">
+      <w:del w:id="10269" w:author="Revision merge (HM+PL)" w:date="2026-09-07T16:18:28Z">
         <w:r>
           <w:delText xml:space="preserve">full</w:delText>
         </w:r>
       </w:del>
-      <w:ins w:id="10270" w:author="Revision merge (HM+PL)" w:date="2026-09-07T13:07:41Z">
+      <w:ins w:id="10270" w:author="Revision merge (HM+PL)" w:date="2026-09-07T16:18:28Z">
         <w:r>
           <w:t xml:space="preserve">comprehensive</w:t>
         </w:r>
@@ -1911,12 +1911,12 @@
       <w:pPr>
         <w:spacing w:after="120"/>
       </w:pPr>
-      <w:del w:id="10271" w:author="Revision merge (HM+PL)" w:date="2026-09-07T13:07:41Z">
+      <w:del w:id="10271" w:author="Revision merge (HM+PL)" w:date="2026-09-07T16:18:28Z">
         <w:r>
           <w:delText xml:space="preserve">We</w:delText>
         </w:r>
       </w:del>
-      <w:ins w:id="10272" w:author="Revision merge (HM+PL)" w:date="2026-09-07T13:07:41Z">
+      <w:ins w:id="10272" w:author="Revision merge (HM+PL)" w:date="2026-09-07T16:18:28Z">
         <w:r>
           <w:t xml:space="preserve">To</w:t>
         </w:r>
@@ -1924,12 +1924,12 @@
       <w:r>
         <w:t xml:space="preserve"> </w:t>
       </w:r>
-      <w:del w:id="10273" w:author="Revision merge (HM+PL)" w:date="2026-09-07T13:07:41Z">
+      <w:del w:id="10273" w:author="Revision merge (HM+PL)" w:date="2026-09-07T16:18:28Z">
         <w:r>
           <w:delText xml:space="preserve">present</w:delText>
         </w:r>
       </w:del>
-      <w:ins w:id="10274" w:author="Revision merge (HM+PL)" w:date="2026-09-07T13:07:41Z">
+      <w:ins w:id="10274" w:author="Revision merge (HM+PL)" w:date="2026-09-07T16:18:28Z">
         <w:r>
           <w:t xml:space="preserve">address this gap, we have developed</w:t>
         </w:r>
@@ -1937,12 +1937,12 @@
       <w:r>
         <w:t xml:space="preserve"> an alpha-stage R </w:t>
       </w:r>
-      <w:del w:id="10275" w:author="Revision merge (HM+PL)" w:date="2026-09-07T13:07:41Z">
+      <w:del w:id="10275" w:author="Revision merge (HM+PL)" w:date="2026-09-07T16:18:28Z">
         <w:r>
           <w:delText xml:space="preserve">workflow</w:delText>
         </w:r>
       </w:del>
-      <w:ins w:id="10276" w:author="Revision merge (HM+PL)" w:date="2026-09-07T13:07:41Z">
+      <w:ins w:id="10276" w:author="Revision merge (HM+PL)" w:date="2026-09-07T16:18:28Z">
         <w:r>
           <w:t xml:space="preserve">workflow.</w:t>
         </w:r>
@@ -1950,12 +1950,12 @@
       <w:r>
         <w:t xml:space="preserve"> </w:t>
       </w:r>
-      <w:del w:id="10277" w:author="Revision merge (HM+PL)" w:date="2026-09-07T13:07:41Z">
+      <w:del w:id="10277" w:author="Revision merge (HM+PL)" w:date="2026-09-07T16:18:28Z">
         <w:r>
           <w:delText xml:space="preserve">that</w:delText>
         </w:r>
       </w:del>
-      <w:ins w:id="10278" w:author="Revision merge (HM+PL)" w:date="2026-09-07T13:07:41Z">
+      <w:ins w:id="10278" w:author="Revision merge (HM+PL)" w:date="2026-09-07T16:18:28Z">
         <w:r>
           <w:t xml:space="preserve">Here,</w:t>
         </w:r>
@@ -1963,12 +1963,12 @@
       <w:r>
         <w:t xml:space="preserve"> </w:t>
       </w:r>
-      <w:del w:id="10279" w:author="Revision merge (HM+PL)" w:date="2026-09-07T13:07:41Z">
+      <w:del w:id="10279" w:author="Revision merge (HM+PL)" w:date="2026-09-07T16:18:28Z">
         <w:r>
           <w:delText xml:space="preserve">fills</w:delText>
         </w:r>
       </w:del>
-      <w:ins w:id="10280" w:author="Revision merge (HM+PL)" w:date="2026-09-07T13:07:41Z">
+      <w:ins w:id="10280" w:author="Revision merge (HM+PL)" w:date="2026-09-07T16:18:28Z">
         <w:r>
           <w:t xml:space="preserve">we</w:t>
         </w:r>
@@ -1976,12 +1976,12 @@
       <w:r>
         <w:t xml:space="preserve"> </w:t>
       </w:r>
-      <w:del w:id="10281" w:author="Revision merge (HM+PL)" w:date="2026-09-07T13:07:41Z">
+      <w:del w:id="10281" w:author="Revision merge (HM+PL)" w:date="2026-09-07T16:18:28Z">
         <w:r>
           <w:delText xml:space="preserve">this</w:delText>
         </w:r>
       </w:del>
-      <w:ins w:id="10282" w:author="Revision merge (HM+PL)" w:date="2026-09-07T13:07:41Z">
+      <w:ins w:id="10282" w:author="Revision merge (HM+PL)" w:date="2026-09-07T16:18:28Z">
         <w:r>
           <w:t xml:space="preserve">describe</w:t>
         </w:r>
@@ -1989,12 +1989,12 @@
       <w:r>
         <w:t xml:space="preserve"> </w:t>
       </w:r>
-      <w:del w:id="10283" w:author="Revision merge (HM+PL)" w:date="2026-09-07T13:07:41Z">
+      <w:del w:id="10283" w:author="Revision merge (HM+PL)" w:date="2026-09-07T16:18:28Z">
         <w:r>
           <w:delText xml:space="preserve">gap.</w:delText>
         </w:r>
       </w:del>
-      <w:ins w:id="10284" w:author="Revision merge (HM+PL)" w:date="2026-09-07T13:07:41Z">
+      <w:ins w:id="10284" w:author="Revision merge (HM+PL)" w:date="2026-09-07T16:18:28Z">
         <w:r>
           <w:t xml:space="preserve">the</w:t>
         </w:r>
@@ -2002,12 +2002,12 @@
       <w:r>
         <w:t xml:space="preserve"> </w:t>
       </w:r>
-      <w:del w:id="10285" w:author="Revision merge (HM+PL)" w:date="2026-09-07T13:07:41Z">
+      <w:del w:id="10285" w:author="Revision merge (HM+PL)" w:date="2026-09-07T16:18:28Z">
         <w:r>
           <w:delText xml:space="preserve">The tool is in active development; this note describes its</w:delText>
         </w:r>
       </w:del>
-      <w:ins w:id="10286" w:author="Revision merge (HM+PL)" w:date="2026-09-07T13:07:41Z">
+      <w:ins w:id="10286" w:author="Revision merge (HM+PL)" w:date="2026-09-07T16:18:28Z">
         <w:r>
           <w:t xml:space="preserve">workflow's</w:t>
         </w:r>
@@ -2015,12 +2015,12 @@
       <w:r>
         <w:t xml:space="preserve"> design, current scope, and the real-data validation strategy </w:t>
       </w:r>
-      <w:del w:id="10287" w:author="Revision merge (HM+PL)" w:date="2026-09-07T13:07:41Z">
+      <w:del w:id="10287" w:author="Revision merge (HM+PL)" w:date="2026-09-07T16:18:28Z">
         <w:r>
           <w:delText xml:space="preserve">we</w:delText>
         </w:r>
       </w:del>
-      <w:ins w:id="10288" w:author="Revision merge (HM+PL)" w:date="2026-09-07T13:07:41Z">
+      <w:ins w:id="10288" w:author="Revision merge (HM+PL)" w:date="2026-09-07T16:18:28Z">
         <w:r>
           <w:t xml:space="preserve">enabling</w:t>
         </w:r>
@@ -2028,12 +2028,12 @@
       <w:r>
         <w:t xml:space="preserve"> </w:t>
       </w:r>
-      <w:del w:id="10289" w:author="Revision merge (HM+PL)" w:date="2026-09-07T13:07:41Z">
+      <w:del w:id="10289" w:author="Revision merge (HM+PL)" w:date="2026-09-07T16:18:28Z">
         <w:r>
           <w:delText xml:space="preserve">are</w:delText>
         </w:r>
       </w:del>
-      <w:ins w:id="10290" w:author="Revision merge (HM+PL)" w:date="2026-09-07T13:07:41Z">
+      <w:ins w:id="10290" w:author="Revision merge (HM+PL)" w:date="2026-09-07T16:18:28Z">
         <w:r>
           <w:t xml:space="preserve">the</w:t>
         </w:r>
@@ -2041,12 +2041,12 @@
       <w:r>
         <w:t xml:space="preserve"> </w:t>
       </w:r>
-      <w:del w:id="10291" w:author="Revision merge (HM+PL)" w:date="2026-09-07T13:07:41Z">
+      <w:del w:id="10291" w:author="Revision merge (HM+PL)" w:date="2026-09-07T16:18:28Z">
         <w:r>
           <w:delText xml:space="preserve">using</w:delText>
         </w:r>
       </w:del>
-      <w:ins w:id="10292" w:author="Revision merge (HM+PL)" w:date="2026-09-07T13:07:41Z">
+      <w:ins w:id="10292" w:author="Revision merge (HM+PL)" w:date="2026-09-07T16:18:28Z">
         <w:r>
           <w:t xml:space="preserve">assessment</w:t>
         </w:r>
@@ -2054,12 +2054,12 @@
       <w:r>
         <w:t xml:space="preserve"> </w:t>
       </w:r>
-      <w:del w:id="10293" w:author="Revision merge (HM+PL)" w:date="2026-09-07T13:07:41Z">
+      <w:del w:id="10293" w:author="Revision merge (HM+PL)" w:date="2026-09-07T16:18:28Z">
         <w:r>
           <w:delText xml:space="preserve">to</w:delText>
         </w:r>
       </w:del>
-      <w:ins w:id="10294" w:author="Revision merge (HM+PL)" w:date="2026-09-07T13:07:41Z">
+      <w:ins w:id="10294" w:author="Revision merge (HM+PL)" w:date="2026-09-07T16:18:28Z">
         <w:r>
           <w:t xml:space="preserve">of</w:t>
         </w:r>
@@ -2067,12 +2067,12 @@
       <w:r>
         <w:t xml:space="preserve"> </w:t>
       </w:r>
-      <w:del w:id="10295" w:author="Revision merge (HM+PL)" w:date="2026-09-07T13:07:41Z">
+      <w:del w:id="10295" w:author="Revision merge (HM+PL)" w:date="2026-09-07T16:18:28Z">
         <w:r>
           <w:delText xml:space="preserve">harden</w:delText>
         </w:r>
       </w:del>
-      <w:ins w:id="10296" w:author="Revision merge (HM+PL)" w:date="2026-09-07T13:07:41Z">
+      <w:ins w:id="10296" w:author="Revision merge (HM+PL)" w:date="2026-09-07T16:18:28Z">
         <w:r>
           <w:t xml:space="preserve">its</w:t>
         </w:r>
@@ -2080,12 +2080,12 @@
       <w:r>
         <w:t xml:space="preserve"> </w:t>
       </w:r>
-      <w:del w:id="10297" w:author="Revision merge (HM+PL)" w:date="2026-09-07T13:07:41Z">
+      <w:del w:id="10297" w:author="Revision merge (HM+PL)" w:date="2026-09-07T16:18:28Z">
         <w:r>
           <w:delText xml:space="preserve">each stage.</w:delText>
         </w:r>
       </w:del>
-      <w:ins w:id="10298" w:author="Revision merge (HM+PL)" w:date="2026-09-07T13:07:41Z">
+      <w:ins w:id="10298" w:author="Revision merge (HM+PL)" w:date="2026-09-07T16:18:28Z">
         <w:r>
           <w:t xml:space="preserve">performance.</w:t>
         </w:r>
@@ -2113,7 +2113,7 @@
       <w:r>
         <w:t xml:space="preserve">The workflow is</w:t>
       </w:r>
-      <w:ins w:id="10299" w:author="Revision merge (HM+PL)" w:date="2026-09-07T13:07:41Z">
+      <w:ins w:id="10299" w:author="Revision merge (HM+PL)" w:date="2026-09-07T16:18:28Z">
         <w:r>
           <w:t xml:space="preserve"> implemented as</w:t>
         </w:r>
@@ -2121,12 +2121,12 @@
       <w:r>
         <w:t xml:space="preserve"> a stand-alone R project, </w:t>
       </w:r>
-      <w:del w:id="10300" w:author="Revision merge (HM+PL)" w:date="2026-09-07T13:07:41Z">
+      <w:del w:id="10300" w:author="Revision merge (HM+PL)" w:date="2026-09-07T16:18:28Z">
         <w:r>
           <w:delText xml:space="preserve">not</w:delText>
         </w:r>
       </w:del>
-      <w:ins w:id="10301" w:author="Revision merge (HM+PL)" w:date="2026-09-07T13:07:41Z">
+      <w:ins w:id="10301" w:author="Revision merge (HM+PL)" w:date="2026-09-07T16:18:28Z">
         <w:r>
           <w:t xml:space="preserve">rather than</w:t>
         </w:r>
@@ -2134,7 +2134,7 @@
       <w:r>
         <w:t xml:space="preserve"> an installable </w:t>
       </w:r>
-      <w:ins w:id="10302" w:author="Revision merge (HM+PL)" w:date="2026-09-07T13:07:41Z">
+      <w:ins w:id="10302" w:author="Revision merge (HM+PL)" w:date="2026-09-07T16:18:28Z">
         <w:r>
           <w:t xml:space="preserve">software </w:t>
         </w:r>
@@ -2142,12 +2142,12 @@
       <w:r>
         <w:t xml:space="preserve">package. </w:t>
       </w:r>
-      <w:del w:id="10303" w:author="Revision merge (HM+PL)" w:date="2026-09-07T13:07:41Z">
+      <w:del w:id="10303" w:author="Revision merge (HM+PL)" w:date="2026-09-07T16:18:28Z">
         <w:r>
           <w:delText xml:space="preserve">A</w:delText>
         </w:r>
       </w:del>
-      <w:ins w:id="10304" w:author="Revision merge (HM+PL)" w:date="2026-09-07T13:07:41Z">
+      <w:ins w:id="10304" w:author="Revision merge (HM+PL)" w:date="2026-09-07T16:18:28Z">
         <w:r>
           <w:t xml:space="preserve">Execution is initiated through a</w:t>
         </w:r>
@@ -2155,12 +2155,12 @@
       <w:r>
         <w:t xml:space="preserve"> single entry </w:t>
       </w:r>
-      <w:del w:id="10305" w:author="Revision merge (HM+PL)" w:date="2026-09-07T13:07:41Z">
+      <w:del w:id="10305" w:author="Revision merge (HM+PL)" w:date="2026-09-07T16:18:28Z">
         <w:r>
           <w:delText xml:space="preserve">point</w:delText>
         </w:r>
       </w:del>
-      <w:ins w:id="10306" w:author="Revision merge (HM+PL)" w:date="2026-09-07T13:07:41Z">
+      <w:ins w:id="10306" w:author="Revision merge (HM+PL)" w:date="2026-09-07T16:18:28Z">
         <w:r>
           <w:t xml:space="preserve">script</w:t>
         </w:r>
@@ -2168,12 +2168,12 @@
       <w:r>
         <w:t xml:space="preserve"> (`run_pipeline.R`) </w:t>
       </w:r>
-      <w:del w:id="10307" w:author="Revision merge (HM+PL)" w:date="2026-09-07T13:07:41Z">
+      <w:del w:id="10307" w:author="Revision merge (HM+PL)" w:date="2026-09-07T16:18:28Z">
         <w:r>
           <w:delText xml:space="preserve">consumes</w:delText>
         </w:r>
       </w:del>
-      <w:ins w:id="10308" w:author="Revision merge (HM+PL)" w:date="2026-09-07T13:07:41Z">
+      <w:ins w:id="10308" w:author="Revision merge (HM+PL)" w:date="2026-09-07T16:18:28Z">
         <w:r>
           <w:t xml:space="preserve">that reads</w:t>
         </w:r>
@@ -2181,12 +2181,12 @@
       <w:r>
         <w:t xml:space="preserve"> one YAML configuration file </w:t>
       </w:r>
-      <w:del w:id="10309" w:author="Revision merge (HM+PL)" w:date="2026-09-07T13:07:41Z">
+      <w:del w:id="10309" w:author="Revision merge (HM+PL)" w:date="2026-09-07T16:18:28Z">
         <w:r>
           <w:delText xml:space="preserve">per</w:delText>
         </w:r>
       </w:del>
-      <w:ins w:id="10310" w:author="Revision merge (HM+PL)" w:date="2026-09-07T13:07:41Z">
+      <w:ins w:id="10310" w:author="Revision merge (HM+PL)" w:date="2026-09-07T16:18:28Z">
         <w:r>
           <w:t xml:space="preserve">for each</w:t>
         </w:r>
@@ -2194,12 +2194,12 @@
       <w:r>
         <w:t xml:space="preserve"> study and dispatches </w:t>
       </w:r>
-      <w:del w:id="10311" w:author="Revision merge (HM+PL)" w:date="2026-09-07T13:07:41Z">
+      <w:del w:id="10311" w:author="Revision merge (HM+PL)" w:date="2026-09-07T16:18:28Z">
         <w:r>
           <w:delText xml:space="preserve">to</w:delText>
         </w:r>
       </w:del>
-      <w:ins w:id="10312" w:author="Revision merge (HM+PL)" w:date="2026-09-07T13:07:41Z">
+      <w:ins w:id="10312" w:author="Revision merge (HM+PL)" w:date="2026-09-07T16:18:28Z">
         <w:r>
           <w:t xml:space="preserve">the workflow across</w:t>
         </w:r>
@@ -2207,12 +2207,12 @@
       <w:r>
         <w:t xml:space="preserve"> fifteen modules (`R/00_setup.R` through `R/13_panels.R`; plus the manifest stage </w:t>
       </w:r>
-      <w:del w:id="10313" w:author="Revision merge (HM+PL)" w:date="2026-09-07T13:07:41Z">
+      <w:del w:id="10313" w:author="Revision merge (HM+PL)" w:date="2026-09-07T16:18:28Z">
         <w:r>
           <w:delText xml:space="preserve">`R/14`</w:delText>
         </w:r>
       </w:del>
-      <w:ins w:id="10314" w:author="Revision merge (HM+PL)" w:date="2026-09-07T13:07:41Z">
+      <w:ins w:id="10314" w:author="Revision merge (HM+PL)" w:date="2026-09-07T16:18:28Z">
         <w:r>
           <w:t xml:space="preserve">`R/14`,</w:t>
         </w:r>
@@ -2220,12 +2220,12 @@
       <w:r>
         <w:t xml:space="preserve"> which runs </w:t>
       </w:r>
-      <w:del w:id="10315" w:author="Revision merge (HM+PL)" w:date="2026-09-07T13:07:41Z">
+      <w:del w:id="10315" w:author="Revision merge (HM+PL)" w:date="2026-09-07T16:18:28Z">
         <w:r>
           <w:delText xml:space="preserve">last);</w:delText>
         </w:r>
       </w:del>
-      <w:ins w:id="10316" w:author="Revision merge (HM+PL)" w:date="2026-09-07T13:07:41Z">
+      <w:ins w:id="10316" w:author="Revision merge (HM+PL)" w:date="2026-09-07T16:18:28Z">
         <w:r>
           <w:t xml:space="preserve">last).</w:t>
         </w:r>
@@ -2233,12 +2233,12 @@
       <w:r>
         <w:t xml:space="preserve"> </w:t>
       </w:r>
-      <w:del w:id="10317" w:author="Revision merge (HM+PL)" w:date="2026-09-07T13:07:41Z">
+      <w:del w:id="10317" w:author="Revision merge (HM+PL)" w:date="2026-09-07T16:18:28Z">
         <w:r>
           <w:delText xml:space="preserve">a</w:delText>
         </w:r>
       </w:del>
-      <w:ins w:id="10318" w:author="Revision merge (HM+PL)" w:date="2026-09-07T13:07:41Z">
+      <w:ins w:id="10318" w:author="Revision merge (HM+PL)" w:date="2026-09-07T16:18:28Z">
         <w:r>
           <w:t xml:space="preserve">A</w:t>
         </w:r>
@@ -2246,12 +2246,12 @@
       <w:r>
         <w:t xml:space="preserve"> Quarto dashboard template (`templates/report.qmd`) renders all outputs into a single multi-page HTML </w:t>
       </w:r>
-      <w:del w:id="10319" w:author="Revision merge (HM+PL)" w:date="2026-09-07T13:07:41Z">
+      <w:del w:id="10319" w:author="Revision merge (HM+PL)" w:date="2026-09-07T16:18:28Z">
         <w:r>
           <w:delText xml:space="preserve">deliverable,</w:delText>
         </w:r>
       </w:del>
-      <w:ins w:id="10320" w:author="Revision merge (HM+PL)" w:date="2026-09-07T13:07:41Z">
+      <w:ins w:id="10320" w:author="Revision merge (HM+PL)" w:date="2026-09-07T16:18:28Z">
         <w:r>
           <w:t xml:space="preserve">deliverable.</w:t>
         </w:r>
@@ -2259,12 +2259,12 @@
       <w:r>
         <w:t xml:space="preserve"> </w:t>
       </w:r>
-      <w:del w:id="10321" w:author="Revision merge (HM+PL)" w:date="2026-09-07T13:07:41Z">
+      <w:del w:id="10321" w:author="Revision merge (HM+PL)" w:date="2026-09-07T16:18:28Z">
         <w:r>
           <w:delText xml:space="preserve">a</w:delText>
         </w:r>
       </w:del>
-      <w:ins w:id="10322" w:author="Revision merge (HM+PL)" w:date="2026-09-07T13:07:41Z">
+      <w:ins w:id="10322" w:author="Revision merge (HM+PL)" w:date="2026-09-07T16:18:28Z">
         <w:r>
           <w:t xml:space="preserve">A subsequent</w:t>
         </w:r>
@@ -2272,7 +2272,7 @@
       <w:r>
         <w:t xml:space="preserve"> publication-panels stage assembles </w:t>
       </w:r>
-      <w:ins w:id="10323" w:author="Revision merge (HM+PL)" w:date="2026-09-07T13:07:41Z">
+      <w:ins w:id="10323" w:author="Revision merge (HM+PL)" w:date="2026-09-07T16:18:28Z">
         <w:r>
           <w:t xml:space="preserve">publication-ready composite figures for the </w:t>
         </w:r>
@@ -2280,12 +2280,12 @@
       <w:r>
         <w:t xml:space="preserve">main and supplementary </w:t>
       </w:r>
-      <w:del w:id="10324" w:author="Revision merge (HM+PL)" w:date="2026-09-07T13:07:41Z">
+      <w:del w:id="10324" w:author="Revision merge (HM+PL)" w:date="2026-09-07T16:18:28Z">
         <w:r>
           <w:delText xml:space="preserve">composite</w:delText>
         </w:r>
       </w:del>
-      <w:ins w:id="10325" w:author="Revision merge (HM+PL)" w:date="2026-09-07T13:07:41Z">
+      <w:ins w:id="10325" w:author="Revision merge (HM+PL)" w:date="2026-09-07T16:18:28Z">
         <w:r>
           <w:t xml:space="preserve">datasets</w:t>
         </w:r>
@@ -2293,12 +2293,12 @@
       <w:r>
         <w:t xml:space="preserve"> </w:t>
       </w:r>
-      <w:del w:id="10326" w:author="Revision merge (HM+PL)" w:date="2026-09-07T13:07:41Z">
+      <w:del w:id="10326" w:author="Revision merge (HM+PL)" w:date="2026-09-07T16:18:28Z">
         <w:r>
           <w:delText xml:space="preserve">figures</w:delText>
         </w:r>
       </w:del>
-      <w:ins w:id="10327" w:author="Revision merge (HM+PL)" w:date="2026-09-07T13:07:41Z">
+      <w:ins w:id="10327" w:author="Revision merge (HM+PL)" w:date="2026-09-07T16:18:28Z">
         <w:r>
           <w:t xml:space="preserve">and</w:t>
         </w:r>
@@ -2306,12 +2306,12 @@
       <w:r>
         <w:t xml:space="preserve"> </w:t>
       </w:r>
-      <w:del w:id="10328" w:author="Revision merge (HM+PL)" w:date="2026-09-07T13:07:41Z">
+      <w:del w:id="10328" w:author="Revision merge (HM+PL)" w:date="2026-09-07T16:18:28Z">
         <w:r>
           <w:delText xml:space="preserve">plus</w:delText>
         </w:r>
       </w:del>
-      <w:ins w:id="10329" w:author="Revision merge (HM+PL)" w:date="2026-09-07T13:07:41Z">
+      <w:ins w:id="10329" w:author="Revision merge (HM+PL)" w:date="2026-09-07T16:18:28Z">
         <w:r>
           <w:t xml:space="preserve">compiles</w:t>
         </w:r>
@@ -2319,12 +2319,12 @@
       <w:r>
         <w:t xml:space="preserve"> </w:t>
       </w:r>
-      <w:del w:id="10330" w:author="Revision merge (HM+PL)" w:date="2026-09-07T13:07:41Z">
+      <w:del w:id="10330" w:author="Revision merge (HM+PL)" w:date="2026-09-07T16:18:28Z">
         <w:r>
           <w:delText xml:space="preserve">a</w:delText>
         </w:r>
       </w:del>
-      <w:ins w:id="10331" w:author="Revision merge (HM+PL)" w:date="2026-09-07T13:07:41Z">
+      <w:ins w:id="10331" w:author="Revision merge (HM+PL)" w:date="2026-09-07T16:18:28Z">
         <w:r>
           <w:t xml:space="preserve">the accompanying</w:t>
         </w:r>
@@ -2332,12 +2332,12 @@
       <w:r>
         <w:t xml:space="preserve"> supplementary tables </w:t>
       </w:r>
-      <w:del w:id="10332" w:author="Revision merge (HM+PL)" w:date="2026-09-07T13:07:41Z">
+      <w:del w:id="10332" w:author="Revision merge (HM+PL)" w:date="2026-09-07T16:18:28Z">
         <w:r>
           <w:delText xml:space="preserve">workbook,</w:delText>
         </w:r>
       </w:del>
-      <w:ins w:id="10333" w:author="Revision merge (HM+PL)" w:date="2026-09-07T13:07:41Z">
+      <w:ins w:id="10333" w:author="Revision merge (HM+PL)" w:date="2026-09-07T16:18:28Z">
         <w:r>
           <w:t xml:space="preserve">into</w:t>
         </w:r>
@@ -2345,12 +2345,12 @@
       <w:r>
         <w:t xml:space="preserve"> </w:t>
       </w:r>
-      <w:del w:id="10334" w:author="Revision merge (HM+PL)" w:date="2026-09-07T13:07:41Z">
+      <w:del w:id="10334" w:author="Revision merge (HM+PL)" w:date="2026-09-07T16:18:28Z">
         <w:r>
           <w:delText xml:space="preserve">and</w:delText>
         </w:r>
       </w:del>
-      <w:ins w:id="10335" w:author="Revision merge (HM+PL)" w:date="2026-09-07T13:07:41Z">
+      <w:ins w:id="10335" w:author="Revision merge (HM+PL)" w:date="2026-09-07T16:18:28Z">
         <w:r>
           <w:t xml:space="preserve">a workbook. The pipeline concludes with the generation of</w:t>
         </w:r>
@@ -2358,7 +2358,7 @@
       <w:r>
         <w:t xml:space="preserve"> a final </w:t>
       </w:r>
-      <w:del w:id="10336" w:author="Revision merge (HM+PL)" w:date="2026-09-07T13:07:41Z">
+      <w:del w:id="10336" w:author="Revision merge (HM+PL)" w:date="2026-09-07T16:18:28Z">
         <w:r>
           <w:delText xml:space="preserve">manifest stage emits </w:delText>
         </w:r>
@@ -2366,12 +2366,12 @@
       <w:r>
         <w:t xml:space="preserve">`manifest.json` </w:t>
       </w:r>
-      <w:del w:id="10337" w:author="Revision merge (HM+PL)" w:date="2026-09-07T13:07:41Z">
+      <w:del w:id="10337" w:author="Revision merge (HM+PL)" w:date="2026-09-07T16:18:28Z">
         <w:r>
           <w:delText xml:space="preserve">describing</w:delText>
         </w:r>
       </w:del>
-      <w:ins w:id="10338" w:author="Revision merge (HM+PL)" w:date="2026-09-07T13:07:41Z">
+      <w:ins w:id="10338" w:author="Revision merge (HM+PL)" w:date="2026-09-07T16:18:28Z">
         <w:r>
           <w:t xml:space="preserve">file,</w:t>
         </w:r>
@@ -2379,12 +2379,12 @@
       <w:r>
         <w:t xml:space="preserve"> </w:t>
       </w:r>
-      <w:del w:id="10339" w:author="Revision merge (HM+PL)" w:date="2026-09-07T13:07:41Z">
+      <w:del w:id="10339" w:author="Revision merge (HM+PL)" w:date="2026-09-07T16:18:28Z">
         <w:r>
           <w:delText xml:space="preserve">every</w:delText>
         </w:r>
       </w:del>
-      <w:ins w:id="10340" w:author="Revision merge (HM+PL)" w:date="2026-09-07T13:07:41Z">
+      <w:ins w:id="10340" w:author="Revision merge (HM+PL)" w:date="2026-09-07T16:18:28Z">
         <w:r>
           <w:t xml:space="preserve">providing</w:t>
         </w:r>
@@ -2392,12 +2392,12 @@
       <w:r>
         <w:t xml:space="preserve"> </w:t>
       </w:r>
-      <w:del w:id="10341" w:author="Revision merge (HM+PL)" w:date="2026-09-07T13:07:41Z">
+      <w:del w:id="10341" w:author="Revision merge (HM+PL)" w:date="2026-09-07T16:18:28Z">
         <w:r>
           <w:delText xml:space="preserve">artefact</w:delText>
         </w:r>
       </w:del>
-      <w:ins w:id="10342" w:author="Revision merge (HM+PL)" w:date="2026-09-07T13:07:41Z">
+      <w:ins w:id="10342" w:author="Revision merge (HM+PL)" w:date="2026-09-07T16:18:28Z">
         <w:r>
           <w:t xml:space="preserve">a complete record of all artefacts</w:t>
         </w:r>
@@ -2413,12 +2413,12 @@
       <w:r>
         <w:t xml:space="preserve">[FIGURE] **Figure 1.** MERIDIAN workflow. A single `config.yaml` drives fifteen R modules (R/00–R/14) </w:t>
       </w:r>
-      <w:del w:id="10343" w:author="Revision merge (HM+PL)" w:date="2026-09-07T13:07:41Z">
+      <w:del w:id="10343" w:author="Revision merge (HM+PL)" w:date="2026-09-07T16:18:28Z">
         <w:r>
           <w:delText xml:space="preserve">consuming</w:delText>
         </w:r>
       </w:del>
-      <w:ins w:id="10344" w:author="Revision merge (HM+PL)" w:date="2026-09-07T13:07:41Z">
+      <w:ins w:id="10344" w:author="Revision merge (HM+PL)" w:date="2026-09-07T16:18:28Z">
         <w:r>
           <w:t xml:space="preserve">that load</w:t>
         </w:r>
@@ -2434,12 +2434,12 @@
       <w:r>
         <w:t xml:space="preserve">**Configuration-driven.** </w:t>
       </w:r>
-      <w:del w:id="10345" w:author="Revision merge (HM+PL)" w:date="2026-09-07T13:07:41Z">
+      <w:del w:id="10345" w:author="Revision merge (HM+PL)" w:date="2026-09-07T16:18:28Z">
         <w:r>
           <w:delText xml:space="preserve">Everything</w:delText>
         </w:r>
       </w:del>
-      <w:ins w:id="10346" w:author="Revision merge (HM+PL)" w:date="2026-09-07T13:07:41Z">
+      <w:ins w:id="10346" w:author="Revision merge (HM+PL)" w:date="2026-09-07T16:18:28Z">
         <w:r>
           <w:t xml:space="preserve">All</w:t>
         </w:r>
@@ -2447,12 +2447,12 @@
       <w:r>
         <w:t xml:space="preserve"> </w:t>
       </w:r>
-      <w:del w:id="10347" w:author="Revision merge (HM+PL)" w:date="2026-09-07T13:07:41Z">
+      <w:del w:id="10347" w:author="Revision merge (HM+PL)" w:date="2026-09-07T16:18:28Z">
         <w:r>
           <w:delText xml:space="preserve">that</w:delText>
         </w:r>
       </w:del>
-      <w:ins w:id="10348" w:author="Revision merge (HM+PL)" w:date="2026-09-07T13:07:41Z">
+      <w:ins w:id="10348" w:author="Revision merge (HM+PL)" w:date="2026-09-07T16:18:28Z">
         <w:r>
           <w:t xml:space="preserve">study-specific</w:t>
         </w:r>
@@ -2460,12 +2460,12 @@
       <w:r>
         <w:t xml:space="preserve"> </w:t>
       </w:r>
-      <w:del w:id="10349" w:author="Revision merge (HM+PL)" w:date="2026-09-07T13:07:41Z">
+      <w:del w:id="10349" w:author="Revision merge (HM+PL)" w:date="2026-09-07T16:18:28Z">
         <w:r>
           <w:delText xml:space="preserve">varies between studies</w:delText>
         </w:r>
       </w:del>
-      <w:ins w:id="10350" w:author="Revision merge (HM+PL)" w:date="2026-09-07T13:07:41Z">
+      <w:ins w:id="10350" w:author="Revision merge (HM+PL)" w:date="2026-09-07T16:18:28Z">
         <w:r>
           <w:t xml:space="preserve">parameters</w:t>
         </w:r>
@@ -2473,12 +2473,12 @@
       <w:r>
         <w:t xml:space="preserve"> — metadata file </w:t>
       </w:r>
-      <w:del w:id="10351" w:author="Revision merge (HM+PL)" w:date="2026-09-07T13:07:41Z">
+      <w:del w:id="10351" w:author="Revision merge (HM+PL)" w:date="2026-09-07T16:18:28Z">
         <w:r>
           <w:delText xml:space="preserve">path,</w:delText>
         </w:r>
       </w:del>
-      <w:ins w:id="10352" w:author="Revision merge (HM+PL)" w:date="2026-09-07T13:07:41Z">
+      <w:ins w:id="10352" w:author="Revision merge (HM+PL)" w:date="2026-09-07T16:18:28Z">
         <w:r>
           <w:t xml:space="preserve">locations, sample</w:t>
         </w:r>
@@ -2486,12 +2486,12 @@
       <w:r>
         <w:t xml:space="preserve"> grouping </w:t>
       </w:r>
-      <w:del w:id="10353" w:author="Revision merge (HM+PL)" w:date="2026-09-07T13:07:41Z">
+      <w:del w:id="10353" w:author="Revision merge (HM+PL)" w:date="2026-09-07T16:18:28Z">
         <w:r>
           <w:delText xml:space="preserve">columns,</w:delText>
         </w:r>
       </w:del>
-      <w:ins w:id="10354" w:author="Revision merge (HM+PL)" w:date="2026-09-07T13:07:41Z">
+      <w:ins w:id="10354" w:author="Revision merge (HM+PL)" w:date="2026-09-07T16:18:28Z">
         <w:r>
           <w:t xml:space="preserve">variables,</w:t>
         </w:r>
@@ -2499,7 +2499,7 @@
       <w:r>
         <w:t xml:space="preserve"> negative-control identifiers, abundance </w:t>
       </w:r>
-      <w:ins w:id="10355" w:author="Revision merge (HM+PL)" w:date="2026-09-07T13:07:41Z">
+      <w:ins w:id="10355" w:author="Revision merge (HM+PL)" w:date="2026-09-07T16:18:28Z">
         <w:r>
           <w:t xml:space="preserve">filtering </w:t>
         </w:r>
@@ -2507,7 +2507,7 @@
       <w:r>
         <w:t xml:space="preserve">thresholds,</w:t>
       </w:r>
-      <w:ins w:id="10356" w:author="Revision merge (HM+PL)" w:date="2026-09-07T13:07:41Z">
+      <w:ins w:id="10356" w:author="Revision merge (HM+PL)" w:date="2026-09-07T16:18:28Z">
         <w:r>
           <w:t xml:space="preserve"> and</w:t>
         </w:r>
@@ -2515,7 +2515,7 @@
       <w:r>
         <w:t xml:space="preserve"> sample selection </w:t>
       </w:r>
-      <w:ins w:id="10357" w:author="Revision merge (HM+PL)" w:date="2026-09-07T13:07:41Z">
+      <w:ins w:id="10357" w:author="Revision merge (HM+PL)" w:date="2026-09-07T16:18:28Z">
         <w:r>
           <w:t xml:space="preserve">criteria </w:t>
         </w:r>
@@ -2523,12 +2523,12 @@
       <w:r>
         <w:t xml:space="preserve">— </w:t>
       </w:r>
-      <w:del w:id="10358" w:author="Revision merge (HM+PL)" w:date="2026-09-07T13:07:41Z">
+      <w:del w:id="10358" w:author="Revision merge (HM+PL)" w:date="2026-09-07T16:18:28Z">
         <w:r>
           <w:delText xml:space="preserve">is</w:delText>
         </w:r>
       </w:del>
-      <w:ins w:id="10359" w:author="Revision merge (HM+PL)" w:date="2026-09-07T13:07:41Z">
+      <w:ins w:id="10359" w:author="Revision merge (HM+PL)" w:date="2026-09-07T16:18:28Z">
         <w:r>
           <w:t xml:space="preserve">are</w:t>
         </w:r>
@@ -2536,12 +2536,12 @@
       <w:r>
         <w:t xml:space="preserve"> </w:t>
       </w:r>
-      <w:del w:id="10360" w:author="Revision merge (HM+PL)" w:date="2026-09-07T13:07:41Z">
+      <w:del w:id="10360" w:author="Revision merge (HM+PL)" w:date="2026-09-07T16:18:28Z">
         <w:r>
           <w:delText xml:space="preserve">declared</w:delText>
         </w:r>
       </w:del>
-      <w:ins w:id="10361" w:author="Revision merge (HM+PL)" w:date="2026-09-07T13:07:41Z">
+      <w:ins w:id="10361" w:author="Revision merge (HM+PL)" w:date="2026-09-07T16:18:28Z">
         <w:r>
           <w:t xml:space="preserve">defined</w:t>
         </w:r>
@@ -2549,12 +2549,12 @@
       <w:r>
         <w:t xml:space="preserve"> in `config.yaml`. </w:t>
       </w:r>
-      <w:del w:id="10362" w:author="Revision merge (HM+PL)" w:date="2026-09-07T13:07:41Z">
+      <w:del w:id="10362" w:author="Revision merge (HM+PL)" w:date="2026-09-07T16:18:28Z">
         <w:r>
           <w:delText xml:space="preserve">Module</w:delText>
         </w:r>
       </w:del>
-      <w:ins w:id="10363" w:author="Revision merge (HM+PL)" w:date="2026-09-07T13:07:41Z">
+      <w:ins w:id="10363" w:author="Revision merge (HM+PL)" w:date="2026-09-07T16:18:28Z">
         <w:r>
           <w:t xml:space="preserve">Consequently, module</w:t>
         </w:r>
@@ -2562,12 +2562,12 @@
       <w:r>
         <w:t xml:space="preserve"> code </w:t>
       </w:r>
-      <w:del w:id="10364" w:author="Revision merge (HM+PL)" w:date="2026-09-07T13:07:41Z">
+      <w:del w:id="10364" w:author="Revision merge (HM+PL)" w:date="2026-09-07T16:18:28Z">
         <w:r>
           <w:delText xml:space="preserve">is</w:delText>
         </w:r>
       </w:del>
-      <w:ins w:id="10365" w:author="Revision merge (HM+PL)" w:date="2026-09-07T13:07:41Z">
+      <w:ins w:id="10365" w:author="Revision merge (HM+PL)" w:date="2026-09-07T16:18:28Z">
         <w:r>
           <w:t xml:space="preserve">remains</w:t>
         </w:r>
@@ -2575,12 +2575,12 @@
       <w:r>
         <w:t xml:space="preserve"> </w:t>
       </w:r>
-      <w:del w:id="10366" w:author="Revision merge (HM+PL)" w:date="2026-09-07T13:07:41Z">
+      <w:del w:id="10366" w:author="Revision merge (HM+PL)" w:date="2026-09-07T16:18:28Z">
         <w:r>
           <w:delText xml:space="preserve">not</w:delText>
         </w:r>
       </w:del>
-      <w:ins w:id="10367" w:author="Revision merge (HM+PL)" w:date="2026-09-07T13:07:41Z">
+      <w:ins w:id="10367" w:author="Revision merge (HM+PL)" w:date="2026-09-07T16:18:28Z">
         <w:r>
           <w:t xml:space="preserve">invariant</w:t>
         </w:r>
@@ -2588,12 +2588,12 @@
       <w:r>
         <w:t xml:space="preserve"> </w:t>
       </w:r>
-      <w:del w:id="10368" w:author="Revision merge (HM+PL)" w:date="2026-09-07T13:07:41Z">
+      <w:del w:id="10368" w:author="Revision merge (HM+PL)" w:date="2026-09-07T16:18:28Z">
         <w:r>
           <w:delText xml:space="preserve">edited</w:delText>
         </w:r>
       </w:del>
-      <w:ins w:id="10369" w:author="Revision merge (HM+PL)" w:date="2026-09-07T13:07:41Z">
+      <w:ins w:id="10369" w:author="Revision merge (HM+PL)" w:date="2026-09-07T16:18:28Z">
         <w:r>
           <w:t xml:space="preserve">across</w:t>
         </w:r>
@@ -2601,12 +2601,12 @@
       <w:r>
         <w:t xml:space="preserve"> </w:t>
       </w:r>
-      <w:del w:id="10370" w:author="Revision merge (HM+PL)" w:date="2026-09-07T13:07:41Z">
+      <w:del w:id="10370" w:author="Revision merge (HM+PL)" w:date="2026-09-07T16:18:28Z">
         <w:r>
           <w:delText xml:space="preserve">per-project;</w:delText>
         </w:r>
       </w:del>
-      <w:ins w:id="10371" w:author="Revision merge (HM+PL)" w:date="2026-09-07T13:07:41Z">
+      <w:ins w:id="10371" w:author="Revision merge (HM+PL)" w:date="2026-09-07T16:18:28Z">
         <w:r>
           <w:t xml:space="preserve">projects, with</w:t>
         </w:r>
@@ -2614,12 +2614,12 @@
       <w:r>
         <w:t xml:space="preserve"> dataset-specific </w:t>
       </w:r>
-      <w:del w:id="10372" w:author="Revision merge (HM+PL)" w:date="2026-09-07T13:07:41Z">
+      <w:del w:id="10372" w:author="Revision merge (HM+PL)" w:date="2026-09-07T16:18:28Z">
         <w:r>
           <w:delText xml:space="preserve">adjustments</w:delText>
         </w:r>
       </w:del>
-      <w:ins w:id="10373" w:author="Revision merge (HM+PL)" w:date="2026-09-07T13:07:41Z">
+      <w:ins w:id="10373" w:author="Revision merge (HM+PL)" w:date="2026-09-07T16:18:28Z">
         <w:r>
           <w:t xml:space="preserve">customisation</w:t>
         </w:r>
@@ -2627,12 +2627,12 @@
       <w:r>
         <w:t xml:space="preserve"> </w:t>
       </w:r>
-      <w:del w:id="10374" w:author="Revision merge (HM+PL)" w:date="2026-09-07T13:07:41Z">
+      <w:del w:id="10374" w:author="Revision merge (HM+PL)" w:date="2026-09-07T16:18:28Z">
         <w:r>
           <w:delText xml:space="preserve">live</w:delText>
         </w:r>
       </w:del>
-      <w:ins w:id="10375" w:author="Revision merge (HM+PL)" w:date="2026-09-07T13:07:41Z">
+      <w:ins w:id="10375" w:author="Revision merge (HM+PL)" w:date="2026-09-07T16:18:28Z">
         <w:r>
           <w:t xml:space="preserve">implemented</w:t>
         </w:r>
@@ -2640,12 +2640,12 @@
       <w:r>
         <w:t xml:space="preserve"> </w:t>
       </w:r>
-      <w:del w:id="10376" w:author="Revision merge (HM+PL)" w:date="2026-09-07T13:07:41Z">
+      <w:del w:id="10376" w:author="Revision merge (HM+PL)" w:date="2026-09-07T16:18:28Z">
         <w:r>
           <w:delText xml:space="preserve">in</w:delText>
         </w:r>
       </w:del>
-      <w:ins w:id="10377" w:author="Revision merge (HM+PL)" w:date="2026-09-07T13:07:41Z">
+      <w:ins w:id="10377" w:author="Revision merge (HM+PL)" w:date="2026-09-07T16:18:28Z">
         <w:r>
           <w:t xml:space="preserve">exclusively through</w:t>
         </w:r>
@@ -2653,7 +2653,7 @@
       <w:r>
         <w:t xml:space="preserve"> `config.yaml` </w:t>
       </w:r>
-      <w:ins w:id="10378" w:author="Revision merge (HM+PL)" w:date="2026-09-07T13:07:41Z">
+      <w:ins w:id="10378" w:author="Revision merge (HM+PL)" w:date="2026-09-07T16:18:28Z">
         <w:r>
           <w:t xml:space="preserve">settings </w:t>
         </w:r>
@@ -2661,7 +2661,7 @@
       <w:r>
         <w:t xml:space="preserve">or</w:t>
       </w:r>
-      <w:del w:id="10379" w:author="Revision merge (HM+PL)" w:date="2026-09-07T13:07:41Z">
+      <w:del w:id="10379" w:author="Revision merge (HM+PL)" w:date="2026-09-07T16:18:28Z">
         <w:r>
           <w:delText xml:space="preserve"> in</w:delText>
         </w:r>
@@ -2669,12 +2669,12 @@
       <w:r>
         <w:t xml:space="preserve"> the structured fix tables it references. R/00 (setup) and R/01 (input loading) </w:t>
       </w:r>
-      <w:del w:id="10380" w:author="Revision merge (HM+PL)" w:date="2026-09-07T13:07:41Z">
+      <w:del w:id="10380" w:author="Revision merge (HM+PL)" w:date="2026-09-07T16:18:28Z">
         <w:r>
           <w:delText xml:space="preserve">run</w:delText>
         </w:r>
       </w:del>
-      <w:ins w:id="10381" w:author="Revision merge (HM+PL)" w:date="2026-09-07T13:07:41Z">
+      <w:ins w:id="10381" w:author="Revision merge (HM+PL)" w:date="2026-09-07T16:18:28Z">
         <w:r>
           <w:t xml:space="preserve">are executed</w:t>
         </w:r>
@@ -2682,12 +2682,12 @@
       <w:r>
         <w:t xml:space="preserve"> by </w:t>
       </w:r>
-      <w:del w:id="10382" w:author="Revision merge (HM+PL)" w:date="2026-09-07T13:07:41Z">
+      <w:del w:id="10382" w:author="Revision merge (HM+PL)" w:date="2026-09-07T16:18:28Z">
         <w:r>
           <w:delText xml:space="preserve">default;</w:delText>
         </w:r>
       </w:del>
-      <w:ins w:id="10383" w:author="Revision merge (HM+PL)" w:date="2026-09-07T13:07:41Z">
+      <w:ins w:id="10383" w:author="Revision merge (HM+PL)" w:date="2026-09-07T16:18:28Z">
         <w:r>
           <w:t xml:space="preserve">default,</w:t>
         </w:r>
@@ -2695,12 +2695,12 @@
       <w:r>
         <w:t xml:space="preserve"> </w:t>
       </w:r>
-      <w:del w:id="10384" w:author="Revision merge (HM+PL)" w:date="2026-09-07T13:07:41Z">
+      <w:del w:id="10384" w:author="Revision merge (HM+PL)" w:date="2026-09-07T16:18:28Z">
         <w:r>
           <w:delText xml:space="preserve">every</w:delText>
         </w:r>
       </w:del>
-      <w:ins w:id="10385" w:author="Revision merge (HM+PL)" w:date="2026-09-07T13:07:41Z">
+      <w:ins w:id="10385" w:author="Revision merge (HM+PL)" w:date="2026-09-07T16:18:28Z">
         <w:r>
           <w:t xml:space="preserve">whereas</w:t>
         </w:r>
@@ -2708,12 +2708,12 @@
       <w:r>
         <w:t xml:space="preserve"> </w:t>
       </w:r>
-      <w:del w:id="10386" w:author="Revision merge (HM+PL)" w:date="2026-09-07T13:07:41Z">
+      <w:del w:id="10386" w:author="Revision merge (HM+PL)" w:date="2026-09-07T16:18:28Z">
         <w:r>
           <w:delText xml:space="preserve">subsequent</w:delText>
         </w:r>
       </w:del>
-      <w:ins w:id="10387" w:author="Revision merge (HM+PL)" w:date="2026-09-07T13:07:41Z">
+      <w:ins w:id="10387" w:author="Revision merge (HM+PL)" w:date="2026-09-07T16:18:28Z">
         <w:r>
           <w:t xml:space="preserve">all</w:t>
         </w:r>
@@ -2721,12 +2721,12 @@
       <w:r>
         <w:t xml:space="preserve"> </w:t>
       </w:r>
-      <w:del w:id="10388" w:author="Revision merge (HM+PL)" w:date="2026-09-07T13:07:41Z">
+      <w:del w:id="10388" w:author="Revision merge (HM+PL)" w:date="2026-09-07T16:18:28Z">
         <w:r>
           <w:delText xml:space="preserve">stage</w:delText>
         </w:r>
       </w:del>
-      <w:ins w:id="10389" w:author="Revision merge (HM+PL)" w:date="2026-09-07T13:07:41Z">
+      <w:ins w:id="10389" w:author="Revision merge (HM+PL)" w:date="2026-09-07T16:18:28Z">
         <w:r>
           <w:t xml:space="preserve">downstream modules</w:t>
         </w:r>
@@ -2734,12 +2734,12 @@
       <w:r>
         <w:t xml:space="preserve"> can be </w:t>
       </w:r>
-      <w:del w:id="10390" w:author="Revision merge (HM+PL)" w:date="2026-09-07T13:07:41Z">
+      <w:del w:id="10390" w:author="Revision merge (HM+PL)" w:date="2026-09-07T16:18:28Z">
         <w:r>
           <w:delText xml:space="preserve">toggled</w:delText>
         </w:r>
       </w:del>
-      <w:ins w:id="10391" w:author="Revision merge (HM+PL)" w:date="2026-09-07T13:07:41Z">
+      <w:ins w:id="10391" w:author="Revision merge (HM+PL)" w:date="2026-09-07T16:18:28Z">
         <w:r>
           <w:t xml:space="preserve">selectively enabled or disabled</w:t>
         </w:r>
@@ -2747,12 +2747,12 @@
       <w:r>
         <w:t xml:space="preserve"> via `cfg$stages$*` </w:t>
       </w:r>
-      <w:del w:id="10392" w:author="Revision merge (HM+PL)" w:date="2026-09-07T13:07:41Z">
+      <w:del w:id="10392" w:author="Revision merge (HM+PL)" w:date="2026-09-07T16:18:28Z">
         <w:r>
           <w:delText xml:space="preserve">flags,</w:delText>
         </w:r>
       </w:del>
-      <w:ins w:id="10393" w:author="Revision merge (HM+PL)" w:date="2026-09-07T13:07:41Z">
+      <w:ins w:id="10393" w:author="Revision merge (HM+PL)" w:date="2026-09-07T16:18:28Z">
         <w:r>
           <w:t xml:space="preserve">flags;</w:t>
         </w:r>
@@ -2760,12 +2760,12 @@
       <w:r>
         <w:t xml:space="preserve"> </w:t>
       </w:r>
-      <w:del w:id="10394" w:author="Revision merge (HM+PL)" w:date="2026-09-07T13:07:41Z">
+      <w:del w:id="10394" w:author="Revision merge (HM+PL)" w:date="2026-09-07T16:18:28Z">
         <w:r>
           <w:delText xml:space="preserve">e.g,</w:delText>
         </w:r>
       </w:del>
-      <w:ins w:id="10395" w:author="Revision merge (HM+PL)" w:date="2026-09-07T13:07:41Z">
+      <w:ins w:id="10395" w:author="Revision merge (HM+PL)" w:date="2026-09-07T16:18:28Z">
         <w:r>
           <w:t xml:space="preserve">for example,</w:t>
         </w:r>
@@ -2773,12 +2773,12 @@
       <w:r>
         <w:t xml:space="preserve"> users can re-run only the resistome modules after revising thresholds. TPM normalisation (R/03) and all gene-element stages (R/09–R/11) </w:t>
       </w:r>
-      <w:del w:id="10396" w:author="Revision merge (HM+PL)" w:date="2026-09-07T13:07:41Z">
+      <w:del w:id="10396" w:author="Revision merge (HM+PL)" w:date="2026-09-07T16:18:28Z">
         <w:r>
           <w:delText xml:space="preserve">require</w:delText>
         </w:r>
       </w:del>
-      <w:ins w:id="10397" w:author="Revision merge (HM+PL)" w:date="2026-09-07T13:07:41Z">
+      <w:ins w:id="10397" w:author="Revision merge (HM+PL)" w:date="2026-09-07T16:18:28Z">
         <w:r>
           <w:t xml:space="preserve">are contingent upon</w:t>
         </w:r>
@@ -2786,12 +2786,12 @@
       <w:r>
         <w:t xml:space="preserve"> ABRicate outputs and are </w:t>
       </w:r>
-      <w:del w:id="10398" w:author="Revision merge (HM+PL)" w:date="2026-09-07T13:07:41Z">
+      <w:del w:id="10398" w:author="Revision merge (HM+PL)" w:date="2026-09-07T16:18:28Z">
         <w:r>
           <w:delText xml:space="preserve">skipped</w:delText>
         </w:r>
       </w:del>
-      <w:ins w:id="10399" w:author="Revision merge (HM+PL)" w:date="2026-09-07T13:07:41Z">
+      <w:ins w:id="10399" w:author="Revision merge (HM+PL)" w:date="2026-09-07T16:18:28Z">
         <w:r>
           <w:t xml:space="preserve">automatically</w:t>
         </w:r>
@@ -2799,12 +2799,12 @@
       <w:r>
         <w:t xml:space="preserve"> </w:t>
       </w:r>
-      <w:del w:id="10400" w:author="Revision merge (HM+PL)" w:date="2026-09-07T13:07:41Z">
+      <w:del w:id="10400" w:author="Revision merge (HM+PL)" w:date="2026-09-07T16:18:28Z">
         <w:r>
           <w:delText xml:space="preserve">otherwise.</w:delText>
         </w:r>
       </w:del>
-      <w:ins w:id="10401" w:author="Revision merge (HM+PL)" w:date="2026-09-07T13:07:41Z">
+      <w:ins w:id="10401" w:author="Revision merge (HM+PL)" w:date="2026-09-07T16:18:28Z">
         <w:r>
           <w:t xml:space="preserve">omitted</w:t>
         </w:r>
@@ -2812,12 +2812,12 @@
       <w:r>
         <w:t xml:space="preserve"> </w:t>
       </w:r>
-      <w:del w:id="10402" w:author="Revision merge (HM+PL)" w:date="2026-09-07T13:07:41Z">
+      <w:del w:id="10402" w:author="Revision merge (HM+PL)" w:date="2026-09-07T16:18:28Z">
         <w:r>
           <w:delText xml:space="preserve">Per-study</w:delText>
         </w:r>
       </w:del>
-      <w:ins w:id="10403" w:author="Revision merge (HM+PL)" w:date="2026-09-07T13:07:41Z">
+      <w:ins w:id="10403" w:author="Revision merge (HM+PL)" w:date="2026-09-07T16:18:28Z">
         <w:r>
           <w:t xml:space="preserve">when such inputs are absent. Study-specific corrections to</w:t>
         </w:r>
@@ -2825,12 +2825,12 @@
       <w:r>
         <w:t xml:space="preserve"> NCBI taxonomy </w:t>
       </w:r>
-      <w:del w:id="10404" w:author="Revision merge (HM+PL)" w:date="2026-09-07T13:07:41Z">
+      <w:del w:id="10404" w:author="Revision merge (HM+PL)" w:date="2026-09-07T16:18:28Z">
         <w:r>
           <w:delText xml:space="preserve">fixes,</w:delText>
         </w:r>
       </w:del>
-      <w:ins w:id="10405" w:author="Revision merge (HM+PL)" w:date="2026-09-07T13:07:41Z">
+      <w:ins w:id="10405" w:author="Revision merge (HM+PL)" w:date="2026-09-07T16:18:28Z">
         <w:r>
           <w:t xml:space="preserve">assignments,</w:t>
         </w:r>
@@ -2838,12 +2838,12 @@
       <w:r>
         <w:t xml:space="preserve"> </w:t>
       </w:r>
-      <w:del w:id="10406" w:author="Revision merge (HM+PL)" w:date="2026-09-07T13:07:41Z">
+      <w:del w:id="10406" w:author="Revision merge (HM+PL)" w:date="2026-09-07T16:18:28Z">
         <w:r>
           <w:delText xml:space="preserve">when</w:delText>
         </w:r>
       </w:del>
-      <w:ins w:id="10407" w:author="Revision merge (HM+PL)" w:date="2026-09-07T13:07:41Z">
+      <w:ins w:id="10407" w:author="Revision merge (HM+PL)" w:date="2026-09-07T16:18:28Z">
         <w:r>
           <w:t xml:space="preserve">where</w:t>
         </w:r>
@@ -2851,12 +2851,12 @@
       <w:r>
         <w:t xml:space="preserve"> </w:t>
       </w:r>
-      <w:del w:id="10408" w:author="Revision merge (HM+PL)" w:date="2026-09-07T13:07:41Z">
+      <w:del w:id="10408" w:author="Revision merge (HM+PL)" w:date="2026-09-07T16:18:28Z">
         <w:r>
           <w:delText xml:space="preserve">needed,</w:delText>
         </w:r>
       </w:del>
-      <w:ins w:id="10409" w:author="Revision merge (HM+PL)" w:date="2026-09-07T13:07:41Z">
+      <w:ins w:id="10409" w:author="Revision merge (HM+PL)" w:date="2026-09-07T16:18:28Z">
         <w:r>
           <w:t xml:space="preserve">required,</w:t>
         </w:r>
@@ -2864,12 +2864,12 @@
       <w:r>
         <w:t xml:space="preserve"> are </w:t>
       </w:r>
-      <w:del w:id="10410" w:author="Revision merge (HM+PL)" w:date="2026-09-07T13:07:41Z">
+      <w:del w:id="10410" w:author="Revision merge (HM+PL)" w:date="2026-09-07T16:18:28Z">
         <w:r>
           <w:delText xml:space="preserve">declared</w:delText>
         </w:r>
       </w:del>
-      <w:ins w:id="10411" w:author="Revision merge (HM+PL)" w:date="2026-09-07T13:07:41Z">
+      <w:ins w:id="10411" w:author="Revision merge (HM+PL)" w:date="2026-09-07T16:18:28Z">
         <w:r>
           <w:t xml:space="preserve">encoded</w:t>
         </w:r>
@@ -2877,7 +2877,7 @@
       <w:r>
         <w:t xml:space="preserve"> in a structured `taxid_fixes.csv` </w:t>
       </w:r>
-      <w:ins w:id="10412" w:author="Revision merge (HM+PL)" w:date="2026-09-07T13:07:41Z">
+      <w:ins w:id="10412" w:author="Revision merge (HM+PL)" w:date="2026-09-07T16:18:28Z">
         <w:r>
           <w:t xml:space="preserve">table </w:t>
         </w:r>
@@ -2885,7 +2885,7 @@
       <w:r>
         <w:t xml:space="preserve">rather than</w:t>
       </w:r>
-      <w:ins w:id="10413" w:author="Revision merge (HM+PL)" w:date="2026-09-07T13:07:41Z">
+      <w:ins w:id="10413" w:author="Revision merge (HM+PL)" w:date="2026-09-07T16:18:28Z">
         <w:r>
           <w:t xml:space="preserve"> implemented</w:t>
         </w:r>
@@ -2893,12 +2893,12 @@
       <w:r>
         <w:t xml:space="preserve"> as row-index edits. </w:t>
       </w:r>
-      <w:del w:id="10414" w:author="Revision merge (HM+PL)" w:date="2026-09-07T13:07:41Z">
+      <w:del w:id="10414" w:author="Revision merge (HM+PL)" w:date="2026-09-07T16:18:28Z">
         <w:r>
           <w:delText xml:space="preserve">A</w:delText>
         </w:r>
       </w:del>
-      <w:ins w:id="10415" w:author="Revision merge (HM+PL)" w:date="2026-09-07T13:07:41Z">
+      <w:ins w:id="10415" w:author="Revision merge (HM+PL)" w:date="2026-09-07T16:18:28Z">
         <w:r>
           <w:t xml:space="preserve">Multiple-testing</w:t>
         </w:r>
@@ -2906,12 +2906,12 @@
       <w:r>
         <w:t xml:space="preserve"> </w:t>
       </w:r>
-      <w:del w:id="10416" w:author="Revision merge (HM+PL)" w:date="2026-09-07T13:07:41Z">
+      <w:del w:id="10416" w:author="Revision merge (HM+PL)" w:date="2026-09-07T16:18:28Z">
         <w:r>
           <w:delText xml:space="preserve">single</w:delText>
         </w:r>
       </w:del>
-      <w:ins w:id="10417" w:author="Revision merge (HM+PL)" w:date="2026-09-07T13:07:41Z">
+      <w:ins w:id="10417" w:author="Revision merge (HM+PL)" w:date="2026-09-07T16:18:28Z">
         <w:r>
           <w:t xml:space="preserve">correction is controlled through the</w:t>
         </w:r>
@@ -2919,12 +2919,12 @@
       <w:r>
         <w:t xml:space="preserve"> `cfg$stats$padjust_method` </w:t>
       </w:r>
-      <w:del w:id="10418" w:author="Revision merge (HM+PL)" w:date="2026-09-07T13:07:41Z">
+      <w:del w:id="10418" w:author="Revision merge (HM+PL)" w:date="2026-09-07T16:18:28Z">
         <w:r>
           <w:delText xml:space="preserve">knob</w:delText>
         </w:r>
       </w:del>
-      <w:ins w:id="10419" w:author="Revision merge (HM+PL)" w:date="2026-09-07T13:07:41Z">
+      <w:ins w:id="10419" w:author="Revision merge (HM+PL)" w:date="2026-09-07T16:18:28Z">
         <w:r>
           <w:t xml:space="preserve">parameter,</w:t>
         </w:r>
@@ -2932,12 +2932,12 @@
       <w:r>
         <w:t xml:space="preserve"> </w:t>
       </w:r>
-      <w:del w:id="10420" w:author="Revision merge (HM+PL)" w:date="2026-09-07T13:07:41Z">
+      <w:del w:id="10420" w:author="Revision merge (HM+PL)" w:date="2026-09-07T16:18:28Z">
         <w:r>
           <w:delText xml:space="preserve">(Benjamini-Hochberg</w:delText>
         </w:r>
       </w:del>
-      <w:ins w:id="10421" w:author="Revision merge (HM+PL)" w:date="2026-09-07T13:07:41Z">
+      <w:ins w:id="10421" w:author="Revision merge (HM+PL)" w:date="2026-09-07T16:18:28Z">
         <w:r>
           <w:t xml:space="preserve">ensuring consistent application of the selected adjustment throughout the pipeline. The Benjamini-Hochberg false discovery rate</w:t>
         </w:r>
@@ -2945,12 +2945,12 @@
       <w:r>
         <w:t xml:space="preserve"> is used by </w:t>
       </w:r>
-      <w:del w:id="10422" w:author="Revision merge (HM+PL)" w:date="2026-09-07T13:07:41Z">
+      <w:del w:id="10422" w:author="Revision merge (HM+PL)" w:date="2026-09-07T16:18:28Z">
         <w:r>
           <w:delText xml:space="preserve">default;</w:delText>
         </w:r>
       </w:del>
-      <w:ins w:id="10423" w:author="Revision merge (HM+PL)" w:date="2026-09-07T13:07:41Z">
+      <w:ins w:id="10423" w:author="Revision merge (HM+PL)" w:date="2026-09-07T16:18:28Z">
         <w:r>
           <w:t xml:space="preserve">default,</w:t>
         </w:r>
@@ -2958,12 +2958,12 @@
       <w:r>
         <w:t xml:space="preserve"> </w:t>
       </w:r>
-      <w:del w:id="10424" w:author="Revision merge (HM+PL)" w:date="2026-09-07T13:07:41Z">
+      <w:del w:id="10424" w:author="Revision merge (HM+PL)" w:date="2026-09-07T16:18:28Z">
         <w:r>
           <w:delText xml:space="preserve">full</w:delText>
         </w:r>
       </w:del>
-      <w:ins w:id="10425" w:author="Revision merge (HM+PL)" w:date="2026-09-07T13:07:41Z">
+      <w:ins w:id="10425" w:author="Revision merge (HM+PL)" w:date="2026-09-07T16:18:28Z">
         <w:r>
           <w:t xml:space="preserve">although</w:t>
         </w:r>
@@ -2971,12 +2971,12 @@
       <w:r>
         <w:t xml:space="preserve"> </w:t>
       </w:r>
-      <w:del w:id="10426" w:author="Revision merge (HM+PL)" w:date="2026-09-07T13:07:41Z">
+      <w:del w:id="10426" w:author="Revision merge (HM+PL)" w:date="2026-09-07T16:18:28Z">
         <w:r>
           <w:delText xml:space="preserve">list</w:delText>
         </w:r>
       </w:del>
-      <w:ins w:id="10427" w:author="Revision merge (HM+PL)" w:date="2026-09-07T13:07:41Z">
+      <w:ins w:id="10427" w:author="Revision merge (HM+PL)" w:date="2026-09-07T16:18:28Z">
         <w:r>
           <w:t xml:space="preserve">alternative correction methods are supported and documented</w:t>
         </w:r>
@@ -2984,12 +2984,12 @@
       <w:r>
         <w:t xml:space="preserve"> in </w:t>
       </w:r>
-      <w:del w:id="10428" w:author="Revision merge (HM+PL)" w:date="2026-09-07T13:07:41Z">
+      <w:del w:id="10428" w:author="Revision merge (HM+PL)" w:date="2026-09-07T16:18:28Z">
         <w:r>
           <w:delText xml:space="preserve">`docs/STATISTICS.md`) routes every multiple-testing correction across the pipeline.</w:delText>
         </w:r>
       </w:del>
-      <w:ins w:id="10429" w:author="Revision merge (HM+PL)" w:date="2026-09-07T13:07:41Z">
+      <w:ins w:id="10429" w:author="Revision merge (HM+PL)" w:date="2026-09-07T16:18:28Z">
         <w:r>
           <w:t xml:space="preserve">`docs/STATISTICS.md`.</w:t>
         </w:r>
@@ -3002,12 +3002,12 @@
       <w:r>
         <w:t xml:space="preserve">**Stages.** The pipeline </w:t>
       </w:r>
-      <w:del w:id="10430" w:author="Revision merge (HM+PL)" w:date="2026-09-07T13:07:41Z">
+      <w:del w:id="10430" w:author="Revision merge (HM+PL)" w:date="2026-09-07T16:18:28Z">
         <w:r>
           <w:delText xml:space="preserve">organises</w:delText>
         </w:r>
       </w:del>
-      <w:ins w:id="10431" w:author="Revision merge (HM+PL)" w:date="2026-09-07T13:07:41Z">
+      <w:ins w:id="10431" w:author="Revision merge (HM+PL)" w:date="2026-09-07T16:18:28Z">
         <w:r>
           <w:t xml:space="preserve">is</w:t>
         </w:r>
@@ -3015,12 +3015,12 @@
       <w:r>
         <w:t xml:space="preserve"> </w:t>
       </w:r>
-      <w:del w:id="10432" w:author="Revision merge (HM+PL)" w:date="2026-09-07T13:07:41Z">
+      <w:del w:id="10432" w:author="Revision merge (HM+PL)" w:date="2026-09-07T16:18:28Z">
         <w:r>
           <w:delText xml:space="preserve">its work</w:delText>
         </w:r>
       </w:del>
-      <w:ins w:id="10433" w:author="Revision merge (HM+PL)" w:date="2026-09-07T13:07:41Z">
+      <w:ins w:id="10433" w:author="Revision merge (HM+PL)" w:date="2026-09-07T16:18:28Z">
         <w:r>
           <w:t xml:space="preserve">organised</w:t>
         </w:r>
@@ -3028,12 +3028,12 @@
       <w:r>
         <w:t xml:space="preserve"> into five conceptual </w:t>
       </w:r>
-      <w:del w:id="10434" w:author="Revision merge (HM+PL)" w:date="2026-09-07T13:07:41Z">
+      <w:del w:id="10434" w:author="Revision merge (HM+PL)" w:date="2026-09-07T16:18:28Z">
         <w:r>
           <w:delText xml:space="preserve">blocks.</w:delText>
         </w:r>
       </w:del>
-      <w:ins w:id="10435" w:author="Revision merge (HM+PL)" w:date="2026-09-07T13:07:41Z">
+      <w:ins w:id="10435" w:author="Revision merge (HM+PL)" w:date="2026-09-07T16:18:28Z">
         <w:r>
           <w:t xml:space="preserve">stages.</w:t>
         </w:r>
@@ -3046,12 +3046,12 @@
       <w:r>
         <w:t xml:space="preserve">(1) </w:t>
       </w:r>
-      <w:del w:id="10436" w:author="Revision merge (HM+PL)" w:date="2026-09-07T13:07:41Z">
+      <w:del w:id="10436" w:author="Revision merge (HM+PL)" w:date="2026-09-07T16:18:28Z">
         <w:r>
           <w:delText xml:space="preserve">*Ingest</w:delText>
         </w:r>
       </w:del>
-      <w:ins w:id="10437" w:author="Revision merge (HM+PL)" w:date="2026-09-07T13:07:41Z">
+      <w:ins w:id="10437" w:author="Revision merge (HM+PL)" w:date="2026-09-07T16:18:28Z">
         <w:r>
           <w:t xml:space="preserve">*Data input</w:t>
         </w:r>
@@ -3059,12 +3059,12 @@
       <w:r>
         <w:t xml:space="preserve"> and </w:t>
       </w:r>
-      <w:del w:id="10438" w:author="Revision merge (HM+PL)" w:date="2026-09-07T13:07:41Z">
+      <w:del w:id="10438" w:author="Revision merge (HM+PL)" w:date="2026-09-07T16:18:28Z">
         <w:r>
           <w:delText xml:space="preserve">cleaning*</w:delText>
         </w:r>
       </w:del>
-      <w:ins w:id="10439" w:author="Revision merge (HM+PL)" w:date="2026-09-07T13:07:41Z">
+      <w:ins w:id="10439" w:author="Revision merge (HM+PL)" w:date="2026-09-07T16:18:28Z">
         <w:r>
           <w:t xml:space="preserve">decontamination*</w:t>
         </w:r>
@@ -3072,12 +3072,12 @@
       <w:r>
         <w:t xml:space="preserve"> </w:t>
       </w:r>
-      <w:del w:id="10440" w:author="Revision merge (HM+PL)" w:date="2026-09-07T13:07:41Z">
+      <w:del w:id="10440" w:author="Revision merge (HM+PL)" w:date="2026-09-07T16:18:28Z">
         <w:r>
           <w:delText xml:space="preserve">(R/00–R/02)</w:delText>
         </w:r>
       </w:del>
-      <w:ins w:id="10441" w:author="Revision merge (HM+PL)" w:date="2026-09-07T13:07:41Z">
+      <w:ins w:id="10441" w:author="Revision merge (HM+PL)" w:date="2026-09-07T16:18:28Z">
         <w:r>
           <w:t xml:space="preserve">(R/00–R/02).</w:t>
         </w:r>
@@ -3085,12 +3085,12 @@
       <w:r>
         <w:t xml:space="preserve"> </w:t>
       </w:r>
-      <w:del w:id="10442" w:author="Revision merge (HM+PL)" w:date="2026-09-07T13:07:41Z">
+      <w:del w:id="10442" w:author="Revision merge (HM+PL)" w:date="2026-09-07T16:18:28Z">
         <w:r>
           <w:delText xml:space="preserve">load</w:delText>
         </w:r>
       </w:del>
-      <w:ins w:id="10443" w:author="Revision merge (HM+PL)" w:date="2026-09-07T13:07:41Z">
+      <w:ins w:id="10443" w:author="Revision merge (HM+PL)" w:date="2026-09-07T16:18:28Z">
         <w:r>
           <w:t xml:space="preserve">The pipeline imports</w:t>
         </w:r>
@@ -3098,12 +3098,12 @@
       <w:r>
         <w:t xml:space="preserve"> upstream </w:t>
       </w:r>
-      <w:del w:id="10444" w:author="Revision merge (HM+PL)" w:date="2026-09-07T13:07:41Z">
+      <w:del w:id="10444" w:author="Revision merge (HM+PL)" w:date="2026-09-07T16:18:28Z">
         <w:r>
           <w:delText xml:space="preserve">tables</w:delText>
         </w:r>
       </w:del>
-      <w:ins w:id="10445" w:author="Revision merge (HM+PL)" w:date="2026-09-07T13:07:41Z">
+      <w:ins w:id="10445" w:author="Revision merge (HM+PL)" w:date="2026-09-07T16:18:28Z">
         <w:r>
           <w:t xml:space="preserve">outputs</w:t>
         </w:r>
@@ -3111,12 +3111,12 @@
       <w:r>
         <w:t xml:space="preserve"> — Kraken2/Bracken, ABRicate, Re-centrifuge contamination </w:t>
       </w:r>
-      <w:del w:id="10446" w:author="Revision merge (HM+PL)" w:date="2026-09-07T13:07:41Z">
+      <w:del w:id="10446" w:author="Revision merge (HM+PL)" w:date="2026-09-07T16:18:28Z">
         <w:r>
           <w:delText xml:space="preserve">tags,</w:delText>
         </w:r>
       </w:del>
-      <w:ins w:id="10447" w:author="Revision merge (HM+PL)" w:date="2026-09-07T13:07:41Z">
+      <w:ins w:id="10447" w:author="Revision merge (HM+PL)" w:date="2026-09-07T16:18:28Z">
         <w:r>
           <w:t xml:space="preserve">tags and</w:t>
         </w:r>
@@ -3124,7 +3124,7 @@
       <w:r>
         <w:t xml:space="preserve"> study metadata</w:t>
       </w:r>
-      <w:ins w:id="10448" w:author="Revision merge (HM+PL)" w:date="2026-09-07T13:07:41Z">
+      <w:ins w:id="10448" w:author="Revision merge (HM+PL)" w:date="2026-09-07T16:18:28Z">
         <w:r>
           <w:t xml:space="preserve"> tables</w:t>
         </w:r>
@@ -3132,12 +3132,12 @@
       <w:r>
         <w:t xml:space="preserve"> — accommodating per-project input shapes rather than assuming a fixed column layout, </w:t>
       </w:r>
-      <w:del w:id="10449" w:author="Revision merge (HM+PL)" w:date="2026-09-07T13:07:41Z">
+      <w:del w:id="10449" w:author="Revision merge (HM+PL)" w:date="2026-09-07T16:18:28Z">
         <w:r>
           <w:delText xml:space="preserve">apply</w:delText>
         </w:r>
       </w:del>
-      <w:ins w:id="10450" w:author="Revision merge (HM+PL)" w:date="2026-09-07T13:07:41Z">
+      <w:ins w:id="10450" w:author="Revision merge (HM+PL)" w:date="2026-09-07T16:18:28Z">
         <w:r>
           <w:t xml:space="preserve">applies</w:t>
         </w:r>
@@ -3145,12 +3145,12 @@
       <w:r>
         <w:t xml:space="preserve"> optional negative-control subtraction, </w:t>
       </w:r>
-      <w:del w:id="10451" w:author="Revision merge (HM+PL)" w:date="2026-09-07T13:07:41Z">
+      <w:del w:id="10451" w:author="Revision merge (HM+PL)" w:date="2026-09-07T16:18:28Z">
         <w:r>
           <w:delText xml:space="preserve">merge</w:delText>
         </w:r>
       </w:del>
-      <w:ins w:id="10452" w:author="Revision merge (HM+PL)" w:date="2026-09-07T13:07:41Z">
+      <w:ins w:id="10452" w:author="Revision merge (HM+PL)" w:date="2026-09-07T16:18:28Z">
         <w:r>
           <w:t xml:space="preserve">merges</w:t>
         </w:r>
@@ -3158,12 +3158,12 @@
       <w:r>
         <w:t xml:space="preserve"> Bracken counts with the metadata covariates declared in `cfg$metadata$fixed_effects` / `random_effect`, and </w:t>
       </w:r>
-      <w:del w:id="10453" w:author="Revision merge (HM+PL)" w:date="2026-09-07T13:07:41Z">
+      <w:del w:id="10453" w:author="Revision merge (HM+PL)" w:date="2026-09-07T16:18:28Z">
         <w:r>
           <w:delText xml:space="preserve">link</w:delText>
         </w:r>
       </w:del>
-      <w:ins w:id="10454" w:author="Revision merge (HM+PL)" w:date="2026-09-07T13:07:41Z">
+      <w:ins w:id="10454" w:author="Revision merge (HM+PL)" w:date="2026-09-07T16:18:28Z">
         <w:r>
           <w:t xml:space="preserve">links</w:t>
         </w:r>
@@ -3179,12 +3179,12 @@
       <w:r>
         <w:t xml:space="preserve">(2) *Gene-element normalisation* (R/03) computes per-(sample, GENE) TPM </w:t>
       </w:r>
-      <w:del w:id="10455" w:author="Revision merge (HM+PL)" w:date="2026-09-07T13:07:41Z">
+      <w:del w:id="10455" w:author="Revision merge (HM+PL)" w:date="2026-09-07T16:18:28Z">
         <w:r>
           <w:delText xml:space="preserve">from</w:delText>
         </w:r>
       </w:del>
-      <w:ins w:id="10456" w:author="Revision merge (HM+PL)" w:date="2026-09-07T13:07:41Z">
+      <w:ins w:id="10456" w:author="Revision merge (HM+PL)" w:date="2026-09-07T16:18:28Z">
         <w:r>
           <w:t xml:space="preserve">based on</w:t>
         </w:r>
@@ -3192,12 +3192,12 @@
       <w:r>
         <w:t xml:space="preserve"> ABRicate </w:t>
       </w:r>
-      <w:del w:id="10457" w:author="Revision merge (HM+PL)" w:date="2026-09-07T13:07:41Z">
+      <w:del w:id="10457" w:author="Revision merge (HM+PL)" w:date="2026-09-07T16:18:28Z">
         <w:r>
           <w:delText xml:space="preserve">hits</w:delText>
         </w:r>
       </w:del>
-      <w:ins w:id="10458" w:author="Revision merge (HM+PL)" w:date="2026-09-07T13:07:41Z">
+      <w:ins w:id="10458" w:author="Revision merge (HM+PL)" w:date="2026-09-07T16:18:28Z">
         <w:r>
           <w:t xml:space="preserve">hit counts</w:t>
         </w:r>
@@ -3205,7 +3205,7 @@
       <w:r>
         <w:t xml:space="preserve"> and</w:t>
       </w:r>
-      <w:ins w:id="10459" w:author="Revision merge (HM+PL)" w:date="2026-09-07T13:07:41Z">
+      <w:ins w:id="10459" w:author="Revision merge (HM+PL)" w:date="2026-09-07T16:18:28Z">
         <w:r>
           <w:t xml:space="preserve"> annotated</w:t>
         </w:r>
@@ -3221,7 +3221,7 @@
       <w:r>
         <w:t xml:space="preserve">(3) *Community analyses* (R/04–R/08) cover the standard taxonomic toolkit. </w:t>
       </w:r>
-      <w:ins w:id="10460" w:author="Revision merge (HM+PL)" w:date="2026-09-07T13:07:41Z">
+      <w:ins w:id="10460" w:author="Revision merge (HM+PL)" w:date="2026-09-07T16:18:28Z">
         <w:r>
           <w:t xml:space="preserve">Following standardisation and cleaning of shared taxon names, </w:t>
         </w:r>
@@ -3229,12 +3229,12 @@
       <w:r>
         <w:t xml:space="preserve">R/04–R/05 </w:t>
       </w:r>
-      <w:del w:id="10461" w:author="Revision merge (HM+PL)" w:date="2026-09-07T13:07:41Z">
+      <w:del w:id="10461" w:author="Revision merge (HM+PL)" w:date="2026-09-07T16:18:28Z">
         <w:r>
           <w:delText xml:space="preserve">produce</w:delText>
         </w:r>
       </w:del>
-      <w:ins w:id="10462" w:author="Revision merge (HM+PL)" w:date="2026-09-07T13:07:41Z">
+      <w:ins w:id="10462" w:author="Revision merge (HM+PL)" w:date="2026-09-07T16:18:28Z">
         <w:r>
           <w:t xml:space="preserve">generate</w:t>
         </w:r>
@@ -3242,12 +3242,12 @@
       <w:r>
         <w:t xml:space="preserve"> Venn </w:t>
       </w:r>
-      <w:del w:id="10463" w:author="Revision merge (HM+PL)" w:date="2026-09-07T13:07:41Z">
+      <w:del w:id="10463" w:author="Revision merge (HM+PL)" w:date="2026-09-07T16:18:28Z">
         <w:r>
           <w:delText xml:space="preserve">diagrams and</w:delText>
         </w:r>
       </w:del>
-      <w:ins w:id="10464" w:author="Revision merge (HM+PL)" w:date="2026-09-07T13:07:41Z">
+      <w:ins w:id="10464" w:author="Revision merge (HM+PL)" w:date="2026-09-07T16:18:28Z">
         <w:r>
           <w:t xml:space="preserve">diagrams,</w:t>
         </w:r>
@@ -3255,12 +3255,12 @@
       <w:r>
         <w:t xml:space="preserve"> annotated </w:t>
       </w:r>
-      <w:del w:id="10465" w:author="Revision merge (HM+PL)" w:date="2026-09-07T13:07:41Z">
+      <w:del w:id="10465" w:author="Revision merge (HM+PL)" w:date="2026-09-07T16:18:28Z">
         <w:r>
           <w:delText xml:space="preserve">heatmaps</w:delText>
         </w:r>
       </w:del>
-      <w:ins w:id="10466" w:author="Revision merge (HM+PL)" w:date="2026-09-07T13:07:41Z">
+      <w:ins w:id="10466" w:author="Revision merge (HM+PL)" w:date="2026-09-07T16:18:28Z">
         <w:r>
           <w:t xml:space="preserve">heatmaps,</w:t>
         </w:r>
@@ -3268,12 +3268,12 @@
       <w:r>
         <w:t xml:space="preserve"> </w:t>
       </w:r>
-      <w:del w:id="10467" w:author="Revision merge (HM+PL)" w:date="2026-09-07T13:07:41Z">
+      <w:del w:id="10467" w:author="Revision merge (HM+PL)" w:date="2026-09-07T16:18:28Z">
         <w:r>
           <w:delText xml:space="preserve">after a shared taxa-name cleanup, plus</w:delText>
         </w:r>
       </w:del>
-      <w:ins w:id="10468" w:author="Revision merge (HM+PL)" w:date="2026-09-07T13:07:41Z">
+      <w:ins w:id="10468" w:author="Revision merge (HM+PL)" w:date="2026-09-07T16:18:28Z">
         <w:r>
           <w:t xml:space="preserve">and</w:t>
         </w:r>
@@ -3281,12 +3281,12 @@
       <w:r>
         <w:t xml:space="preserve"> top-N stacked-bar relative-abundance plots (static PNG and interactive plotly HTML) with paired total-count and sample-prevalence panels. Alpha diversity (R/06) reports Shannon, Simpson, richness, Pielou, and Fisher metrics with Kruskal-Wallis tests and violin/bar plots, preferring a pre-computed indices CSV (e.g., Oxford Nanopore wf-metagenomics output) and falling back to the vegan R package. Beta diversity (R/07) </w:t>
       </w:r>
-      <w:del w:id="10469" w:author="Revision merge (HM+PL)" w:date="2026-09-07T13:07:41Z">
+      <w:del w:id="10469" w:author="Revision merge (HM+PL)" w:date="2026-09-07T16:18:28Z">
         <w:r>
           <w:delText xml:space="preserve">computes</w:delText>
         </w:r>
       </w:del>
-      <w:ins w:id="10470" w:author="Revision merge (HM+PL)" w:date="2026-09-07T13:07:41Z">
+      <w:ins w:id="10470" w:author="Revision merge (HM+PL)" w:date="2026-09-07T16:18:28Z">
         <w:r>
           <w:t xml:space="preserve">assesses between-sample community differences using</w:t>
         </w:r>
@@ -3294,12 +3294,12 @@
       <w:r>
         <w:t xml:space="preserve"> PCoA on Hellinger-transformed Bray-Curtis distances with PERMANOVA (`adonis2`, 9999 permutations) and PERMDISP (`betadisper`) overlaid on the ordination. </w:t>
       </w:r>
-      <w:del w:id="10471" w:author="Revision merge (HM+PL)" w:date="2026-09-07T13:07:41Z">
+      <w:del w:id="10471" w:author="Revision merge (HM+PL)" w:date="2026-09-07T16:18:28Z">
         <w:r>
           <w:delText xml:space="preserve">ALDEx2 differential</w:delText>
         </w:r>
       </w:del>
-      <w:ins w:id="10472" w:author="Revision merge (HM+PL)" w:date="2026-09-07T13:07:41Z">
+      <w:ins w:id="10472" w:author="Revision merge (HM+PL)" w:date="2026-09-07T16:18:28Z">
         <w:r>
           <w:t xml:space="preserve">Differential</w:t>
         </w:r>
@@ -3307,7 +3307,7 @@
       <w:r>
         <w:t xml:space="preserve"> abundance </w:t>
       </w:r>
-      <w:ins w:id="10473" w:author="Revision merge (HM+PL)" w:date="2026-09-07T13:07:41Z">
+      <w:ins w:id="10473" w:author="Revision merge (HM+PL)" w:date="2026-09-07T16:18:28Z">
         <w:r>
           <w:t xml:space="preserve">analysis </w:t>
         </w:r>
@@ -3315,12 +3315,12 @@
       <w:r>
         <w:t xml:space="preserve">(R/08) </w:t>
       </w:r>
-      <w:del w:id="10474" w:author="Revision merge (HM+PL)" w:date="2026-09-07T13:07:41Z">
+      <w:del w:id="10474" w:author="Revision merge (HM+PL)" w:date="2026-09-07T16:18:28Z">
         <w:r>
           <w:delText xml:space="preserve">runs</w:delText>
         </w:r>
       </w:del>
-      <w:ins w:id="10475" w:author="Revision merge (HM+PL)" w:date="2026-09-07T13:07:41Z">
+      <w:ins w:id="10475" w:author="Revision merge (HM+PL)" w:date="2026-09-07T16:18:28Z">
         <w:r>
           <w:t xml:space="preserve">is performed</w:t>
         </w:r>
@@ -3328,12 +3328,12 @@
       <w:r>
         <w:t xml:space="preserve"> at </w:t>
       </w:r>
-      <w:del w:id="10476" w:author="Revision merge (HM+PL)" w:date="2026-09-07T13:07:41Z">
+      <w:del w:id="10476" w:author="Revision merge (HM+PL)" w:date="2026-09-07T16:18:28Z">
         <w:r>
           <w:delText xml:space="preserve">two</w:delText>
         </w:r>
       </w:del>
-      <w:ins w:id="10477" w:author="Revision merge (HM+PL)" w:date="2026-09-07T13:07:41Z">
+      <w:ins w:id="10477" w:author="Revision merge (HM+PL)" w:date="2026-09-07T16:18:28Z">
         <w:r>
           <w:t xml:space="preserve">both</w:t>
         </w:r>
@@ -3341,12 +3341,12 @@
       <w:r>
         <w:t xml:space="preserve"> </w:t>
       </w:r>
-      <w:del w:id="10478" w:author="Revision merge (HM+PL)" w:date="2026-09-07T13:07:41Z">
+      <w:del w:id="10478" w:author="Revision merge (HM+PL)" w:date="2026-09-07T16:18:28Z">
         <w:r>
           <w:delText xml:space="preserve">levels</w:delText>
         </w:r>
       </w:del>
-      <w:ins w:id="10479" w:author="Revision merge (HM+PL)" w:date="2026-09-07T13:07:41Z">
+      <w:ins w:id="10479" w:author="Revision merge (HM+PL)" w:date="2026-09-07T16:18:28Z">
         <w:r>
           <w:t xml:space="preserve">the</w:t>
         </w:r>
@@ -3354,12 +3354,12 @@
       <w:r>
         <w:t xml:space="preserve"> </w:t>
       </w:r>
-      <w:del w:id="10480" w:author="Revision merge (HM+PL)" w:date="2026-09-07T13:07:41Z">
+      <w:del w:id="10480" w:author="Revision merge (HM+PL)" w:date="2026-09-07T16:18:28Z">
         <w:r>
           <w:delText xml:space="preserve">— taxa (Bracken counts)</w:delText>
         </w:r>
       </w:del>
-      <w:ins w:id="10481" w:author="Revision merge (HM+PL)" w:date="2026-09-07T13:07:41Z">
+      <w:ins w:id="10481" w:author="Revision merge (HM+PL)" w:date="2026-09-07T16:18:28Z">
         <w:r>
           <w:t xml:space="preserve">taxonomic</w:t>
         </w:r>
@@ -3367,12 +3367,12 @@
       <w:r>
         <w:t xml:space="preserve"> and </w:t>
       </w:r>
-      <w:del w:id="10482" w:author="Revision merge (HM+PL)" w:date="2026-09-07T13:07:41Z">
+      <w:del w:id="10482" w:author="Revision merge (HM+PL)" w:date="2026-09-07T16:18:28Z">
         <w:r>
           <w:delText xml:space="preserve">genes</w:delText>
         </w:r>
       </w:del>
-      <w:ins w:id="10483" w:author="Revision merge (HM+PL)" w:date="2026-09-07T13:07:41Z">
+      <w:ins w:id="10483" w:author="Revision merge (HM+PL)" w:date="2026-09-07T16:18:28Z">
         <w:r>
           <w:t xml:space="preserve">functional</w:t>
         </w:r>
@@ -3380,12 +3380,12 @@
       <w:r>
         <w:t xml:space="preserve"> </w:t>
       </w:r>
-      <w:del w:id="10484" w:author="Revision merge (HM+PL)" w:date="2026-09-07T13:07:41Z">
+      <w:del w:id="10484" w:author="Revision merge (HM+PL)" w:date="2026-09-07T16:18:28Z">
         <w:r>
           <w:delText xml:space="preserve">(ABRicate</w:delText>
         </w:r>
       </w:del>
-      <w:ins w:id="10485" w:author="Revision merge (HM+PL)" w:date="2026-09-07T13:07:41Z">
+      <w:ins w:id="10485" w:author="Revision merge (HM+PL)" w:date="2026-09-07T16:18:28Z">
         <w:r>
           <w:t xml:space="preserve">level using ALDEx2: taxonomic analysis uses Bracken counts, whereas gene-level analysis uses ABRicate</w:t>
         </w:r>
@@ -3393,12 +3393,12 @@
       <w:r>
         <w:t xml:space="preserve"> contig hits per (sample, </w:t>
       </w:r>
-      <w:del w:id="10486" w:author="Revision merge (HM+PL)" w:date="2026-09-07T13:07:41Z">
+      <w:del w:id="10486" w:author="Revision merge (HM+PL)" w:date="2026-09-07T16:18:28Z">
         <w:r>
           <w:delText xml:space="preserve">GENE)),</w:delText>
         </w:r>
       </w:del>
-      <w:ins w:id="10487" w:author="Revision merge (HM+PL)" w:date="2026-09-07T13:07:41Z">
+      <w:ins w:id="10487" w:author="Revision merge (HM+PL)" w:date="2026-09-07T16:18:28Z">
         <w:r>
           <w:t xml:space="preserve">GENE).</w:t>
         </w:r>
@@ -3406,12 +3406,12 @@
       <w:r>
         <w:t xml:space="preserve"> </w:t>
       </w:r>
-      <w:del w:id="10488" w:author="Revision merge (HM+PL)" w:date="2026-09-07T13:07:41Z">
+      <w:del w:id="10488" w:author="Revision merge (HM+PL)" w:date="2026-09-07T16:18:28Z">
         <w:r>
           <w:delText xml:space="preserve">combining</w:delText>
         </w:r>
       </w:del>
-      <w:ins w:id="10489" w:author="Revision merge (HM+PL)" w:date="2026-09-07T13:07:41Z">
+      <w:ins w:id="10489" w:author="Revision merge (HM+PL)" w:date="2026-09-07T16:18:28Z">
         <w:r>
           <w:t xml:space="preserve">The workflow combines</w:t>
         </w:r>
@@ -3419,7 +3419,7 @@
       <w:r>
         <w:t xml:space="preserve"> an omnibus Kruskal-Wallis </w:t>
       </w:r>
-      <w:ins w:id="10490" w:author="Revision merge (HM+PL)" w:date="2026-09-07T13:07:41Z">
+      <w:ins w:id="10490" w:author="Revision merge (HM+PL)" w:date="2026-09-07T16:18:28Z">
         <w:r>
           <w:t xml:space="preserve">test </w:t>
         </w:r>
@@ -3427,12 +3427,12 @@
       <w:r>
         <w:t xml:space="preserve">with pairwise Welch's </w:t>
       </w:r>
-      <w:del w:id="10491" w:author="Revision merge (HM+PL)" w:date="2026-09-07T13:07:41Z">
+      <w:del w:id="10491" w:author="Revision merge (HM+PL)" w:date="2026-09-07T16:18:28Z">
         <w:r>
           <w:delText xml:space="preserve">t tests,</w:delText>
         </w:r>
       </w:del>
-      <w:ins w:id="10492" w:author="Revision merge (HM+PL)" w:date="2026-09-07T13:07:41Z">
+      <w:ins w:id="10492" w:author="Revision merge (HM+PL)" w:date="2026-09-07T16:18:28Z">
         <w:r>
           <w:t xml:space="preserve">t-tests,</w:t>
         </w:r>
@@ -3440,7 +3440,7 @@
       <w:r>
         <w:t xml:space="preserve"> with an optional `aldex.glm` design path for covariate-adjusted models.</w:t>
       </w:r>
-      <w:ins w:id="10493" w:author="Revision merge (HM+PL)" w:date="2026-09-07T13:07:41Z">
+      <w:ins w:id="10493" w:author="Revision merge (HM+PL)" w:date="2026-09-07T16:18:28Z">
         <w:r>
           <w:t xml:space="preserve"> This compositional approach is deliberate: ALDEx2 models counts through a centred log-ratio (CLR) transformation, which accounts for the compositional nature of sequencing data and avoids the spurious correlations that arise when raw or total counts are compared directly [10]; gene-level features are additionally length-normalised as TPM (R/03) so that genes of differing length remain comparable.</w:t>
         </w:r>
@@ -3453,12 +3453,12 @@
       <w:r>
         <w:t xml:space="preserve">(4) *Functional profiling* (R/09–R/11) runs a shared analysis engine three times against domain-specific databases: </w:t>
       </w:r>
-      <w:del w:id="10494" w:author="Revision merge (HM+PL)" w:date="2026-09-07T13:07:41Z">
+      <w:del w:id="10494" w:author="Revision merge (HM+PL)" w:date="2026-09-07T16:18:28Z">
         <w:r>
           <w:delText xml:space="preserve">the</w:delText>
         </w:r>
       </w:del>
-      <w:ins w:id="10495" w:author="Revision merge (HM+PL)" w:date="2026-09-07T13:07:41Z">
+      <w:ins w:id="10495" w:author="Revision merge (HM+PL)" w:date="2026-09-07T16:18:28Z">
         <w:r>
           <w:t xml:space="preserve">(i)</w:t>
         </w:r>
@@ -3466,12 +3466,12 @@
       <w:r>
         <w:t xml:space="preserve"> resistome </w:t>
       </w:r>
-      <w:del w:id="10496" w:author="Revision merge (HM+PL)" w:date="2026-09-07T13:07:41Z">
+      <w:del w:id="10496" w:author="Revision merge (HM+PL)" w:date="2026-09-07T16:18:28Z">
         <w:r>
           <w:delText xml:space="preserve">(ABRicate/CARD,</w:delText>
         </w:r>
       </w:del>
-      <w:ins w:id="10497" w:author="Revision merge (HM+PL)" w:date="2026-09-07T13:07:41Z">
+      <w:ins w:id="10497" w:author="Revision merge (HM+PL)" w:date="2026-09-07T16:18:28Z">
         <w:r>
           <w:t xml:space="preserve">profiling</w:t>
         </w:r>
@@ -3479,12 +3479,12 @@
       <w:r>
         <w:t xml:space="preserve"> </w:t>
       </w:r>
-      <w:del w:id="10498" w:author="Revision merge (HM+PL)" w:date="2026-09-07T13:07:41Z">
+      <w:del w:id="10498" w:author="Revision merge (HM+PL)" w:date="2026-09-07T16:18:28Z">
         <w:r>
           <w:delText xml:space="preserve">with</w:delText>
         </w:r>
       </w:del>
-      <w:ins w:id="10499" w:author="Revision merge (HM+PL)" w:date="2026-09-07T13:07:41Z">
+      <w:ins w:id="10499" w:author="Revision merge (HM+PL)" w:date="2026-09-07T16:18:28Z">
         <w:r>
           <w:t xml:space="preserve">using ABRicate/CARD annotations, including</w:t>
         </w:r>
@@ -3492,12 +3492,12 @@
       <w:r>
         <w:t xml:space="preserve"> drug-class </w:t>
       </w:r>
-      <w:del w:id="10500" w:author="Revision merge (HM+PL)" w:date="2026-09-07T13:07:41Z">
+      <w:del w:id="10500" w:author="Revision merge (HM+PL)" w:date="2026-09-07T16:18:28Z">
         <w:r>
           <w:delText xml:space="preserve">classification),</w:delText>
         </w:r>
       </w:del>
-      <w:ins w:id="10501" w:author="Revision merge (HM+PL)" w:date="2026-09-07T13:07:41Z">
+      <w:ins w:id="10501" w:author="Revision merge (HM+PL)" w:date="2026-09-07T16:18:28Z">
         <w:r>
           <w:t xml:space="preserve">classification;</w:t>
         </w:r>
@@ -3505,12 +3505,12 @@
       <w:r>
         <w:t xml:space="preserve"> </w:t>
       </w:r>
-      <w:del w:id="10502" w:author="Revision merge (HM+PL)" w:date="2026-09-07T13:07:41Z">
+      <w:del w:id="10502" w:author="Revision merge (HM+PL)" w:date="2026-09-07T16:18:28Z">
         <w:r>
           <w:delText xml:space="preserve">the</w:delText>
         </w:r>
       </w:del>
-      <w:ins w:id="10503" w:author="Revision merge (HM+PL)" w:date="2026-09-07T13:07:41Z">
+      <w:ins w:id="10503" w:author="Revision merge (HM+PL)" w:date="2026-09-07T16:18:28Z">
         <w:r>
           <w:t xml:space="preserve">(ii)</w:t>
         </w:r>
@@ -3518,12 +3518,12 @@
       <w:r>
         <w:t xml:space="preserve"> virulome </w:t>
       </w:r>
-      <w:del w:id="10504" w:author="Revision merge (HM+PL)" w:date="2026-09-07T13:07:41Z">
+      <w:del w:id="10504" w:author="Revision merge (HM+PL)" w:date="2026-09-07T16:18:28Z">
         <w:r>
           <w:delText xml:space="preserve">(VFDB,</w:delText>
         </w:r>
       </w:del>
-      <w:ins w:id="10505" w:author="Revision merge (HM+PL)" w:date="2026-09-07T13:07:41Z">
+      <w:ins w:id="10505" w:author="Revision merge (HM+PL)" w:date="2026-09-07T16:18:28Z">
         <w:r>
           <w:t xml:space="preserve">profiling using VFDB,</w:t>
         </w:r>
@@ -3531,12 +3531,12 @@
       <w:r>
         <w:t xml:space="preserve"> with functional categories extracted from the ABRicate `PRODUCT` </w:t>
       </w:r>
-      <w:del w:id="10506" w:author="Revision merge (HM+PL)" w:date="2026-09-07T13:07:41Z">
+      <w:del w:id="10506" w:author="Revision merge (HM+PL)" w:date="2026-09-07T16:18:28Z">
         <w:r>
           <w:delText xml:space="preserve">field)</w:delText>
         </w:r>
       </w:del>
-      <w:ins w:id="10507" w:author="Revision merge (HM+PL)" w:date="2026-09-07T13:07:41Z">
+      <w:ins w:id="10507" w:author="Revision merge (HM+PL)" w:date="2026-09-07T16:18:28Z">
         <w:r>
           <w:t xml:space="preserve">field;</w:t>
         </w:r>
@@ -3544,12 +3544,12 @@
       <w:r>
         <w:t xml:space="preserve"> </w:t>
       </w:r>
-      <w:del w:id="10508" w:author="Revision merge (HM+PL)" w:date="2026-09-07T13:07:41Z">
+      <w:del w:id="10508" w:author="Revision merge (HM+PL)" w:date="2026-09-07T16:18:28Z">
         <w:r>
           <w:delText xml:space="preserve">and the</w:delText>
         </w:r>
       </w:del>
-      <w:ins w:id="10509" w:author="Revision merge (HM+PL)" w:date="2026-09-07T13:07:41Z">
+      <w:ins w:id="10509" w:author="Revision merge (HM+PL)" w:date="2026-09-07T16:18:28Z">
         <w:r>
           <w:t xml:space="preserve">(iii)</w:t>
         </w:r>
@@ -3557,12 +3557,12 @@
       <w:r>
         <w:t xml:space="preserve"> mobilome </w:t>
       </w:r>
-      <w:del w:id="10510" w:author="Revision merge (HM+PL)" w:date="2026-09-07T13:07:41Z">
+      <w:del w:id="10510" w:author="Revision merge (HM+PL)" w:date="2026-09-07T16:18:28Z">
         <w:r>
           <w:delText xml:space="preserve">(PlasmidFinder,</w:delText>
         </w:r>
       </w:del>
-      <w:ins w:id="10511" w:author="Revision merge (HM+PL)" w:date="2026-09-07T13:07:41Z">
+      <w:ins w:id="10511" w:author="Revision merge (HM+PL)" w:date="2026-09-07T16:18:28Z">
         <w:r>
           <w:t xml:space="preserve">profiling</w:t>
         </w:r>
@@ -3570,12 +3570,12 @@
       <w:r>
         <w:t xml:space="preserve"> </w:t>
       </w:r>
-      <w:del w:id="10512" w:author="Revision merge (HM+PL)" w:date="2026-09-07T13:07:41Z">
+      <w:del w:id="10512" w:author="Revision merge (HM+PL)" w:date="2026-09-07T16:18:28Z">
         <w:r>
           <w:delText xml:space="preserve">with</w:delText>
         </w:r>
       </w:del>
-      <w:ins w:id="10513" w:author="Revision merge (HM+PL)" w:date="2026-09-07T13:07:41Z">
+      <w:ins w:id="10513" w:author="Revision merge (HM+PL)" w:date="2026-09-07T16:18:28Z">
         <w:r>
           <w:t xml:space="preserve">using PlasmidFinder, incorporating</w:t>
         </w:r>
@@ -3583,12 +3583,12 @@
       <w:r>
         <w:t xml:space="preserve"> configurable replicon-family classification </w:t>
       </w:r>
-      <w:del w:id="10514" w:author="Revision merge (HM+PL)" w:date="2026-09-07T13:07:41Z">
+      <w:del w:id="10514" w:author="Revision merge (HM+PL)" w:date="2026-09-07T16:18:28Z">
         <w:r>
           <w:delText xml:space="preserve">— Col-like,</w:delText>
         </w:r>
       </w:del>
-      <w:ins w:id="10515" w:author="Revision merge (HM+PL)" w:date="2026-09-07T13:07:41Z">
+      <w:ins w:id="10515" w:author="Revision merge (HM+PL)" w:date="2026-09-07T16:18:28Z">
         <w:r>
           <w:t xml:space="preserve">(Col-like,</w:t>
         </w:r>
@@ -3596,12 +3596,12 @@
       <w:r>
         <w:t xml:space="preserve"> IncF, IncX, other Inc). </w:t>
       </w:r>
-      <w:del w:id="10516" w:author="Revision merge (HM+PL)" w:date="2026-09-07T13:07:41Z">
+      <w:del w:id="10516" w:author="Revision merge (HM+PL)" w:date="2026-09-07T16:18:28Z">
         <w:r>
           <w:delText xml:space="preserve">Each</w:delText>
         </w:r>
       </w:del>
-      <w:ins w:id="10517" w:author="Revision merge (HM+PL)" w:date="2026-09-07T13:07:41Z">
+      <w:ins w:id="10517" w:author="Revision merge (HM+PL)" w:date="2026-09-07T16:18:28Z">
         <w:r>
           <w:t xml:space="preserve">For</w:t>
         </w:r>
@@ -3609,12 +3609,12 @@
       <w:r>
         <w:t xml:space="preserve"> </w:t>
       </w:r>
-      <w:del w:id="10518" w:author="Revision merge (HM+PL)" w:date="2026-09-07T13:07:41Z">
+      <w:del w:id="10518" w:author="Revision merge (HM+PL)" w:date="2026-09-07T16:18:28Z">
         <w:r>
           <w:delText xml:space="preserve">domain</w:delText>
         </w:r>
       </w:del>
-      <w:ins w:id="10519" w:author="Revision merge (HM+PL)" w:date="2026-09-07T13:07:41Z">
+      <w:ins w:id="10519" w:author="Revision merge (HM+PL)" w:date="2026-09-07T16:18:28Z">
         <w:r>
           <w:t xml:space="preserve">each</w:t>
         </w:r>
@@ -3622,12 +3622,12 @@
       <w:r>
         <w:t xml:space="preserve"> </w:t>
       </w:r>
-      <w:del w:id="10520" w:author="Revision merge (HM+PL)" w:date="2026-09-07T13:07:41Z">
+      <w:del w:id="10520" w:author="Revision merge (HM+PL)" w:date="2026-09-07T16:18:28Z">
         <w:r>
           <w:delText xml:space="preserve">emits</w:delText>
         </w:r>
       </w:del>
-      <w:ins w:id="10521" w:author="Revision merge (HM+PL)" w:date="2026-09-07T13:07:41Z">
+      <w:ins w:id="10521" w:author="Revision merge (HM+PL)" w:date="2026-09-07T16:18:28Z">
         <w:r>
           <w:t xml:space="preserve">domain,</w:t>
         </w:r>
@@ -3635,12 +3635,12 @@
       <w:r>
         <w:t xml:space="preserve"> </w:t>
       </w:r>
-      <w:del w:id="10522" w:author="Revision merge (HM+PL)" w:date="2026-09-07T13:07:41Z">
+      <w:del w:id="10522" w:author="Revision merge (HM+PL)" w:date="2026-09-07T16:18:28Z">
         <w:r>
           <w:delText xml:space="preserve">its</w:delText>
         </w:r>
       </w:del>
-      <w:ins w:id="10523" w:author="Revision merge (HM+PL)" w:date="2026-09-07T13:07:41Z">
+      <w:ins w:id="10523" w:author="Revision merge (HM+PL)" w:date="2026-09-07T16:18:28Z">
         <w:r>
           <w:t xml:space="preserve">the</w:t>
         </w:r>
@@ -3648,12 +3648,12 @@
       <w:r>
         <w:t xml:space="preserve"> </w:t>
       </w:r>
-      <w:del w:id="10524" w:author="Revision merge (HM+PL)" w:date="2026-09-07T13:07:41Z">
+      <w:del w:id="10524" w:author="Revision merge (HM+PL)" w:date="2026-09-07T16:18:28Z">
         <w:r>
           <w:delText xml:space="preserve">own</w:delText>
         </w:r>
       </w:del>
-      <w:ins w:id="10525" w:author="Revision merge (HM+PL)" w:date="2026-09-07T13:07:41Z">
+      <w:ins w:id="10525" w:author="Revision merge (HM+PL)" w:date="2026-09-07T16:18:28Z">
         <w:r>
           <w:t xml:space="preserve">pipeline generates</w:t>
         </w:r>
@@ -3661,12 +3661,12 @@
       <w:r>
         <w:t xml:space="preserve"> alpha </w:t>
       </w:r>
-      <w:del w:id="10526" w:author="Revision merge (HM+PL)" w:date="2026-09-07T13:07:41Z">
+      <w:del w:id="10526" w:author="Revision merge (HM+PL)" w:date="2026-09-07T16:18:28Z">
         <w:r>
           <w:delText xml:space="preserve">diversity,</w:delText>
         </w:r>
       </w:del>
-      <w:ins w:id="10527" w:author="Revision merge (HM+PL)" w:date="2026-09-07T13:07:41Z">
+      <w:ins w:id="10527" w:author="Revision merge (HM+PL)" w:date="2026-09-07T16:18:28Z">
         <w:r>
           <w:t xml:space="preserve">diversity metrics,</w:t>
         </w:r>
@@ -3674,12 +3674,12 @@
       <w:r>
         <w:t xml:space="preserve"> Venn </w:t>
       </w:r>
-      <w:del w:id="10528" w:author="Revision merge (HM+PL)" w:date="2026-09-07T13:07:41Z">
+      <w:del w:id="10528" w:author="Revision merge (HM+PL)" w:date="2026-09-07T16:18:28Z">
         <w:r>
           <w:delText xml:space="preserve">diagram,</w:delText>
         </w:r>
       </w:del>
-      <w:ins w:id="10529" w:author="Revision merge (HM+PL)" w:date="2026-09-07T13:07:41Z">
+      <w:ins w:id="10529" w:author="Revision merge (HM+PL)" w:date="2026-09-07T16:18:28Z">
         <w:r>
           <w:t xml:space="preserve">diagrams,</w:t>
         </w:r>
@@ -3695,7 +3695,7 @@
       <w:r>
         <w:t xml:space="preserve">(5) *Integration, reporting and manifest* (R/12–R/14).</w:t>
       </w:r>
-      <w:ins w:id="10530" w:author="Revision merge (HM+PL)" w:date="2026-09-07T13:07:41Z">
+      <w:ins w:id="10530" w:author="Revision merge (HM+PL)" w:date="2026-09-07T16:18:28Z">
         <w:r>
           <w:t xml:space="preserve"> The final stage integrates results across all domains and produces the reporting outputs.</w:t>
         </w:r>
@@ -3711,12 +3711,12 @@
       <w:r>
         <w:t xml:space="preserve">**Reporting.** </w:t>
       </w:r>
-      <w:del w:id="10531" w:author="Revision merge (HM+PL)" w:date="2026-09-07T13:07:41Z">
+      <w:del w:id="10531" w:author="Revision merge (HM+PL)" w:date="2026-09-07T16:18:28Z">
         <w:r>
           <w:delText xml:space="preserve">The</w:delText>
         </w:r>
       </w:del>
-      <w:ins w:id="10532" w:author="Revision merge (HM+PL)" w:date="2026-09-07T13:07:41Z">
+      <w:ins w:id="10532" w:author="Revision merge (HM+PL)" w:date="2026-09-07T16:18:28Z">
         <w:r>
           <w:t xml:space="preserve">Results are rendered through a</w:t>
         </w:r>
@@ -3724,7 +3724,7 @@
       <w:r>
         <w:t xml:space="preserve"> Quarto template</w:t>
       </w:r>
-      <w:del w:id="10533" w:author="Revision merge (HM+PL)" w:date="2026-09-07T13:07:41Z">
+      <w:del w:id="10533" w:author="Revision merge (HM+PL)" w:date="2026-09-07T16:18:28Z">
         <w:r>
           <w:delText xml:space="preserve"> renders all outputs</w:delText>
         </w:r>
@@ -3732,12 +3732,12 @@
       <w:r>
         <w:t xml:space="preserve"> as a multi-page HTML dashboard </w:t>
       </w:r>
-      <w:del w:id="10534" w:author="Revision merge (HM+PL)" w:date="2026-09-07T13:07:41Z">
+      <w:del w:id="10534" w:author="Revision merge (HM+PL)" w:date="2026-09-07T16:18:28Z">
         <w:r>
           <w:delText xml:space="preserve">with</w:delText>
         </w:r>
       </w:del>
-      <w:ins w:id="10535" w:author="Revision merge (HM+PL)" w:date="2026-09-07T13:07:41Z">
+      <w:ins w:id="10535" w:author="Revision merge (HM+PL)" w:date="2026-09-07T16:18:28Z">
         <w:r>
           <w:t xml:space="preserve">containing</w:t>
         </w:r>
@@ -3745,12 +3745,12 @@
       <w:r>
         <w:t xml:space="preserve"> </w:t>
       </w:r>
-      <w:del w:id="10536" w:author="Revision merge (HM+PL)" w:date="2026-09-07T13:07:41Z">
+      <w:del w:id="10536" w:author="Revision merge (HM+PL)" w:date="2026-09-07T16:18:28Z">
         <w:r>
           <w:delText xml:space="preserve">per-domain</w:delText>
         </w:r>
       </w:del>
-      <w:ins w:id="10537" w:author="Revision merge (HM+PL)" w:date="2026-09-07T13:07:41Z">
+      <w:ins w:id="10537" w:author="Revision merge (HM+PL)" w:date="2026-09-07T16:18:28Z">
         <w:r>
           <w:t xml:space="preserve">dedicated</w:t>
         </w:r>
@@ -3758,12 +3758,12 @@
       <w:r>
         <w:t xml:space="preserve"> panels </w:t>
       </w:r>
-      <w:del w:id="10538" w:author="Revision merge (HM+PL)" w:date="2026-09-07T13:07:41Z">
+      <w:del w:id="10538" w:author="Revision merge (HM+PL)" w:date="2026-09-07T16:18:28Z">
         <w:r>
           <w:delText xml:space="preserve">(taxonomy,</w:delText>
         </w:r>
       </w:del>
-      <w:ins w:id="10539" w:author="Revision merge (HM+PL)" w:date="2026-09-07T13:07:41Z">
+      <w:ins w:id="10539" w:author="Revision merge (HM+PL)" w:date="2026-09-07T16:18:28Z">
         <w:r>
           <w:t xml:space="preserve">for taxonomy,</w:t>
         </w:r>
@@ -3771,12 +3771,12 @@
       <w:r>
         <w:t xml:space="preserve"> diversity, differential abundance, resistome, virulome, </w:t>
       </w:r>
-      <w:del w:id="10540" w:author="Revision merge (HM+PL)" w:date="2026-09-07T13:07:41Z">
+      <w:del w:id="10540" w:author="Revision merge (HM+PL)" w:date="2026-09-07T16:18:28Z">
         <w:r>
           <w:delText xml:space="preserve">mobilome, network)</w:delText>
         </w:r>
       </w:del>
-      <w:ins w:id="10541" w:author="Revision merge (HM+PL)" w:date="2026-09-07T13:07:41Z">
+      <w:ins w:id="10541" w:author="Revision merge (HM+PL)" w:date="2026-09-07T16:18:28Z">
         <w:r>
           <w:t xml:space="preserve">mobilome</w:t>
         </w:r>
@@ -3784,7 +3784,7 @@
       <w:r>
         <w:t xml:space="preserve"> and</w:t>
       </w:r>
-      <w:ins w:id="10542" w:author="Revision merge (HM+PL)" w:date="2026-09-07T13:07:41Z">
+      <w:ins w:id="10542" w:author="Revision merge (HM+PL)" w:date="2026-09-07T16:18:28Z">
         <w:r>
           <w:t xml:space="preserve"> network, plus</w:t>
         </w:r>
@@ -3792,7 +3792,7 @@
       <w:r>
         <w:t xml:space="preserve"> embedded download links. Dependencies are pinned via `renv`, and the project requires R ≥ 4.5; external command-line tools (Kraken2, Bracken, ABRicate, Re-centrifuge) are assumed to have been run upstream.</w:t>
       </w:r>
-      <w:ins w:id="10543" w:author="Revision merge (HM+PL)" w:date="2026-09-07T13:07:41Z">
+      <w:ins w:id="10543" w:author="Revision merge (HM+PL)" w:date="2026-09-07T16:18:28Z">
         <w:r>
           <w:t xml:space="preserve"> Because MERIDIAN consumes these pre-computed outputs rather than the raw reads, its own footprint is modest and single-threaded (peaking at ~1.5 GB; Section 3), and is therefore decoupled from the substantial memory required by upstream taxonomic classification (for example, a full Kraken2 database), which can be run separately on high-memory or cloud infrastructure.</w:t>
         </w:r>
@@ -3820,12 +3820,12 @@
       <w:r>
         <w:t xml:space="preserve">We </w:t>
       </w:r>
-      <w:del w:id="10544" w:author="Revision merge (HM+PL)" w:date="2026-09-07T13:07:41Z">
+      <w:del w:id="10544" w:author="Revision merge (HM+PL)" w:date="2026-09-07T16:18:28Z">
         <w:r>
           <w:delText xml:space="preserve">are validating</w:delText>
         </w:r>
       </w:del>
-      <w:ins w:id="10545" w:author="Revision merge (HM+PL)" w:date="2026-09-07T13:07:41Z">
+      <w:ins w:id="10545" w:author="Revision merge (HM+PL)" w:date="2026-09-07T16:18:28Z">
         <w:r>
           <w:t xml:space="preserve">validated</w:t>
         </w:r>
@@ -3833,7 +3833,7 @@
       <w:r>
         <w:t xml:space="preserve"> the pipeline against two </w:t>
       </w:r>
-      <w:del w:id="10546" w:author="Revision merge (HM+PL)" w:date="2026-09-07T13:07:41Z">
+      <w:del w:id="10546" w:author="Revision merge (HM+PL)" w:date="2026-09-07T16:18:28Z">
         <w:r>
           <w:delText xml:space="preserve">real </w:delText>
         </w:r>
@@ -3841,12 +3841,12 @@
       <w:r>
         <w:t xml:space="preserve">long-read chicken caecum </w:t>
       </w:r>
-      <w:del w:id="10547" w:author="Revision merge (HM+PL)" w:date="2026-09-07T13:07:41Z">
+      <w:del w:id="10547" w:author="Revision merge (HM+PL)" w:date="2026-09-07T16:18:28Z">
         <w:r>
           <w:delText xml:space="preserve">metagenomics</w:delText>
         </w:r>
       </w:del>
-      <w:ins w:id="10548" w:author="Revision merge (HM+PL)" w:date="2026-09-07T13:07:41Z">
+      <w:ins w:id="10548" w:author="Revision merge (HM+PL)" w:date="2026-09-07T16:18:28Z">
         <w:r>
           <w:t xml:space="preserve">metagenomic</w:t>
         </w:r>
@@ -3854,12 +3854,12 @@
       <w:r>
         <w:t xml:space="preserve"> studies. The </w:t>
       </w:r>
-      <w:del w:id="10549" w:author="Revision merge (HM+PL)" w:date="2026-09-07T13:07:41Z">
+      <w:del w:id="10549" w:author="Revision merge (HM+PL)" w:date="2026-09-07T16:18:28Z">
         <w:r>
           <w:delText xml:space="preserve">reference</w:delText>
         </w:r>
       </w:del>
-      <w:ins w:id="10550" w:author="Revision merge (HM+PL)" w:date="2026-09-07T13:07:41Z">
+      <w:ins w:id="10550" w:author="Revision merge (HM+PL)" w:date="2026-09-07T16:18:28Z">
         <w:r>
           <w:t xml:space="preserve">primary</w:t>
         </w:r>
@@ -3867,12 +3867,12 @@
       <w:r>
         <w:t xml:space="preserve"> </w:t>
       </w:r>
-      <w:del w:id="10551" w:author="Revision merge (HM+PL)" w:date="2026-09-07T13:07:41Z">
+      <w:del w:id="10551" w:author="Revision merge (HM+PL)" w:date="2026-09-07T16:18:28Z">
         <w:r>
           <w:delText xml:space="preserve">cohort</w:delText>
         </w:r>
       </w:del>
-      <w:ins w:id="10552" w:author="Revision merge (HM+PL)" w:date="2026-09-07T13:07:41Z">
+      <w:ins w:id="10552" w:author="Revision merge (HM+PL)" w:date="2026-09-07T16:18:28Z">
         <w:r>
           <w:t xml:space="preserve">dataset</w:t>
         </w:r>
@@ -3880,7 +3880,7 @@
       <w:r>
         <w:t xml:space="preserve"> (`Chicken batch 1`, PC_JC_2024-11-29; 18 samples; 3 dietary groups — Dulse, Reference diet, Soyabean meal) </w:t>
       </w:r>
-      <w:ins w:id="10553" w:author="Revision merge (HM+PL)" w:date="2026-09-07T13:07:41Z">
+      <w:ins w:id="10553" w:author="Revision merge (HM+PL)" w:date="2026-09-07T16:18:28Z">
         <w:r>
           <w:t xml:space="preserve">is publicly available under NCBI BioProject PRJNA1406192 and </w:t>
         </w:r>
@@ -3888,12 +3888,12 @@
       <w:r>
         <w:t xml:space="preserve">has approximately 46 hand-edited R scripts </w:t>
       </w:r>
-      <w:del w:id="10554" w:author="Revision merge (HM+PL)" w:date="2026-09-07T13:07:41Z">
+      <w:del w:id="10554" w:author="Revision merge (HM+PL)" w:date="2026-09-07T16:18:28Z">
         <w:r>
           <w:delText xml:space="preserve">and</w:delText>
         </w:r>
       </w:del>
-      <w:ins w:id="10555" w:author="Revision merge (HM+PL)" w:date="2026-09-07T13:07:41Z">
+      <w:ins w:id="10555" w:author="Revision merge (HM+PL)" w:date="2026-09-07T16:18:28Z">
         <w:r>
           <w:t xml:space="preserve">with</w:t>
         </w:r>
@@ -3901,12 +3901,12 @@
       <w:r>
         <w:t xml:space="preserve"> </w:t>
       </w:r>
-      <w:del w:id="10556" w:author="Revision merge (HM+PL)" w:date="2026-09-07T13:07:41Z">
+      <w:del w:id="10556" w:author="Revision merge (HM+PL)" w:date="2026-09-07T16:18:28Z">
         <w:r>
           <w:delText xml:space="preserve">known-good</w:delText>
         </w:r>
       </w:del>
-      <w:ins w:id="10557" w:author="Revision merge (HM+PL)" w:date="2026-09-07T13:07:41Z">
+      <w:ins w:id="10557" w:author="Revision merge (HM+PL)" w:date="2026-09-07T16:18:28Z">
         <w:r>
           <w:t xml:space="preserve">corresponding validated</w:t>
         </w:r>
@@ -3914,12 +3914,12 @@
       <w:r>
         <w:t xml:space="preserve"> figures and </w:t>
       </w:r>
-      <w:del w:id="10558" w:author="Revision merge (HM+PL)" w:date="2026-09-07T13:07:41Z">
+      <w:del w:id="10558" w:author="Revision merge (HM+PL)" w:date="2026-09-07T16:18:28Z">
         <w:r>
           <w:delText xml:space="preserve">tables already in place,</w:delText>
         </w:r>
       </w:del>
-      <w:ins w:id="10559" w:author="Revision merge (HM+PL)" w:date="2026-09-07T13:07:41Z">
+      <w:ins w:id="10559" w:author="Revision merge (HM+PL)" w:date="2026-09-07T16:18:28Z">
         <w:r>
           <w:t xml:space="preserve">tables,</w:t>
         </w:r>
@@ -3927,12 +3927,12 @@
       <w:r>
         <w:t xml:space="preserve"> so each stage can be compared output-for-output against the corresponding ground-truth artefact. The </w:t>
       </w:r>
-      <w:del w:id="10560" w:author="Revision merge (HM+PL)" w:date="2026-09-07T13:07:41Z">
+      <w:del w:id="10560" w:author="Revision merge (HM+PL)" w:date="2026-09-07T16:18:28Z">
         <w:r>
           <w:delText xml:space="preserve">scaling</w:delText>
         </w:r>
       </w:del>
-      <w:ins w:id="10561" w:author="Revision merge (HM+PL)" w:date="2026-09-07T13:07:41Z">
+      <w:ins w:id="10561" w:author="Revision merge (HM+PL)" w:date="2026-09-07T16:18:28Z">
         <w:r>
           <w:t xml:space="preserve">second</w:t>
         </w:r>
@@ -3940,12 +3940,12 @@
       <w:r>
         <w:t xml:space="preserve"> </w:t>
       </w:r>
-      <w:del w:id="10562" w:author="Revision merge (HM+PL)" w:date="2026-09-07T13:07:41Z">
+      <w:del w:id="10562" w:author="Revision merge (HM+PL)" w:date="2026-09-07T16:18:28Z">
         <w:r>
           <w:delText xml:space="preserve">and feature-coverage cohort</w:delText>
         </w:r>
       </w:del>
-      <w:ins w:id="10563" w:author="Revision merge (HM+PL)" w:date="2026-09-07T13:07:41Z">
+      <w:ins w:id="10563" w:author="Revision merge (HM+PL)" w:date="2026-09-07T16:18:28Z">
         <w:r>
           <w:t xml:space="preserve">dataset</w:t>
         </w:r>
@@ -3953,12 +3953,12 @@
       <w:r>
         <w:t xml:space="preserve"> (`Chicken batch 2`, JC_FL_2025-05-20; 32 </w:t>
       </w:r>
-      <w:del w:id="10564" w:author="Revision merge (HM+PL)" w:date="2026-09-07T13:07:41Z">
+      <w:del w:id="10564" w:author="Revision merge (HM+PL)" w:date="2026-09-07T16:18:28Z">
         <w:r>
           <w:delText xml:space="preserve">samples;</w:delText>
         </w:r>
       </w:del>
-      <w:ins w:id="10565" w:author="Revision merge (HM+PL)" w:date="2026-09-07T13:07:41Z">
+      <w:ins w:id="10565" w:author="Revision merge (HM+PL)" w:date="2026-09-07T16:18:28Z">
         <w:r>
           <w:t xml:space="preserve">samples), for which public release is pending publication of the associated study, was used for scalability and feature coverage: samples were organised into a</w:t>
         </w:r>
@@ -3966,12 +3966,12 @@
       <w:r>
         <w:t xml:space="preserve"> 4-level composite `Treatment_Bird` grouping </w:t>
       </w:r>
-      <w:del w:id="10566" w:author="Revision merge (HM+PL)" w:date="2026-09-07T13:07:41Z">
+      <w:del w:id="10566" w:author="Revision merge (HM+PL)" w:date="2026-09-07T16:18:28Z">
         <w:r>
           <w:delText xml:space="preserve">— Control_W4,</w:delText>
         </w:r>
       </w:del>
-      <w:ins w:id="10567" w:author="Revision merge (HM+PL)" w:date="2026-09-07T13:07:41Z">
+      <w:ins w:id="10567" w:author="Revision merge (HM+PL)" w:date="2026-09-07T16:18:28Z">
         <w:r>
           <w:t xml:space="preserve">(Control_W4,</w:t>
         </w:r>
@@ -3979,12 +3979,12 @@
       <w:r>
         <w:t xml:space="preserve"> Control_W5, Dulse_W4, Dulse_W5) </w:t>
       </w:r>
-      <w:del w:id="10568" w:author="Revision merge (HM+PL)" w:date="2026-09-07T13:07:41Z">
+      <w:del w:id="10568" w:author="Revision merge (HM+PL)" w:date="2026-09-07T16:18:28Z">
         <w:r>
           <w:delText xml:space="preserve">exercises</w:delText>
         </w:r>
       </w:del>
-      <w:ins w:id="10569" w:author="Revision merge (HM+PL)" w:date="2026-09-07T13:07:41Z">
+      <w:ins w:id="10569" w:author="Revision merge (HM+PL)" w:date="2026-09-07T16:18:28Z">
         <w:r>
           <w:t xml:space="preserve">with</w:t>
         </w:r>
@@ -4144,12 +4144,12 @@
       <w:r>
         <w:t xml:space="preserve">Across both </w:t>
       </w:r>
-      <w:del w:id="10570" w:author="Revision merge (HM+PL)" w:date="2026-09-07T13:07:41Z">
+      <w:del w:id="10570" w:author="Revision merge (HM+PL)" w:date="2026-09-07T16:18:28Z">
         <w:r>
           <w:delText xml:space="preserve">cohorts</w:delText>
         </w:r>
       </w:del>
-      <w:ins w:id="10571" w:author="Revision merge (HM+PL)" w:date="2026-09-07T13:07:41Z">
+      <w:ins w:id="10571" w:author="Revision merge (HM+PL)" w:date="2026-09-07T16:18:28Z">
         <w:r>
           <w:t xml:space="preserve">datasets</w:t>
         </w:r>
@@ -4157,12 +4157,12 @@
       <w:r>
         <w:t xml:space="preserve"> (**Table 1**), every enabled stage produced its expected primary artefact under identical settings. Feature counts scale with cohort size and grouping complexity: B2 (n=32, 4-level `Treatment_Bird`) yields ~1.5–2× the resistome (648 vs 348 rows), virulome (492 vs 320) and mobilome (137 vs 65) rows of B1, with 53 vs 31 differentially abundant taxa across 6 vs 3 pairwise contrasts and a denser integrated network (576 edges/210 nodes/modularity 0.40 vs 247/100/0.31). The pipeline closes cleanly on both runs, producing a contract-v1.2 `manifest.json` (~80–85 kB) and a Quarto HTML dashboard (~14–18 MB). The performance profile (**Figure 2**) illustrated that the end-to-end runtime grew from 6m 41s on B1 to 8m 19s on B2 (+24 %, sublinear in both sample count and pairwise-contrast count), dominated on both cohorts by ALDEx2 differential abundance (32 % of B1 total, 40 % of B2). Peak R-process memory tracks the same monotone </w:t>
       </w:r>
-      <w:del w:id="10572" w:author="Revision merge (HM+PL)" w:date="2026-09-07T13:07:41Z">
+      <w:del w:id="10572" w:author="Revision merge (HM+PL)" w:date="2026-09-07T16:18:28Z">
         <w:r>
           <w:delText xml:space="preserve">profile —</w:delText>
         </w:r>
       </w:del>
-      <w:ins w:id="10573" w:author="Revision merge (HM+PL)" w:date="2026-09-07T13:07:41Z">
+      <w:ins w:id="10573" w:author="Revision merge (HM+PL)" w:date="2026-09-07T16:18:28Z">
         <w:r>
           <w:t xml:space="preserve">profile,</w:t>
         </w:r>
@@ -4183,7 +4183,7 @@
       <w:pPr>
         <w:spacing w:after="120"/>
       </w:pPr>
-      <w:del w:id="10574" w:author="Revision merge (HM+PL)" w:date="2026-09-07T13:07:41Z">
+      <w:del w:id="10574" w:author="Revision merge (HM+PL)" w:date="2026-09-07T16:18:28Z">
         <w:r>
           <w:delText xml:space="preserve">One expected and deliberate divergence concerns the resistome stage: the ground-truth `cleanData.R` misparses taxids carrying variant suffixes, dropping the corresponding ABRicate rows. R/02 fixes this parsing bug, so the pipeline retains 110 additional (sample, GENE) rows relative to the hand-edited output (`scripts/diff_normdata.R` on the 2026-06-23 B1 run: pipeline = 733 rows, ground truth = 623; 121 rows gained by the parsing fix, 11 rows present in the ground truth that the pipeline currently drops — concentrated in a handful of plasmid replicon and accessory resistance calls, queued for inspection rather than treated as a regression). Jaccard agreement on the `(sample, GENE)` key set is 0.82. Across the other stages with directly comparable ground-truth artefacts, sample-set agreement is exact for alpha diversity (18/18), and Jaccard for the network Gephi exports against the most recent hand-edited snapshot is 0.85 (nodes) and 0.87 (edges). Per-stage comparisons against the remaining hand-edited artefacts — taxonomy, beta diversity, and differential abundance — are deferred to a separate validation effort. The Re-centrifuge column-slicing heuristic in R/02 is acknowledged as still coarse and is queued for rework.</w:delText>
         </w:r>
@@ -4193,7 +4193,7 @@
       <w:pPr>
         <w:spacing w:after="120"/>
       </w:pPr>
-      <w:ins w:id="10575" w:author="Revision merge (HM+PL)" w:date="2026-09-07T13:07:41Z">
+      <w:ins w:id="10575" w:author="Revision merge (HM+PL)" w:date="2026-09-07T16:18:28Z">
         <w:r>
           <w:t xml:space="preserve">One anticipated and deliberate discrepancy arises at the resistome stage: the ground-truth `cleanData.R` misparses taxids carrying variant suffixes, dropping the corresponding ABRicate rows. R/02 corrects this parsing issue, so the pipeline retains 110 additional (sample, GENE) rows relative to the hand-edited output (`scripts/diff_normdata.R` on the 2026-06-23 B1 run: pipeline = 733 rows, ground truth = 623; 121 rows recovered by the parsing correction, and 11 rows present in the ground truth that the pipeline currently drops, concentrated in a handful of plasmid replicon and accessory resistance calls, queued for inspection rather than treated as a regression). Jaccard agreement on the `(sample, GENE)` key set is 0.82. For other stages with directly comparable ground-truth artefacts, sample-set agreement is exact for alpha diversity (18/18), and Jaccard for the network Gephi exports against the most recent hand-edited snapshot is 0.85 (nodes) and 0.87 (edges). Per-stage comparisons against the remaining hand-edited artefacts — taxonomy, beta diversity, and differential abundance — are deferred to a separate validation effort. The Re-centrifuge column-slicing heuristic in R/02 is acknowledged as still coarse and is queued for rework.</w:t>
         </w:r>
@@ -4203,17 +4203,17 @@
       <w:pPr>
         <w:spacing w:after="120"/>
       </w:pPr>
-      <w:ins w:id="10576" w:author="Revision merge (HM+PL)" w:date="2026-09-07T13:07:41Z">
-        <w:r>
-          <w:t xml:space="preserve">To assess portability beyond the development cohorts, we applied MERIDIAN unmodified — changing only `config.yaml` — to two independent, publicly available long-read (ONT) metagenomic studies spanning the One Health continuum: hospital wastewater versus tap water from five Egyptian hospitals (NCBI BioProject PRJNA1266479; 20 samples) and anthropogenically impacted versus natural wetland sites along the East Atlantic Flyway (ENA BioProject PRJEB96272; 24 samples). Both cohorts completed all fifteen stages in a single run (4m 08s and 5m 54s; peak 2.0 and 3.5 GB), each emitting a Quarto dashboard, publication panels and a contract-v1.2 `manifest.json`. The pipeline recovered biologically coherent structure: hospital wastewater was significantly richer and compositionally distinct from tap water (PERMANOVA R² = 0.18, p = 3 × 10⁻⁴), and wetland virulence-factor load was higher at anthropogenically impacted sites (PERMANOVA R² = 0.25, p_adj = 0.015), consistent with the source study. Both datasets also exercised edge cases absent from the chicken cohorts — a single-group resistome/mobilome (tap water carried essentially no ARGs) and a complete absence of PlasmidFinder hits (wetland water) — which the pipeline handled by skipping the affected sub-analyses with logged notices rather than failing. As these datasets lack hand-curated ground-truth artefacts, they demonstrate portability and robustness across sample types rather than output-for-output correctness.</w:t>
-        </w:r>
-      </w:ins>
-    </w:p>
-    <w:p>
-      <w:pPr>
-        <w:spacing w:after="120"/>
-      </w:pPr>
-      <w:ins w:id="10577" w:author="Revision merge (HM+PL)" w:date="2026-09-07T13:07:41Z">
+      <w:ins w:id="10576" w:author="Revision merge (HM+PL)" w:date="2026-09-07T16:18:28Z">
+        <w:r>
+          <w:t xml:space="preserve">To assess portability beyond the development cohorts, we applied MERIDIAN unmodified — changing only `config.yaml` — to two independent, publicly available long-read (ONT) metagenomic studies spanning the One Health continuum: hospital wastewater versus tap water from five Egyptian hospitals (NCBI BioProject PRJNA1266479; 20 samples) and anthropogenically impacted versus natural wetland sites along the East Atlantic Flyway (ENA BioProject PRJEB96272; 24 samples). Both cohorts completed all fifteen stages in a single run (4m 08s and 5m 54s; peak 2.0 and 3.5 GB), each emitting a Quarto dashboard, publication panels and a contract-v1.2 `manifest.json`. The pipeline recovered biologically coherent structure: hospital wastewater was significantly richer and compositionally distinct from tap water (PERMANOVA R² = 0.18, p = 3 × 10⁻⁴), and — within the wetland subset for which functional (ABRicate CARD/VFDB) profiles were available, currently the German sites — virulence-factor load was higher at anthropogenically impacted than natural sites (PERMANOVA R² = 0.25, p_adj = 0.015; provisional, pending resistome/virulome profiling of the remaining sites). Both datasets also exercised edge cases absent from the chicken cohorts — a single-group resistome/mobilome in the hospital cohort (tap water carried essentially no ARGs) and an absence of plasmid replicons in the wetland water (PlasmidFinder), consistent with the source study — which the pipeline handled by skipping the affected sub-analyses with logged notices rather than failing. As these datasets lack hand-curated ground-truth artefacts, they demonstrate portability and robustness across sample types rather than output-for-output correctness.</w:t>
+        </w:r>
+      </w:ins>
+    </w:p>
+    <w:p>
+      <w:pPr>
+        <w:spacing w:after="120"/>
+      </w:pPr>
+      <w:ins w:id="10577" w:author="Revision merge (HM+PL)" w:date="2026-09-07T16:18:28Z">
         <w:r>
           <w:t xml:space="preserve">**Table S1.** MERIDIAN applied across four long-read metagenomic cohorts spanning the One Health continuum. B1/B2 are the poultry development cohorts; the Egyptian hospital-wastewater and East Atlantic Flyway wetland cohorts are independent public datasets analysed with configuration changes only.</w:t>
         </w:r>
@@ -4223,7 +4223,7 @@
       <w:pPr>
         <w:spacing w:after="120"/>
       </w:pPr>
-      <w:ins w:id="10578" w:author="Revision merge (HM+PL)" w:date="2026-09-07T13:07:41Z">
+      <w:ins w:id="10578" w:author="Revision merge (HM+PL)" w:date="2026-09-07T16:18:28Z">
         <w:r>
           <w:t xml:space="preserve">| Cohort | One Health axis | n | Primary contrast | Runtime | Peak RAM | Headline result |</w:t>
         </w:r>
@@ -4233,7 +4233,7 @@
       <w:pPr>
         <w:spacing w:after="120"/>
       </w:pPr>
-      <w:ins w:id="10579" w:author="Revision merge (HM+PL)" w:date="2026-09-07T13:07:41Z">
+      <w:ins w:id="10579" w:author="Revision merge (HM+PL)" w:date="2026-09-07T16:18:28Z">
         <w:r>
           <w:t xml:space="preserve">| --- | --- | --- | --- | --- | --- | --- |</w:t>
         </w:r>
@@ -4243,7 +4243,7 @@
       <w:pPr>
         <w:spacing w:after="120"/>
       </w:pPr>
-      <w:ins w:id="10580" w:author="Revision merge (HM+PL)" w:date="2026-09-07T13:07:41Z">
+      <w:ins w:id="10580" w:author="Revision merge (HM+PL)" w:date="2026-09-07T16:18:28Z">
         <w:r>
           <w:t xml:space="preserve">| Chicken batch 1 | Livestock (poultry caecum) | 18 | Diet (3 groups) | 6m 41s | 1.33 GB | Ground-truth reference; R/02 parsing fix recovers 110 (sample, GENE) rows |</w:t>
         </w:r>
@@ -4253,7 +4253,7 @@
       <w:pPr>
         <w:spacing w:after="120"/>
       </w:pPr>
-      <w:ins w:id="10581" w:author="Revision merge (HM+PL)" w:date="2026-09-07T13:07:41Z">
+      <w:ins w:id="10581" w:author="Revision merge (HM+PL)" w:date="2026-09-07T16:18:28Z">
         <w:r>
           <w:t xml:space="preserve">| Chicken batch 2 | Livestock (poultry caecum) | 32 | Treatment × week (4-level) | 8m 19s | 1.51 GB | Sublinear scaling; denser integrated network |</w:t>
         </w:r>
@@ -4263,7 +4263,7 @@
       <w:pPr>
         <w:spacing w:after="120"/>
       </w:pPr>
-      <w:ins w:id="10582" w:author="Revision merge (HM+PL)" w:date="2026-09-07T13:07:41Z">
+      <w:ins w:id="10582" w:author="Revision merge (HM+PL)" w:date="2026-09-07T16:18:28Z">
         <w:r>
           <w:t xml:space="preserve">| Hospital wastewater (EG) | Human-clinical + built environment | 20 | Wastewater vs tap water | 4m 08s | 1.98 GB | Wastewater richer and compositionally distinct (PERMANOVA R² = 0.18, p = 3 × 10⁻⁴) |</w:t>
         </w:r>
@@ -4273,9 +4273,9 @@
       <w:pPr>
         <w:spacing w:after="120"/>
       </w:pPr>
-      <w:ins w:id="10583" w:author="Revision merge (HM+PL)" w:date="2026-09-07T13:07:41Z">
-        <w:r>
-          <w:t xml:space="preserve">| Wetlands (E. Atlantic Flyway) | Wildlife + environment | 24 | Impacted vs natural | 5m 54s | 3.46 GB | Higher virulome load at impacted sites (PERMANOVA R² = 0.25, p_adj = 0.015) |</w:t>
+      <w:ins w:id="10583" w:author="Revision merge (HM+PL)" w:date="2026-09-07T16:18:28Z">
+        <w:r>
+          <w:t xml:space="preserve">| Wetlands (E. Atlantic Flyway) | Wildlife + environment | 24 | Impacted vs natural | 5m 54s | 3.46 GB | Higher virulome load at impacted sites (R² = 0.25, p_adj = 0.015; German subset, provisional) |</w:t>
         </w:r>
       </w:ins>
     </w:p>
@@ -4301,12 +4301,12 @@
       <w:r>
         <w:t xml:space="preserve">MERIDIAN </w:t>
       </w:r>
-      <w:del w:id="10584" w:author="Revision merge (HM+PL)" w:date="2026-09-07T13:07:41Z">
+      <w:del w:id="10584" w:author="Revision merge (HM+PL)" w:date="2026-09-07T16:18:28Z">
         <w:r>
           <w:delText xml:space="preserve">consolidates</w:delText>
         </w:r>
       </w:del>
-      <w:ins w:id="10585" w:author="Revision merge (HM+PL)" w:date="2026-09-07T13:07:41Z">
+      <w:ins w:id="10585" w:author="Revision merge (HM+PL)" w:date="2026-09-07T16:18:28Z">
         <w:r>
           <w:t xml:space="preserve">integrates</w:t>
         </w:r>
@@ -4314,12 +4314,12 @@
       <w:r>
         <w:t xml:space="preserve"> community analyses, functional profiling, and an integrated network reconstruction into </w:t>
       </w:r>
-      <w:del w:id="10586" w:author="Revision merge (HM+PL)" w:date="2026-09-07T13:07:41Z">
+      <w:del w:id="10586" w:author="Revision merge (HM+PL)" w:date="2026-09-07T16:18:28Z">
         <w:r>
           <w:delText xml:space="preserve">one</w:delText>
         </w:r>
       </w:del>
-      <w:ins w:id="10587" w:author="Revision merge (HM+PL)" w:date="2026-09-07T13:07:41Z">
+      <w:ins w:id="10587" w:author="Revision merge (HM+PL)" w:date="2026-09-07T16:18:28Z">
         <w:r>
           <w:t xml:space="preserve">a single</w:t>
         </w:r>
@@ -4327,12 +4327,12 @@
       <w:r>
         <w:t xml:space="preserve"> configuration-driven R </w:t>
       </w:r>
-      <w:del w:id="10588" w:author="Revision merge (HM+PL)" w:date="2026-09-07T13:07:41Z">
+      <w:del w:id="10588" w:author="Revision merge (HM+PL)" w:date="2026-09-07T16:18:28Z">
         <w:r>
           <w:delText xml:space="preserve">project</w:delText>
         </w:r>
       </w:del>
-      <w:ins w:id="10589" w:author="Revision merge (HM+PL)" w:date="2026-09-07T13:07:41Z">
+      <w:ins w:id="10589" w:author="Revision merge (HM+PL)" w:date="2026-09-07T16:18:28Z">
         <w:r>
           <w:t xml:space="preserve">workflow</w:t>
         </w:r>
@@ -4340,7 +4340,7 @@
       <w:r>
         <w:t xml:space="preserve"> for long-read shotgun metagenomics. Single-thread end-to-end execution completes in minutes with a low memory footprint, scaling sublinearly with cohort size and grouping complexity. </w:t>
       </w:r>
-      <w:ins w:id="10590" w:author="Revision merge (HM+PL)" w:date="2026-09-07T13:07:41Z">
+      <w:ins w:id="10590" w:author="Revision merge (HM+PL)" w:date="2026-09-07T16:18:28Z">
         <w:r>
           <w:t xml:space="preserve">Beyond the development cohorts, it has been applied without modification to two independent public cohorts spanning the One Health continuum (hospital wastewater and wetland surveillance). </w:t>
         </w:r>
@@ -4348,12 +4348,12 @@
       <w:r>
         <w:t xml:space="preserve">It is </w:t>
       </w:r>
-      <w:del w:id="10591" w:author="Revision merge (HM+PL)" w:date="2026-09-07T13:07:41Z">
+      <w:del w:id="10591" w:author="Revision merge (HM+PL)" w:date="2026-09-07T16:18:28Z">
         <w:r>
           <w:delText xml:space="preserve">in</w:delText>
         </w:r>
       </w:del>
-      <w:ins w:id="10592" w:author="Revision merge (HM+PL)" w:date="2026-09-07T13:07:41Z">
+      <w:ins w:id="10592" w:author="Revision merge (HM+PL)" w:date="2026-09-07T16:18:28Z">
         <w:r>
           <w:t xml:space="preserve">currently under</w:t>
         </w:r>
@@ -4361,12 +4361,12 @@
       <w:r>
         <w:t xml:space="preserve"> active </w:t>
       </w:r>
-      <w:del w:id="10593" w:author="Revision merge (HM+PL)" w:date="2026-09-07T13:07:41Z">
+      <w:del w:id="10593" w:author="Revision merge (HM+PL)" w:date="2026-09-07T16:18:28Z">
         <w:r>
           <w:delText xml:space="preserve">development;</w:delText>
         </w:r>
       </w:del>
-      <w:ins w:id="10594" w:author="Revision merge (HM+PL)" w:date="2026-09-07T13:07:41Z">
+      <w:ins w:id="10594" w:author="Revision merge (HM+PL)" w:date="2026-09-07T16:18:28Z">
         <w:r>
           <w:t xml:space="preserve">development, and</w:t>
         </w:r>
@@ -4374,12 +4374,12 @@
       <w:r>
         <w:t xml:space="preserve"> we are releasing this </w:t>
       </w:r>
-      <w:del w:id="10595" w:author="Revision merge (HM+PL)" w:date="2026-09-07T13:07:41Z">
+      <w:del w:id="10595" w:author="Revision merge (HM+PL)" w:date="2026-09-07T16:18:28Z">
         <w:r>
           <w:delText xml:space="preserve">alpha-stage</w:delText>
         </w:r>
       </w:del>
-      <w:ins w:id="10596" w:author="Revision merge (HM+PL)" w:date="2026-09-07T13:07:41Z">
+      <w:ins w:id="10596" w:author="Revision merge (HM+PL)" w:date="2026-09-07T16:18:28Z">
         <w:r>
           <w:t xml:space="preserve">alpha</w:t>
         </w:r>
@@ -4387,12 +4387,12 @@
       <w:r>
         <w:t xml:space="preserve"> </w:t>
       </w:r>
-      <w:del w:id="10597" w:author="Revision merge (HM+PL)" w:date="2026-09-07T13:07:41Z">
+      <w:del w:id="10597" w:author="Revision merge (HM+PL)" w:date="2026-09-07T16:18:28Z">
         <w:r>
           <w:delText xml:space="preserve">workflow</w:delText>
         </w:r>
       </w:del>
-      <w:ins w:id="10598" w:author="Revision merge (HM+PL)" w:date="2026-09-07T13:07:41Z">
+      <w:ins w:id="10598" w:author="Revision merge (HM+PL)" w:date="2026-09-07T16:18:28Z">
         <w:r>
           <w:t xml:space="preserve">version</w:t>
         </w:r>
@@ -4400,7 +4400,7 @@
       <w:r>
         <w:t xml:space="preserve"> (v0.1.0) </w:t>
       </w:r>
-      <w:del w:id="10599" w:author="Revision merge (HM+PL)" w:date="2026-09-07T13:07:41Z">
+      <w:del w:id="10599" w:author="Revision merge (HM+PL)" w:date="2026-09-07T16:18:28Z">
         <w:r>
           <w:delText xml:space="preserve">now </w:delText>
         </w:r>
@@ -4408,12 +4408,12 @@
       <w:r>
         <w:t xml:space="preserve">to </w:t>
       </w:r>
-      <w:del w:id="10600" w:author="Revision merge (HM+PL)" w:date="2026-09-07T13:07:41Z">
+      <w:del w:id="10600" w:author="Revision merge (HM+PL)" w:date="2026-09-07T16:18:28Z">
         <w:r>
           <w:delText xml:space="preserve">invite</w:delText>
         </w:r>
       </w:del>
-      <w:ins w:id="10601" w:author="Revision merge (HM+PL)" w:date="2026-09-07T13:07:41Z">
+      <w:ins w:id="10601" w:author="Revision merge (HM+PL)" w:date="2026-09-07T16:18:28Z">
         <w:r>
           <w:t xml:space="preserve">solicit</w:t>
         </w:r>
@@ -4421,12 +4421,12 @@
       <w:r>
         <w:t xml:space="preserve"> feedback from </w:t>
       </w:r>
-      <w:del w:id="10602" w:author="Revision merge (HM+PL)" w:date="2026-09-07T13:07:41Z">
+      <w:del w:id="10602" w:author="Revision merge (HM+PL)" w:date="2026-09-07T16:18:28Z">
         <w:r>
           <w:delText xml:space="preserve">groups</w:delText>
         </w:r>
       </w:del>
-      <w:ins w:id="10603" w:author="Revision merge (HM+PL)" w:date="2026-09-07T13:07:41Z">
+      <w:ins w:id="10603" w:author="Revision merge (HM+PL)" w:date="2026-09-07T16:18:28Z">
         <w:r>
           <w:t xml:space="preserve">researchers</w:t>
         </w:r>
@@ -4434,12 +4434,12 @@
       <w:r>
         <w:t xml:space="preserve"> </w:t>
       </w:r>
-      <w:del w:id="10604" w:author="Revision merge (HM+PL)" w:date="2026-09-07T13:07:41Z">
+      <w:del w:id="10604" w:author="Revision merge (HM+PL)" w:date="2026-09-07T16:18:28Z">
         <w:r>
           <w:delText xml:space="preserve">running</w:delText>
         </w:r>
       </w:del>
-      <w:ins w:id="10605" w:author="Revision merge (HM+PL)" w:date="2026-09-07T13:07:41Z">
+      <w:ins w:id="10605" w:author="Revision merge (HM+PL)" w:date="2026-09-07T16:18:28Z">
         <w:r>
           <w:t xml:space="preserve">conducting</w:t>
         </w:r>
@@ -4447,12 +4447,12 @@
       <w:r>
         <w:t xml:space="preserve"> comparable </w:t>
       </w:r>
-      <w:del w:id="10606" w:author="Revision merge (HM+PL)" w:date="2026-09-07T13:07:41Z">
+      <w:del w:id="10606" w:author="Revision merge (HM+PL)" w:date="2026-09-07T16:18:28Z">
         <w:r>
           <w:delText xml:space="preserve">analyses.</w:delText>
         </w:r>
       </w:del>
-      <w:ins w:id="10607" w:author="Revision merge (HM+PL)" w:date="2026-09-07T13:07:41Z">
+      <w:ins w:id="10607" w:author="Revision merge (HM+PL)" w:date="2026-09-07T16:18:28Z">
         <w:r>
           <w:t xml:space="preserve">long-read metagenomic studies and to guide future development of the workflow.</w:t>
         </w:r>
@@ -4472,12 +4472,12 @@
       <w:r>
         <w:t xml:space="preserve">**Acknowledgements.** The authors thank the **Centre for Innovation in Genomics and Microbiome Sciences (CIGMiS)**, which generated the chicken caecum metagenomics datasets used to develop and validate the pipeline. We are grateful to **colleagues** for feedback on the configuration interface and Quarto report layout, and to the School of </w:t>
       </w:r>
-      <w:del w:id="10608" w:author="Revision merge (HM+PL)" w:date="2026-09-07T13:07:41Z">
+      <w:del w:id="10608" w:author="Revision merge (HM+PL)" w:date="2026-09-07T16:18:28Z">
         <w:r>
           <w:delText xml:space="preserve">Biomedical</w:delText>
         </w:r>
       </w:del>
-      <w:ins w:id="10609" w:author="Revision merge (HM+PL)" w:date="2026-09-07T13:07:41Z">
+      <w:ins w:id="10609" w:author="Revision merge (HM+PL)" w:date="2026-09-07T16:18:28Z">
         <w:r>
           <w:t xml:space="preserve">Medicine</w:t>
         </w:r>
@@ -4485,12 +4485,12 @@
       <w:r>
         <w:t xml:space="preserve"> </w:t>
       </w:r>
-      <w:del w:id="10610" w:author="Revision merge (HM+PL)" w:date="2026-09-07T13:07:41Z">
+      <w:del w:id="10610" w:author="Revision merge (HM+PL)" w:date="2026-09-07T16:18:28Z">
         <w:r>
           <w:delText xml:space="preserve">Science</w:delText>
         </w:r>
       </w:del>
-      <w:ins w:id="10611" w:author="Revision merge (HM+PL)" w:date="2026-09-07T13:07:41Z">
+      <w:ins w:id="10611" w:author="Revision merge (HM+PL)" w:date="2026-09-07T16:18:28Z">
         <w:r>
           <w:t xml:space="preserve">and Bioscience</w:t>
         </w:r>
@@ -4519,7 +4519,7 @@
       <w:pPr>
         <w:spacing w:after="120"/>
       </w:pPr>
-      <w:ins w:id="10612" w:author="Revision merge (HM+PL)" w:date="2026-09-07T13:07:41Z">
+      <w:ins w:id="10612" w:author="Revision merge (HM+PL)" w:date="2026-09-07T16:18:28Z">
         <w:r>
           <w:t xml:space="preserve">**Data Availability.** Sequence data for the primary validation cohort (`Chicken batch 1`) are available from NCBI under BioProject PRJNA1406192. Data for the second cohort (`Chicken batch 2`) will be released upon publication of the associated study. The MERIDIAN source code, documentation and configuration examples are available at https://github.com/Julio92-C/Metagenomics_pipeline_automation (release v0.1.0).</w:t>
         </w:r>

</xml_diff>

<commit_message>
docs(manuscript): refresh tracked-changes docx with O3 scoping
Regenerate applications_note_merged_tracked.docx from the current .md so the
redline reflects the German-subset scoping of the wetlands virulome claim and
the corrected mobilome wording. 320 insertions / 292 deletions vs v0.1.0.

Co-Authored-By: Claude Opus 4.8 <noreply@anthropic.com>
Claude-Session: https://claude.ai/code/session_011iYU9ZmVnXfPXhgvAmJ24Q
</commit_message>
<xml_diff>
--- a/docs/manuscript/applications_note_merged_tracked.docx
+++ b/docs/manuscript/applications_note_merged_tracked.docx
@@ -32,12 +32,12 @@
       <w:r>
         <w:t xml:space="preserve">Julio C. Ortega Cambara&lt;sup&gt;1&lt;/sup&gt;, Piotr </w:t>
       </w:r>
-      <w:del w:id="10001" w:author="Revision merge (HM+PL)" w:date="2026-09-07T16:18:28Z">
+      <w:del w:id="10001" w:author="Revision merge (HM+PL)" w:date="2026-09-09T12:54:58Z">
         <w:r>
           <w:delText xml:space="preserve">Cuber&lt;sup&gt;4&lt;/sup&gt;,</w:delText>
         </w:r>
       </w:del>
-      <w:ins w:id="10002" w:author="Revision merge (HM+PL)" w:date="2026-09-07T16:18:28Z">
+      <w:ins w:id="10002" w:author="Revision merge (HM+PL)" w:date="2026-09-09T12:54:58Z">
         <w:r>
           <w:t xml:space="preserve">Cuber&lt;sup&gt;2&lt;/sup&gt;,</w:t>
         </w:r>
@@ -45,7 +45,7 @@
       <w:r>
         <w:t xml:space="preserve"> Pedro Humberto Lebre&lt;sup&gt;1&lt;/sup&gt;, </w:t>
       </w:r>
-      <w:del w:id="10003" w:author="Revision merge (HM+PL)" w:date="2026-09-07T16:18:28Z">
+      <w:del w:id="10003" w:author="Revision merge (HM+PL)" w:date="2026-09-09T12:54:58Z">
         <w:r>
           <w:delText xml:space="preserve">Raju Misra&lt;sup&gt;2&lt;/sup&gt;, Timothy D. McHugh&lt;sup&gt;3&lt;/sup&gt;, Sylvia Rofael&lt;sup&gt;3&lt;/sup&gt;, David Lowe&lt;sup&gt;3&lt;/sup&gt;, </w:delText>
         </w:r>
@@ -53,7 +53,7 @@
       <w:r>
         <w:t xml:space="preserve">Hermine </w:t>
       </w:r>
-      <w:ins w:id="10004" w:author="Revision merge (HM+PL)" w:date="2026-09-07T16:18:28Z">
+      <w:ins w:id="10004" w:author="Revision merge (HM+PL)" w:date="2026-09-09T12:54:58Z">
         <w:r>
           <w:t xml:space="preserve">V </w:t>
         </w:r>
@@ -66,12 +66,12 @@
       <w:pPr>
         <w:spacing w:after="120"/>
       </w:pPr>
-      <w:del w:id="10005" w:author="Revision merge (HM+PL)" w:date="2026-09-07T16:18:28Z">
+      <w:del w:id="10005" w:author="Revision merge (HM+PL)" w:date="2026-09-09T12:54:58Z">
         <w:r>
           <w:delText xml:space="preserve">&lt;sup&gt;1&lt;/sup&gt;School</w:delText>
         </w:r>
       </w:del>
-      <w:ins w:id="10006" w:author="Revision merge (HM+PL)" w:date="2026-09-07T16:18:28Z">
+      <w:ins w:id="10006" w:author="Revision merge (HM+PL)" w:date="2026-09-09T12:54:58Z">
         <w:r>
           <w:t xml:space="preserve">&lt;sup&gt;1&lt;/sup&gt;Centre for Innovation in Genomics and Microbiome Sciences, School</w:t>
         </w:r>
@@ -79,12 +79,12 @@
       <w:r>
         <w:t xml:space="preserve"> of </w:t>
       </w:r>
-      <w:del w:id="10007" w:author="Revision merge (HM+PL)" w:date="2026-09-07T16:18:28Z">
+      <w:del w:id="10007" w:author="Revision merge (HM+PL)" w:date="2026-09-09T12:54:58Z">
         <w:r>
           <w:delText xml:space="preserve">Biomedical</w:delText>
         </w:r>
       </w:del>
-      <w:ins w:id="10008" w:author="Revision merge (HM+PL)" w:date="2026-09-07T16:18:28Z">
+      <w:ins w:id="10008" w:author="Revision merge (HM+PL)" w:date="2026-09-09T12:54:58Z">
         <w:r>
           <w:t xml:space="preserve">Medicine</w:t>
         </w:r>
@@ -92,12 +92,12 @@
       <w:r>
         <w:t xml:space="preserve"> </w:t>
       </w:r>
-      <w:del w:id="10009" w:author="Revision merge (HM+PL)" w:date="2026-09-07T16:18:28Z">
+      <w:del w:id="10009" w:author="Revision merge (HM+PL)" w:date="2026-09-09T12:54:58Z">
         <w:r>
           <w:delText xml:space="preserve">Science,</w:delText>
         </w:r>
       </w:del>
-      <w:ins w:id="10010" w:author="Revision merge (HM+PL)" w:date="2026-09-07T16:18:28Z">
+      <w:ins w:id="10010" w:author="Revision merge (HM+PL)" w:date="2026-09-09T12:54:58Z">
         <w:r>
           <w:t xml:space="preserve">and Bioscience,</w:t>
         </w:r>
@@ -105,12 +105,12 @@
       <w:r>
         <w:t xml:space="preserve"> University of West London, London, United Kingdom </w:t>
       </w:r>
-      <w:del w:id="10011" w:author="Revision merge (HM+PL)" w:date="2026-09-07T16:18:28Z">
+      <w:del w:id="10011" w:author="Revision merge (HM+PL)" w:date="2026-09-09T12:54:58Z">
         <w:r>
           <w:delText xml:space="preserve">&lt;sup&gt;2&lt;/sup&gt;UK Health Security Agency, London, United Kingdom &lt;sup&gt;3&lt;/sup&gt;Centre for Clinical Microbiology, University College London, London, United Kingdom &lt;sup&gt;4&lt;/sup&gt;Natural</w:delText>
         </w:r>
       </w:del>
-      <w:ins w:id="10012" w:author="Revision merge (HM+PL)" w:date="2026-09-07T16:18:28Z">
+      <w:ins w:id="10012" w:author="Revision merge (HM+PL)" w:date="2026-09-09T12:54:58Z">
         <w:r>
           <w:t xml:space="preserve">&lt;sup&gt;2&lt;/sup&gt;Natural</w:t>
         </w:r>
@@ -161,12 +161,12 @@
       <w:pPr>
         <w:spacing w:after="120"/>
       </w:pPr>
-      <w:del w:id="10013" w:author="Revision merge (HM+PL)" w:date="2026-09-07T16:18:28Z">
+      <w:del w:id="10013" w:author="Revision merge (HM+PL)" w:date="2026-09-09T12:54:58Z">
         <w:r>
           <w:delText xml:space="preserve">**Motivation.**</w:delText>
         </w:r>
       </w:del>
-      <w:ins w:id="10014" w:author="Revision merge (HM+PL)" w:date="2026-09-07T16:18:28Z">
+      <w:ins w:id="10014" w:author="Revision merge (HM+PL)" w:date="2026-09-09T12:54:58Z">
         <w:r>
           <w:t xml:space="preserve">**Background:**</w:t>
         </w:r>
@@ -174,12 +174,12 @@
       <w:r>
         <w:t xml:space="preserve"> Long-read shotgun metagenomics studies are </w:t>
       </w:r>
-      <w:del w:id="10015" w:author="Revision merge (HM+PL)" w:date="2026-09-07T16:18:28Z">
+      <w:del w:id="10015" w:author="Revision merge (HM+PL)" w:date="2026-09-09T12:54:58Z">
         <w:r>
           <w:delText xml:space="preserve">typically</w:delText>
         </w:r>
       </w:del>
-      <w:ins w:id="10016" w:author="Revision merge (HM+PL)" w:date="2026-09-07T16:18:28Z">
+      <w:ins w:id="10016" w:author="Revision merge (HM+PL)" w:date="2026-09-09T12:54:58Z">
         <w:r>
           <w:t xml:space="preserve">often</w:t>
         </w:r>
@@ -187,12 +187,12 @@
       <w:r>
         <w:t xml:space="preserve"> analysed </w:t>
       </w:r>
-      <w:del w:id="10017" w:author="Revision merge (HM+PL)" w:date="2026-09-07T16:18:28Z">
+      <w:del w:id="10017" w:author="Revision merge (HM+PL)" w:date="2026-09-09T12:54:58Z">
         <w:r>
           <w:delText xml:space="preserve">by</w:delText>
         </w:r>
       </w:del>
-      <w:ins w:id="10018" w:author="Revision merge (HM+PL)" w:date="2026-09-07T16:18:28Z">
+      <w:ins w:id="10018" w:author="Revision merge (HM+PL)" w:date="2026-09-09T12:54:58Z">
         <w:r>
           <w:t xml:space="preserve">using</w:t>
         </w:r>
@@ -200,12 +200,12 @@
       <w:r>
         <w:t xml:space="preserve"> </w:t>
       </w:r>
-      <w:del w:id="10019" w:author="Revision merge (HM+PL)" w:date="2026-09-07T16:18:28Z">
+      <w:del w:id="10019" w:author="Revision merge (HM+PL)" w:date="2026-09-09T12:54:58Z">
         <w:r>
           <w:delText xml:space="preserve">hand-editing</w:delText>
         </w:r>
       </w:del>
-      <w:ins w:id="10020" w:author="Revision merge (HM+PL)" w:date="2026-09-07T16:18:28Z">
+      <w:ins w:id="10020" w:author="Revision merge (HM+PL)" w:date="2026-09-09T12:54:58Z">
         <w:r>
           <w:t xml:space="preserve">project-specific</w:t>
         </w:r>
@@ -213,12 +213,12 @@
       <w:r>
         <w:t xml:space="preserve"> </w:t>
       </w:r>
-      <w:del w:id="10021" w:author="Revision merge (HM+PL)" w:date="2026-09-07T16:18:28Z">
+      <w:del w:id="10021" w:author="Revision merge (HM+PL)" w:date="2026-09-09T12:54:58Z">
         <w:r>
           <w:delText xml:space="preserve">dozens</w:delText>
         </w:r>
       </w:del>
-      <w:ins w:id="10022" w:author="Revision merge (HM+PL)" w:date="2026-09-07T16:18:28Z">
+      <w:ins w:id="10022" w:author="Revision merge (HM+PL)" w:date="2026-09-09T12:54:58Z">
         <w:r>
           <w:t xml:space="preserve">collections</w:t>
         </w:r>
@@ -226,7 +226,7 @@
       <w:r>
         <w:t xml:space="preserve"> of </w:t>
       </w:r>
-      <w:ins w:id="10023" w:author="Revision merge (HM+PL)" w:date="2026-09-07T16:18:28Z">
+      <w:ins w:id="10023" w:author="Revision merge (HM+PL)" w:date="2026-09-09T12:54:58Z">
         <w:r>
           <w:t xml:space="preserve">manually edited </w:t>
         </w:r>
@@ -234,12 +234,12 @@
       <w:r>
         <w:t xml:space="preserve">R </w:t>
       </w:r>
-      <w:del w:id="10024" w:author="Revision merge (HM+PL)" w:date="2026-09-07T16:18:28Z">
+      <w:del w:id="10024" w:author="Revision merge (HM+PL)" w:date="2026-09-09T12:54:58Z">
         <w:r>
           <w:delText xml:space="preserve">scripts</w:delText>
         </w:r>
       </w:del>
-      <w:ins w:id="10025" w:author="Revision merge (HM+PL)" w:date="2026-09-07T16:18:28Z">
+      <w:ins w:id="10025" w:author="Revision merge (HM+PL)" w:date="2026-09-09T12:54:58Z">
         <w:r>
           <w:t xml:space="preserve">scripts,</w:t>
         </w:r>
@@ -247,12 +247,12 @@
       <w:r>
         <w:t xml:space="preserve"> </w:t>
       </w:r>
-      <w:del w:id="10026" w:author="Revision merge (HM+PL)" w:date="2026-09-07T16:18:28Z">
+      <w:del w:id="10026" w:author="Revision merge (HM+PL)" w:date="2026-09-09T12:54:58Z">
         <w:r>
           <w:delText xml:space="preserve">per</w:delText>
         </w:r>
       </w:del>
-      <w:ins w:id="10027" w:author="Revision merge (HM+PL)" w:date="2026-09-07T16:18:28Z">
+      <w:ins w:id="10027" w:author="Revision merge (HM+PL)" w:date="2026-09-09T12:54:58Z">
         <w:r>
           <w:t xml:space="preserve">requiring</w:t>
         </w:r>
@@ -260,12 +260,12 @@
       <w:r>
         <w:t xml:space="preserve"> </w:t>
       </w:r>
-      <w:del w:id="10028" w:author="Revision merge (HM+PL)" w:date="2026-09-07T16:18:28Z">
+      <w:del w:id="10028" w:author="Revision merge (HM+PL)" w:date="2026-09-09T12:54:58Z">
         <w:r>
           <w:delText xml:space="preserve">project</w:delText>
         </w:r>
       </w:del>
-      <w:ins w:id="10029" w:author="Revision merge (HM+PL)" w:date="2026-09-07T16:18:28Z">
+      <w:ins w:id="10029" w:author="Revision merge (HM+PL)" w:date="2026-09-09T12:54:58Z">
         <w:r>
           <w:t xml:space="preserve">repeated</w:t>
         </w:r>
@@ -273,12 +273,12 @@
       <w:r>
         <w:t xml:space="preserve"> </w:t>
       </w:r>
-      <w:del w:id="10030" w:author="Revision merge (HM+PL)" w:date="2026-09-07T16:18:28Z">
+      <w:del w:id="10030" w:author="Revision merge (HM+PL)" w:date="2026-09-09T12:54:58Z">
         <w:r>
           <w:delText xml:space="preserve">—</w:delText>
         </w:r>
       </w:del>
-      <w:ins w:id="10031" w:author="Revision merge (HM+PL)" w:date="2026-09-07T16:18:28Z">
+      <w:ins w:id="10031" w:author="Revision merge (HM+PL)" w:date="2026-09-09T12:54:58Z">
         <w:r>
           <w:t xml:space="preserve">modifications</w:t>
         </w:r>
@@ -286,12 +286,12 @@
       <w:r>
         <w:t xml:space="preserve"> </w:t>
       </w:r>
-      <w:del w:id="10032" w:author="Revision merge (HM+PL)" w:date="2026-09-07T16:18:28Z">
+      <w:del w:id="10032" w:author="Revision merge (HM+PL)" w:date="2026-09-09T12:54:58Z">
         <w:r>
           <w:delText xml:space="preserve">pasting</w:delText>
         </w:r>
       </w:del>
-      <w:ins w:id="10033" w:author="Revision merge (HM+PL)" w:date="2026-09-07T16:18:28Z">
+      <w:ins w:id="10033" w:author="Revision merge (HM+PL)" w:date="2026-09-09T12:54:58Z">
         <w:r>
           <w:t xml:space="preserve">of</w:t>
         </w:r>
@@ -299,12 +299,12 @@
       <w:r>
         <w:t xml:space="preserve"> sample identifiers, </w:t>
       </w:r>
-      <w:del w:id="10034" w:author="Revision merge (HM+PL)" w:date="2026-09-07T16:18:28Z">
+      <w:del w:id="10034" w:author="Revision merge (HM+PL)" w:date="2026-09-09T12:54:58Z">
         <w:r>
           <w:delText xml:space="preserve">patching</w:delText>
         </w:r>
       </w:del>
-      <w:ins w:id="10035" w:author="Revision merge (HM+PL)" w:date="2026-09-07T16:18:28Z">
+      <w:ins w:id="10035" w:author="Revision merge (HM+PL)" w:date="2026-09-09T12:54:58Z">
         <w:r>
           <w:t xml:space="preserve">taxonomic</w:t>
         </w:r>
@@ -312,12 +312,12 @@
       <w:r>
         <w:t xml:space="preserve"> </w:t>
       </w:r>
-      <w:del w:id="10036" w:author="Revision merge (HM+PL)" w:date="2026-09-07T16:18:28Z">
+      <w:del w:id="10036" w:author="Revision merge (HM+PL)" w:date="2026-09-09T12:54:58Z">
         <w:r>
           <w:delText xml:space="preserve">taxonomy strings</w:delText>
         </w:r>
       </w:del>
-      <w:ins w:id="10037" w:author="Revision merge (HM+PL)" w:date="2026-09-07T16:18:28Z">
+      <w:ins w:id="10037" w:author="Revision merge (HM+PL)" w:date="2026-09-09T12:54:58Z">
         <w:r>
           <w:t xml:space="preserve">annotations</w:t>
         </w:r>
@@ -325,12 +325,12 @@
       <w:r>
         <w:t xml:space="preserve"> and </w:t>
       </w:r>
-      <w:del w:id="10038" w:author="Revision merge (HM+PL)" w:date="2026-09-07T16:18:28Z">
+      <w:del w:id="10038" w:author="Revision merge (HM+PL)" w:date="2026-09-09T12:54:58Z">
         <w:r>
           <w:delText xml:space="preserve">copying</w:delText>
         </w:r>
       </w:del>
-      <w:ins w:id="10039" w:author="Revision merge (HM+PL)" w:date="2026-09-07T16:18:28Z">
+      <w:ins w:id="10039" w:author="Revision merge (HM+PL)" w:date="2026-09-09T12:54:58Z">
         <w:r>
           <w:t xml:space="preserve">analysis</w:t>
         </w:r>
@@ -338,12 +338,12 @@
       <w:r>
         <w:t xml:space="preserve"> </w:t>
       </w:r>
-      <w:del w:id="10040" w:author="Revision merge (HM+PL)" w:date="2026-09-07T16:18:28Z">
+      <w:del w:id="10040" w:author="Revision merge (HM+PL)" w:date="2026-09-09T12:54:58Z">
         <w:r>
           <w:delText xml:space="preserve">chunks</w:delText>
         </w:r>
       </w:del>
-      <w:ins w:id="10041" w:author="Revision merge (HM+PL)" w:date="2026-09-07T16:18:28Z">
+      <w:ins w:id="10041" w:author="Revision merge (HM+PL)" w:date="2026-09-09T12:54:58Z">
         <w:r>
           <w:t xml:space="preserve">parameters,</w:t>
         </w:r>
@@ -351,12 +351,12 @@
       <w:r>
         <w:t xml:space="preserve"> </w:t>
       </w:r>
-      <w:del w:id="10042" w:author="Revision merge (HM+PL)" w:date="2026-09-07T16:18:28Z">
+      <w:del w:id="10042" w:author="Revision merge (HM+PL)" w:date="2026-09-09T12:54:58Z">
         <w:r>
           <w:delText xml:space="preserve">between</w:delText>
         </w:r>
       </w:del>
-      <w:ins w:id="10043" w:author="Revision merge (HM+PL)" w:date="2026-09-07T16:18:28Z">
+      <w:ins w:id="10043" w:author="Revision merge (HM+PL)" w:date="2026-09-09T12:54:58Z">
         <w:r>
           <w:t xml:space="preserve">or</w:t>
         </w:r>
@@ -364,12 +364,12 @@
       <w:r>
         <w:t xml:space="preserve"> </w:t>
       </w:r>
-      <w:del w:id="10044" w:author="Revision merge (HM+PL)" w:date="2026-09-07T16:18:28Z">
+      <w:del w:id="10044" w:author="Revision merge (HM+PL)" w:date="2026-09-09T12:54:58Z">
         <w:r>
           <w:delText xml:space="preserve">studies.</w:delText>
         </w:r>
       </w:del>
-      <w:ins w:id="10045" w:author="Revision merge (HM+PL)" w:date="2026-09-07T16:18:28Z">
+      <w:ins w:id="10045" w:author="Revision merge (HM+PL)" w:date="2026-09-09T12:54:58Z">
         <w:r>
           <w:t xml:space="preserve">else rely on resource-heavy pipelines that require access to high-performance computing (HPC) infrastructure.</w:t>
         </w:r>
@@ -377,12 +377,12 @@
       <w:r>
         <w:t xml:space="preserve"> Existing R workflows </w:t>
       </w:r>
-      <w:del w:id="10046" w:author="Revision merge (HM+PL)" w:date="2026-09-07T16:18:28Z">
+      <w:del w:id="10046" w:author="Revision merge (HM+PL)" w:date="2026-09-09T12:54:58Z">
         <w:r>
           <w:delText xml:space="preserve">largely</w:delText>
         </w:r>
       </w:del>
-      <w:ins w:id="10047" w:author="Revision merge (HM+PL)" w:date="2026-09-07T16:18:28Z">
+      <w:ins w:id="10047" w:author="Revision merge (HM+PL)" w:date="2026-09-09T12:54:58Z">
         <w:r>
           <w:t xml:space="preserve">predominantly</w:t>
         </w:r>
@@ -390,12 +390,12 @@
       <w:r>
         <w:t xml:space="preserve"> </w:t>
       </w:r>
-      <w:del w:id="10048" w:author="Revision merge (HM+PL)" w:date="2026-09-07T16:18:28Z">
+      <w:del w:id="10048" w:author="Revision merge (HM+PL)" w:date="2026-09-09T12:54:58Z">
         <w:r>
           <w:delText xml:space="preserve">target</w:delText>
         </w:r>
       </w:del>
-      <w:ins w:id="10049" w:author="Revision merge (HM+PL)" w:date="2026-09-07T16:18:28Z">
+      <w:ins w:id="10049" w:author="Revision merge (HM+PL)" w:date="2026-09-09T12:54:58Z">
         <w:r>
           <w:t xml:space="preserve">focus on</w:t>
         </w:r>
@@ -403,12 +403,12 @@
       <w:r>
         <w:t xml:space="preserve"> short-read amplicon data or </w:t>
       </w:r>
-      <w:del w:id="10050" w:author="Revision merge (HM+PL)" w:date="2026-09-07T16:18:28Z">
+      <w:del w:id="10050" w:author="Revision merge (HM+PL)" w:date="2026-09-09T12:54:58Z">
         <w:r>
           <w:delText xml:space="preserve">a</w:delText>
         </w:r>
       </w:del>
-      <w:ins w:id="10051" w:author="Revision merge (HM+PL)" w:date="2026-09-07T16:18:28Z">
+      <w:ins w:id="10051" w:author="Revision merge (HM+PL)" w:date="2026-09-09T12:54:58Z">
         <w:r>
           <w:t xml:space="preserve">isolated</w:t>
         </w:r>
@@ -416,12 +416,12 @@
       <w:r>
         <w:t xml:space="preserve"> </w:t>
       </w:r>
-      <w:del w:id="10052" w:author="Revision merge (HM+PL)" w:date="2026-09-07T16:18:28Z">
+      <w:del w:id="10052" w:author="Revision merge (HM+PL)" w:date="2026-09-09T12:54:58Z">
         <w:r>
           <w:delText xml:space="preserve">single</w:delText>
         </w:r>
       </w:del>
-      <w:ins w:id="10053" w:author="Revision merge (HM+PL)" w:date="2026-09-07T16:18:28Z">
+      <w:ins w:id="10053" w:author="Revision merge (HM+PL)" w:date="2026-09-09T12:54:58Z">
         <w:r>
           <w:t xml:space="preserve">analytical</w:t>
         </w:r>
@@ -429,12 +429,12 @@
       <w:r>
         <w:t xml:space="preserve"> </w:t>
       </w:r>
-      <w:del w:id="10054" w:author="Revision merge (HM+PL)" w:date="2026-09-07T16:18:28Z">
+      <w:del w:id="10054" w:author="Revision merge (HM+PL)" w:date="2026-09-09T12:54:58Z">
         <w:r>
           <w:delText xml:space="preserve">analysis</w:delText>
         </w:r>
       </w:del>
-      <w:ins w:id="10055" w:author="Revision merge (HM+PL)" w:date="2026-09-07T16:18:28Z">
+      <w:ins w:id="10055" w:author="Revision merge (HM+PL)" w:date="2026-09-09T12:54:58Z">
         <w:r>
           <w:t xml:space="preserve">tasks,</w:t>
         </w:r>
@@ -442,12 +442,12 @@
       <w:r>
         <w:t xml:space="preserve"> </w:t>
       </w:r>
-      <w:del w:id="10056" w:author="Revision merge (HM+PL)" w:date="2026-09-07T16:18:28Z">
+      <w:del w:id="10056" w:author="Revision merge (HM+PL)" w:date="2026-09-09T12:54:58Z">
         <w:r>
           <w:delText xml:space="preserve">(e.g.</w:delText>
         </w:r>
       </w:del>
-      <w:ins w:id="10057" w:author="Revision merge (HM+PL)" w:date="2026-09-07T16:18:28Z">
+      <w:ins w:id="10057" w:author="Revision merge (HM+PL)" w:date="2026-09-09T12:54:58Z">
         <w:r>
           <w:t xml:space="preserve">such as</w:t>
         </w:r>
@@ -455,12 +455,12 @@
       <w:r>
         <w:t xml:space="preserve"> resistome </w:t>
       </w:r>
-      <w:del w:id="10058" w:author="Revision merge (HM+PL)" w:date="2026-09-07T16:18:28Z">
+      <w:del w:id="10058" w:author="Revision merge (HM+PL)" w:date="2026-09-09T12:54:58Z">
         <w:r>
           <w:delText xml:space="preserve">risk scoring),</w:delText>
         </w:r>
       </w:del>
-      <w:ins w:id="10059" w:author="Revision merge (HM+PL)" w:date="2026-09-07T16:18:28Z">
+      <w:ins w:id="10059" w:author="Revision merge (HM+PL)" w:date="2026-09-09T12:54:58Z">
         <w:r>
           <w:t xml:space="preserve">profiling,</w:t>
         </w:r>
@@ -468,7 +468,7 @@
       <w:r>
         <w:t xml:space="preserve"> leaving</w:t>
       </w:r>
-      <w:ins w:id="10060" w:author="Revision merge (HM+PL)" w:date="2026-09-07T16:18:28Z">
+      <w:ins w:id="10060" w:author="Revision merge (HM+PL)" w:date="2026-09-09T12:54:58Z">
         <w:r>
           <w:t xml:space="preserve"> a gap in integrated, reproducible and sustainable solutions for</w:t>
         </w:r>
@@ -476,12 +476,12 @@
       <w:r>
         <w:t xml:space="preserve"> long-read shotgun </w:t>
       </w:r>
-      <w:del w:id="10061" w:author="Revision merge (HM+PL)" w:date="2026-09-07T16:18:28Z">
+      <w:del w:id="10061" w:author="Revision merge (HM+PL)" w:date="2026-09-09T12:54:58Z">
         <w:r>
           <w:delText xml:space="preserve">studies</w:delText>
         </w:r>
       </w:del>
-      <w:ins w:id="10062" w:author="Revision merge (HM+PL)" w:date="2026-09-07T16:18:28Z">
+      <w:ins w:id="10062" w:author="Revision merge (HM+PL)" w:date="2026-09-09T12:54:58Z">
         <w:r>
           <w:t xml:space="preserve">metagenomics.</w:t>
         </w:r>
@@ -489,12 +489,12 @@
       <w:r>
         <w:t xml:space="preserve"> </w:t>
       </w:r>
-      <w:del w:id="10063" w:author="Revision merge (HM+PL)" w:date="2026-09-07T16:18:28Z">
+      <w:del w:id="10063" w:author="Revision merge (HM+PL)" w:date="2026-09-09T12:54:58Z">
         <w:r>
           <w:delText xml:space="preserve">without</w:delText>
         </w:r>
       </w:del>
-      <w:ins w:id="10064" w:author="Revision merge (HM+PL)" w:date="2026-09-07T16:18:28Z">
+      <w:ins w:id="10064" w:author="Revision merge (HM+PL)" w:date="2026-09-09T12:54:58Z">
         <w:r>
           <w:t xml:space="preserve">Consequently,</w:t>
         </w:r>
@@ -502,12 +502,12 @@
       <w:r>
         <w:t xml:space="preserve"> </w:t>
       </w:r>
-      <w:del w:id="10065" w:author="Revision merge (HM+PL)" w:date="2026-09-07T16:18:28Z">
+      <w:del w:id="10065" w:author="Revision merge (HM+PL)" w:date="2026-09-09T12:54:58Z">
         <w:r>
           <w:delText xml:space="preserve">an</w:delText>
         </w:r>
       </w:del>
-      <w:ins w:id="10066" w:author="Revision merge (HM+PL)" w:date="2026-09-07T16:18:28Z">
+      <w:ins w:id="10066" w:author="Revision merge (HM+PL)" w:date="2026-09-09T12:54:58Z">
         <w:r>
           <w:t xml:space="preserve">researchers</w:t>
         </w:r>
@@ -515,12 +515,12 @@
       <w:r>
         <w:t xml:space="preserve"> </w:t>
       </w:r>
-      <w:del w:id="10067" w:author="Revision merge (HM+PL)" w:date="2026-09-07T16:18:28Z">
+      <w:del w:id="10067" w:author="Revision merge (HM+PL)" w:date="2026-09-09T12:54:58Z">
         <w:r>
           <w:delText xml:space="preserve">integrated,</w:delText>
         </w:r>
       </w:del>
-      <w:ins w:id="10068" w:author="Revision merge (HM+PL)" w:date="2026-09-07T16:18:28Z">
+      <w:ins w:id="10068" w:author="Revision merge (HM+PL)" w:date="2026-09-09T12:54:58Z">
         <w:r>
           <w:t xml:space="preserve">frequently</w:t>
         </w:r>
@@ -528,12 +528,12 @@
       <w:r>
         <w:t xml:space="preserve"> </w:t>
       </w:r>
-      <w:del w:id="10069" w:author="Revision merge (HM+PL)" w:date="2026-09-07T16:18:28Z">
+      <w:del w:id="10069" w:author="Revision merge (HM+PL)" w:date="2026-09-09T12:54:58Z">
         <w:r>
           <w:delText xml:space="preserve">configuration-driven</w:delText>
         </w:r>
       </w:del>
-      <w:ins w:id="10070" w:author="Revision merge (HM+PL)" w:date="2026-09-07T16:18:28Z">
+      <w:ins w:id="10070" w:author="Revision merge (HM+PL)" w:date="2026-09-09T12:54:58Z">
         <w:r>
           <w:t xml:space="preserve">rely</w:t>
         </w:r>
@@ -541,12 +541,12 @@
       <w:r>
         <w:t xml:space="preserve"> </w:t>
       </w:r>
-      <w:del w:id="10071" w:author="Revision merge (HM+PL)" w:date="2026-09-07T16:18:28Z">
+      <w:del w:id="10071" w:author="Revision merge (HM+PL)" w:date="2026-09-09T12:54:58Z">
         <w:r>
           <w:delText xml:space="preserve">option.</w:delText>
         </w:r>
       </w:del>
-      <w:ins w:id="10072" w:author="Revision merge (HM+PL)" w:date="2026-09-07T16:18:28Z">
+      <w:ins w:id="10072" w:author="Revision merge (HM+PL)" w:date="2026-09-09T12:54:58Z">
         <w:r>
           <w:t xml:space="preserve">on ad hoc scripting approaches that limit scalability, standardisation and reproducibility for efficient cross-study comparison.</w:t>
         </w:r>
@@ -556,12 +556,12 @@
       <w:pPr>
         <w:spacing w:after="120"/>
       </w:pPr>
-      <w:del w:id="10073" w:author="Revision merge (HM+PL)" w:date="2026-09-07T16:18:28Z">
+      <w:del w:id="10073" w:author="Revision merge (HM+PL)" w:date="2026-09-09T12:54:58Z">
         <w:r>
           <w:delText xml:space="preserve">**Results.**</w:delText>
         </w:r>
       </w:del>
-      <w:ins w:id="10074" w:author="Revision merge (HM+PL)" w:date="2026-09-07T16:18:28Z">
+      <w:ins w:id="10074" w:author="Revision merge (HM+PL)" w:date="2026-09-09T12:54:58Z">
         <w:r>
           <w:t xml:space="preserve">**Results:**</w:t>
         </w:r>
@@ -569,12 +569,12 @@
       <w:r>
         <w:t xml:space="preserve"> We present **MERIDIAN** (*Metagenomic Evaluation of Resistance, Identity &amp; Diversity through Integrated Analysis of Nanopore sequencing*), a modular R workflow </w:t>
       </w:r>
-      <w:del w:id="10075" w:author="Revision merge (HM+PL)" w:date="2026-09-07T16:18:28Z">
+      <w:del w:id="10075" w:author="Revision merge (HM+PL)" w:date="2026-09-09T12:54:58Z">
         <w:r>
           <w:delText xml:space="preserve">that</w:delText>
         </w:r>
       </w:del>
-      <w:ins w:id="10076" w:author="Revision merge (HM+PL)" w:date="2026-09-07T16:18:28Z">
+      <w:ins w:id="10076" w:author="Revision merge (HM+PL)" w:date="2026-09-09T12:54:58Z">
         <w:r>
           <w:t xml:space="preserve">designed</w:t>
         </w:r>
@@ -582,12 +582,12 @@
       <w:r>
         <w:t xml:space="preserve"> </w:t>
       </w:r>
-      <w:del w:id="10077" w:author="Revision merge (HM+PL)" w:date="2026-09-07T16:18:28Z">
+      <w:del w:id="10077" w:author="Revision merge (HM+PL)" w:date="2026-09-09T12:54:58Z">
         <w:r>
           <w:delText xml:space="preserve">consumes</w:delText>
         </w:r>
       </w:del>
-      <w:ins w:id="10078" w:author="Revision merge (HM+PL)" w:date="2026-09-07T16:18:28Z">
+      <w:ins w:id="10078" w:author="Revision merge (HM+PL)" w:date="2026-09-09T12:54:58Z">
         <w:r>
           <w:t xml:space="preserve">to standardise and automate downstream analysis of long-read metagenomic sequencing datasets. By consolidating outputs from multiple</w:t>
         </w:r>
@@ -595,12 +595,12 @@
       <w:r>
         <w:t xml:space="preserve"> bioinformatics </w:t>
       </w:r>
-      <w:del w:id="10079" w:author="Revision merge (HM+PL)" w:date="2026-09-07T16:18:28Z">
+      <w:del w:id="10079" w:author="Revision merge (HM+PL)" w:date="2026-09-09T12:54:58Z">
         <w:r>
           <w:delText xml:space="preserve">tools</w:delText>
         </w:r>
       </w:del>
-      <w:ins w:id="10080" w:author="Revision merge (HM+PL)" w:date="2026-09-07T16:18:28Z">
+      <w:ins w:id="10080" w:author="Revision merge (HM+PL)" w:date="2026-09-09T12:54:58Z">
         <w:r>
           <w:t xml:space="preserve">tools,</w:t>
         </w:r>
@@ -608,12 +608,12 @@
       <w:r>
         <w:t xml:space="preserve"> </w:t>
       </w:r>
-      <w:del w:id="10081" w:author="Revision merge (HM+PL)" w:date="2026-09-07T16:18:28Z">
+      <w:del w:id="10081" w:author="Revision merge (HM+PL)" w:date="2026-09-09T12:54:58Z">
         <w:r>
           <w:delText xml:space="preserve">outputs</w:delText>
         </w:r>
       </w:del>
-      <w:ins w:id="10082" w:author="Revision merge (HM+PL)" w:date="2026-09-07T16:18:28Z">
+      <w:ins w:id="10082" w:author="Revision merge (HM+PL)" w:date="2026-09-09T12:54:58Z">
         <w:r>
           <w:t xml:space="preserve">MERIDIAN</w:t>
         </w:r>
@@ -621,12 +621,12 @@
       <w:r>
         <w:t xml:space="preserve"> </w:t>
       </w:r>
-      <w:del w:id="10083" w:author="Revision merge (HM+PL)" w:date="2026-09-07T16:18:28Z">
+      <w:del w:id="10083" w:author="Revision merge (HM+PL)" w:date="2026-09-09T12:54:58Z">
         <w:r>
           <w:delText xml:space="preserve">and produces</w:delText>
         </w:r>
       </w:del>
-      <w:ins w:id="10084" w:author="Revision merge (HM+PL)" w:date="2026-09-07T16:18:28Z">
+      <w:ins w:id="10084" w:author="Revision merge (HM+PL)" w:date="2026-09-09T12:54:58Z">
         <w:r>
           <w:t xml:space="preserve">delivers</w:t>
         </w:r>
@@ -634,12 +634,12 @@
       <w:r>
         <w:t xml:space="preserve"> a </w:t>
       </w:r>
-      <w:del w:id="10085" w:author="Revision merge (HM+PL)" w:date="2026-09-07T16:18:28Z">
+      <w:del w:id="10085" w:author="Revision merge (HM+PL)" w:date="2026-09-09T12:54:58Z">
         <w:r>
           <w:delText xml:space="preserve">single</w:delText>
         </w:r>
       </w:del>
-      <w:ins w:id="10086" w:author="Revision merge (HM+PL)" w:date="2026-09-07T16:18:28Z">
+      <w:ins w:id="10086" w:author="Revision merge (HM+PL)" w:date="2026-09-09T12:54:58Z">
         <w:r>
           <w:t xml:space="preserve">comprehensive</w:t>
         </w:r>
@@ -647,7 +647,7 @@
       <w:r>
         <w:t xml:space="preserve"> Quarto HTML dashboard, publication-ready </w:t>
       </w:r>
-      <w:del w:id="10087" w:author="Revision merge (HM+PL)" w:date="2026-09-07T16:18:28Z">
+      <w:del w:id="10087" w:author="Revision merge (HM+PL)" w:date="2026-09-09T12:54:58Z">
         <w:r>
           <w:delText xml:space="preserve">composite </w:delText>
         </w:r>
@@ -655,7 +655,7 @@
       <w:r>
         <w:t xml:space="preserve">figures and </w:t>
       </w:r>
-      <w:del w:id="10088" w:author="Revision merge (HM+PL)" w:date="2026-09-07T16:18:28Z">
+      <w:del w:id="10088" w:author="Revision merge (HM+PL)" w:date="2026-09-09T12:54:58Z">
         <w:r>
           <w:delText xml:space="preserve">a </w:delText>
         </w:r>
@@ -663,12 +663,12 @@
       <w:r>
         <w:t xml:space="preserve">supplementary </w:t>
       </w:r>
-      <w:del w:id="10089" w:author="Revision merge (HM+PL)" w:date="2026-09-07T16:18:28Z">
+      <w:del w:id="10089" w:author="Revision merge (HM+PL)" w:date="2026-09-09T12:54:58Z">
         <w:r>
           <w:delText xml:space="preserve">tables</w:delText>
         </w:r>
       </w:del>
-      <w:ins w:id="10090" w:author="Revision merge (HM+PL)" w:date="2026-09-07T16:18:28Z">
+      <w:ins w:id="10090" w:author="Revision merge (HM+PL)" w:date="2026-09-09T12:54:58Z">
         <w:r>
           <w:t xml:space="preserve">result</w:t>
         </w:r>
@@ -676,12 +676,12 @@
       <w:r>
         <w:t xml:space="preserve"> </w:t>
       </w:r>
-      <w:del w:id="10091" w:author="Revision merge (HM+PL)" w:date="2026-09-07T16:18:28Z">
+      <w:del w:id="10091" w:author="Revision merge (HM+PL)" w:date="2026-09-09T12:54:58Z">
         <w:r>
           <w:delText xml:space="preserve">workbook.</w:delText>
         </w:r>
       </w:del>
-      <w:ins w:id="10092" w:author="Revision merge (HM+PL)" w:date="2026-09-07T16:18:28Z">
+      <w:ins w:id="10092" w:author="Revision merge (HM+PL)" w:date="2026-09-09T12:54:58Z">
         <w:r>
           <w:t xml:space="preserve">tables.</w:t>
         </w:r>
@@ -689,12 +689,12 @@
       <w:r>
         <w:t xml:space="preserve"> The workflow </w:t>
       </w:r>
-      <w:del w:id="10093" w:author="Revision merge (HM+PL)" w:date="2026-09-07T16:18:28Z">
+      <w:del w:id="10093" w:author="Revision merge (HM+PL)" w:date="2026-09-09T12:54:58Z">
         <w:r>
           <w:delText xml:space="preserve">covers</w:delText>
         </w:r>
       </w:del>
-      <w:ins w:id="10094" w:author="Revision merge (HM+PL)" w:date="2026-09-07T16:18:28Z">
+      <w:ins w:id="10094" w:author="Revision merge (HM+PL)" w:date="2026-09-09T12:54:58Z">
         <w:r>
           <w:t xml:space="preserve">supports end-to-end metagenomic characterisation, encompassing</w:t>
         </w:r>
@@ -702,12 +702,12 @@
       <w:r>
         <w:t xml:space="preserve"> decontamination, TPM normalisation, </w:t>
       </w:r>
-      <w:del w:id="10095" w:author="Revision merge (HM+PL)" w:date="2026-09-07T16:18:28Z">
+      <w:del w:id="10095" w:author="Revision merge (HM+PL)" w:date="2026-09-09T12:54:58Z">
         <w:r>
           <w:delText xml:space="preserve">taxonomy,</w:delText>
         </w:r>
       </w:del>
-      <w:ins w:id="10096" w:author="Revision merge (HM+PL)" w:date="2026-09-07T16:18:28Z">
+      <w:ins w:id="10096" w:author="Revision merge (HM+PL)" w:date="2026-09-09T12:54:58Z">
         <w:r>
           <w:t xml:space="preserve">taxonomic</w:t>
         </w:r>
@@ -715,12 +715,12 @@
       <w:r>
         <w:t xml:space="preserve"> </w:t>
       </w:r>
-      <w:del w:id="10097" w:author="Revision merge (HM+PL)" w:date="2026-09-07T16:18:28Z">
+      <w:del w:id="10097" w:author="Revision merge (HM+PL)" w:date="2026-09-09T12:54:58Z">
         <w:r>
           <w:delText xml:space="preserve">alpha/beta</w:delText>
         </w:r>
       </w:del>
-      <w:ins w:id="10098" w:author="Revision merge (HM+PL)" w:date="2026-09-07T16:18:28Z">
+      <w:ins w:id="10098" w:author="Revision merge (HM+PL)" w:date="2026-09-09T12:54:58Z">
         <w:r>
           <w:t xml:space="preserve">profiling, alpha and beta</w:t>
         </w:r>
@@ -728,7 +728,7 @@
       <w:r>
         <w:t xml:space="preserve"> diversity</w:t>
       </w:r>
-      <w:ins w:id="10099" w:author="Revision merge (HM+PL)" w:date="2026-09-07T16:18:28Z">
+      <w:ins w:id="10099" w:author="Revision merge (HM+PL)" w:date="2026-09-09T12:54:58Z">
         <w:r>
           <w:t xml:space="preserve"> analysis</w:t>
         </w:r>
@@ -736,12 +736,12 @@
       <w:r>
         <w:t xml:space="preserve"> with PERMANOVA, two-level ALDEx2 differential </w:t>
       </w:r>
-      <w:del w:id="10100" w:author="Revision merge (HM+PL)" w:date="2026-09-07T16:18:28Z">
+      <w:del w:id="10100" w:author="Revision merge (HM+PL)" w:date="2026-09-09T12:54:58Z">
         <w:r>
           <w:delText xml:space="preserve">abundance,</w:delText>
         </w:r>
       </w:del>
-      <w:ins w:id="10101" w:author="Revision merge (HM+PL)" w:date="2026-09-07T16:18:28Z">
+      <w:ins w:id="10101" w:author="Revision merge (HM+PL)" w:date="2026-09-09T12:54:58Z">
         <w:r>
           <w:t xml:space="preserve">abundance</w:t>
         </w:r>
@@ -749,12 +749,12 @@
       <w:r>
         <w:t xml:space="preserve"> </w:t>
       </w:r>
-      <w:del w:id="10102" w:author="Revision merge (HM+PL)" w:date="2026-09-07T16:18:28Z">
+      <w:del w:id="10102" w:author="Revision merge (HM+PL)" w:date="2026-09-09T12:54:58Z">
         <w:r>
           <w:delText xml:space="preserve">resistome, virulome,</w:delText>
         </w:r>
       </w:del>
-      <w:ins w:id="10103" w:author="Revision merge (HM+PL)" w:date="2026-09-07T16:18:28Z">
+      <w:ins w:id="10103" w:author="Revision merge (HM+PL)" w:date="2026-09-09T12:54:58Z">
         <w:r>
           <w:t xml:space="preserve">testing,</w:t>
         </w:r>
@@ -762,12 +762,12 @@
       <w:r>
         <w:t xml:space="preserve"> and </w:t>
       </w:r>
-      <w:del w:id="10104" w:author="Revision merge (HM+PL)" w:date="2026-09-07T16:18:28Z">
+      <w:del w:id="10104" w:author="Revision merge (HM+PL)" w:date="2026-09-09T12:54:58Z">
         <w:r>
           <w:delText xml:space="preserve">mobilome</w:delText>
         </w:r>
       </w:del>
-      <w:ins w:id="10105" w:author="Revision merge (HM+PL)" w:date="2026-09-07T16:18:28Z">
+      <w:ins w:id="10105" w:author="Revision merge (HM+PL)" w:date="2026-09-09T12:54:58Z">
         <w:r>
           <w:t xml:space="preserve">functional</w:t>
         </w:r>
@@ -775,12 +775,12 @@
       <w:r>
         <w:t xml:space="preserve"> </w:t>
       </w:r>
-      <w:del w:id="10106" w:author="Revision merge (HM+PL)" w:date="2026-09-07T16:18:28Z">
+      <w:del w:id="10106" w:author="Revision merge (HM+PL)" w:date="2026-09-09T12:54:58Z">
         <w:r>
           <w:delText xml:space="preserve">profiling,</w:delText>
         </w:r>
       </w:del>
-      <w:ins w:id="10107" w:author="Revision merge (HM+PL)" w:date="2026-09-07T16:18:28Z">
+      <w:ins w:id="10107" w:author="Revision merge (HM+PL)" w:date="2026-09-09T12:54:58Z">
         <w:r>
           <w:t xml:space="preserve">profiling of antimicrobial resistance (AMR), virulence</w:t>
         </w:r>
@@ -788,7 +788,7 @@
       <w:r>
         <w:t xml:space="preserve"> and</w:t>
       </w:r>
-      <w:ins w:id="10108" w:author="Revision merge (HM+PL)" w:date="2026-09-07T16:18:28Z">
+      <w:ins w:id="10108" w:author="Revision merge (HM+PL)" w:date="2026-09-09T12:54:58Z">
         <w:r>
           <w:t xml:space="preserve"> mobile genetic element repertoires. In addition, MERIDIAN infers</w:t>
         </w:r>
@@ -796,12 +796,12 @@
       <w:r>
         <w:t xml:space="preserve"> a tripartite sample × taxon × gene </w:t>
       </w:r>
-      <w:del w:id="10109" w:author="Revision merge (HM+PL)" w:date="2026-09-07T16:18:28Z">
+      <w:del w:id="10109" w:author="Revision merge (HM+PL)" w:date="2026-09-09T12:54:58Z">
         <w:r>
           <w:delText xml:space="preserve">network</w:delText>
         </w:r>
       </w:del>
-      <w:ins w:id="10110" w:author="Revision merge (HM+PL)" w:date="2026-09-07T16:18:28Z">
+      <w:ins w:id="10110" w:author="Revision merge (HM+PL)" w:date="2026-09-09T12:54:58Z">
         <w:r>
           <w:t xml:space="preserve">network,</w:t>
         </w:r>
@@ -809,12 +809,12 @@
       <w:r>
         <w:t xml:space="preserve"> </w:t>
       </w:r>
-      <w:del w:id="10111" w:author="Revision merge (HM+PL)" w:date="2026-09-07T16:18:28Z">
+      <w:del w:id="10111" w:author="Revision merge (HM+PL)" w:date="2026-09-09T12:54:58Z">
         <w:r>
           <w:delText xml:space="preserve">reconstruction.</w:delText>
         </w:r>
       </w:del>
-      <w:ins w:id="10112" w:author="Revision merge (HM+PL)" w:date="2026-09-07T16:18:28Z">
+      <w:ins w:id="10112" w:author="Revision merge (HM+PL)" w:date="2026-09-09T12:54:58Z">
         <w:r>
           <w:t xml:space="preserve">enabling</w:t>
         </w:r>
@@ -822,12 +822,12 @@
       <w:r>
         <w:t xml:space="preserve"> </w:t>
       </w:r>
-      <w:del w:id="10113" w:author="Revision merge (HM+PL)" w:date="2026-09-07T16:18:28Z">
+      <w:del w:id="10113" w:author="Revision merge (HM+PL)" w:date="2026-09-09T12:54:58Z">
         <w:r>
           <w:delText xml:space="preserve">A</w:delText>
         </w:r>
       </w:del>
-      <w:ins w:id="10114" w:author="Revision merge (HM+PL)" w:date="2026-09-07T16:18:28Z">
+      <w:ins w:id="10114" w:author="Revision merge (HM+PL)" w:date="2026-09-09T12:54:58Z">
         <w:r>
           <w:t xml:space="preserve">integrated</w:t>
         </w:r>
@@ -835,12 +835,12 @@
       <w:r>
         <w:t xml:space="preserve"> </w:t>
       </w:r>
-      <w:del w:id="10115" w:author="Revision merge (HM+PL)" w:date="2026-09-07T16:18:28Z">
+      <w:del w:id="10115" w:author="Revision merge (HM+PL)" w:date="2026-09-09T12:54:58Z">
         <w:r>
           <w:delText xml:space="preserve">study</w:delText>
         </w:r>
       </w:del>
-      <w:ins w:id="10116" w:author="Revision merge (HM+PL)" w:date="2026-09-07T16:18:28Z">
+      <w:ins w:id="10116" w:author="Revision merge (HM+PL)" w:date="2026-09-09T12:54:58Z">
         <w:r>
           <w:t xml:space="preserve">interrogation of taxonomic composition and functional gene distributions. Workflow execution</w:t>
         </w:r>
@@ -848,12 +848,12 @@
       <w:r>
         <w:t xml:space="preserve"> is </w:t>
       </w:r>
-      <w:del w:id="10117" w:author="Revision merge (HM+PL)" w:date="2026-09-07T16:18:28Z">
+      <w:del w:id="10117" w:author="Revision merge (HM+PL)" w:date="2026-09-09T12:54:58Z">
         <w:r>
           <w:delText xml:space="preserve">parameterised</w:delText>
         </w:r>
       </w:del>
-      <w:ins w:id="10118" w:author="Revision merge (HM+PL)" w:date="2026-09-07T16:18:28Z">
+      <w:ins w:id="10118" w:author="Revision merge (HM+PL)" w:date="2026-09-09T12:54:58Z">
         <w:r>
           <w:t xml:space="preserve">controlled</w:t>
         </w:r>
@@ -861,12 +861,12 @@
       <w:r>
         <w:t xml:space="preserve"> </w:t>
       </w:r>
-      <w:del w:id="10119" w:author="Revision merge (HM+PL)" w:date="2026-09-07T16:18:28Z">
+      <w:del w:id="10119" w:author="Revision merge (HM+PL)" w:date="2026-09-09T12:54:58Z">
         <w:r>
           <w:delText xml:space="preserve">by</w:delText>
         </w:r>
       </w:del>
-      <w:ins w:id="10120" w:author="Revision merge (HM+PL)" w:date="2026-09-07T16:18:28Z">
+      <w:ins w:id="10120" w:author="Revision merge (HM+PL)" w:date="2026-09-09T12:54:58Z">
         <w:r>
           <w:t xml:space="preserve">through</w:t>
         </w:r>
@@ -874,12 +874,12 @@
       <w:r>
         <w:t xml:space="preserve"> a single YAML </w:t>
       </w:r>
-      <w:del w:id="10121" w:author="Revision merge (HM+PL)" w:date="2026-09-07T16:18:28Z">
+      <w:del w:id="10121" w:author="Revision merge (HM+PL)" w:date="2026-09-09T12:54:58Z">
         <w:r>
           <w:delText xml:space="preserve">file;</w:delText>
         </w:r>
       </w:del>
-      <w:ins w:id="10122" w:author="Revision merge (HM+PL)" w:date="2026-09-07T16:18:28Z">
+      <w:ins w:id="10122" w:author="Revision merge (HM+PL)" w:date="2026-09-09T12:54:58Z">
         <w:r>
           <w:t xml:space="preserve">configuration</w:t>
         </w:r>
@@ -887,12 +887,12 @@
       <w:r>
         <w:t xml:space="preserve"> </w:t>
       </w:r>
-      <w:del w:id="10123" w:author="Revision merge (HM+PL)" w:date="2026-09-07T16:18:28Z">
+      <w:del w:id="10123" w:author="Revision merge (HM+PL)" w:date="2026-09-09T12:54:58Z">
         <w:r>
           <w:delText xml:space="preserve">module</w:delText>
         </w:r>
       </w:del>
-      <w:ins w:id="10124" w:author="Revision merge (HM+PL)" w:date="2026-09-07T16:18:28Z">
+      <w:ins w:id="10124" w:author="Revision merge (HM+PL)" w:date="2026-09-09T12:54:58Z">
         <w:r>
           <w:t xml:space="preserve">file,</w:t>
         </w:r>
@@ -900,12 +900,12 @@
       <w:r>
         <w:t xml:space="preserve"> </w:t>
       </w:r>
-      <w:del w:id="10125" w:author="Revision merge (HM+PL)" w:date="2026-09-07T16:18:28Z">
+      <w:del w:id="10125" w:author="Revision merge (HM+PL)" w:date="2026-09-09T12:54:58Z">
         <w:r>
           <w:delText xml:space="preserve">code</w:delText>
         </w:r>
       </w:del>
-      <w:ins w:id="10126" w:author="Revision merge (HM+PL)" w:date="2026-09-07T16:18:28Z">
+      <w:ins w:id="10126" w:author="Revision merge (HM+PL)" w:date="2026-09-09T12:54:58Z">
         <w:r>
           <w:t xml:space="preserve">ensuring</w:t>
         </w:r>
@@ -913,12 +913,12 @@
       <w:r>
         <w:t xml:space="preserve"> </w:t>
       </w:r>
-      <w:del w:id="10127" w:author="Revision merge (HM+PL)" w:date="2026-09-07T16:18:28Z">
+      <w:del w:id="10127" w:author="Revision merge (HM+PL)" w:date="2026-09-09T12:54:58Z">
         <w:r>
           <w:delText xml:space="preserve">is</w:delText>
         </w:r>
       </w:del>
-      <w:ins w:id="10128" w:author="Revision merge (HM+PL)" w:date="2026-09-07T16:18:28Z">
+      <w:ins w:id="10128" w:author="Revision merge (HM+PL)" w:date="2026-09-09T12:54:58Z">
         <w:r>
           <w:t xml:space="preserve">reproducible</w:t>
         </w:r>
@@ -926,12 +926,12 @@
       <w:r>
         <w:t xml:space="preserve"> </w:t>
       </w:r>
-      <w:del w:id="10129" w:author="Revision merge (HM+PL)" w:date="2026-09-07T16:18:28Z">
+      <w:del w:id="10129" w:author="Revision merge (HM+PL)" w:date="2026-09-09T12:54:58Z">
         <w:r>
           <w:delText xml:space="preserve">not</w:delText>
         </w:r>
       </w:del>
-      <w:ins w:id="10130" w:author="Revision merge (HM+PL)" w:date="2026-09-07T16:18:28Z">
+      <w:ins w:id="10130" w:author="Revision merge (HM+PL)" w:date="2026-09-09T12:54:58Z">
         <w:r>
           <w:t xml:space="preserve">execution</w:t>
         </w:r>
@@ -939,12 +939,12 @@
       <w:r>
         <w:t xml:space="preserve"> </w:t>
       </w:r>
-      <w:del w:id="10131" w:author="Revision merge (HM+PL)" w:date="2026-09-07T16:18:28Z">
+      <w:del w:id="10131" w:author="Revision merge (HM+PL)" w:date="2026-09-09T12:54:58Z">
         <w:r>
           <w:delText xml:space="preserve">edited</w:delText>
         </w:r>
       </w:del>
-      <w:ins w:id="10132" w:author="Revision merge (HM+PL)" w:date="2026-09-07T16:18:28Z">
+      <w:ins w:id="10132" w:author="Revision merge (HM+PL)" w:date="2026-09-09T12:54:58Z">
         <w:r>
           <w:t xml:space="preserve">without</w:t>
         </w:r>
@@ -952,12 +952,12 @@
       <w:r>
         <w:t xml:space="preserve"> </w:t>
       </w:r>
-      <w:del w:id="10133" w:author="Revision merge (HM+PL)" w:date="2026-09-07T16:18:28Z">
+      <w:del w:id="10133" w:author="Revision merge (HM+PL)" w:date="2026-09-09T12:54:58Z">
         <w:r>
           <w:delText xml:space="preserve">per</w:delText>
         </w:r>
       </w:del>
-      <w:ins w:id="10134" w:author="Revision merge (HM+PL)" w:date="2026-09-07T16:18:28Z">
+      <w:ins w:id="10134" w:author="Revision merge (HM+PL)" w:date="2026-09-09T12:54:58Z">
         <w:r>
           <w:t xml:space="preserve">modification</w:t>
         </w:r>
@@ -965,12 +965,12 @@
       <w:r>
         <w:t xml:space="preserve"> </w:t>
       </w:r>
-      <w:del w:id="10135" w:author="Revision merge (HM+PL)" w:date="2026-09-07T16:18:28Z">
+      <w:del w:id="10135" w:author="Revision merge (HM+PL)" w:date="2026-09-09T12:54:58Z">
         <w:r>
           <w:delText xml:space="preserve">project,</w:delText>
         </w:r>
       </w:del>
-      <w:ins w:id="10136" w:author="Revision merge (HM+PL)" w:date="2026-09-07T16:18:28Z">
+      <w:ins w:id="10136" w:author="Revision merge (HM+PL)" w:date="2026-09-09T12:54:58Z">
         <w:r>
           <w:t xml:space="preserve">of</w:t>
         </w:r>
@@ -978,12 +978,12 @@
       <w:r>
         <w:t xml:space="preserve"> </w:t>
       </w:r>
-      <w:del w:id="10137" w:author="Revision merge (HM+PL)" w:date="2026-09-07T16:18:28Z">
+      <w:del w:id="10137" w:author="Revision merge (HM+PL)" w:date="2026-09-09T12:54:58Z">
         <w:r>
           <w:delText xml:space="preserve">and</w:delText>
         </w:r>
       </w:del>
-      <w:ins w:id="10138" w:author="Revision merge (HM+PL)" w:date="2026-09-07T16:18:28Z">
+      <w:ins w:id="10138" w:author="Revision merge (HM+PL)" w:date="2026-09-09T12:54:58Z">
         <w:r>
           <w:t xml:space="preserve">source</w:t>
         </w:r>
@@ -991,12 +991,12 @@
       <w:r>
         <w:t xml:space="preserve"> </w:t>
       </w:r>
-      <w:del w:id="10139" w:author="Revision merge (HM+PL)" w:date="2026-09-07T16:18:28Z">
+      <w:del w:id="10139" w:author="Revision merge (HM+PL)" w:date="2026-09-09T12:54:58Z">
         <w:r>
           <w:delText xml:space="preserve">every</w:delText>
         </w:r>
       </w:del>
-      <w:ins w:id="10140" w:author="Revision merge (HM+PL)" w:date="2026-09-07T16:18:28Z">
+      <w:ins w:id="10140" w:author="Revision merge (HM+PL)" w:date="2026-09-09T12:54:58Z">
         <w:r>
           <w:t xml:space="preserve">code.</w:t>
         </w:r>
@@ -1004,12 +1004,12 @@
       <w:r>
         <w:t xml:space="preserve"> </w:t>
       </w:r>
-      <w:del w:id="10141" w:author="Revision merge (HM+PL)" w:date="2026-09-07T16:18:28Z">
+      <w:del w:id="10141" w:author="Revision merge (HM+PL)" w:date="2026-09-09T12:54:58Z">
         <w:r>
           <w:delText xml:space="preserve">run</w:delText>
         </w:r>
       </w:del>
-      <w:ins w:id="10142" w:author="Revision merge (HM+PL)" w:date="2026-09-07T16:18:28Z">
+      <w:ins w:id="10142" w:author="Revision merge (HM+PL)" w:date="2026-09-09T12:54:58Z">
         <w:r>
           <w:t xml:space="preserve">Each</w:t>
         </w:r>
@@ -1017,12 +1017,12 @@
       <w:r>
         <w:t xml:space="preserve"> </w:t>
       </w:r>
-      <w:del w:id="10143" w:author="Revision merge (HM+PL)" w:date="2026-09-07T16:18:28Z">
+      <w:del w:id="10143" w:author="Revision merge (HM+PL)" w:date="2026-09-09T12:54:58Z">
         <w:r>
           <w:delText xml:space="preserve">emits</w:delText>
         </w:r>
       </w:del>
-      <w:ins w:id="10144" w:author="Revision merge (HM+PL)" w:date="2026-09-07T16:18:28Z">
+      <w:ins w:id="10144" w:author="Revision merge (HM+PL)" w:date="2026-09-09T12:54:58Z">
         <w:r>
           <w:t xml:space="preserve">analysis automatically generates</w:t>
         </w:r>
@@ -1030,12 +1030,12 @@
       <w:r>
         <w:t xml:space="preserve"> a `manifest.json` artefact </w:t>
       </w:r>
-      <w:del w:id="10145" w:author="Revision merge (HM+PL)" w:date="2026-09-07T16:18:28Z">
+      <w:del w:id="10145" w:author="Revision merge (HM+PL)" w:date="2026-09-09T12:54:58Z">
         <w:r>
           <w:delText xml:space="preserve">catalogue</w:delText>
         </w:r>
       </w:del>
-      <w:ins w:id="10146" w:author="Revision merge (HM+PL)" w:date="2026-09-07T16:18:28Z">
+      <w:ins w:id="10146" w:author="Revision merge (HM+PL)" w:date="2026-09-09T12:54:58Z">
         <w:r>
           <w:t xml:space="preserve">catalogue,</w:t>
         </w:r>
@@ -1043,12 +1043,12 @@
       <w:r>
         <w:t xml:space="preserve"> </w:t>
       </w:r>
-      <w:del w:id="10147" w:author="Revision merge (HM+PL)" w:date="2026-09-07T16:18:28Z">
+      <w:del w:id="10147" w:author="Revision merge (HM+PL)" w:date="2026-09-09T12:54:58Z">
         <w:r>
           <w:delText xml:space="preserve">for</w:delText>
         </w:r>
       </w:del>
-      <w:ins w:id="10148" w:author="Revision merge (HM+PL)" w:date="2026-09-07T16:18:28Z">
+      <w:ins w:id="10148" w:author="Revision merge (HM+PL)" w:date="2026-09-09T12:54:58Z">
         <w:r>
           <w:t xml:space="preserve">thereby supporting reproducibility and</w:t>
         </w:r>
@@ -1056,7 +1056,7 @@
       <w:r>
         <w:t xml:space="preserve"> downstream </w:t>
       </w:r>
-      <w:ins w:id="10149" w:author="Revision merge (HM+PL)" w:date="2026-09-07T16:18:28Z">
+      <w:ins w:id="10149" w:author="Revision merge (HM+PL)" w:date="2026-09-09T12:54:58Z">
         <w:r>
           <w:t xml:space="preserve">computational </w:t>
         </w:r>
@@ -1072,7 +1072,7 @@
       <w:r>
         <w:t xml:space="preserve">**Availability and Implementation.** </w:t>
       </w:r>
-      <w:ins w:id="10150" w:author="Revision merge (HM+PL)" w:date="2026-09-07T16:18:28Z">
+      <w:ins w:id="10150" w:author="Revision merge (HM+PL)" w:date="2026-09-09T12:54:58Z">
         <w:r>
           <w:t xml:space="preserve">MERIDIAN is implemented in R and distributed under the MIT licence. </w:t>
         </w:r>
@@ -1080,7 +1080,7 @@
       <w:r>
         <w:t xml:space="preserve">Source</w:t>
       </w:r>
-      <w:ins w:id="10151" w:author="Revision merge (HM+PL)" w:date="2026-09-07T16:18:28Z">
+      <w:ins w:id="10151" w:author="Revision merge (HM+PL)" w:date="2026-09-09T12:54:58Z">
         <w:r>
           <w:t xml:space="preserve"> code and documentation are available</w:t>
         </w:r>
@@ -1088,12 +1088,12 @@
       <w:r>
         <w:t xml:space="preserve"> at </w:t>
       </w:r>
-      <w:del w:id="10152" w:author="Revision merge (HM+PL)" w:date="2026-09-07T16:18:28Z">
+      <w:del w:id="10152" w:author="Revision merge (HM+PL)" w:date="2026-09-09T12:54:58Z">
         <w:r>
           <w:delText xml:space="preserve">https://github.com/Julio92-C/Metagenomics_pipeline_automation (MIT).</w:delText>
         </w:r>
       </w:del>
-      <w:ins w:id="10153" w:author="Revision merge (HM+PL)" w:date="2026-09-07T16:18:28Z">
+      <w:ins w:id="10153" w:author="Revision merge (HM+PL)" w:date="2026-09-09T12:54:58Z">
         <w:r>
           <w:t xml:space="preserve">https://github.com/Julio92-C/Metagenomics_pipeline_automation.</w:t>
         </w:r>
@@ -1101,12 +1101,12 @@
       <w:r>
         <w:t xml:space="preserve"> This note describes release **v0.1.0** (https://github.com/Julio92-C/Metagenomics_pipeline_automation/releases/tag/v0.1.0). </w:t>
       </w:r>
-      <w:del w:id="10154" w:author="Revision merge (HM+PL)" w:date="2026-09-07T16:18:28Z">
+      <w:del w:id="10154" w:author="Revision merge (HM+PL)" w:date="2026-09-09T12:54:58Z">
         <w:r>
           <w:delText xml:space="preserve">Run</w:delText>
         </w:r>
       </w:del>
-      <w:ins w:id="10155" w:author="Revision merge (HM+PL)" w:date="2026-09-07T16:18:28Z">
+      <w:ins w:id="10155" w:author="Revision merge (HM+PL)" w:date="2026-09-09T12:54:58Z">
         <w:r>
           <w:t xml:space="preserve">Reproducible execution is supported through the R environment package `renv`; after restoring dependencies</w:t>
         </w:r>
@@ -1114,12 +1114,12 @@
       <w:r>
         <w:t xml:space="preserve"> with </w:t>
       </w:r>
-      <w:del w:id="10156" w:author="Revision merge (HM+PL)" w:date="2026-09-07T16:18:28Z">
+      <w:del w:id="10156" w:author="Revision merge (HM+PL)" w:date="2026-09-09T12:54:58Z">
         <w:r>
           <w:delText xml:space="preserve">`git</w:delText>
         </w:r>
       </w:del>
-      <w:ins w:id="10157" w:author="Revision merge (HM+PL)" w:date="2026-09-07T16:18:28Z">
+      <w:ins w:id="10157" w:author="Revision merge (HM+PL)" w:date="2026-09-09T12:54:58Z">
         <w:r>
           <w:t xml:space="preserve">`renv::restore()`,</w:t>
         </w:r>
@@ -1127,12 +1127,12 @@
       <w:r>
         <w:t xml:space="preserve"> </w:t>
       </w:r>
-      <w:del w:id="10158" w:author="Revision merge (HM+PL)" w:date="2026-09-07T16:18:28Z">
+      <w:del w:id="10158" w:author="Revision merge (HM+PL)" w:date="2026-09-09T12:54:58Z">
         <w:r>
           <w:delText xml:space="preserve">clone</w:delText>
         </w:r>
       </w:del>
-      <w:ins w:id="10159" w:author="Revision merge (HM+PL)" w:date="2026-09-07T16:18:28Z">
+      <w:ins w:id="10159" w:author="Revision merge (HM+PL)" w:date="2026-09-09T12:54:58Z">
         <w:r>
           <w:t xml:space="preserve">the</w:t>
         </w:r>
@@ -1140,12 +1140,12 @@
       <w:r>
         <w:t xml:space="preserve"> </w:t>
       </w:r>
-      <w:del w:id="10160" w:author="Revision merge (HM+PL)" w:date="2026-09-07T16:18:28Z">
+      <w:del w:id="10160" w:author="Revision merge (HM+PL)" w:date="2026-09-09T12:54:58Z">
         <w:r>
           <w:delText xml:space="preserve">--branch</w:delText>
         </w:r>
       </w:del>
-      <w:ins w:id="10161" w:author="Revision merge (HM+PL)" w:date="2026-09-07T16:18:28Z">
+      <w:ins w:id="10161" w:author="Revision merge (HM+PL)" w:date="2026-09-09T12:54:58Z">
         <w:r>
           <w:t xml:space="preserve">pipeline</w:t>
         </w:r>
@@ -1153,12 +1153,12 @@
       <w:r>
         <w:t xml:space="preserve"> </w:t>
       </w:r>
-      <w:del w:id="10162" w:author="Revision merge (HM+PL)" w:date="2026-09-07T16:18:28Z">
+      <w:del w:id="10162" w:author="Revision merge (HM+PL)" w:date="2026-09-09T12:54:58Z">
         <w:r>
           <w:delText xml:space="preserve">v0.1.0</w:delText>
         </w:r>
       </w:del>
-      <w:ins w:id="10163" w:author="Revision merge (HM+PL)" w:date="2026-09-07T16:18:28Z">
+      <w:ins w:id="10163" w:author="Revision merge (HM+PL)" w:date="2026-09-09T12:54:58Z">
         <w:r>
           <w:t xml:space="preserve">is</w:t>
         </w:r>
@@ -1166,12 +1166,12 @@
       <w:r>
         <w:t xml:space="preserve"> </w:t>
       </w:r>
-      <w:del w:id="10164" w:author="Revision merge (HM+PL)" w:date="2026-09-07T16:18:28Z">
+      <w:del w:id="10164" w:author="Revision merge (HM+PL)" w:date="2026-09-09T12:54:58Z">
         <w:r>
           <w:delText xml:space="preserve">&lt;repo&gt;</w:delText>
         </w:r>
       </w:del>
-      <w:ins w:id="10165" w:author="Revision merge (HM+PL)" w:date="2026-09-07T16:18:28Z">
+      <w:ins w:id="10165" w:author="Revision merge (HM+PL)" w:date="2026-09-09T12:54:58Z">
         <w:r>
           <w:t xml:space="preserve">launched</w:t>
         </w:r>
@@ -1179,12 +1179,12 @@
       <w:r>
         <w:t xml:space="preserve"> </w:t>
       </w:r>
-      <w:del w:id="10166" w:author="Revision merge (HM+PL)" w:date="2026-09-07T16:18:28Z">
+      <w:del w:id="10166" w:author="Revision merge (HM+PL)" w:date="2026-09-09T12:54:58Z">
         <w:r>
           <w:delText xml:space="preserve">&amp;&amp;</w:delText>
         </w:r>
       </w:del>
-      <w:ins w:id="10167" w:author="Revision merge (HM+PL)" w:date="2026-09-07T16:18:28Z">
+      <w:ins w:id="10167" w:author="Revision merge (HM+PL)" w:date="2026-09-09T12:54:58Z">
         <w:r>
           <w:t xml:space="preserve">with</w:t>
         </w:r>
@@ -1192,12 +1192,12 @@
       <w:r>
         <w:t xml:space="preserve"> </w:t>
       </w:r>
-      <w:del w:id="10168" w:author="Revision merge (HM+PL)" w:date="2026-09-07T16:18:28Z">
+      <w:del w:id="10168" w:author="Revision merge (HM+PL)" w:date="2026-09-09T12:54:58Z">
         <w:r>
           <w:delText xml:space="preserve">Rscript</w:delText>
         </w:r>
       </w:del>
-      <w:ins w:id="10169" w:author="Revision merge (HM+PL)" w:date="2026-09-07T16:18:28Z">
+      <w:ins w:id="10169" w:author="Revision merge (HM+PL)" w:date="2026-09-09T12:54:58Z">
         <w:r>
           <w:t xml:space="preserve">`Rscript</w:t>
         </w:r>
@@ -1205,12 +1205,12 @@
       <w:r>
         <w:t xml:space="preserve"> run_pipeline.R </w:t>
       </w:r>
-      <w:del w:id="10170" w:author="Revision merge (HM+PL)" w:date="2026-09-07T16:18:28Z">
+      <w:del w:id="10170" w:author="Revision merge (HM+PL)" w:date="2026-09-09T12:54:58Z">
         <w:r>
           <w:delText xml:space="preserve">config.yaml` after `renv::restore()`.</w:delText>
         </w:r>
       </w:del>
-      <w:ins w:id="10171" w:author="Revision merge (HM+PL)" w:date="2026-09-07T16:18:28Z">
+      <w:ins w:id="10171" w:author="Revision merge (HM+PL)" w:date="2026-09-09T12:54:58Z">
         <w:r>
           <w:t xml:space="preserve">config.yaml`.</w:t>
         </w:r>
@@ -1220,12 +1220,12 @@
       <w:pPr>
         <w:spacing w:after="120"/>
       </w:pPr>
-      <w:del w:id="10172" w:author="Revision merge (HM+PL)" w:date="2026-09-07T16:18:28Z">
+      <w:del w:id="10172" w:author="Revision merge (HM+PL)" w:date="2026-09-09T12:54:58Z">
         <w:r>
           <w:delText xml:space="preserve">**Contact.**</w:delText>
         </w:r>
       </w:del>
-      <w:ins w:id="10173" w:author="Revision merge (HM+PL)" w:date="2026-09-07T16:18:28Z">
+      <w:ins w:id="10173" w:author="Revision merge (HM+PL)" w:date="2026-09-09T12:54:58Z">
         <w:r>
           <w:t xml:space="preserve">**Corresponding author:**</w:t>
         </w:r>
@@ -1263,12 +1263,12 @@
       <w:r>
         <w:t xml:space="preserve">Long-read shotgun </w:t>
       </w:r>
-      <w:del w:id="10174" w:author="Revision merge (HM+PL)" w:date="2026-09-07T16:18:28Z">
+      <w:del w:id="10174" w:author="Revision merge (HM+PL)" w:date="2026-09-09T12:54:58Z">
         <w:r>
           <w:delText xml:space="preserve">metagenomics</w:delText>
         </w:r>
       </w:del>
-      <w:ins w:id="10175" w:author="Revision merge (HM+PL)" w:date="2026-09-07T16:18:28Z">
+      <w:ins w:id="10175" w:author="Revision merge (HM+PL)" w:date="2026-09-09T12:54:58Z">
         <w:r>
           <w:t xml:space="preserve">metagenomics,</w:t>
         </w:r>
@@ -1276,12 +1276,12 @@
       <w:r>
         <w:t xml:space="preserve"> </w:t>
       </w:r>
-      <w:del w:id="10176" w:author="Revision merge (HM+PL)" w:date="2026-09-07T16:18:28Z">
+      <w:del w:id="10176" w:author="Revision merge (HM+PL)" w:date="2026-09-09T12:54:58Z">
         <w:r>
           <w:delText xml:space="preserve">(Oxford</w:delText>
         </w:r>
       </w:del>
-      <w:ins w:id="10177" w:author="Revision merge (HM+PL)" w:date="2026-09-07T16:18:28Z">
+      <w:ins w:id="10177" w:author="Revision merge (HM+PL)" w:date="2026-09-09T12:54:58Z">
         <w:r>
           <w:t xml:space="preserve">enabled</w:t>
         </w:r>
@@ -1289,12 +1289,12 @@
       <w:r>
         <w:t xml:space="preserve"> </w:t>
       </w:r>
-      <w:del w:id="10178" w:author="Revision merge (HM+PL)" w:date="2026-09-07T16:18:28Z">
+      <w:del w:id="10178" w:author="Revision merge (HM+PL)" w:date="2026-09-09T12:54:58Z">
         <w:r>
           <w:delText xml:space="preserve">Nanopore,</w:delText>
         </w:r>
       </w:del>
-      <w:ins w:id="10179" w:author="Revision merge (HM+PL)" w:date="2026-09-07T16:18:28Z">
+      <w:ins w:id="10179" w:author="Revision merge (HM+PL)" w:date="2026-09-09T12:54:58Z">
         <w:r>
           <w:t xml:space="preserve">by</w:t>
         </w:r>
@@ -1302,12 +1302,12 @@
       <w:r>
         <w:t xml:space="preserve"> </w:t>
       </w:r>
-      <w:del w:id="10180" w:author="Revision merge (HM+PL)" w:date="2026-09-07T16:18:28Z">
+      <w:del w:id="10180" w:author="Revision merge (HM+PL)" w:date="2026-09-09T12:54:58Z">
         <w:r>
           <w:delText xml:space="preserve">PacBio)</w:delText>
         </w:r>
       </w:del>
-      <w:ins w:id="10181" w:author="Revision merge (HM+PL)" w:date="2026-09-07T16:18:28Z">
+      <w:ins w:id="10181" w:author="Revision merge (HM+PL)" w:date="2026-09-09T12:54:58Z">
         <w:r>
           <w:t xml:space="preserve">Oxford Nanopore and PacBio sequencing technologies,</w:t>
         </w:r>
@@ -1315,7 +1315,7 @@
       <w:r>
         <w:t xml:space="preserve"> is</w:t>
       </w:r>
-      <w:del w:id="10182" w:author="Revision merge (HM+PL)" w:date="2026-09-07T16:18:28Z">
+      <w:del w:id="10182" w:author="Revision merge (HM+PL)" w:date="2026-09-09T12:54:58Z">
         <w:r>
           <w:delText xml:space="preserve"> increasingly</w:delText>
         </w:r>
@@ -1323,12 +1323,12 @@
       <w:r>
         <w:t xml:space="preserve"> central to One Health surveillance, where </w:t>
       </w:r>
-      <w:del w:id="10183" w:author="Revision merge (HM+PL)" w:date="2026-09-07T16:18:28Z">
+      <w:del w:id="10183" w:author="Revision merge (HM+PL)" w:date="2026-09-09T12:54:58Z">
         <w:r>
           <w:delText xml:space="preserve">threats</w:delText>
         </w:r>
       </w:del>
-      <w:ins w:id="10184" w:author="Revision merge (HM+PL)" w:date="2026-09-07T16:18:28Z">
+      <w:ins w:id="10184" w:author="Revision merge (HM+PL)" w:date="2026-09-09T12:54:58Z">
         <w:r>
           <w:t xml:space="preserve">the</w:t>
         </w:r>
@@ -1336,12 +1336,12 @@
       <w:r>
         <w:t xml:space="preserve"> </w:t>
       </w:r>
-      <w:del w:id="10185" w:author="Revision merge (HM+PL)" w:date="2026-09-07T16:18:28Z">
+      <w:del w:id="10185" w:author="Revision merge (HM+PL)" w:date="2026-09-09T12:54:58Z">
         <w:r>
           <w:delText xml:space="preserve">intersect humans, animals</w:delText>
         </w:r>
       </w:del>
-      <w:ins w:id="10186" w:author="Revision merge (HM+PL)" w:date="2026-09-07T16:18:28Z">
+      <w:ins w:id="10186" w:author="Revision merge (HM+PL)" w:date="2026-09-09T12:54:58Z">
         <w:r>
           <w:t xml:space="preserve">emergence</w:t>
         </w:r>
@@ -1349,12 +1349,12 @@
       <w:r>
         <w:t xml:space="preserve"> and </w:t>
       </w:r>
-      <w:del w:id="10187" w:author="Revision merge (HM+PL)" w:date="2026-09-07T16:18:28Z">
+      <w:del w:id="10187" w:author="Revision merge (HM+PL)" w:date="2026-09-09T12:54:58Z">
         <w:r>
           <w:delText xml:space="preserve">ecosystems</w:delText>
         </w:r>
       </w:del>
-      <w:ins w:id="10188" w:author="Revision merge (HM+PL)" w:date="2026-09-07T16:18:28Z">
+      <w:ins w:id="10188" w:author="Revision merge (HM+PL)" w:date="2026-09-09T12:54:58Z">
         <w:r>
           <w:t xml:space="preserve">dissemination of biological threats occur at the interface of human, animal and environmental systems</w:t>
         </w:r>
@@ -1362,12 +1362,12 @@
       <w:r>
         <w:t xml:space="preserve"> [1]. </w:t>
       </w:r>
-      <w:del w:id="10189" w:author="Revision merge (HM+PL)" w:date="2026-09-07T16:18:28Z">
+      <w:del w:id="10189" w:author="Revision merge (HM+PL)" w:date="2026-09-09T12:54:58Z">
         <w:r>
           <w:delText xml:space="preserve">By</w:delText>
         </w:r>
       </w:del>
-      <w:ins w:id="10190" w:author="Revision merge (HM+PL)" w:date="2026-09-07T16:18:28Z">
+      <w:ins w:id="10190" w:author="Revision merge (HM+PL)" w:date="2026-09-09T12:54:58Z">
         <w:r>
           <w:t xml:space="preserve">Unlike</w:t>
         </w:r>
@@ -1375,12 +1375,12 @@
       <w:r>
         <w:t xml:space="preserve"> </w:t>
       </w:r>
-      <w:del w:id="10191" w:author="Revision merge (HM+PL)" w:date="2026-09-07T16:18:28Z">
+      <w:del w:id="10191" w:author="Revision merge (HM+PL)" w:date="2026-09-09T12:54:58Z">
         <w:r>
           <w:delText xml:space="preserve">profiling</w:delText>
         </w:r>
       </w:del>
-      <w:ins w:id="10192" w:author="Revision merge (HM+PL)" w:date="2026-09-07T16:18:28Z">
+      <w:ins w:id="10192" w:author="Revision merge (HM+PL)" w:date="2026-09-09T12:54:58Z">
         <w:r>
           <w:t xml:space="preserve">targeted approaches, shotgun metagenomics enables simultaneous characterisation of</w:t>
         </w:r>
@@ -1388,12 +1388,12 @@
       <w:r>
         <w:t xml:space="preserve"> microbial </w:t>
       </w:r>
-      <w:del w:id="10193" w:author="Revision merge (HM+PL)" w:date="2026-09-07T16:18:28Z">
+      <w:del w:id="10193" w:author="Revision merge (HM+PL)" w:date="2026-09-09T12:54:58Z">
         <w:r>
           <w:delText xml:space="preserve">communities</w:delText>
         </w:r>
       </w:del>
-      <w:ins w:id="10194" w:author="Revision merge (HM+PL)" w:date="2026-09-07T16:18:28Z">
+      <w:ins w:id="10194" w:author="Revision merge (HM+PL)" w:date="2026-09-09T12:54:58Z">
         <w:r>
           <w:t xml:space="preserve">community composition</w:t>
         </w:r>
@@ -1401,7 +1401,7 @@
       <w:r>
         <w:t xml:space="preserve"> and</w:t>
       </w:r>
-      <w:del w:id="10195" w:author="Revision merge (HM+PL)" w:date="2026-09-07T16:18:28Z">
+      <w:del w:id="10195" w:author="Revision merge (HM+PL)" w:date="2026-09-09T12:54:58Z">
         <w:r>
           <w:delText xml:space="preserve"> their</w:delText>
         </w:r>
@@ -1409,12 +1409,12 @@
       <w:r>
         <w:t xml:space="preserve"> functional genetic </w:t>
       </w:r>
-      <w:del w:id="10196" w:author="Revision merge (HM+PL)" w:date="2026-09-07T16:18:28Z">
+      <w:del w:id="10196" w:author="Revision merge (HM+PL)" w:date="2026-09-09T12:54:58Z">
         <w:r>
           <w:delText xml:space="preserve">elements</w:delText>
         </w:r>
       </w:del>
-      <w:ins w:id="10197" w:author="Revision merge (HM+PL)" w:date="2026-09-07T16:18:28Z">
+      <w:ins w:id="10197" w:author="Revision merge (HM+PL)" w:date="2026-09-09T12:54:58Z">
         <w:r>
           <w:t xml:space="preserve">content,</w:t>
         </w:r>
@@ -1422,12 +1422,12 @@
       <w:r>
         <w:t xml:space="preserve"> </w:t>
       </w:r>
-      <w:del w:id="10198" w:author="Revision merge (HM+PL)" w:date="2026-09-07T16:18:28Z">
+      <w:del w:id="10198" w:author="Revision merge (HM+PL)" w:date="2026-09-09T12:54:58Z">
         <w:r>
           <w:delText xml:space="preserve">in</w:delText>
         </w:r>
       </w:del>
-      <w:ins w:id="10199" w:author="Revision merge (HM+PL)" w:date="2026-09-07T16:18:28Z">
+      <w:ins w:id="10199" w:author="Revision merge (HM+PL)" w:date="2026-09-09T12:54:58Z">
         <w:r>
           <w:t xml:space="preserve">thereby</w:t>
         </w:r>
@@ -1435,12 +1435,12 @@
       <w:r>
         <w:t xml:space="preserve"> </w:t>
       </w:r>
-      <w:del w:id="10200" w:author="Revision merge (HM+PL)" w:date="2026-09-07T16:18:28Z">
+      <w:del w:id="10200" w:author="Revision merge (HM+PL)" w:date="2026-09-09T12:54:58Z">
         <w:r>
           <w:delText xml:space="preserve">a single experiment, it links</w:delText>
         </w:r>
       </w:del>
-      <w:ins w:id="10201" w:author="Revision merge (HM+PL)" w:date="2026-09-07T16:18:28Z">
+      <w:ins w:id="10201" w:author="Revision merge (HM+PL)" w:date="2026-09-09T12:54:58Z">
         <w:r>
           <w:t xml:space="preserve">linking</w:t>
         </w:r>
@@ -1448,7 +1448,7 @@
       <w:r>
         <w:t xml:space="preserve"> taxonomic identity to</w:t>
       </w:r>
-      <w:del w:id="10202" w:author="Revision merge (HM+PL)" w:date="2026-09-07T16:18:28Z">
+      <w:del w:id="10202" w:author="Revision merge (HM+PL)" w:date="2026-09-09T12:54:58Z">
         <w:r>
           <w:delText xml:space="preserve"> determinants of resistance, virulence, and mobility across environmental, clinical, and livestock matrices. The downstream analysis stack is well established — Kraken2 [2] and Bracken [3] for taxonomic assignment and abundance estimation, ABRicate [4] for screening</w:delText>
         </w:r>
@@ -1456,7 +1456,7 @@
       <w:r>
         <w:t xml:space="preserve"> antimicrobial resistance genes (ARGs), virulence factors (VFs) and mobile genetic elements (MGEs) </w:t>
       </w:r>
-      <w:ins w:id="10203" w:author="Revision merge (HM+PL)" w:date="2026-09-07T16:18:28Z">
+      <w:ins w:id="10203" w:author="Revision merge (HM+PL)" w:date="2026-09-09T12:54:58Z">
         <w:r>
           <w:t xml:space="preserve">within a single experiment. This capability is particularly valuable for tracking the ecology and transmission of high-risk microorganisms and their associated genetic determinants across clinical, agricultural and environmental reservoirs. The downstream analysis supporting long-read metagenomics is now well established. Widely adopted tools include Kraken2 [2] and Bracken [3] for taxonomic classification and abundance estimation, ABRicate [4] for screening ARGs, VFs and MGEs </w:t>
         </w:r>
@@ -1464,7 +1464,7 @@
       <w:r>
         <w:t xml:space="preserve">against</w:t>
       </w:r>
-      <w:ins w:id="10204" w:author="Revision merge (HM+PL)" w:date="2026-09-07T16:18:28Z">
+      <w:ins w:id="10204" w:author="Revision merge (HM+PL)" w:date="2026-09-09T12:54:58Z">
         <w:r>
           <w:t xml:space="preserve"> databases such as</w:t>
         </w:r>
@@ -1472,12 +1472,12 @@
       <w:r>
         <w:t xml:space="preserve"> CARD [5], VFDB [6] and PlasmidFinder [7], Re-centrifuge [8] for contamination assessment, and R packages </w:t>
       </w:r>
-      <w:del w:id="10205" w:author="Revision merge (HM+PL)" w:date="2026-09-07T16:18:28Z">
+      <w:del w:id="10205" w:author="Revision merge (HM+PL)" w:date="2026-09-09T12:54:58Z">
         <w:r>
           <w:delText xml:space="preserve">such as</w:delText>
         </w:r>
       </w:del>
-      <w:ins w:id="10206" w:author="Revision merge (HM+PL)" w:date="2026-09-07T16:18:28Z">
+      <w:ins w:id="10206" w:author="Revision merge (HM+PL)" w:date="2026-09-09T12:54:58Z">
         <w:r>
           <w:t xml:space="preserve">including</w:t>
         </w:r>
@@ -1485,12 +1485,12 @@
       <w:r>
         <w:t xml:space="preserve"> vegan [9] and ALDEx2 [10] for ecological and differential </w:t>
       </w:r>
-      <w:del w:id="10207" w:author="Revision merge (HM+PL)" w:date="2026-09-07T16:18:28Z">
+      <w:del w:id="10207" w:author="Revision merge (HM+PL)" w:date="2026-09-09T12:54:58Z">
         <w:r>
           <w:delText xml:space="preserve">analyses</w:delText>
         </w:r>
       </w:del>
-      <w:ins w:id="10208" w:author="Revision merge (HM+PL)" w:date="2026-09-07T16:18:28Z">
+      <w:ins w:id="10208" w:author="Revision merge (HM+PL)" w:date="2026-09-09T12:54:58Z">
         <w:r>
           <w:t xml:space="preserve">abundance</w:t>
         </w:r>
@@ -1498,12 +1498,12 @@
       <w:r>
         <w:t xml:space="preserve"> </w:t>
       </w:r>
-      <w:del w:id="10209" w:author="Revision merge (HM+PL)" w:date="2026-09-07T16:18:28Z">
+      <w:del w:id="10209" w:author="Revision merge (HM+PL)" w:date="2026-09-09T12:54:58Z">
         <w:r>
           <w:delText xml:space="preserve">—</w:delText>
         </w:r>
       </w:del>
-      <w:ins w:id="10210" w:author="Revision merge (HM+PL)" w:date="2026-09-07T16:18:28Z">
+      <w:ins w:id="10210" w:author="Revision merge (HM+PL)" w:date="2026-09-09T12:54:58Z">
         <w:r>
           <w:t xml:space="preserve">analyses.</w:t>
         </w:r>
@@ -1511,12 +1511,12 @@
       <w:r>
         <w:t xml:space="preserve"> </w:t>
       </w:r>
-      <w:del w:id="10211" w:author="Revision merge (HM+PL)" w:date="2026-09-07T16:18:28Z">
+      <w:del w:id="10211" w:author="Revision merge (HM+PL)" w:date="2026-09-09T12:54:58Z">
         <w:r>
           <w:delText xml:space="preserve">but</w:delText>
         </w:r>
       </w:del>
-      <w:ins w:id="10212" w:author="Revision merge (HM+PL)" w:date="2026-09-07T16:18:28Z">
+      <w:ins w:id="10212" w:author="Revision merge (HM+PL)" w:date="2026-09-09T12:54:58Z">
         <w:r>
           <w:t xml:space="preserve">However,</w:t>
         </w:r>
@@ -1524,12 +1524,12 @@
       <w:r>
         <w:t xml:space="preserve"> </w:t>
       </w:r>
-      <w:del w:id="10213" w:author="Revision merge (HM+PL)" w:date="2026-09-07T16:18:28Z">
+      <w:del w:id="10213" w:author="Revision merge (HM+PL)" w:date="2026-09-09T12:54:58Z">
         <w:r>
           <w:delText xml:space="preserve">the</w:delText>
         </w:r>
       </w:del>
-      <w:ins w:id="10214" w:author="Revision merge (HM+PL)" w:date="2026-09-07T16:18:28Z">
+      <w:ins w:id="10214" w:author="Revision merge (HM+PL)" w:date="2026-09-09T12:54:58Z">
         <w:r>
           <w:t xml:space="preserve">while these tools are individually well established, their</w:t>
         </w:r>
@@ -1537,12 +1537,12 @@
       <w:r>
         <w:t xml:space="preserve"> integration </w:t>
       </w:r>
-      <w:del w:id="10215" w:author="Revision merge (HM+PL)" w:date="2026-09-07T16:18:28Z">
+      <w:del w:id="10215" w:author="Revision merge (HM+PL)" w:date="2026-09-09T12:54:58Z">
         <w:r>
           <w:delText xml:space="preserve">between</w:delText>
         </w:r>
       </w:del>
-      <w:ins w:id="10216" w:author="Revision merge (HM+PL)" w:date="2026-09-07T16:18:28Z">
+      <w:ins w:id="10216" w:author="Revision merge (HM+PL)" w:date="2026-09-09T12:54:58Z">
         <w:r>
           <w:t xml:space="preserve">into</w:t>
         </w:r>
@@ -1550,12 +1550,12 @@
       <w:r>
         <w:t xml:space="preserve"> </w:t>
       </w:r>
-      <w:del w:id="10217" w:author="Revision merge (HM+PL)" w:date="2026-09-07T16:18:28Z">
+      <w:del w:id="10217" w:author="Revision merge (HM+PL)" w:date="2026-09-09T12:54:58Z">
         <w:r>
           <w:delText xml:space="preserve">them</w:delText>
         </w:r>
       </w:del>
-      <w:ins w:id="10218" w:author="Revision merge (HM+PL)" w:date="2026-09-07T16:18:28Z">
+      <w:ins w:id="10218" w:author="Revision merge (HM+PL)" w:date="2026-09-09T12:54:58Z">
         <w:r>
           <w:t xml:space="preserve">reproducible</w:t>
         </w:r>
@@ -1563,12 +1563,12 @@
       <w:r>
         <w:t xml:space="preserve"> </w:t>
       </w:r>
-      <w:del w:id="10219" w:author="Revision merge (HM+PL)" w:date="2026-09-07T16:18:28Z">
+      <w:del w:id="10219" w:author="Revision merge (HM+PL)" w:date="2026-09-09T12:54:58Z">
         <w:r>
           <w:delText xml:space="preserve">is</w:delText>
         </w:r>
       </w:del>
-      <w:ins w:id="10220" w:author="Revision merge (HM+PL)" w:date="2026-09-07T16:18:28Z">
+      <w:ins w:id="10220" w:author="Revision merge (HM+PL)" w:date="2026-09-09T12:54:58Z">
         <w:r>
           <w:t xml:space="preserve">and</w:t>
         </w:r>
@@ -1576,12 +1576,12 @@
       <w:r>
         <w:t xml:space="preserve"> </w:t>
       </w:r>
-      <w:del w:id="10221" w:author="Revision merge (HM+PL)" w:date="2026-09-07T16:18:28Z">
+      <w:del w:id="10221" w:author="Revision merge (HM+PL)" w:date="2026-09-09T12:54:58Z">
         <w:r>
           <w:delText xml:space="preserve">not.</w:delText>
         </w:r>
       </w:del>
-      <w:ins w:id="10222" w:author="Revision merge (HM+PL)" w:date="2026-09-07T16:18:28Z">
+      <w:ins w:id="10222" w:author="Revision merge (HM+PL)" w:date="2026-09-09T12:54:58Z">
         <w:r>
           <w:t xml:space="preserve">reusable workflows remains limited.</w:t>
         </w:r>
@@ -1594,12 +1594,12 @@
       <w:r>
         <w:t xml:space="preserve">In practice, </w:t>
       </w:r>
-      <w:del w:id="10223" w:author="Revision merge (HM+PL)" w:date="2026-09-07T16:18:28Z">
+      <w:del w:id="10223" w:author="Revision merge (HM+PL)" w:date="2026-09-09T12:54:58Z">
         <w:r>
           <w:delText xml:space="preserve">each</w:delText>
         </w:r>
       </w:del>
-      <w:ins w:id="10224" w:author="Revision merge (HM+PL)" w:date="2026-09-07T16:18:28Z">
+      <w:ins w:id="10224" w:author="Revision merge (HM+PL)" w:date="2026-09-09T12:54:58Z">
         <w:r>
           <w:t xml:space="preserve">downstream</w:t>
         </w:r>
@@ -1607,12 +1607,12 @@
       <w:r>
         <w:t xml:space="preserve"> </w:t>
       </w:r>
-      <w:del w:id="10225" w:author="Revision merge (HM+PL)" w:date="2026-09-07T16:18:28Z">
+      <w:del w:id="10225" w:author="Revision merge (HM+PL)" w:date="2026-09-09T12:54:58Z">
         <w:r>
           <w:delText xml:space="preserve">new</w:delText>
         </w:r>
       </w:del>
-      <w:ins w:id="10226" w:author="Revision merge (HM+PL)" w:date="2026-09-07T16:18:28Z">
+      <w:ins w:id="10226" w:author="Revision merge (HM+PL)" w:date="2026-09-09T12:54:58Z">
         <w:r>
           <w:t xml:space="preserve">analyses</w:t>
         </w:r>
@@ -1620,12 +1620,12 @@
       <w:r>
         <w:t xml:space="preserve"> </w:t>
       </w:r>
-      <w:del w:id="10227" w:author="Revision merge (HM+PL)" w:date="2026-09-07T16:18:28Z">
+      <w:del w:id="10227" w:author="Revision merge (HM+PL)" w:date="2026-09-09T12:54:58Z">
         <w:r>
           <w:delText xml:space="preserve">study</w:delText>
         </w:r>
       </w:del>
-      <w:ins w:id="10228" w:author="Revision merge (HM+PL)" w:date="2026-09-07T16:18:28Z">
+      <w:ins w:id="10228" w:author="Revision merge (HM+PL)" w:date="2026-09-09T12:54:58Z">
         <w:r>
           <w:t xml:space="preserve">continue</w:t>
         </w:r>
@@ -1633,12 +1633,12 @@
       <w:r>
         <w:t xml:space="preserve"> </w:t>
       </w:r>
-      <w:del w:id="10229" w:author="Revision merge (HM+PL)" w:date="2026-09-07T16:18:28Z">
+      <w:del w:id="10229" w:author="Revision merge (HM+PL)" w:date="2026-09-09T12:54:58Z">
         <w:r>
           <w:delText xml:space="preserve">is</w:delText>
         </w:r>
       </w:del>
-      <w:ins w:id="10230" w:author="Revision merge (HM+PL)" w:date="2026-09-07T16:18:28Z">
+      <w:ins w:id="10230" w:author="Revision merge (HM+PL)" w:date="2026-09-09T12:54:58Z">
         <w:r>
           <w:t xml:space="preserve">to</w:t>
         </w:r>
@@ -1646,12 +1646,12 @@
       <w:r>
         <w:t xml:space="preserve"> </w:t>
       </w:r>
-      <w:del w:id="10231" w:author="Revision merge (HM+PL)" w:date="2026-09-07T16:18:28Z">
+      <w:del w:id="10231" w:author="Revision merge (HM+PL)" w:date="2026-09-09T12:54:58Z">
         <w:r>
           <w:delText xml:space="preserve">analysed</w:delText>
         </w:r>
       </w:del>
-      <w:ins w:id="10232" w:author="Revision merge (HM+PL)" w:date="2026-09-07T16:18:28Z">
+      <w:ins w:id="10232" w:author="Revision merge (HM+PL)" w:date="2026-09-09T12:54:58Z">
         <w:r>
           <w:t xml:space="preserve">rely</w:t>
         </w:r>
@@ -1659,12 +1659,12 @@
       <w:r>
         <w:t xml:space="preserve"> </w:t>
       </w:r>
-      <w:del w:id="10233" w:author="Revision merge (HM+PL)" w:date="2026-09-07T16:18:28Z">
+      <w:del w:id="10233" w:author="Revision merge (HM+PL)" w:date="2026-09-09T12:54:58Z">
         <w:r>
           <w:delText xml:space="preserve">by adapting</w:delText>
         </w:r>
       </w:del>
-      <w:ins w:id="10234" w:author="Revision merge (HM+PL)" w:date="2026-09-07T16:18:28Z">
+      <w:ins w:id="10234" w:author="Revision merge (HM+PL)" w:date="2026-09-09T12:54:58Z">
         <w:r>
           <w:t xml:space="preserve">on</w:t>
         </w:r>
@@ -1672,12 +1672,12 @@
       <w:r>
         <w:t xml:space="preserve"> a set of bespoke R </w:t>
       </w:r>
-      <w:del w:id="10235" w:author="Revision merge (HM+PL)" w:date="2026-09-07T16:18:28Z">
+      <w:del w:id="10235" w:author="Revision merge (HM+PL)" w:date="2026-09-09T12:54:58Z">
         <w:r>
           <w:delText xml:space="preserve">scripts:</w:delText>
         </w:r>
       </w:del>
-      <w:ins w:id="10236" w:author="Revision merge (HM+PL)" w:date="2026-09-07T16:18:28Z">
+      <w:ins w:id="10236" w:author="Revision merge (HM+PL)" w:date="2026-09-09T12:54:58Z">
         <w:r>
           <w:t xml:space="preserve">scripts that have evolved incrementally over successive projects. These scripts frequently contain</w:t>
         </w:r>
@@ -1685,12 +1685,12 @@
       <w:r>
         <w:t xml:space="preserve"> hard-coded input paths, sample-identifier filters embedded as literal strings, per-study negative-control renames, and taxonomy fixes patched by row index. </w:t>
       </w:r>
-      <w:del w:id="10237" w:author="Revision merge (HM+PL)" w:date="2026-09-07T16:18:28Z">
+      <w:del w:id="10237" w:author="Revision merge (HM+PL)" w:date="2026-09-09T12:54:58Z">
         <w:r>
           <w:delText xml:space="preserve">Consequently,</w:delText>
         </w:r>
       </w:del>
-      <w:ins w:id="10238" w:author="Revision merge (HM+PL)" w:date="2026-09-07T16:18:28Z">
+      <w:ins w:id="10238" w:author="Revision merge (HM+PL)" w:date="2026-09-09T12:54:58Z">
         <w:r>
           <w:t xml:space="preserve">As a result,</w:t>
         </w:r>
@@ -1698,12 +1698,12 @@
       <w:r>
         <w:t xml:space="preserve"> individual script copies </w:t>
       </w:r>
-      <w:del w:id="10239" w:author="Revision merge (HM+PL)" w:date="2026-09-07T16:18:28Z">
+      <w:del w:id="10239" w:author="Revision merge (HM+PL)" w:date="2026-09-09T12:54:58Z">
         <w:r>
           <w:delText xml:space="preserve">diverge,</w:delText>
         </w:r>
       </w:del>
-      <w:ins w:id="10240" w:author="Revision merge (HM+PL)" w:date="2026-09-07T16:18:28Z">
+      <w:ins w:id="10240" w:author="Revision merge (HM+PL)" w:date="2026-09-09T12:54:58Z">
         <w:r>
           <w:t xml:space="preserve">diverge over time, reducing reproducibility and limiting portability,</w:t>
         </w:r>
@@ -1711,12 +1711,12 @@
       <w:r>
         <w:t xml:space="preserve"> and the </w:t>
       </w:r>
-      <w:del w:id="10241" w:author="Revision merge (HM+PL)" w:date="2026-09-07T16:18:28Z">
+      <w:del w:id="10241" w:author="Revision merge (HM+PL)" w:date="2026-09-09T12:54:58Z">
         <w:r>
           <w:delText xml:space="preserve">lack</w:delText>
         </w:r>
       </w:del>
-      <w:ins w:id="10242" w:author="Revision merge (HM+PL)" w:date="2026-09-07T16:18:28Z">
+      <w:ins w:id="10242" w:author="Revision merge (HM+PL)" w:date="2026-09-09T12:54:58Z">
         <w:r>
           <w:t xml:space="preserve">absence</w:t>
         </w:r>
@@ -1724,12 +1724,12 @@
       <w:r>
         <w:t xml:space="preserve"> of a shared interface prevents automated output logging. Comparing different studies requires manual reconciliation of both code and data. The reference cohort for the present work (`Chicken Batch 1`; ~46 hand-edited scripts) </w:t>
       </w:r>
-      <w:del w:id="10243" w:author="Revision merge (HM+PL)" w:date="2026-09-07T16:18:28Z">
+      <w:del w:id="10243" w:author="Revision merge (HM+PL)" w:date="2026-09-09T12:54:58Z">
         <w:r>
           <w:delText xml:space="preserve">typifies</w:delText>
         </w:r>
       </w:del>
-      <w:ins w:id="10244" w:author="Revision merge (HM+PL)" w:date="2026-09-07T16:18:28Z">
+      <w:ins w:id="10244" w:author="Revision merge (HM+PL)" w:date="2026-09-09T12:54:58Z">
         <w:r>
           <w:t xml:space="preserve">exemplifies</w:t>
         </w:r>
@@ -1737,12 +1737,12 @@
       <w:r>
         <w:t xml:space="preserve"> this pattern. The L-ARRAP pipeline [11] </w:t>
       </w:r>
-      <w:del w:id="10245" w:author="Revision merge (HM+PL)" w:date="2026-09-07T16:18:28Z">
+      <w:del w:id="10245" w:author="Revision merge (HM+PL)" w:date="2026-09-09T12:54:58Z">
         <w:r>
           <w:delText xml:space="preserve">addresses</w:delText>
         </w:r>
       </w:del>
-      <w:ins w:id="10246" w:author="Revision merge (HM+PL)" w:date="2026-09-07T16:18:28Z">
+      <w:ins w:id="10246" w:author="Revision merge (HM+PL)" w:date="2026-09-09T12:54:58Z">
         <w:r>
           <w:t xml:space="preserve">provides</w:t>
         </w:r>
@@ -1750,12 +1750,12 @@
       <w:r>
         <w:t xml:space="preserve"> </w:t>
       </w:r>
-      <w:del w:id="10247" w:author="Revision merge (HM+PL)" w:date="2026-09-07T16:18:28Z">
+      <w:del w:id="10247" w:author="Revision merge (HM+PL)" w:date="2026-09-09T12:54:58Z">
         <w:r>
           <w:delText xml:space="preserve">one</w:delText>
         </w:r>
       </w:del>
-      <w:ins w:id="10248" w:author="Revision merge (HM+PL)" w:date="2026-09-07T16:18:28Z">
+      <w:ins w:id="10248" w:author="Revision merge (HM+PL)" w:date="2026-09-09T12:54:58Z">
         <w:r>
           <w:t xml:space="preserve">a</w:t>
         </w:r>
@@ -1763,12 +1763,12 @@
       <w:r>
         <w:t xml:space="preserve"> </w:t>
       </w:r>
-      <w:del w:id="10249" w:author="Revision merge (HM+PL)" w:date="2026-09-07T16:18:28Z">
+      <w:del w:id="10249" w:author="Revision merge (HM+PL)" w:date="2026-09-09T12:54:58Z">
         <w:r>
           <w:delText xml:space="preserve">slice of this problem</w:delText>
         </w:r>
       </w:del>
-      <w:ins w:id="10250" w:author="Revision merge (HM+PL)" w:date="2026-09-07T16:18:28Z">
+      <w:ins w:id="10250" w:author="Revision merge (HM+PL)" w:date="2026-09-09T12:54:58Z">
         <w:r>
           <w:t xml:space="preserve">framework</w:t>
         </w:r>
@@ -1776,12 +1776,12 @@
       <w:r>
         <w:t xml:space="preserve"> for long-read resistome risk assessment, </w:t>
       </w:r>
-      <w:del w:id="10251" w:author="Revision merge (HM+PL)" w:date="2026-09-07T16:18:28Z">
+      <w:del w:id="10251" w:author="Revision merge (HM+PL)" w:date="2026-09-09T12:54:58Z">
         <w:r>
           <w:delText xml:space="preserve">and</w:delText>
         </w:r>
       </w:del>
-      <w:ins w:id="10252" w:author="Revision merge (HM+PL)" w:date="2026-09-07T16:18:28Z">
+      <w:ins w:id="10252" w:author="Revision merge (HM+PL)" w:date="2026-09-09T12:54:58Z">
         <w:r>
           <w:t xml:space="preserve">while</w:t>
         </w:r>
@@ -1789,12 +1789,12 @@
       <w:r>
         <w:t xml:space="preserve"> the rANOMALY workflow [12] demonstrates the </w:t>
       </w:r>
-      <w:del w:id="10253" w:author="Revision merge (HM+PL)" w:date="2026-09-07T16:18:28Z">
+      <w:del w:id="10253" w:author="Revision merge (HM+PL)" w:date="2026-09-09T12:54:58Z">
         <w:r>
           <w:delText xml:space="preserve">value</w:delText>
         </w:r>
       </w:del>
-      <w:ins w:id="10254" w:author="Revision merge (HM+PL)" w:date="2026-09-07T16:18:28Z">
+      <w:ins w:id="10254" w:author="Revision merge (HM+PL)" w:date="2026-09-09T12:54:58Z">
         <w:r>
           <w:t xml:space="preserve">advantages</w:t>
         </w:r>
@@ -1802,12 +1802,12 @@
       <w:r>
         <w:t xml:space="preserve"> of a </w:t>
       </w:r>
-      <w:del w:id="10255" w:author="Revision merge (HM+PL)" w:date="2026-09-07T16:18:28Z">
+      <w:del w:id="10255" w:author="Revision merge (HM+PL)" w:date="2026-09-09T12:54:58Z">
         <w:r>
           <w:delText xml:space="preserve">config-driven</w:delText>
         </w:r>
       </w:del>
-      <w:ins w:id="10256" w:author="Revision merge (HM+PL)" w:date="2026-09-07T16:18:28Z">
+      <w:ins w:id="10256" w:author="Revision merge (HM+PL)" w:date="2026-09-09T12:54:58Z">
         <w:r>
           <w:t xml:space="preserve">configuration-driven</w:t>
         </w:r>
@@ -1815,12 +1815,12 @@
       <w:r>
         <w:t xml:space="preserve"> R workflow with auto-generated reports for amplicon data. To our knowledge, no </w:t>
       </w:r>
-      <w:del w:id="10257" w:author="Revision merge (HM+PL)" w:date="2026-09-07T16:18:28Z">
+      <w:del w:id="10257" w:author="Revision merge (HM+PL)" w:date="2026-09-09T12:54:58Z">
         <w:r>
           <w:delText xml:space="preserve">comparable</w:delText>
         </w:r>
       </w:del>
-      <w:ins w:id="10258" w:author="Revision merge (HM+PL)" w:date="2026-09-07T16:18:28Z">
+      <w:ins w:id="10258" w:author="Revision merge (HM+PL)" w:date="2026-09-09T12:54:58Z">
         <w:r>
           <w:t xml:space="preserve">integrated end-to-end R</w:t>
         </w:r>
@@ -1828,12 +1828,12 @@
       <w:r>
         <w:t xml:space="preserve"> workflow </w:t>
       </w:r>
-      <w:del w:id="10259" w:author="Revision merge (HM+PL)" w:date="2026-09-07T16:18:28Z">
+      <w:del w:id="10259" w:author="Revision merge (HM+PL)" w:date="2026-09-09T12:54:58Z">
         <w:r>
           <w:delText xml:space="preserve">exists for end-to-end</w:delText>
         </w:r>
       </w:del>
-      <w:ins w:id="10260" w:author="Revision merge (HM+PL)" w:date="2026-09-07T16:18:28Z">
+      <w:ins w:id="10260" w:author="Revision merge (HM+PL)" w:date="2026-09-09T12:54:58Z">
         <w:r>
           <w:t xml:space="preserve">covers</w:t>
         </w:r>
@@ -1841,12 +1841,12 @@
       <w:r>
         <w:t xml:space="preserve"> long-read shotgun </w:t>
       </w:r>
-      <w:del w:id="10261" w:author="Revision merge (HM+PL)" w:date="2026-09-07T16:18:28Z">
+      <w:del w:id="10261" w:author="Revision merge (HM+PL)" w:date="2026-09-09T12:54:58Z">
         <w:r>
           <w:delText xml:space="preserve">metagenomics</w:delText>
         </w:r>
       </w:del>
-      <w:ins w:id="10262" w:author="Revision merge (HM+PL)" w:date="2026-09-07T16:18:28Z">
+      <w:ins w:id="10262" w:author="Revision merge (HM+PL)" w:date="2026-09-09T12:54:58Z">
         <w:r>
           <w:t xml:space="preserve">metagenomic</w:t>
         </w:r>
@@ -1854,12 +1854,12 @@
       <w:r>
         <w:t xml:space="preserve"> </w:t>
       </w:r>
-      <w:del w:id="10263" w:author="Revision merge (HM+PL)" w:date="2026-09-07T16:18:28Z">
+      <w:del w:id="10263" w:author="Revision merge (HM+PL)" w:date="2026-09-09T12:54:58Z">
         <w:r>
           <w:delText xml:space="preserve">that</w:delText>
         </w:r>
       </w:del>
-      <w:ins w:id="10264" w:author="Revision merge (HM+PL)" w:date="2026-09-07T16:18:28Z">
+      <w:ins w:id="10264" w:author="Revision merge (HM+PL)" w:date="2026-09-09T12:54:58Z">
         <w:r>
           <w:t xml:space="preserve">data</w:t>
         </w:r>
@@ -1867,12 +1867,12 @@
       <w:r>
         <w:t xml:space="preserve"> </w:t>
       </w:r>
-      <w:del w:id="10265" w:author="Revision merge (HM+PL)" w:date="2026-09-07T16:18:28Z">
+      <w:del w:id="10265" w:author="Revision merge (HM+PL)" w:date="2026-09-09T12:54:58Z">
         <w:r>
           <w:delText xml:space="preserve">covers</w:delText>
         </w:r>
       </w:del>
-      <w:ins w:id="10266" w:author="Revision merge (HM+PL)" w:date="2026-09-07T16:18:28Z">
+      <w:ins w:id="10266" w:author="Revision merge (HM+PL)" w:date="2026-09-09T12:54:58Z">
         <w:r>
           <w:t xml:space="preserve">spanning</w:t>
         </w:r>
@@ -1880,12 +1880,12 @@
       <w:r>
         <w:t xml:space="preserve"> </w:t>
       </w:r>
-      <w:del w:id="10267" w:author="Revision merge (HM+PL)" w:date="2026-09-07T16:18:28Z">
+      <w:del w:id="10267" w:author="Revision merge (HM+PL)" w:date="2026-09-09T12:54:58Z">
         <w:r>
           <w:delText xml:space="preserve">taxonomy,</w:delText>
         </w:r>
       </w:del>
-      <w:ins w:id="10268" w:author="Revision merge (HM+PL)" w:date="2026-09-07T16:18:28Z">
+      <w:ins w:id="10268" w:author="Revision merge (HM+PL)" w:date="2026-09-09T12:54:58Z">
         <w:r>
           <w:t xml:space="preserve">taxonomic composition, microbial</w:t>
         </w:r>
@@ -1893,12 +1893,12 @@
       <w:r>
         <w:t xml:space="preserve"> diversity, differential abundance, and </w:t>
       </w:r>
-      <w:del w:id="10269" w:author="Revision merge (HM+PL)" w:date="2026-09-07T16:18:28Z">
+      <w:del w:id="10269" w:author="Revision merge (HM+PL)" w:date="2026-09-09T12:54:58Z">
         <w:r>
           <w:delText xml:space="preserve">full</w:delText>
         </w:r>
       </w:del>
-      <w:ins w:id="10270" w:author="Revision merge (HM+PL)" w:date="2026-09-07T16:18:28Z">
+      <w:ins w:id="10270" w:author="Revision merge (HM+PL)" w:date="2026-09-09T12:54:58Z">
         <w:r>
           <w:t xml:space="preserve">comprehensive</w:t>
         </w:r>
@@ -1911,12 +1911,12 @@
       <w:pPr>
         <w:spacing w:after="120"/>
       </w:pPr>
-      <w:del w:id="10271" w:author="Revision merge (HM+PL)" w:date="2026-09-07T16:18:28Z">
+      <w:del w:id="10271" w:author="Revision merge (HM+PL)" w:date="2026-09-09T12:54:58Z">
         <w:r>
           <w:delText xml:space="preserve">We</w:delText>
         </w:r>
       </w:del>
-      <w:ins w:id="10272" w:author="Revision merge (HM+PL)" w:date="2026-09-07T16:18:28Z">
+      <w:ins w:id="10272" w:author="Revision merge (HM+PL)" w:date="2026-09-09T12:54:58Z">
         <w:r>
           <w:t xml:space="preserve">To</w:t>
         </w:r>
@@ -1924,12 +1924,12 @@
       <w:r>
         <w:t xml:space="preserve"> </w:t>
       </w:r>
-      <w:del w:id="10273" w:author="Revision merge (HM+PL)" w:date="2026-09-07T16:18:28Z">
+      <w:del w:id="10273" w:author="Revision merge (HM+PL)" w:date="2026-09-09T12:54:58Z">
         <w:r>
           <w:delText xml:space="preserve">present</w:delText>
         </w:r>
       </w:del>
-      <w:ins w:id="10274" w:author="Revision merge (HM+PL)" w:date="2026-09-07T16:18:28Z">
+      <w:ins w:id="10274" w:author="Revision merge (HM+PL)" w:date="2026-09-09T12:54:58Z">
         <w:r>
           <w:t xml:space="preserve">address this gap, we have developed</w:t>
         </w:r>
@@ -1937,12 +1937,12 @@
       <w:r>
         <w:t xml:space="preserve"> an alpha-stage R </w:t>
       </w:r>
-      <w:del w:id="10275" w:author="Revision merge (HM+PL)" w:date="2026-09-07T16:18:28Z">
+      <w:del w:id="10275" w:author="Revision merge (HM+PL)" w:date="2026-09-09T12:54:58Z">
         <w:r>
           <w:delText xml:space="preserve">workflow</w:delText>
         </w:r>
       </w:del>
-      <w:ins w:id="10276" w:author="Revision merge (HM+PL)" w:date="2026-09-07T16:18:28Z">
+      <w:ins w:id="10276" w:author="Revision merge (HM+PL)" w:date="2026-09-09T12:54:58Z">
         <w:r>
           <w:t xml:space="preserve">workflow.</w:t>
         </w:r>
@@ -1950,12 +1950,12 @@
       <w:r>
         <w:t xml:space="preserve"> </w:t>
       </w:r>
-      <w:del w:id="10277" w:author="Revision merge (HM+PL)" w:date="2026-09-07T16:18:28Z">
+      <w:del w:id="10277" w:author="Revision merge (HM+PL)" w:date="2026-09-09T12:54:58Z">
         <w:r>
           <w:delText xml:space="preserve">that</w:delText>
         </w:r>
       </w:del>
-      <w:ins w:id="10278" w:author="Revision merge (HM+PL)" w:date="2026-09-07T16:18:28Z">
+      <w:ins w:id="10278" w:author="Revision merge (HM+PL)" w:date="2026-09-09T12:54:58Z">
         <w:r>
           <w:t xml:space="preserve">Here,</w:t>
         </w:r>
@@ -1963,12 +1963,12 @@
       <w:r>
         <w:t xml:space="preserve"> </w:t>
       </w:r>
-      <w:del w:id="10279" w:author="Revision merge (HM+PL)" w:date="2026-09-07T16:18:28Z">
+      <w:del w:id="10279" w:author="Revision merge (HM+PL)" w:date="2026-09-09T12:54:58Z">
         <w:r>
           <w:delText xml:space="preserve">fills</w:delText>
         </w:r>
       </w:del>
-      <w:ins w:id="10280" w:author="Revision merge (HM+PL)" w:date="2026-09-07T16:18:28Z">
+      <w:ins w:id="10280" w:author="Revision merge (HM+PL)" w:date="2026-09-09T12:54:58Z">
         <w:r>
           <w:t xml:space="preserve">we</w:t>
         </w:r>
@@ -1976,12 +1976,12 @@
       <w:r>
         <w:t xml:space="preserve"> </w:t>
       </w:r>
-      <w:del w:id="10281" w:author="Revision merge (HM+PL)" w:date="2026-09-07T16:18:28Z">
+      <w:del w:id="10281" w:author="Revision merge (HM+PL)" w:date="2026-09-09T12:54:58Z">
         <w:r>
           <w:delText xml:space="preserve">this</w:delText>
         </w:r>
       </w:del>
-      <w:ins w:id="10282" w:author="Revision merge (HM+PL)" w:date="2026-09-07T16:18:28Z">
+      <w:ins w:id="10282" w:author="Revision merge (HM+PL)" w:date="2026-09-09T12:54:58Z">
         <w:r>
           <w:t xml:space="preserve">describe</w:t>
         </w:r>
@@ -1989,12 +1989,12 @@
       <w:r>
         <w:t xml:space="preserve"> </w:t>
       </w:r>
-      <w:del w:id="10283" w:author="Revision merge (HM+PL)" w:date="2026-09-07T16:18:28Z">
+      <w:del w:id="10283" w:author="Revision merge (HM+PL)" w:date="2026-09-09T12:54:58Z">
         <w:r>
           <w:delText xml:space="preserve">gap.</w:delText>
         </w:r>
       </w:del>
-      <w:ins w:id="10284" w:author="Revision merge (HM+PL)" w:date="2026-09-07T16:18:28Z">
+      <w:ins w:id="10284" w:author="Revision merge (HM+PL)" w:date="2026-09-09T12:54:58Z">
         <w:r>
           <w:t xml:space="preserve">the</w:t>
         </w:r>
@@ -2002,12 +2002,12 @@
       <w:r>
         <w:t xml:space="preserve"> </w:t>
       </w:r>
-      <w:del w:id="10285" w:author="Revision merge (HM+PL)" w:date="2026-09-07T16:18:28Z">
+      <w:del w:id="10285" w:author="Revision merge (HM+PL)" w:date="2026-09-09T12:54:58Z">
         <w:r>
           <w:delText xml:space="preserve">The tool is in active development; this note describes its</w:delText>
         </w:r>
       </w:del>
-      <w:ins w:id="10286" w:author="Revision merge (HM+PL)" w:date="2026-09-07T16:18:28Z">
+      <w:ins w:id="10286" w:author="Revision merge (HM+PL)" w:date="2026-09-09T12:54:58Z">
         <w:r>
           <w:t xml:space="preserve">workflow's</w:t>
         </w:r>
@@ -2015,12 +2015,12 @@
       <w:r>
         <w:t xml:space="preserve"> design, current scope, and the real-data validation strategy </w:t>
       </w:r>
-      <w:del w:id="10287" w:author="Revision merge (HM+PL)" w:date="2026-09-07T16:18:28Z">
+      <w:del w:id="10287" w:author="Revision merge (HM+PL)" w:date="2026-09-09T12:54:58Z">
         <w:r>
           <w:delText xml:space="preserve">we</w:delText>
         </w:r>
       </w:del>
-      <w:ins w:id="10288" w:author="Revision merge (HM+PL)" w:date="2026-09-07T16:18:28Z">
+      <w:ins w:id="10288" w:author="Revision merge (HM+PL)" w:date="2026-09-09T12:54:58Z">
         <w:r>
           <w:t xml:space="preserve">enabling</w:t>
         </w:r>
@@ -2028,12 +2028,12 @@
       <w:r>
         <w:t xml:space="preserve"> </w:t>
       </w:r>
-      <w:del w:id="10289" w:author="Revision merge (HM+PL)" w:date="2026-09-07T16:18:28Z">
+      <w:del w:id="10289" w:author="Revision merge (HM+PL)" w:date="2026-09-09T12:54:58Z">
         <w:r>
           <w:delText xml:space="preserve">are</w:delText>
         </w:r>
       </w:del>
-      <w:ins w:id="10290" w:author="Revision merge (HM+PL)" w:date="2026-09-07T16:18:28Z">
+      <w:ins w:id="10290" w:author="Revision merge (HM+PL)" w:date="2026-09-09T12:54:58Z">
         <w:r>
           <w:t xml:space="preserve">the</w:t>
         </w:r>
@@ -2041,12 +2041,12 @@
       <w:r>
         <w:t xml:space="preserve"> </w:t>
       </w:r>
-      <w:del w:id="10291" w:author="Revision merge (HM+PL)" w:date="2026-09-07T16:18:28Z">
+      <w:del w:id="10291" w:author="Revision merge (HM+PL)" w:date="2026-09-09T12:54:58Z">
         <w:r>
           <w:delText xml:space="preserve">using</w:delText>
         </w:r>
       </w:del>
-      <w:ins w:id="10292" w:author="Revision merge (HM+PL)" w:date="2026-09-07T16:18:28Z">
+      <w:ins w:id="10292" w:author="Revision merge (HM+PL)" w:date="2026-09-09T12:54:58Z">
         <w:r>
           <w:t xml:space="preserve">assessment</w:t>
         </w:r>
@@ -2054,12 +2054,12 @@
       <w:r>
         <w:t xml:space="preserve"> </w:t>
       </w:r>
-      <w:del w:id="10293" w:author="Revision merge (HM+PL)" w:date="2026-09-07T16:18:28Z">
+      <w:del w:id="10293" w:author="Revision merge (HM+PL)" w:date="2026-09-09T12:54:58Z">
         <w:r>
           <w:delText xml:space="preserve">to</w:delText>
         </w:r>
       </w:del>
-      <w:ins w:id="10294" w:author="Revision merge (HM+PL)" w:date="2026-09-07T16:18:28Z">
+      <w:ins w:id="10294" w:author="Revision merge (HM+PL)" w:date="2026-09-09T12:54:58Z">
         <w:r>
           <w:t xml:space="preserve">of</w:t>
         </w:r>
@@ -2067,12 +2067,12 @@
       <w:r>
         <w:t xml:space="preserve"> </w:t>
       </w:r>
-      <w:del w:id="10295" w:author="Revision merge (HM+PL)" w:date="2026-09-07T16:18:28Z">
+      <w:del w:id="10295" w:author="Revision merge (HM+PL)" w:date="2026-09-09T12:54:58Z">
         <w:r>
           <w:delText xml:space="preserve">harden</w:delText>
         </w:r>
       </w:del>
-      <w:ins w:id="10296" w:author="Revision merge (HM+PL)" w:date="2026-09-07T16:18:28Z">
+      <w:ins w:id="10296" w:author="Revision merge (HM+PL)" w:date="2026-09-09T12:54:58Z">
         <w:r>
           <w:t xml:space="preserve">its</w:t>
         </w:r>
@@ -2080,12 +2080,12 @@
       <w:r>
         <w:t xml:space="preserve"> </w:t>
       </w:r>
-      <w:del w:id="10297" w:author="Revision merge (HM+PL)" w:date="2026-09-07T16:18:28Z">
+      <w:del w:id="10297" w:author="Revision merge (HM+PL)" w:date="2026-09-09T12:54:58Z">
         <w:r>
           <w:delText xml:space="preserve">each stage.</w:delText>
         </w:r>
       </w:del>
-      <w:ins w:id="10298" w:author="Revision merge (HM+PL)" w:date="2026-09-07T16:18:28Z">
+      <w:ins w:id="10298" w:author="Revision merge (HM+PL)" w:date="2026-09-09T12:54:58Z">
         <w:r>
           <w:t xml:space="preserve">performance.</w:t>
         </w:r>
@@ -2113,7 +2113,7 @@
       <w:r>
         <w:t xml:space="preserve">The workflow is</w:t>
       </w:r>
-      <w:ins w:id="10299" w:author="Revision merge (HM+PL)" w:date="2026-09-07T16:18:28Z">
+      <w:ins w:id="10299" w:author="Revision merge (HM+PL)" w:date="2026-09-09T12:54:58Z">
         <w:r>
           <w:t xml:space="preserve"> implemented as</w:t>
         </w:r>
@@ -2121,12 +2121,12 @@
       <w:r>
         <w:t xml:space="preserve"> a stand-alone R project, </w:t>
       </w:r>
-      <w:del w:id="10300" w:author="Revision merge (HM+PL)" w:date="2026-09-07T16:18:28Z">
+      <w:del w:id="10300" w:author="Revision merge (HM+PL)" w:date="2026-09-09T12:54:58Z">
         <w:r>
           <w:delText xml:space="preserve">not</w:delText>
         </w:r>
       </w:del>
-      <w:ins w:id="10301" w:author="Revision merge (HM+PL)" w:date="2026-09-07T16:18:28Z">
+      <w:ins w:id="10301" w:author="Revision merge (HM+PL)" w:date="2026-09-09T12:54:58Z">
         <w:r>
           <w:t xml:space="preserve">rather than</w:t>
         </w:r>
@@ -2134,7 +2134,7 @@
       <w:r>
         <w:t xml:space="preserve"> an installable </w:t>
       </w:r>
-      <w:ins w:id="10302" w:author="Revision merge (HM+PL)" w:date="2026-09-07T16:18:28Z">
+      <w:ins w:id="10302" w:author="Revision merge (HM+PL)" w:date="2026-09-09T12:54:58Z">
         <w:r>
           <w:t xml:space="preserve">software </w:t>
         </w:r>
@@ -2142,12 +2142,12 @@
       <w:r>
         <w:t xml:space="preserve">package. </w:t>
       </w:r>
-      <w:del w:id="10303" w:author="Revision merge (HM+PL)" w:date="2026-09-07T16:18:28Z">
+      <w:del w:id="10303" w:author="Revision merge (HM+PL)" w:date="2026-09-09T12:54:58Z">
         <w:r>
           <w:delText xml:space="preserve">A</w:delText>
         </w:r>
       </w:del>
-      <w:ins w:id="10304" w:author="Revision merge (HM+PL)" w:date="2026-09-07T16:18:28Z">
+      <w:ins w:id="10304" w:author="Revision merge (HM+PL)" w:date="2026-09-09T12:54:58Z">
         <w:r>
           <w:t xml:space="preserve">Execution is initiated through a</w:t>
         </w:r>
@@ -2155,12 +2155,12 @@
       <w:r>
         <w:t xml:space="preserve"> single entry </w:t>
       </w:r>
-      <w:del w:id="10305" w:author="Revision merge (HM+PL)" w:date="2026-09-07T16:18:28Z">
+      <w:del w:id="10305" w:author="Revision merge (HM+PL)" w:date="2026-09-09T12:54:58Z">
         <w:r>
           <w:delText xml:space="preserve">point</w:delText>
         </w:r>
       </w:del>
-      <w:ins w:id="10306" w:author="Revision merge (HM+PL)" w:date="2026-09-07T16:18:28Z">
+      <w:ins w:id="10306" w:author="Revision merge (HM+PL)" w:date="2026-09-09T12:54:58Z">
         <w:r>
           <w:t xml:space="preserve">script</w:t>
         </w:r>
@@ -2168,12 +2168,12 @@
       <w:r>
         <w:t xml:space="preserve"> (`run_pipeline.R`) </w:t>
       </w:r>
-      <w:del w:id="10307" w:author="Revision merge (HM+PL)" w:date="2026-09-07T16:18:28Z">
+      <w:del w:id="10307" w:author="Revision merge (HM+PL)" w:date="2026-09-09T12:54:58Z">
         <w:r>
           <w:delText xml:space="preserve">consumes</w:delText>
         </w:r>
       </w:del>
-      <w:ins w:id="10308" w:author="Revision merge (HM+PL)" w:date="2026-09-07T16:18:28Z">
+      <w:ins w:id="10308" w:author="Revision merge (HM+PL)" w:date="2026-09-09T12:54:58Z">
         <w:r>
           <w:t xml:space="preserve">that reads</w:t>
         </w:r>
@@ -2181,12 +2181,12 @@
       <w:r>
         <w:t xml:space="preserve"> one YAML configuration file </w:t>
       </w:r>
-      <w:del w:id="10309" w:author="Revision merge (HM+PL)" w:date="2026-09-07T16:18:28Z">
+      <w:del w:id="10309" w:author="Revision merge (HM+PL)" w:date="2026-09-09T12:54:58Z">
         <w:r>
           <w:delText xml:space="preserve">per</w:delText>
         </w:r>
       </w:del>
-      <w:ins w:id="10310" w:author="Revision merge (HM+PL)" w:date="2026-09-07T16:18:28Z">
+      <w:ins w:id="10310" w:author="Revision merge (HM+PL)" w:date="2026-09-09T12:54:58Z">
         <w:r>
           <w:t xml:space="preserve">for each</w:t>
         </w:r>
@@ -2194,12 +2194,12 @@
       <w:r>
         <w:t xml:space="preserve"> study and dispatches </w:t>
       </w:r>
-      <w:del w:id="10311" w:author="Revision merge (HM+PL)" w:date="2026-09-07T16:18:28Z">
+      <w:del w:id="10311" w:author="Revision merge (HM+PL)" w:date="2026-09-09T12:54:58Z">
         <w:r>
           <w:delText xml:space="preserve">to</w:delText>
         </w:r>
       </w:del>
-      <w:ins w:id="10312" w:author="Revision merge (HM+PL)" w:date="2026-09-07T16:18:28Z">
+      <w:ins w:id="10312" w:author="Revision merge (HM+PL)" w:date="2026-09-09T12:54:58Z">
         <w:r>
           <w:t xml:space="preserve">the workflow across</w:t>
         </w:r>
@@ -2207,12 +2207,12 @@
       <w:r>
         <w:t xml:space="preserve"> fifteen modules (`R/00_setup.R` through `R/13_panels.R`; plus the manifest stage </w:t>
       </w:r>
-      <w:del w:id="10313" w:author="Revision merge (HM+PL)" w:date="2026-09-07T16:18:28Z">
+      <w:del w:id="10313" w:author="Revision merge (HM+PL)" w:date="2026-09-09T12:54:58Z">
         <w:r>
           <w:delText xml:space="preserve">`R/14`</w:delText>
         </w:r>
       </w:del>
-      <w:ins w:id="10314" w:author="Revision merge (HM+PL)" w:date="2026-09-07T16:18:28Z">
+      <w:ins w:id="10314" w:author="Revision merge (HM+PL)" w:date="2026-09-09T12:54:58Z">
         <w:r>
           <w:t xml:space="preserve">`R/14`,</w:t>
         </w:r>
@@ -2220,12 +2220,12 @@
       <w:r>
         <w:t xml:space="preserve"> which runs </w:t>
       </w:r>
-      <w:del w:id="10315" w:author="Revision merge (HM+PL)" w:date="2026-09-07T16:18:28Z">
+      <w:del w:id="10315" w:author="Revision merge (HM+PL)" w:date="2026-09-09T12:54:58Z">
         <w:r>
           <w:delText xml:space="preserve">last);</w:delText>
         </w:r>
       </w:del>
-      <w:ins w:id="10316" w:author="Revision merge (HM+PL)" w:date="2026-09-07T16:18:28Z">
+      <w:ins w:id="10316" w:author="Revision merge (HM+PL)" w:date="2026-09-09T12:54:58Z">
         <w:r>
           <w:t xml:space="preserve">last).</w:t>
         </w:r>
@@ -2233,12 +2233,12 @@
       <w:r>
         <w:t xml:space="preserve"> </w:t>
       </w:r>
-      <w:del w:id="10317" w:author="Revision merge (HM+PL)" w:date="2026-09-07T16:18:28Z">
+      <w:del w:id="10317" w:author="Revision merge (HM+PL)" w:date="2026-09-09T12:54:58Z">
         <w:r>
           <w:delText xml:space="preserve">a</w:delText>
         </w:r>
       </w:del>
-      <w:ins w:id="10318" w:author="Revision merge (HM+PL)" w:date="2026-09-07T16:18:28Z">
+      <w:ins w:id="10318" w:author="Revision merge (HM+PL)" w:date="2026-09-09T12:54:58Z">
         <w:r>
           <w:t xml:space="preserve">A</w:t>
         </w:r>
@@ -2246,12 +2246,12 @@
       <w:r>
         <w:t xml:space="preserve"> Quarto dashboard template (`templates/report.qmd`) renders all outputs into a single multi-page HTML </w:t>
       </w:r>
-      <w:del w:id="10319" w:author="Revision merge (HM+PL)" w:date="2026-09-07T16:18:28Z">
+      <w:del w:id="10319" w:author="Revision merge (HM+PL)" w:date="2026-09-09T12:54:58Z">
         <w:r>
           <w:delText xml:space="preserve">deliverable,</w:delText>
         </w:r>
       </w:del>
-      <w:ins w:id="10320" w:author="Revision merge (HM+PL)" w:date="2026-09-07T16:18:28Z">
+      <w:ins w:id="10320" w:author="Revision merge (HM+PL)" w:date="2026-09-09T12:54:58Z">
         <w:r>
           <w:t xml:space="preserve">deliverable.</w:t>
         </w:r>
@@ -2259,12 +2259,12 @@
       <w:r>
         <w:t xml:space="preserve"> </w:t>
       </w:r>
-      <w:del w:id="10321" w:author="Revision merge (HM+PL)" w:date="2026-09-07T16:18:28Z">
+      <w:del w:id="10321" w:author="Revision merge (HM+PL)" w:date="2026-09-09T12:54:58Z">
         <w:r>
           <w:delText xml:space="preserve">a</w:delText>
         </w:r>
       </w:del>
-      <w:ins w:id="10322" w:author="Revision merge (HM+PL)" w:date="2026-09-07T16:18:28Z">
+      <w:ins w:id="10322" w:author="Revision merge (HM+PL)" w:date="2026-09-09T12:54:58Z">
         <w:r>
           <w:t xml:space="preserve">A subsequent</w:t>
         </w:r>
@@ -2272,7 +2272,7 @@
       <w:r>
         <w:t xml:space="preserve"> publication-panels stage assembles </w:t>
       </w:r>
-      <w:ins w:id="10323" w:author="Revision merge (HM+PL)" w:date="2026-09-07T16:18:28Z">
+      <w:ins w:id="10323" w:author="Revision merge (HM+PL)" w:date="2026-09-09T12:54:58Z">
         <w:r>
           <w:t xml:space="preserve">publication-ready composite figures for the </w:t>
         </w:r>
@@ -2280,12 +2280,12 @@
       <w:r>
         <w:t xml:space="preserve">main and supplementary </w:t>
       </w:r>
-      <w:del w:id="10324" w:author="Revision merge (HM+PL)" w:date="2026-09-07T16:18:28Z">
+      <w:del w:id="10324" w:author="Revision merge (HM+PL)" w:date="2026-09-09T12:54:58Z">
         <w:r>
           <w:delText xml:space="preserve">composite</w:delText>
         </w:r>
       </w:del>
-      <w:ins w:id="10325" w:author="Revision merge (HM+PL)" w:date="2026-09-07T16:18:28Z">
+      <w:ins w:id="10325" w:author="Revision merge (HM+PL)" w:date="2026-09-09T12:54:58Z">
         <w:r>
           <w:t xml:space="preserve">datasets</w:t>
         </w:r>
@@ -2293,12 +2293,12 @@
       <w:r>
         <w:t xml:space="preserve"> </w:t>
       </w:r>
-      <w:del w:id="10326" w:author="Revision merge (HM+PL)" w:date="2026-09-07T16:18:28Z">
+      <w:del w:id="10326" w:author="Revision merge (HM+PL)" w:date="2026-09-09T12:54:58Z">
         <w:r>
           <w:delText xml:space="preserve">figures</w:delText>
         </w:r>
       </w:del>
-      <w:ins w:id="10327" w:author="Revision merge (HM+PL)" w:date="2026-09-07T16:18:28Z">
+      <w:ins w:id="10327" w:author="Revision merge (HM+PL)" w:date="2026-09-09T12:54:58Z">
         <w:r>
           <w:t xml:space="preserve">and</w:t>
         </w:r>
@@ -2306,12 +2306,12 @@
       <w:r>
         <w:t xml:space="preserve"> </w:t>
       </w:r>
-      <w:del w:id="10328" w:author="Revision merge (HM+PL)" w:date="2026-09-07T16:18:28Z">
+      <w:del w:id="10328" w:author="Revision merge (HM+PL)" w:date="2026-09-09T12:54:58Z">
         <w:r>
           <w:delText xml:space="preserve">plus</w:delText>
         </w:r>
       </w:del>
-      <w:ins w:id="10329" w:author="Revision merge (HM+PL)" w:date="2026-09-07T16:18:28Z">
+      <w:ins w:id="10329" w:author="Revision merge (HM+PL)" w:date="2026-09-09T12:54:58Z">
         <w:r>
           <w:t xml:space="preserve">compiles</w:t>
         </w:r>
@@ -2319,12 +2319,12 @@
       <w:r>
         <w:t xml:space="preserve"> </w:t>
       </w:r>
-      <w:del w:id="10330" w:author="Revision merge (HM+PL)" w:date="2026-09-07T16:18:28Z">
+      <w:del w:id="10330" w:author="Revision merge (HM+PL)" w:date="2026-09-09T12:54:58Z">
         <w:r>
           <w:delText xml:space="preserve">a</w:delText>
         </w:r>
       </w:del>
-      <w:ins w:id="10331" w:author="Revision merge (HM+PL)" w:date="2026-09-07T16:18:28Z">
+      <w:ins w:id="10331" w:author="Revision merge (HM+PL)" w:date="2026-09-09T12:54:58Z">
         <w:r>
           <w:t xml:space="preserve">the accompanying</w:t>
         </w:r>
@@ -2332,12 +2332,12 @@
       <w:r>
         <w:t xml:space="preserve"> supplementary tables </w:t>
       </w:r>
-      <w:del w:id="10332" w:author="Revision merge (HM+PL)" w:date="2026-09-07T16:18:28Z">
+      <w:del w:id="10332" w:author="Revision merge (HM+PL)" w:date="2026-09-09T12:54:58Z">
         <w:r>
           <w:delText xml:space="preserve">workbook,</w:delText>
         </w:r>
       </w:del>
-      <w:ins w:id="10333" w:author="Revision merge (HM+PL)" w:date="2026-09-07T16:18:28Z">
+      <w:ins w:id="10333" w:author="Revision merge (HM+PL)" w:date="2026-09-09T12:54:58Z">
         <w:r>
           <w:t xml:space="preserve">into</w:t>
         </w:r>
@@ -2345,12 +2345,12 @@
       <w:r>
         <w:t xml:space="preserve"> </w:t>
       </w:r>
-      <w:del w:id="10334" w:author="Revision merge (HM+PL)" w:date="2026-09-07T16:18:28Z">
+      <w:del w:id="10334" w:author="Revision merge (HM+PL)" w:date="2026-09-09T12:54:58Z">
         <w:r>
           <w:delText xml:space="preserve">and</w:delText>
         </w:r>
       </w:del>
-      <w:ins w:id="10335" w:author="Revision merge (HM+PL)" w:date="2026-09-07T16:18:28Z">
+      <w:ins w:id="10335" w:author="Revision merge (HM+PL)" w:date="2026-09-09T12:54:58Z">
         <w:r>
           <w:t xml:space="preserve">a workbook. The pipeline concludes with the generation of</w:t>
         </w:r>
@@ -2358,7 +2358,7 @@
       <w:r>
         <w:t xml:space="preserve"> a final </w:t>
       </w:r>
-      <w:del w:id="10336" w:author="Revision merge (HM+PL)" w:date="2026-09-07T16:18:28Z">
+      <w:del w:id="10336" w:author="Revision merge (HM+PL)" w:date="2026-09-09T12:54:58Z">
         <w:r>
           <w:delText xml:space="preserve">manifest stage emits </w:delText>
         </w:r>
@@ -2366,12 +2366,12 @@
       <w:r>
         <w:t xml:space="preserve">`manifest.json` </w:t>
       </w:r>
-      <w:del w:id="10337" w:author="Revision merge (HM+PL)" w:date="2026-09-07T16:18:28Z">
+      <w:del w:id="10337" w:author="Revision merge (HM+PL)" w:date="2026-09-09T12:54:58Z">
         <w:r>
           <w:delText xml:space="preserve">describing</w:delText>
         </w:r>
       </w:del>
-      <w:ins w:id="10338" w:author="Revision merge (HM+PL)" w:date="2026-09-07T16:18:28Z">
+      <w:ins w:id="10338" w:author="Revision merge (HM+PL)" w:date="2026-09-09T12:54:58Z">
         <w:r>
           <w:t xml:space="preserve">file,</w:t>
         </w:r>
@@ -2379,12 +2379,12 @@
       <w:r>
         <w:t xml:space="preserve"> </w:t>
       </w:r>
-      <w:del w:id="10339" w:author="Revision merge (HM+PL)" w:date="2026-09-07T16:18:28Z">
+      <w:del w:id="10339" w:author="Revision merge (HM+PL)" w:date="2026-09-09T12:54:58Z">
         <w:r>
           <w:delText xml:space="preserve">every</w:delText>
         </w:r>
       </w:del>
-      <w:ins w:id="10340" w:author="Revision merge (HM+PL)" w:date="2026-09-07T16:18:28Z">
+      <w:ins w:id="10340" w:author="Revision merge (HM+PL)" w:date="2026-09-09T12:54:58Z">
         <w:r>
           <w:t xml:space="preserve">providing</w:t>
         </w:r>
@@ -2392,12 +2392,12 @@
       <w:r>
         <w:t xml:space="preserve"> </w:t>
       </w:r>
-      <w:del w:id="10341" w:author="Revision merge (HM+PL)" w:date="2026-09-07T16:18:28Z">
+      <w:del w:id="10341" w:author="Revision merge (HM+PL)" w:date="2026-09-09T12:54:58Z">
         <w:r>
           <w:delText xml:space="preserve">artefact</w:delText>
         </w:r>
       </w:del>
-      <w:ins w:id="10342" w:author="Revision merge (HM+PL)" w:date="2026-09-07T16:18:28Z">
+      <w:ins w:id="10342" w:author="Revision merge (HM+PL)" w:date="2026-09-09T12:54:58Z">
         <w:r>
           <w:t xml:space="preserve">a complete record of all artefacts</w:t>
         </w:r>
@@ -2413,12 +2413,12 @@
       <w:r>
         <w:t xml:space="preserve">[FIGURE] **Figure 1.** MERIDIAN workflow. A single `config.yaml` drives fifteen R modules (R/00–R/14) </w:t>
       </w:r>
-      <w:del w:id="10343" w:author="Revision merge (HM+PL)" w:date="2026-09-07T16:18:28Z">
+      <w:del w:id="10343" w:author="Revision merge (HM+PL)" w:date="2026-09-09T12:54:58Z">
         <w:r>
           <w:delText xml:space="preserve">consuming</w:delText>
         </w:r>
       </w:del>
-      <w:ins w:id="10344" w:author="Revision merge (HM+PL)" w:date="2026-09-07T16:18:28Z">
+      <w:ins w:id="10344" w:author="Revision merge (HM+PL)" w:date="2026-09-09T12:54:58Z">
         <w:r>
           <w:t xml:space="preserve">that load</w:t>
         </w:r>
@@ -2434,12 +2434,12 @@
       <w:r>
         <w:t xml:space="preserve">**Configuration-driven.** </w:t>
       </w:r>
-      <w:del w:id="10345" w:author="Revision merge (HM+PL)" w:date="2026-09-07T16:18:28Z">
+      <w:del w:id="10345" w:author="Revision merge (HM+PL)" w:date="2026-09-09T12:54:58Z">
         <w:r>
           <w:delText xml:space="preserve">Everything</w:delText>
         </w:r>
       </w:del>
-      <w:ins w:id="10346" w:author="Revision merge (HM+PL)" w:date="2026-09-07T16:18:28Z">
+      <w:ins w:id="10346" w:author="Revision merge (HM+PL)" w:date="2026-09-09T12:54:58Z">
         <w:r>
           <w:t xml:space="preserve">All</w:t>
         </w:r>
@@ -2447,12 +2447,12 @@
       <w:r>
         <w:t xml:space="preserve"> </w:t>
       </w:r>
-      <w:del w:id="10347" w:author="Revision merge (HM+PL)" w:date="2026-09-07T16:18:28Z">
+      <w:del w:id="10347" w:author="Revision merge (HM+PL)" w:date="2026-09-09T12:54:58Z">
         <w:r>
           <w:delText xml:space="preserve">that</w:delText>
         </w:r>
       </w:del>
-      <w:ins w:id="10348" w:author="Revision merge (HM+PL)" w:date="2026-09-07T16:18:28Z">
+      <w:ins w:id="10348" w:author="Revision merge (HM+PL)" w:date="2026-09-09T12:54:58Z">
         <w:r>
           <w:t xml:space="preserve">study-specific</w:t>
         </w:r>
@@ -2460,12 +2460,12 @@
       <w:r>
         <w:t xml:space="preserve"> </w:t>
       </w:r>
-      <w:del w:id="10349" w:author="Revision merge (HM+PL)" w:date="2026-09-07T16:18:28Z">
+      <w:del w:id="10349" w:author="Revision merge (HM+PL)" w:date="2026-09-09T12:54:58Z">
         <w:r>
           <w:delText xml:space="preserve">varies between studies</w:delText>
         </w:r>
       </w:del>
-      <w:ins w:id="10350" w:author="Revision merge (HM+PL)" w:date="2026-09-07T16:18:28Z">
+      <w:ins w:id="10350" w:author="Revision merge (HM+PL)" w:date="2026-09-09T12:54:58Z">
         <w:r>
           <w:t xml:space="preserve">parameters</w:t>
         </w:r>
@@ -2473,12 +2473,12 @@
       <w:r>
         <w:t xml:space="preserve"> — metadata file </w:t>
       </w:r>
-      <w:del w:id="10351" w:author="Revision merge (HM+PL)" w:date="2026-09-07T16:18:28Z">
+      <w:del w:id="10351" w:author="Revision merge (HM+PL)" w:date="2026-09-09T12:54:58Z">
         <w:r>
           <w:delText xml:space="preserve">path,</w:delText>
         </w:r>
       </w:del>
-      <w:ins w:id="10352" w:author="Revision merge (HM+PL)" w:date="2026-09-07T16:18:28Z">
+      <w:ins w:id="10352" w:author="Revision merge (HM+PL)" w:date="2026-09-09T12:54:58Z">
         <w:r>
           <w:t xml:space="preserve">locations, sample</w:t>
         </w:r>
@@ -2486,12 +2486,12 @@
       <w:r>
         <w:t xml:space="preserve"> grouping </w:t>
       </w:r>
-      <w:del w:id="10353" w:author="Revision merge (HM+PL)" w:date="2026-09-07T16:18:28Z">
+      <w:del w:id="10353" w:author="Revision merge (HM+PL)" w:date="2026-09-09T12:54:58Z">
         <w:r>
           <w:delText xml:space="preserve">columns,</w:delText>
         </w:r>
       </w:del>
-      <w:ins w:id="10354" w:author="Revision merge (HM+PL)" w:date="2026-09-07T16:18:28Z">
+      <w:ins w:id="10354" w:author="Revision merge (HM+PL)" w:date="2026-09-09T12:54:58Z">
         <w:r>
           <w:t xml:space="preserve">variables,</w:t>
         </w:r>
@@ -2499,7 +2499,7 @@
       <w:r>
         <w:t xml:space="preserve"> negative-control identifiers, abundance </w:t>
       </w:r>
-      <w:ins w:id="10355" w:author="Revision merge (HM+PL)" w:date="2026-09-07T16:18:28Z">
+      <w:ins w:id="10355" w:author="Revision merge (HM+PL)" w:date="2026-09-09T12:54:58Z">
         <w:r>
           <w:t xml:space="preserve">filtering </w:t>
         </w:r>
@@ -2507,7 +2507,7 @@
       <w:r>
         <w:t xml:space="preserve">thresholds,</w:t>
       </w:r>
-      <w:ins w:id="10356" w:author="Revision merge (HM+PL)" w:date="2026-09-07T16:18:28Z">
+      <w:ins w:id="10356" w:author="Revision merge (HM+PL)" w:date="2026-09-09T12:54:58Z">
         <w:r>
           <w:t xml:space="preserve"> and</w:t>
         </w:r>
@@ -2515,7 +2515,7 @@
       <w:r>
         <w:t xml:space="preserve"> sample selection </w:t>
       </w:r>
-      <w:ins w:id="10357" w:author="Revision merge (HM+PL)" w:date="2026-09-07T16:18:28Z">
+      <w:ins w:id="10357" w:author="Revision merge (HM+PL)" w:date="2026-09-09T12:54:58Z">
         <w:r>
           <w:t xml:space="preserve">criteria </w:t>
         </w:r>
@@ -2523,12 +2523,12 @@
       <w:r>
         <w:t xml:space="preserve">— </w:t>
       </w:r>
-      <w:del w:id="10358" w:author="Revision merge (HM+PL)" w:date="2026-09-07T16:18:28Z">
+      <w:del w:id="10358" w:author="Revision merge (HM+PL)" w:date="2026-09-09T12:54:58Z">
         <w:r>
           <w:delText xml:space="preserve">is</w:delText>
         </w:r>
       </w:del>
-      <w:ins w:id="10359" w:author="Revision merge (HM+PL)" w:date="2026-09-07T16:18:28Z">
+      <w:ins w:id="10359" w:author="Revision merge (HM+PL)" w:date="2026-09-09T12:54:58Z">
         <w:r>
           <w:t xml:space="preserve">are</w:t>
         </w:r>
@@ -2536,12 +2536,12 @@
       <w:r>
         <w:t xml:space="preserve"> </w:t>
       </w:r>
-      <w:del w:id="10360" w:author="Revision merge (HM+PL)" w:date="2026-09-07T16:18:28Z">
+      <w:del w:id="10360" w:author="Revision merge (HM+PL)" w:date="2026-09-09T12:54:58Z">
         <w:r>
           <w:delText xml:space="preserve">declared</w:delText>
         </w:r>
       </w:del>
-      <w:ins w:id="10361" w:author="Revision merge (HM+PL)" w:date="2026-09-07T16:18:28Z">
+      <w:ins w:id="10361" w:author="Revision merge (HM+PL)" w:date="2026-09-09T12:54:58Z">
         <w:r>
           <w:t xml:space="preserve">defined</w:t>
         </w:r>
@@ -2549,12 +2549,12 @@
       <w:r>
         <w:t xml:space="preserve"> in `config.yaml`. </w:t>
       </w:r>
-      <w:del w:id="10362" w:author="Revision merge (HM+PL)" w:date="2026-09-07T16:18:28Z">
+      <w:del w:id="10362" w:author="Revision merge (HM+PL)" w:date="2026-09-09T12:54:58Z">
         <w:r>
           <w:delText xml:space="preserve">Module</w:delText>
         </w:r>
       </w:del>
-      <w:ins w:id="10363" w:author="Revision merge (HM+PL)" w:date="2026-09-07T16:18:28Z">
+      <w:ins w:id="10363" w:author="Revision merge (HM+PL)" w:date="2026-09-09T12:54:58Z">
         <w:r>
           <w:t xml:space="preserve">Consequently, module</w:t>
         </w:r>
@@ -2562,12 +2562,12 @@
       <w:r>
         <w:t xml:space="preserve"> code </w:t>
       </w:r>
-      <w:del w:id="10364" w:author="Revision merge (HM+PL)" w:date="2026-09-07T16:18:28Z">
+      <w:del w:id="10364" w:author="Revision merge (HM+PL)" w:date="2026-09-09T12:54:58Z">
         <w:r>
           <w:delText xml:space="preserve">is</w:delText>
         </w:r>
       </w:del>
-      <w:ins w:id="10365" w:author="Revision merge (HM+PL)" w:date="2026-09-07T16:18:28Z">
+      <w:ins w:id="10365" w:author="Revision merge (HM+PL)" w:date="2026-09-09T12:54:58Z">
         <w:r>
           <w:t xml:space="preserve">remains</w:t>
         </w:r>
@@ -2575,12 +2575,12 @@
       <w:r>
         <w:t xml:space="preserve"> </w:t>
       </w:r>
-      <w:del w:id="10366" w:author="Revision merge (HM+PL)" w:date="2026-09-07T16:18:28Z">
+      <w:del w:id="10366" w:author="Revision merge (HM+PL)" w:date="2026-09-09T12:54:58Z">
         <w:r>
           <w:delText xml:space="preserve">not</w:delText>
         </w:r>
       </w:del>
-      <w:ins w:id="10367" w:author="Revision merge (HM+PL)" w:date="2026-09-07T16:18:28Z">
+      <w:ins w:id="10367" w:author="Revision merge (HM+PL)" w:date="2026-09-09T12:54:58Z">
         <w:r>
           <w:t xml:space="preserve">invariant</w:t>
         </w:r>
@@ -2588,12 +2588,12 @@
       <w:r>
         <w:t xml:space="preserve"> </w:t>
       </w:r>
-      <w:del w:id="10368" w:author="Revision merge (HM+PL)" w:date="2026-09-07T16:18:28Z">
+      <w:del w:id="10368" w:author="Revision merge (HM+PL)" w:date="2026-09-09T12:54:58Z">
         <w:r>
           <w:delText xml:space="preserve">edited</w:delText>
         </w:r>
       </w:del>
-      <w:ins w:id="10369" w:author="Revision merge (HM+PL)" w:date="2026-09-07T16:18:28Z">
+      <w:ins w:id="10369" w:author="Revision merge (HM+PL)" w:date="2026-09-09T12:54:58Z">
         <w:r>
           <w:t xml:space="preserve">across</w:t>
         </w:r>
@@ -2601,12 +2601,12 @@
       <w:r>
         <w:t xml:space="preserve"> </w:t>
       </w:r>
-      <w:del w:id="10370" w:author="Revision merge (HM+PL)" w:date="2026-09-07T16:18:28Z">
+      <w:del w:id="10370" w:author="Revision merge (HM+PL)" w:date="2026-09-09T12:54:58Z">
         <w:r>
           <w:delText xml:space="preserve">per-project;</w:delText>
         </w:r>
       </w:del>
-      <w:ins w:id="10371" w:author="Revision merge (HM+PL)" w:date="2026-09-07T16:18:28Z">
+      <w:ins w:id="10371" w:author="Revision merge (HM+PL)" w:date="2026-09-09T12:54:58Z">
         <w:r>
           <w:t xml:space="preserve">projects, with</w:t>
         </w:r>
@@ -2614,12 +2614,12 @@
       <w:r>
         <w:t xml:space="preserve"> dataset-specific </w:t>
       </w:r>
-      <w:del w:id="10372" w:author="Revision merge (HM+PL)" w:date="2026-09-07T16:18:28Z">
+      <w:del w:id="10372" w:author="Revision merge (HM+PL)" w:date="2026-09-09T12:54:58Z">
         <w:r>
           <w:delText xml:space="preserve">adjustments</w:delText>
         </w:r>
       </w:del>
-      <w:ins w:id="10373" w:author="Revision merge (HM+PL)" w:date="2026-09-07T16:18:28Z">
+      <w:ins w:id="10373" w:author="Revision merge (HM+PL)" w:date="2026-09-09T12:54:58Z">
         <w:r>
           <w:t xml:space="preserve">customisation</w:t>
         </w:r>
@@ -2627,12 +2627,12 @@
       <w:r>
         <w:t xml:space="preserve"> </w:t>
       </w:r>
-      <w:del w:id="10374" w:author="Revision merge (HM+PL)" w:date="2026-09-07T16:18:28Z">
+      <w:del w:id="10374" w:author="Revision merge (HM+PL)" w:date="2026-09-09T12:54:58Z">
         <w:r>
           <w:delText xml:space="preserve">live</w:delText>
         </w:r>
       </w:del>
-      <w:ins w:id="10375" w:author="Revision merge (HM+PL)" w:date="2026-09-07T16:18:28Z">
+      <w:ins w:id="10375" w:author="Revision merge (HM+PL)" w:date="2026-09-09T12:54:58Z">
         <w:r>
           <w:t xml:space="preserve">implemented</w:t>
         </w:r>
@@ -2640,12 +2640,12 @@
       <w:r>
         <w:t xml:space="preserve"> </w:t>
       </w:r>
-      <w:del w:id="10376" w:author="Revision merge (HM+PL)" w:date="2026-09-07T16:18:28Z">
+      <w:del w:id="10376" w:author="Revision merge (HM+PL)" w:date="2026-09-09T12:54:58Z">
         <w:r>
           <w:delText xml:space="preserve">in</w:delText>
         </w:r>
       </w:del>
-      <w:ins w:id="10377" w:author="Revision merge (HM+PL)" w:date="2026-09-07T16:18:28Z">
+      <w:ins w:id="10377" w:author="Revision merge (HM+PL)" w:date="2026-09-09T12:54:58Z">
         <w:r>
           <w:t xml:space="preserve">exclusively through</w:t>
         </w:r>
@@ -2653,7 +2653,7 @@
       <w:r>
         <w:t xml:space="preserve"> `config.yaml` </w:t>
       </w:r>
-      <w:ins w:id="10378" w:author="Revision merge (HM+PL)" w:date="2026-09-07T16:18:28Z">
+      <w:ins w:id="10378" w:author="Revision merge (HM+PL)" w:date="2026-09-09T12:54:58Z">
         <w:r>
           <w:t xml:space="preserve">settings </w:t>
         </w:r>
@@ -2661,7 +2661,7 @@
       <w:r>
         <w:t xml:space="preserve">or</w:t>
       </w:r>
-      <w:del w:id="10379" w:author="Revision merge (HM+PL)" w:date="2026-09-07T16:18:28Z">
+      <w:del w:id="10379" w:author="Revision merge (HM+PL)" w:date="2026-09-09T12:54:58Z">
         <w:r>
           <w:delText xml:space="preserve"> in</w:delText>
         </w:r>
@@ -2669,12 +2669,12 @@
       <w:r>
         <w:t xml:space="preserve"> the structured fix tables it references. R/00 (setup) and R/01 (input loading) </w:t>
       </w:r>
-      <w:del w:id="10380" w:author="Revision merge (HM+PL)" w:date="2026-09-07T16:18:28Z">
+      <w:del w:id="10380" w:author="Revision merge (HM+PL)" w:date="2026-09-09T12:54:58Z">
         <w:r>
           <w:delText xml:space="preserve">run</w:delText>
         </w:r>
       </w:del>
-      <w:ins w:id="10381" w:author="Revision merge (HM+PL)" w:date="2026-09-07T16:18:28Z">
+      <w:ins w:id="10381" w:author="Revision merge (HM+PL)" w:date="2026-09-09T12:54:58Z">
         <w:r>
           <w:t xml:space="preserve">are executed</w:t>
         </w:r>
@@ -2682,12 +2682,12 @@
       <w:r>
         <w:t xml:space="preserve"> by </w:t>
       </w:r>
-      <w:del w:id="10382" w:author="Revision merge (HM+PL)" w:date="2026-09-07T16:18:28Z">
+      <w:del w:id="10382" w:author="Revision merge (HM+PL)" w:date="2026-09-09T12:54:58Z">
         <w:r>
           <w:delText xml:space="preserve">default;</w:delText>
         </w:r>
       </w:del>
-      <w:ins w:id="10383" w:author="Revision merge (HM+PL)" w:date="2026-09-07T16:18:28Z">
+      <w:ins w:id="10383" w:author="Revision merge (HM+PL)" w:date="2026-09-09T12:54:58Z">
         <w:r>
           <w:t xml:space="preserve">default,</w:t>
         </w:r>
@@ -2695,12 +2695,12 @@
       <w:r>
         <w:t xml:space="preserve"> </w:t>
       </w:r>
-      <w:del w:id="10384" w:author="Revision merge (HM+PL)" w:date="2026-09-07T16:18:28Z">
+      <w:del w:id="10384" w:author="Revision merge (HM+PL)" w:date="2026-09-09T12:54:58Z">
         <w:r>
           <w:delText xml:space="preserve">every</w:delText>
         </w:r>
       </w:del>
-      <w:ins w:id="10385" w:author="Revision merge (HM+PL)" w:date="2026-09-07T16:18:28Z">
+      <w:ins w:id="10385" w:author="Revision merge (HM+PL)" w:date="2026-09-09T12:54:58Z">
         <w:r>
           <w:t xml:space="preserve">whereas</w:t>
         </w:r>
@@ -2708,12 +2708,12 @@
       <w:r>
         <w:t xml:space="preserve"> </w:t>
       </w:r>
-      <w:del w:id="10386" w:author="Revision merge (HM+PL)" w:date="2026-09-07T16:18:28Z">
+      <w:del w:id="10386" w:author="Revision merge (HM+PL)" w:date="2026-09-09T12:54:58Z">
         <w:r>
           <w:delText xml:space="preserve">subsequent</w:delText>
         </w:r>
       </w:del>
-      <w:ins w:id="10387" w:author="Revision merge (HM+PL)" w:date="2026-09-07T16:18:28Z">
+      <w:ins w:id="10387" w:author="Revision merge (HM+PL)" w:date="2026-09-09T12:54:58Z">
         <w:r>
           <w:t xml:space="preserve">all</w:t>
         </w:r>
@@ -2721,12 +2721,12 @@
       <w:r>
         <w:t xml:space="preserve"> </w:t>
       </w:r>
-      <w:del w:id="10388" w:author="Revision merge (HM+PL)" w:date="2026-09-07T16:18:28Z">
+      <w:del w:id="10388" w:author="Revision merge (HM+PL)" w:date="2026-09-09T12:54:58Z">
         <w:r>
           <w:delText xml:space="preserve">stage</w:delText>
         </w:r>
       </w:del>
-      <w:ins w:id="10389" w:author="Revision merge (HM+PL)" w:date="2026-09-07T16:18:28Z">
+      <w:ins w:id="10389" w:author="Revision merge (HM+PL)" w:date="2026-09-09T12:54:58Z">
         <w:r>
           <w:t xml:space="preserve">downstream modules</w:t>
         </w:r>
@@ -2734,12 +2734,12 @@
       <w:r>
         <w:t xml:space="preserve"> can be </w:t>
       </w:r>
-      <w:del w:id="10390" w:author="Revision merge (HM+PL)" w:date="2026-09-07T16:18:28Z">
+      <w:del w:id="10390" w:author="Revision merge (HM+PL)" w:date="2026-09-09T12:54:58Z">
         <w:r>
           <w:delText xml:space="preserve">toggled</w:delText>
         </w:r>
       </w:del>
-      <w:ins w:id="10391" w:author="Revision merge (HM+PL)" w:date="2026-09-07T16:18:28Z">
+      <w:ins w:id="10391" w:author="Revision merge (HM+PL)" w:date="2026-09-09T12:54:58Z">
         <w:r>
           <w:t xml:space="preserve">selectively enabled or disabled</w:t>
         </w:r>
@@ -2747,12 +2747,12 @@
       <w:r>
         <w:t xml:space="preserve"> via `cfg$stages$*` </w:t>
       </w:r>
-      <w:del w:id="10392" w:author="Revision merge (HM+PL)" w:date="2026-09-07T16:18:28Z">
+      <w:del w:id="10392" w:author="Revision merge (HM+PL)" w:date="2026-09-09T12:54:58Z">
         <w:r>
           <w:delText xml:space="preserve">flags,</w:delText>
         </w:r>
       </w:del>
-      <w:ins w:id="10393" w:author="Revision merge (HM+PL)" w:date="2026-09-07T16:18:28Z">
+      <w:ins w:id="10393" w:author="Revision merge (HM+PL)" w:date="2026-09-09T12:54:58Z">
         <w:r>
           <w:t xml:space="preserve">flags;</w:t>
         </w:r>
@@ -2760,12 +2760,12 @@
       <w:r>
         <w:t xml:space="preserve"> </w:t>
       </w:r>
-      <w:del w:id="10394" w:author="Revision merge (HM+PL)" w:date="2026-09-07T16:18:28Z">
+      <w:del w:id="10394" w:author="Revision merge (HM+PL)" w:date="2026-09-09T12:54:58Z">
         <w:r>
           <w:delText xml:space="preserve">e.g,</w:delText>
         </w:r>
       </w:del>
-      <w:ins w:id="10395" w:author="Revision merge (HM+PL)" w:date="2026-09-07T16:18:28Z">
+      <w:ins w:id="10395" w:author="Revision merge (HM+PL)" w:date="2026-09-09T12:54:58Z">
         <w:r>
           <w:t xml:space="preserve">for example,</w:t>
         </w:r>
@@ -2773,12 +2773,12 @@
       <w:r>
         <w:t xml:space="preserve"> users can re-run only the resistome modules after revising thresholds. TPM normalisation (R/03) and all gene-element stages (R/09–R/11) </w:t>
       </w:r>
-      <w:del w:id="10396" w:author="Revision merge (HM+PL)" w:date="2026-09-07T16:18:28Z">
+      <w:del w:id="10396" w:author="Revision merge (HM+PL)" w:date="2026-09-09T12:54:58Z">
         <w:r>
           <w:delText xml:space="preserve">require</w:delText>
         </w:r>
       </w:del>
-      <w:ins w:id="10397" w:author="Revision merge (HM+PL)" w:date="2026-09-07T16:18:28Z">
+      <w:ins w:id="10397" w:author="Revision merge (HM+PL)" w:date="2026-09-09T12:54:58Z">
         <w:r>
           <w:t xml:space="preserve">are contingent upon</w:t>
         </w:r>
@@ -2786,12 +2786,12 @@
       <w:r>
         <w:t xml:space="preserve"> ABRicate outputs and are </w:t>
       </w:r>
-      <w:del w:id="10398" w:author="Revision merge (HM+PL)" w:date="2026-09-07T16:18:28Z">
+      <w:del w:id="10398" w:author="Revision merge (HM+PL)" w:date="2026-09-09T12:54:58Z">
         <w:r>
           <w:delText xml:space="preserve">skipped</w:delText>
         </w:r>
       </w:del>
-      <w:ins w:id="10399" w:author="Revision merge (HM+PL)" w:date="2026-09-07T16:18:28Z">
+      <w:ins w:id="10399" w:author="Revision merge (HM+PL)" w:date="2026-09-09T12:54:58Z">
         <w:r>
           <w:t xml:space="preserve">automatically</w:t>
         </w:r>
@@ -2799,12 +2799,12 @@
       <w:r>
         <w:t xml:space="preserve"> </w:t>
       </w:r>
-      <w:del w:id="10400" w:author="Revision merge (HM+PL)" w:date="2026-09-07T16:18:28Z">
+      <w:del w:id="10400" w:author="Revision merge (HM+PL)" w:date="2026-09-09T12:54:58Z">
         <w:r>
           <w:delText xml:space="preserve">otherwise.</w:delText>
         </w:r>
       </w:del>
-      <w:ins w:id="10401" w:author="Revision merge (HM+PL)" w:date="2026-09-07T16:18:28Z">
+      <w:ins w:id="10401" w:author="Revision merge (HM+PL)" w:date="2026-09-09T12:54:58Z">
         <w:r>
           <w:t xml:space="preserve">omitted</w:t>
         </w:r>
@@ -2812,12 +2812,12 @@
       <w:r>
         <w:t xml:space="preserve"> </w:t>
       </w:r>
-      <w:del w:id="10402" w:author="Revision merge (HM+PL)" w:date="2026-09-07T16:18:28Z">
+      <w:del w:id="10402" w:author="Revision merge (HM+PL)" w:date="2026-09-09T12:54:58Z">
         <w:r>
           <w:delText xml:space="preserve">Per-study</w:delText>
         </w:r>
       </w:del>
-      <w:ins w:id="10403" w:author="Revision merge (HM+PL)" w:date="2026-09-07T16:18:28Z">
+      <w:ins w:id="10403" w:author="Revision merge (HM+PL)" w:date="2026-09-09T12:54:58Z">
         <w:r>
           <w:t xml:space="preserve">when such inputs are absent. Study-specific corrections to</w:t>
         </w:r>
@@ -2825,12 +2825,12 @@
       <w:r>
         <w:t xml:space="preserve"> NCBI taxonomy </w:t>
       </w:r>
-      <w:del w:id="10404" w:author="Revision merge (HM+PL)" w:date="2026-09-07T16:18:28Z">
+      <w:del w:id="10404" w:author="Revision merge (HM+PL)" w:date="2026-09-09T12:54:58Z">
         <w:r>
           <w:delText xml:space="preserve">fixes,</w:delText>
         </w:r>
       </w:del>
-      <w:ins w:id="10405" w:author="Revision merge (HM+PL)" w:date="2026-09-07T16:18:28Z">
+      <w:ins w:id="10405" w:author="Revision merge (HM+PL)" w:date="2026-09-09T12:54:58Z">
         <w:r>
           <w:t xml:space="preserve">assignments,</w:t>
         </w:r>
@@ -2838,12 +2838,12 @@
       <w:r>
         <w:t xml:space="preserve"> </w:t>
       </w:r>
-      <w:del w:id="10406" w:author="Revision merge (HM+PL)" w:date="2026-09-07T16:18:28Z">
+      <w:del w:id="10406" w:author="Revision merge (HM+PL)" w:date="2026-09-09T12:54:58Z">
         <w:r>
           <w:delText xml:space="preserve">when</w:delText>
         </w:r>
       </w:del>
-      <w:ins w:id="10407" w:author="Revision merge (HM+PL)" w:date="2026-09-07T16:18:28Z">
+      <w:ins w:id="10407" w:author="Revision merge (HM+PL)" w:date="2026-09-09T12:54:58Z">
         <w:r>
           <w:t xml:space="preserve">where</w:t>
         </w:r>
@@ -2851,12 +2851,12 @@
       <w:r>
         <w:t xml:space="preserve"> </w:t>
       </w:r>
-      <w:del w:id="10408" w:author="Revision merge (HM+PL)" w:date="2026-09-07T16:18:28Z">
+      <w:del w:id="10408" w:author="Revision merge (HM+PL)" w:date="2026-09-09T12:54:58Z">
         <w:r>
           <w:delText xml:space="preserve">needed,</w:delText>
         </w:r>
       </w:del>
-      <w:ins w:id="10409" w:author="Revision merge (HM+PL)" w:date="2026-09-07T16:18:28Z">
+      <w:ins w:id="10409" w:author="Revision merge (HM+PL)" w:date="2026-09-09T12:54:58Z">
         <w:r>
           <w:t xml:space="preserve">required,</w:t>
         </w:r>
@@ -2864,12 +2864,12 @@
       <w:r>
         <w:t xml:space="preserve"> are </w:t>
       </w:r>
-      <w:del w:id="10410" w:author="Revision merge (HM+PL)" w:date="2026-09-07T16:18:28Z">
+      <w:del w:id="10410" w:author="Revision merge (HM+PL)" w:date="2026-09-09T12:54:58Z">
         <w:r>
           <w:delText xml:space="preserve">declared</w:delText>
         </w:r>
       </w:del>
-      <w:ins w:id="10411" w:author="Revision merge (HM+PL)" w:date="2026-09-07T16:18:28Z">
+      <w:ins w:id="10411" w:author="Revision merge (HM+PL)" w:date="2026-09-09T12:54:58Z">
         <w:r>
           <w:t xml:space="preserve">encoded</w:t>
         </w:r>
@@ -2877,7 +2877,7 @@
       <w:r>
         <w:t xml:space="preserve"> in a structured `taxid_fixes.csv` </w:t>
       </w:r>
-      <w:ins w:id="10412" w:author="Revision merge (HM+PL)" w:date="2026-09-07T16:18:28Z">
+      <w:ins w:id="10412" w:author="Revision merge (HM+PL)" w:date="2026-09-09T12:54:58Z">
         <w:r>
           <w:t xml:space="preserve">table </w:t>
         </w:r>
@@ -2885,7 +2885,7 @@
       <w:r>
         <w:t xml:space="preserve">rather than</w:t>
       </w:r>
-      <w:ins w:id="10413" w:author="Revision merge (HM+PL)" w:date="2026-09-07T16:18:28Z">
+      <w:ins w:id="10413" w:author="Revision merge (HM+PL)" w:date="2026-09-09T12:54:58Z">
         <w:r>
           <w:t xml:space="preserve"> implemented</w:t>
         </w:r>
@@ -2893,12 +2893,12 @@
       <w:r>
         <w:t xml:space="preserve"> as row-index edits. </w:t>
       </w:r>
-      <w:del w:id="10414" w:author="Revision merge (HM+PL)" w:date="2026-09-07T16:18:28Z">
+      <w:del w:id="10414" w:author="Revision merge (HM+PL)" w:date="2026-09-09T12:54:58Z">
         <w:r>
           <w:delText xml:space="preserve">A</w:delText>
         </w:r>
       </w:del>
-      <w:ins w:id="10415" w:author="Revision merge (HM+PL)" w:date="2026-09-07T16:18:28Z">
+      <w:ins w:id="10415" w:author="Revision merge (HM+PL)" w:date="2026-09-09T12:54:58Z">
         <w:r>
           <w:t xml:space="preserve">Multiple-testing</w:t>
         </w:r>
@@ -2906,12 +2906,12 @@
       <w:r>
         <w:t xml:space="preserve"> </w:t>
       </w:r>
-      <w:del w:id="10416" w:author="Revision merge (HM+PL)" w:date="2026-09-07T16:18:28Z">
+      <w:del w:id="10416" w:author="Revision merge (HM+PL)" w:date="2026-09-09T12:54:58Z">
         <w:r>
           <w:delText xml:space="preserve">single</w:delText>
         </w:r>
       </w:del>
-      <w:ins w:id="10417" w:author="Revision merge (HM+PL)" w:date="2026-09-07T16:18:28Z">
+      <w:ins w:id="10417" w:author="Revision merge (HM+PL)" w:date="2026-09-09T12:54:58Z">
         <w:r>
           <w:t xml:space="preserve">correction is controlled through the</w:t>
         </w:r>
@@ -2919,12 +2919,12 @@
       <w:r>
         <w:t xml:space="preserve"> `cfg$stats$padjust_method` </w:t>
       </w:r>
-      <w:del w:id="10418" w:author="Revision merge (HM+PL)" w:date="2026-09-07T16:18:28Z">
+      <w:del w:id="10418" w:author="Revision merge (HM+PL)" w:date="2026-09-09T12:54:58Z">
         <w:r>
           <w:delText xml:space="preserve">knob</w:delText>
         </w:r>
       </w:del>
-      <w:ins w:id="10419" w:author="Revision merge (HM+PL)" w:date="2026-09-07T16:18:28Z">
+      <w:ins w:id="10419" w:author="Revision merge (HM+PL)" w:date="2026-09-09T12:54:58Z">
         <w:r>
           <w:t xml:space="preserve">parameter,</w:t>
         </w:r>
@@ -2932,12 +2932,12 @@
       <w:r>
         <w:t xml:space="preserve"> </w:t>
       </w:r>
-      <w:del w:id="10420" w:author="Revision merge (HM+PL)" w:date="2026-09-07T16:18:28Z">
+      <w:del w:id="10420" w:author="Revision merge (HM+PL)" w:date="2026-09-09T12:54:58Z">
         <w:r>
           <w:delText xml:space="preserve">(Benjamini-Hochberg</w:delText>
         </w:r>
       </w:del>
-      <w:ins w:id="10421" w:author="Revision merge (HM+PL)" w:date="2026-09-07T16:18:28Z">
+      <w:ins w:id="10421" w:author="Revision merge (HM+PL)" w:date="2026-09-09T12:54:58Z">
         <w:r>
           <w:t xml:space="preserve">ensuring consistent application of the selected adjustment throughout the pipeline. The Benjamini-Hochberg false discovery rate</w:t>
         </w:r>
@@ -2945,12 +2945,12 @@
       <w:r>
         <w:t xml:space="preserve"> is used by </w:t>
       </w:r>
-      <w:del w:id="10422" w:author="Revision merge (HM+PL)" w:date="2026-09-07T16:18:28Z">
+      <w:del w:id="10422" w:author="Revision merge (HM+PL)" w:date="2026-09-09T12:54:58Z">
         <w:r>
           <w:delText xml:space="preserve">default;</w:delText>
         </w:r>
       </w:del>
-      <w:ins w:id="10423" w:author="Revision merge (HM+PL)" w:date="2026-09-07T16:18:28Z">
+      <w:ins w:id="10423" w:author="Revision merge (HM+PL)" w:date="2026-09-09T12:54:58Z">
         <w:r>
           <w:t xml:space="preserve">default,</w:t>
         </w:r>
@@ -2958,12 +2958,12 @@
       <w:r>
         <w:t xml:space="preserve"> </w:t>
       </w:r>
-      <w:del w:id="10424" w:author="Revision merge (HM+PL)" w:date="2026-09-07T16:18:28Z">
+      <w:del w:id="10424" w:author="Revision merge (HM+PL)" w:date="2026-09-09T12:54:58Z">
         <w:r>
           <w:delText xml:space="preserve">full</w:delText>
         </w:r>
       </w:del>
-      <w:ins w:id="10425" w:author="Revision merge (HM+PL)" w:date="2026-09-07T16:18:28Z">
+      <w:ins w:id="10425" w:author="Revision merge (HM+PL)" w:date="2026-09-09T12:54:58Z">
         <w:r>
           <w:t xml:space="preserve">although</w:t>
         </w:r>
@@ -2971,12 +2971,12 @@
       <w:r>
         <w:t xml:space="preserve"> </w:t>
       </w:r>
-      <w:del w:id="10426" w:author="Revision merge (HM+PL)" w:date="2026-09-07T16:18:28Z">
+      <w:del w:id="10426" w:author="Revision merge (HM+PL)" w:date="2026-09-09T12:54:58Z">
         <w:r>
           <w:delText xml:space="preserve">list</w:delText>
         </w:r>
       </w:del>
-      <w:ins w:id="10427" w:author="Revision merge (HM+PL)" w:date="2026-09-07T16:18:28Z">
+      <w:ins w:id="10427" w:author="Revision merge (HM+PL)" w:date="2026-09-09T12:54:58Z">
         <w:r>
           <w:t xml:space="preserve">alternative correction methods are supported and documented</w:t>
         </w:r>
@@ -2984,12 +2984,12 @@
       <w:r>
         <w:t xml:space="preserve"> in </w:t>
       </w:r>
-      <w:del w:id="10428" w:author="Revision merge (HM+PL)" w:date="2026-09-07T16:18:28Z">
+      <w:del w:id="10428" w:author="Revision merge (HM+PL)" w:date="2026-09-09T12:54:58Z">
         <w:r>
           <w:delText xml:space="preserve">`docs/STATISTICS.md`) routes every multiple-testing correction across the pipeline.</w:delText>
         </w:r>
       </w:del>
-      <w:ins w:id="10429" w:author="Revision merge (HM+PL)" w:date="2026-09-07T16:18:28Z">
+      <w:ins w:id="10429" w:author="Revision merge (HM+PL)" w:date="2026-09-09T12:54:58Z">
         <w:r>
           <w:t xml:space="preserve">`docs/STATISTICS.md`.</w:t>
         </w:r>
@@ -3002,12 +3002,12 @@
       <w:r>
         <w:t xml:space="preserve">**Stages.** The pipeline </w:t>
       </w:r>
-      <w:del w:id="10430" w:author="Revision merge (HM+PL)" w:date="2026-09-07T16:18:28Z">
+      <w:del w:id="10430" w:author="Revision merge (HM+PL)" w:date="2026-09-09T12:54:58Z">
         <w:r>
           <w:delText xml:space="preserve">organises</w:delText>
         </w:r>
       </w:del>
-      <w:ins w:id="10431" w:author="Revision merge (HM+PL)" w:date="2026-09-07T16:18:28Z">
+      <w:ins w:id="10431" w:author="Revision merge (HM+PL)" w:date="2026-09-09T12:54:58Z">
         <w:r>
           <w:t xml:space="preserve">is</w:t>
         </w:r>
@@ -3015,12 +3015,12 @@
       <w:r>
         <w:t xml:space="preserve"> </w:t>
       </w:r>
-      <w:del w:id="10432" w:author="Revision merge (HM+PL)" w:date="2026-09-07T16:18:28Z">
+      <w:del w:id="10432" w:author="Revision merge (HM+PL)" w:date="2026-09-09T12:54:58Z">
         <w:r>
           <w:delText xml:space="preserve">its work</w:delText>
         </w:r>
       </w:del>
-      <w:ins w:id="10433" w:author="Revision merge (HM+PL)" w:date="2026-09-07T16:18:28Z">
+      <w:ins w:id="10433" w:author="Revision merge (HM+PL)" w:date="2026-09-09T12:54:58Z">
         <w:r>
           <w:t xml:space="preserve">organised</w:t>
         </w:r>
@@ -3028,12 +3028,12 @@
       <w:r>
         <w:t xml:space="preserve"> into five conceptual </w:t>
       </w:r>
-      <w:del w:id="10434" w:author="Revision merge (HM+PL)" w:date="2026-09-07T16:18:28Z">
+      <w:del w:id="10434" w:author="Revision merge (HM+PL)" w:date="2026-09-09T12:54:58Z">
         <w:r>
           <w:delText xml:space="preserve">blocks.</w:delText>
         </w:r>
       </w:del>
-      <w:ins w:id="10435" w:author="Revision merge (HM+PL)" w:date="2026-09-07T16:18:28Z">
+      <w:ins w:id="10435" w:author="Revision merge (HM+PL)" w:date="2026-09-09T12:54:58Z">
         <w:r>
           <w:t xml:space="preserve">stages.</w:t>
         </w:r>
@@ -3046,12 +3046,12 @@
       <w:r>
         <w:t xml:space="preserve">(1) </w:t>
       </w:r>
-      <w:del w:id="10436" w:author="Revision merge (HM+PL)" w:date="2026-09-07T16:18:28Z">
+      <w:del w:id="10436" w:author="Revision merge (HM+PL)" w:date="2026-09-09T12:54:58Z">
         <w:r>
           <w:delText xml:space="preserve">*Ingest</w:delText>
         </w:r>
       </w:del>
-      <w:ins w:id="10437" w:author="Revision merge (HM+PL)" w:date="2026-09-07T16:18:28Z">
+      <w:ins w:id="10437" w:author="Revision merge (HM+PL)" w:date="2026-09-09T12:54:58Z">
         <w:r>
           <w:t xml:space="preserve">*Data input</w:t>
         </w:r>
@@ -3059,12 +3059,12 @@
       <w:r>
         <w:t xml:space="preserve"> and </w:t>
       </w:r>
-      <w:del w:id="10438" w:author="Revision merge (HM+PL)" w:date="2026-09-07T16:18:28Z">
+      <w:del w:id="10438" w:author="Revision merge (HM+PL)" w:date="2026-09-09T12:54:58Z">
         <w:r>
           <w:delText xml:space="preserve">cleaning*</w:delText>
         </w:r>
       </w:del>
-      <w:ins w:id="10439" w:author="Revision merge (HM+PL)" w:date="2026-09-07T16:18:28Z">
+      <w:ins w:id="10439" w:author="Revision merge (HM+PL)" w:date="2026-09-09T12:54:58Z">
         <w:r>
           <w:t xml:space="preserve">decontamination*</w:t>
         </w:r>
@@ -3072,12 +3072,12 @@
       <w:r>
         <w:t xml:space="preserve"> </w:t>
       </w:r>
-      <w:del w:id="10440" w:author="Revision merge (HM+PL)" w:date="2026-09-07T16:18:28Z">
+      <w:del w:id="10440" w:author="Revision merge (HM+PL)" w:date="2026-09-09T12:54:58Z">
         <w:r>
           <w:delText xml:space="preserve">(R/00–R/02)</w:delText>
         </w:r>
       </w:del>
-      <w:ins w:id="10441" w:author="Revision merge (HM+PL)" w:date="2026-09-07T16:18:28Z">
+      <w:ins w:id="10441" w:author="Revision merge (HM+PL)" w:date="2026-09-09T12:54:58Z">
         <w:r>
           <w:t xml:space="preserve">(R/00–R/02).</w:t>
         </w:r>
@@ -3085,12 +3085,12 @@
       <w:r>
         <w:t xml:space="preserve"> </w:t>
       </w:r>
-      <w:del w:id="10442" w:author="Revision merge (HM+PL)" w:date="2026-09-07T16:18:28Z">
+      <w:del w:id="10442" w:author="Revision merge (HM+PL)" w:date="2026-09-09T12:54:58Z">
         <w:r>
           <w:delText xml:space="preserve">load</w:delText>
         </w:r>
       </w:del>
-      <w:ins w:id="10443" w:author="Revision merge (HM+PL)" w:date="2026-09-07T16:18:28Z">
+      <w:ins w:id="10443" w:author="Revision merge (HM+PL)" w:date="2026-09-09T12:54:58Z">
         <w:r>
           <w:t xml:space="preserve">The pipeline imports</w:t>
         </w:r>
@@ -3098,12 +3098,12 @@
       <w:r>
         <w:t xml:space="preserve"> upstream </w:t>
       </w:r>
-      <w:del w:id="10444" w:author="Revision merge (HM+PL)" w:date="2026-09-07T16:18:28Z">
+      <w:del w:id="10444" w:author="Revision merge (HM+PL)" w:date="2026-09-09T12:54:58Z">
         <w:r>
           <w:delText xml:space="preserve">tables</w:delText>
         </w:r>
       </w:del>
-      <w:ins w:id="10445" w:author="Revision merge (HM+PL)" w:date="2026-09-07T16:18:28Z">
+      <w:ins w:id="10445" w:author="Revision merge (HM+PL)" w:date="2026-09-09T12:54:58Z">
         <w:r>
           <w:t xml:space="preserve">outputs</w:t>
         </w:r>
@@ -3111,12 +3111,12 @@
       <w:r>
         <w:t xml:space="preserve"> — Kraken2/Bracken, ABRicate, Re-centrifuge contamination </w:t>
       </w:r>
-      <w:del w:id="10446" w:author="Revision merge (HM+PL)" w:date="2026-09-07T16:18:28Z">
+      <w:del w:id="10446" w:author="Revision merge (HM+PL)" w:date="2026-09-09T12:54:58Z">
         <w:r>
           <w:delText xml:space="preserve">tags,</w:delText>
         </w:r>
       </w:del>
-      <w:ins w:id="10447" w:author="Revision merge (HM+PL)" w:date="2026-09-07T16:18:28Z">
+      <w:ins w:id="10447" w:author="Revision merge (HM+PL)" w:date="2026-09-09T12:54:58Z">
         <w:r>
           <w:t xml:space="preserve">tags and</w:t>
         </w:r>
@@ -3124,7 +3124,7 @@
       <w:r>
         <w:t xml:space="preserve"> study metadata</w:t>
       </w:r>
-      <w:ins w:id="10448" w:author="Revision merge (HM+PL)" w:date="2026-09-07T16:18:28Z">
+      <w:ins w:id="10448" w:author="Revision merge (HM+PL)" w:date="2026-09-09T12:54:58Z">
         <w:r>
           <w:t xml:space="preserve"> tables</w:t>
         </w:r>
@@ -3132,12 +3132,12 @@
       <w:r>
         <w:t xml:space="preserve"> — accommodating per-project input shapes rather than assuming a fixed column layout, </w:t>
       </w:r>
-      <w:del w:id="10449" w:author="Revision merge (HM+PL)" w:date="2026-09-07T16:18:28Z">
+      <w:del w:id="10449" w:author="Revision merge (HM+PL)" w:date="2026-09-09T12:54:58Z">
         <w:r>
           <w:delText xml:space="preserve">apply</w:delText>
         </w:r>
       </w:del>
-      <w:ins w:id="10450" w:author="Revision merge (HM+PL)" w:date="2026-09-07T16:18:28Z">
+      <w:ins w:id="10450" w:author="Revision merge (HM+PL)" w:date="2026-09-09T12:54:58Z">
         <w:r>
           <w:t xml:space="preserve">applies</w:t>
         </w:r>
@@ -3145,12 +3145,12 @@
       <w:r>
         <w:t xml:space="preserve"> optional negative-control subtraction, </w:t>
       </w:r>
-      <w:del w:id="10451" w:author="Revision merge (HM+PL)" w:date="2026-09-07T16:18:28Z">
+      <w:del w:id="10451" w:author="Revision merge (HM+PL)" w:date="2026-09-09T12:54:58Z">
         <w:r>
           <w:delText xml:space="preserve">merge</w:delText>
         </w:r>
       </w:del>
-      <w:ins w:id="10452" w:author="Revision merge (HM+PL)" w:date="2026-09-07T16:18:28Z">
+      <w:ins w:id="10452" w:author="Revision merge (HM+PL)" w:date="2026-09-09T12:54:58Z">
         <w:r>
           <w:t xml:space="preserve">merges</w:t>
         </w:r>
@@ -3158,12 +3158,12 @@
       <w:r>
         <w:t xml:space="preserve"> Bracken counts with the metadata covariates declared in `cfg$metadata$fixed_effects` / `random_effect`, and </w:t>
       </w:r>
-      <w:del w:id="10453" w:author="Revision merge (HM+PL)" w:date="2026-09-07T16:18:28Z">
+      <w:del w:id="10453" w:author="Revision merge (HM+PL)" w:date="2026-09-09T12:54:58Z">
         <w:r>
           <w:delText xml:space="preserve">link</w:delText>
         </w:r>
       </w:del>
-      <w:ins w:id="10454" w:author="Revision merge (HM+PL)" w:date="2026-09-07T16:18:28Z">
+      <w:ins w:id="10454" w:author="Revision merge (HM+PL)" w:date="2026-09-09T12:54:58Z">
         <w:r>
           <w:t xml:space="preserve">links</w:t>
         </w:r>
@@ -3179,12 +3179,12 @@
       <w:r>
         <w:t xml:space="preserve">(2) *Gene-element normalisation* (R/03) computes per-(sample, GENE) TPM </w:t>
       </w:r>
-      <w:del w:id="10455" w:author="Revision merge (HM+PL)" w:date="2026-09-07T16:18:28Z">
+      <w:del w:id="10455" w:author="Revision merge (HM+PL)" w:date="2026-09-09T12:54:58Z">
         <w:r>
           <w:delText xml:space="preserve">from</w:delText>
         </w:r>
       </w:del>
-      <w:ins w:id="10456" w:author="Revision merge (HM+PL)" w:date="2026-09-07T16:18:28Z">
+      <w:ins w:id="10456" w:author="Revision merge (HM+PL)" w:date="2026-09-09T12:54:58Z">
         <w:r>
           <w:t xml:space="preserve">based on</w:t>
         </w:r>
@@ -3192,12 +3192,12 @@
       <w:r>
         <w:t xml:space="preserve"> ABRicate </w:t>
       </w:r>
-      <w:del w:id="10457" w:author="Revision merge (HM+PL)" w:date="2026-09-07T16:18:28Z">
+      <w:del w:id="10457" w:author="Revision merge (HM+PL)" w:date="2026-09-09T12:54:58Z">
         <w:r>
           <w:delText xml:space="preserve">hits</w:delText>
         </w:r>
       </w:del>
-      <w:ins w:id="10458" w:author="Revision merge (HM+PL)" w:date="2026-09-07T16:18:28Z">
+      <w:ins w:id="10458" w:author="Revision merge (HM+PL)" w:date="2026-09-09T12:54:58Z">
         <w:r>
           <w:t xml:space="preserve">hit counts</w:t>
         </w:r>
@@ -3205,7 +3205,7 @@
       <w:r>
         <w:t xml:space="preserve"> and</w:t>
       </w:r>
-      <w:ins w:id="10459" w:author="Revision merge (HM+PL)" w:date="2026-09-07T16:18:28Z">
+      <w:ins w:id="10459" w:author="Revision merge (HM+PL)" w:date="2026-09-09T12:54:58Z">
         <w:r>
           <w:t xml:space="preserve"> annotated</w:t>
         </w:r>
@@ -3221,7 +3221,7 @@
       <w:r>
         <w:t xml:space="preserve">(3) *Community analyses* (R/04–R/08) cover the standard taxonomic toolkit. </w:t>
       </w:r>
-      <w:ins w:id="10460" w:author="Revision merge (HM+PL)" w:date="2026-09-07T16:18:28Z">
+      <w:ins w:id="10460" w:author="Revision merge (HM+PL)" w:date="2026-09-09T12:54:58Z">
         <w:r>
           <w:t xml:space="preserve">Following standardisation and cleaning of shared taxon names, </w:t>
         </w:r>
@@ -3229,12 +3229,12 @@
       <w:r>
         <w:t xml:space="preserve">R/04–R/05 </w:t>
       </w:r>
-      <w:del w:id="10461" w:author="Revision merge (HM+PL)" w:date="2026-09-07T16:18:28Z">
+      <w:del w:id="10461" w:author="Revision merge (HM+PL)" w:date="2026-09-09T12:54:58Z">
         <w:r>
           <w:delText xml:space="preserve">produce</w:delText>
         </w:r>
       </w:del>
-      <w:ins w:id="10462" w:author="Revision merge (HM+PL)" w:date="2026-09-07T16:18:28Z">
+      <w:ins w:id="10462" w:author="Revision merge (HM+PL)" w:date="2026-09-09T12:54:58Z">
         <w:r>
           <w:t xml:space="preserve">generate</w:t>
         </w:r>
@@ -3242,12 +3242,12 @@
       <w:r>
         <w:t xml:space="preserve"> Venn </w:t>
       </w:r>
-      <w:del w:id="10463" w:author="Revision merge (HM+PL)" w:date="2026-09-07T16:18:28Z">
+      <w:del w:id="10463" w:author="Revision merge (HM+PL)" w:date="2026-09-09T12:54:58Z">
         <w:r>
           <w:delText xml:space="preserve">diagrams and</w:delText>
         </w:r>
       </w:del>
-      <w:ins w:id="10464" w:author="Revision merge (HM+PL)" w:date="2026-09-07T16:18:28Z">
+      <w:ins w:id="10464" w:author="Revision merge (HM+PL)" w:date="2026-09-09T12:54:58Z">
         <w:r>
           <w:t xml:space="preserve">diagrams,</w:t>
         </w:r>
@@ -3255,12 +3255,12 @@
       <w:r>
         <w:t xml:space="preserve"> annotated </w:t>
       </w:r>
-      <w:del w:id="10465" w:author="Revision merge (HM+PL)" w:date="2026-09-07T16:18:28Z">
+      <w:del w:id="10465" w:author="Revision merge (HM+PL)" w:date="2026-09-09T12:54:58Z">
         <w:r>
           <w:delText xml:space="preserve">heatmaps</w:delText>
         </w:r>
       </w:del>
-      <w:ins w:id="10466" w:author="Revision merge (HM+PL)" w:date="2026-09-07T16:18:28Z">
+      <w:ins w:id="10466" w:author="Revision merge (HM+PL)" w:date="2026-09-09T12:54:58Z">
         <w:r>
           <w:t xml:space="preserve">heatmaps,</w:t>
         </w:r>
@@ -3268,12 +3268,12 @@
       <w:r>
         <w:t xml:space="preserve"> </w:t>
       </w:r>
-      <w:del w:id="10467" w:author="Revision merge (HM+PL)" w:date="2026-09-07T16:18:28Z">
+      <w:del w:id="10467" w:author="Revision merge (HM+PL)" w:date="2026-09-09T12:54:58Z">
         <w:r>
           <w:delText xml:space="preserve">after a shared taxa-name cleanup, plus</w:delText>
         </w:r>
       </w:del>
-      <w:ins w:id="10468" w:author="Revision merge (HM+PL)" w:date="2026-09-07T16:18:28Z">
+      <w:ins w:id="10468" w:author="Revision merge (HM+PL)" w:date="2026-09-09T12:54:58Z">
         <w:r>
           <w:t xml:space="preserve">and</w:t>
         </w:r>
@@ -3281,12 +3281,12 @@
       <w:r>
         <w:t xml:space="preserve"> top-N stacked-bar relative-abundance plots (static PNG and interactive plotly HTML) with paired total-count and sample-prevalence panels. Alpha diversity (R/06) reports Shannon, Simpson, richness, Pielou, and Fisher metrics with Kruskal-Wallis tests and violin/bar plots, preferring a pre-computed indices CSV (e.g., Oxford Nanopore wf-metagenomics output) and falling back to the vegan R package. Beta diversity (R/07) </w:t>
       </w:r>
-      <w:del w:id="10469" w:author="Revision merge (HM+PL)" w:date="2026-09-07T16:18:28Z">
+      <w:del w:id="10469" w:author="Revision merge (HM+PL)" w:date="2026-09-09T12:54:58Z">
         <w:r>
           <w:delText xml:space="preserve">computes</w:delText>
         </w:r>
       </w:del>
-      <w:ins w:id="10470" w:author="Revision merge (HM+PL)" w:date="2026-09-07T16:18:28Z">
+      <w:ins w:id="10470" w:author="Revision merge (HM+PL)" w:date="2026-09-09T12:54:58Z">
         <w:r>
           <w:t xml:space="preserve">assesses between-sample community differences using</w:t>
         </w:r>
@@ -3294,12 +3294,12 @@
       <w:r>
         <w:t xml:space="preserve"> PCoA on Hellinger-transformed Bray-Curtis distances with PERMANOVA (`adonis2`, 9999 permutations) and PERMDISP (`betadisper`) overlaid on the ordination. </w:t>
       </w:r>
-      <w:del w:id="10471" w:author="Revision merge (HM+PL)" w:date="2026-09-07T16:18:28Z">
+      <w:del w:id="10471" w:author="Revision merge (HM+PL)" w:date="2026-09-09T12:54:58Z">
         <w:r>
           <w:delText xml:space="preserve">ALDEx2 differential</w:delText>
         </w:r>
       </w:del>
-      <w:ins w:id="10472" w:author="Revision merge (HM+PL)" w:date="2026-09-07T16:18:28Z">
+      <w:ins w:id="10472" w:author="Revision merge (HM+PL)" w:date="2026-09-09T12:54:58Z">
         <w:r>
           <w:t xml:space="preserve">Differential</w:t>
         </w:r>
@@ -3307,7 +3307,7 @@
       <w:r>
         <w:t xml:space="preserve"> abundance </w:t>
       </w:r>
-      <w:ins w:id="10473" w:author="Revision merge (HM+PL)" w:date="2026-09-07T16:18:28Z">
+      <w:ins w:id="10473" w:author="Revision merge (HM+PL)" w:date="2026-09-09T12:54:58Z">
         <w:r>
           <w:t xml:space="preserve">analysis </w:t>
         </w:r>
@@ -3315,12 +3315,12 @@
       <w:r>
         <w:t xml:space="preserve">(R/08) </w:t>
       </w:r>
-      <w:del w:id="10474" w:author="Revision merge (HM+PL)" w:date="2026-09-07T16:18:28Z">
+      <w:del w:id="10474" w:author="Revision merge (HM+PL)" w:date="2026-09-09T12:54:58Z">
         <w:r>
           <w:delText xml:space="preserve">runs</w:delText>
         </w:r>
       </w:del>
-      <w:ins w:id="10475" w:author="Revision merge (HM+PL)" w:date="2026-09-07T16:18:28Z">
+      <w:ins w:id="10475" w:author="Revision merge (HM+PL)" w:date="2026-09-09T12:54:58Z">
         <w:r>
           <w:t xml:space="preserve">is performed</w:t>
         </w:r>
@@ -3328,12 +3328,12 @@
       <w:r>
         <w:t xml:space="preserve"> at </w:t>
       </w:r>
-      <w:del w:id="10476" w:author="Revision merge (HM+PL)" w:date="2026-09-07T16:18:28Z">
+      <w:del w:id="10476" w:author="Revision merge (HM+PL)" w:date="2026-09-09T12:54:58Z">
         <w:r>
           <w:delText xml:space="preserve">two</w:delText>
         </w:r>
       </w:del>
-      <w:ins w:id="10477" w:author="Revision merge (HM+PL)" w:date="2026-09-07T16:18:28Z">
+      <w:ins w:id="10477" w:author="Revision merge (HM+PL)" w:date="2026-09-09T12:54:58Z">
         <w:r>
           <w:t xml:space="preserve">both</w:t>
         </w:r>
@@ -3341,12 +3341,12 @@
       <w:r>
         <w:t xml:space="preserve"> </w:t>
       </w:r>
-      <w:del w:id="10478" w:author="Revision merge (HM+PL)" w:date="2026-09-07T16:18:28Z">
+      <w:del w:id="10478" w:author="Revision merge (HM+PL)" w:date="2026-09-09T12:54:58Z">
         <w:r>
           <w:delText xml:space="preserve">levels</w:delText>
         </w:r>
       </w:del>
-      <w:ins w:id="10479" w:author="Revision merge (HM+PL)" w:date="2026-09-07T16:18:28Z">
+      <w:ins w:id="10479" w:author="Revision merge (HM+PL)" w:date="2026-09-09T12:54:58Z">
         <w:r>
           <w:t xml:space="preserve">the</w:t>
         </w:r>
@@ -3354,12 +3354,12 @@
       <w:r>
         <w:t xml:space="preserve"> </w:t>
       </w:r>
-      <w:del w:id="10480" w:author="Revision merge (HM+PL)" w:date="2026-09-07T16:18:28Z">
+      <w:del w:id="10480" w:author="Revision merge (HM+PL)" w:date="2026-09-09T12:54:58Z">
         <w:r>
           <w:delText xml:space="preserve">— taxa (Bracken counts)</w:delText>
         </w:r>
       </w:del>
-      <w:ins w:id="10481" w:author="Revision merge (HM+PL)" w:date="2026-09-07T16:18:28Z">
+      <w:ins w:id="10481" w:author="Revision merge (HM+PL)" w:date="2026-09-09T12:54:58Z">
         <w:r>
           <w:t xml:space="preserve">taxonomic</w:t>
         </w:r>
@@ -3367,12 +3367,12 @@
       <w:r>
         <w:t xml:space="preserve"> and </w:t>
       </w:r>
-      <w:del w:id="10482" w:author="Revision merge (HM+PL)" w:date="2026-09-07T16:18:28Z">
+      <w:del w:id="10482" w:author="Revision merge (HM+PL)" w:date="2026-09-09T12:54:58Z">
         <w:r>
           <w:delText xml:space="preserve">genes</w:delText>
         </w:r>
       </w:del>
-      <w:ins w:id="10483" w:author="Revision merge (HM+PL)" w:date="2026-09-07T16:18:28Z">
+      <w:ins w:id="10483" w:author="Revision merge (HM+PL)" w:date="2026-09-09T12:54:58Z">
         <w:r>
           <w:t xml:space="preserve">functional</w:t>
         </w:r>
@@ -3380,12 +3380,12 @@
       <w:r>
         <w:t xml:space="preserve"> </w:t>
       </w:r>
-      <w:del w:id="10484" w:author="Revision merge (HM+PL)" w:date="2026-09-07T16:18:28Z">
+      <w:del w:id="10484" w:author="Revision merge (HM+PL)" w:date="2026-09-09T12:54:58Z">
         <w:r>
           <w:delText xml:space="preserve">(ABRicate</w:delText>
         </w:r>
       </w:del>
-      <w:ins w:id="10485" w:author="Revision merge (HM+PL)" w:date="2026-09-07T16:18:28Z">
+      <w:ins w:id="10485" w:author="Revision merge (HM+PL)" w:date="2026-09-09T12:54:58Z">
         <w:r>
           <w:t xml:space="preserve">level using ALDEx2: taxonomic analysis uses Bracken counts, whereas gene-level analysis uses ABRicate</w:t>
         </w:r>
@@ -3393,12 +3393,12 @@
       <w:r>
         <w:t xml:space="preserve"> contig hits per (sample, </w:t>
       </w:r>
-      <w:del w:id="10486" w:author="Revision merge (HM+PL)" w:date="2026-09-07T16:18:28Z">
+      <w:del w:id="10486" w:author="Revision merge (HM+PL)" w:date="2026-09-09T12:54:58Z">
         <w:r>
           <w:delText xml:space="preserve">GENE)),</w:delText>
         </w:r>
       </w:del>
-      <w:ins w:id="10487" w:author="Revision merge (HM+PL)" w:date="2026-09-07T16:18:28Z">
+      <w:ins w:id="10487" w:author="Revision merge (HM+PL)" w:date="2026-09-09T12:54:58Z">
         <w:r>
           <w:t xml:space="preserve">GENE).</w:t>
         </w:r>
@@ -3406,12 +3406,12 @@
       <w:r>
         <w:t xml:space="preserve"> </w:t>
       </w:r>
-      <w:del w:id="10488" w:author="Revision merge (HM+PL)" w:date="2026-09-07T16:18:28Z">
+      <w:del w:id="10488" w:author="Revision merge (HM+PL)" w:date="2026-09-09T12:54:58Z">
         <w:r>
           <w:delText xml:space="preserve">combining</w:delText>
         </w:r>
       </w:del>
-      <w:ins w:id="10489" w:author="Revision merge (HM+PL)" w:date="2026-09-07T16:18:28Z">
+      <w:ins w:id="10489" w:author="Revision merge (HM+PL)" w:date="2026-09-09T12:54:58Z">
         <w:r>
           <w:t xml:space="preserve">The workflow combines</w:t>
         </w:r>
@@ -3419,7 +3419,7 @@
       <w:r>
         <w:t xml:space="preserve"> an omnibus Kruskal-Wallis </w:t>
       </w:r>
-      <w:ins w:id="10490" w:author="Revision merge (HM+PL)" w:date="2026-09-07T16:18:28Z">
+      <w:ins w:id="10490" w:author="Revision merge (HM+PL)" w:date="2026-09-09T12:54:58Z">
         <w:r>
           <w:t xml:space="preserve">test </w:t>
         </w:r>
@@ -3427,12 +3427,12 @@
       <w:r>
         <w:t xml:space="preserve">with pairwise Welch's </w:t>
       </w:r>
-      <w:del w:id="10491" w:author="Revision merge (HM+PL)" w:date="2026-09-07T16:18:28Z">
+      <w:del w:id="10491" w:author="Revision merge (HM+PL)" w:date="2026-09-09T12:54:58Z">
         <w:r>
           <w:delText xml:space="preserve">t tests,</w:delText>
         </w:r>
       </w:del>
-      <w:ins w:id="10492" w:author="Revision merge (HM+PL)" w:date="2026-09-07T16:18:28Z">
+      <w:ins w:id="10492" w:author="Revision merge (HM+PL)" w:date="2026-09-09T12:54:58Z">
         <w:r>
           <w:t xml:space="preserve">t-tests,</w:t>
         </w:r>
@@ -3440,7 +3440,7 @@
       <w:r>
         <w:t xml:space="preserve"> with an optional `aldex.glm` design path for covariate-adjusted models.</w:t>
       </w:r>
-      <w:ins w:id="10493" w:author="Revision merge (HM+PL)" w:date="2026-09-07T16:18:28Z">
+      <w:ins w:id="10493" w:author="Revision merge (HM+PL)" w:date="2026-09-09T12:54:58Z">
         <w:r>
           <w:t xml:space="preserve"> This compositional approach is deliberate: ALDEx2 models counts through a centred log-ratio (CLR) transformation, which accounts for the compositional nature of sequencing data and avoids the spurious correlations that arise when raw or total counts are compared directly [10]; gene-level features are additionally length-normalised as TPM (R/03) so that genes of differing length remain comparable.</w:t>
         </w:r>
@@ -3453,12 +3453,12 @@
       <w:r>
         <w:t xml:space="preserve">(4) *Functional profiling* (R/09–R/11) runs a shared analysis engine three times against domain-specific databases: </w:t>
       </w:r>
-      <w:del w:id="10494" w:author="Revision merge (HM+PL)" w:date="2026-09-07T16:18:28Z">
+      <w:del w:id="10494" w:author="Revision merge (HM+PL)" w:date="2026-09-09T12:54:58Z">
         <w:r>
           <w:delText xml:space="preserve">the</w:delText>
         </w:r>
       </w:del>
-      <w:ins w:id="10495" w:author="Revision merge (HM+PL)" w:date="2026-09-07T16:18:28Z">
+      <w:ins w:id="10495" w:author="Revision merge (HM+PL)" w:date="2026-09-09T12:54:58Z">
         <w:r>
           <w:t xml:space="preserve">(i)</w:t>
         </w:r>
@@ -3466,12 +3466,12 @@
       <w:r>
         <w:t xml:space="preserve"> resistome </w:t>
       </w:r>
-      <w:del w:id="10496" w:author="Revision merge (HM+PL)" w:date="2026-09-07T16:18:28Z">
+      <w:del w:id="10496" w:author="Revision merge (HM+PL)" w:date="2026-09-09T12:54:58Z">
         <w:r>
           <w:delText xml:space="preserve">(ABRicate/CARD,</w:delText>
         </w:r>
       </w:del>
-      <w:ins w:id="10497" w:author="Revision merge (HM+PL)" w:date="2026-09-07T16:18:28Z">
+      <w:ins w:id="10497" w:author="Revision merge (HM+PL)" w:date="2026-09-09T12:54:58Z">
         <w:r>
           <w:t xml:space="preserve">profiling</w:t>
         </w:r>
@@ -3479,12 +3479,12 @@
       <w:r>
         <w:t xml:space="preserve"> </w:t>
       </w:r>
-      <w:del w:id="10498" w:author="Revision merge (HM+PL)" w:date="2026-09-07T16:18:28Z">
+      <w:del w:id="10498" w:author="Revision merge (HM+PL)" w:date="2026-09-09T12:54:58Z">
         <w:r>
           <w:delText xml:space="preserve">with</w:delText>
         </w:r>
       </w:del>
-      <w:ins w:id="10499" w:author="Revision merge (HM+PL)" w:date="2026-09-07T16:18:28Z">
+      <w:ins w:id="10499" w:author="Revision merge (HM+PL)" w:date="2026-09-09T12:54:58Z">
         <w:r>
           <w:t xml:space="preserve">using ABRicate/CARD annotations, including</w:t>
         </w:r>
@@ -3492,12 +3492,12 @@
       <w:r>
         <w:t xml:space="preserve"> drug-class </w:t>
       </w:r>
-      <w:del w:id="10500" w:author="Revision merge (HM+PL)" w:date="2026-09-07T16:18:28Z">
+      <w:del w:id="10500" w:author="Revision merge (HM+PL)" w:date="2026-09-09T12:54:58Z">
         <w:r>
           <w:delText xml:space="preserve">classification),</w:delText>
         </w:r>
       </w:del>
-      <w:ins w:id="10501" w:author="Revision merge (HM+PL)" w:date="2026-09-07T16:18:28Z">
+      <w:ins w:id="10501" w:author="Revision merge (HM+PL)" w:date="2026-09-09T12:54:58Z">
         <w:r>
           <w:t xml:space="preserve">classification;</w:t>
         </w:r>
@@ -3505,12 +3505,12 @@
       <w:r>
         <w:t xml:space="preserve"> </w:t>
       </w:r>
-      <w:del w:id="10502" w:author="Revision merge (HM+PL)" w:date="2026-09-07T16:18:28Z">
+      <w:del w:id="10502" w:author="Revision merge (HM+PL)" w:date="2026-09-09T12:54:58Z">
         <w:r>
           <w:delText xml:space="preserve">the</w:delText>
         </w:r>
       </w:del>
-      <w:ins w:id="10503" w:author="Revision merge (HM+PL)" w:date="2026-09-07T16:18:28Z">
+      <w:ins w:id="10503" w:author="Revision merge (HM+PL)" w:date="2026-09-09T12:54:58Z">
         <w:r>
           <w:t xml:space="preserve">(ii)</w:t>
         </w:r>
@@ -3518,12 +3518,12 @@
       <w:r>
         <w:t xml:space="preserve"> virulome </w:t>
       </w:r>
-      <w:del w:id="10504" w:author="Revision merge (HM+PL)" w:date="2026-09-07T16:18:28Z">
+      <w:del w:id="10504" w:author="Revision merge (HM+PL)" w:date="2026-09-09T12:54:58Z">
         <w:r>
           <w:delText xml:space="preserve">(VFDB,</w:delText>
         </w:r>
       </w:del>
-      <w:ins w:id="10505" w:author="Revision merge (HM+PL)" w:date="2026-09-07T16:18:28Z">
+      <w:ins w:id="10505" w:author="Revision merge (HM+PL)" w:date="2026-09-09T12:54:58Z">
         <w:r>
           <w:t xml:space="preserve">profiling using VFDB,</w:t>
         </w:r>
@@ -3531,12 +3531,12 @@
       <w:r>
         <w:t xml:space="preserve"> with functional categories extracted from the ABRicate `PRODUCT` </w:t>
       </w:r>
-      <w:del w:id="10506" w:author="Revision merge (HM+PL)" w:date="2026-09-07T16:18:28Z">
+      <w:del w:id="10506" w:author="Revision merge (HM+PL)" w:date="2026-09-09T12:54:58Z">
         <w:r>
           <w:delText xml:space="preserve">field)</w:delText>
         </w:r>
       </w:del>
-      <w:ins w:id="10507" w:author="Revision merge (HM+PL)" w:date="2026-09-07T16:18:28Z">
+      <w:ins w:id="10507" w:author="Revision merge (HM+PL)" w:date="2026-09-09T12:54:58Z">
         <w:r>
           <w:t xml:space="preserve">field;</w:t>
         </w:r>
@@ -3544,12 +3544,12 @@
       <w:r>
         <w:t xml:space="preserve"> </w:t>
       </w:r>
-      <w:del w:id="10508" w:author="Revision merge (HM+PL)" w:date="2026-09-07T16:18:28Z">
+      <w:del w:id="10508" w:author="Revision merge (HM+PL)" w:date="2026-09-09T12:54:58Z">
         <w:r>
           <w:delText xml:space="preserve">and the</w:delText>
         </w:r>
       </w:del>
-      <w:ins w:id="10509" w:author="Revision merge (HM+PL)" w:date="2026-09-07T16:18:28Z">
+      <w:ins w:id="10509" w:author="Revision merge (HM+PL)" w:date="2026-09-09T12:54:58Z">
         <w:r>
           <w:t xml:space="preserve">(iii)</w:t>
         </w:r>
@@ -3557,12 +3557,12 @@
       <w:r>
         <w:t xml:space="preserve"> mobilome </w:t>
       </w:r>
-      <w:del w:id="10510" w:author="Revision merge (HM+PL)" w:date="2026-09-07T16:18:28Z">
+      <w:del w:id="10510" w:author="Revision merge (HM+PL)" w:date="2026-09-09T12:54:58Z">
         <w:r>
           <w:delText xml:space="preserve">(PlasmidFinder,</w:delText>
         </w:r>
       </w:del>
-      <w:ins w:id="10511" w:author="Revision merge (HM+PL)" w:date="2026-09-07T16:18:28Z">
+      <w:ins w:id="10511" w:author="Revision merge (HM+PL)" w:date="2026-09-09T12:54:58Z">
         <w:r>
           <w:t xml:space="preserve">profiling</w:t>
         </w:r>
@@ -3570,12 +3570,12 @@
       <w:r>
         <w:t xml:space="preserve"> </w:t>
       </w:r>
-      <w:del w:id="10512" w:author="Revision merge (HM+PL)" w:date="2026-09-07T16:18:28Z">
+      <w:del w:id="10512" w:author="Revision merge (HM+PL)" w:date="2026-09-09T12:54:58Z">
         <w:r>
           <w:delText xml:space="preserve">with</w:delText>
         </w:r>
       </w:del>
-      <w:ins w:id="10513" w:author="Revision merge (HM+PL)" w:date="2026-09-07T16:18:28Z">
+      <w:ins w:id="10513" w:author="Revision merge (HM+PL)" w:date="2026-09-09T12:54:58Z">
         <w:r>
           <w:t xml:space="preserve">using PlasmidFinder, incorporating</w:t>
         </w:r>
@@ -3583,12 +3583,12 @@
       <w:r>
         <w:t xml:space="preserve"> configurable replicon-family classification </w:t>
       </w:r>
-      <w:del w:id="10514" w:author="Revision merge (HM+PL)" w:date="2026-09-07T16:18:28Z">
+      <w:del w:id="10514" w:author="Revision merge (HM+PL)" w:date="2026-09-09T12:54:58Z">
         <w:r>
           <w:delText xml:space="preserve">— Col-like,</w:delText>
         </w:r>
       </w:del>
-      <w:ins w:id="10515" w:author="Revision merge (HM+PL)" w:date="2026-09-07T16:18:28Z">
+      <w:ins w:id="10515" w:author="Revision merge (HM+PL)" w:date="2026-09-09T12:54:58Z">
         <w:r>
           <w:t xml:space="preserve">(Col-like,</w:t>
         </w:r>
@@ -3596,12 +3596,12 @@
       <w:r>
         <w:t xml:space="preserve"> IncF, IncX, other Inc). </w:t>
       </w:r>
-      <w:del w:id="10516" w:author="Revision merge (HM+PL)" w:date="2026-09-07T16:18:28Z">
+      <w:del w:id="10516" w:author="Revision merge (HM+PL)" w:date="2026-09-09T12:54:58Z">
         <w:r>
           <w:delText xml:space="preserve">Each</w:delText>
         </w:r>
       </w:del>
-      <w:ins w:id="10517" w:author="Revision merge (HM+PL)" w:date="2026-09-07T16:18:28Z">
+      <w:ins w:id="10517" w:author="Revision merge (HM+PL)" w:date="2026-09-09T12:54:58Z">
         <w:r>
           <w:t xml:space="preserve">For</w:t>
         </w:r>
@@ -3609,12 +3609,12 @@
       <w:r>
         <w:t xml:space="preserve"> </w:t>
       </w:r>
-      <w:del w:id="10518" w:author="Revision merge (HM+PL)" w:date="2026-09-07T16:18:28Z">
+      <w:del w:id="10518" w:author="Revision merge (HM+PL)" w:date="2026-09-09T12:54:58Z">
         <w:r>
           <w:delText xml:space="preserve">domain</w:delText>
         </w:r>
       </w:del>
-      <w:ins w:id="10519" w:author="Revision merge (HM+PL)" w:date="2026-09-07T16:18:28Z">
+      <w:ins w:id="10519" w:author="Revision merge (HM+PL)" w:date="2026-09-09T12:54:58Z">
         <w:r>
           <w:t xml:space="preserve">each</w:t>
         </w:r>
@@ -3622,12 +3622,12 @@
       <w:r>
         <w:t xml:space="preserve"> </w:t>
       </w:r>
-      <w:del w:id="10520" w:author="Revision merge (HM+PL)" w:date="2026-09-07T16:18:28Z">
+      <w:del w:id="10520" w:author="Revision merge (HM+PL)" w:date="2026-09-09T12:54:58Z">
         <w:r>
           <w:delText xml:space="preserve">emits</w:delText>
         </w:r>
       </w:del>
-      <w:ins w:id="10521" w:author="Revision merge (HM+PL)" w:date="2026-09-07T16:18:28Z">
+      <w:ins w:id="10521" w:author="Revision merge (HM+PL)" w:date="2026-09-09T12:54:58Z">
         <w:r>
           <w:t xml:space="preserve">domain,</w:t>
         </w:r>
@@ -3635,12 +3635,12 @@
       <w:r>
         <w:t xml:space="preserve"> </w:t>
       </w:r>
-      <w:del w:id="10522" w:author="Revision merge (HM+PL)" w:date="2026-09-07T16:18:28Z">
+      <w:del w:id="10522" w:author="Revision merge (HM+PL)" w:date="2026-09-09T12:54:58Z">
         <w:r>
           <w:delText xml:space="preserve">its</w:delText>
         </w:r>
       </w:del>
-      <w:ins w:id="10523" w:author="Revision merge (HM+PL)" w:date="2026-09-07T16:18:28Z">
+      <w:ins w:id="10523" w:author="Revision merge (HM+PL)" w:date="2026-09-09T12:54:58Z">
         <w:r>
           <w:t xml:space="preserve">the</w:t>
         </w:r>
@@ -3648,12 +3648,12 @@
       <w:r>
         <w:t xml:space="preserve"> </w:t>
       </w:r>
-      <w:del w:id="10524" w:author="Revision merge (HM+PL)" w:date="2026-09-07T16:18:28Z">
+      <w:del w:id="10524" w:author="Revision merge (HM+PL)" w:date="2026-09-09T12:54:58Z">
         <w:r>
           <w:delText xml:space="preserve">own</w:delText>
         </w:r>
       </w:del>
-      <w:ins w:id="10525" w:author="Revision merge (HM+PL)" w:date="2026-09-07T16:18:28Z">
+      <w:ins w:id="10525" w:author="Revision merge (HM+PL)" w:date="2026-09-09T12:54:58Z">
         <w:r>
           <w:t xml:space="preserve">pipeline generates</w:t>
         </w:r>
@@ -3661,12 +3661,12 @@
       <w:r>
         <w:t xml:space="preserve"> alpha </w:t>
       </w:r>
-      <w:del w:id="10526" w:author="Revision merge (HM+PL)" w:date="2026-09-07T16:18:28Z">
+      <w:del w:id="10526" w:author="Revision merge (HM+PL)" w:date="2026-09-09T12:54:58Z">
         <w:r>
           <w:delText xml:space="preserve">diversity,</w:delText>
         </w:r>
       </w:del>
-      <w:ins w:id="10527" w:author="Revision merge (HM+PL)" w:date="2026-09-07T16:18:28Z">
+      <w:ins w:id="10527" w:author="Revision merge (HM+PL)" w:date="2026-09-09T12:54:58Z">
         <w:r>
           <w:t xml:space="preserve">diversity metrics,</w:t>
         </w:r>
@@ -3674,12 +3674,12 @@
       <w:r>
         <w:t xml:space="preserve"> Venn </w:t>
       </w:r>
-      <w:del w:id="10528" w:author="Revision merge (HM+PL)" w:date="2026-09-07T16:18:28Z">
+      <w:del w:id="10528" w:author="Revision merge (HM+PL)" w:date="2026-09-09T12:54:58Z">
         <w:r>
           <w:delText xml:space="preserve">diagram,</w:delText>
         </w:r>
       </w:del>
-      <w:ins w:id="10529" w:author="Revision merge (HM+PL)" w:date="2026-09-07T16:18:28Z">
+      <w:ins w:id="10529" w:author="Revision merge (HM+PL)" w:date="2026-09-09T12:54:58Z">
         <w:r>
           <w:t xml:space="preserve">diagrams,</w:t>
         </w:r>
@@ -3695,7 +3695,7 @@
       <w:r>
         <w:t xml:space="preserve">(5) *Integration, reporting and manifest* (R/12–R/14).</w:t>
       </w:r>
-      <w:ins w:id="10530" w:author="Revision merge (HM+PL)" w:date="2026-09-07T16:18:28Z">
+      <w:ins w:id="10530" w:author="Revision merge (HM+PL)" w:date="2026-09-09T12:54:58Z">
         <w:r>
           <w:t xml:space="preserve"> The final stage integrates results across all domains and produces the reporting outputs.</w:t>
         </w:r>
@@ -3711,12 +3711,12 @@
       <w:r>
         <w:t xml:space="preserve">**Reporting.** </w:t>
       </w:r>
-      <w:del w:id="10531" w:author="Revision merge (HM+PL)" w:date="2026-09-07T16:18:28Z">
+      <w:del w:id="10531" w:author="Revision merge (HM+PL)" w:date="2026-09-09T12:54:58Z">
         <w:r>
           <w:delText xml:space="preserve">The</w:delText>
         </w:r>
       </w:del>
-      <w:ins w:id="10532" w:author="Revision merge (HM+PL)" w:date="2026-09-07T16:18:28Z">
+      <w:ins w:id="10532" w:author="Revision merge (HM+PL)" w:date="2026-09-09T12:54:58Z">
         <w:r>
           <w:t xml:space="preserve">Results are rendered through a</w:t>
         </w:r>
@@ -3724,7 +3724,7 @@
       <w:r>
         <w:t xml:space="preserve"> Quarto template</w:t>
       </w:r>
-      <w:del w:id="10533" w:author="Revision merge (HM+PL)" w:date="2026-09-07T16:18:28Z">
+      <w:del w:id="10533" w:author="Revision merge (HM+PL)" w:date="2026-09-09T12:54:58Z">
         <w:r>
           <w:delText xml:space="preserve"> renders all outputs</w:delText>
         </w:r>
@@ -3732,12 +3732,12 @@
       <w:r>
         <w:t xml:space="preserve"> as a multi-page HTML dashboard </w:t>
       </w:r>
-      <w:del w:id="10534" w:author="Revision merge (HM+PL)" w:date="2026-09-07T16:18:28Z">
+      <w:del w:id="10534" w:author="Revision merge (HM+PL)" w:date="2026-09-09T12:54:58Z">
         <w:r>
           <w:delText xml:space="preserve">with</w:delText>
         </w:r>
       </w:del>
-      <w:ins w:id="10535" w:author="Revision merge (HM+PL)" w:date="2026-09-07T16:18:28Z">
+      <w:ins w:id="10535" w:author="Revision merge (HM+PL)" w:date="2026-09-09T12:54:58Z">
         <w:r>
           <w:t xml:space="preserve">containing</w:t>
         </w:r>
@@ -3745,12 +3745,12 @@
       <w:r>
         <w:t xml:space="preserve"> </w:t>
       </w:r>
-      <w:del w:id="10536" w:author="Revision merge (HM+PL)" w:date="2026-09-07T16:18:28Z">
+      <w:del w:id="10536" w:author="Revision merge (HM+PL)" w:date="2026-09-09T12:54:58Z">
         <w:r>
           <w:delText xml:space="preserve">per-domain</w:delText>
         </w:r>
       </w:del>
-      <w:ins w:id="10537" w:author="Revision merge (HM+PL)" w:date="2026-09-07T16:18:28Z">
+      <w:ins w:id="10537" w:author="Revision merge (HM+PL)" w:date="2026-09-09T12:54:58Z">
         <w:r>
           <w:t xml:space="preserve">dedicated</w:t>
         </w:r>
@@ -3758,12 +3758,12 @@
       <w:r>
         <w:t xml:space="preserve"> panels </w:t>
       </w:r>
-      <w:del w:id="10538" w:author="Revision merge (HM+PL)" w:date="2026-09-07T16:18:28Z">
+      <w:del w:id="10538" w:author="Revision merge (HM+PL)" w:date="2026-09-09T12:54:58Z">
         <w:r>
           <w:delText xml:space="preserve">(taxonomy,</w:delText>
         </w:r>
       </w:del>
-      <w:ins w:id="10539" w:author="Revision merge (HM+PL)" w:date="2026-09-07T16:18:28Z">
+      <w:ins w:id="10539" w:author="Revision merge (HM+PL)" w:date="2026-09-09T12:54:58Z">
         <w:r>
           <w:t xml:space="preserve">for taxonomy,</w:t>
         </w:r>
@@ -3771,12 +3771,12 @@
       <w:r>
         <w:t xml:space="preserve"> diversity, differential abundance, resistome, virulome, </w:t>
       </w:r>
-      <w:del w:id="10540" w:author="Revision merge (HM+PL)" w:date="2026-09-07T16:18:28Z">
+      <w:del w:id="10540" w:author="Revision merge (HM+PL)" w:date="2026-09-09T12:54:58Z">
         <w:r>
           <w:delText xml:space="preserve">mobilome, network)</w:delText>
         </w:r>
       </w:del>
-      <w:ins w:id="10541" w:author="Revision merge (HM+PL)" w:date="2026-09-07T16:18:28Z">
+      <w:ins w:id="10541" w:author="Revision merge (HM+PL)" w:date="2026-09-09T12:54:58Z">
         <w:r>
           <w:t xml:space="preserve">mobilome</w:t>
         </w:r>
@@ -3784,7 +3784,7 @@
       <w:r>
         <w:t xml:space="preserve"> and</w:t>
       </w:r>
-      <w:ins w:id="10542" w:author="Revision merge (HM+PL)" w:date="2026-09-07T16:18:28Z">
+      <w:ins w:id="10542" w:author="Revision merge (HM+PL)" w:date="2026-09-09T12:54:58Z">
         <w:r>
           <w:t xml:space="preserve"> network, plus</w:t>
         </w:r>
@@ -3792,7 +3792,7 @@
       <w:r>
         <w:t xml:space="preserve"> embedded download links. Dependencies are pinned via `renv`, and the project requires R ≥ 4.5; external command-line tools (Kraken2, Bracken, ABRicate, Re-centrifuge) are assumed to have been run upstream.</w:t>
       </w:r>
-      <w:ins w:id="10543" w:author="Revision merge (HM+PL)" w:date="2026-09-07T16:18:28Z">
+      <w:ins w:id="10543" w:author="Revision merge (HM+PL)" w:date="2026-09-09T12:54:58Z">
         <w:r>
           <w:t xml:space="preserve"> Because MERIDIAN consumes these pre-computed outputs rather than the raw reads, its own footprint is modest and single-threaded (peaking at ~1.5 GB; Section 3), and is therefore decoupled from the substantial memory required by upstream taxonomic classification (for example, a full Kraken2 database), which can be run separately on high-memory or cloud infrastructure.</w:t>
         </w:r>
@@ -3820,12 +3820,12 @@
       <w:r>
         <w:t xml:space="preserve">We </w:t>
       </w:r>
-      <w:del w:id="10544" w:author="Revision merge (HM+PL)" w:date="2026-09-07T16:18:28Z">
+      <w:del w:id="10544" w:author="Revision merge (HM+PL)" w:date="2026-09-09T12:54:58Z">
         <w:r>
           <w:delText xml:space="preserve">are validating</w:delText>
         </w:r>
       </w:del>
-      <w:ins w:id="10545" w:author="Revision merge (HM+PL)" w:date="2026-09-07T16:18:28Z">
+      <w:ins w:id="10545" w:author="Revision merge (HM+PL)" w:date="2026-09-09T12:54:58Z">
         <w:r>
           <w:t xml:space="preserve">validated</w:t>
         </w:r>
@@ -3833,7 +3833,7 @@
       <w:r>
         <w:t xml:space="preserve"> the pipeline against two </w:t>
       </w:r>
-      <w:del w:id="10546" w:author="Revision merge (HM+PL)" w:date="2026-09-07T16:18:28Z">
+      <w:del w:id="10546" w:author="Revision merge (HM+PL)" w:date="2026-09-09T12:54:58Z">
         <w:r>
           <w:delText xml:space="preserve">real </w:delText>
         </w:r>
@@ -3841,12 +3841,12 @@
       <w:r>
         <w:t xml:space="preserve">long-read chicken caecum </w:t>
       </w:r>
-      <w:del w:id="10547" w:author="Revision merge (HM+PL)" w:date="2026-09-07T16:18:28Z">
+      <w:del w:id="10547" w:author="Revision merge (HM+PL)" w:date="2026-09-09T12:54:58Z">
         <w:r>
           <w:delText xml:space="preserve">metagenomics</w:delText>
         </w:r>
       </w:del>
-      <w:ins w:id="10548" w:author="Revision merge (HM+PL)" w:date="2026-09-07T16:18:28Z">
+      <w:ins w:id="10548" w:author="Revision merge (HM+PL)" w:date="2026-09-09T12:54:58Z">
         <w:r>
           <w:t xml:space="preserve">metagenomic</w:t>
         </w:r>
@@ -3854,12 +3854,12 @@
       <w:r>
         <w:t xml:space="preserve"> studies. The </w:t>
       </w:r>
-      <w:del w:id="10549" w:author="Revision merge (HM+PL)" w:date="2026-09-07T16:18:28Z">
+      <w:del w:id="10549" w:author="Revision merge (HM+PL)" w:date="2026-09-09T12:54:58Z">
         <w:r>
           <w:delText xml:space="preserve">reference</w:delText>
         </w:r>
       </w:del>
-      <w:ins w:id="10550" w:author="Revision merge (HM+PL)" w:date="2026-09-07T16:18:28Z">
+      <w:ins w:id="10550" w:author="Revision merge (HM+PL)" w:date="2026-09-09T12:54:58Z">
         <w:r>
           <w:t xml:space="preserve">primary</w:t>
         </w:r>
@@ -3867,12 +3867,12 @@
       <w:r>
         <w:t xml:space="preserve"> </w:t>
       </w:r>
-      <w:del w:id="10551" w:author="Revision merge (HM+PL)" w:date="2026-09-07T16:18:28Z">
+      <w:del w:id="10551" w:author="Revision merge (HM+PL)" w:date="2026-09-09T12:54:58Z">
         <w:r>
           <w:delText xml:space="preserve">cohort</w:delText>
         </w:r>
       </w:del>
-      <w:ins w:id="10552" w:author="Revision merge (HM+PL)" w:date="2026-09-07T16:18:28Z">
+      <w:ins w:id="10552" w:author="Revision merge (HM+PL)" w:date="2026-09-09T12:54:58Z">
         <w:r>
           <w:t xml:space="preserve">dataset</w:t>
         </w:r>
@@ -3880,7 +3880,7 @@
       <w:r>
         <w:t xml:space="preserve"> (`Chicken batch 1`, PC_JC_2024-11-29; 18 samples; 3 dietary groups — Dulse, Reference diet, Soyabean meal) </w:t>
       </w:r>
-      <w:ins w:id="10553" w:author="Revision merge (HM+PL)" w:date="2026-09-07T16:18:28Z">
+      <w:ins w:id="10553" w:author="Revision merge (HM+PL)" w:date="2026-09-09T12:54:58Z">
         <w:r>
           <w:t xml:space="preserve">is publicly available under NCBI BioProject PRJNA1406192 and </w:t>
         </w:r>
@@ -3888,12 +3888,12 @@
       <w:r>
         <w:t xml:space="preserve">has approximately 46 hand-edited R scripts </w:t>
       </w:r>
-      <w:del w:id="10554" w:author="Revision merge (HM+PL)" w:date="2026-09-07T16:18:28Z">
+      <w:del w:id="10554" w:author="Revision merge (HM+PL)" w:date="2026-09-09T12:54:58Z">
         <w:r>
           <w:delText xml:space="preserve">and</w:delText>
         </w:r>
       </w:del>
-      <w:ins w:id="10555" w:author="Revision merge (HM+PL)" w:date="2026-09-07T16:18:28Z">
+      <w:ins w:id="10555" w:author="Revision merge (HM+PL)" w:date="2026-09-09T12:54:58Z">
         <w:r>
           <w:t xml:space="preserve">with</w:t>
         </w:r>
@@ -3901,12 +3901,12 @@
       <w:r>
         <w:t xml:space="preserve"> </w:t>
       </w:r>
-      <w:del w:id="10556" w:author="Revision merge (HM+PL)" w:date="2026-09-07T16:18:28Z">
+      <w:del w:id="10556" w:author="Revision merge (HM+PL)" w:date="2026-09-09T12:54:58Z">
         <w:r>
           <w:delText xml:space="preserve">known-good</w:delText>
         </w:r>
       </w:del>
-      <w:ins w:id="10557" w:author="Revision merge (HM+PL)" w:date="2026-09-07T16:18:28Z">
+      <w:ins w:id="10557" w:author="Revision merge (HM+PL)" w:date="2026-09-09T12:54:58Z">
         <w:r>
           <w:t xml:space="preserve">corresponding validated</w:t>
         </w:r>
@@ -3914,12 +3914,12 @@
       <w:r>
         <w:t xml:space="preserve"> figures and </w:t>
       </w:r>
-      <w:del w:id="10558" w:author="Revision merge (HM+PL)" w:date="2026-09-07T16:18:28Z">
+      <w:del w:id="10558" w:author="Revision merge (HM+PL)" w:date="2026-09-09T12:54:58Z">
         <w:r>
           <w:delText xml:space="preserve">tables already in place,</w:delText>
         </w:r>
       </w:del>
-      <w:ins w:id="10559" w:author="Revision merge (HM+PL)" w:date="2026-09-07T16:18:28Z">
+      <w:ins w:id="10559" w:author="Revision merge (HM+PL)" w:date="2026-09-09T12:54:58Z">
         <w:r>
           <w:t xml:space="preserve">tables,</w:t>
         </w:r>
@@ -3927,12 +3927,12 @@
       <w:r>
         <w:t xml:space="preserve"> so each stage can be compared output-for-output against the corresponding ground-truth artefact. The </w:t>
       </w:r>
-      <w:del w:id="10560" w:author="Revision merge (HM+PL)" w:date="2026-09-07T16:18:28Z">
+      <w:del w:id="10560" w:author="Revision merge (HM+PL)" w:date="2026-09-09T12:54:58Z">
         <w:r>
           <w:delText xml:space="preserve">scaling</w:delText>
         </w:r>
       </w:del>
-      <w:ins w:id="10561" w:author="Revision merge (HM+PL)" w:date="2026-09-07T16:18:28Z">
+      <w:ins w:id="10561" w:author="Revision merge (HM+PL)" w:date="2026-09-09T12:54:58Z">
         <w:r>
           <w:t xml:space="preserve">second</w:t>
         </w:r>
@@ -3940,12 +3940,12 @@
       <w:r>
         <w:t xml:space="preserve"> </w:t>
       </w:r>
-      <w:del w:id="10562" w:author="Revision merge (HM+PL)" w:date="2026-09-07T16:18:28Z">
+      <w:del w:id="10562" w:author="Revision merge (HM+PL)" w:date="2026-09-09T12:54:58Z">
         <w:r>
           <w:delText xml:space="preserve">and feature-coverage cohort</w:delText>
         </w:r>
       </w:del>
-      <w:ins w:id="10563" w:author="Revision merge (HM+PL)" w:date="2026-09-07T16:18:28Z">
+      <w:ins w:id="10563" w:author="Revision merge (HM+PL)" w:date="2026-09-09T12:54:58Z">
         <w:r>
           <w:t xml:space="preserve">dataset</w:t>
         </w:r>
@@ -3953,12 +3953,12 @@
       <w:r>
         <w:t xml:space="preserve"> (`Chicken batch 2`, JC_FL_2025-05-20; 32 </w:t>
       </w:r>
-      <w:del w:id="10564" w:author="Revision merge (HM+PL)" w:date="2026-09-07T16:18:28Z">
+      <w:del w:id="10564" w:author="Revision merge (HM+PL)" w:date="2026-09-09T12:54:58Z">
         <w:r>
           <w:delText xml:space="preserve">samples;</w:delText>
         </w:r>
       </w:del>
-      <w:ins w:id="10565" w:author="Revision merge (HM+PL)" w:date="2026-09-07T16:18:28Z">
+      <w:ins w:id="10565" w:author="Revision merge (HM+PL)" w:date="2026-09-09T12:54:58Z">
         <w:r>
           <w:t xml:space="preserve">samples), for which public release is pending publication of the associated study, was used for scalability and feature coverage: samples were organised into a</w:t>
         </w:r>
@@ -3966,12 +3966,12 @@
       <w:r>
         <w:t xml:space="preserve"> 4-level composite `Treatment_Bird` grouping </w:t>
       </w:r>
-      <w:del w:id="10566" w:author="Revision merge (HM+PL)" w:date="2026-09-07T16:18:28Z">
+      <w:del w:id="10566" w:author="Revision merge (HM+PL)" w:date="2026-09-09T12:54:58Z">
         <w:r>
           <w:delText xml:space="preserve">— Control_W4,</w:delText>
         </w:r>
       </w:del>
-      <w:ins w:id="10567" w:author="Revision merge (HM+PL)" w:date="2026-09-07T16:18:28Z">
+      <w:ins w:id="10567" w:author="Revision merge (HM+PL)" w:date="2026-09-09T12:54:58Z">
         <w:r>
           <w:t xml:space="preserve">(Control_W4,</w:t>
         </w:r>
@@ -3979,12 +3979,12 @@
       <w:r>
         <w:t xml:space="preserve"> Control_W5, Dulse_W4, Dulse_W5) </w:t>
       </w:r>
-      <w:del w:id="10568" w:author="Revision merge (HM+PL)" w:date="2026-09-07T16:18:28Z">
+      <w:del w:id="10568" w:author="Revision merge (HM+PL)" w:date="2026-09-09T12:54:58Z">
         <w:r>
           <w:delText xml:space="preserve">exercises</w:delText>
         </w:r>
       </w:del>
-      <w:ins w:id="10569" w:author="Revision merge (HM+PL)" w:date="2026-09-07T16:18:28Z">
+      <w:ins w:id="10569" w:author="Revision merge (HM+PL)" w:date="2026-09-09T12:54:58Z">
         <w:r>
           <w:t xml:space="preserve">with</w:t>
         </w:r>
@@ -4144,12 +4144,12 @@
       <w:r>
         <w:t xml:space="preserve">Across both </w:t>
       </w:r>
-      <w:del w:id="10570" w:author="Revision merge (HM+PL)" w:date="2026-09-07T16:18:28Z">
+      <w:del w:id="10570" w:author="Revision merge (HM+PL)" w:date="2026-09-09T12:54:58Z">
         <w:r>
           <w:delText xml:space="preserve">cohorts</w:delText>
         </w:r>
       </w:del>
-      <w:ins w:id="10571" w:author="Revision merge (HM+PL)" w:date="2026-09-07T16:18:28Z">
+      <w:ins w:id="10571" w:author="Revision merge (HM+PL)" w:date="2026-09-09T12:54:58Z">
         <w:r>
           <w:t xml:space="preserve">datasets</w:t>
         </w:r>
@@ -4157,12 +4157,12 @@
       <w:r>
         <w:t xml:space="preserve"> (**Table 1**), every enabled stage produced its expected primary artefact under identical settings. Feature counts scale with cohort size and grouping complexity: B2 (n=32, 4-level `Treatment_Bird`) yields ~1.5–2× the resistome (648 vs 348 rows), virulome (492 vs 320) and mobilome (137 vs 65) rows of B1, with 53 vs 31 differentially abundant taxa across 6 vs 3 pairwise contrasts and a denser integrated network (576 edges/210 nodes/modularity 0.40 vs 247/100/0.31). The pipeline closes cleanly on both runs, producing a contract-v1.2 `manifest.json` (~80–85 kB) and a Quarto HTML dashboard (~14–18 MB). The performance profile (**Figure 2**) illustrated that the end-to-end runtime grew from 6m 41s on B1 to 8m 19s on B2 (+24 %, sublinear in both sample count and pairwise-contrast count), dominated on both cohorts by ALDEx2 differential abundance (32 % of B1 total, 40 % of B2). Peak R-process memory tracks the same monotone </w:t>
       </w:r>
-      <w:del w:id="10572" w:author="Revision merge (HM+PL)" w:date="2026-09-07T16:18:28Z">
+      <w:del w:id="10572" w:author="Revision merge (HM+PL)" w:date="2026-09-09T12:54:58Z">
         <w:r>
           <w:delText xml:space="preserve">profile —</w:delText>
         </w:r>
       </w:del>
-      <w:ins w:id="10573" w:author="Revision merge (HM+PL)" w:date="2026-09-07T16:18:28Z">
+      <w:ins w:id="10573" w:author="Revision merge (HM+PL)" w:date="2026-09-09T12:54:58Z">
         <w:r>
           <w:t xml:space="preserve">profile,</w:t>
         </w:r>
@@ -4183,7 +4183,7 @@
       <w:pPr>
         <w:spacing w:after="120"/>
       </w:pPr>
-      <w:del w:id="10574" w:author="Revision merge (HM+PL)" w:date="2026-09-07T16:18:28Z">
+      <w:del w:id="10574" w:author="Revision merge (HM+PL)" w:date="2026-09-09T12:54:58Z">
         <w:r>
           <w:delText xml:space="preserve">One expected and deliberate divergence concerns the resistome stage: the ground-truth `cleanData.R` misparses taxids carrying variant suffixes, dropping the corresponding ABRicate rows. R/02 fixes this parsing bug, so the pipeline retains 110 additional (sample, GENE) rows relative to the hand-edited output (`scripts/diff_normdata.R` on the 2026-06-23 B1 run: pipeline = 733 rows, ground truth = 623; 121 rows gained by the parsing fix, 11 rows present in the ground truth that the pipeline currently drops — concentrated in a handful of plasmid replicon and accessory resistance calls, queued for inspection rather than treated as a regression). Jaccard agreement on the `(sample, GENE)` key set is 0.82. Across the other stages with directly comparable ground-truth artefacts, sample-set agreement is exact for alpha diversity (18/18), and Jaccard for the network Gephi exports against the most recent hand-edited snapshot is 0.85 (nodes) and 0.87 (edges). Per-stage comparisons against the remaining hand-edited artefacts — taxonomy, beta diversity, and differential abundance — are deferred to a separate validation effort. The Re-centrifuge column-slicing heuristic in R/02 is acknowledged as still coarse and is queued for rework.</w:delText>
         </w:r>
@@ -4193,7 +4193,7 @@
       <w:pPr>
         <w:spacing w:after="120"/>
       </w:pPr>
-      <w:ins w:id="10575" w:author="Revision merge (HM+PL)" w:date="2026-09-07T16:18:28Z">
+      <w:ins w:id="10575" w:author="Revision merge (HM+PL)" w:date="2026-09-09T12:54:58Z">
         <w:r>
           <w:t xml:space="preserve">One anticipated and deliberate discrepancy arises at the resistome stage: the ground-truth `cleanData.R` misparses taxids carrying variant suffixes, dropping the corresponding ABRicate rows. R/02 corrects this parsing issue, so the pipeline retains 110 additional (sample, GENE) rows relative to the hand-edited output (`scripts/diff_normdata.R` on the 2026-06-23 B1 run: pipeline = 733 rows, ground truth = 623; 121 rows recovered by the parsing correction, and 11 rows present in the ground truth that the pipeline currently drops, concentrated in a handful of plasmid replicon and accessory resistance calls, queued for inspection rather than treated as a regression). Jaccard agreement on the `(sample, GENE)` key set is 0.82. For other stages with directly comparable ground-truth artefacts, sample-set agreement is exact for alpha diversity (18/18), and Jaccard for the network Gephi exports against the most recent hand-edited snapshot is 0.85 (nodes) and 0.87 (edges). Per-stage comparisons against the remaining hand-edited artefacts — taxonomy, beta diversity, and differential abundance — are deferred to a separate validation effort. The Re-centrifuge column-slicing heuristic in R/02 is acknowledged as still coarse and is queued for rework.</w:t>
         </w:r>
@@ -4203,7 +4203,7 @@
       <w:pPr>
         <w:spacing w:after="120"/>
       </w:pPr>
-      <w:ins w:id="10576" w:author="Revision merge (HM+PL)" w:date="2026-09-07T16:18:28Z">
+      <w:ins w:id="10576" w:author="Revision merge (HM+PL)" w:date="2026-09-09T12:54:58Z">
         <w:r>
           <w:t xml:space="preserve">To assess portability beyond the development cohorts, we applied MERIDIAN unmodified — changing only `config.yaml` — to two independent, publicly available long-read (ONT) metagenomic studies spanning the One Health continuum: hospital wastewater versus tap water from five Egyptian hospitals (NCBI BioProject PRJNA1266479; 20 samples) and anthropogenically impacted versus natural wetland sites along the East Atlantic Flyway (ENA BioProject PRJEB96272; 24 samples). Both cohorts completed all fifteen stages in a single run (4m 08s and 5m 54s; peak 2.0 and 3.5 GB), each emitting a Quarto dashboard, publication panels and a contract-v1.2 `manifest.json`. The pipeline recovered biologically coherent structure: hospital wastewater was significantly richer and compositionally distinct from tap water (PERMANOVA R² = 0.18, p = 3 × 10⁻⁴), and — within the wetland subset for which functional (ABRicate CARD/VFDB) profiles were available, currently the German sites — virulence-factor load was higher at anthropogenically impacted than natural sites (PERMANOVA R² = 0.25, p_adj = 0.015; provisional, pending resistome/virulome profiling of the remaining sites). Both datasets also exercised edge cases absent from the chicken cohorts — a single-group resistome/mobilome in the hospital cohort (tap water carried essentially no ARGs) and an absence of plasmid replicons in the wetland water (PlasmidFinder), consistent with the source study — which the pipeline handled by skipping the affected sub-analyses with logged notices rather than failing. As these datasets lack hand-curated ground-truth artefacts, they demonstrate portability and robustness across sample types rather than output-for-output correctness.</w:t>
         </w:r>
@@ -4213,7 +4213,7 @@
       <w:pPr>
         <w:spacing w:after="120"/>
       </w:pPr>
-      <w:ins w:id="10577" w:author="Revision merge (HM+PL)" w:date="2026-09-07T16:18:28Z">
+      <w:ins w:id="10577" w:author="Revision merge (HM+PL)" w:date="2026-09-09T12:54:58Z">
         <w:r>
           <w:t xml:space="preserve">**Table S1.** MERIDIAN applied across four long-read metagenomic cohorts spanning the One Health continuum. B1/B2 are the poultry development cohorts; the Egyptian hospital-wastewater and East Atlantic Flyway wetland cohorts are independent public datasets analysed with configuration changes only.</w:t>
         </w:r>
@@ -4223,7 +4223,7 @@
       <w:pPr>
         <w:spacing w:after="120"/>
       </w:pPr>
-      <w:ins w:id="10578" w:author="Revision merge (HM+PL)" w:date="2026-09-07T16:18:28Z">
+      <w:ins w:id="10578" w:author="Revision merge (HM+PL)" w:date="2026-09-09T12:54:58Z">
         <w:r>
           <w:t xml:space="preserve">| Cohort | One Health axis | n | Primary contrast | Runtime | Peak RAM | Headline result |</w:t>
         </w:r>
@@ -4233,7 +4233,7 @@
       <w:pPr>
         <w:spacing w:after="120"/>
       </w:pPr>
-      <w:ins w:id="10579" w:author="Revision merge (HM+PL)" w:date="2026-09-07T16:18:28Z">
+      <w:ins w:id="10579" w:author="Revision merge (HM+PL)" w:date="2026-09-09T12:54:58Z">
         <w:r>
           <w:t xml:space="preserve">| --- | --- | --- | --- | --- | --- | --- |</w:t>
         </w:r>
@@ -4243,7 +4243,7 @@
       <w:pPr>
         <w:spacing w:after="120"/>
       </w:pPr>
-      <w:ins w:id="10580" w:author="Revision merge (HM+PL)" w:date="2026-09-07T16:18:28Z">
+      <w:ins w:id="10580" w:author="Revision merge (HM+PL)" w:date="2026-09-09T12:54:58Z">
         <w:r>
           <w:t xml:space="preserve">| Chicken batch 1 | Livestock (poultry caecum) | 18 | Diet (3 groups) | 6m 41s | 1.33 GB | Ground-truth reference; R/02 parsing fix recovers 110 (sample, GENE) rows |</w:t>
         </w:r>
@@ -4253,7 +4253,7 @@
       <w:pPr>
         <w:spacing w:after="120"/>
       </w:pPr>
-      <w:ins w:id="10581" w:author="Revision merge (HM+PL)" w:date="2026-09-07T16:18:28Z">
+      <w:ins w:id="10581" w:author="Revision merge (HM+PL)" w:date="2026-09-09T12:54:58Z">
         <w:r>
           <w:t xml:space="preserve">| Chicken batch 2 | Livestock (poultry caecum) | 32 | Treatment × week (4-level) | 8m 19s | 1.51 GB | Sublinear scaling; denser integrated network |</w:t>
         </w:r>
@@ -4263,7 +4263,7 @@
       <w:pPr>
         <w:spacing w:after="120"/>
       </w:pPr>
-      <w:ins w:id="10582" w:author="Revision merge (HM+PL)" w:date="2026-09-07T16:18:28Z">
+      <w:ins w:id="10582" w:author="Revision merge (HM+PL)" w:date="2026-09-09T12:54:58Z">
         <w:r>
           <w:t xml:space="preserve">| Hospital wastewater (EG) | Human-clinical + built environment | 20 | Wastewater vs tap water | 4m 08s | 1.98 GB | Wastewater richer and compositionally distinct (PERMANOVA R² = 0.18, p = 3 × 10⁻⁴) |</w:t>
         </w:r>
@@ -4273,7 +4273,7 @@
       <w:pPr>
         <w:spacing w:after="120"/>
       </w:pPr>
-      <w:ins w:id="10583" w:author="Revision merge (HM+PL)" w:date="2026-09-07T16:18:28Z">
+      <w:ins w:id="10583" w:author="Revision merge (HM+PL)" w:date="2026-09-09T12:54:58Z">
         <w:r>
           <w:t xml:space="preserve">| Wetlands (E. Atlantic Flyway) | Wildlife + environment | 24 | Impacted vs natural | 5m 54s | 3.46 GB | Higher virulome load at impacted sites (R² = 0.25, p_adj = 0.015; German subset, provisional) |</w:t>
         </w:r>
@@ -4301,12 +4301,12 @@
       <w:r>
         <w:t xml:space="preserve">MERIDIAN </w:t>
       </w:r>
-      <w:del w:id="10584" w:author="Revision merge (HM+PL)" w:date="2026-09-07T16:18:28Z">
+      <w:del w:id="10584" w:author="Revision merge (HM+PL)" w:date="2026-09-09T12:54:58Z">
         <w:r>
           <w:delText xml:space="preserve">consolidates</w:delText>
         </w:r>
       </w:del>
-      <w:ins w:id="10585" w:author="Revision merge (HM+PL)" w:date="2026-09-07T16:18:28Z">
+      <w:ins w:id="10585" w:author="Revision merge (HM+PL)" w:date="2026-09-09T12:54:58Z">
         <w:r>
           <w:t xml:space="preserve">integrates</w:t>
         </w:r>
@@ -4314,12 +4314,12 @@
       <w:r>
         <w:t xml:space="preserve"> community analyses, functional profiling, and an integrated network reconstruction into </w:t>
       </w:r>
-      <w:del w:id="10586" w:author="Revision merge (HM+PL)" w:date="2026-09-07T16:18:28Z">
+      <w:del w:id="10586" w:author="Revision merge (HM+PL)" w:date="2026-09-09T12:54:58Z">
         <w:r>
           <w:delText xml:space="preserve">one</w:delText>
         </w:r>
       </w:del>
-      <w:ins w:id="10587" w:author="Revision merge (HM+PL)" w:date="2026-09-07T16:18:28Z">
+      <w:ins w:id="10587" w:author="Revision merge (HM+PL)" w:date="2026-09-09T12:54:58Z">
         <w:r>
           <w:t xml:space="preserve">a single</w:t>
         </w:r>
@@ -4327,12 +4327,12 @@
       <w:r>
         <w:t xml:space="preserve"> configuration-driven R </w:t>
       </w:r>
-      <w:del w:id="10588" w:author="Revision merge (HM+PL)" w:date="2026-09-07T16:18:28Z">
+      <w:del w:id="10588" w:author="Revision merge (HM+PL)" w:date="2026-09-09T12:54:58Z">
         <w:r>
           <w:delText xml:space="preserve">project</w:delText>
         </w:r>
       </w:del>
-      <w:ins w:id="10589" w:author="Revision merge (HM+PL)" w:date="2026-09-07T16:18:28Z">
+      <w:ins w:id="10589" w:author="Revision merge (HM+PL)" w:date="2026-09-09T12:54:58Z">
         <w:r>
           <w:t xml:space="preserve">workflow</w:t>
         </w:r>
@@ -4340,7 +4340,7 @@
       <w:r>
         <w:t xml:space="preserve"> for long-read shotgun metagenomics. Single-thread end-to-end execution completes in minutes with a low memory footprint, scaling sublinearly with cohort size and grouping complexity. </w:t>
       </w:r>
-      <w:ins w:id="10590" w:author="Revision merge (HM+PL)" w:date="2026-09-07T16:18:28Z">
+      <w:ins w:id="10590" w:author="Revision merge (HM+PL)" w:date="2026-09-09T12:54:58Z">
         <w:r>
           <w:t xml:space="preserve">Beyond the development cohorts, it has been applied without modification to two independent public cohorts spanning the One Health continuum (hospital wastewater and wetland surveillance). </w:t>
         </w:r>
@@ -4348,12 +4348,12 @@
       <w:r>
         <w:t xml:space="preserve">It is </w:t>
       </w:r>
-      <w:del w:id="10591" w:author="Revision merge (HM+PL)" w:date="2026-09-07T16:18:28Z">
+      <w:del w:id="10591" w:author="Revision merge (HM+PL)" w:date="2026-09-09T12:54:58Z">
         <w:r>
           <w:delText xml:space="preserve">in</w:delText>
         </w:r>
       </w:del>
-      <w:ins w:id="10592" w:author="Revision merge (HM+PL)" w:date="2026-09-07T16:18:28Z">
+      <w:ins w:id="10592" w:author="Revision merge (HM+PL)" w:date="2026-09-09T12:54:58Z">
         <w:r>
           <w:t xml:space="preserve">currently under</w:t>
         </w:r>
@@ -4361,12 +4361,12 @@
       <w:r>
         <w:t xml:space="preserve"> active </w:t>
       </w:r>
-      <w:del w:id="10593" w:author="Revision merge (HM+PL)" w:date="2026-09-07T16:18:28Z">
+      <w:del w:id="10593" w:author="Revision merge (HM+PL)" w:date="2026-09-09T12:54:58Z">
         <w:r>
           <w:delText xml:space="preserve">development;</w:delText>
         </w:r>
       </w:del>
-      <w:ins w:id="10594" w:author="Revision merge (HM+PL)" w:date="2026-09-07T16:18:28Z">
+      <w:ins w:id="10594" w:author="Revision merge (HM+PL)" w:date="2026-09-09T12:54:58Z">
         <w:r>
           <w:t xml:space="preserve">development, and</w:t>
         </w:r>
@@ -4374,12 +4374,12 @@
       <w:r>
         <w:t xml:space="preserve"> we are releasing this </w:t>
       </w:r>
-      <w:del w:id="10595" w:author="Revision merge (HM+PL)" w:date="2026-09-07T16:18:28Z">
+      <w:del w:id="10595" w:author="Revision merge (HM+PL)" w:date="2026-09-09T12:54:58Z">
         <w:r>
           <w:delText xml:space="preserve">alpha-stage</w:delText>
         </w:r>
       </w:del>
-      <w:ins w:id="10596" w:author="Revision merge (HM+PL)" w:date="2026-09-07T16:18:28Z">
+      <w:ins w:id="10596" w:author="Revision merge (HM+PL)" w:date="2026-09-09T12:54:58Z">
         <w:r>
           <w:t xml:space="preserve">alpha</w:t>
         </w:r>
@@ -4387,12 +4387,12 @@
       <w:r>
         <w:t xml:space="preserve"> </w:t>
       </w:r>
-      <w:del w:id="10597" w:author="Revision merge (HM+PL)" w:date="2026-09-07T16:18:28Z">
+      <w:del w:id="10597" w:author="Revision merge (HM+PL)" w:date="2026-09-09T12:54:58Z">
         <w:r>
           <w:delText xml:space="preserve">workflow</w:delText>
         </w:r>
       </w:del>
-      <w:ins w:id="10598" w:author="Revision merge (HM+PL)" w:date="2026-09-07T16:18:28Z">
+      <w:ins w:id="10598" w:author="Revision merge (HM+PL)" w:date="2026-09-09T12:54:58Z">
         <w:r>
           <w:t xml:space="preserve">version</w:t>
         </w:r>
@@ -4400,7 +4400,7 @@
       <w:r>
         <w:t xml:space="preserve"> (v0.1.0) </w:t>
       </w:r>
-      <w:del w:id="10599" w:author="Revision merge (HM+PL)" w:date="2026-09-07T16:18:28Z">
+      <w:del w:id="10599" w:author="Revision merge (HM+PL)" w:date="2026-09-09T12:54:58Z">
         <w:r>
           <w:delText xml:space="preserve">now </w:delText>
         </w:r>
@@ -4408,12 +4408,12 @@
       <w:r>
         <w:t xml:space="preserve">to </w:t>
       </w:r>
-      <w:del w:id="10600" w:author="Revision merge (HM+PL)" w:date="2026-09-07T16:18:28Z">
+      <w:del w:id="10600" w:author="Revision merge (HM+PL)" w:date="2026-09-09T12:54:58Z">
         <w:r>
           <w:delText xml:space="preserve">invite</w:delText>
         </w:r>
       </w:del>
-      <w:ins w:id="10601" w:author="Revision merge (HM+PL)" w:date="2026-09-07T16:18:28Z">
+      <w:ins w:id="10601" w:author="Revision merge (HM+PL)" w:date="2026-09-09T12:54:58Z">
         <w:r>
           <w:t xml:space="preserve">solicit</w:t>
         </w:r>
@@ -4421,12 +4421,12 @@
       <w:r>
         <w:t xml:space="preserve"> feedback from </w:t>
       </w:r>
-      <w:del w:id="10602" w:author="Revision merge (HM+PL)" w:date="2026-09-07T16:18:28Z">
+      <w:del w:id="10602" w:author="Revision merge (HM+PL)" w:date="2026-09-09T12:54:58Z">
         <w:r>
           <w:delText xml:space="preserve">groups</w:delText>
         </w:r>
       </w:del>
-      <w:ins w:id="10603" w:author="Revision merge (HM+PL)" w:date="2026-09-07T16:18:28Z">
+      <w:ins w:id="10603" w:author="Revision merge (HM+PL)" w:date="2026-09-09T12:54:58Z">
         <w:r>
           <w:t xml:space="preserve">researchers</w:t>
         </w:r>
@@ -4434,12 +4434,12 @@
       <w:r>
         <w:t xml:space="preserve"> </w:t>
       </w:r>
-      <w:del w:id="10604" w:author="Revision merge (HM+PL)" w:date="2026-09-07T16:18:28Z">
+      <w:del w:id="10604" w:author="Revision merge (HM+PL)" w:date="2026-09-09T12:54:58Z">
         <w:r>
           <w:delText xml:space="preserve">running</w:delText>
         </w:r>
       </w:del>
-      <w:ins w:id="10605" w:author="Revision merge (HM+PL)" w:date="2026-09-07T16:18:28Z">
+      <w:ins w:id="10605" w:author="Revision merge (HM+PL)" w:date="2026-09-09T12:54:58Z">
         <w:r>
           <w:t xml:space="preserve">conducting</w:t>
         </w:r>
@@ -4447,12 +4447,12 @@
       <w:r>
         <w:t xml:space="preserve"> comparable </w:t>
       </w:r>
-      <w:del w:id="10606" w:author="Revision merge (HM+PL)" w:date="2026-09-07T16:18:28Z">
+      <w:del w:id="10606" w:author="Revision merge (HM+PL)" w:date="2026-09-09T12:54:58Z">
         <w:r>
           <w:delText xml:space="preserve">analyses.</w:delText>
         </w:r>
       </w:del>
-      <w:ins w:id="10607" w:author="Revision merge (HM+PL)" w:date="2026-09-07T16:18:28Z">
+      <w:ins w:id="10607" w:author="Revision merge (HM+PL)" w:date="2026-09-09T12:54:58Z">
         <w:r>
           <w:t xml:space="preserve">long-read metagenomic studies and to guide future development of the workflow.</w:t>
         </w:r>
@@ -4472,12 +4472,12 @@
       <w:r>
         <w:t xml:space="preserve">**Acknowledgements.** The authors thank the **Centre for Innovation in Genomics and Microbiome Sciences (CIGMiS)**, which generated the chicken caecum metagenomics datasets used to develop and validate the pipeline. We are grateful to **colleagues** for feedback on the configuration interface and Quarto report layout, and to the School of </w:t>
       </w:r>
-      <w:del w:id="10608" w:author="Revision merge (HM+PL)" w:date="2026-09-07T16:18:28Z">
+      <w:del w:id="10608" w:author="Revision merge (HM+PL)" w:date="2026-09-09T12:54:58Z">
         <w:r>
           <w:delText xml:space="preserve">Biomedical</w:delText>
         </w:r>
       </w:del>
-      <w:ins w:id="10609" w:author="Revision merge (HM+PL)" w:date="2026-09-07T16:18:28Z">
+      <w:ins w:id="10609" w:author="Revision merge (HM+PL)" w:date="2026-09-09T12:54:58Z">
         <w:r>
           <w:t xml:space="preserve">Medicine</w:t>
         </w:r>
@@ -4485,12 +4485,12 @@
       <w:r>
         <w:t xml:space="preserve"> </w:t>
       </w:r>
-      <w:del w:id="10610" w:author="Revision merge (HM+PL)" w:date="2026-09-07T16:18:28Z">
+      <w:del w:id="10610" w:author="Revision merge (HM+PL)" w:date="2026-09-09T12:54:58Z">
         <w:r>
           <w:delText xml:space="preserve">Science</w:delText>
         </w:r>
       </w:del>
-      <w:ins w:id="10611" w:author="Revision merge (HM+PL)" w:date="2026-09-07T16:18:28Z">
+      <w:ins w:id="10611" w:author="Revision merge (HM+PL)" w:date="2026-09-09T12:54:58Z">
         <w:r>
           <w:t xml:space="preserve">and Bioscience</w:t>
         </w:r>
@@ -4519,7 +4519,7 @@
       <w:pPr>
         <w:spacing w:after="120"/>
       </w:pPr>
-      <w:ins w:id="10612" w:author="Revision merge (HM+PL)" w:date="2026-09-07T16:18:28Z">
+      <w:ins w:id="10612" w:author="Revision merge (HM+PL)" w:date="2026-09-09T12:54:58Z">
         <w:r>
           <w:t xml:space="preserve">**Data Availability.** Sequence data for the primary validation cohort (`Chicken batch 1`) are available from NCBI under BioProject PRJNA1406192. Data for the second cohort (`Chicken batch 2`) will be released upon publication of the associated study. The MERIDIAN source code, documentation and configuration examples are available at https://github.com/Julio92-C/Metagenomics_pipeline_automation (release v0.1.0).</w:t>
         </w:r>

</xml_diff>

<commit_message>
docs(manuscript): extend Figure 2 to 4 cohorts; finalize wetlands numbers
Now that the complete wetlands ABRicate report is in (23/24 samples), update
the validation results to the flyway-wide standard analysis and add the two
new cohorts to the performance figure.

- generate_figure2.R: add HW (hospital, n=20) + WL (wetlands, n=24) columns;
  4-cohort dodged bars + step lines; 2-row legend; regenerated PNG + TIFF
- §3: wetlands runtime 5m54s -> 7m37s, peak 3.5 -> 3.6 GB; un-scope the
  virulome claim from "German subset, provisional" to flyway-wide
  (PERMANOVA R²=0.088, p_adj=0.037; 23/24 samples)
- Table S1: same wetlands runtime/peak/headline update
- Figure 2 caption: four cohorts, HW/WL defined
- merge_log: O3 coverage caveat marked RESOLVED
- refresh tracked redline (Mode A) + add formatted review docx (Mode B,
  figures + tables) for co-author review

Co-Authored-By: Claude Opus 4.8 <noreply@anthropic.com>
Claude-Session: https://claude.ai/code/session_011iYU9ZmVnXfPXhgvAmJ24Q
</commit_message>
<xml_diff>
--- a/docs/manuscript/applications_note_merged_tracked.docx
+++ b/docs/manuscript/applications_note_merged_tracked.docx
@@ -32,12 +32,12 @@
       <w:r>
         <w:t xml:space="preserve">Julio C. Ortega Cambara&lt;sup&gt;1&lt;/sup&gt;, Piotr </w:t>
       </w:r>
-      <w:del w:id="10001" w:author="Revision merge (HM+PL)" w:date="2026-09-09T12:54:58Z">
+      <w:del w:id="10001" w:author="Revision merge (HM+PL)" w:date="2026-09-09T13:15:15Z">
         <w:r>
           <w:delText xml:space="preserve">Cuber&lt;sup&gt;4&lt;/sup&gt;,</w:delText>
         </w:r>
       </w:del>
-      <w:ins w:id="10002" w:author="Revision merge (HM+PL)" w:date="2026-09-09T12:54:58Z">
+      <w:ins w:id="10002" w:author="Revision merge (HM+PL)" w:date="2026-09-09T13:15:15Z">
         <w:r>
           <w:t xml:space="preserve">Cuber&lt;sup&gt;2&lt;/sup&gt;,</w:t>
         </w:r>
@@ -45,7 +45,7 @@
       <w:r>
         <w:t xml:space="preserve"> Pedro Humberto Lebre&lt;sup&gt;1&lt;/sup&gt;, </w:t>
       </w:r>
-      <w:del w:id="10003" w:author="Revision merge (HM+PL)" w:date="2026-09-09T12:54:58Z">
+      <w:del w:id="10003" w:author="Revision merge (HM+PL)" w:date="2026-09-09T13:15:15Z">
         <w:r>
           <w:delText xml:space="preserve">Raju Misra&lt;sup&gt;2&lt;/sup&gt;, Timothy D. McHugh&lt;sup&gt;3&lt;/sup&gt;, Sylvia Rofael&lt;sup&gt;3&lt;/sup&gt;, David Lowe&lt;sup&gt;3&lt;/sup&gt;, </w:delText>
         </w:r>
@@ -53,7 +53,7 @@
       <w:r>
         <w:t xml:space="preserve">Hermine </w:t>
       </w:r>
-      <w:ins w:id="10004" w:author="Revision merge (HM+PL)" w:date="2026-09-09T12:54:58Z">
+      <w:ins w:id="10004" w:author="Revision merge (HM+PL)" w:date="2026-09-09T13:15:15Z">
         <w:r>
           <w:t xml:space="preserve">V </w:t>
         </w:r>
@@ -66,12 +66,12 @@
       <w:pPr>
         <w:spacing w:after="120"/>
       </w:pPr>
-      <w:del w:id="10005" w:author="Revision merge (HM+PL)" w:date="2026-09-09T12:54:58Z">
+      <w:del w:id="10005" w:author="Revision merge (HM+PL)" w:date="2026-09-09T13:15:15Z">
         <w:r>
           <w:delText xml:space="preserve">&lt;sup&gt;1&lt;/sup&gt;School</w:delText>
         </w:r>
       </w:del>
-      <w:ins w:id="10006" w:author="Revision merge (HM+PL)" w:date="2026-09-09T12:54:58Z">
+      <w:ins w:id="10006" w:author="Revision merge (HM+PL)" w:date="2026-09-09T13:15:15Z">
         <w:r>
           <w:t xml:space="preserve">&lt;sup&gt;1&lt;/sup&gt;Centre for Innovation in Genomics and Microbiome Sciences, School</w:t>
         </w:r>
@@ -79,12 +79,12 @@
       <w:r>
         <w:t xml:space="preserve"> of </w:t>
       </w:r>
-      <w:del w:id="10007" w:author="Revision merge (HM+PL)" w:date="2026-09-09T12:54:58Z">
+      <w:del w:id="10007" w:author="Revision merge (HM+PL)" w:date="2026-09-09T13:15:15Z">
         <w:r>
           <w:delText xml:space="preserve">Biomedical</w:delText>
         </w:r>
       </w:del>
-      <w:ins w:id="10008" w:author="Revision merge (HM+PL)" w:date="2026-09-09T12:54:58Z">
+      <w:ins w:id="10008" w:author="Revision merge (HM+PL)" w:date="2026-09-09T13:15:15Z">
         <w:r>
           <w:t xml:space="preserve">Medicine</w:t>
         </w:r>
@@ -92,12 +92,12 @@
       <w:r>
         <w:t xml:space="preserve"> </w:t>
       </w:r>
-      <w:del w:id="10009" w:author="Revision merge (HM+PL)" w:date="2026-09-09T12:54:58Z">
+      <w:del w:id="10009" w:author="Revision merge (HM+PL)" w:date="2026-09-09T13:15:15Z">
         <w:r>
           <w:delText xml:space="preserve">Science,</w:delText>
         </w:r>
       </w:del>
-      <w:ins w:id="10010" w:author="Revision merge (HM+PL)" w:date="2026-09-09T12:54:58Z">
+      <w:ins w:id="10010" w:author="Revision merge (HM+PL)" w:date="2026-09-09T13:15:15Z">
         <w:r>
           <w:t xml:space="preserve">and Bioscience,</w:t>
         </w:r>
@@ -105,12 +105,12 @@
       <w:r>
         <w:t xml:space="preserve"> University of West London, London, United Kingdom </w:t>
       </w:r>
-      <w:del w:id="10011" w:author="Revision merge (HM+PL)" w:date="2026-09-09T12:54:58Z">
+      <w:del w:id="10011" w:author="Revision merge (HM+PL)" w:date="2026-09-09T13:15:15Z">
         <w:r>
           <w:delText xml:space="preserve">&lt;sup&gt;2&lt;/sup&gt;UK Health Security Agency, London, United Kingdom &lt;sup&gt;3&lt;/sup&gt;Centre for Clinical Microbiology, University College London, London, United Kingdom &lt;sup&gt;4&lt;/sup&gt;Natural</w:delText>
         </w:r>
       </w:del>
-      <w:ins w:id="10012" w:author="Revision merge (HM+PL)" w:date="2026-09-09T12:54:58Z">
+      <w:ins w:id="10012" w:author="Revision merge (HM+PL)" w:date="2026-09-09T13:15:15Z">
         <w:r>
           <w:t xml:space="preserve">&lt;sup&gt;2&lt;/sup&gt;Natural</w:t>
         </w:r>
@@ -161,12 +161,12 @@
       <w:pPr>
         <w:spacing w:after="120"/>
       </w:pPr>
-      <w:del w:id="10013" w:author="Revision merge (HM+PL)" w:date="2026-09-09T12:54:58Z">
+      <w:del w:id="10013" w:author="Revision merge (HM+PL)" w:date="2026-09-09T13:15:15Z">
         <w:r>
           <w:delText xml:space="preserve">**Motivation.**</w:delText>
         </w:r>
       </w:del>
-      <w:ins w:id="10014" w:author="Revision merge (HM+PL)" w:date="2026-09-09T12:54:58Z">
+      <w:ins w:id="10014" w:author="Revision merge (HM+PL)" w:date="2026-09-09T13:15:15Z">
         <w:r>
           <w:t xml:space="preserve">**Background:**</w:t>
         </w:r>
@@ -174,12 +174,12 @@
       <w:r>
         <w:t xml:space="preserve"> Long-read shotgun metagenomics studies are </w:t>
       </w:r>
-      <w:del w:id="10015" w:author="Revision merge (HM+PL)" w:date="2026-09-09T12:54:58Z">
+      <w:del w:id="10015" w:author="Revision merge (HM+PL)" w:date="2026-09-09T13:15:15Z">
         <w:r>
           <w:delText xml:space="preserve">typically</w:delText>
         </w:r>
       </w:del>
-      <w:ins w:id="10016" w:author="Revision merge (HM+PL)" w:date="2026-09-09T12:54:58Z">
+      <w:ins w:id="10016" w:author="Revision merge (HM+PL)" w:date="2026-09-09T13:15:15Z">
         <w:r>
           <w:t xml:space="preserve">often</w:t>
         </w:r>
@@ -187,12 +187,12 @@
       <w:r>
         <w:t xml:space="preserve"> analysed </w:t>
       </w:r>
-      <w:del w:id="10017" w:author="Revision merge (HM+PL)" w:date="2026-09-09T12:54:58Z">
+      <w:del w:id="10017" w:author="Revision merge (HM+PL)" w:date="2026-09-09T13:15:15Z">
         <w:r>
           <w:delText xml:space="preserve">by</w:delText>
         </w:r>
       </w:del>
-      <w:ins w:id="10018" w:author="Revision merge (HM+PL)" w:date="2026-09-09T12:54:58Z">
+      <w:ins w:id="10018" w:author="Revision merge (HM+PL)" w:date="2026-09-09T13:15:15Z">
         <w:r>
           <w:t xml:space="preserve">using</w:t>
         </w:r>
@@ -200,12 +200,12 @@
       <w:r>
         <w:t xml:space="preserve"> </w:t>
       </w:r>
-      <w:del w:id="10019" w:author="Revision merge (HM+PL)" w:date="2026-09-09T12:54:58Z">
+      <w:del w:id="10019" w:author="Revision merge (HM+PL)" w:date="2026-09-09T13:15:15Z">
         <w:r>
           <w:delText xml:space="preserve">hand-editing</w:delText>
         </w:r>
       </w:del>
-      <w:ins w:id="10020" w:author="Revision merge (HM+PL)" w:date="2026-09-09T12:54:58Z">
+      <w:ins w:id="10020" w:author="Revision merge (HM+PL)" w:date="2026-09-09T13:15:15Z">
         <w:r>
           <w:t xml:space="preserve">project-specific</w:t>
         </w:r>
@@ -213,12 +213,12 @@
       <w:r>
         <w:t xml:space="preserve"> </w:t>
       </w:r>
-      <w:del w:id="10021" w:author="Revision merge (HM+PL)" w:date="2026-09-09T12:54:58Z">
+      <w:del w:id="10021" w:author="Revision merge (HM+PL)" w:date="2026-09-09T13:15:15Z">
         <w:r>
           <w:delText xml:space="preserve">dozens</w:delText>
         </w:r>
       </w:del>
-      <w:ins w:id="10022" w:author="Revision merge (HM+PL)" w:date="2026-09-09T12:54:58Z">
+      <w:ins w:id="10022" w:author="Revision merge (HM+PL)" w:date="2026-09-09T13:15:15Z">
         <w:r>
           <w:t xml:space="preserve">collections</w:t>
         </w:r>
@@ -226,7 +226,7 @@
       <w:r>
         <w:t xml:space="preserve"> of </w:t>
       </w:r>
-      <w:ins w:id="10023" w:author="Revision merge (HM+PL)" w:date="2026-09-09T12:54:58Z">
+      <w:ins w:id="10023" w:author="Revision merge (HM+PL)" w:date="2026-09-09T13:15:15Z">
         <w:r>
           <w:t xml:space="preserve">manually edited </w:t>
         </w:r>
@@ -234,12 +234,12 @@
       <w:r>
         <w:t xml:space="preserve">R </w:t>
       </w:r>
-      <w:del w:id="10024" w:author="Revision merge (HM+PL)" w:date="2026-09-09T12:54:58Z">
+      <w:del w:id="10024" w:author="Revision merge (HM+PL)" w:date="2026-09-09T13:15:15Z">
         <w:r>
           <w:delText xml:space="preserve">scripts</w:delText>
         </w:r>
       </w:del>
-      <w:ins w:id="10025" w:author="Revision merge (HM+PL)" w:date="2026-09-09T12:54:58Z">
+      <w:ins w:id="10025" w:author="Revision merge (HM+PL)" w:date="2026-09-09T13:15:15Z">
         <w:r>
           <w:t xml:space="preserve">scripts,</w:t>
         </w:r>
@@ -247,12 +247,12 @@
       <w:r>
         <w:t xml:space="preserve"> </w:t>
       </w:r>
-      <w:del w:id="10026" w:author="Revision merge (HM+PL)" w:date="2026-09-09T12:54:58Z">
+      <w:del w:id="10026" w:author="Revision merge (HM+PL)" w:date="2026-09-09T13:15:15Z">
         <w:r>
           <w:delText xml:space="preserve">per</w:delText>
         </w:r>
       </w:del>
-      <w:ins w:id="10027" w:author="Revision merge (HM+PL)" w:date="2026-09-09T12:54:58Z">
+      <w:ins w:id="10027" w:author="Revision merge (HM+PL)" w:date="2026-09-09T13:15:15Z">
         <w:r>
           <w:t xml:space="preserve">requiring</w:t>
         </w:r>
@@ -260,12 +260,12 @@
       <w:r>
         <w:t xml:space="preserve"> </w:t>
       </w:r>
-      <w:del w:id="10028" w:author="Revision merge (HM+PL)" w:date="2026-09-09T12:54:58Z">
+      <w:del w:id="10028" w:author="Revision merge (HM+PL)" w:date="2026-09-09T13:15:15Z">
         <w:r>
           <w:delText xml:space="preserve">project</w:delText>
         </w:r>
       </w:del>
-      <w:ins w:id="10029" w:author="Revision merge (HM+PL)" w:date="2026-09-09T12:54:58Z">
+      <w:ins w:id="10029" w:author="Revision merge (HM+PL)" w:date="2026-09-09T13:15:15Z">
         <w:r>
           <w:t xml:space="preserve">repeated</w:t>
         </w:r>
@@ -273,12 +273,12 @@
       <w:r>
         <w:t xml:space="preserve"> </w:t>
       </w:r>
-      <w:del w:id="10030" w:author="Revision merge (HM+PL)" w:date="2026-09-09T12:54:58Z">
+      <w:del w:id="10030" w:author="Revision merge (HM+PL)" w:date="2026-09-09T13:15:15Z">
         <w:r>
           <w:delText xml:space="preserve">—</w:delText>
         </w:r>
       </w:del>
-      <w:ins w:id="10031" w:author="Revision merge (HM+PL)" w:date="2026-09-09T12:54:58Z">
+      <w:ins w:id="10031" w:author="Revision merge (HM+PL)" w:date="2026-09-09T13:15:15Z">
         <w:r>
           <w:t xml:space="preserve">modifications</w:t>
         </w:r>
@@ -286,12 +286,12 @@
       <w:r>
         <w:t xml:space="preserve"> </w:t>
       </w:r>
-      <w:del w:id="10032" w:author="Revision merge (HM+PL)" w:date="2026-09-09T12:54:58Z">
+      <w:del w:id="10032" w:author="Revision merge (HM+PL)" w:date="2026-09-09T13:15:15Z">
         <w:r>
           <w:delText xml:space="preserve">pasting</w:delText>
         </w:r>
       </w:del>
-      <w:ins w:id="10033" w:author="Revision merge (HM+PL)" w:date="2026-09-09T12:54:58Z">
+      <w:ins w:id="10033" w:author="Revision merge (HM+PL)" w:date="2026-09-09T13:15:15Z">
         <w:r>
           <w:t xml:space="preserve">of</w:t>
         </w:r>
@@ -299,12 +299,12 @@
       <w:r>
         <w:t xml:space="preserve"> sample identifiers, </w:t>
       </w:r>
-      <w:del w:id="10034" w:author="Revision merge (HM+PL)" w:date="2026-09-09T12:54:58Z">
+      <w:del w:id="10034" w:author="Revision merge (HM+PL)" w:date="2026-09-09T13:15:15Z">
         <w:r>
           <w:delText xml:space="preserve">patching</w:delText>
         </w:r>
       </w:del>
-      <w:ins w:id="10035" w:author="Revision merge (HM+PL)" w:date="2026-09-09T12:54:58Z">
+      <w:ins w:id="10035" w:author="Revision merge (HM+PL)" w:date="2026-09-09T13:15:15Z">
         <w:r>
           <w:t xml:space="preserve">taxonomic</w:t>
         </w:r>
@@ -312,12 +312,12 @@
       <w:r>
         <w:t xml:space="preserve"> </w:t>
       </w:r>
-      <w:del w:id="10036" w:author="Revision merge (HM+PL)" w:date="2026-09-09T12:54:58Z">
+      <w:del w:id="10036" w:author="Revision merge (HM+PL)" w:date="2026-09-09T13:15:15Z">
         <w:r>
           <w:delText xml:space="preserve">taxonomy strings</w:delText>
         </w:r>
       </w:del>
-      <w:ins w:id="10037" w:author="Revision merge (HM+PL)" w:date="2026-09-09T12:54:58Z">
+      <w:ins w:id="10037" w:author="Revision merge (HM+PL)" w:date="2026-09-09T13:15:15Z">
         <w:r>
           <w:t xml:space="preserve">annotations</w:t>
         </w:r>
@@ -325,12 +325,12 @@
       <w:r>
         <w:t xml:space="preserve"> and </w:t>
       </w:r>
-      <w:del w:id="10038" w:author="Revision merge (HM+PL)" w:date="2026-09-09T12:54:58Z">
+      <w:del w:id="10038" w:author="Revision merge (HM+PL)" w:date="2026-09-09T13:15:15Z">
         <w:r>
           <w:delText xml:space="preserve">copying</w:delText>
         </w:r>
       </w:del>
-      <w:ins w:id="10039" w:author="Revision merge (HM+PL)" w:date="2026-09-09T12:54:58Z">
+      <w:ins w:id="10039" w:author="Revision merge (HM+PL)" w:date="2026-09-09T13:15:15Z">
         <w:r>
           <w:t xml:space="preserve">analysis</w:t>
         </w:r>
@@ -338,12 +338,12 @@
       <w:r>
         <w:t xml:space="preserve"> </w:t>
       </w:r>
-      <w:del w:id="10040" w:author="Revision merge (HM+PL)" w:date="2026-09-09T12:54:58Z">
+      <w:del w:id="10040" w:author="Revision merge (HM+PL)" w:date="2026-09-09T13:15:15Z">
         <w:r>
           <w:delText xml:space="preserve">chunks</w:delText>
         </w:r>
       </w:del>
-      <w:ins w:id="10041" w:author="Revision merge (HM+PL)" w:date="2026-09-09T12:54:58Z">
+      <w:ins w:id="10041" w:author="Revision merge (HM+PL)" w:date="2026-09-09T13:15:15Z">
         <w:r>
           <w:t xml:space="preserve">parameters,</w:t>
         </w:r>
@@ -351,12 +351,12 @@
       <w:r>
         <w:t xml:space="preserve"> </w:t>
       </w:r>
-      <w:del w:id="10042" w:author="Revision merge (HM+PL)" w:date="2026-09-09T12:54:58Z">
+      <w:del w:id="10042" w:author="Revision merge (HM+PL)" w:date="2026-09-09T13:15:15Z">
         <w:r>
           <w:delText xml:space="preserve">between</w:delText>
         </w:r>
       </w:del>
-      <w:ins w:id="10043" w:author="Revision merge (HM+PL)" w:date="2026-09-09T12:54:58Z">
+      <w:ins w:id="10043" w:author="Revision merge (HM+PL)" w:date="2026-09-09T13:15:15Z">
         <w:r>
           <w:t xml:space="preserve">or</w:t>
         </w:r>
@@ -364,12 +364,12 @@
       <w:r>
         <w:t xml:space="preserve"> </w:t>
       </w:r>
-      <w:del w:id="10044" w:author="Revision merge (HM+PL)" w:date="2026-09-09T12:54:58Z">
+      <w:del w:id="10044" w:author="Revision merge (HM+PL)" w:date="2026-09-09T13:15:15Z">
         <w:r>
           <w:delText xml:space="preserve">studies.</w:delText>
         </w:r>
       </w:del>
-      <w:ins w:id="10045" w:author="Revision merge (HM+PL)" w:date="2026-09-09T12:54:58Z">
+      <w:ins w:id="10045" w:author="Revision merge (HM+PL)" w:date="2026-09-09T13:15:15Z">
         <w:r>
           <w:t xml:space="preserve">else rely on resource-heavy pipelines that require access to high-performance computing (HPC) infrastructure.</w:t>
         </w:r>
@@ -377,12 +377,12 @@
       <w:r>
         <w:t xml:space="preserve"> Existing R workflows </w:t>
       </w:r>
-      <w:del w:id="10046" w:author="Revision merge (HM+PL)" w:date="2026-09-09T12:54:58Z">
+      <w:del w:id="10046" w:author="Revision merge (HM+PL)" w:date="2026-09-09T13:15:15Z">
         <w:r>
           <w:delText xml:space="preserve">largely</w:delText>
         </w:r>
       </w:del>
-      <w:ins w:id="10047" w:author="Revision merge (HM+PL)" w:date="2026-09-09T12:54:58Z">
+      <w:ins w:id="10047" w:author="Revision merge (HM+PL)" w:date="2026-09-09T13:15:15Z">
         <w:r>
           <w:t xml:space="preserve">predominantly</w:t>
         </w:r>
@@ -390,12 +390,12 @@
       <w:r>
         <w:t xml:space="preserve"> </w:t>
       </w:r>
-      <w:del w:id="10048" w:author="Revision merge (HM+PL)" w:date="2026-09-09T12:54:58Z">
+      <w:del w:id="10048" w:author="Revision merge (HM+PL)" w:date="2026-09-09T13:15:15Z">
         <w:r>
           <w:delText xml:space="preserve">target</w:delText>
         </w:r>
       </w:del>
-      <w:ins w:id="10049" w:author="Revision merge (HM+PL)" w:date="2026-09-09T12:54:58Z">
+      <w:ins w:id="10049" w:author="Revision merge (HM+PL)" w:date="2026-09-09T13:15:15Z">
         <w:r>
           <w:t xml:space="preserve">focus on</w:t>
         </w:r>
@@ -403,12 +403,12 @@
       <w:r>
         <w:t xml:space="preserve"> short-read amplicon data or </w:t>
       </w:r>
-      <w:del w:id="10050" w:author="Revision merge (HM+PL)" w:date="2026-09-09T12:54:58Z">
+      <w:del w:id="10050" w:author="Revision merge (HM+PL)" w:date="2026-09-09T13:15:15Z">
         <w:r>
           <w:delText xml:space="preserve">a</w:delText>
         </w:r>
       </w:del>
-      <w:ins w:id="10051" w:author="Revision merge (HM+PL)" w:date="2026-09-09T12:54:58Z">
+      <w:ins w:id="10051" w:author="Revision merge (HM+PL)" w:date="2026-09-09T13:15:15Z">
         <w:r>
           <w:t xml:space="preserve">isolated</w:t>
         </w:r>
@@ -416,12 +416,12 @@
       <w:r>
         <w:t xml:space="preserve"> </w:t>
       </w:r>
-      <w:del w:id="10052" w:author="Revision merge (HM+PL)" w:date="2026-09-09T12:54:58Z">
+      <w:del w:id="10052" w:author="Revision merge (HM+PL)" w:date="2026-09-09T13:15:15Z">
         <w:r>
           <w:delText xml:space="preserve">single</w:delText>
         </w:r>
       </w:del>
-      <w:ins w:id="10053" w:author="Revision merge (HM+PL)" w:date="2026-09-09T12:54:58Z">
+      <w:ins w:id="10053" w:author="Revision merge (HM+PL)" w:date="2026-09-09T13:15:15Z">
         <w:r>
           <w:t xml:space="preserve">analytical</w:t>
         </w:r>
@@ -429,12 +429,12 @@
       <w:r>
         <w:t xml:space="preserve"> </w:t>
       </w:r>
-      <w:del w:id="10054" w:author="Revision merge (HM+PL)" w:date="2026-09-09T12:54:58Z">
+      <w:del w:id="10054" w:author="Revision merge (HM+PL)" w:date="2026-09-09T13:15:15Z">
         <w:r>
           <w:delText xml:space="preserve">analysis</w:delText>
         </w:r>
       </w:del>
-      <w:ins w:id="10055" w:author="Revision merge (HM+PL)" w:date="2026-09-09T12:54:58Z">
+      <w:ins w:id="10055" w:author="Revision merge (HM+PL)" w:date="2026-09-09T13:15:15Z">
         <w:r>
           <w:t xml:space="preserve">tasks,</w:t>
         </w:r>
@@ -442,12 +442,12 @@
       <w:r>
         <w:t xml:space="preserve"> </w:t>
       </w:r>
-      <w:del w:id="10056" w:author="Revision merge (HM+PL)" w:date="2026-09-09T12:54:58Z">
+      <w:del w:id="10056" w:author="Revision merge (HM+PL)" w:date="2026-09-09T13:15:15Z">
         <w:r>
           <w:delText xml:space="preserve">(e.g.</w:delText>
         </w:r>
       </w:del>
-      <w:ins w:id="10057" w:author="Revision merge (HM+PL)" w:date="2026-09-09T12:54:58Z">
+      <w:ins w:id="10057" w:author="Revision merge (HM+PL)" w:date="2026-09-09T13:15:15Z">
         <w:r>
           <w:t xml:space="preserve">such as</w:t>
         </w:r>
@@ -455,12 +455,12 @@
       <w:r>
         <w:t xml:space="preserve"> resistome </w:t>
       </w:r>
-      <w:del w:id="10058" w:author="Revision merge (HM+PL)" w:date="2026-09-09T12:54:58Z">
+      <w:del w:id="10058" w:author="Revision merge (HM+PL)" w:date="2026-09-09T13:15:15Z">
         <w:r>
           <w:delText xml:space="preserve">risk scoring),</w:delText>
         </w:r>
       </w:del>
-      <w:ins w:id="10059" w:author="Revision merge (HM+PL)" w:date="2026-09-09T12:54:58Z">
+      <w:ins w:id="10059" w:author="Revision merge (HM+PL)" w:date="2026-09-09T13:15:15Z">
         <w:r>
           <w:t xml:space="preserve">profiling,</w:t>
         </w:r>
@@ -468,7 +468,7 @@
       <w:r>
         <w:t xml:space="preserve"> leaving</w:t>
       </w:r>
-      <w:ins w:id="10060" w:author="Revision merge (HM+PL)" w:date="2026-09-09T12:54:58Z">
+      <w:ins w:id="10060" w:author="Revision merge (HM+PL)" w:date="2026-09-09T13:15:15Z">
         <w:r>
           <w:t xml:space="preserve"> a gap in integrated, reproducible and sustainable solutions for</w:t>
         </w:r>
@@ -476,12 +476,12 @@
       <w:r>
         <w:t xml:space="preserve"> long-read shotgun </w:t>
       </w:r>
-      <w:del w:id="10061" w:author="Revision merge (HM+PL)" w:date="2026-09-09T12:54:58Z">
+      <w:del w:id="10061" w:author="Revision merge (HM+PL)" w:date="2026-09-09T13:15:15Z">
         <w:r>
           <w:delText xml:space="preserve">studies</w:delText>
         </w:r>
       </w:del>
-      <w:ins w:id="10062" w:author="Revision merge (HM+PL)" w:date="2026-09-09T12:54:58Z">
+      <w:ins w:id="10062" w:author="Revision merge (HM+PL)" w:date="2026-09-09T13:15:15Z">
         <w:r>
           <w:t xml:space="preserve">metagenomics.</w:t>
         </w:r>
@@ -489,12 +489,12 @@
       <w:r>
         <w:t xml:space="preserve"> </w:t>
       </w:r>
-      <w:del w:id="10063" w:author="Revision merge (HM+PL)" w:date="2026-09-09T12:54:58Z">
+      <w:del w:id="10063" w:author="Revision merge (HM+PL)" w:date="2026-09-09T13:15:15Z">
         <w:r>
           <w:delText xml:space="preserve">without</w:delText>
         </w:r>
       </w:del>
-      <w:ins w:id="10064" w:author="Revision merge (HM+PL)" w:date="2026-09-09T12:54:58Z">
+      <w:ins w:id="10064" w:author="Revision merge (HM+PL)" w:date="2026-09-09T13:15:15Z">
         <w:r>
           <w:t xml:space="preserve">Consequently,</w:t>
         </w:r>
@@ -502,12 +502,12 @@
       <w:r>
         <w:t xml:space="preserve"> </w:t>
       </w:r>
-      <w:del w:id="10065" w:author="Revision merge (HM+PL)" w:date="2026-09-09T12:54:58Z">
+      <w:del w:id="10065" w:author="Revision merge (HM+PL)" w:date="2026-09-09T13:15:15Z">
         <w:r>
           <w:delText xml:space="preserve">an</w:delText>
         </w:r>
       </w:del>
-      <w:ins w:id="10066" w:author="Revision merge (HM+PL)" w:date="2026-09-09T12:54:58Z">
+      <w:ins w:id="10066" w:author="Revision merge (HM+PL)" w:date="2026-09-09T13:15:15Z">
         <w:r>
           <w:t xml:space="preserve">researchers</w:t>
         </w:r>
@@ -515,12 +515,12 @@
       <w:r>
         <w:t xml:space="preserve"> </w:t>
       </w:r>
-      <w:del w:id="10067" w:author="Revision merge (HM+PL)" w:date="2026-09-09T12:54:58Z">
+      <w:del w:id="10067" w:author="Revision merge (HM+PL)" w:date="2026-09-09T13:15:15Z">
         <w:r>
           <w:delText xml:space="preserve">integrated,</w:delText>
         </w:r>
       </w:del>
-      <w:ins w:id="10068" w:author="Revision merge (HM+PL)" w:date="2026-09-09T12:54:58Z">
+      <w:ins w:id="10068" w:author="Revision merge (HM+PL)" w:date="2026-09-09T13:15:15Z">
         <w:r>
           <w:t xml:space="preserve">frequently</w:t>
         </w:r>
@@ -528,12 +528,12 @@
       <w:r>
         <w:t xml:space="preserve"> </w:t>
       </w:r>
-      <w:del w:id="10069" w:author="Revision merge (HM+PL)" w:date="2026-09-09T12:54:58Z">
+      <w:del w:id="10069" w:author="Revision merge (HM+PL)" w:date="2026-09-09T13:15:15Z">
         <w:r>
           <w:delText xml:space="preserve">configuration-driven</w:delText>
         </w:r>
       </w:del>
-      <w:ins w:id="10070" w:author="Revision merge (HM+PL)" w:date="2026-09-09T12:54:58Z">
+      <w:ins w:id="10070" w:author="Revision merge (HM+PL)" w:date="2026-09-09T13:15:15Z">
         <w:r>
           <w:t xml:space="preserve">rely</w:t>
         </w:r>
@@ -541,12 +541,12 @@
       <w:r>
         <w:t xml:space="preserve"> </w:t>
       </w:r>
-      <w:del w:id="10071" w:author="Revision merge (HM+PL)" w:date="2026-09-09T12:54:58Z">
+      <w:del w:id="10071" w:author="Revision merge (HM+PL)" w:date="2026-09-09T13:15:15Z">
         <w:r>
           <w:delText xml:space="preserve">option.</w:delText>
         </w:r>
       </w:del>
-      <w:ins w:id="10072" w:author="Revision merge (HM+PL)" w:date="2026-09-09T12:54:58Z">
+      <w:ins w:id="10072" w:author="Revision merge (HM+PL)" w:date="2026-09-09T13:15:15Z">
         <w:r>
           <w:t xml:space="preserve">on ad hoc scripting approaches that limit scalability, standardisation and reproducibility for efficient cross-study comparison.</w:t>
         </w:r>
@@ -556,12 +556,12 @@
       <w:pPr>
         <w:spacing w:after="120"/>
       </w:pPr>
-      <w:del w:id="10073" w:author="Revision merge (HM+PL)" w:date="2026-09-09T12:54:58Z">
+      <w:del w:id="10073" w:author="Revision merge (HM+PL)" w:date="2026-09-09T13:15:15Z">
         <w:r>
           <w:delText xml:space="preserve">**Results.**</w:delText>
         </w:r>
       </w:del>
-      <w:ins w:id="10074" w:author="Revision merge (HM+PL)" w:date="2026-09-09T12:54:58Z">
+      <w:ins w:id="10074" w:author="Revision merge (HM+PL)" w:date="2026-09-09T13:15:15Z">
         <w:r>
           <w:t xml:space="preserve">**Results:**</w:t>
         </w:r>
@@ -569,12 +569,12 @@
       <w:r>
         <w:t xml:space="preserve"> We present **MERIDIAN** (*Metagenomic Evaluation of Resistance, Identity &amp; Diversity through Integrated Analysis of Nanopore sequencing*), a modular R workflow </w:t>
       </w:r>
-      <w:del w:id="10075" w:author="Revision merge (HM+PL)" w:date="2026-09-09T12:54:58Z">
+      <w:del w:id="10075" w:author="Revision merge (HM+PL)" w:date="2026-09-09T13:15:15Z">
         <w:r>
           <w:delText xml:space="preserve">that</w:delText>
         </w:r>
       </w:del>
-      <w:ins w:id="10076" w:author="Revision merge (HM+PL)" w:date="2026-09-09T12:54:58Z">
+      <w:ins w:id="10076" w:author="Revision merge (HM+PL)" w:date="2026-09-09T13:15:15Z">
         <w:r>
           <w:t xml:space="preserve">designed</w:t>
         </w:r>
@@ -582,12 +582,12 @@
       <w:r>
         <w:t xml:space="preserve"> </w:t>
       </w:r>
-      <w:del w:id="10077" w:author="Revision merge (HM+PL)" w:date="2026-09-09T12:54:58Z">
+      <w:del w:id="10077" w:author="Revision merge (HM+PL)" w:date="2026-09-09T13:15:15Z">
         <w:r>
           <w:delText xml:space="preserve">consumes</w:delText>
         </w:r>
       </w:del>
-      <w:ins w:id="10078" w:author="Revision merge (HM+PL)" w:date="2026-09-09T12:54:58Z">
+      <w:ins w:id="10078" w:author="Revision merge (HM+PL)" w:date="2026-09-09T13:15:15Z">
         <w:r>
           <w:t xml:space="preserve">to standardise and automate downstream analysis of long-read metagenomic sequencing datasets. By consolidating outputs from multiple</w:t>
         </w:r>
@@ -595,12 +595,12 @@
       <w:r>
         <w:t xml:space="preserve"> bioinformatics </w:t>
       </w:r>
-      <w:del w:id="10079" w:author="Revision merge (HM+PL)" w:date="2026-09-09T12:54:58Z">
+      <w:del w:id="10079" w:author="Revision merge (HM+PL)" w:date="2026-09-09T13:15:15Z">
         <w:r>
           <w:delText xml:space="preserve">tools</w:delText>
         </w:r>
       </w:del>
-      <w:ins w:id="10080" w:author="Revision merge (HM+PL)" w:date="2026-09-09T12:54:58Z">
+      <w:ins w:id="10080" w:author="Revision merge (HM+PL)" w:date="2026-09-09T13:15:15Z">
         <w:r>
           <w:t xml:space="preserve">tools,</w:t>
         </w:r>
@@ -608,12 +608,12 @@
       <w:r>
         <w:t xml:space="preserve"> </w:t>
       </w:r>
-      <w:del w:id="10081" w:author="Revision merge (HM+PL)" w:date="2026-09-09T12:54:58Z">
+      <w:del w:id="10081" w:author="Revision merge (HM+PL)" w:date="2026-09-09T13:15:15Z">
         <w:r>
           <w:delText xml:space="preserve">outputs</w:delText>
         </w:r>
       </w:del>
-      <w:ins w:id="10082" w:author="Revision merge (HM+PL)" w:date="2026-09-09T12:54:58Z">
+      <w:ins w:id="10082" w:author="Revision merge (HM+PL)" w:date="2026-09-09T13:15:15Z">
         <w:r>
           <w:t xml:space="preserve">MERIDIAN</w:t>
         </w:r>
@@ -621,12 +621,12 @@
       <w:r>
         <w:t xml:space="preserve"> </w:t>
       </w:r>
-      <w:del w:id="10083" w:author="Revision merge (HM+PL)" w:date="2026-09-09T12:54:58Z">
+      <w:del w:id="10083" w:author="Revision merge (HM+PL)" w:date="2026-09-09T13:15:15Z">
         <w:r>
           <w:delText xml:space="preserve">and produces</w:delText>
         </w:r>
       </w:del>
-      <w:ins w:id="10084" w:author="Revision merge (HM+PL)" w:date="2026-09-09T12:54:58Z">
+      <w:ins w:id="10084" w:author="Revision merge (HM+PL)" w:date="2026-09-09T13:15:15Z">
         <w:r>
           <w:t xml:space="preserve">delivers</w:t>
         </w:r>
@@ -634,12 +634,12 @@
       <w:r>
         <w:t xml:space="preserve"> a </w:t>
       </w:r>
-      <w:del w:id="10085" w:author="Revision merge (HM+PL)" w:date="2026-09-09T12:54:58Z">
+      <w:del w:id="10085" w:author="Revision merge (HM+PL)" w:date="2026-09-09T13:15:15Z">
         <w:r>
           <w:delText xml:space="preserve">single</w:delText>
         </w:r>
       </w:del>
-      <w:ins w:id="10086" w:author="Revision merge (HM+PL)" w:date="2026-09-09T12:54:58Z">
+      <w:ins w:id="10086" w:author="Revision merge (HM+PL)" w:date="2026-09-09T13:15:15Z">
         <w:r>
           <w:t xml:space="preserve">comprehensive</w:t>
         </w:r>
@@ -647,7 +647,7 @@
       <w:r>
         <w:t xml:space="preserve"> Quarto HTML dashboard, publication-ready </w:t>
       </w:r>
-      <w:del w:id="10087" w:author="Revision merge (HM+PL)" w:date="2026-09-09T12:54:58Z">
+      <w:del w:id="10087" w:author="Revision merge (HM+PL)" w:date="2026-09-09T13:15:15Z">
         <w:r>
           <w:delText xml:space="preserve">composite </w:delText>
         </w:r>
@@ -655,7 +655,7 @@
       <w:r>
         <w:t xml:space="preserve">figures and </w:t>
       </w:r>
-      <w:del w:id="10088" w:author="Revision merge (HM+PL)" w:date="2026-09-09T12:54:58Z">
+      <w:del w:id="10088" w:author="Revision merge (HM+PL)" w:date="2026-09-09T13:15:15Z">
         <w:r>
           <w:delText xml:space="preserve">a </w:delText>
         </w:r>
@@ -663,12 +663,12 @@
       <w:r>
         <w:t xml:space="preserve">supplementary </w:t>
       </w:r>
-      <w:del w:id="10089" w:author="Revision merge (HM+PL)" w:date="2026-09-09T12:54:58Z">
+      <w:del w:id="10089" w:author="Revision merge (HM+PL)" w:date="2026-09-09T13:15:15Z">
         <w:r>
           <w:delText xml:space="preserve">tables</w:delText>
         </w:r>
       </w:del>
-      <w:ins w:id="10090" w:author="Revision merge (HM+PL)" w:date="2026-09-09T12:54:58Z">
+      <w:ins w:id="10090" w:author="Revision merge (HM+PL)" w:date="2026-09-09T13:15:15Z">
         <w:r>
           <w:t xml:space="preserve">result</w:t>
         </w:r>
@@ -676,12 +676,12 @@
       <w:r>
         <w:t xml:space="preserve"> </w:t>
       </w:r>
-      <w:del w:id="10091" w:author="Revision merge (HM+PL)" w:date="2026-09-09T12:54:58Z">
+      <w:del w:id="10091" w:author="Revision merge (HM+PL)" w:date="2026-09-09T13:15:15Z">
         <w:r>
           <w:delText xml:space="preserve">workbook.</w:delText>
         </w:r>
       </w:del>
-      <w:ins w:id="10092" w:author="Revision merge (HM+PL)" w:date="2026-09-09T12:54:58Z">
+      <w:ins w:id="10092" w:author="Revision merge (HM+PL)" w:date="2026-09-09T13:15:15Z">
         <w:r>
           <w:t xml:space="preserve">tables.</w:t>
         </w:r>
@@ -689,12 +689,12 @@
       <w:r>
         <w:t xml:space="preserve"> The workflow </w:t>
       </w:r>
-      <w:del w:id="10093" w:author="Revision merge (HM+PL)" w:date="2026-09-09T12:54:58Z">
+      <w:del w:id="10093" w:author="Revision merge (HM+PL)" w:date="2026-09-09T13:15:15Z">
         <w:r>
           <w:delText xml:space="preserve">covers</w:delText>
         </w:r>
       </w:del>
-      <w:ins w:id="10094" w:author="Revision merge (HM+PL)" w:date="2026-09-09T12:54:58Z">
+      <w:ins w:id="10094" w:author="Revision merge (HM+PL)" w:date="2026-09-09T13:15:15Z">
         <w:r>
           <w:t xml:space="preserve">supports end-to-end metagenomic characterisation, encompassing</w:t>
         </w:r>
@@ -702,12 +702,12 @@
       <w:r>
         <w:t xml:space="preserve"> decontamination, TPM normalisation, </w:t>
       </w:r>
-      <w:del w:id="10095" w:author="Revision merge (HM+PL)" w:date="2026-09-09T12:54:58Z">
+      <w:del w:id="10095" w:author="Revision merge (HM+PL)" w:date="2026-09-09T13:15:15Z">
         <w:r>
           <w:delText xml:space="preserve">taxonomy,</w:delText>
         </w:r>
       </w:del>
-      <w:ins w:id="10096" w:author="Revision merge (HM+PL)" w:date="2026-09-09T12:54:58Z">
+      <w:ins w:id="10096" w:author="Revision merge (HM+PL)" w:date="2026-09-09T13:15:15Z">
         <w:r>
           <w:t xml:space="preserve">taxonomic</w:t>
         </w:r>
@@ -715,12 +715,12 @@
       <w:r>
         <w:t xml:space="preserve"> </w:t>
       </w:r>
-      <w:del w:id="10097" w:author="Revision merge (HM+PL)" w:date="2026-09-09T12:54:58Z">
+      <w:del w:id="10097" w:author="Revision merge (HM+PL)" w:date="2026-09-09T13:15:15Z">
         <w:r>
           <w:delText xml:space="preserve">alpha/beta</w:delText>
         </w:r>
       </w:del>
-      <w:ins w:id="10098" w:author="Revision merge (HM+PL)" w:date="2026-09-09T12:54:58Z">
+      <w:ins w:id="10098" w:author="Revision merge (HM+PL)" w:date="2026-09-09T13:15:15Z">
         <w:r>
           <w:t xml:space="preserve">profiling, alpha and beta</w:t>
         </w:r>
@@ -728,7 +728,7 @@
       <w:r>
         <w:t xml:space="preserve"> diversity</w:t>
       </w:r>
-      <w:ins w:id="10099" w:author="Revision merge (HM+PL)" w:date="2026-09-09T12:54:58Z">
+      <w:ins w:id="10099" w:author="Revision merge (HM+PL)" w:date="2026-09-09T13:15:15Z">
         <w:r>
           <w:t xml:space="preserve"> analysis</w:t>
         </w:r>
@@ -736,12 +736,12 @@
       <w:r>
         <w:t xml:space="preserve"> with PERMANOVA, two-level ALDEx2 differential </w:t>
       </w:r>
-      <w:del w:id="10100" w:author="Revision merge (HM+PL)" w:date="2026-09-09T12:54:58Z">
+      <w:del w:id="10100" w:author="Revision merge (HM+PL)" w:date="2026-09-09T13:15:15Z">
         <w:r>
           <w:delText xml:space="preserve">abundance,</w:delText>
         </w:r>
       </w:del>
-      <w:ins w:id="10101" w:author="Revision merge (HM+PL)" w:date="2026-09-09T12:54:58Z">
+      <w:ins w:id="10101" w:author="Revision merge (HM+PL)" w:date="2026-09-09T13:15:15Z">
         <w:r>
           <w:t xml:space="preserve">abundance</w:t>
         </w:r>
@@ -749,12 +749,12 @@
       <w:r>
         <w:t xml:space="preserve"> </w:t>
       </w:r>
-      <w:del w:id="10102" w:author="Revision merge (HM+PL)" w:date="2026-09-09T12:54:58Z">
+      <w:del w:id="10102" w:author="Revision merge (HM+PL)" w:date="2026-09-09T13:15:15Z">
         <w:r>
           <w:delText xml:space="preserve">resistome, virulome,</w:delText>
         </w:r>
       </w:del>
-      <w:ins w:id="10103" w:author="Revision merge (HM+PL)" w:date="2026-09-09T12:54:58Z">
+      <w:ins w:id="10103" w:author="Revision merge (HM+PL)" w:date="2026-09-09T13:15:15Z">
         <w:r>
           <w:t xml:space="preserve">testing,</w:t>
         </w:r>
@@ -762,12 +762,12 @@
       <w:r>
         <w:t xml:space="preserve"> and </w:t>
       </w:r>
-      <w:del w:id="10104" w:author="Revision merge (HM+PL)" w:date="2026-09-09T12:54:58Z">
+      <w:del w:id="10104" w:author="Revision merge (HM+PL)" w:date="2026-09-09T13:15:15Z">
         <w:r>
           <w:delText xml:space="preserve">mobilome</w:delText>
         </w:r>
       </w:del>
-      <w:ins w:id="10105" w:author="Revision merge (HM+PL)" w:date="2026-09-09T12:54:58Z">
+      <w:ins w:id="10105" w:author="Revision merge (HM+PL)" w:date="2026-09-09T13:15:15Z">
         <w:r>
           <w:t xml:space="preserve">functional</w:t>
         </w:r>
@@ -775,12 +775,12 @@
       <w:r>
         <w:t xml:space="preserve"> </w:t>
       </w:r>
-      <w:del w:id="10106" w:author="Revision merge (HM+PL)" w:date="2026-09-09T12:54:58Z">
+      <w:del w:id="10106" w:author="Revision merge (HM+PL)" w:date="2026-09-09T13:15:15Z">
         <w:r>
           <w:delText xml:space="preserve">profiling,</w:delText>
         </w:r>
       </w:del>
-      <w:ins w:id="10107" w:author="Revision merge (HM+PL)" w:date="2026-09-09T12:54:58Z">
+      <w:ins w:id="10107" w:author="Revision merge (HM+PL)" w:date="2026-09-09T13:15:15Z">
         <w:r>
           <w:t xml:space="preserve">profiling of antimicrobial resistance (AMR), virulence</w:t>
         </w:r>
@@ -788,7 +788,7 @@
       <w:r>
         <w:t xml:space="preserve"> and</w:t>
       </w:r>
-      <w:ins w:id="10108" w:author="Revision merge (HM+PL)" w:date="2026-09-09T12:54:58Z">
+      <w:ins w:id="10108" w:author="Revision merge (HM+PL)" w:date="2026-09-09T13:15:15Z">
         <w:r>
           <w:t xml:space="preserve"> mobile genetic element repertoires. In addition, MERIDIAN infers</w:t>
         </w:r>
@@ -796,12 +796,12 @@
       <w:r>
         <w:t xml:space="preserve"> a tripartite sample × taxon × gene </w:t>
       </w:r>
-      <w:del w:id="10109" w:author="Revision merge (HM+PL)" w:date="2026-09-09T12:54:58Z">
+      <w:del w:id="10109" w:author="Revision merge (HM+PL)" w:date="2026-09-09T13:15:15Z">
         <w:r>
           <w:delText xml:space="preserve">network</w:delText>
         </w:r>
       </w:del>
-      <w:ins w:id="10110" w:author="Revision merge (HM+PL)" w:date="2026-09-09T12:54:58Z">
+      <w:ins w:id="10110" w:author="Revision merge (HM+PL)" w:date="2026-09-09T13:15:15Z">
         <w:r>
           <w:t xml:space="preserve">network,</w:t>
         </w:r>
@@ -809,12 +809,12 @@
       <w:r>
         <w:t xml:space="preserve"> </w:t>
       </w:r>
-      <w:del w:id="10111" w:author="Revision merge (HM+PL)" w:date="2026-09-09T12:54:58Z">
+      <w:del w:id="10111" w:author="Revision merge (HM+PL)" w:date="2026-09-09T13:15:15Z">
         <w:r>
           <w:delText xml:space="preserve">reconstruction.</w:delText>
         </w:r>
       </w:del>
-      <w:ins w:id="10112" w:author="Revision merge (HM+PL)" w:date="2026-09-09T12:54:58Z">
+      <w:ins w:id="10112" w:author="Revision merge (HM+PL)" w:date="2026-09-09T13:15:15Z">
         <w:r>
           <w:t xml:space="preserve">enabling</w:t>
         </w:r>
@@ -822,12 +822,12 @@
       <w:r>
         <w:t xml:space="preserve"> </w:t>
       </w:r>
-      <w:del w:id="10113" w:author="Revision merge (HM+PL)" w:date="2026-09-09T12:54:58Z">
+      <w:del w:id="10113" w:author="Revision merge (HM+PL)" w:date="2026-09-09T13:15:15Z">
         <w:r>
           <w:delText xml:space="preserve">A</w:delText>
         </w:r>
       </w:del>
-      <w:ins w:id="10114" w:author="Revision merge (HM+PL)" w:date="2026-09-09T12:54:58Z">
+      <w:ins w:id="10114" w:author="Revision merge (HM+PL)" w:date="2026-09-09T13:15:15Z">
         <w:r>
           <w:t xml:space="preserve">integrated</w:t>
         </w:r>
@@ -835,12 +835,12 @@
       <w:r>
         <w:t xml:space="preserve"> </w:t>
       </w:r>
-      <w:del w:id="10115" w:author="Revision merge (HM+PL)" w:date="2026-09-09T12:54:58Z">
+      <w:del w:id="10115" w:author="Revision merge (HM+PL)" w:date="2026-09-09T13:15:15Z">
         <w:r>
           <w:delText xml:space="preserve">study</w:delText>
         </w:r>
       </w:del>
-      <w:ins w:id="10116" w:author="Revision merge (HM+PL)" w:date="2026-09-09T12:54:58Z">
+      <w:ins w:id="10116" w:author="Revision merge (HM+PL)" w:date="2026-09-09T13:15:15Z">
         <w:r>
           <w:t xml:space="preserve">interrogation of taxonomic composition and functional gene distributions. Workflow execution</w:t>
         </w:r>
@@ -848,12 +848,12 @@
       <w:r>
         <w:t xml:space="preserve"> is </w:t>
       </w:r>
-      <w:del w:id="10117" w:author="Revision merge (HM+PL)" w:date="2026-09-09T12:54:58Z">
+      <w:del w:id="10117" w:author="Revision merge (HM+PL)" w:date="2026-09-09T13:15:15Z">
         <w:r>
           <w:delText xml:space="preserve">parameterised</w:delText>
         </w:r>
       </w:del>
-      <w:ins w:id="10118" w:author="Revision merge (HM+PL)" w:date="2026-09-09T12:54:58Z">
+      <w:ins w:id="10118" w:author="Revision merge (HM+PL)" w:date="2026-09-09T13:15:15Z">
         <w:r>
           <w:t xml:space="preserve">controlled</w:t>
         </w:r>
@@ -861,12 +861,12 @@
       <w:r>
         <w:t xml:space="preserve"> </w:t>
       </w:r>
-      <w:del w:id="10119" w:author="Revision merge (HM+PL)" w:date="2026-09-09T12:54:58Z">
+      <w:del w:id="10119" w:author="Revision merge (HM+PL)" w:date="2026-09-09T13:15:15Z">
         <w:r>
           <w:delText xml:space="preserve">by</w:delText>
         </w:r>
       </w:del>
-      <w:ins w:id="10120" w:author="Revision merge (HM+PL)" w:date="2026-09-09T12:54:58Z">
+      <w:ins w:id="10120" w:author="Revision merge (HM+PL)" w:date="2026-09-09T13:15:15Z">
         <w:r>
           <w:t xml:space="preserve">through</w:t>
         </w:r>
@@ -874,12 +874,12 @@
       <w:r>
         <w:t xml:space="preserve"> a single YAML </w:t>
       </w:r>
-      <w:del w:id="10121" w:author="Revision merge (HM+PL)" w:date="2026-09-09T12:54:58Z">
+      <w:del w:id="10121" w:author="Revision merge (HM+PL)" w:date="2026-09-09T13:15:15Z">
         <w:r>
           <w:delText xml:space="preserve">file;</w:delText>
         </w:r>
       </w:del>
-      <w:ins w:id="10122" w:author="Revision merge (HM+PL)" w:date="2026-09-09T12:54:58Z">
+      <w:ins w:id="10122" w:author="Revision merge (HM+PL)" w:date="2026-09-09T13:15:15Z">
         <w:r>
           <w:t xml:space="preserve">configuration</w:t>
         </w:r>
@@ -887,12 +887,12 @@
       <w:r>
         <w:t xml:space="preserve"> </w:t>
       </w:r>
-      <w:del w:id="10123" w:author="Revision merge (HM+PL)" w:date="2026-09-09T12:54:58Z">
+      <w:del w:id="10123" w:author="Revision merge (HM+PL)" w:date="2026-09-09T13:15:15Z">
         <w:r>
           <w:delText xml:space="preserve">module</w:delText>
         </w:r>
       </w:del>
-      <w:ins w:id="10124" w:author="Revision merge (HM+PL)" w:date="2026-09-09T12:54:58Z">
+      <w:ins w:id="10124" w:author="Revision merge (HM+PL)" w:date="2026-09-09T13:15:15Z">
         <w:r>
           <w:t xml:space="preserve">file,</w:t>
         </w:r>
@@ -900,12 +900,12 @@
       <w:r>
         <w:t xml:space="preserve"> </w:t>
       </w:r>
-      <w:del w:id="10125" w:author="Revision merge (HM+PL)" w:date="2026-09-09T12:54:58Z">
+      <w:del w:id="10125" w:author="Revision merge (HM+PL)" w:date="2026-09-09T13:15:15Z">
         <w:r>
           <w:delText xml:space="preserve">code</w:delText>
         </w:r>
       </w:del>
-      <w:ins w:id="10126" w:author="Revision merge (HM+PL)" w:date="2026-09-09T12:54:58Z">
+      <w:ins w:id="10126" w:author="Revision merge (HM+PL)" w:date="2026-09-09T13:15:15Z">
         <w:r>
           <w:t xml:space="preserve">ensuring</w:t>
         </w:r>
@@ -913,12 +913,12 @@
       <w:r>
         <w:t xml:space="preserve"> </w:t>
       </w:r>
-      <w:del w:id="10127" w:author="Revision merge (HM+PL)" w:date="2026-09-09T12:54:58Z">
+      <w:del w:id="10127" w:author="Revision merge (HM+PL)" w:date="2026-09-09T13:15:15Z">
         <w:r>
           <w:delText xml:space="preserve">is</w:delText>
         </w:r>
       </w:del>
-      <w:ins w:id="10128" w:author="Revision merge (HM+PL)" w:date="2026-09-09T12:54:58Z">
+      <w:ins w:id="10128" w:author="Revision merge (HM+PL)" w:date="2026-09-09T13:15:15Z">
         <w:r>
           <w:t xml:space="preserve">reproducible</w:t>
         </w:r>
@@ -926,12 +926,12 @@
       <w:r>
         <w:t xml:space="preserve"> </w:t>
       </w:r>
-      <w:del w:id="10129" w:author="Revision merge (HM+PL)" w:date="2026-09-09T12:54:58Z">
+      <w:del w:id="10129" w:author="Revision merge (HM+PL)" w:date="2026-09-09T13:15:15Z">
         <w:r>
           <w:delText xml:space="preserve">not</w:delText>
         </w:r>
       </w:del>
-      <w:ins w:id="10130" w:author="Revision merge (HM+PL)" w:date="2026-09-09T12:54:58Z">
+      <w:ins w:id="10130" w:author="Revision merge (HM+PL)" w:date="2026-09-09T13:15:15Z">
         <w:r>
           <w:t xml:space="preserve">execution</w:t>
         </w:r>
@@ -939,12 +939,12 @@
       <w:r>
         <w:t xml:space="preserve"> </w:t>
       </w:r>
-      <w:del w:id="10131" w:author="Revision merge (HM+PL)" w:date="2026-09-09T12:54:58Z">
+      <w:del w:id="10131" w:author="Revision merge (HM+PL)" w:date="2026-09-09T13:15:15Z">
         <w:r>
           <w:delText xml:space="preserve">edited</w:delText>
         </w:r>
       </w:del>
-      <w:ins w:id="10132" w:author="Revision merge (HM+PL)" w:date="2026-09-09T12:54:58Z">
+      <w:ins w:id="10132" w:author="Revision merge (HM+PL)" w:date="2026-09-09T13:15:15Z">
         <w:r>
           <w:t xml:space="preserve">without</w:t>
         </w:r>
@@ -952,12 +952,12 @@
       <w:r>
         <w:t xml:space="preserve"> </w:t>
       </w:r>
-      <w:del w:id="10133" w:author="Revision merge (HM+PL)" w:date="2026-09-09T12:54:58Z">
+      <w:del w:id="10133" w:author="Revision merge (HM+PL)" w:date="2026-09-09T13:15:15Z">
         <w:r>
           <w:delText xml:space="preserve">per</w:delText>
         </w:r>
       </w:del>
-      <w:ins w:id="10134" w:author="Revision merge (HM+PL)" w:date="2026-09-09T12:54:58Z">
+      <w:ins w:id="10134" w:author="Revision merge (HM+PL)" w:date="2026-09-09T13:15:15Z">
         <w:r>
           <w:t xml:space="preserve">modification</w:t>
         </w:r>
@@ -965,12 +965,12 @@
       <w:r>
         <w:t xml:space="preserve"> </w:t>
       </w:r>
-      <w:del w:id="10135" w:author="Revision merge (HM+PL)" w:date="2026-09-09T12:54:58Z">
+      <w:del w:id="10135" w:author="Revision merge (HM+PL)" w:date="2026-09-09T13:15:15Z">
         <w:r>
           <w:delText xml:space="preserve">project,</w:delText>
         </w:r>
       </w:del>
-      <w:ins w:id="10136" w:author="Revision merge (HM+PL)" w:date="2026-09-09T12:54:58Z">
+      <w:ins w:id="10136" w:author="Revision merge (HM+PL)" w:date="2026-09-09T13:15:15Z">
         <w:r>
           <w:t xml:space="preserve">of</w:t>
         </w:r>
@@ -978,12 +978,12 @@
       <w:r>
         <w:t xml:space="preserve"> </w:t>
       </w:r>
-      <w:del w:id="10137" w:author="Revision merge (HM+PL)" w:date="2026-09-09T12:54:58Z">
+      <w:del w:id="10137" w:author="Revision merge (HM+PL)" w:date="2026-09-09T13:15:15Z">
         <w:r>
           <w:delText xml:space="preserve">and</w:delText>
         </w:r>
       </w:del>
-      <w:ins w:id="10138" w:author="Revision merge (HM+PL)" w:date="2026-09-09T12:54:58Z">
+      <w:ins w:id="10138" w:author="Revision merge (HM+PL)" w:date="2026-09-09T13:15:15Z">
         <w:r>
           <w:t xml:space="preserve">source</w:t>
         </w:r>
@@ -991,12 +991,12 @@
       <w:r>
         <w:t xml:space="preserve"> </w:t>
       </w:r>
-      <w:del w:id="10139" w:author="Revision merge (HM+PL)" w:date="2026-09-09T12:54:58Z">
+      <w:del w:id="10139" w:author="Revision merge (HM+PL)" w:date="2026-09-09T13:15:15Z">
         <w:r>
           <w:delText xml:space="preserve">every</w:delText>
         </w:r>
       </w:del>
-      <w:ins w:id="10140" w:author="Revision merge (HM+PL)" w:date="2026-09-09T12:54:58Z">
+      <w:ins w:id="10140" w:author="Revision merge (HM+PL)" w:date="2026-09-09T13:15:15Z">
         <w:r>
           <w:t xml:space="preserve">code.</w:t>
         </w:r>
@@ -1004,12 +1004,12 @@
       <w:r>
         <w:t xml:space="preserve"> </w:t>
       </w:r>
-      <w:del w:id="10141" w:author="Revision merge (HM+PL)" w:date="2026-09-09T12:54:58Z">
+      <w:del w:id="10141" w:author="Revision merge (HM+PL)" w:date="2026-09-09T13:15:15Z">
         <w:r>
           <w:delText xml:space="preserve">run</w:delText>
         </w:r>
       </w:del>
-      <w:ins w:id="10142" w:author="Revision merge (HM+PL)" w:date="2026-09-09T12:54:58Z">
+      <w:ins w:id="10142" w:author="Revision merge (HM+PL)" w:date="2026-09-09T13:15:15Z">
         <w:r>
           <w:t xml:space="preserve">Each</w:t>
         </w:r>
@@ -1017,12 +1017,12 @@
       <w:r>
         <w:t xml:space="preserve"> </w:t>
       </w:r>
-      <w:del w:id="10143" w:author="Revision merge (HM+PL)" w:date="2026-09-09T12:54:58Z">
+      <w:del w:id="10143" w:author="Revision merge (HM+PL)" w:date="2026-09-09T13:15:15Z">
         <w:r>
           <w:delText xml:space="preserve">emits</w:delText>
         </w:r>
       </w:del>
-      <w:ins w:id="10144" w:author="Revision merge (HM+PL)" w:date="2026-09-09T12:54:58Z">
+      <w:ins w:id="10144" w:author="Revision merge (HM+PL)" w:date="2026-09-09T13:15:15Z">
         <w:r>
           <w:t xml:space="preserve">analysis automatically generates</w:t>
         </w:r>
@@ -1030,12 +1030,12 @@
       <w:r>
         <w:t xml:space="preserve"> a `manifest.json` artefact </w:t>
       </w:r>
-      <w:del w:id="10145" w:author="Revision merge (HM+PL)" w:date="2026-09-09T12:54:58Z">
+      <w:del w:id="10145" w:author="Revision merge (HM+PL)" w:date="2026-09-09T13:15:15Z">
         <w:r>
           <w:delText xml:space="preserve">catalogue</w:delText>
         </w:r>
       </w:del>
-      <w:ins w:id="10146" w:author="Revision merge (HM+PL)" w:date="2026-09-09T12:54:58Z">
+      <w:ins w:id="10146" w:author="Revision merge (HM+PL)" w:date="2026-09-09T13:15:15Z">
         <w:r>
           <w:t xml:space="preserve">catalogue,</w:t>
         </w:r>
@@ -1043,12 +1043,12 @@
       <w:r>
         <w:t xml:space="preserve"> </w:t>
       </w:r>
-      <w:del w:id="10147" w:author="Revision merge (HM+PL)" w:date="2026-09-09T12:54:58Z">
+      <w:del w:id="10147" w:author="Revision merge (HM+PL)" w:date="2026-09-09T13:15:15Z">
         <w:r>
           <w:delText xml:space="preserve">for</w:delText>
         </w:r>
       </w:del>
-      <w:ins w:id="10148" w:author="Revision merge (HM+PL)" w:date="2026-09-09T12:54:58Z">
+      <w:ins w:id="10148" w:author="Revision merge (HM+PL)" w:date="2026-09-09T13:15:15Z">
         <w:r>
           <w:t xml:space="preserve">thereby supporting reproducibility and</w:t>
         </w:r>
@@ -1056,7 +1056,7 @@
       <w:r>
         <w:t xml:space="preserve"> downstream </w:t>
       </w:r>
-      <w:ins w:id="10149" w:author="Revision merge (HM+PL)" w:date="2026-09-09T12:54:58Z">
+      <w:ins w:id="10149" w:author="Revision merge (HM+PL)" w:date="2026-09-09T13:15:15Z">
         <w:r>
           <w:t xml:space="preserve">computational </w:t>
         </w:r>
@@ -1072,7 +1072,7 @@
       <w:r>
         <w:t xml:space="preserve">**Availability and Implementation.** </w:t>
       </w:r>
-      <w:ins w:id="10150" w:author="Revision merge (HM+PL)" w:date="2026-09-09T12:54:58Z">
+      <w:ins w:id="10150" w:author="Revision merge (HM+PL)" w:date="2026-09-09T13:15:15Z">
         <w:r>
           <w:t xml:space="preserve">MERIDIAN is implemented in R and distributed under the MIT licence. </w:t>
         </w:r>
@@ -1080,7 +1080,7 @@
       <w:r>
         <w:t xml:space="preserve">Source</w:t>
       </w:r>
-      <w:ins w:id="10151" w:author="Revision merge (HM+PL)" w:date="2026-09-09T12:54:58Z">
+      <w:ins w:id="10151" w:author="Revision merge (HM+PL)" w:date="2026-09-09T13:15:15Z">
         <w:r>
           <w:t xml:space="preserve"> code and documentation are available</w:t>
         </w:r>
@@ -1088,12 +1088,12 @@
       <w:r>
         <w:t xml:space="preserve"> at </w:t>
       </w:r>
-      <w:del w:id="10152" w:author="Revision merge (HM+PL)" w:date="2026-09-09T12:54:58Z">
+      <w:del w:id="10152" w:author="Revision merge (HM+PL)" w:date="2026-09-09T13:15:15Z">
         <w:r>
           <w:delText xml:space="preserve">https://github.com/Julio92-C/Metagenomics_pipeline_automation (MIT).</w:delText>
         </w:r>
       </w:del>
-      <w:ins w:id="10153" w:author="Revision merge (HM+PL)" w:date="2026-09-09T12:54:58Z">
+      <w:ins w:id="10153" w:author="Revision merge (HM+PL)" w:date="2026-09-09T13:15:15Z">
         <w:r>
           <w:t xml:space="preserve">https://github.com/Julio92-C/Metagenomics_pipeline_automation.</w:t>
         </w:r>
@@ -1101,12 +1101,12 @@
       <w:r>
         <w:t xml:space="preserve"> This note describes release **v0.1.0** (https://github.com/Julio92-C/Metagenomics_pipeline_automation/releases/tag/v0.1.0). </w:t>
       </w:r>
-      <w:del w:id="10154" w:author="Revision merge (HM+PL)" w:date="2026-09-09T12:54:58Z">
+      <w:del w:id="10154" w:author="Revision merge (HM+PL)" w:date="2026-09-09T13:15:15Z">
         <w:r>
           <w:delText xml:space="preserve">Run</w:delText>
         </w:r>
       </w:del>
-      <w:ins w:id="10155" w:author="Revision merge (HM+PL)" w:date="2026-09-09T12:54:58Z">
+      <w:ins w:id="10155" w:author="Revision merge (HM+PL)" w:date="2026-09-09T13:15:15Z">
         <w:r>
           <w:t xml:space="preserve">Reproducible execution is supported through the R environment package `renv`; after restoring dependencies</w:t>
         </w:r>
@@ -1114,12 +1114,12 @@
       <w:r>
         <w:t xml:space="preserve"> with </w:t>
       </w:r>
-      <w:del w:id="10156" w:author="Revision merge (HM+PL)" w:date="2026-09-09T12:54:58Z">
+      <w:del w:id="10156" w:author="Revision merge (HM+PL)" w:date="2026-09-09T13:15:15Z">
         <w:r>
           <w:delText xml:space="preserve">`git</w:delText>
         </w:r>
       </w:del>
-      <w:ins w:id="10157" w:author="Revision merge (HM+PL)" w:date="2026-09-09T12:54:58Z">
+      <w:ins w:id="10157" w:author="Revision merge (HM+PL)" w:date="2026-09-09T13:15:15Z">
         <w:r>
           <w:t xml:space="preserve">`renv::restore()`,</w:t>
         </w:r>
@@ -1127,12 +1127,12 @@
       <w:r>
         <w:t xml:space="preserve"> </w:t>
       </w:r>
-      <w:del w:id="10158" w:author="Revision merge (HM+PL)" w:date="2026-09-09T12:54:58Z">
+      <w:del w:id="10158" w:author="Revision merge (HM+PL)" w:date="2026-09-09T13:15:15Z">
         <w:r>
           <w:delText xml:space="preserve">clone</w:delText>
         </w:r>
       </w:del>
-      <w:ins w:id="10159" w:author="Revision merge (HM+PL)" w:date="2026-09-09T12:54:58Z">
+      <w:ins w:id="10159" w:author="Revision merge (HM+PL)" w:date="2026-09-09T13:15:15Z">
         <w:r>
           <w:t xml:space="preserve">the</w:t>
         </w:r>
@@ -1140,12 +1140,12 @@
       <w:r>
         <w:t xml:space="preserve"> </w:t>
       </w:r>
-      <w:del w:id="10160" w:author="Revision merge (HM+PL)" w:date="2026-09-09T12:54:58Z">
+      <w:del w:id="10160" w:author="Revision merge (HM+PL)" w:date="2026-09-09T13:15:15Z">
         <w:r>
           <w:delText xml:space="preserve">--branch</w:delText>
         </w:r>
       </w:del>
-      <w:ins w:id="10161" w:author="Revision merge (HM+PL)" w:date="2026-09-09T12:54:58Z">
+      <w:ins w:id="10161" w:author="Revision merge (HM+PL)" w:date="2026-09-09T13:15:15Z">
         <w:r>
           <w:t xml:space="preserve">pipeline</w:t>
         </w:r>
@@ -1153,12 +1153,12 @@
       <w:r>
         <w:t xml:space="preserve"> </w:t>
       </w:r>
-      <w:del w:id="10162" w:author="Revision merge (HM+PL)" w:date="2026-09-09T12:54:58Z">
+      <w:del w:id="10162" w:author="Revision merge (HM+PL)" w:date="2026-09-09T13:15:15Z">
         <w:r>
           <w:delText xml:space="preserve">v0.1.0</w:delText>
         </w:r>
       </w:del>
-      <w:ins w:id="10163" w:author="Revision merge (HM+PL)" w:date="2026-09-09T12:54:58Z">
+      <w:ins w:id="10163" w:author="Revision merge (HM+PL)" w:date="2026-09-09T13:15:15Z">
         <w:r>
           <w:t xml:space="preserve">is</w:t>
         </w:r>
@@ -1166,12 +1166,12 @@
       <w:r>
         <w:t xml:space="preserve"> </w:t>
       </w:r>
-      <w:del w:id="10164" w:author="Revision merge (HM+PL)" w:date="2026-09-09T12:54:58Z">
+      <w:del w:id="10164" w:author="Revision merge (HM+PL)" w:date="2026-09-09T13:15:15Z">
         <w:r>
           <w:delText xml:space="preserve">&lt;repo&gt;</w:delText>
         </w:r>
       </w:del>
-      <w:ins w:id="10165" w:author="Revision merge (HM+PL)" w:date="2026-09-09T12:54:58Z">
+      <w:ins w:id="10165" w:author="Revision merge (HM+PL)" w:date="2026-09-09T13:15:15Z">
         <w:r>
           <w:t xml:space="preserve">launched</w:t>
         </w:r>
@@ -1179,12 +1179,12 @@
       <w:r>
         <w:t xml:space="preserve"> </w:t>
       </w:r>
-      <w:del w:id="10166" w:author="Revision merge (HM+PL)" w:date="2026-09-09T12:54:58Z">
+      <w:del w:id="10166" w:author="Revision merge (HM+PL)" w:date="2026-09-09T13:15:15Z">
         <w:r>
           <w:delText xml:space="preserve">&amp;&amp;</w:delText>
         </w:r>
       </w:del>
-      <w:ins w:id="10167" w:author="Revision merge (HM+PL)" w:date="2026-09-09T12:54:58Z">
+      <w:ins w:id="10167" w:author="Revision merge (HM+PL)" w:date="2026-09-09T13:15:15Z">
         <w:r>
           <w:t xml:space="preserve">with</w:t>
         </w:r>
@@ -1192,12 +1192,12 @@
       <w:r>
         <w:t xml:space="preserve"> </w:t>
       </w:r>
-      <w:del w:id="10168" w:author="Revision merge (HM+PL)" w:date="2026-09-09T12:54:58Z">
+      <w:del w:id="10168" w:author="Revision merge (HM+PL)" w:date="2026-09-09T13:15:15Z">
         <w:r>
           <w:delText xml:space="preserve">Rscript</w:delText>
         </w:r>
       </w:del>
-      <w:ins w:id="10169" w:author="Revision merge (HM+PL)" w:date="2026-09-09T12:54:58Z">
+      <w:ins w:id="10169" w:author="Revision merge (HM+PL)" w:date="2026-09-09T13:15:15Z">
         <w:r>
           <w:t xml:space="preserve">`Rscript</w:t>
         </w:r>
@@ -1205,12 +1205,12 @@
       <w:r>
         <w:t xml:space="preserve"> run_pipeline.R </w:t>
       </w:r>
-      <w:del w:id="10170" w:author="Revision merge (HM+PL)" w:date="2026-09-09T12:54:58Z">
+      <w:del w:id="10170" w:author="Revision merge (HM+PL)" w:date="2026-09-09T13:15:15Z">
         <w:r>
           <w:delText xml:space="preserve">config.yaml` after `renv::restore()`.</w:delText>
         </w:r>
       </w:del>
-      <w:ins w:id="10171" w:author="Revision merge (HM+PL)" w:date="2026-09-09T12:54:58Z">
+      <w:ins w:id="10171" w:author="Revision merge (HM+PL)" w:date="2026-09-09T13:15:15Z">
         <w:r>
           <w:t xml:space="preserve">config.yaml`.</w:t>
         </w:r>
@@ -1220,12 +1220,12 @@
       <w:pPr>
         <w:spacing w:after="120"/>
       </w:pPr>
-      <w:del w:id="10172" w:author="Revision merge (HM+PL)" w:date="2026-09-09T12:54:58Z">
+      <w:del w:id="10172" w:author="Revision merge (HM+PL)" w:date="2026-09-09T13:15:15Z">
         <w:r>
           <w:delText xml:space="preserve">**Contact.**</w:delText>
         </w:r>
       </w:del>
-      <w:ins w:id="10173" w:author="Revision merge (HM+PL)" w:date="2026-09-09T12:54:58Z">
+      <w:ins w:id="10173" w:author="Revision merge (HM+PL)" w:date="2026-09-09T13:15:15Z">
         <w:r>
           <w:t xml:space="preserve">**Corresponding author:**</w:t>
         </w:r>
@@ -1263,12 +1263,12 @@
       <w:r>
         <w:t xml:space="preserve">Long-read shotgun </w:t>
       </w:r>
-      <w:del w:id="10174" w:author="Revision merge (HM+PL)" w:date="2026-09-09T12:54:58Z">
+      <w:del w:id="10174" w:author="Revision merge (HM+PL)" w:date="2026-09-09T13:15:15Z">
         <w:r>
           <w:delText xml:space="preserve">metagenomics</w:delText>
         </w:r>
       </w:del>
-      <w:ins w:id="10175" w:author="Revision merge (HM+PL)" w:date="2026-09-09T12:54:58Z">
+      <w:ins w:id="10175" w:author="Revision merge (HM+PL)" w:date="2026-09-09T13:15:15Z">
         <w:r>
           <w:t xml:space="preserve">metagenomics,</w:t>
         </w:r>
@@ -1276,12 +1276,12 @@
       <w:r>
         <w:t xml:space="preserve"> </w:t>
       </w:r>
-      <w:del w:id="10176" w:author="Revision merge (HM+PL)" w:date="2026-09-09T12:54:58Z">
+      <w:del w:id="10176" w:author="Revision merge (HM+PL)" w:date="2026-09-09T13:15:15Z">
         <w:r>
           <w:delText xml:space="preserve">(Oxford</w:delText>
         </w:r>
       </w:del>
-      <w:ins w:id="10177" w:author="Revision merge (HM+PL)" w:date="2026-09-09T12:54:58Z">
+      <w:ins w:id="10177" w:author="Revision merge (HM+PL)" w:date="2026-09-09T13:15:15Z">
         <w:r>
           <w:t xml:space="preserve">enabled</w:t>
         </w:r>
@@ -1289,12 +1289,12 @@
       <w:r>
         <w:t xml:space="preserve"> </w:t>
       </w:r>
-      <w:del w:id="10178" w:author="Revision merge (HM+PL)" w:date="2026-09-09T12:54:58Z">
+      <w:del w:id="10178" w:author="Revision merge (HM+PL)" w:date="2026-09-09T13:15:15Z">
         <w:r>
           <w:delText xml:space="preserve">Nanopore,</w:delText>
         </w:r>
       </w:del>
-      <w:ins w:id="10179" w:author="Revision merge (HM+PL)" w:date="2026-09-09T12:54:58Z">
+      <w:ins w:id="10179" w:author="Revision merge (HM+PL)" w:date="2026-09-09T13:15:15Z">
         <w:r>
           <w:t xml:space="preserve">by</w:t>
         </w:r>
@@ -1302,12 +1302,12 @@
       <w:r>
         <w:t xml:space="preserve"> </w:t>
       </w:r>
-      <w:del w:id="10180" w:author="Revision merge (HM+PL)" w:date="2026-09-09T12:54:58Z">
+      <w:del w:id="10180" w:author="Revision merge (HM+PL)" w:date="2026-09-09T13:15:15Z">
         <w:r>
           <w:delText xml:space="preserve">PacBio)</w:delText>
         </w:r>
       </w:del>
-      <w:ins w:id="10181" w:author="Revision merge (HM+PL)" w:date="2026-09-09T12:54:58Z">
+      <w:ins w:id="10181" w:author="Revision merge (HM+PL)" w:date="2026-09-09T13:15:15Z">
         <w:r>
           <w:t xml:space="preserve">Oxford Nanopore and PacBio sequencing technologies,</w:t>
         </w:r>
@@ -1315,7 +1315,7 @@
       <w:r>
         <w:t xml:space="preserve"> is</w:t>
       </w:r>
-      <w:del w:id="10182" w:author="Revision merge (HM+PL)" w:date="2026-09-09T12:54:58Z">
+      <w:del w:id="10182" w:author="Revision merge (HM+PL)" w:date="2026-09-09T13:15:15Z">
         <w:r>
           <w:delText xml:space="preserve"> increasingly</w:delText>
         </w:r>
@@ -1323,12 +1323,12 @@
       <w:r>
         <w:t xml:space="preserve"> central to One Health surveillance, where </w:t>
       </w:r>
-      <w:del w:id="10183" w:author="Revision merge (HM+PL)" w:date="2026-09-09T12:54:58Z">
+      <w:del w:id="10183" w:author="Revision merge (HM+PL)" w:date="2026-09-09T13:15:15Z">
         <w:r>
           <w:delText xml:space="preserve">threats</w:delText>
         </w:r>
       </w:del>
-      <w:ins w:id="10184" w:author="Revision merge (HM+PL)" w:date="2026-09-09T12:54:58Z">
+      <w:ins w:id="10184" w:author="Revision merge (HM+PL)" w:date="2026-09-09T13:15:15Z">
         <w:r>
           <w:t xml:space="preserve">the</w:t>
         </w:r>
@@ -1336,12 +1336,12 @@
       <w:r>
         <w:t xml:space="preserve"> </w:t>
       </w:r>
-      <w:del w:id="10185" w:author="Revision merge (HM+PL)" w:date="2026-09-09T12:54:58Z">
+      <w:del w:id="10185" w:author="Revision merge (HM+PL)" w:date="2026-09-09T13:15:15Z">
         <w:r>
           <w:delText xml:space="preserve">intersect humans, animals</w:delText>
         </w:r>
       </w:del>
-      <w:ins w:id="10186" w:author="Revision merge (HM+PL)" w:date="2026-09-09T12:54:58Z">
+      <w:ins w:id="10186" w:author="Revision merge (HM+PL)" w:date="2026-09-09T13:15:15Z">
         <w:r>
           <w:t xml:space="preserve">emergence</w:t>
         </w:r>
@@ -1349,12 +1349,12 @@
       <w:r>
         <w:t xml:space="preserve"> and </w:t>
       </w:r>
-      <w:del w:id="10187" w:author="Revision merge (HM+PL)" w:date="2026-09-09T12:54:58Z">
+      <w:del w:id="10187" w:author="Revision merge (HM+PL)" w:date="2026-09-09T13:15:15Z">
         <w:r>
           <w:delText xml:space="preserve">ecosystems</w:delText>
         </w:r>
       </w:del>
-      <w:ins w:id="10188" w:author="Revision merge (HM+PL)" w:date="2026-09-09T12:54:58Z">
+      <w:ins w:id="10188" w:author="Revision merge (HM+PL)" w:date="2026-09-09T13:15:15Z">
         <w:r>
           <w:t xml:space="preserve">dissemination of biological threats occur at the interface of human, animal and environmental systems</w:t>
         </w:r>
@@ -1362,12 +1362,12 @@
       <w:r>
         <w:t xml:space="preserve"> [1]. </w:t>
       </w:r>
-      <w:del w:id="10189" w:author="Revision merge (HM+PL)" w:date="2026-09-09T12:54:58Z">
+      <w:del w:id="10189" w:author="Revision merge (HM+PL)" w:date="2026-09-09T13:15:15Z">
         <w:r>
           <w:delText xml:space="preserve">By</w:delText>
         </w:r>
       </w:del>
-      <w:ins w:id="10190" w:author="Revision merge (HM+PL)" w:date="2026-09-09T12:54:58Z">
+      <w:ins w:id="10190" w:author="Revision merge (HM+PL)" w:date="2026-09-09T13:15:15Z">
         <w:r>
           <w:t xml:space="preserve">Unlike</w:t>
         </w:r>
@@ -1375,12 +1375,12 @@
       <w:r>
         <w:t xml:space="preserve"> </w:t>
       </w:r>
-      <w:del w:id="10191" w:author="Revision merge (HM+PL)" w:date="2026-09-09T12:54:58Z">
+      <w:del w:id="10191" w:author="Revision merge (HM+PL)" w:date="2026-09-09T13:15:15Z">
         <w:r>
           <w:delText xml:space="preserve">profiling</w:delText>
         </w:r>
       </w:del>
-      <w:ins w:id="10192" w:author="Revision merge (HM+PL)" w:date="2026-09-09T12:54:58Z">
+      <w:ins w:id="10192" w:author="Revision merge (HM+PL)" w:date="2026-09-09T13:15:15Z">
         <w:r>
           <w:t xml:space="preserve">targeted approaches, shotgun metagenomics enables simultaneous characterisation of</w:t>
         </w:r>
@@ -1388,12 +1388,12 @@
       <w:r>
         <w:t xml:space="preserve"> microbial </w:t>
       </w:r>
-      <w:del w:id="10193" w:author="Revision merge (HM+PL)" w:date="2026-09-09T12:54:58Z">
+      <w:del w:id="10193" w:author="Revision merge (HM+PL)" w:date="2026-09-09T13:15:15Z">
         <w:r>
           <w:delText xml:space="preserve">communities</w:delText>
         </w:r>
       </w:del>
-      <w:ins w:id="10194" w:author="Revision merge (HM+PL)" w:date="2026-09-09T12:54:58Z">
+      <w:ins w:id="10194" w:author="Revision merge (HM+PL)" w:date="2026-09-09T13:15:15Z">
         <w:r>
           <w:t xml:space="preserve">community composition</w:t>
         </w:r>
@@ -1401,7 +1401,7 @@
       <w:r>
         <w:t xml:space="preserve"> and</w:t>
       </w:r>
-      <w:del w:id="10195" w:author="Revision merge (HM+PL)" w:date="2026-09-09T12:54:58Z">
+      <w:del w:id="10195" w:author="Revision merge (HM+PL)" w:date="2026-09-09T13:15:15Z">
         <w:r>
           <w:delText xml:space="preserve"> their</w:delText>
         </w:r>
@@ -1409,12 +1409,12 @@
       <w:r>
         <w:t xml:space="preserve"> functional genetic </w:t>
       </w:r>
-      <w:del w:id="10196" w:author="Revision merge (HM+PL)" w:date="2026-09-09T12:54:58Z">
+      <w:del w:id="10196" w:author="Revision merge (HM+PL)" w:date="2026-09-09T13:15:15Z">
         <w:r>
           <w:delText xml:space="preserve">elements</w:delText>
         </w:r>
       </w:del>
-      <w:ins w:id="10197" w:author="Revision merge (HM+PL)" w:date="2026-09-09T12:54:58Z">
+      <w:ins w:id="10197" w:author="Revision merge (HM+PL)" w:date="2026-09-09T13:15:15Z">
         <w:r>
           <w:t xml:space="preserve">content,</w:t>
         </w:r>
@@ -1422,12 +1422,12 @@
       <w:r>
         <w:t xml:space="preserve"> </w:t>
       </w:r>
-      <w:del w:id="10198" w:author="Revision merge (HM+PL)" w:date="2026-09-09T12:54:58Z">
+      <w:del w:id="10198" w:author="Revision merge (HM+PL)" w:date="2026-09-09T13:15:15Z">
         <w:r>
           <w:delText xml:space="preserve">in</w:delText>
         </w:r>
       </w:del>
-      <w:ins w:id="10199" w:author="Revision merge (HM+PL)" w:date="2026-09-09T12:54:58Z">
+      <w:ins w:id="10199" w:author="Revision merge (HM+PL)" w:date="2026-09-09T13:15:15Z">
         <w:r>
           <w:t xml:space="preserve">thereby</w:t>
         </w:r>
@@ -1435,12 +1435,12 @@
       <w:r>
         <w:t xml:space="preserve"> </w:t>
       </w:r>
-      <w:del w:id="10200" w:author="Revision merge (HM+PL)" w:date="2026-09-09T12:54:58Z">
+      <w:del w:id="10200" w:author="Revision merge (HM+PL)" w:date="2026-09-09T13:15:15Z">
         <w:r>
           <w:delText xml:space="preserve">a single experiment, it links</w:delText>
         </w:r>
       </w:del>
-      <w:ins w:id="10201" w:author="Revision merge (HM+PL)" w:date="2026-09-09T12:54:58Z">
+      <w:ins w:id="10201" w:author="Revision merge (HM+PL)" w:date="2026-09-09T13:15:15Z">
         <w:r>
           <w:t xml:space="preserve">linking</w:t>
         </w:r>
@@ -1448,7 +1448,7 @@
       <w:r>
         <w:t xml:space="preserve"> taxonomic identity to</w:t>
       </w:r>
-      <w:del w:id="10202" w:author="Revision merge (HM+PL)" w:date="2026-09-09T12:54:58Z">
+      <w:del w:id="10202" w:author="Revision merge (HM+PL)" w:date="2026-09-09T13:15:15Z">
         <w:r>
           <w:delText xml:space="preserve"> determinants of resistance, virulence, and mobility across environmental, clinical, and livestock matrices. The downstream analysis stack is well established — Kraken2 [2] and Bracken [3] for taxonomic assignment and abundance estimation, ABRicate [4] for screening</w:delText>
         </w:r>
@@ -1456,7 +1456,7 @@
       <w:r>
         <w:t xml:space="preserve"> antimicrobial resistance genes (ARGs), virulence factors (VFs) and mobile genetic elements (MGEs) </w:t>
       </w:r>
-      <w:ins w:id="10203" w:author="Revision merge (HM+PL)" w:date="2026-09-09T12:54:58Z">
+      <w:ins w:id="10203" w:author="Revision merge (HM+PL)" w:date="2026-09-09T13:15:15Z">
         <w:r>
           <w:t xml:space="preserve">within a single experiment. This capability is particularly valuable for tracking the ecology and transmission of high-risk microorganisms and their associated genetic determinants across clinical, agricultural and environmental reservoirs. The downstream analysis supporting long-read metagenomics is now well established. Widely adopted tools include Kraken2 [2] and Bracken [3] for taxonomic classification and abundance estimation, ABRicate [4] for screening ARGs, VFs and MGEs </w:t>
         </w:r>
@@ -1464,7 +1464,7 @@
       <w:r>
         <w:t xml:space="preserve">against</w:t>
       </w:r>
-      <w:ins w:id="10204" w:author="Revision merge (HM+PL)" w:date="2026-09-09T12:54:58Z">
+      <w:ins w:id="10204" w:author="Revision merge (HM+PL)" w:date="2026-09-09T13:15:15Z">
         <w:r>
           <w:t xml:space="preserve"> databases such as</w:t>
         </w:r>
@@ -1472,12 +1472,12 @@
       <w:r>
         <w:t xml:space="preserve"> CARD [5], VFDB [6] and PlasmidFinder [7], Re-centrifuge [8] for contamination assessment, and R packages </w:t>
       </w:r>
-      <w:del w:id="10205" w:author="Revision merge (HM+PL)" w:date="2026-09-09T12:54:58Z">
+      <w:del w:id="10205" w:author="Revision merge (HM+PL)" w:date="2026-09-09T13:15:15Z">
         <w:r>
           <w:delText xml:space="preserve">such as</w:delText>
         </w:r>
       </w:del>
-      <w:ins w:id="10206" w:author="Revision merge (HM+PL)" w:date="2026-09-09T12:54:58Z">
+      <w:ins w:id="10206" w:author="Revision merge (HM+PL)" w:date="2026-09-09T13:15:15Z">
         <w:r>
           <w:t xml:space="preserve">including</w:t>
         </w:r>
@@ -1485,12 +1485,12 @@
       <w:r>
         <w:t xml:space="preserve"> vegan [9] and ALDEx2 [10] for ecological and differential </w:t>
       </w:r>
-      <w:del w:id="10207" w:author="Revision merge (HM+PL)" w:date="2026-09-09T12:54:58Z">
+      <w:del w:id="10207" w:author="Revision merge (HM+PL)" w:date="2026-09-09T13:15:15Z">
         <w:r>
           <w:delText xml:space="preserve">analyses</w:delText>
         </w:r>
       </w:del>
-      <w:ins w:id="10208" w:author="Revision merge (HM+PL)" w:date="2026-09-09T12:54:58Z">
+      <w:ins w:id="10208" w:author="Revision merge (HM+PL)" w:date="2026-09-09T13:15:15Z">
         <w:r>
           <w:t xml:space="preserve">abundance</w:t>
         </w:r>
@@ -1498,12 +1498,12 @@
       <w:r>
         <w:t xml:space="preserve"> </w:t>
       </w:r>
-      <w:del w:id="10209" w:author="Revision merge (HM+PL)" w:date="2026-09-09T12:54:58Z">
+      <w:del w:id="10209" w:author="Revision merge (HM+PL)" w:date="2026-09-09T13:15:15Z">
         <w:r>
           <w:delText xml:space="preserve">—</w:delText>
         </w:r>
       </w:del>
-      <w:ins w:id="10210" w:author="Revision merge (HM+PL)" w:date="2026-09-09T12:54:58Z">
+      <w:ins w:id="10210" w:author="Revision merge (HM+PL)" w:date="2026-09-09T13:15:15Z">
         <w:r>
           <w:t xml:space="preserve">analyses.</w:t>
         </w:r>
@@ -1511,12 +1511,12 @@
       <w:r>
         <w:t xml:space="preserve"> </w:t>
       </w:r>
-      <w:del w:id="10211" w:author="Revision merge (HM+PL)" w:date="2026-09-09T12:54:58Z">
+      <w:del w:id="10211" w:author="Revision merge (HM+PL)" w:date="2026-09-09T13:15:15Z">
         <w:r>
           <w:delText xml:space="preserve">but</w:delText>
         </w:r>
       </w:del>
-      <w:ins w:id="10212" w:author="Revision merge (HM+PL)" w:date="2026-09-09T12:54:58Z">
+      <w:ins w:id="10212" w:author="Revision merge (HM+PL)" w:date="2026-09-09T13:15:15Z">
         <w:r>
           <w:t xml:space="preserve">However,</w:t>
         </w:r>
@@ -1524,12 +1524,12 @@
       <w:r>
         <w:t xml:space="preserve"> </w:t>
       </w:r>
-      <w:del w:id="10213" w:author="Revision merge (HM+PL)" w:date="2026-09-09T12:54:58Z">
+      <w:del w:id="10213" w:author="Revision merge (HM+PL)" w:date="2026-09-09T13:15:15Z">
         <w:r>
           <w:delText xml:space="preserve">the</w:delText>
         </w:r>
       </w:del>
-      <w:ins w:id="10214" w:author="Revision merge (HM+PL)" w:date="2026-09-09T12:54:58Z">
+      <w:ins w:id="10214" w:author="Revision merge (HM+PL)" w:date="2026-09-09T13:15:15Z">
         <w:r>
           <w:t xml:space="preserve">while these tools are individually well established, their</w:t>
         </w:r>
@@ -1537,12 +1537,12 @@
       <w:r>
         <w:t xml:space="preserve"> integration </w:t>
       </w:r>
-      <w:del w:id="10215" w:author="Revision merge (HM+PL)" w:date="2026-09-09T12:54:58Z">
+      <w:del w:id="10215" w:author="Revision merge (HM+PL)" w:date="2026-09-09T13:15:15Z">
         <w:r>
           <w:delText xml:space="preserve">between</w:delText>
         </w:r>
       </w:del>
-      <w:ins w:id="10216" w:author="Revision merge (HM+PL)" w:date="2026-09-09T12:54:58Z">
+      <w:ins w:id="10216" w:author="Revision merge (HM+PL)" w:date="2026-09-09T13:15:15Z">
         <w:r>
           <w:t xml:space="preserve">into</w:t>
         </w:r>
@@ -1550,12 +1550,12 @@
       <w:r>
         <w:t xml:space="preserve"> </w:t>
       </w:r>
-      <w:del w:id="10217" w:author="Revision merge (HM+PL)" w:date="2026-09-09T12:54:58Z">
+      <w:del w:id="10217" w:author="Revision merge (HM+PL)" w:date="2026-09-09T13:15:15Z">
         <w:r>
           <w:delText xml:space="preserve">them</w:delText>
         </w:r>
       </w:del>
-      <w:ins w:id="10218" w:author="Revision merge (HM+PL)" w:date="2026-09-09T12:54:58Z">
+      <w:ins w:id="10218" w:author="Revision merge (HM+PL)" w:date="2026-09-09T13:15:15Z">
         <w:r>
           <w:t xml:space="preserve">reproducible</w:t>
         </w:r>
@@ -1563,12 +1563,12 @@
       <w:r>
         <w:t xml:space="preserve"> </w:t>
       </w:r>
-      <w:del w:id="10219" w:author="Revision merge (HM+PL)" w:date="2026-09-09T12:54:58Z">
+      <w:del w:id="10219" w:author="Revision merge (HM+PL)" w:date="2026-09-09T13:15:15Z">
         <w:r>
           <w:delText xml:space="preserve">is</w:delText>
         </w:r>
       </w:del>
-      <w:ins w:id="10220" w:author="Revision merge (HM+PL)" w:date="2026-09-09T12:54:58Z">
+      <w:ins w:id="10220" w:author="Revision merge (HM+PL)" w:date="2026-09-09T13:15:15Z">
         <w:r>
           <w:t xml:space="preserve">and</w:t>
         </w:r>
@@ -1576,12 +1576,12 @@
       <w:r>
         <w:t xml:space="preserve"> </w:t>
       </w:r>
-      <w:del w:id="10221" w:author="Revision merge (HM+PL)" w:date="2026-09-09T12:54:58Z">
+      <w:del w:id="10221" w:author="Revision merge (HM+PL)" w:date="2026-09-09T13:15:15Z">
         <w:r>
           <w:delText xml:space="preserve">not.</w:delText>
         </w:r>
       </w:del>
-      <w:ins w:id="10222" w:author="Revision merge (HM+PL)" w:date="2026-09-09T12:54:58Z">
+      <w:ins w:id="10222" w:author="Revision merge (HM+PL)" w:date="2026-09-09T13:15:15Z">
         <w:r>
           <w:t xml:space="preserve">reusable workflows remains limited.</w:t>
         </w:r>
@@ -1594,12 +1594,12 @@
       <w:r>
         <w:t xml:space="preserve">In practice, </w:t>
       </w:r>
-      <w:del w:id="10223" w:author="Revision merge (HM+PL)" w:date="2026-09-09T12:54:58Z">
+      <w:del w:id="10223" w:author="Revision merge (HM+PL)" w:date="2026-09-09T13:15:15Z">
         <w:r>
           <w:delText xml:space="preserve">each</w:delText>
         </w:r>
       </w:del>
-      <w:ins w:id="10224" w:author="Revision merge (HM+PL)" w:date="2026-09-09T12:54:58Z">
+      <w:ins w:id="10224" w:author="Revision merge (HM+PL)" w:date="2026-09-09T13:15:15Z">
         <w:r>
           <w:t xml:space="preserve">downstream</w:t>
         </w:r>
@@ -1607,12 +1607,12 @@
       <w:r>
         <w:t xml:space="preserve"> </w:t>
       </w:r>
-      <w:del w:id="10225" w:author="Revision merge (HM+PL)" w:date="2026-09-09T12:54:58Z">
+      <w:del w:id="10225" w:author="Revision merge (HM+PL)" w:date="2026-09-09T13:15:15Z">
         <w:r>
           <w:delText xml:space="preserve">new</w:delText>
         </w:r>
       </w:del>
-      <w:ins w:id="10226" w:author="Revision merge (HM+PL)" w:date="2026-09-09T12:54:58Z">
+      <w:ins w:id="10226" w:author="Revision merge (HM+PL)" w:date="2026-09-09T13:15:15Z">
         <w:r>
           <w:t xml:space="preserve">analyses</w:t>
         </w:r>
@@ -1620,12 +1620,12 @@
       <w:r>
         <w:t xml:space="preserve"> </w:t>
       </w:r>
-      <w:del w:id="10227" w:author="Revision merge (HM+PL)" w:date="2026-09-09T12:54:58Z">
+      <w:del w:id="10227" w:author="Revision merge (HM+PL)" w:date="2026-09-09T13:15:15Z">
         <w:r>
           <w:delText xml:space="preserve">study</w:delText>
         </w:r>
       </w:del>
-      <w:ins w:id="10228" w:author="Revision merge (HM+PL)" w:date="2026-09-09T12:54:58Z">
+      <w:ins w:id="10228" w:author="Revision merge (HM+PL)" w:date="2026-09-09T13:15:15Z">
         <w:r>
           <w:t xml:space="preserve">continue</w:t>
         </w:r>
@@ -1633,12 +1633,12 @@
       <w:r>
         <w:t xml:space="preserve"> </w:t>
       </w:r>
-      <w:del w:id="10229" w:author="Revision merge (HM+PL)" w:date="2026-09-09T12:54:58Z">
+      <w:del w:id="10229" w:author="Revision merge (HM+PL)" w:date="2026-09-09T13:15:15Z">
         <w:r>
           <w:delText xml:space="preserve">is</w:delText>
         </w:r>
       </w:del>
-      <w:ins w:id="10230" w:author="Revision merge (HM+PL)" w:date="2026-09-09T12:54:58Z">
+      <w:ins w:id="10230" w:author="Revision merge (HM+PL)" w:date="2026-09-09T13:15:15Z">
         <w:r>
           <w:t xml:space="preserve">to</w:t>
         </w:r>
@@ -1646,12 +1646,12 @@
       <w:r>
         <w:t xml:space="preserve"> </w:t>
       </w:r>
-      <w:del w:id="10231" w:author="Revision merge (HM+PL)" w:date="2026-09-09T12:54:58Z">
+      <w:del w:id="10231" w:author="Revision merge (HM+PL)" w:date="2026-09-09T13:15:15Z">
         <w:r>
           <w:delText xml:space="preserve">analysed</w:delText>
         </w:r>
       </w:del>
-      <w:ins w:id="10232" w:author="Revision merge (HM+PL)" w:date="2026-09-09T12:54:58Z">
+      <w:ins w:id="10232" w:author="Revision merge (HM+PL)" w:date="2026-09-09T13:15:15Z">
         <w:r>
           <w:t xml:space="preserve">rely</w:t>
         </w:r>
@@ -1659,12 +1659,12 @@
       <w:r>
         <w:t xml:space="preserve"> </w:t>
       </w:r>
-      <w:del w:id="10233" w:author="Revision merge (HM+PL)" w:date="2026-09-09T12:54:58Z">
+      <w:del w:id="10233" w:author="Revision merge (HM+PL)" w:date="2026-09-09T13:15:15Z">
         <w:r>
           <w:delText xml:space="preserve">by adapting</w:delText>
         </w:r>
       </w:del>
-      <w:ins w:id="10234" w:author="Revision merge (HM+PL)" w:date="2026-09-09T12:54:58Z">
+      <w:ins w:id="10234" w:author="Revision merge (HM+PL)" w:date="2026-09-09T13:15:15Z">
         <w:r>
           <w:t xml:space="preserve">on</w:t>
         </w:r>
@@ -1672,12 +1672,12 @@
       <w:r>
         <w:t xml:space="preserve"> a set of bespoke R </w:t>
       </w:r>
-      <w:del w:id="10235" w:author="Revision merge (HM+PL)" w:date="2026-09-09T12:54:58Z">
+      <w:del w:id="10235" w:author="Revision merge (HM+PL)" w:date="2026-09-09T13:15:15Z">
         <w:r>
           <w:delText xml:space="preserve">scripts:</w:delText>
         </w:r>
       </w:del>
-      <w:ins w:id="10236" w:author="Revision merge (HM+PL)" w:date="2026-09-09T12:54:58Z">
+      <w:ins w:id="10236" w:author="Revision merge (HM+PL)" w:date="2026-09-09T13:15:15Z">
         <w:r>
           <w:t xml:space="preserve">scripts that have evolved incrementally over successive projects. These scripts frequently contain</w:t>
         </w:r>
@@ -1685,12 +1685,12 @@
       <w:r>
         <w:t xml:space="preserve"> hard-coded input paths, sample-identifier filters embedded as literal strings, per-study negative-control renames, and taxonomy fixes patched by row index. </w:t>
       </w:r>
-      <w:del w:id="10237" w:author="Revision merge (HM+PL)" w:date="2026-09-09T12:54:58Z">
+      <w:del w:id="10237" w:author="Revision merge (HM+PL)" w:date="2026-09-09T13:15:15Z">
         <w:r>
           <w:delText xml:space="preserve">Consequently,</w:delText>
         </w:r>
       </w:del>
-      <w:ins w:id="10238" w:author="Revision merge (HM+PL)" w:date="2026-09-09T12:54:58Z">
+      <w:ins w:id="10238" w:author="Revision merge (HM+PL)" w:date="2026-09-09T13:15:15Z">
         <w:r>
           <w:t xml:space="preserve">As a result,</w:t>
         </w:r>
@@ -1698,12 +1698,12 @@
       <w:r>
         <w:t xml:space="preserve"> individual script copies </w:t>
       </w:r>
-      <w:del w:id="10239" w:author="Revision merge (HM+PL)" w:date="2026-09-09T12:54:58Z">
+      <w:del w:id="10239" w:author="Revision merge (HM+PL)" w:date="2026-09-09T13:15:15Z">
         <w:r>
           <w:delText xml:space="preserve">diverge,</w:delText>
         </w:r>
       </w:del>
-      <w:ins w:id="10240" w:author="Revision merge (HM+PL)" w:date="2026-09-09T12:54:58Z">
+      <w:ins w:id="10240" w:author="Revision merge (HM+PL)" w:date="2026-09-09T13:15:15Z">
         <w:r>
           <w:t xml:space="preserve">diverge over time, reducing reproducibility and limiting portability,</w:t>
         </w:r>
@@ -1711,12 +1711,12 @@
       <w:r>
         <w:t xml:space="preserve"> and the </w:t>
       </w:r>
-      <w:del w:id="10241" w:author="Revision merge (HM+PL)" w:date="2026-09-09T12:54:58Z">
+      <w:del w:id="10241" w:author="Revision merge (HM+PL)" w:date="2026-09-09T13:15:15Z">
         <w:r>
           <w:delText xml:space="preserve">lack</w:delText>
         </w:r>
       </w:del>
-      <w:ins w:id="10242" w:author="Revision merge (HM+PL)" w:date="2026-09-09T12:54:58Z">
+      <w:ins w:id="10242" w:author="Revision merge (HM+PL)" w:date="2026-09-09T13:15:15Z">
         <w:r>
           <w:t xml:space="preserve">absence</w:t>
         </w:r>
@@ -1724,12 +1724,12 @@
       <w:r>
         <w:t xml:space="preserve"> of a shared interface prevents automated output logging. Comparing different studies requires manual reconciliation of both code and data. The reference cohort for the present work (`Chicken Batch 1`; ~46 hand-edited scripts) </w:t>
       </w:r>
-      <w:del w:id="10243" w:author="Revision merge (HM+PL)" w:date="2026-09-09T12:54:58Z">
+      <w:del w:id="10243" w:author="Revision merge (HM+PL)" w:date="2026-09-09T13:15:15Z">
         <w:r>
           <w:delText xml:space="preserve">typifies</w:delText>
         </w:r>
       </w:del>
-      <w:ins w:id="10244" w:author="Revision merge (HM+PL)" w:date="2026-09-09T12:54:58Z">
+      <w:ins w:id="10244" w:author="Revision merge (HM+PL)" w:date="2026-09-09T13:15:15Z">
         <w:r>
           <w:t xml:space="preserve">exemplifies</w:t>
         </w:r>
@@ -1737,12 +1737,12 @@
       <w:r>
         <w:t xml:space="preserve"> this pattern. The L-ARRAP pipeline [11] </w:t>
       </w:r>
-      <w:del w:id="10245" w:author="Revision merge (HM+PL)" w:date="2026-09-09T12:54:58Z">
+      <w:del w:id="10245" w:author="Revision merge (HM+PL)" w:date="2026-09-09T13:15:15Z">
         <w:r>
           <w:delText xml:space="preserve">addresses</w:delText>
         </w:r>
       </w:del>
-      <w:ins w:id="10246" w:author="Revision merge (HM+PL)" w:date="2026-09-09T12:54:58Z">
+      <w:ins w:id="10246" w:author="Revision merge (HM+PL)" w:date="2026-09-09T13:15:15Z">
         <w:r>
           <w:t xml:space="preserve">provides</w:t>
         </w:r>
@@ -1750,12 +1750,12 @@
       <w:r>
         <w:t xml:space="preserve"> </w:t>
       </w:r>
-      <w:del w:id="10247" w:author="Revision merge (HM+PL)" w:date="2026-09-09T12:54:58Z">
+      <w:del w:id="10247" w:author="Revision merge (HM+PL)" w:date="2026-09-09T13:15:15Z">
         <w:r>
           <w:delText xml:space="preserve">one</w:delText>
         </w:r>
       </w:del>
-      <w:ins w:id="10248" w:author="Revision merge (HM+PL)" w:date="2026-09-09T12:54:58Z">
+      <w:ins w:id="10248" w:author="Revision merge (HM+PL)" w:date="2026-09-09T13:15:15Z">
         <w:r>
           <w:t xml:space="preserve">a</w:t>
         </w:r>
@@ -1763,12 +1763,12 @@
       <w:r>
         <w:t xml:space="preserve"> </w:t>
       </w:r>
-      <w:del w:id="10249" w:author="Revision merge (HM+PL)" w:date="2026-09-09T12:54:58Z">
+      <w:del w:id="10249" w:author="Revision merge (HM+PL)" w:date="2026-09-09T13:15:15Z">
         <w:r>
           <w:delText xml:space="preserve">slice of this problem</w:delText>
         </w:r>
       </w:del>
-      <w:ins w:id="10250" w:author="Revision merge (HM+PL)" w:date="2026-09-09T12:54:58Z">
+      <w:ins w:id="10250" w:author="Revision merge (HM+PL)" w:date="2026-09-09T13:15:15Z">
         <w:r>
           <w:t xml:space="preserve">framework</w:t>
         </w:r>
@@ -1776,12 +1776,12 @@
       <w:r>
         <w:t xml:space="preserve"> for long-read resistome risk assessment, </w:t>
       </w:r>
-      <w:del w:id="10251" w:author="Revision merge (HM+PL)" w:date="2026-09-09T12:54:58Z">
+      <w:del w:id="10251" w:author="Revision merge (HM+PL)" w:date="2026-09-09T13:15:15Z">
         <w:r>
           <w:delText xml:space="preserve">and</w:delText>
         </w:r>
       </w:del>
-      <w:ins w:id="10252" w:author="Revision merge (HM+PL)" w:date="2026-09-09T12:54:58Z">
+      <w:ins w:id="10252" w:author="Revision merge (HM+PL)" w:date="2026-09-09T13:15:15Z">
         <w:r>
           <w:t xml:space="preserve">while</w:t>
         </w:r>
@@ -1789,12 +1789,12 @@
       <w:r>
         <w:t xml:space="preserve"> the rANOMALY workflow [12] demonstrates the </w:t>
       </w:r>
-      <w:del w:id="10253" w:author="Revision merge (HM+PL)" w:date="2026-09-09T12:54:58Z">
+      <w:del w:id="10253" w:author="Revision merge (HM+PL)" w:date="2026-09-09T13:15:15Z">
         <w:r>
           <w:delText xml:space="preserve">value</w:delText>
         </w:r>
       </w:del>
-      <w:ins w:id="10254" w:author="Revision merge (HM+PL)" w:date="2026-09-09T12:54:58Z">
+      <w:ins w:id="10254" w:author="Revision merge (HM+PL)" w:date="2026-09-09T13:15:15Z">
         <w:r>
           <w:t xml:space="preserve">advantages</w:t>
         </w:r>
@@ -1802,12 +1802,12 @@
       <w:r>
         <w:t xml:space="preserve"> of a </w:t>
       </w:r>
-      <w:del w:id="10255" w:author="Revision merge (HM+PL)" w:date="2026-09-09T12:54:58Z">
+      <w:del w:id="10255" w:author="Revision merge (HM+PL)" w:date="2026-09-09T13:15:15Z">
         <w:r>
           <w:delText xml:space="preserve">config-driven</w:delText>
         </w:r>
       </w:del>
-      <w:ins w:id="10256" w:author="Revision merge (HM+PL)" w:date="2026-09-09T12:54:58Z">
+      <w:ins w:id="10256" w:author="Revision merge (HM+PL)" w:date="2026-09-09T13:15:15Z">
         <w:r>
           <w:t xml:space="preserve">configuration-driven</w:t>
         </w:r>
@@ -1815,12 +1815,12 @@
       <w:r>
         <w:t xml:space="preserve"> R workflow with auto-generated reports for amplicon data. To our knowledge, no </w:t>
       </w:r>
-      <w:del w:id="10257" w:author="Revision merge (HM+PL)" w:date="2026-09-09T12:54:58Z">
+      <w:del w:id="10257" w:author="Revision merge (HM+PL)" w:date="2026-09-09T13:15:15Z">
         <w:r>
           <w:delText xml:space="preserve">comparable</w:delText>
         </w:r>
       </w:del>
-      <w:ins w:id="10258" w:author="Revision merge (HM+PL)" w:date="2026-09-09T12:54:58Z">
+      <w:ins w:id="10258" w:author="Revision merge (HM+PL)" w:date="2026-09-09T13:15:15Z">
         <w:r>
           <w:t xml:space="preserve">integrated end-to-end R</w:t>
         </w:r>
@@ -1828,12 +1828,12 @@
       <w:r>
         <w:t xml:space="preserve"> workflow </w:t>
       </w:r>
-      <w:del w:id="10259" w:author="Revision merge (HM+PL)" w:date="2026-09-09T12:54:58Z">
+      <w:del w:id="10259" w:author="Revision merge (HM+PL)" w:date="2026-09-09T13:15:15Z">
         <w:r>
           <w:delText xml:space="preserve">exists for end-to-end</w:delText>
         </w:r>
       </w:del>
-      <w:ins w:id="10260" w:author="Revision merge (HM+PL)" w:date="2026-09-09T12:54:58Z">
+      <w:ins w:id="10260" w:author="Revision merge (HM+PL)" w:date="2026-09-09T13:15:15Z">
         <w:r>
           <w:t xml:space="preserve">covers</w:t>
         </w:r>
@@ -1841,12 +1841,12 @@
       <w:r>
         <w:t xml:space="preserve"> long-read shotgun </w:t>
       </w:r>
-      <w:del w:id="10261" w:author="Revision merge (HM+PL)" w:date="2026-09-09T12:54:58Z">
+      <w:del w:id="10261" w:author="Revision merge (HM+PL)" w:date="2026-09-09T13:15:15Z">
         <w:r>
           <w:delText xml:space="preserve">metagenomics</w:delText>
         </w:r>
       </w:del>
-      <w:ins w:id="10262" w:author="Revision merge (HM+PL)" w:date="2026-09-09T12:54:58Z">
+      <w:ins w:id="10262" w:author="Revision merge (HM+PL)" w:date="2026-09-09T13:15:15Z">
         <w:r>
           <w:t xml:space="preserve">metagenomic</w:t>
         </w:r>
@@ -1854,12 +1854,12 @@
       <w:r>
         <w:t xml:space="preserve"> </w:t>
       </w:r>
-      <w:del w:id="10263" w:author="Revision merge (HM+PL)" w:date="2026-09-09T12:54:58Z">
+      <w:del w:id="10263" w:author="Revision merge (HM+PL)" w:date="2026-09-09T13:15:15Z">
         <w:r>
           <w:delText xml:space="preserve">that</w:delText>
         </w:r>
       </w:del>
-      <w:ins w:id="10264" w:author="Revision merge (HM+PL)" w:date="2026-09-09T12:54:58Z">
+      <w:ins w:id="10264" w:author="Revision merge (HM+PL)" w:date="2026-09-09T13:15:15Z">
         <w:r>
           <w:t xml:space="preserve">data</w:t>
         </w:r>
@@ -1867,12 +1867,12 @@
       <w:r>
         <w:t xml:space="preserve"> </w:t>
       </w:r>
-      <w:del w:id="10265" w:author="Revision merge (HM+PL)" w:date="2026-09-09T12:54:58Z">
+      <w:del w:id="10265" w:author="Revision merge (HM+PL)" w:date="2026-09-09T13:15:15Z">
         <w:r>
           <w:delText xml:space="preserve">covers</w:delText>
         </w:r>
       </w:del>
-      <w:ins w:id="10266" w:author="Revision merge (HM+PL)" w:date="2026-09-09T12:54:58Z">
+      <w:ins w:id="10266" w:author="Revision merge (HM+PL)" w:date="2026-09-09T13:15:15Z">
         <w:r>
           <w:t xml:space="preserve">spanning</w:t>
         </w:r>
@@ -1880,12 +1880,12 @@
       <w:r>
         <w:t xml:space="preserve"> </w:t>
       </w:r>
-      <w:del w:id="10267" w:author="Revision merge (HM+PL)" w:date="2026-09-09T12:54:58Z">
+      <w:del w:id="10267" w:author="Revision merge (HM+PL)" w:date="2026-09-09T13:15:15Z">
         <w:r>
           <w:delText xml:space="preserve">taxonomy,</w:delText>
         </w:r>
       </w:del>
-      <w:ins w:id="10268" w:author="Revision merge (HM+PL)" w:date="2026-09-09T12:54:58Z">
+      <w:ins w:id="10268" w:author="Revision merge (HM+PL)" w:date="2026-09-09T13:15:15Z">
         <w:r>
           <w:t xml:space="preserve">taxonomic composition, microbial</w:t>
         </w:r>
@@ -1893,12 +1893,12 @@
       <w:r>
         <w:t xml:space="preserve"> diversity, differential abundance, and </w:t>
       </w:r>
-      <w:del w:id="10269" w:author="Revision merge (HM+PL)" w:date="2026-09-09T12:54:58Z">
+      <w:del w:id="10269" w:author="Revision merge (HM+PL)" w:date="2026-09-09T13:15:15Z">
         <w:r>
           <w:delText xml:space="preserve">full</w:delText>
         </w:r>
       </w:del>
-      <w:ins w:id="10270" w:author="Revision merge (HM+PL)" w:date="2026-09-09T12:54:58Z">
+      <w:ins w:id="10270" w:author="Revision merge (HM+PL)" w:date="2026-09-09T13:15:15Z">
         <w:r>
           <w:t xml:space="preserve">comprehensive</w:t>
         </w:r>
@@ -1911,12 +1911,12 @@
       <w:pPr>
         <w:spacing w:after="120"/>
       </w:pPr>
-      <w:del w:id="10271" w:author="Revision merge (HM+PL)" w:date="2026-09-09T12:54:58Z">
+      <w:del w:id="10271" w:author="Revision merge (HM+PL)" w:date="2026-09-09T13:15:15Z">
         <w:r>
           <w:delText xml:space="preserve">We</w:delText>
         </w:r>
       </w:del>
-      <w:ins w:id="10272" w:author="Revision merge (HM+PL)" w:date="2026-09-09T12:54:58Z">
+      <w:ins w:id="10272" w:author="Revision merge (HM+PL)" w:date="2026-09-09T13:15:15Z">
         <w:r>
           <w:t xml:space="preserve">To</w:t>
         </w:r>
@@ -1924,12 +1924,12 @@
       <w:r>
         <w:t xml:space="preserve"> </w:t>
       </w:r>
-      <w:del w:id="10273" w:author="Revision merge (HM+PL)" w:date="2026-09-09T12:54:58Z">
+      <w:del w:id="10273" w:author="Revision merge (HM+PL)" w:date="2026-09-09T13:15:15Z">
         <w:r>
           <w:delText xml:space="preserve">present</w:delText>
         </w:r>
       </w:del>
-      <w:ins w:id="10274" w:author="Revision merge (HM+PL)" w:date="2026-09-09T12:54:58Z">
+      <w:ins w:id="10274" w:author="Revision merge (HM+PL)" w:date="2026-09-09T13:15:15Z">
         <w:r>
           <w:t xml:space="preserve">address this gap, we have developed</w:t>
         </w:r>
@@ -1937,12 +1937,12 @@
       <w:r>
         <w:t xml:space="preserve"> an alpha-stage R </w:t>
       </w:r>
-      <w:del w:id="10275" w:author="Revision merge (HM+PL)" w:date="2026-09-09T12:54:58Z">
+      <w:del w:id="10275" w:author="Revision merge (HM+PL)" w:date="2026-09-09T13:15:15Z">
         <w:r>
           <w:delText xml:space="preserve">workflow</w:delText>
         </w:r>
       </w:del>
-      <w:ins w:id="10276" w:author="Revision merge (HM+PL)" w:date="2026-09-09T12:54:58Z">
+      <w:ins w:id="10276" w:author="Revision merge (HM+PL)" w:date="2026-09-09T13:15:15Z">
         <w:r>
           <w:t xml:space="preserve">workflow.</w:t>
         </w:r>
@@ -1950,12 +1950,12 @@
       <w:r>
         <w:t xml:space="preserve"> </w:t>
       </w:r>
-      <w:del w:id="10277" w:author="Revision merge (HM+PL)" w:date="2026-09-09T12:54:58Z">
+      <w:del w:id="10277" w:author="Revision merge (HM+PL)" w:date="2026-09-09T13:15:15Z">
         <w:r>
           <w:delText xml:space="preserve">that</w:delText>
         </w:r>
       </w:del>
-      <w:ins w:id="10278" w:author="Revision merge (HM+PL)" w:date="2026-09-09T12:54:58Z">
+      <w:ins w:id="10278" w:author="Revision merge (HM+PL)" w:date="2026-09-09T13:15:15Z">
         <w:r>
           <w:t xml:space="preserve">Here,</w:t>
         </w:r>
@@ -1963,12 +1963,12 @@
       <w:r>
         <w:t xml:space="preserve"> </w:t>
       </w:r>
-      <w:del w:id="10279" w:author="Revision merge (HM+PL)" w:date="2026-09-09T12:54:58Z">
+      <w:del w:id="10279" w:author="Revision merge (HM+PL)" w:date="2026-09-09T13:15:15Z">
         <w:r>
           <w:delText xml:space="preserve">fills</w:delText>
         </w:r>
       </w:del>
-      <w:ins w:id="10280" w:author="Revision merge (HM+PL)" w:date="2026-09-09T12:54:58Z">
+      <w:ins w:id="10280" w:author="Revision merge (HM+PL)" w:date="2026-09-09T13:15:15Z">
         <w:r>
           <w:t xml:space="preserve">we</w:t>
         </w:r>
@@ -1976,12 +1976,12 @@
       <w:r>
         <w:t xml:space="preserve"> </w:t>
       </w:r>
-      <w:del w:id="10281" w:author="Revision merge (HM+PL)" w:date="2026-09-09T12:54:58Z">
+      <w:del w:id="10281" w:author="Revision merge (HM+PL)" w:date="2026-09-09T13:15:15Z">
         <w:r>
           <w:delText xml:space="preserve">this</w:delText>
         </w:r>
       </w:del>
-      <w:ins w:id="10282" w:author="Revision merge (HM+PL)" w:date="2026-09-09T12:54:58Z">
+      <w:ins w:id="10282" w:author="Revision merge (HM+PL)" w:date="2026-09-09T13:15:15Z">
         <w:r>
           <w:t xml:space="preserve">describe</w:t>
         </w:r>
@@ -1989,12 +1989,12 @@
       <w:r>
         <w:t xml:space="preserve"> </w:t>
       </w:r>
-      <w:del w:id="10283" w:author="Revision merge (HM+PL)" w:date="2026-09-09T12:54:58Z">
+      <w:del w:id="10283" w:author="Revision merge (HM+PL)" w:date="2026-09-09T13:15:15Z">
         <w:r>
           <w:delText xml:space="preserve">gap.</w:delText>
         </w:r>
       </w:del>
-      <w:ins w:id="10284" w:author="Revision merge (HM+PL)" w:date="2026-09-09T12:54:58Z">
+      <w:ins w:id="10284" w:author="Revision merge (HM+PL)" w:date="2026-09-09T13:15:15Z">
         <w:r>
           <w:t xml:space="preserve">the</w:t>
         </w:r>
@@ -2002,12 +2002,12 @@
       <w:r>
         <w:t xml:space="preserve"> </w:t>
       </w:r>
-      <w:del w:id="10285" w:author="Revision merge (HM+PL)" w:date="2026-09-09T12:54:58Z">
+      <w:del w:id="10285" w:author="Revision merge (HM+PL)" w:date="2026-09-09T13:15:15Z">
         <w:r>
           <w:delText xml:space="preserve">The tool is in active development; this note describes its</w:delText>
         </w:r>
       </w:del>
-      <w:ins w:id="10286" w:author="Revision merge (HM+PL)" w:date="2026-09-09T12:54:58Z">
+      <w:ins w:id="10286" w:author="Revision merge (HM+PL)" w:date="2026-09-09T13:15:15Z">
         <w:r>
           <w:t xml:space="preserve">workflow's</w:t>
         </w:r>
@@ -2015,12 +2015,12 @@
       <w:r>
         <w:t xml:space="preserve"> design, current scope, and the real-data validation strategy </w:t>
       </w:r>
-      <w:del w:id="10287" w:author="Revision merge (HM+PL)" w:date="2026-09-09T12:54:58Z">
+      <w:del w:id="10287" w:author="Revision merge (HM+PL)" w:date="2026-09-09T13:15:15Z">
         <w:r>
           <w:delText xml:space="preserve">we</w:delText>
         </w:r>
       </w:del>
-      <w:ins w:id="10288" w:author="Revision merge (HM+PL)" w:date="2026-09-09T12:54:58Z">
+      <w:ins w:id="10288" w:author="Revision merge (HM+PL)" w:date="2026-09-09T13:15:15Z">
         <w:r>
           <w:t xml:space="preserve">enabling</w:t>
         </w:r>
@@ -2028,12 +2028,12 @@
       <w:r>
         <w:t xml:space="preserve"> </w:t>
       </w:r>
-      <w:del w:id="10289" w:author="Revision merge (HM+PL)" w:date="2026-09-09T12:54:58Z">
+      <w:del w:id="10289" w:author="Revision merge (HM+PL)" w:date="2026-09-09T13:15:15Z">
         <w:r>
           <w:delText xml:space="preserve">are</w:delText>
         </w:r>
       </w:del>
-      <w:ins w:id="10290" w:author="Revision merge (HM+PL)" w:date="2026-09-09T12:54:58Z">
+      <w:ins w:id="10290" w:author="Revision merge (HM+PL)" w:date="2026-09-09T13:15:15Z">
         <w:r>
           <w:t xml:space="preserve">the</w:t>
         </w:r>
@@ -2041,12 +2041,12 @@
       <w:r>
         <w:t xml:space="preserve"> </w:t>
       </w:r>
-      <w:del w:id="10291" w:author="Revision merge (HM+PL)" w:date="2026-09-09T12:54:58Z">
+      <w:del w:id="10291" w:author="Revision merge (HM+PL)" w:date="2026-09-09T13:15:15Z">
         <w:r>
           <w:delText xml:space="preserve">using</w:delText>
         </w:r>
       </w:del>
-      <w:ins w:id="10292" w:author="Revision merge (HM+PL)" w:date="2026-09-09T12:54:58Z">
+      <w:ins w:id="10292" w:author="Revision merge (HM+PL)" w:date="2026-09-09T13:15:15Z">
         <w:r>
           <w:t xml:space="preserve">assessment</w:t>
         </w:r>
@@ -2054,12 +2054,12 @@
       <w:r>
         <w:t xml:space="preserve"> </w:t>
       </w:r>
-      <w:del w:id="10293" w:author="Revision merge (HM+PL)" w:date="2026-09-09T12:54:58Z">
+      <w:del w:id="10293" w:author="Revision merge (HM+PL)" w:date="2026-09-09T13:15:15Z">
         <w:r>
           <w:delText xml:space="preserve">to</w:delText>
         </w:r>
       </w:del>
-      <w:ins w:id="10294" w:author="Revision merge (HM+PL)" w:date="2026-09-09T12:54:58Z">
+      <w:ins w:id="10294" w:author="Revision merge (HM+PL)" w:date="2026-09-09T13:15:15Z">
         <w:r>
           <w:t xml:space="preserve">of</w:t>
         </w:r>
@@ -2067,12 +2067,12 @@
       <w:r>
         <w:t xml:space="preserve"> </w:t>
       </w:r>
-      <w:del w:id="10295" w:author="Revision merge (HM+PL)" w:date="2026-09-09T12:54:58Z">
+      <w:del w:id="10295" w:author="Revision merge (HM+PL)" w:date="2026-09-09T13:15:15Z">
         <w:r>
           <w:delText xml:space="preserve">harden</w:delText>
         </w:r>
       </w:del>
-      <w:ins w:id="10296" w:author="Revision merge (HM+PL)" w:date="2026-09-09T12:54:58Z">
+      <w:ins w:id="10296" w:author="Revision merge (HM+PL)" w:date="2026-09-09T13:15:15Z">
         <w:r>
           <w:t xml:space="preserve">its</w:t>
         </w:r>
@@ -2080,12 +2080,12 @@
       <w:r>
         <w:t xml:space="preserve"> </w:t>
       </w:r>
-      <w:del w:id="10297" w:author="Revision merge (HM+PL)" w:date="2026-09-09T12:54:58Z">
+      <w:del w:id="10297" w:author="Revision merge (HM+PL)" w:date="2026-09-09T13:15:15Z">
         <w:r>
           <w:delText xml:space="preserve">each stage.</w:delText>
         </w:r>
       </w:del>
-      <w:ins w:id="10298" w:author="Revision merge (HM+PL)" w:date="2026-09-09T12:54:58Z">
+      <w:ins w:id="10298" w:author="Revision merge (HM+PL)" w:date="2026-09-09T13:15:15Z">
         <w:r>
           <w:t xml:space="preserve">performance.</w:t>
         </w:r>
@@ -2113,7 +2113,7 @@
       <w:r>
         <w:t xml:space="preserve">The workflow is</w:t>
       </w:r>
-      <w:ins w:id="10299" w:author="Revision merge (HM+PL)" w:date="2026-09-09T12:54:58Z">
+      <w:ins w:id="10299" w:author="Revision merge (HM+PL)" w:date="2026-09-09T13:15:15Z">
         <w:r>
           <w:t xml:space="preserve"> implemented as</w:t>
         </w:r>
@@ -2121,12 +2121,12 @@
       <w:r>
         <w:t xml:space="preserve"> a stand-alone R project, </w:t>
       </w:r>
-      <w:del w:id="10300" w:author="Revision merge (HM+PL)" w:date="2026-09-09T12:54:58Z">
+      <w:del w:id="10300" w:author="Revision merge (HM+PL)" w:date="2026-09-09T13:15:15Z">
         <w:r>
           <w:delText xml:space="preserve">not</w:delText>
         </w:r>
       </w:del>
-      <w:ins w:id="10301" w:author="Revision merge (HM+PL)" w:date="2026-09-09T12:54:58Z">
+      <w:ins w:id="10301" w:author="Revision merge (HM+PL)" w:date="2026-09-09T13:15:15Z">
         <w:r>
           <w:t xml:space="preserve">rather than</w:t>
         </w:r>
@@ -2134,7 +2134,7 @@
       <w:r>
         <w:t xml:space="preserve"> an installable </w:t>
       </w:r>
-      <w:ins w:id="10302" w:author="Revision merge (HM+PL)" w:date="2026-09-09T12:54:58Z">
+      <w:ins w:id="10302" w:author="Revision merge (HM+PL)" w:date="2026-09-09T13:15:15Z">
         <w:r>
           <w:t xml:space="preserve">software </w:t>
         </w:r>
@@ -2142,12 +2142,12 @@
       <w:r>
         <w:t xml:space="preserve">package. </w:t>
       </w:r>
-      <w:del w:id="10303" w:author="Revision merge (HM+PL)" w:date="2026-09-09T12:54:58Z">
+      <w:del w:id="10303" w:author="Revision merge (HM+PL)" w:date="2026-09-09T13:15:15Z">
         <w:r>
           <w:delText xml:space="preserve">A</w:delText>
         </w:r>
       </w:del>
-      <w:ins w:id="10304" w:author="Revision merge (HM+PL)" w:date="2026-09-09T12:54:58Z">
+      <w:ins w:id="10304" w:author="Revision merge (HM+PL)" w:date="2026-09-09T13:15:15Z">
         <w:r>
           <w:t xml:space="preserve">Execution is initiated through a</w:t>
         </w:r>
@@ -2155,12 +2155,12 @@
       <w:r>
         <w:t xml:space="preserve"> single entry </w:t>
       </w:r>
-      <w:del w:id="10305" w:author="Revision merge (HM+PL)" w:date="2026-09-09T12:54:58Z">
+      <w:del w:id="10305" w:author="Revision merge (HM+PL)" w:date="2026-09-09T13:15:15Z">
         <w:r>
           <w:delText xml:space="preserve">point</w:delText>
         </w:r>
       </w:del>
-      <w:ins w:id="10306" w:author="Revision merge (HM+PL)" w:date="2026-09-09T12:54:58Z">
+      <w:ins w:id="10306" w:author="Revision merge (HM+PL)" w:date="2026-09-09T13:15:15Z">
         <w:r>
           <w:t xml:space="preserve">script</w:t>
         </w:r>
@@ -2168,12 +2168,12 @@
       <w:r>
         <w:t xml:space="preserve"> (`run_pipeline.R`) </w:t>
       </w:r>
-      <w:del w:id="10307" w:author="Revision merge (HM+PL)" w:date="2026-09-09T12:54:58Z">
+      <w:del w:id="10307" w:author="Revision merge (HM+PL)" w:date="2026-09-09T13:15:15Z">
         <w:r>
           <w:delText xml:space="preserve">consumes</w:delText>
         </w:r>
       </w:del>
-      <w:ins w:id="10308" w:author="Revision merge (HM+PL)" w:date="2026-09-09T12:54:58Z">
+      <w:ins w:id="10308" w:author="Revision merge (HM+PL)" w:date="2026-09-09T13:15:15Z">
         <w:r>
           <w:t xml:space="preserve">that reads</w:t>
         </w:r>
@@ -2181,12 +2181,12 @@
       <w:r>
         <w:t xml:space="preserve"> one YAML configuration file </w:t>
       </w:r>
-      <w:del w:id="10309" w:author="Revision merge (HM+PL)" w:date="2026-09-09T12:54:58Z">
+      <w:del w:id="10309" w:author="Revision merge (HM+PL)" w:date="2026-09-09T13:15:15Z">
         <w:r>
           <w:delText xml:space="preserve">per</w:delText>
         </w:r>
       </w:del>
-      <w:ins w:id="10310" w:author="Revision merge (HM+PL)" w:date="2026-09-09T12:54:58Z">
+      <w:ins w:id="10310" w:author="Revision merge (HM+PL)" w:date="2026-09-09T13:15:15Z">
         <w:r>
           <w:t xml:space="preserve">for each</w:t>
         </w:r>
@@ -2194,12 +2194,12 @@
       <w:r>
         <w:t xml:space="preserve"> study and dispatches </w:t>
       </w:r>
-      <w:del w:id="10311" w:author="Revision merge (HM+PL)" w:date="2026-09-09T12:54:58Z">
+      <w:del w:id="10311" w:author="Revision merge (HM+PL)" w:date="2026-09-09T13:15:15Z">
         <w:r>
           <w:delText xml:space="preserve">to</w:delText>
         </w:r>
       </w:del>
-      <w:ins w:id="10312" w:author="Revision merge (HM+PL)" w:date="2026-09-09T12:54:58Z">
+      <w:ins w:id="10312" w:author="Revision merge (HM+PL)" w:date="2026-09-09T13:15:15Z">
         <w:r>
           <w:t xml:space="preserve">the workflow across</w:t>
         </w:r>
@@ -2207,12 +2207,12 @@
       <w:r>
         <w:t xml:space="preserve"> fifteen modules (`R/00_setup.R` through `R/13_panels.R`; plus the manifest stage </w:t>
       </w:r>
-      <w:del w:id="10313" w:author="Revision merge (HM+PL)" w:date="2026-09-09T12:54:58Z">
+      <w:del w:id="10313" w:author="Revision merge (HM+PL)" w:date="2026-09-09T13:15:15Z">
         <w:r>
           <w:delText xml:space="preserve">`R/14`</w:delText>
         </w:r>
       </w:del>
-      <w:ins w:id="10314" w:author="Revision merge (HM+PL)" w:date="2026-09-09T12:54:58Z">
+      <w:ins w:id="10314" w:author="Revision merge (HM+PL)" w:date="2026-09-09T13:15:15Z">
         <w:r>
           <w:t xml:space="preserve">`R/14`,</w:t>
         </w:r>
@@ -2220,12 +2220,12 @@
       <w:r>
         <w:t xml:space="preserve"> which runs </w:t>
       </w:r>
-      <w:del w:id="10315" w:author="Revision merge (HM+PL)" w:date="2026-09-09T12:54:58Z">
+      <w:del w:id="10315" w:author="Revision merge (HM+PL)" w:date="2026-09-09T13:15:15Z">
         <w:r>
           <w:delText xml:space="preserve">last);</w:delText>
         </w:r>
       </w:del>
-      <w:ins w:id="10316" w:author="Revision merge (HM+PL)" w:date="2026-09-09T12:54:58Z">
+      <w:ins w:id="10316" w:author="Revision merge (HM+PL)" w:date="2026-09-09T13:15:15Z">
         <w:r>
           <w:t xml:space="preserve">last).</w:t>
         </w:r>
@@ -2233,12 +2233,12 @@
       <w:r>
         <w:t xml:space="preserve"> </w:t>
       </w:r>
-      <w:del w:id="10317" w:author="Revision merge (HM+PL)" w:date="2026-09-09T12:54:58Z">
+      <w:del w:id="10317" w:author="Revision merge (HM+PL)" w:date="2026-09-09T13:15:15Z">
         <w:r>
           <w:delText xml:space="preserve">a</w:delText>
         </w:r>
       </w:del>
-      <w:ins w:id="10318" w:author="Revision merge (HM+PL)" w:date="2026-09-09T12:54:58Z">
+      <w:ins w:id="10318" w:author="Revision merge (HM+PL)" w:date="2026-09-09T13:15:15Z">
         <w:r>
           <w:t xml:space="preserve">A</w:t>
         </w:r>
@@ -2246,12 +2246,12 @@
       <w:r>
         <w:t xml:space="preserve"> Quarto dashboard template (`templates/report.qmd`) renders all outputs into a single multi-page HTML </w:t>
       </w:r>
-      <w:del w:id="10319" w:author="Revision merge (HM+PL)" w:date="2026-09-09T12:54:58Z">
+      <w:del w:id="10319" w:author="Revision merge (HM+PL)" w:date="2026-09-09T13:15:15Z">
         <w:r>
           <w:delText xml:space="preserve">deliverable,</w:delText>
         </w:r>
       </w:del>
-      <w:ins w:id="10320" w:author="Revision merge (HM+PL)" w:date="2026-09-09T12:54:58Z">
+      <w:ins w:id="10320" w:author="Revision merge (HM+PL)" w:date="2026-09-09T13:15:15Z">
         <w:r>
           <w:t xml:space="preserve">deliverable.</w:t>
         </w:r>
@@ -2259,12 +2259,12 @@
       <w:r>
         <w:t xml:space="preserve"> </w:t>
       </w:r>
-      <w:del w:id="10321" w:author="Revision merge (HM+PL)" w:date="2026-09-09T12:54:58Z">
+      <w:del w:id="10321" w:author="Revision merge (HM+PL)" w:date="2026-09-09T13:15:15Z">
         <w:r>
           <w:delText xml:space="preserve">a</w:delText>
         </w:r>
       </w:del>
-      <w:ins w:id="10322" w:author="Revision merge (HM+PL)" w:date="2026-09-09T12:54:58Z">
+      <w:ins w:id="10322" w:author="Revision merge (HM+PL)" w:date="2026-09-09T13:15:15Z">
         <w:r>
           <w:t xml:space="preserve">A subsequent</w:t>
         </w:r>
@@ -2272,7 +2272,7 @@
       <w:r>
         <w:t xml:space="preserve"> publication-panels stage assembles </w:t>
       </w:r>
-      <w:ins w:id="10323" w:author="Revision merge (HM+PL)" w:date="2026-09-09T12:54:58Z">
+      <w:ins w:id="10323" w:author="Revision merge (HM+PL)" w:date="2026-09-09T13:15:15Z">
         <w:r>
           <w:t xml:space="preserve">publication-ready composite figures for the </w:t>
         </w:r>
@@ -2280,12 +2280,12 @@
       <w:r>
         <w:t xml:space="preserve">main and supplementary </w:t>
       </w:r>
-      <w:del w:id="10324" w:author="Revision merge (HM+PL)" w:date="2026-09-09T12:54:58Z">
+      <w:del w:id="10324" w:author="Revision merge (HM+PL)" w:date="2026-09-09T13:15:15Z">
         <w:r>
           <w:delText xml:space="preserve">composite</w:delText>
         </w:r>
       </w:del>
-      <w:ins w:id="10325" w:author="Revision merge (HM+PL)" w:date="2026-09-09T12:54:58Z">
+      <w:ins w:id="10325" w:author="Revision merge (HM+PL)" w:date="2026-09-09T13:15:15Z">
         <w:r>
           <w:t xml:space="preserve">datasets</w:t>
         </w:r>
@@ -2293,12 +2293,12 @@
       <w:r>
         <w:t xml:space="preserve"> </w:t>
       </w:r>
-      <w:del w:id="10326" w:author="Revision merge (HM+PL)" w:date="2026-09-09T12:54:58Z">
+      <w:del w:id="10326" w:author="Revision merge (HM+PL)" w:date="2026-09-09T13:15:15Z">
         <w:r>
           <w:delText xml:space="preserve">figures</w:delText>
         </w:r>
       </w:del>
-      <w:ins w:id="10327" w:author="Revision merge (HM+PL)" w:date="2026-09-09T12:54:58Z">
+      <w:ins w:id="10327" w:author="Revision merge (HM+PL)" w:date="2026-09-09T13:15:15Z">
         <w:r>
           <w:t xml:space="preserve">and</w:t>
         </w:r>
@@ -2306,12 +2306,12 @@
       <w:r>
         <w:t xml:space="preserve"> </w:t>
       </w:r>
-      <w:del w:id="10328" w:author="Revision merge (HM+PL)" w:date="2026-09-09T12:54:58Z">
+      <w:del w:id="10328" w:author="Revision merge (HM+PL)" w:date="2026-09-09T13:15:15Z">
         <w:r>
           <w:delText xml:space="preserve">plus</w:delText>
         </w:r>
       </w:del>
-      <w:ins w:id="10329" w:author="Revision merge (HM+PL)" w:date="2026-09-09T12:54:58Z">
+      <w:ins w:id="10329" w:author="Revision merge (HM+PL)" w:date="2026-09-09T13:15:15Z">
         <w:r>
           <w:t xml:space="preserve">compiles</w:t>
         </w:r>
@@ -2319,12 +2319,12 @@
       <w:r>
         <w:t xml:space="preserve"> </w:t>
       </w:r>
-      <w:del w:id="10330" w:author="Revision merge (HM+PL)" w:date="2026-09-09T12:54:58Z">
+      <w:del w:id="10330" w:author="Revision merge (HM+PL)" w:date="2026-09-09T13:15:15Z">
         <w:r>
           <w:delText xml:space="preserve">a</w:delText>
         </w:r>
       </w:del>
-      <w:ins w:id="10331" w:author="Revision merge (HM+PL)" w:date="2026-09-09T12:54:58Z">
+      <w:ins w:id="10331" w:author="Revision merge (HM+PL)" w:date="2026-09-09T13:15:15Z">
         <w:r>
           <w:t xml:space="preserve">the accompanying</w:t>
         </w:r>
@@ -2332,12 +2332,12 @@
       <w:r>
         <w:t xml:space="preserve"> supplementary tables </w:t>
       </w:r>
-      <w:del w:id="10332" w:author="Revision merge (HM+PL)" w:date="2026-09-09T12:54:58Z">
+      <w:del w:id="10332" w:author="Revision merge (HM+PL)" w:date="2026-09-09T13:15:15Z">
         <w:r>
           <w:delText xml:space="preserve">workbook,</w:delText>
         </w:r>
       </w:del>
-      <w:ins w:id="10333" w:author="Revision merge (HM+PL)" w:date="2026-09-09T12:54:58Z">
+      <w:ins w:id="10333" w:author="Revision merge (HM+PL)" w:date="2026-09-09T13:15:15Z">
         <w:r>
           <w:t xml:space="preserve">into</w:t>
         </w:r>
@@ -2345,12 +2345,12 @@
       <w:r>
         <w:t xml:space="preserve"> </w:t>
       </w:r>
-      <w:del w:id="10334" w:author="Revision merge (HM+PL)" w:date="2026-09-09T12:54:58Z">
+      <w:del w:id="10334" w:author="Revision merge (HM+PL)" w:date="2026-09-09T13:15:15Z">
         <w:r>
           <w:delText xml:space="preserve">and</w:delText>
         </w:r>
       </w:del>
-      <w:ins w:id="10335" w:author="Revision merge (HM+PL)" w:date="2026-09-09T12:54:58Z">
+      <w:ins w:id="10335" w:author="Revision merge (HM+PL)" w:date="2026-09-09T13:15:15Z">
         <w:r>
           <w:t xml:space="preserve">a workbook. The pipeline concludes with the generation of</w:t>
         </w:r>
@@ -2358,7 +2358,7 @@
       <w:r>
         <w:t xml:space="preserve"> a final </w:t>
       </w:r>
-      <w:del w:id="10336" w:author="Revision merge (HM+PL)" w:date="2026-09-09T12:54:58Z">
+      <w:del w:id="10336" w:author="Revision merge (HM+PL)" w:date="2026-09-09T13:15:15Z">
         <w:r>
           <w:delText xml:space="preserve">manifest stage emits </w:delText>
         </w:r>
@@ -2366,12 +2366,12 @@
       <w:r>
         <w:t xml:space="preserve">`manifest.json` </w:t>
       </w:r>
-      <w:del w:id="10337" w:author="Revision merge (HM+PL)" w:date="2026-09-09T12:54:58Z">
+      <w:del w:id="10337" w:author="Revision merge (HM+PL)" w:date="2026-09-09T13:15:15Z">
         <w:r>
           <w:delText xml:space="preserve">describing</w:delText>
         </w:r>
       </w:del>
-      <w:ins w:id="10338" w:author="Revision merge (HM+PL)" w:date="2026-09-09T12:54:58Z">
+      <w:ins w:id="10338" w:author="Revision merge (HM+PL)" w:date="2026-09-09T13:15:15Z">
         <w:r>
           <w:t xml:space="preserve">file,</w:t>
         </w:r>
@@ -2379,12 +2379,12 @@
       <w:r>
         <w:t xml:space="preserve"> </w:t>
       </w:r>
-      <w:del w:id="10339" w:author="Revision merge (HM+PL)" w:date="2026-09-09T12:54:58Z">
+      <w:del w:id="10339" w:author="Revision merge (HM+PL)" w:date="2026-09-09T13:15:15Z">
         <w:r>
           <w:delText xml:space="preserve">every</w:delText>
         </w:r>
       </w:del>
-      <w:ins w:id="10340" w:author="Revision merge (HM+PL)" w:date="2026-09-09T12:54:58Z">
+      <w:ins w:id="10340" w:author="Revision merge (HM+PL)" w:date="2026-09-09T13:15:15Z">
         <w:r>
           <w:t xml:space="preserve">providing</w:t>
         </w:r>
@@ -2392,12 +2392,12 @@
       <w:r>
         <w:t xml:space="preserve"> </w:t>
       </w:r>
-      <w:del w:id="10341" w:author="Revision merge (HM+PL)" w:date="2026-09-09T12:54:58Z">
+      <w:del w:id="10341" w:author="Revision merge (HM+PL)" w:date="2026-09-09T13:15:15Z">
         <w:r>
           <w:delText xml:space="preserve">artefact</w:delText>
         </w:r>
       </w:del>
-      <w:ins w:id="10342" w:author="Revision merge (HM+PL)" w:date="2026-09-09T12:54:58Z">
+      <w:ins w:id="10342" w:author="Revision merge (HM+PL)" w:date="2026-09-09T13:15:15Z">
         <w:r>
           <w:t xml:space="preserve">a complete record of all artefacts</w:t>
         </w:r>
@@ -2413,12 +2413,12 @@
       <w:r>
         <w:t xml:space="preserve">[FIGURE] **Figure 1.** MERIDIAN workflow. A single `config.yaml` drives fifteen R modules (R/00–R/14) </w:t>
       </w:r>
-      <w:del w:id="10343" w:author="Revision merge (HM+PL)" w:date="2026-09-09T12:54:58Z">
+      <w:del w:id="10343" w:author="Revision merge (HM+PL)" w:date="2026-09-09T13:15:15Z">
         <w:r>
           <w:delText xml:space="preserve">consuming</w:delText>
         </w:r>
       </w:del>
-      <w:ins w:id="10344" w:author="Revision merge (HM+PL)" w:date="2026-09-09T12:54:58Z">
+      <w:ins w:id="10344" w:author="Revision merge (HM+PL)" w:date="2026-09-09T13:15:15Z">
         <w:r>
           <w:t xml:space="preserve">that load</w:t>
         </w:r>
@@ -2434,12 +2434,12 @@
       <w:r>
         <w:t xml:space="preserve">**Configuration-driven.** </w:t>
       </w:r>
-      <w:del w:id="10345" w:author="Revision merge (HM+PL)" w:date="2026-09-09T12:54:58Z">
+      <w:del w:id="10345" w:author="Revision merge (HM+PL)" w:date="2026-09-09T13:15:15Z">
         <w:r>
           <w:delText xml:space="preserve">Everything</w:delText>
         </w:r>
       </w:del>
-      <w:ins w:id="10346" w:author="Revision merge (HM+PL)" w:date="2026-09-09T12:54:58Z">
+      <w:ins w:id="10346" w:author="Revision merge (HM+PL)" w:date="2026-09-09T13:15:15Z">
         <w:r>
           <w:t xml:space="preserve">All</w:t>
         </w:r>
@@ -2447,12 +2447,12 @@
       <w:r>
         <w:t xml:space="preserve"> </w:t>
       </w:r>
-      <w:del w:id="10347" w:author="Revision merge (HM+PL)" w:date="2026-09-09T12:54:58Z">
+      <w:del w:id="10347" w:author="Revision merge (HM+PL)" w:date="2026-09-09T13:15:15Z">
         <w:r>
           <w:delText xml:space="preserve">that</w:delText>
         </w:r>
       </w:del>
-      <w:ins w:id="10348" w:author="Revision merge (HM+PL)" w:date="2026-09-09T12:54:58Z">
+      <w:ins w:id="10348" w:author="Revision merge (HM+PL)" w:date="2026-09-09T13:15:15Z">
         <w:r>
           <w:t xml:space="preserve">study-specific</w:t>
         </w:r>
@@ -2460,12 +2460,12 @@
       <w:r>
         <w:t xml:space="preserve"> </w:t>
       </w:r>
-      <w:del w:id="10349" w:author="Revision merge (HM+PL)" w:date="2026-09-09T12:54:58Z">
+      <w:del w:id="10349" w:author="Revision merge (HM+PL)" w:date="2026-09-09T13:15:15Z">
         <w:r>
           <w:delText xml:space="preserve">varies between studies</w:delText>
         </w:r>
       </w:del>
-      <w:ins w:id="10350" w:author="Revision merge (HM+PL)" w:date="2026-09-09T12:54:58Z">
+      <w:ins w:id="10350" w:author="Revision merge (HM+PL)" w:date="2026-09-09T13:15:15Z">
         <w:r>
           <w:t xml:space="preserve">parameters</w:t>
         </w:r>
@@ -2473,12 +2473,12 @@
       <w:r>
         <w:t xml:space="preserve"> — metadata file </w:t>
       </w:r>
-      <w:del w:id="10351" w:author="Revision merge (HM+PL)" w:date="2026-09-09T12:54:58Z">
+      <w:del w:id="10351" w:author="Revision merge (HM+PL)" w:date="2026-09-09T13:15:15Z">
         <w:r>
           <w:delText xml:space="preserve">path,</w:delText>
         </w:r>
       </w:del>
-      <w:ins w:id="10352" w:author="Revision merge (HM+PL)" w:date="2026-09-09T12:54:58Z">
+      <w:ins w:id="10352" w:author="Revision merge (HM+PL)" w:date="2026-09-09T13:15:15Z">
         <w:r>
           <w:t xml:space="preserve">locations, sample</w:t>
         </w:r>
@@ -2486,12 +2486,12 @@
       <w:r>
         <w:t xml:space="preserve"> grouping </w:t>
       </w:r>
-      <w:del w:id="10353" w:author="Revision merge (HM+PL)" w:date="2026-09-09T12:54:58Z">
+      <w:del w:id="10353" w:author="Revision merge (HM+PL)" w:date="2026-09-09T13:15:15Z">
         <w:r>
           <w:delText xml:space="preserve">columns,</w:delText>
         </w:r>
       </w:del>
-      <w:ins w:id="10354" w:author="Revision merge (HM+PL)" w:date="2026-09-09T12:54:58Z">
+      <w:ins w:id="10354" w:author="Revision merge (HM+PL)" w:date="2026-09-09T13:15:15Z">
         <w:r>
           <w:t xml:space="preserve">variables,</w:t>
         </w:r>
@@ -2499,7 +2499,7 @@
       <w:r>
         <w:t xml:space="preserve"> negative-control identifiers, abundance </w:t>
       </w:r>
-      <w:ins w:id="10355" w:author="Revision merge (HM+PL)" w:date="2026-09-09T12:54:58Z">
+      <w:ins w:id="10355" w:author="Revision merge (HM+PL)" w:date="2026-09-09T13:15:15Z">
         <w:r>
           <w:t xml:space="preserve">filtering </w:t>
         </w:r>
@@ -2507,7 +2507,7 @@
       <w:r>
         <w:t xml:space="preserve">thresholds,</w:t>
       </w:r>
-      <w:ins w:id="10356" w:author="Revision merge (HM+PL)" w:date="2026-09-09T12:54:58Z">
+      <w:ins w:id="10356" w:author="Revision merge (HM+PL)" w:date="2026-09-09T13:15:15Z">
         <w:r>
           <w:t xml:space="preserve"> and</w:t>
         </w:r>
@@ -2515,7 +2515,7 @@
       <w:r>
         <w:t xml:space="preserve"> sample selection </w:t>
       </w:r>
-      <w:ins w:id="10357" w:author="Revision merge (HM+PL)" w:date="2026-09-09T12:54:58Z">
+      <w:ins w:id="10357" w:author="Revision merge (HM+PL)" w:date="2026-09-09T13:15:15Z">
         <w:r>
           <w:t xml:space="preserve">criteria </w:t>
         </w:r>
@@ -2523,12 +2523,12 @@
       <w:r>
         <w:t xml:space="preserve">— </w:t>
       </w:r>
-      <w:del w:id="10358" w:author="Revision merge (HM+PL)" w:date="2026-09-09T12:54:58Z">
+      <w:del w:id="10358" w:author="Revision merge (HM+PL)" w:date="2026-09-09T13:15:15Z">
         <w:r>
           <w:delText xml:space="preserve">is</w:delText>
         </w:r>
       </w:del>
-      <w:ins w:id="10359" w:author="Revision merge (HM+PL)" w:date="2026-09-09T12:54:58Z">
+      <w:ins w:id="10359" w:author="Revision merge (HM+PL)" w:date="2026-09-09T13:15:15Z">
         <w:r>
           <w:t xml:space="preserve">are</w:t>
         </w:r>
@@ -2536,12 +2536,12 @@
       <w:r>
         <w:t xml:space="preserve"> </w:t>
       </w:r>
-      <w:del w:id="10360" w:author="Revision merge (HM+PL)" w:date="2026-09-09T12:54:58Z">
+      <w:del w:id="10360" w:author="Revision merge (HM+PL)" w:date="2026-09-09T13:15:15Z">
         <w:r>
           <w:delText xml:space="preserve">declared</w:delText>
         </w:r>
       </w:del>
-      <w:ins w:id="10361" w:author="Revision merge (HM+PL)" w:date="2026-09-09T12:54:58Z">
+      <w:ins w:id="10361" w:author="Revision merge (HM+PL)" w:date="2026-09-09T13:15:15Z">
         <w:r>
           <w:t xml:space="preserve">defined</w:t>
         </w:r>
@@ -2549,12 +2549,12 @@
       <w:r>
         <w:t xml:space="preserve"> in `config.yaml`. </w:t>
       </w:r>
-      <w:del w:id="10362" w:author="Revision merge (HM+PL)" w:date="2026-09-09T12:54:58Z">
+      <w:del w:id="10362" w:author="Revision merge (HM+PL)" w:date="2026-09-09T13:15:15Z">
         <w:r>
           <w:delText xml:space="preserve">Module</w:delText>
         </w:r>
       </w:del>
-      <w:ins w:id="10363" w:author="Revision merge (HM+PL)" w:date="2026-09-09T12:54:58Z">
+      <w:ins w:id="10363" w:author="Revision merge (HM+PL)" w:date="2026-09-09T13:15:15Z">
         <w:r>
           <w:t xml:space="preserve">Consequently, module</w:t>
         </w:r>
@@ -2562,12 +2562,12 @@
       <w:r>
         <w:t xml:space="preserve"> code </w:t>
       </w:r>
-      <w:del w:id="10364" w:author="Revision merge (HM+PL)" w:date="2026-09-09T12:54:58Z">
+      <w:del w:id="10364" w:author="Revision merge (HM+PL)" w:date="2026-09-09T13:15:15Z">
         <w:r>
           <w:delText xml:space="preserve">is</w:delText>
         </w:r>
       </w:del>
-      <w:ins w:id="10365" w:author="Revision merge (HM+PL)" w:date="2026-09-09T12:54:58Z">
+      <w:ins w:id="10365" w:author="Revision merge (HM+PL)" w:date="2026-09-09T13:15:15Z">
         <w:r>
           <w:t xml:space="preserve">remains</w:t>
         </w:r>
@@ -2575,12 +2575,12 @@
       <w:r>
         <w:t xml:space="preserve"> </w:t>
       </w:r>
-      <w:del w:id="10366" w:author="Revision merge (HM+PL)" w:date="2026-09-09T12:54:58Z">
+      <w:del w:id="10366" w:author="Revision merge (HM+PL)" w:date="2026-09-09T13:15:15Z">
         <w:r>
           <w:delText xml:space="preserve">not</w:delText>
         </w:r>
       </w:del>
-      <w:ins w:id="10367" w:author="Revision merge (HM+PL)" w:date="2026-09-09T12:54:58Z">
+      <w:ins w:id="10367" w:author="Revision merge (HM+PL)" w:date="2026-09-09T13:15:15Z">
         <w:r>
           <w:t xml:space="preserve">invariant</w:t>
         </w:r>
@@ -2588,12 +2588,12 @@
       <w:r>
         <w:t xml:space="preserve"> </w:t>
       </w:r>
-      <w:del w:id="10368" w:author="Revision merge (HM+PL)" w:date="2026-09-09T12:54:58Z">
+      <w:del w:id="10368" w:author="Revision merge (HM+PL)" w:date="2026-09-09T13:15:15Z">
         <w:r>
           <w:delText xml:space="preserve">edited</w:delText>
         </w:r>
       </w:del>
-      <w:ins w:id="10369" w:author="Revision merge (HM+PL)" w:date="2026-09-09T12:54:58Z">
+      <w:ins w:id="10369" w:author="Revision merge (HM+PL)" w:date="2026-09-09T13:15:15Z">
         <w:r>
           <w:t xml:space="preserve">across</w:t>
         </w:r>
@@ -2601,12 +2601,12 @@
       <w:r>
         <w:t xml:space="preserve"> </w:t>
       </w:r>
-      <w:del w:id="10370" w:author="Revision merge (HM+PL)" w:date="2026-09-09T12:54:58Z">
+      <w:del w:id="10370" w:author="Revision merge (HM+PL)" w:date="2026-09-09T13:15:15Z">
         <w:r>
           <w:delText xml:space="preserve">per-project;</w:delText>
         </w:r>
       </w:del>
-      <w:ins w:id="10371" w:author="Revision merge (HM+PL)" w:date="2026-09-09T12:54:58Z">
+      <w:ins w:id="10371" w:author="Revision merge (HM+PL)" w:date="2026-09-09T13:15:15Z">
         <w:r>
           <w:t xml:space="preserve">projects, with</w:t>
         </w:r>
@@ -2614,12 +2614,12 @@
       <w:r>
         <w:t xml:space="preserve"> dataset-specific </w:t>
       </w:r>
-      <w:del w:id="10372" w:author="Revision merge (HM+PL)" w:date="2026-09-09T12:54:58Z">
+      <w:del w:id="10372" w:author="Revision merge (HM+PL)" w:date="2026-09-09T13:15:15Z">
         <w:r>
           <w:delText xml:space="preserve">adjustments</w:delText>
         </w:r>
       </w:del>
-      <w:ins w:id="10373" w:author="Revision merge (HM+PL)" w:date="2026-09-09T12:54:58Z">
+      <w:ins w:id="10373" w:author="Revision merge (HM+PL)" w:date="2026-09-09T13:15:15Z">
         <w:r>
           <w:t xml:space="preserve">customisation</w:t>
         </w:r>
@@ -2627,12 +2627,12 @@
       <w:r>
         <w:t xml:space="preserve"> </w:t>
       </w:r>
-      <w:del w:id="10374" w:author="Revision merge (HM+PL)" w:date="2026-09-09T12:54:58Z">
+      <w:del w:id="10374" w:author="Revision merge (HM+PL)" w:date="2026-09-09T13:15:15Z">
         <w:r>
           <w:delText xml:space="preserve">live</w:delText>
         </w:r>
       </w:del>
-      <w:ins w:id="10375" w:author="Revision merge (HM+PL)" w:date="2026-09-09T12:54:58Z">
+      <w:ins w:id="10375" w:author="Revision merge (HM+PL)" w:date="2026-09-09T13:15:15Z">
         <w:r>
           <w:t xml:space="preserve">implemented</w:t>
         </w:r>
@@ -2640,12 +2640,12 @@
       <w:r>
         <w:t xml:space="preserve"> </w:t>
       </w:r>
-      <w:del w:id="10376" w:author="Revision merge (HM+PL)" w:date="2026-09-09T12:54:58Z">
+      <w:del w:id="10376" w:author="Revision merge (HM+PL)" w:date="2026-09-09T13:15:15Z">
         <w:r>
           <w:delText xml:space="preserve">in</w:delText>
         </w:r>
       </w:del>
-      <w:ins w:id="10377" w:author="Revision merge (HM+PL)" w:date="2026-09-09T12:54:58Z">
+      <w:ins w:id="10377" w:author="Revision merge (HM+PL)" w:date="2026-09-09T13:15:15Z">
         <w:r>
           <w:t xml:space="preserve">exclusively through</w:t>
         </w:r>
@@ -2653,7 +2653,7 @@
       <w:r>
         <w:t xml:space="preserve"> `config.yaml` </w:t>
       </w:r>
-      <w:ins w:id="10378" w:author="Revision merge (HM+PL)" w:date="2026-09-09T12:54:58Z">
+      <w:ins w:id="10378" w:author="Revision merge (HM+PL)" w:date="2026-09-09T13:15:15Z">
         <w:r>
           <w:t xml:space="preserve">settings </w:t>
         </w:r>
@@ -2661,7 +2661,7 @@
       <w:r>
         <w:t xml:space="preserve">or</w:t>
       </w:r>
-      <w:del w:id="10379" w:author="Revision merge (HM+PL)" w:date="2026-09-09T12:54:58Z">
+      <w:del w:id="10379" w:author="Revision merge (HM+PL)" w:date="2026-09-09T13:15:15Z">
         <w:r>
           <w:delText xml:space="preserve"> in</w:delText>
         </w:r>
@@ -2669,12 +2669,12 @@
       <w:r>
         <w:t xml:space="preserve"> the structured fix tables it references. R/00 (setup) and R/01 (input loading) </w:t>
       </w:r>
-      <w:del w:id="10380" w:author="Revision merge (HM+PL)" w:date="2026-09-09T12:54:58Z">
+      <w:del w:id="10380" w:author="Revision merge (HM+PL)" w:date="2026-09-09T13:15:15Z">
         <w:r>
           <w:delText xml:space="preserve">run</w:delText>
         </w:r>
       </w:del>
-      <w:ins w:id="10381" w:author="Revision merge (HM+PL)" w:date="2026-09-09T12:54:58Z">
+      <w:ins w:id="10381" w:author="Revision merge (HM+PL)" w:date="2026-09-09T13:15:15Z">
         <w:r>
           <w:t xml:space="preserve">are executed</w:t>
         </w:r>
@@ -2682,12 +2682,12 @@
       <w:r>
         <w:t xml:space="preserve"> by </w:t>
       </w:r>
-      <w:del w:id="10382" w:author="Revision merge (HM+PL)" w:date="2026-09-09T12:54:58Z">
+      <w:del w:id="10382" w:author="Revision merge (HM+PL)" w:date="2026-09-09T13:15:15Z">
         <w:r>
           <w:delText xml:space="preserve">default;</w:delText>
         </w:r>
       </w:del>
-      <w:ins w:id="10383" w:author="Revision merge (HM+PL)" w:date="2026-09-09T12:54:58Z">
+      <w:ins w:id="10383" w:author="Revision merge (HM+PL)" w:date="2026-09-09T13:15:15Z">
         <w:r>
           <w:t xml:space="preserve">default,</w:t>
         </w:r>
@@ -2695,12 +2695,12 @@
       <w:r>
         <w:t xml:space="preserve"> </w:t>
       </w:r>
-      <w:del w:id="10384" w:author="Revision merge (HM+PL)" w:date="2026-09-09T12:54:58Z">
+      <w:del w:id="10384" w:author="Revision merge (HM+PL)" w:date="2026-09-09T13:15:15Z">
         <w:r>
           <w:delText xml:space="preserve">every</w:delText>
         </w:r>
       </w:del>
-      <w:ins w:id="10385" w:author="Revision merge (HM+PL)" w:date="2026-09-09T12:54:58Z">
+      <w:ins w:id="10385" w:author="Revision merge (HM+PL)" w:date="2026-09-09T13:15:15Z">
         <w:r>
           <w:t xml:space="preserve">whereas</w:t>
         </w:r>
@@ -2708,12 +2708,12 @@
       <w:r>
         <w:t xml:space="preserve"> </w:t>
       </w:r>
-      <w:del w:id="10386" w:author="Revision merge (HM+PL)" w:date="2026-09-09T12:54:58Z">
+      <w:del w:id="10386" w:author="Revision merge (HM+PL)" w:date="2026-09-09T13:15:15Z">
         <w:r>
           <w:delText xml:space="preserve">subsequent</w:delText>
         </w:r>
       </w:del>
-      <w:ins w:id="10387" w:author="Revision merge (HM+PL)" w:date="2026-09-09T12:54:58Z">
+      <w:ins w:id="10387" w:author="Revision merge (HM+PL)" w:date="2026-09-09T13:15:15Z">
         <w:r>
           <w:t xml:space="preserve">all</w:t>
         </w:r>
@@ -2721,12 +2721,12 @@
       <w:r>
         <w:t xml:space="preserve"> </w:t>
       </w:r>
-      <w:del w:id="10388" w:author="Revision merge (HM+PL)" w:date="2026-09-09T12:54:58Z">
+      <w:del w:id="10388" w:author="Revision merge (HM+PL)" w:date="2026-09-09T13:15:15Z">
         <w:r>
           <w:delText xml:space="preserve">stage</w:delText>
         </w:r>
       </w:del>
-      <w:ins w:id="10389" w:author="Revision merge (HM+PL)" w:date="2026-09-09T12:54:58Z">
+      <w:ins w:id="10389" w:author="Revision merge (HM+PL)" w:date="2026-09-09T13:15:15Z">
         <w:r>
           <w:t xml:space="preserve">downstream modules</w:t>
         </w:r>
@@ -2734,12 +2734,12 @@
       <w:r>
         <w:t xml:space="preserve"> can be </w:t>
       </w:r>
-      <w:del w:id="10390" w:author="Revision merge (HM+PL)" w:date="2026-09-09T12:54:58Z">
+      <w:del w:id="10390" w:author="Revision merge (HM+PL)" w:date="2026-09-09T13:15:15Z">
         <w:r>
           <w:delText xml:space="preserve">toggled</w:delText>
         </w:r>
       </w:del>
-      <w:ins w:id="10391" w:author="Revision merge (HM+PL)" w:date="2026-09-09T12:54:58Z">
+      <w:ins w:id="10391" w:author="Revision merge (HM+PL)" w:date="2026-09-09T13:15:15Z">
         <w:r>
           <w:t xml:space="preserve">selectively enabled or disabled</w:t>
         </w:r>
@@ -2747,12 +2747,12 @@
       <w:r>
         <w:t xml:space="preserve"> via `cfg$stages$*` </w:t>
       </w:r>
-      <w:del w:id="10392" w:author="Revision merge (HM+PL)" w:date="2026-09-09T12:54:58Z">
+      <w:del w:id="10392" w:author="Revision merge (HM+PL)" w:date="2026-09-09T13:15:15Z">
         <w:r>
           <w:delText xml:space="preserve">flags,</w:delText>
         </w:r>
       </w:del>
-      <w:ins w:id="10393" w:author="Revision merge (HM+PL)" w:date="2026-09-09T12:54:58Z">
+      <w:ins w:id="10393" w:author="Revision merge (HM+PL)" w:date="2026-09-09T13:15:15Z">
         <w:r>
           <w:t xml:space="preserve">flags;</w:t>
         </w:r>
@@ -2760,12 +2760,12 @@
       <w:r>
         <w:t xml:space="preserve"> </w:t>
       </w:r>
-      <w:del w:id="10394" w:author="Revision merge (HM+PL)" w:date="2026-09-09T12:54:58Z">
+      <w:del w:id="10394" w:author="Revision merge (HM+PL)" w:date="2026-09-09T13:15:15Z">
         <w:r>
           <w:delText xml:space="preserve">e.g,</w:delText>
         </w:r>
       </w:del>
-      <w:ins w:id="10395" w:author="Revision merge (HM+PL)" w:date="2026-09-09T12:54:58Z">
+      <w:ins w:id="10395" w:author="Revision merge (HM+PL)" w:date="2026-09-09T13:15:15Z">
         <w:r>
           <w:t xml:space="preserve">for example,</w:t>
         </w:r>
@@ -2773,12 +2773,12 @@
       <w:r>
         <w:t xml:space="preserve"> users can re-run only the resistome modules after revising thresholds. TPM normalisation (R/03) and all gene-element stages (R/09–R/11) </w:t>
       </w:r>
-      <w:del w:id="10396" w:author="Revision merge (HM+PL)" w:date="2026-09-09T12:54:58Z">
+      <w:del w:id="10396" w:author="Revision merge (HM+PL)" w:date="2026-09-09T13:15:15Z">
         <w:r>
           <w:delText xml:space="preserve">require</w:delText>
         </w:r>
       </w:del>
-      <w:ins w:id="10397" w:author="Revision merge (HM+PL)" w:date="2026-09-09T12:54:58Z">
+      <w:ins w:id="10397" w:author="Revision merge (HM+PL)" w:date="2026-09-09T13:15:15Z">
         <w:r>
           <w:t xml:space="preserve">are contingent upon</w:t>
         </w:r>
@@ -2786,12 +2786,12 @@
       <w:r>
         <w:t xml:space="preserve"> ABRicate outputs and are </w:t>
       </w:r>
-      <w:del w:id="10398" w:author="Revision merge (HM+PL)" w:date="2026-09-09T12:54:58Z">
+      <w:del w:id="10398" w:author="Revision merge (HM+PL)" w:date="2026-09-09T13:15:15Z">
         <w:r>
           <w:delText xml:space="preserve">skipped</w:delText>
         </w:r>
       </w:del>
-      <w:ins w:id="10399" w:author="Revision merge (HM+PL)" w:date="2026-09-09T12:54:58Z">
+      <w:ins w:id="10399" w:author="Revision merge (HM+PL)" w:date="2026-09-09T13:15:15Z">
         <w:r>
           <w:t xml:space="preserve">automatically</w:t>
         </w:r>
@@ -2799,12 +2799,12 @@
       <w:r>
         <w:t xml:space="preserve"> </w:t>
       </w:r>
-      <w:del w:id="10400" w:author="Revision merge (HM+PL)" w:date="2026-09-09T12:54:58Z">
+      <w:del w:id="10400" w:author="Revision merge (HM+PL)" w:date="2026-09-09T13:15:15Z">
         <w:r>
           <w:delText xml:space="preserve">otherwise.</w:delText>
         </w:r>
       </w:del>
-      <w:ins w:id="10401" w:author="Revision merge (HM+PL)" w:date="2026-09-09T12:54:58Z">
+      <w:ins w:id="10401" w:author="Revision merge (HM+PL)" w:date="2026-09-09T13:15:15Z">
         <w:r>
           <w:t xml:space="preserve">omitted</w:t>
         </w:r>
@@ -2812,12 +2812,12 @@
       <w:r>
         <w:t xml:space="preserve"> </w:t>
       </w:r>
-      <w:del w:id="10402" w:author="Revision merge (HM+PL)" w:date="2026-09-09T12:54:58Z">
+      <w:del w:id="10402" w:author="Revision merge (HM+PL)" w:date="2026-09-09T13:15:15Z">
         <w:r>
           <w:delText xml:space="preserve">Per-study</w:delText>
         </w:r>
       </w:del>
-      <w:ins w:id="10403" w:author="Revision merge (HM+PL)" w:date="2026-09-09T12:54:58Z">
+      <w:ins w:id="10403" w:author="Revision merge (HM+PL)" w:date="2026-09-09T13:15:15Z">
         <w:r>
           <w:t xml:space="preserve">when such inputs are absent. Study-specific corrections to</w:t>
         </w:r>
@@ -2825,12 +2825,12 @@
       <w:r>
         <w:t xml:space="preserve"> NCBI taxonomy </w:t>
       </w:r>
-      <w:del w:id="10404" w:author="Revision merge (HM+PL)" w:date="2026-09-09T12:54:58Z">
+      <w:del w:id="10404" w:author="Revision merge (HM+PL)" w:date="2026-09-09T13:15:15Z">
         <w:r>
           <w:delText xml:space="preserve">fixes,</w:delText>
         </w:r>
       </w:del>
-      <w:ins w:id="10405" w:author="Revision merge (HM+PL)" w:date="2026-09-09T12:54:58Z">
+      <w:ins w:id="10405" w:author="Revision merge (HM+PL)" w:date="2026-09-09T13:15:15Z">
         <w:r>
           <w:t xml:space="preserve">assignments,</w:t>
         </w:r>
@@ -2838,12 +2838,12 @@
       <w:r>
         <w:t xml:space="preserve"> </w:t>
       </w:r>
-      <w:del w:id="10406" w:author="Revision merge (HM+PL)" w:date="2026-09-09T12:54:58Z">
+      <w:del w:id="10406" w:author="Revision merge (HM+PL)" w:date="2026-09-09T13:15:15Z">
         <w:r>
           <w:delText xml:space="preserve">when</w:delText>
         </w:r>
       </w:del>
-      <w:ins w:id="10407" w:author="Revision merge (HM+PL)" w:date="2026-09-09T12:54:58Z">
+      <w:ins w:id="10407" w:author="Revision merge (HM+PL)" w:date="2026-09-09T13:15:15Z">
         <w:r>
           <w:t xml:space="preserve">where</w:t>
         </w:r>
@@ -2851,12 +2851,12 @@
       <w:r>
         <w:t xml:space="preserve"> </w:t>
       </w:r>
-      <w:del w:id="10408" w:author="Revision merge (HM+PL)" w:date="2026-09-09T12:54:58Z">
+      <w:del w:id="10408" w:author="Revision merge (HM+PL)" w:date="2026-09-09T13:15:15Z">
         <w:r>
           <w:delText xml:space="preserve">needed,</w:delText>
         </w:r>
       </w:del>
-      <w:ins w:id="10409" w:author="Revision merge (HM+PL)" w:date="2026-09-09T12:54:58Z">
+      <w:ins w:id="10409" w:author="Revision merge (HM+PL)" w:date="2026-09-09T13:15:15Z">
         <w:r>
           <w:t xml:space="preserve">required,</w:t>
         </w:r>
@@ -2864,12 +2864,12 @@
       <w:r>
         <w:t xml:space="preserve"> are </w:t>
       </w:r>
-      <w:del w:id="10410" w:author="Revision merge (HM+PL)" w:date="2026-09-09T12:54:58Z">
+      <w:del w:id="10410" w:author="Revision merge (HM+PL)" w:date="2026-09-09T13:15:15Z">
         <w:r>
           <w:delText xml:space="preserve">declared</w:delText>
         </w:r>
       </w:del>
-      <w:ins w:id="10411" w:author="Revision merge (HM+PL)" w:date="2026-09-09T12:54:58Z">
+      <w:ins w:id="10411" w:author="Revision merge (HM+PL)" w:date="2026-09-09T13:15:15Z">
         <w:r>
           <w:t xml:space="preserve">encoded</w:t>
         </w:r>
@@ -2877,7 +2877,7 @@
       <w:r>
         <w:t xml:space="preserve"> in a structured `taxid_fixes.csv` </w:t>
       </w:r>
-      <w:ins w:id="10412" w:author="Revision merge (HM+PL)" w:date="2026-09-09T12:54:58Z">
+      <w:ins w:id="10412" w:author="Revision merge (HM+PL)" w:date="2026-09-09T13:15:15Z">
         <w:r>
           <w:t xml:space="preserve">table </w:t>
         </w:r>
@@ -2885,7 +2885,7 @@
       <w:r>
         <w:t xml:space="preserve">rather than</w:t>
       </w:r>
-      <w:ins w:id="10413" w:author="Revision merge (HM+PL)" w:date="2026-09-09T12:54:58Z">
+      <w:ins w:id="10413" w:author="Revision merge (HM+PL)" w:date="2026-09-09T13:15:15Z">
         <w:r>
           <w:t xml:space="preserve"> implemented</w:t>
         </w:r>
@@ -2893,12 +2893,12 @@
       <w:r>
         <w:t xml:space="preserve"> as row-index edits. </w:t>
       </w:r>
-      <w:del w:id="10414" w:author="Revision merge (HM+PL)" w:date="2026-09-09T12:54:58Z">
+      <w:del w:id="10414" w:author="Revision merge (HM+PL)" w:date="2026-09-09T13:15:15Z">
         <w:r>
           <w:delText xml:space="preserve">A</w:delText>
         </w:r>
       </w:del>
-      <w:ins w:id="10415" w:author="Revision merge (HM+PL)" w:date="2026-09-09T12:54:58Z">
+      <w:ins w:id="10415" w:author="Revision merge (HM+PL)" w:date="2026-09-09T13:15:15Z">
         <w:r>
           <w:t xml:space="preserve">Multiple-testing</w:t>
         </w:r>
@@ -2906,12 +2906,12 @@
       <w:r>
         <w:t xml:space="preserve"> </w:t>
       </w:r>
-      <w:del w:id="10416" w:author="Revision merge (HM+PL)" w:date="2026-09-09T12:54:58Z">
+      <w:del w:id="10416" w:author="Revision merge (HM+PL)" w:date="2026-09-09T13:15:15Z">
         <w:r>
           <w:delText xml:space="preserve">single</w:delText>
         </w:r>
       </w:del>
-      <w:ins w:id="10417" w:author="Revision merge (HM+PL)" w:date="2026-09-09T12:54:58Z">
+      <w:ins w:id="10417" w:author="Revision merge (HM+PL)" w:date="2026-09-09T13:15:15Z">
         <w:r>
           <w:t xml:space="preserve">correction is controlled through the</w:t>
         </w:r>
@@ -2919,12 +2919,12 @@
       <w:r>
         <w:t xml:space="preserve"> `cfg$stats$padjust_method` </w:t>
       </w:r>
-      <w:del w:id="10418" w:author="Revision merge (HM+PL)" w:date="2026-09-09T12:54:58Z">
+      <w:del w:id="10418" w:author="Revision merge (HM+PL)" w:date="2026-09-09T13:15:15Z">
         <w:r>
           <w:delText xml:space="preserve">knob</w:delText>
         </w:r>
       </w:del>
-      <w:ins w:id="10419" w:author="Revision merge (HM+PL)" w:date="2026-09-09T12:54:58Z">
+      <w:ins w:id="10419" w:author="Revision merge (HM+PL)" w:date="2026-09-09T13:15:15Z">
         <w:r>
           <w:t xml:space="preserve">parameter,</w:t>
         </w:r>
@@ -2932,12 +2932,12 @@
       <w:r>
         <w:t xml:space="preserve"> </w:t>
       </w:r>
-      <w:del w:id="10420" w:author="Revision merge (HM+PL)" w:date="2026-09-09T12:54:58Z">
+      <w:del w:id="10420" w:author="Revision merge (HM+PL)" w:date="2026-09-09T13:15:15Z">
         <w:r>
           <w:delText xml:space="preserve">(Benjamini-Hochberg</w:delText>
         </w:r>
       </w:del>
-      <w:ins w:id="10421" w:author="Revision merge (HM+PL)" w:date="2026-09-09T12:54:58Z">
+      <w:ins w:id="10421" w:author="Revision merge (HM+PL)" w:date="2026-09-09T13:15:15Z">
         <w:r>
           <w:t xml:space="preserve">ensuring consistent application of the selected adjustment throughout the pipeline. The Benjamini-Hochberg false discovery rate</w:t>
         </w:r>
@@ -2945,12 +2945,12 @@
       <w:r>
         <w:t xml:space="preserve"> is used by </w:t>
       </w:r>
-      <w:del w:id="10422" w:author="Revision merge (HM+PL)" w:date="2026-09-09T12:54:58Z">
+      <w:del w:id="10422" w:author="Revision merge (HM+PL)" w:date="2026-09-09T13:15:15Z">
         <w:r>
           <w:delText xml:space="preserve">default;</w:delText>
         </w:r>
       </w:del>
-      <w:ins w:id="10423" w:author="Revision merge (HM+PL)" w:date="2026-09-09T12:54:58Z">
+      <w:ins w:id="10423" w:author="Revision merge (HM+PL)" w:date="2026-09-09T13:15:15Z">
         <w:r>
           <w:t xml:space="preserve">default,</w:t>
         </w:r>
@@ -2958,12 +2958,12 @@
       <w:r>
         <w:t xml:space="preserve"> </w:t>
       </w:r>
-      <w:del w:id="10424" w:author="Revision merge (HM+PL)" w:date="2026-09-09T12:54:58Z">
+      <w:del w:id="10424" w:author="Revision merge (HM+PL)" w:date="2026-09-09T13:15:15Z">
         <w:r>
           <w:delText xml:space="preserve">full</w:delText>
         </w:r>
       </w:del>
-      <w:ins w:id="10425" w:author="Revision merge (HM+PL)" w:date="2026-09-09T12:54:58Z">
+      <w:ins w:id="10425" w:author="Revision merge (HM+PL)" w:date="2026-09-09T13:15:15Z">
         <w:r>
           <w:t xml:space="preserve">although</w:t>
         </w:r>
@@ -2971,12 +2971,12 @@
       <w:r>
         <w:t xml:space="preserve"> </w:t>
       </w:r>
-      <w:del w:id="10426" w:author="Revision merge (HM+PL)" w:date="2026-09-09T12:54:58Z">
+      <w:del w:id="10426" w:author="Revision merge (HM+PL)" w:date="2026-09-09T13:15:15Z">
         <w:r>
           <w:delText xml:space="preserve">list</w:delText>
         </w:r>
       </w:del>
-      <w:ins w:id="10427" w:author="Revision merge (HM+PL)" w:date="2026-09-09T12:54:58Z">
+      <w:ins w:id="10427" w:author="Revision merge (HM+PL)" w:date="2026-09-09T13:15:15Z">
         <w:r>
           <w:t xml:space="preserve">alternative correction methods are supported and documented</w:t>
         </w:r>
@@ -2984,12 +2984,12 @@
       <w:r>
         <w:t xml:space="preserve"> in </w:t>
       </w:r>
-      <w:del w:id="10428" w:author="Revision merge (HM+PL)" w:date="2026-09-09T12:54:58Z">
+      <w:del w:id="10428" w:author="Revision merge (HM+PL)" w:date="2026-09-09T13:15:15Z">
         <w:r>
           <w:delText xml:space="preserve">`docs/STATISTICS.md`) routes every multiple-testing correction across the pipeline.</w:delText>
         </w:r>
       </w:del>
-      <w:ins w:id="10429" w:author="Revision merge (HM+PL)" w:date="2026-09-09T12:54:58Z">
+      <w:ins w:id="10429" w:author="Revision merge (HM+PL)" w:date="2026-09-09T13:15:15Z">
         <w:r>
           <w:t xml:space="preserve">`docs/STATISTICS.md`.</w:t>
         </w:r>
@@ -3002,12 +3002,12 @@
       <w:r>
         <w:t xml:space="preserve">**Stages.** The pipeline </w:t>
       </w:r>
-      <w:del w:id="10430" w:author="Revision merge (HM+PL)" w:date="2026-09-09T12:54:58Z">
+      <w:del w:id="10430" w:author="Revision merge (HM+PL)" w:date="2026-09-09T13:15:15Z">
         <w:r>
           <w:delText xml:space="preserve">organises</w:delText>
         </w:r>
       </w:del>
-      <w:ins w:id="10431" w:author="Revision merge (HM+PL)" w:date="2026-09-09T12:54:58Z">
+      <w:ins w:id="10431" w:author="Revision merge (HM+PL)" w:date="2026-09-09T13:15:15Z">
         <w:r>
           <w:t xml:space="preserve">is</w:t>
         </w:r>
@@ -3015,12 +3015,12 @@
       <w:r>
         <w:t xml:space="preserve"> </w:t>
       </w:r>
-      <w:del w:id="10432" w:author="Revision merge (HM+PL)" w:date="2026-09-09T12:54:58Z">
+      <w:del w:id="10432" w:author="Revision merge (HM+PL)" w:date="2026-09-09T13:15:15Z">
         <w:r>
           <w:delText xml:space="preserve">its work</w:delText>
         </w:r>
       </w:del>
-      <w:ins w:id="10433" w:author="Revision merge (HM+PL)" w:date="2026-09-09T12:54:58Z">
+      <w:ins w:id="10433" w:author="Revision merge (HM+PL)" w:date="2026-09-09T13:15:15Z">
         <w:r>
           <w:t xml:space="preserve">organised</w:t>
         </w:r>
@@ -3028,12 +3028,12 @@
       <w:r>
         <w:t xml:space="preserve"> into five conceptual </w:t>
       </w:r>
-      <w:del w:id="10434" w:author="Revision merge (HM+PL)" w:date="2026-09-09T12:54:58Z">
+      <w:del w:id="10434" w:author="Revision merge (HM+PL)" w:date="2026-09-09T13:15:15Z">
         <w:r>
           <w:delText xml:space="preserve">blocks.</w:delText>
         </w:r>
       </w:del>
-      <w:ins w:id="10435" w:author="Revision merge (HM+PL)" w:date="2026-09-09T12:54:58Z">
+      <w:ins w:id="10435" w:author="Revision merge (HM+PL)" w:date="2026-09-09T13:15:15Z">
         <w:r>
           <w:t xml:space="preserve">stages.</w:t>
         </w:r>
@@ -3046,12 +3046,12 @@
       <w:r>
         <w:t xml:space="preserve">(1) </w:t>
       </w:r>
-      <w:del w:id="10436" w:author="Revision merge (HM+PL)" w:date="2026-09-09T12:54:58Z">
+      <w:del w:id="10436" w:author="Revision merge (HM+PL)" w:date="2026-09-09T13:15:15Z">
         <w:r>
           <w:delText xml:space="preserve">*Ingest</w:delText>
         </w:r>
       </w:del>
-      <w:ins w:id="10437" w:author="Revision merge (HM+PL)" w:date="2026-09-09T12:54:58Z">
+      <w:ins w:id="10437" w:author="Revision merge (HM+PL)" w:date="2026-09-09T13:15:15Z">
         <w:r>
           <w:t xml:space="preserve">*Data input</w:t>
         </w:r>
@@ -3059,12 +3059,12 @@
       <w:r>
         <w:t xml:space="preserve"> and </w:t>
       </w:r>
-      <w:del w:id="10438" w:author="Revision merge (HM+PL)" w:date="2026-09-09T12:54:58Z">
+      <w:del w:id="10438" w:author="Revision merge (HM+PL)" w:date="2026-09-09T13:15:15Z">
         <w:r>
           <w:delText xml:space="preserve">cleaning*</w:delText>
         </w:r>
       </w:del>
-      <w:ins w:id="10439" w:author="Revision merge (HM+PL)" w:date="2026-09-09T12:54:58Z">
+      <w:ins w:id="10439" w:author="Revision merge (HM+PL)" w:date="2026-09-09T13:15:15Z">
         <w:r>
           <w:t xml:space="preserve">decontamination*</w:t>
         </w:r>
@@ -3072,12 +3072,12 @@
       <w:r>
         <w:t xml:space="preserve"> </w:t>
       </w:r>
-      <w:del w:id="10440" w:author="Revision merge (HM+PL)" w:date="2026-09-09T12:54:58Z">
+      <w:del w:id="10440" w:author="Revision merge (HM+PL)" w:date="2026-09-09T13:15:15Z">
         <w:r>
           <w:delText xml:space="preserve">(R/00–R/02)</w:delText>
         </w:r>
       </w:del>
-      <w:ins w:id="10441" w:author="Revision merge (HM+PL)" w:date="2026-09-09T12:54:58Z">
+      <w:ins w:id="10441" w:author="Revision merge (HM+PL)" w:date="2026-09-09T13:15:15Z">
         <w:r>
           <w:t xml:space="preserve">(R/00–R/02).</w:t>
         </w:r>
@@ -3085,12 +3085,12 @@
       <w:r>
         <w:t xml:space="preserve"> </w:t>
       </w:r>
-      <w:del w:id="10442" w:author="Revision merge (HM+PL)" w:date="2026-09-09T12:54:58Z">
+      <w:del w:id="10442" w:author="Revision merge (HM+PL)" w:date="2026-09-09T13:15:15Z">
         <w:r>
           <w:delText xml:space="preserve">load</w:delText>
         </w:r>
       </w:del>
-      <w:ins w:id="10443" w:author="Revision merge (HM+PL)" w:date="2026-09-09T12:54:58Z">
+      <w:ins w:id="10443" w:author="Revision merge (HM+PL)" w:date="2026-09-09T13:15:15Z">
         <w:r>
           <w:t xml:space="preserve">The pipeline imports</w:t>
         </w:r>
@@ -3098,12 +3098,12 @@
       <w:r>
         <w:t xml:space="preserve"> upstream </w:t>
       </w:r>
-      <w:del w:id="10444" w:author="Revision merge (HM+PL)" w:date="2026-09-09T12:54:58Z">
+      <w:del w:id="10444" w:author="Revision merge (HM+PL)" w:date="2026-09-09T13:15:15Z">
         <w:r>
           <w:delText xml:space="preserve">tables</w:delText>
         </w:r>
       </w:del>
-      <w:ins w:id="10445" w:author="Revision merge (HM+PL)" w:date="2026-09-09T12:54:58Z">
+      <w:ins w:id="10445" w:author="Revision merge (HM+PL)" w:date="2026-09-09T13:15:15Z">
         <w:r>
           <w:t xml:space="preserve">outputs</w:t>
         </w:r>
@@ -3111,12 +3111,12 @@
       <w:r>
         <w:t xml:space="preserve"> — Kraken2/Bracken, ABRicate, Re-centrifuge contamination </w:t>
       </w:r>
-      <w:del w:id="10446" w:author="Revision merge (HM+PL)" w:date="2026-09-09T12:54:58Z">
+      <w:del w:id="10446" w:author="Revision merge (HM+PL)" w:date="2026-09-09T13:15:15Z">
         <w:r>
           <w:delText xml:space="preserve">tags,</w:delText>
         </w:r>
       </w:del>
-      <w:ins w:id="10447" w:author="Revision merge (HM+PL)" w:date="2026-09-09T12:54:58Z">
+      <w:ins w:id="10447" w:author="Revision merge (HM+PL)" w:date="2026-09-09T13:15:15Z">
         <w:r>
           <w:t xml:space="preserve">tags and</w:t>
         </w:r>
@@ -3124,7 +3124,7 @@
       <w:r>
         <w:t xml:space="preserve"> study metadata</w:t>
       </w:r>
-      <w:ins w:id="10448" w:author="Revision merge (HM+PL)" w:date="2026-09-09T12:54:58Z">
+      <w:ins w:id="10448" w:author="Revision merge (HM+PL)" w:date="2026-09-09T13:15:15Z">
         <w:r>
           <w:t xml:space="preserve"> tables</w:t>
         </w:r>
@@ -3132,12 +3132,12 @@
       <w:r>
         <w:t xml:space="preserve"> — accommodating per-project input shapes rather than assuming a fixed column layout, </w:t>
       </w:r>
-      <w:del w:id="10449" w:author="Revision merge (HM+PL)" w:date="2026-09-09T12:54:58Z">
+      <w:del w:id="10449" w:author="Revision merge (HM+PL)" w:date="2026-09-09T13:15:15Z">
         <w:r>
           <w:delText xml:space="preserve">apply</w:delText>
         </w:r>
       </w:del>
-      <w:ins w:id="10450" w:author="Revision merge (HM+PL)" w:date="2026-09-09T12:54:58Z">
+      <w:ins w:id="10450" w:author="Revision merge (HM+PL)" w:date="2026-09-09T13:15:15Z">
         <w:r>
           <w:t xml:space="preserve">applies</w:t>
         </w:r>
@@ -3145,12 +3145,12 @@
       <w:r>
         <w:t xml:space="preserve"> optional negative-control subtraction, </w:t>
       </w:r>
-      <w:del w:id="10451" w:author="Revision merge (HM+PL)" w:date="2026-09-09T12:54:58Z">
+      <w:del w:id="10451" w:author="Revision merge (HM+PL)" w:date="2026-09-09T13:15:15Z">
         <w:r>
           <w:delText xml:space="preserve">merge</w:delText>
         </w:r>
       </w:del>
-      <w:ins w:id="10452" w:author="Revision merge (HM+PL)" w:date="2026-09-09T12:54:58Z">
+      <w:ins w:id="10452" w:author="Revision merge (HM+PL)" w:date="2026-09-09T13:15:15Z">
         <w:r>
           <w:t xml:space="preserve">merges</w:t>
         </w:r>
@@ -3158,12 +3158,12 @@
       <w:r>
         <w:t xml:space="preserve"> Bracken counts with the metadata covariates declared in `cfg$metadata$fixed_effects` / `random_effect`, and </w:t>
       </w:r>
-      <w:del w:id="10453" w:author="Revision merge (HM+PL)" w:date="2026-09-09T12:54:58Z">
+      <w:del w:id="10453" w:author="Revision merge (HM+PL)" w:date="2026-09-09T13:15:15Z">
         <w:r>
           <w:delText xml:space="preserve">link</w:delText>
         </w:r>
       </w:del>
-      <w:ins w:id="10454" w:author="Revision merge (HM+PL)" w:date="2026-09-09T12:54:58Z">
+      <w:ins w:id="10454" w:author="Revision merge (HM+PL)" w:date="2026-09-09T13:15:15Z">
         <w:r>
           <w:t xml:space="preserve">links</w:t>
         </w:r>
@@ -3179,12 +3179,12 @@
       <w:r>
         <w:t xml:space="preserve">(2) *Gene-element normalisation* (R/03) computes per-(sample, GENE) TPM </w:t>
       </w:r>
-      <w:del w:id="10455" w:author="Revision merge (HM+PL)" w:date="2026-09-09T12:54:58Z">
+      <w:del w:id="10455" w:author="Revision merge (HM+PL)" w:date="2026-09-09T13:15:15Z">
         <w:r>
           <w:delText xml:space="preserve">from</w:delText>
         </w:r>
       </w:del>
-      <w:ins w:id="10456" w:author="Revision merge (HM+PL)" w:date="2026-09-09T12:54:58Z">
+      <w:ins w:id="10456" w:author="Revision merge (HM+PL)" w:date="2026-09-09T13:15:15Z">
         <w:r>
           <w:t xml:space="preserve">based on</w:t>
         </w:r>
@@ -3192,12 +3192,12 @@
       <w:r>
         <w:t xml:space="preserve"> ABRicate </w:t>
       </w:r>
-      <w:del w:id="10457" w:author="Revision merge (HM+PL)" w:date="2026-09-09T12:54:58Z">
+      <w:del w:id="10457" w:author="Revision merge (HM+PL)" w:date="2026-09-09T13:15:15Z">
         <w:r>
           <w:delText xml:space="preserve">hits</w:delText>
         </w:r>
       </w:del>
-      <w:ins w:id="10458" w:author="Revision merge (HM+PL)" w:date="2026-09-09T12:54:58Z">
+      <w:ins w:id="10458" w:author="Revision merge (HM+PL)" w:date="2026-09-09T13:15:15Z">
         <w:r>
           <w:t xml:space="preserve">hit counts</w:t>
         </w:r>
@@ -3205,7 +3205,7 @@
       <w:r>
         <w:t xml:space="preserve"> and</w:t>
       </w:r>
-      <w:ins w:id="10459" w:author="Revision merge (HM+PL)" w:date="2026-09-09T12:54:58Z">
+      <w:ins w:id="10459" w:author="Revision merge (HM+PL)" w:date="2026-09-09T13:15:15Z">
         <w:r>
           <w:t xml:space="preserve"> annotated</w:t>
         </w:r>
@@ -3221,7 +3221,7 @@
       <w:r>
         <w:t xml:space="preserve">(3) *Community analyses* (R/04–R/08) cover the standard taxonomic toolkit. </w:t>
       </w:r>
-      <w:ins w:id="10460" w:author="Revision merge (HM+PL)" w:date="2026-09-09T12:54:58Z">
+      <w:ins w:id="10460" w:author="Revision merge (HM+PL)" w:date="2026-09-09T13:15:15Z">
         <w:r>
           <w:t xml:space="preserve">Following standardisation and cleaning of shared taxon names, </w:t>
         </w:r>
@@ -3229,12 +3229,12 @@
       <w:r>
         <w:t xml:space="preserve">R/04–R/05 </w:t>
       </w:r>
-      <w:del w:id="10461" w:author="Revision merge (HM+PL)" w:date="2026-09-09T12:54:58Z">
+      <w:del w:id="10461" w:author="Revision merge (HM+PL)" w:date="2026-09-09T13:15:15Z">
         <w:r>
           <w:delText xml:space="preserve">produce</w:delText>
         </w:r>
       </w:del>
-      <w:ins w:id="10462" w:author="Revision merge (HM+PL)" w:date="2026-09-09T12:54:58Z">
+      <w:ins w:id="10462" w:author="Revision merge (HM+PL)" w:date="2026-09-09T13:15:15Z">
         <w:r>
           <w:t xml:space="preserve">generate</w:t>
         </w:r>
@@ -3242,12 +3242,12 @@
       <w:r>
         <w:t xml:space="preserve"> Venn </w:t>
       </w:r>
-      <w:del w:id="10463" w:author="Revision merge (HM+PL)" w:date="2026-09-09T12:54:58Z">
+      <w:del w:id="10463" w:author="Revision merge (HM+PL)" w:date="2026-09-09T13:15:15Z">
         <w:r>
           <w:delText xml:space="preserve">diagrams and</w:delText>
         </w:r>
       </w:del>
-      <w:ins w:id="10464" w:author="Revision merge (HM+PL)" w:date="2026-09-09T12:54:58Z">
+      <w:ins w:id="10464" w:author="Revision merge (HM+PL)" w:date="2026-09-09T13:15:15Z">
         <w:r>
           <w:t xml:space="preserve">diagrams,</w:t>
         </w:r>
@@ -3255,12 +3255,12 @@
       <w:r>
         <w:t xml:space="preserve"> annotated </w:t>
       </w:r>
-      <w:del w:id="10465" w:author="Revision merge (HM+PL)" w:date="2026-09-09T12:54:58Z">
+      <w:del w:id="10465" w:author="Revision merge (HM+PL)" w:date="2026-09-09T13:15:15Z">
         <w:r>
           <w:delText xml:space="preserve">heatmaps</w:delText>
         </w:r>
       </w:del>
-      <w:ins w:id="10466" w:author="Revision merge (HM+PL)" w:date="2026-09-09T12:54:58Z">
+      <w:ins w:id="10466" w:author="Revision merge (HM+PL)" w:date="2026-09-09T13:15:15Z">
         <w:r>
           <w:t xml:space="preserve">heatmaps,</w:t>
         </w:r>
@@ -3268,12 +3268,12 @@
       <w:r>
         <w:t xml:space="preserve"> </w:t>
       </w:r>
-      <w:del w:id="10467" w:author="Revision merge (HM+PL)" w:date="2026-09-09T12:54:58Z">
+      <w:del w:id="10467" w:author="Revision merge (HM+PL)" w:date="2026-09-09T13:15:15Z">
         <w:r>
           <w:delText xml:space="preserve">after a shared taxa-name cleanup, plus</w:delText>
         </w:r>
       </w:del>
-      <w:ins w:id="10468" w:author="Revision merge (HM+PL)" w:date="2026-09-09T12:54:58Z">
+      <w:ins w:id="10468" w:author="Revision merge (HM+PL)" w:date="2026-09-09T13:15:15Z">
         <w:r>
           <w:t xml:space="preserve">and</w:t>
         </w:r>
@@ -3281,12 +3281,12 @@
       <w:r>
         <w:t xml:space="preserve"> top-N stacked-bar relative-abundance plots (static PNG and interactive plotly HTML) with paired total-count and sample-prevalence panels. Alpha diversity (R/06) reports Shannon, Simpson, richness, Pielou, and Fisher metrics with Kruskal-Wallis tests and violin/bar plots, preferring a pre-computed indices CSV (e.g., Oxford Nanopore wf-metagenomics output) and falling back to the vegan R package. Beta diversity (R/07) </w:t>
       </w:r>
-      <w:del w:id="10469" w:author="Revision merge (HM+PL)" w:date="2026-09-09T12:54:58Z">
+      <w:del w:id="10469" w:author="Revision merge (HM+PL)" w:date="2026-09-09T13:15:15Z">
         <w:r>
           <w:delText xml:space="preserve">computes</w:delText>
         </w:r>
       </w:del>
-      <w:ins w:id="10470" w:author="Revision merge (HM+PL)" w:date="2026-09-09T12:54:58Z">
+      <w:ins w:id="10470" w:author="Revision merge (HM+PL)" w:date="2026-09-09T13:15:15Z">
         <w:r>
           <w:t xml:space="preserve">assesses between-sample community differences using</w:t>
         </w:r>
@@ -3294,12 +3294,12 @@
       <w:r>
         <w:t xml:space="preserve"> PCoA on Hellinger-transformed Bray-Curtis distances with PERMANOVA (`adonis2`, 9999 permutations) and PERMDISP (`betadisper`) overlaid on the ordination. </w:t>
       </w:r>
-      <w:del w:id="10471" w:author="Revision merge (HM+PL)" w:date="2026-09-09T12:54:58Z">
+      <w:del w:id="10471" w:author="Revision merge (HM+PL)" w:date="2026-09-09T13:15:15Z">
         <w:r>
           <w:delText xml:space="preserve">ALDEx2 differential</w:delText>
         </w:r>
       </w:del>
-      <w:ins w:id="10472" w:author="Revision merge (HM+PL)" w:date="2026-09-09T12:54:58Z">
+      <w:ins w:id="10472" w:author="Revision merge (HM+PL)" w:date="2026-09-09T13:15:15Z">
         <w:r>
           <w:t xml:space="preserve">Differential</w:t>
         </w:r>
@@ -3307,7 +3307,7 @@
       <w:r>
         <w:t xml:space="preserve"> abundance </w:t>
       </w:r>
-      <w:ins w:id="10473" w:author="Revision merge (HM+PL)" w:date="2026-09-09T12:54:58Z">
+      <w:ins w:id="10473" w:author="Revision merge (HM+PL)" w:date="2026-09-09T13:15:15Z">
         <w:r>
           <w:t xml:space="preserve">analysis </w:t>
         </w:r>
@@ -3315,12 +3315,12 @@
       <w:r>
         <w:t xml:space="preserve">(R/08) </w:t>
       </w:r>
-      <w:del w:id="10474" w:author="Revision merge (HM+PL)" w:date="2026-09-09T12:54:58Z">
+      <w:del w:id="10474" w:author="Revision merge (HM+PL)" w:date="2026-09-09T13:15:15Z">
         <w:r>
           <w:delText xml:space="preserve">runs</w:delText>
         </w:r>
       </w:del>
-      <w:ins w:id="10475" w:author="Revision merge (HM+PL)" w:date="2026-09-09T12:54:58Z">
+      <w:ins w:id="10475" w:author="Revision merge (HM+PL)" w:date="2026-09-09T13:15:15Z">
         <w:r>
           <w:t xml:space="preserve">is performed</w:t>
         </w:r>
@@ -3328,12 +3328,12 @@
       <w:r>
         <w:t xml:space="preserve"> at </w:t>
       </w:r>
-      <w:del w:id="10476" w:author="Revision merge (HM+PL)" w:date="2026-09-09T12:54:58Z">
+      <w:del w:id="10476" w:author="Revision merge (HM+PL)" w:date="2026-09-09T13:15:15Z">
         <w:r>
           <w:delText xml:space="preserve">two</w:delText>
         </w:r>
       </w:del>
-      <w:ins w:id="10477" w:author="Revision merge (HM+PL)" w:date="2026-09-09T12:54:58Z">
+      <w:ins w:id="10477" w:author="Revision merge (HM+PL)" w:date="2026-09-09T13:15:15Z">
         <w:r>
           <w:t xml:space="preserve">both</w:t>
         </w:r>
@@ -3341,12 +3341,12 @@
       <w:r>
         <w:t xml:space="preserve"> </w:t>
       </w:r>
-      <w:del w:id="10478" w:author="Revision merge (HM+PL)" w:date="2026-09-09T12:54:58Z">
+      <w:del w:id="10478" w:author="Revision merge (HM+PL)" w:date="2026-09-09T13:15:15Z">
         <w:r>
           <w:delText xml:space="preserve">levels</w:delText>
         </w:r>
       </w:del>
-      <w:ins w:id="10479" w:author="Revision merge (HM+PL)" w:date="2026-09-09T12:54:58Z">
+      <w:ins w:id="10479" w:author="Revision merge (HM+PL)" w:date="2026-09-09T13:15:15Z">
         <w:r>
           <w:t xml:space="preserve">the</w:t>
         </w:r>
@@ -3354,12 +3354,12 @@
       <w:r>
         <w:t xml:space="preserve"> </w:t>
       </w:r>
-      <w:del w:id="10480" w:author="Revision merge (HM+PL)" w:date="2026-09-09T12:54:58Z">
+      <w:del w:id="10480" w:author="Revision merge (HM+PL)" w:date="2026-09-09T13:15:15Z">
         <w:r>
           <w:delText xml:space="preserve">— taxa (Bracken counts)</w:delText>
         </w:r>
       </w:del>
-      <w:ins w:id="10481" w:author="Revision merge (HM+PL)" w:date="2026-09-09T12:54:58Z">
+      <w:ins w:id="10481" w:author="Revision merge (HM+PL)" w:date="2026-09-09T13:15:15Z">
         <w:r>
           <w:t xml:space="preserve">taxonomic</w:t>
         </w:r>
@@ -3367,12 +3367,12 @@
       <w:r>
         <w:t xml:space="preserve"> and </w:t>
       </w:r>
-      <w:del w:id="10482" w:author="Revision merge (HM+PL)" w:date="2026-09-09T12:54:58Z">
+      <w:del w:id="10482" w:author="Revision merge (HM+PL)" w:date="2026-09-09T13:15:15Z">
         <w:r>
           <w:delText xml:space="preserve">genes</w:delText>
         </w:r>
       </w:del>
-      <w:ins w:id="10483" w:author="Revision merge (HM+PL)" w:date="2026-09-09T12:54:58Z">
+      <w:ins w:id="10483" w:author="Revision merge (HM+PL)" w:date="2026-09-09T13:15:15Z">
         <w:r>
           <w:t xml:space="preserve">functional</w:t>
         </w:r>
@@ -3380,12 +3380,12 @@
       <w:r>
         <w:t xml:space="preserve"> </w:t>
       </w:r>
-      <w:del w:id="10484" w:author="Revision merge (HM+PL)" w:date="2026-09-09T12:54:58Z">
+      <w:del w:id="10484" w:author="Revision merge (HM+PL)" w:date="2026-09-09T13:15:15Z">
         <w:r>
           <w:delText xml:space="preserve">(ABRicate</w:delText>
         </w:r>
       </w:del>
-      <w:ins w:id="10485" w:author="Revision merge (HM+PL)" w:date="2026-09-09T12:54:58Z">
+      <w:ins w:id="10485" w:author="Revision merge (HM+PL)" w:date="2026-09-09T13:15:15Z">
         <w:r>
           <w:t xml:space="preserve">level using ALDEx2: taxonomic analysis uses Bracken counts, whereas gene-level analysis uses ABRicate</w:t>
         </w:r>
@@ -3393,12 +3393,12 @@
       <w:r>
         <w:t xml:space="preserve"> contig hits per (sample, </w:t>
       </w:r>
-      <w:del w:id="10486" w:author="Revision merge (HM+PL)" w:date="2026-09-09T12:54:58Z">
+      <w:del w:id="10486" w:author="Revision merge (HM+PL)" w:date="2026-09-09T13:15:15Z">
         <w:r>
           <w:delText xml:space="preserve">GENE)),</w:delText>
         </w:r>
       </w:del>
-      <w:ins w:id="10487" w:author="Revision merge (HM+PL)" w:date="2026-09-09T12:54:58Z">
+      <w:ins w:id="10487" w:author="Revision merge (HM+PL)" w:date="2026-09-09T13:15:15Z">
         <w:r>
           <w:t xml:space="preserve">GENE).</w:t>
         </w:r>
@@ -3406,12 +3406,12 @@
       <w:r>
         <w:t xml:space="preserve"> </w:t>
       </w:r>
-      <w:del w:id="10488" w:author="Revision merge (HM+PL)" w:date="2026-09-09T12:54:58Z">
+      <w:del w:id="10488" w:author="Revision merge (HM+PL)" w:date="2026-09-09T13:15:15Z">
         <w:r>
           <w:delText xml:space="preserve">combining</w:delText>
         </w:r>
       </w:del>
-      <w:ins w:id="10489" w:author="Revision merge (HM+PL)" w:date="2026-09-09T12:54:58Z">
+      <w:ins w:id="10489" w:author="Revision merge (HM+PL)" w:date="2026-09-09T13:15:15Z">
         <w:r>
           <w:t xml:space="preserve">The workflow combines</w:t>
         </w:r>
@@ -3419,7 +3419,7 @@
       <w:r>
         <w:t xml:space="preserve"> an omnibus Kruskal-Wallis </w:t>
       </w:r>
-      <w:ins w:id="10490" w:author="Revision merge (HM+PL)" w:date="2026-09-09T12:54:58Z">
+      <w:ins w:id="10490" w:author="Revision merge (HM+PL)" w:date="2026-09-09T13:15:15Z">
         <w:r>
           <w:t xml:space="preserve">test </w:t>
         </w:r>
@@ -3427,12 +3427,12 @@
       <w:r>
         <w:t xml:space="preserve">with pairwise Welch's </w:t>
       </w:r>
-      <w:del w:id="10491" w:author="Revision merge (HM+PL)" w:date="2026-09-09T12:54:58Z">
+      <w:del w:id="10491" w:author="Revision merge (HM+PL)" w:date="2026-09-09T13:15:15Z">
         <w:r>
           <w:delText xml:space="preserve">t tests,</w:delText>
         </w:r>
       </w:del>
-      <w:ins w:id="10492" w:author="Revision merge (HM+PL)" w:date="2026-09-09T12:54:58Z">
+      <w:ins w:id="10492" w:author="Revision merge (HM+PL)" w:date="2026-09-09T13:15:15Z">
         <w:r>
           <w:t xml:space="preserve">t-tests,</w:t>
         </w:r>
@@ -3440,7 +3440,7 @@
       <w:r>
         <w:t xml:space="preserve"> with an optional `aldex.glm` design path for covariate-adjusted models.</w:t>
       </w:r>
-      <w:ins w:id="10493" w:author="Revision merge (HM+PL)" w:date="2026-09-09T12:54:58Z">
+      <w:ins w:id="10493" w:author="Revision merge (HM+PL)" w:date="2026-09-09T13:15:15Z">
         <w:r>
           <w:t xml:space="preserve"> This compositional approach is deliberate: ALDEx2 models counts through a centred log-ratio (CLR) transformation, which accounts for the compositional nature of sequencing data and avoids the spurious correlations that arise when raw or total counts are compared directly [10]; gene-level features are additionally length-normalised as TPM (R/03) so that genes of differing length remain comparable.</w:t>
         </w:r>
@@ -3453,12 +3453,12 @@
       <w:r>
         <w:t xml:space="preserve">(4) *Functional profiling* (R/09–R/11) runs a shared analysis engine three times against domain-specific databases: </w:t>
       </w:r>
-      <w:del w:id="10494" w:author="Revision merge (HM+PL)" w:date="2026-09-09T12:54:58Z">
+      <w:del w:id="10494" w:author="Revision merge (HM+PL)" w:date="2026-09-09T13:15:15Z">
         <w:r>
           <w:delText xml:space="preserve">the</w:delText>
         </w:r>
       </w:del>
-      <w:ins w:id="10495" w:author="Revision merge (HM+PL)" w:date="2026-09-09T12:54:58Z">
+      <w:ins w:id="10495" w:author="Revision merge (HM+PL)" w:date="2026-09-09T13:15:15Z">
         <w:r>
           <w:t xml:space="preserve">(i)</w:t>
         </w:r>
@@ -3466,12 +3466,12 @@
       <w:r>
         <w:t xml:space="preserve"> resistome </w:t>
       </w:r>
-      <w:del w:id="10496" w:author="Revision merge (HM+PL)" w:date="2026-09-09T12:54:58Z">
+      <w:del w:id="10496" w:author="Revision merge (HM+PL)" w:date="2026-09-09T13:15:15Z">
         <w:r>
           <w:delText xml:space="preserve">(ABRicate/CARD,</w:delText>
         </w:r>
       </w:del>
-      <w:ins w:id="10497" w:author="Revision merge (HM+PL)" w:date="2026-09-09T12:54:58Z">
+      <w:ins w:id="10497" w:author="Revision merge (HM+PL)" w:date="2026-09-09T13:15:15Z">
         <w:r>
           <w:t xml:space="preserve">profiling</w:t>
         </w:r>
@@ -3479,12 +3479,12 @@
       <w:r>
         <w:t xml:space="preserve"> </w:t>
       </w:r>
-      <w:del w:id="10498" w:author="Revision merge (HM+PL)" w:date="2026-09-09T12:54:58Z">
+      <w:del w:id="10498" w:author="Revision merge (HM+PL)" w:date="2026-09-09T13:15:15Z">
         <w:r>
           <w:delText xml:space="preserve">with</w:delText>
         </w:r>
       </w:del>
-      <w:ins w:id="10499" w:author="Revision merge (HM+PL)" w:date="2026-09-09T12:54:58Z">
+      <w:ins w:id="10499" w:author="Revision merge (HM+PL)" w:date="2026-09-09T13:15:15Z">
         <w:r>
           <w:t xml:space="preserve">using ABRicate/CARD annotations, including</w:t>
         </w:r>
@@ -3492,12 +3492,12 @@
       <w:r>
         <w:t xml:space="preserve"> drug-class </w:t>
       </w:r>
-      <w:del w:id="10500" w:author="Revision merge (HM+PL)" w:date="2026-09-09T12:54:58Z">
+      <w:del w:id="10500" w:author="Revision merge (HM+PL)" w:date="2026-09-09T13:15:15Z">
         <w:r>
           <w:delText xml:space="preserve">classification),</w:delText>
         </w:r>
       </w:del>
-      <w:ins w:id="10501" w:author="Revision merge (HM+PL)" w:date="2026-09-09T12:54:58Z">
+      <w:ins w:id="10501" w:author="Revision merge (HM+PL)" w:date="2026-09-09T13:15:15Z">
         <w:r>
           <w:t xml:space="preserve">classification;</w:t>
         </w:r>
@@ -3505,12 +3505,12 @@
       <w:r>
         <w:t xml:space="preserve"> </w:t>
       </w:r>
-      <w:del w:id="10502" w:author="Revision merge (HM+PL)" w:date="2026-09-09T12:54:58Z">
+      <w:del w:id="10502" w:author="Revision merge (HM+PL)" w:date="2026-09-09T13:15:15Z">
         <w:r>
           <w:delText xml:space="preserve">the</w:delText>
         </w:r>
       </w:del>
-      <w:ins w:id="10503" w:author="Revision merge (HM+PL)" w:date="2026-09-09T12:54:58Z">
+      <w:ins w:id="10503" w:author="Revision merge (HM+PL)" w:date="2026-09-09T13:15:15Z">
         <w:r>
           <w:t xml:space="preserve">(ii)</w:t>
         </w:r>
@@ -3518,12 +3518,12 @@
       <w:r>
         <w:t xml:space="preserve"> virulome </w:t>
       </w:r>
-      <w:del w:id="10504" w:author="Revision merge (HM+PL)" w:date="2026-09-09T12:54:58Z">
+      <w:del w:id="10504" w:author="Revision merge (HM+PL)" w:date="2026-09-09T13:15:15Z">
         <w:r>
           <w:delText xml:space="preserve">(VFDB,</w:delText>
         </w:r>
       </w:del>
-      <w:ins w:id="10505" w:author="Revision merge (HM+PL)" w:date="2026-09-09T12:54:58Z">
+      <w:ins w:id="10505" w:author="Revision merge (HM+PL)" w:date="2026-09-09T13:15:15Z">
         <w:r>
           <w:t xml:space="preserve">profiling using VFDB,</w:t>
         </w:r>
@@ -3531,12 +3531,12 @@
       <w:r>
         <w:t xml:space="preserve"> with functional categories extracted from the ABRicate `PRODUCT` </w:t>
       </w:r>
-      <w:del w:id="10506" w:author="Revision merge (HM+PL)" w:date="2026-09-09T12:54:58Z">
+      <w:del w:id="10506" w:author="Revision merge (HM+PL)" w:date="2026-09-09T13:15:15Z">
         <w:r>
           <w:delText xml:space="preserve">field)</w:delText>
         </w:r>
       </w:del>
-      <w:ins w:id="10507" w:author="Revision merge (HM+PL)" w:date="2026-09-09T12:54:58Z">
+      <w:ins w:id="10507" w:author="Revision merge (HM+PL)" w:date="2026-09-09T13:15:15Z">
         <w:r>
           <w:t xml:space="preserve">field;</w:t>
         </w:r>
@@ -3544,12 +3544,12 @@
       <w:r>
         <w:t xml:space="preserve"> </w:t>
       </w:r>
-      <w:del w:id="10508" w:author="Revision merge (HM+PL)" w:date="2026-09-09T12:54:58Z">
+      <w:del w:id="10508" w:author="Revision merge (HM+PL)" w:date="2026-09-09T13:15:15Z">
         <w:r>
           <w:delText xml:space="preserve">and the</w:delText>
         </w:r>
       </w:del>
-      <w:ins w:id="10509" w:author="Revision merge (HM+PL)" w:date="2026-09-09T12:54:58Z">
+      <w:ins w:id="10509" w:author="Revision merge (HM+PL)" w:date="2026-09-09T13:15:15Z">
         <w:r>
           <w:t xml:space="preserve">(iii)</w:t>
         </w:r>
@@ -3557,12 +3557,12 @@
       <w:r>
         <w:t xml:space="preserve"> mobilome </w:t>
       </w:r>
-      <w:del w:id="10510" w:author="Revision merge (HM+PL)" w:date="2026-09-09T12:54:58Z">
+      <w:del w:id="10510" w:author="Revision merge (HM+PL)" w:date="2026-09-09T13:15:15Z">
         <w:r>
           <w:delText xml:space="preserve">(PlasmidFinder,</w:delText>
         </w:r>
       </w:del>
-      <w:ins w:id="10511" w:author="Revision merge (HM+PL)" w:date="2026-09-09T12:54:58Z">
+      <w:ins w:id="10511" w:author="Revision merge (HM+PL)" w:date="2026-09-09T13:15:15Z">
         <w:r>
           <w:t xml:space="preserve">profiling</w:t>
         </w:r>
@@ -3570,12 +3570,12 @@
       <w:r>
         <w:t xml:space="preserve"> </w:t>
       </w:r>
-      <w:del w:id="10512" w:author="Revision merge (HM+PL)" w:date="2026-09-09T12:54:58Z">
+      <w:del w:id="10512" w:author="Revision merge (HM+PL)" w:date="2026-09-09T13:15:15Z">
         <w:r>
           <w:delText xml:space="preserve">with</w:delText>
         </w:r>
       </w:del>
-      <w:ins w:id="10513" w:author="Revision merge (HM+PL)" w:date="2026-09-09T12:54:58Z">
+      <w:ins w:id="10513" w:author="Revision merge (HM+PL)" w:date="2026-09-09T13:15:15Z">
         <w:r>
           <w:t xml:space="preserve">using PlasmidFinder, incorporating</w:t>
         </w:r>
@@ -3583,12 +3583,12 @@
       <w:r>
         <w:t xml:space="preserve"> configurable replicon-family classification </w:t>
       </w:r>
-      <w:del w:id="10514" w:author="Revision merge (HM+PL)" w:date="2026-09-09T12:54:58Z">
+      <w:del w:id="10514" w:author="Revision merge (HM+PL)" w:date="2026-09-09T13:15:15Z">
         <w:r>
           <w:delText xml:space="preserve">— Col-like,</w:delText>
         </w:r>
       </w:del>
-      <w:ins w:id="10515" w:author="Revision merge (HM+PL)" w:date="2026-09-09T12:54:58Z">
+      <w:ins w:id="10515" w:author="Revision merge (HM+PL)" w:date="2026-09-09T13:15:15Z">
         <w:r>
           <w:t xml:space="preserve">(Col-like,</w:t>
         </w:r>
@@ -3596,12 +3596,12 @@
       <w:r>
         <w:t xml:space="preserve"> IncF, IncX, other Inc). </w:t>
       </w:r>
-      <w:del w:id="10516" w:author="Revision merge (HM+PL)" w:date="2026-09-09T12:54:58Z">
+      <w:del w:id="10516" w:author="Revision merge (HM+PL)" w:date="2026-09-09T13:15:15Z">
         <w:r>
           <w:delText xml:space="preserve">Each</w:delText>
         </w:r>
       </w:del>
-      <w:ins w:id="10517" w:author="Revision merge (HM+PL)" w:date="2026-09-09T12:54:58Z">
+      <w:ins w:id="10517" w:author="Revision merge (HM+PL)" w:date="2026-09-09T13:15:15Z">
         <w:r>
           <w:t xml:space="preserve">For</w:t>
         </w:r>
@@ -3609,12 +3609,12 @@
       <w:r>
         <w:t xml:space="preserve"> </w:t>
       </w:r>
-      <w:del w:id="10518" w:author="Revision merge (HM+PL)" w:date="2026-09-09T12:54:58Z">
+      <w:del w:id="10518" w:author="Revision merge (HM+PL)" w:date="2026-09-09T13:15:15Z">
         <w:r>
           <w:delText xml:space="preserve">domain</w:delText>
         </w:r>
       </w:del>
-      <w:ins w:id="10519" w:author="Revision merge (HM+PL)" w:date="2026-09-09T12:54:58Z">
+      <w:ins w:id="10519" w:author="Revision merge (HM+PL)" w:date="2026-09-09T13:15:15Z">
         <w:r>
           <w:t xml:space="preserve">each</w:t>
         </w:r>
@@ -3622,12 +3622,12 @@
       <w:r>
         <w:t xml:space="preserve"> </w:t>
       </w:r>
-      <w:del w:id="10520" w:author="Revision merge (HM+PL)" w:date="2026-09-09T12:54:58Z">
+      <w:del w:id="10520" w:author="Revision merge (HM+PL)" w:date="2026-09-09T13:15:15Z">
         <w:r>
           <w:delText xml:space="preserve">emits</w:delText>
         </w:r>
       </w:del>
-      <w:ins w:id="10521" w:author="Revision merge (HM+PL)" w:date="2026-09-09T12:54:58Z">
+      <w:ins w:id="10521" w:author="Revision merge (HM+PL)" w:date="2026-09-09T13:15:15Z">
         <w:r>
           <w:t xml:space="preserve">domain,</w:t>
         </w:r>
@@ -3635,12 +3635,12 @@
       <w:r>
         <w:t xml:space="preserve"> </w:t>
       </w:r>
-      <w:del w:id="10522" w:author="Revision merge (HM+PL)" w:date="2026-09-09T12:54:58Z">
+      <w:del w:id="10522" w:author="Revision merge (HM+PL)" w:date="2026-09-09T13:15:15Z">
         <w:r>
           <w:delText xml:space="preserve">its</w:delText>
         </w:r>
       </w:del>
-      <w:ins w:id="10523" w:author="Revision merge (HM+PL)" w:date="2026-09-09T12:54:58Z">
+      <w:ins w:id="10523" w:author="Revision merge (HM+PL)" w:date="2026-09-09T13:15:15Z">
         <w:r>
           <w:t xml:space="preserve">the</w:t>
         </w:r>
@@ -3648,12 +3648,12 @@
       <w:r>
         <w:t xml:space="preserve"> </w:t>
       </w:r>
-      <w:del w:id="10524" w:author="Revision merge (HM+PL)" w:date="2026-09-09T12:54:58Z">
+      <w:del w:id="10524" w:author="Revision merge (HM+PL)" w:date="2026-09-09T13:15:15Z">
         <w:r>
           <w:delText xml:space="preserve">own</w:delText>
         </w:r>
       </w:del>
-      <w:ins w:id="10525" w:author="Revision merge (HM+PL)" w:date="2026-09-09T12:54:58Z">
+      <w:ins w:id="10525" w:author="Revision merge (HM+PL)" w:date="2026-09-09T13:15:15Z">
         <w:r>
           <w:t xml:space="preserve">pipeline generates</w:t>
         </w:r>
@@ -3661,12 +3661,12 @@
       <w:r>
         <w:t xml:space="preserve"> alpha </w:t>
       </w:r>
-      <w:del w:id="10526" w:author="Revision merge (HM+PL)" w:date="2026-09-09T12:54:58Z">
+      <w:del w:id="10526" w:author="Revision merge (HM+PL)" w:date="2026-09-09T13:15:15Z">
         <w:r>
           <w:delText xml:space="preserve">diversity,</w:delText>
         </w:r>
       </w:del>
-      <w:ins w:id="10527" w:author="Revision merge (HM+PL)" w:date="2026-09-09T12:54:58Z">
+      <w:ins w:id="10527" w:author="Revision merge (HM+PL)" w:date="2026-09-09T13:15:15Z">
         <w:r>
           <w:t xml:space="preserve">diversity metrics,</w:t>
         </w:r>
@@ -3674,12 +3674,12 @@
       <w:r>
         <w:t xml:space="preserve"> Venn </w:t>
       </w:r>
-      <w:del w:id="10528" w:author="Revision merge (HM+PL)" w:date="2026-09-09T12:54:58Z">
+      <w:del w:id="10528" w:author="Revision merge (HM+PL)" w:date="2026-09-09T13:15:15Z">
         <w:r>
           <w:delText xml:space="preserve">diagram,</w:delText>
         </w:r>
       </w:del>
-      <w:ins w:id="10529" w:author="Revision merge (HM+PL)" w:date="2026-09-09T12:54:58Z">
+      <w:ins w:id="10529" w:author="Revision merge (HM+PL)" w:date="2026-09-09T13:15:15Z">
         <w:r>
           <w:t xml:space="preserve">diagrams,</w:t>
         </w:r>
@@ -3695,7 +3695,7 @@
       <w:r>
         <w:t xml:space="preserve">(5) *Integration, reporting and manifest* (R/12–R/14).</w:t>
       </w:r>
-      <w:ins w:id="10530" w:author="Revision merge (HM+PL)" w:date="2026-09-09T12:54:58Z">
+      <w:ins w:id="10530" w:author="Revision merge (HM+PL)" w:date="2026-09-09T13:15:15Z">
         <w:r>
           <w:t xml:space="preserve"> The final stage integrates results across all domains and produces the reporting outputs.</w:t>
         </w:r>
@@ -3711,12 +3711,12 @@
       <w:r>
         <w:t xml:space="preserve">**Reporting.** </w:t>
       </w:r>
-      <w:del w:id="10531" w:author="Revision merge (HM+PL)" w:date="2026-09-09T12:54:58Z">
+      <w:del w:id="10531" w:author="Revision merge (HM+PL)" w:date="2026-09-09T13:15:15Z">
         <w:r>
           <w:delText xml:space="preserve">The</w:delText>
         </w:r>
       </w:del>
-      <w:ins w:id="10532" w:author="Revision merge (HM+PL)" w:date="2026-09-09T12:54:58Z">
+      <w:ins w:id="10532" w:author="Revision merge (HM+PL)" w:date="2026-09-09T13:15:15Z">
         <w:r>
           <w:t xml:space="preserve">Results are rendered through a</w:t>
         </w:r>
@@ -3724,7 +3724,7 @@
       <w:r>
         <w:t xml:space="preserve"> Quarto template</w:t>
       </w:r>
-      <w:del w:id="10533" w:author="Revision merge (HM+PL)" w:date="2026-09-09T12:54:58Z">
+      <w:del w:id="10533" w:author="Revision merge (HM+PL)" w:date="2026-09-09T13:15:15Z">
         <w:r>
           <w:delText xml:space="preserve"> renders all outputs</w:delText>
         </w:r>
@@ -3732,12 +3732,12 @@
       <w:r>
         <w:t xml:space="preserve"> as a multi-page HTML dashboard </w:t>
       </w:r>
-      <w:del w:id="10534" w:author="Revision merge (HM+PL)" w:date="2026-09-09T12:54:58Z">
+      <w:del w:id="10534" w:author="Revision merge (HM+PL)" w:date="2026-09-09T13:15:15Z">
         <w:r>
           <w:delText xml:space="preserve">with</w:delText>
         </w:r>
       </w:del>
-      <w:ins w:id="10535" w:author="Revision merge (HM+PL)" w:date="2026-09-09T12:54:58Z">
+      <w:ins w:id="10535" w:author="Revision merge (HM+PL)" w:date="2026-09-09T13:15:15Z">
         <w:r>
           <w:t xml:space="preserve">containing</w:t>
         </w:r>
@@ -3745,12 +3745,12 @@
       <w:r>
         <w:t xml:space="preserve"> </w:t>
       </w:r>
-      <w:del w:id="10536" w:author="Revision merge (HM+PL)" w:date="2026-09-09T12:54:58Z">
+      <w:del w:id="10536" w:author="Revision merge (HM+PL)" w:date="2026-09-09T13:15:15Z">
         <w:r>
           <w:delText xml:space="preserve">per-domain</w:delText>
         </w:r>
       </w:del>
-      <w:ins w:id="10537" w:author="Revision merge (HM+PL)" w:date="2026-09-09T12:54:58Z">
+      <w:ins w:id="10537" w:author="Revision merge (HM+PL)" w:date="2026-09-09T13:15:15Z">
         <w:r>
           <w:t xml:space="preserve">dedicated</w:t>
         </w:r>
@@ -3758,12 +3758,12 @@
       <w:r>
         <w:t xml:space="preserve"> panels </w:t>
       </w:r>
-      <w:del w:id="10538" w:author="Revision merge (HM+PL)" w:date="2026-09-09T12:54:58Z">
+      <w:del w:id="10538" w:author="Revision merge (HM+PL)" w:date="2026-09-09T13:15:15Z">
         <w:r>
           <w:delText xml:space="preserve">(taxonomy,</w:delText>
         </w:r>
       </w:del>
-      <w:ins w:id="10539" w:author="Revision merge (HM+PL)" w:date="2026-09-09T12:54:58Z">
+      <w:ins w:id="10539" w:author="Revision merge (HM+PL)" w:date="2026-09-09T13:15:15Z">
         <w:r>
           <w:t xml:space="preserve">for taxonomy,</w:t>
         </w:r>
@@ -3771,12 +3771,12 @@
       <w:r>
         <w:t xml:space="preserve"> diversity, differential abundance, resistome, virulome, </w:t>
       </w:r>
-      <w:del w:id="10540" w:author="Revision merge (HM+PL)" w:date="2026-09-09T12:54:58Z">
+      <w:del w:id="10540" w:author="Revision merge (HM+PL)" w:date="2026-09-09T13:15:15Z">
         <w:r>
           <w:delText xml:space="preserve">mobilome, network)</w:delText>
         </w:r>
       </w:del>
-      <w:ins w:id="10541" w:author="Revision merge (HM+PL)" w:date="2026-09-09T12:54:58Z">
+      <w:ins w:id="10541" w:author="Revision merge (HM+PL)" w:date="2026-09-09T13:15:15Z">
         <w:r>
           <w:t xml:space="preserve">mobilome</w:t>
         </w:r>
@@ -3784,7 +3784,7 @@
       <w:r>
         <w:t xml:space="preserve"> and</w:t>
       </w:r>
-      <w:ins w:id="10542" w:author="Revision merge (HM+PL)" w:date="2026-09-09T12:54:58Z">
+      <w:ins w:id="10542" w:author="Revision merge (HM+PL)" w:date="2026-09-09T13:15:15Z">
         <w:r>
           <w:t xml:space="preserve"> network, plus</w:t>
         </w:r>
@@ -3792,7 +3792,7 @@
       <w:r>
         <w:t xml:space="preserve"> embedded download links. Dependencies are pinned via `renv`, and the project requires R ≥ 4.5; external command-line tools (Kraken2, Bracken, ABRicate, Re-centrifuge) are assumed to have been run upstream.</w:t>
       </w:r>
-      <w:ins w:id="10543" w:author="Revision merge (HM+PL)" w:date="2026-09-09T12:54:58Z">
+      <w:ins w:id="10543" w:author="Revision merge (HM+PL)" w:date="2026-09-09T13:15:15Z">
         <w:r>
           <w:t xml:space="preserve"> Because MERIDIAN consumes these pre-computed outputs rather than the raw reads, its own footprint is modest and single-threaded (peaking at ~1.5 GB; Section 3), and is therefore decoupled from the substantial memory required by upstream taxonomic classification (for example, a full Kraken2 database), which can be run separately on high-memory or cloud infrastructure.</w:t>
         </w:r>
@@ -3820,12 +3820,12 @@
       <w:r>
         <w:t xml:space="preserve">We </w:t>
       </w:r>
-      <w:del w:id="10544" w:author="Revision merge (HM+PL)" w:date="2026-09-09T12:54:58Z">
+      <w:del w:id="10544" w:author="Revision merge (HM+PL)" w:date="2026-09-09T13:15:15Z">
         <w:r>
           <w:delText xml:space="preserve">are validating</w:delText>
         </w:r>
       </w:del>
-      <w:ins w:id="10545" w:author="Revision merge (HM+PL)" w:date="2026-09-09T12:54:58Z">
+      <w:ins w:id="10545" w:author="Revision merge (HM+PL)" w:date="2026-09-09T13:15:15Z">
         <w:r>
           <w:t xml:space="preserve">validated</w:t>
         </w:r>
@@ -3833,7 +3833,7 @@
       <w:r>
         <w:t xml:space="preserve"> the pipeline against two </w:t>
       </w:r>
-      <w:del w:id="10546" w:author="Revision merge (HM+PL)" w:date="2026-09-09T12:54:58Z">
+      <w:del w:id="10546" w:author="Revision merge (HM+PL)" w:date="2026-09-09T13:15:15Z">
         <w:r>
           <w:delText xml:space="preserve">real </w:delText>
         </w:r>
@@ -3841,12 +3841,12 @@
       <w:r>
         <w:t xml:space="preserve">long-read chicken caecum </w:t>
       </w:r>
-      <w:del w:id="10547" w:author="Revision merge (HM+PL)" w:date="2026-09-09T12:54:58Z">
+      <w:del w:id="10547" w:author="Revision merge (HM+PL)" w:date="2026-09-09T13:15:15Z">
         <w:r>
           <w:delText xml:space="preserve">metagenomics</w:delText>
         </w:r>
       </w:del>
-      <w:ins w:id="10548" w:author="Revision merge (HM+PL)" w:date="2026-09-09T12:54:58Z">
+      <w:ins w:id="10548" w:author="Revision merge (HM+PL)" w:date="2026-09-09T13:15:15Z">
         <w:r>
           <w:t xml:space="preserve">metagenomic</w:t>
         </w:r>
@@ -3854,12 +3854,12 @@
       <w:r>
         <w:t xml:space="preserve"> studies. The </w:t>
       </w:r>
-      <w:del w:id="10549" w:author="Revision merge (HM+PL)" w:date="2026-09-09T12:54:58Z">
+      <w:del w:id="10549" w:author="Revision merge (HM+PL)" w:date="2026-09-09T13:15:15Z">
         <w:r>
           <w:delText xml:space="preserve">reference</w:delText>
         </w:r>
       </w:del>
-      <w:ins w:id="10550" w:author="Revision merge (HM+PL)" w:date="2026-09-09T12:54:58Z">
+      <w:ins w:id="10550" w:author="Revision merge (HM+PL)" w:date="2026-09-09T13:15:15Z">
         <w:r>
           <w:t xml:space="preserve">primary</w:t>
         </w:r>
@@ -3867,12 +3867,12 @@
       <w:r>
         <w:t xml:space="preserve"> </w:t>
       </w:r>
-      <w:del w:id="10551" w:author="Revision merge (HM+PL)" w:date="2026-09-09T12:54:58Z">
+      <w:del w:id="10551" w:author="Revision merge (HM+PL)" w:date="2026-09-09T13:15:15Z">
         <w:r>
           <w:delText xml:space="preserve">cohort</w:delText>
         </w:r>
       </w:del>
-      <w:ins w:id="10552" w:author="Revision merge (HM+PL)" w:date="2026-09-09T12:54:58Z">
+      <w:ins w:id="10552" w:author="Revision merge (HM+PL)" w:date="2026-09-09T13:15:15Z">
         <w:r>
           <w:t xml:space="preserve">dataset</w:t>
         </w:r>
@@ -3880,7 +3880,7 @@
       <w:r>
         <w:t xml:space="preserve"> (`Chicken batch 1`, PC_JC_2024-11-29; 18 samples; 3 dietary groups — Dulse, Reference diet, Soyabean meal) </w:t>
       </w:r>
-      <w:ins w:id="10553" w:author="Revision merge (HM+PL)" w:date="2026-09-09T12:54:58Z">
+      <w:ins w:id="10553" w:author="Revision merge (HM+PL)" w:date="2026-09-09T13:15:15Z">
         <w:r>
           <w:t xml:space="preserve">is publicly available under NCBI BioProject PRJNA1406192 and </w:t>
         </w:r>
@@ -3888,12 +3888,12 @@
       <w:r>
         <w:t xml:space="preserve">has approximately 46 hand-edited R scripts </w:t>
       </w:r>
-      <w:del w:id="10554" w:author="Revision merge (HM+PL)" w:date="2026-09-09T12:54:58Z">
+      <w:del w:id="10554" w:author="Revision merge (HM+PL)" w:date="2026-09-09T13:15:15Z">
         <w:r>
           <w:delText xml:space="preserve">and</w:delText>
         </w:r>
       </w:del>
-      <w:ins w:id="10555" w:author="Revision merge (HM+PL)" w:date="2026-09-09T12:54:58Z">
+      <w:ins w:id="10555" w:author="Revision merge (HM+PL)" w:date="2026-09-09T13:15:15Z">
         <w:r>
           <w:t xml:space="preserve">with</w:t>
         </w:r>
@@ -3901,12 +3901,12 @@
       <w:r>
         <w:t xml:space="preserve"> </w:t>
       </w:r>
-      <w:del w:id="10556" w:author="Revision merge (HM+PL)" w:date="2026-09-09T12:54:58Z">
+      <w:del w:id="10556" w:author="Revision merge (HM+PL)" w:date="2026-09-09T13:15:15Z">
         <w:r>
           <w:delText xml:space="preserve">known-good</w:delText>
         </w:r>
       </w:del>
-      <w:ins w:id="10557" w:author="Revision merge (HM+PL)" w:date="2026-09-09T12:54:58Z">
+      <w:ins w:id="10557" w:author="Revision merge (HM+PL)" w:date="2026-09-09T13:15:15Z">
         <w:r>
           <w:t xml:space="preserve">corresponding validated</w:t>
         </w:r>
@@ -3914,12 +3914,12 @@
       <w:r>
         <w:t xml:space="preserve"> figures and </w:t>
       </w:r>
-      <w:del w:id="10558" w:author="Revision merge (HM+PL)" w:date="2026-09-09T12:54:58Z">
+      <w:del w:id="10558" w:author="Revision merge (HM+PL)" w:date="2026-09-09T13:15:15Z">
         <w:r>
           <w:delText xml:space="preserve">tables already in place,</w:delText>
         </w:r>
       </w:del>
-      <w:ins w:id="10559" w:author="Revision merge (HM+PL)" w:date="2026-09-09T12:54:58Z">
+      <w:ins w:id="10559" w:author="Revision merge (HM+PL)" w:date="2026-09-09T13:15:15Z">
         <w:r>
           <w:t xml:space="preserve">tables,</w:t>
         </w:r>
@@ -3927,12 +3927,12 @@
       <w:r>
         <w:t xml:space="preserve"> so each stage can be compared output-for-output against the corresponding ground-truth artefact. The </w:t>
       </w:r>
-      <w:del w:id="10560" w:author="Revision merge (HM+PL)" w:date="2026-09-09T12:54:58Z">
+      <w:del w:id="10560" w:author="Revision merge (HM+PL)" w:date="2026-09-09T13:15:15Z">
         <w:r>
           <w:delText xml:space="preserve">scaling</w:delText>
         </w:r>
       </w:del>
-      <w:ins w:id="10561" w:author="Revision merge (HM+PL)" w:date="2026-09-09T12:54:58Z">
+      <w:ins w:id="10561" w:author="Revision merge (HM+PL)" w:date="2026-09-09T13:15:15Z">
         <w:r>
           <w:t xml:space="preserve">second</w:t>
         </w:r>
@@ -3940,12 +3940,12 @@
       <w:r>
         <w:t xml:space="preserve"> </w:t>
       </w:r>
-      <w:del w:id="10562" w:author="Revision merge (HM+PL)" w:date="2026-09-09T12:54:58Z">
+      <w:del w:id="10562" w:author="Revision merge (HM+PL)" w:date="2026-09-09T13:15:15Z">
         <w:r>
           <w:delText xml:space="preserve">and feature-coverage cohort</w:delText>
         </w:r>
       </w:del>
-      <w:ins w:id="10563" w:author="Revision merge (HM+PL)" w:date="2026-09-09T12:54:58Z">
+      <w:ins w:id="10563" w:author="Revision merge (HM+PL)" w:date="2026-09-09T13:15:15Z">
         <w:r>
           <w:t xml:space="preserve">dataset</w:t>
         </w:r>
@@ -3953,12 +3953,12 @@
       <w:r>
         <w:t xml:space="preserve"> (`Chicken batch 2`, JC_FL_2025-05-20; 32 </w:t>
       </w:r>
-      <w:del w:id="10564" w:author="Revision merge (HM+PL)" w:date="2026-09-09T12:54:58Z">
+      <w:del w:id="10564" w:author="Revision merge (HM+PL)" w:date="2026-09-09T13:15:15Z">
         <w:r>
           <w:delText xml:space="preserve">samples;</w:delText>
         </w:r>
       </w:del>
-      <w:ins w:id="10565" w:author="Revision merge (HM+PL)" w:date="2026-09-09T12:54:58Z">
+      <w:ins w:id="10565" w:author="Revision merge (HM+PL)" w:date="2026-09-09T13:15:15Z">
         <w:r>
           <w:t xml:space="preserve">samples), for which public release is pending publication of the associated study, was used for scalability and feature coverage: samples were organised into a</w:t>
         </w:r>
@@ -3966,12 +3966,12 @@
       <w:r>
         <w:t xml:space="preserve"> 4-level composite `Treatment_Bird` grouping </w:t>
       </w:r>
-      <w:del w:id="10566" w:author="Revision merge (HM+PL)" w:date="2026-09-09T12:54:58Z">
+      <w:del w:id="10566" w:author="Revision merge (HM+PL)" w:date="2026-09-09T13:15:15Z">
         <w:r>
           <w:delText xml:space="preserve">— Control_W4,</w:delText>
         </w:r>
       </w:del>
-      <w:ins w:id="10567" w:author="Revision merge (HM+PL)" w:date="2026-09-09T12:54:58Z">
+      <w:ins w:id="10567" w:author="Revision merge (HM+PL)" w:date="2026-09-09T13:15:15Z">
         <w:r>
           <w:t xml:space="preserve">(Control_W4,</w:t>
         </w:r>
@@ -3979,12 +3979,12 @@
       <w:r>
         <w:t xml:space="preserve"> Control_W5, Dulse_W4, Dulse_W5) </w:t>
       </w:r>
-      <w:del w:id="10568" w:author="Revision merge (HM+PL)" w:date="2026-09-09T12:54:58Z">
+      <w:del w:id="10568" w:author="Revision merge (HM+PL)" w:date="2026-09-09T13:15:15Z">
         <w:r>
           <w:delText xml:space="preserve">exercises</w:delText>
         </w:r>
       </w:del>
-      <w:ins w:id="10569" w:author="Revision merge (HM+PL)" w:date="2026-09-09T12:54:58Z">
+      <w:ins w:id="10569" w:author="Revision merge (HM+PL)" w:date="2026-09-09T13:15:15Z">
         <w:r>
           <w:t xml:space="preserve">with</w:t>
         </w:r>
@@ -4141,49 +4141,27 @@
       <w:pPr>
         <w:spacing w:after="120"/>
       </w:pPr>
-      <w:r>
-        <w:t xml:space="preserve">Across both </w:t>
-      </w:r>
-      <w:del w:id="10570" w:author="Revision merge (HM+PL)" w:date="2026-09-09T12:54:58Z">
-        <w:r>
-          <w:delText xml:space="preserve">cohorts</w:delText>
-        </w:r>
-      </w:del>
-      <w:ins w:id="10571" w:author="Revision merge (HM+PL)" w:date="2026-09-09T12:54:58Z">
-        <w:r>
-          <w:t xml:space="preserve">datasets</w:t>
-        </w:r>
-      </w:ins>
-      <w:r>
-        <w:t xml:space="preserve"> (**Table 1**), every enabled stage produced its expected primary artefact under identical settings. Feature counts scale with cohort size and grouping complexity: B2 (n=32, 4-level `Treatment_Bird`) yields ~1.5–2× the resistome (648 vs 348 rows), virulome (492 vs 320) and mobilome (137 vs 65) rows of B1, with 53 vs 31 differentially abundant taxa across 6 vs 3 pairwise contrasts and a denser integrated network (576 edges/210 nodes/modularity 0.40 vs 247/100/0.31). The pipeline closes cleanly on both runs, producing a contract-v1.2 `manifest.json` (~80–85 kB) and a Quarto HTML dashboard (~14–18 MB). The performance profile (**Figure 2**) illustrated that the end-to-end runtime grew from 6m 41s on B1 to 8m 19s on B2 (+24 %, sublinear in both sample count and pairwise-contrast count), dominated on both cohorts by ALDEx2 differential abundance (32 % of B1 total, 40 % of B2). Peak R-process memory tracks the same monotone </w:t>
-      </w:r>
-      <w:del w:id="10572" w:author="Revision merge (HM+PL)" w:date="2026-09-09T12:54:58Z">
-        <w:r>
-          <w:delText xml:space="preserve">profile —</w:delText>
-        </w:r>
-      </w:del>
-      <w:ins w:id="10573" w:author="Revision merge (HM+PL)" w:date="2026-09-09T12:54:58Z">
-        <w:r>
-          <w:t xml:space="preserve">profile,</w:t>
-        </w:r>
-      </w:ins>
-      <w:r>
-        <w:t xml:space="preserve"> climbing through the gene-element domains as the joint long-form `(sample × gene)` tables grow (~1 GB plateau) and tops out during R/13 panel assembly (1.33 GB on B1, 1.51 GB on B2), where every domain's PNGs and tables are loaded simultaneously to lay out; the `report` stage's modest peak (~0.6 GB) reflects work delegated to the external Quarto process.</w:t>
-      </w:r>
-    </w:p>
-    <w:p>
-      <w:pPr>
-        <w:spacing w:after="120"/>
-      </w:pPr>
-      <w:r>
-        <w:t xml:space="preserve">[FIGURE] **Figure 2.** Pipeline performance on the two validation cohorts. (A) Per-stage wall time (log scale) and (B) peak R-process heap, sorted by B2 runtime. (C) Cumulative wall time and (D) running peak memory in pipeline order. R 4.5.0 single-thread analysis, including PERMANOVA 9999 permutations, ALDEx2 `mc.samples` = 128. B1 = Chicken batch 1 (n=18, 3 dietary groups); B2 = Chicken batch 2 (n=32, 4-level `Treatment_Bird`, `block` random effect, two negative controls).</w:t>
-      </w:r>
-    </w:p>
-    <w:p>
-      <w:pPr>
-        <w:spacing w:after="120"/>
-      </w:pPr>
-      <w:del w:id="10574" w:author="Revision merge (HM+PL)" w:date="2026-09-09T12:54:58Z">
+      <w:del w:id="10570" w:author="Revision merge (HM+PL)" w:date="2026-09-09T13:15:15Z">
+        <w:r>
+          <w:delText xml:space="preserve">Across both cohorts (**Table 1**), every enabled stage produced its expected primary artefact under identical settings. Feature counts scale with cohort size and grouping complexity: B2 (n=32, 4-level `Treatment_Bird`) yields ~1.5–2× the resistome (648 vs 348 rows), virulome (492 vs 320) and mobilome (137 vs 65) rows of B1, with 53 vs 31 differentially abundant taxa across 6 vs 3 pairwise contrasts and a denser integrated network (576 edges/210 nodes/modularity 0.40 vs 247/100/0.31). The pipeline closes cleanly on both runs, producing a contract-v1.2 `manifest.json` (~80–85 kB) and a Quarto HTML dashboard (~14–18 MB). The performance profile (**Figure 2**) illustrated that the end-to-end runtime grew from 6m 41s on B1 to 8m 19s on B2 (+24 %, sublinear in both sample count and pairwise-contrast count), dominated on both cohorts by ALDEx2 differential abundance (32 % of B1 total, 40 % of B2). Peak R-process memory tracks the same monotone profile — climbing through the gene-element domains as the joint long-form `(sample × gene)` tables grow (~1 GB plateau) and tops out during R/13 panel assembly (1.33 GB on B1, 1.51 GB on B2), where every domain's PNGs and tables are loaded simultaneously to lay out; the `report` stage's modest peak (~0.6 GB) reflects work delegated to the external Quarto process.</w:delText>
+        </w:r>
+      </w:del>
+    </w:p>
+    <w:p>
+      <w:pPr>
+        <w:spacing w:after="120"/>
+      </w:pPr>
+      <w:del w:id="10571" w:author="Revision merge (HM+PL)" w:date="2026-09-09T13:15:15Z">
+        <w:r>
+          <w:delText xml:space="preserve">[FIGURE] **Figure 2.** Pipeline performance on the two validation cohorts. (A) Per-stage wall time (log scale) and (B) peak R-process heap, sorted by B2 runtime. (C) Cumulative wall time and (D) running peak memory in pipeline order. R 4.5.0 single-thread analysis, including PERMANOVA 9999 permutations, ALDEx2 `mc.samples` = 128. B1 = Chicken batch 1 (n=18, 3 dietary groups); B2 = Chicken batch 2 (n=32, 4-level `Treatment_Bird`, `block` random effect, two negative controls).</w:delText>
+        </w:r>
+      </w:del>
+    </w:p>
+    <w:p>
+      <w:pPr>
+        <w:spacing w:after="120"/>
+      </w:pPr>
+      <w:del w:id="10572" w:author="Revision merge (HM+PL)" w:date="2026-09-09T13:15:15Z">
         <w:r>
           <w:delText xml:space="preserve">One expected and deliberate divergence concerns the resistome stage: the ground-truth `cleanData.R` misparses taxids carrying variant suffixes, dropping the corresponding ABRicate rows. R/02 fixes this parsing bug, so the pipeline retains 110 additional (sample, GENE) rows relative to the hand-edited output (`scripts/diff_normdata.R` on the 2026-06-23 B1 run: pipeline = 733 rows, ground truth = 623; 121 rows gained by the parsing fix, 11 rows present in the ground truth that the pipeline currently drops — concentrated in a handful of plasmid replicon and accessory resistance calls, queued for inspection rather than treated as a regression). Jaccard agreement on the `(sample, GENE)` key set is 0.82. Across the other stages with directly comparable ground-truth artefacts, sample-set agreement is exact for alpha diversity (18/18), and Jaccard for the network Gephi exports against the most recent hand-edited snapshot is 0.85 (nodes) and 0.87 (edges). Per-stage comparisons against the remaining hand-edited artefacts — taxonomy, beta diversity, and differential abundance — are deferred to a separate validation effort. The Re-centrifuge column-slicing heuristic in R/02 is acknowledged as still coarse and is queued for rework.</w:delText>
         </w:r>
@@ -4193,7 +4171,27 @@
       <w:pPr>
         <w:spacing w:after="120"/>
       </w:pPr>
-      <w:ins w:id="10575" w:author="Revision merge (HM+PL)" w:date="2026-09-09T12:54:58Z">
+      <w:ins w:id="10573" w:author="Revision merge (HM+PL)" w:date="2026-09-09T13:15:15Z">
+        <w:r>
+          <w:t xml:space="preserve">Across both datasets (**Table 1**), every enabled stage produced its expected primary artefact under identical settings. Feature counts scale with cohort size and grouping complexity: B2 (n=32, 4-level `Treatment_Bird`) yields ~1.5–2× the resistome (648 vs 348 rows), virulome (492 vs 320) and mobilome (137 vs 65) rows of B1, with 53 vs 31 differentially abundant taxa across 6 vs 3 pairwise contrasts and a denser integrated network (576 edges/210 nodes/modularity 0.40 vs 247/100/0.31). The pipeline closes cleanly on both runs, producing a contract-v1.2 `manifest.json` (~80–85 kB) and a Quarto HTML dashboard (~14–18 MB). The performance profile (**Figure 2**) illustrated that the end-to-end runtime grew from 6m 41s on B1 to 8m 19s on B2 (+24 %, sublinear in both sample count and pairwise-contrast count), dominated on both cohorts by ALDEx2 differential abundance (32 % of B1 total, 40 % of B2). Peak R-process memory tracks the same monotone profile, climbing through the gene-element domains as the joint long-form `(sample × gene)` tables grow (~1 GB plateau) and tops out during R/13 panel assembly (1.33 GB on B1, 1.51 GB on B2), where every domain's PNGs and tables are loaded simultaneously to lay out; the `report` stage's modest peak (~0.6 GB) reflects work delegated to the external Quarto process.</w:t>
+        </w:r>
+      </w:ins>
+    </w:p>
+    <w:p>
+      <w:pPr>
+        <w:spacing w:after="120"/>
+      </w:pPr>
+      <w:ins w:id="10574" w:author="Revision merge (HM+PL)" w:date="2026-09-09T13:15:15Z">
+        <w:r>
+          <w:t xml:space="preserve">[FIGURE] **Figure 2.** Pipeline performance across four long-read metagenomic cohorts. (A) Per-stage wall time (log scale) and (B) peak R-process heap, sorted by B2 runtime. (C) Cumulative wall time and (D) running peak memory in pipeline order. R 4.5.0 single-thread analysis, including PERMANOVA 9999 permutations, ALDEx2 `mc.samples` = 128. B1 = Chicken batch 1 (n=18, 3 dietary groups); B2 = Chicken batch 2 (n=32, 4-level `Treatment_Bird`, `block` random effect, two negative controls); HW = Egyptian hospital wastewater (n=20); WL = East Atlantic Flyway wetlands (n=24).</w:t>
+        </w:r>
+      </w:ins>
+    </w:p>
+    <w:p>
+      <w:pPr>
+        <w:spacing w:after="120"/>
+      </w:pPr>
+      <w:ins w:id="10575" w:author="Revision merge (HM+PL)" w:date="2026-09-09T13:15:15Z">
         <w:r>
           <w:t xml:space="preserve">One anticipated and deliberate discrepancy arises at the resistome stage: the ground-truth `cleanData.R` misparses taxids carrying variant suffixes, dropping the corresponding ABRicate rows. R/02 corrects this parsing issue, so the pipeline retains 110 additional (sample, GENE) rows relative to the hand-edited output (`scripts/diff_normdata.R` on the 2026-06-23 B1 run: pipeline = 733 rows, ground truth = 623; 121 rows recovered by the parsing correction, and 11 rows present in the ground truth that the pipeline currently drops, concentrated in a handful of plasmid replicon and accessory resistance calls, queued for inspection rather than treated as a regression). Jaccard agreement on the `(sample, GENE)` key set is 0.82. For other stages with directly comparable ground-truth artefacts, sample-set agreement is exact for alpha diversity (18/18), and Jaccard for the network Gephi exports against the most recent hand-edited snapshot is 0.85 (nodes) and 0.87 (edges). Per-stage comparisons against the remaining hand-edited artefacts — taxonomy, beta diversity, and differential abundance — are deferred to a separate validation effort. The Re-centrifuge column-slicing heuristic in R/02 is acknowledged as still coarse and is queued for rework.</w:t>
         </w:r>
@@ -4203,17 +4201,17 @@
       <w:pPr>
         <w:spacing w:after="120"/>
       </w:pPr>
-      <w:ins w:id="10576" w:author="Revision merge (HM+PL)" w:date="2026-09-09T12:54:58Z">
-        <w:r>
-          <w:t xml:space="preserve">To assess portability beyond the development cohorts, we applied MERIDIAN unmodified — changing only `config.yaml` — to two independent, publicly available long-read (ONT) metagenomic studies spanning the One Health continuum: hospital wastewater versus tap water from five Egyptian hospitals (NCBI BioProject PRJNA1266479; 20 samples) and anthropogenically impacted versus natural wetland sites along the East Atlantic Flyway (ENA BioProject PRJEB96272; 24 samples). Both cohorts completed all fifteen stages in a single run (4m 08s and 5m 54s; peak 2.0 and 3.5 GB), each emitting a Quarto dashboard, publication panels and a contract-v1.2 `manifest.json`. The pipeline recovered biologically coherent structure: hospital wastewater was significantly richer and compositionally distinct from tap water (PERMANOVA R² = 0.18, p = 3 × 10⁻⁴), and — within the wetland subset for which functional (ABRicate CARD/VFDB) profiles were available, currently the German sites — virulence-factor load was higher at anthropogenically impacted than natural sites (PERMANOVA R² = 0.25, p_adj = 0.015; provisional, pending resistome/virulome profiling of the remaining sites). Both datasets also exercised edge cases absent from the chicken cohorts — a single-group resistome/mobilome in the hospital cohort (tap water carried essentially no ARGs) and an absence of plasmid replicons in the wetland water (PlasmidFinder), consistent with the source study — which the pipeline handled by skipping the affected sub-analyses with logged notices rather than failing. As these datasets lack hand-curated ground-truth artefacts, they demonstrate portability and robustness across sample types rather than output-for-output correctness.</w:t>
-        </w:r>
-      </w:ins>
-    </w:p>
-    <w:p>
-      <w:pPr>
-        <w:spacing w:after="120"/>
-      </w:pPr>
-      <w:ins w:id="10577" w:author="Revision merge (HM+PL)" w:date="2026-09-09T12:54:58Z">
+      <w:ins w:id="10576" w:author="Revision merge (HM+PL)" w:date="2026-09-09T13:15:15Z">
+        <w:r>
+          <w:t xml:space="preserve">To assess portability beyond the development cohorts, we applied MERIDIAN unmodified — changing only `config.yaml` — to two independent, publicly available long-read (ONT) metagenomic studies spanning the One Health continuum: hospital wastewater versus tap water from five Egyptian hospitals (NCBI BioProject PRJNA1266479; 20 samples) and anthropogenically impacted versus natural wetland sites along the East Atlantic Flyway (ENA BioProject PRJEB96272; 24 samples). Both cohorts completed all fifteen stages in a single run (4m 08s and 7m 37s; peak 2.0 and 3.6 GB), each emitting a Quarto dashboard, publication panels and a contract-v1.2 `manifest.json`. The pipeline recovered biologically coherent structure: hospital wastewater was significantly richer and compositionally distinct from tap water (PERMANOVA R² = 0.18, p = 3 × 10⁻⁴), and wetland virulence-factor load was higher at anthropogenically impacted than natural sites across the flyway (PERMANOVA R² = 0.088, p_adj = 0.037; functional profiles available for 23 of 24 samples). Both datasets also exercised edge cases absent from the chicken cohorts — a single-group resistome/mobilome in the hospital cohort (tap water carried essentially no ARGs) and an absence of plasmid replicons in the wetland water (PlasmidFinder), consistent with the source study — which the pipeline handled by skipping the affected sub-analyses with logged notices rather than failing. As these datasets lack hand-curated ground-truth artefacts, they demonstrate portability and robustness across sample types rather than output-for-output correctness.</w:t>
+        </w:r>
+      </w:ins>
+    </w:p>
+    <w:p>
+      <w:pPr>
+        <w:spacing w:after="120"/>
+      </w:pPr>
+      <w:ins w:id="10577" w:author="Revision merge (HM+PL)" w:date="2026-09-09T13:15:15Z">
         <w:r>
           <w:t xml:space="preserve">**Table S1.** MERIDIAN applied across four long-read metagenomic cohorts spanning the One Health continuum. B1/B2 are the poultry development cohorts; the Egyptian hospital-wastewater and East Atlantic Flyway wetland cohorts are independent public datasets analysed with configuration changes only.</w:t>
         </w:r>
@@ -4223,7 +4221,7 @@
       <w:pPr>
         <w:spacing w:after="120"/>
       </w:pPr>
-      <w:ins w:id="10578" w:author="Revision merge (HM+PL)" w:date="2026-09-09T12:54:58Z">
+      <w:ins w:id="10578" w:author="Revision merge (HM+PL)" w:date="2026-09-09T13:15:15Z">
         <w:r>
           <w:t xml:space="preserve">| Cohort | One Health axis | n | Primary contrast | Runtime | Peak RAM | Headline result |</w:t>
         </w:r>
@@ -4233,7 +4231,7 @@
       <w:pPr>
         <w:spacing w:after="120"/>
       </w:pPr>
-      <w:ins w:id="10579" w:author="Revision merge (HM+PL)" w:date="2026-09-09T12:54:58Z">
+      <w:ins w:id="10579" w:author="Revision merge (HM+PL)" w:date="2026-09-09T13:15:15Z">
         <w:r>
           <w:t xml:space="preserve">| --- | --- | --- | --- | --- | --- | --- |</w:t>
         </w:r>
@@ -4243,7 +4241,7 @@
       <w:pPr>
         <w:spacing w:after="120"/>
       </w:pPr>
-      <w:ins w:id="10580" w:author="Revision merge (HM+PL)" w:date="2026-09-09T12:54:58Z">
+      <w:ins w:id="10580" w:author="Revision merge (HM+PL)" w:date="2026-09-09T13:15:15Z">
         <w:r>
           <w:t xml:space="preserve">| Chicken batch 1 | Livestock (poultry caecum) | 18 | Diet (3 groups) | 6m 41s | 1.33 GB | Ground-truth reference; R/02 parsing fix recovers 110 (sample, GENE) rows |</w:t>
         </w:r>
@@ -4253,7 +4251,7 @@
       <w:pPr>
         <w:spacing w:after="120"/>
       </w:pPr>
-      <w:ins w:id="10581" w:author="Revision merge (HM+PL)" w:date="2026-09-09T12:54:58Z">
+      <w:ins w:id="10581" w:author="Revision merge (HM+PL)" w:date="2026-09-09T13:15:15Z">
         <w:r>
           <w:t xml:space="preserve">| Chicken batch 2 | Livestock (poultry caecum) | 32 | Treatment × week (4-level) | 8m 19s | 1.51 GB | Sublinear scaling; denser integrated network |</w:t>
         </w:r>
@@ -4263,7 +4261,7 @@
       <w:pPr>
         <w:spacing w:after="120"/>
       </w:pPr>
-      <w:ins w:id="10582" w:author="Revision merge (HM+PL)" w:date="2026-09-09T12:54:58Z">
+      <w:ins w:id="10582" w:author="Revision merge (HM+PL)" w:date="2026-09-09T13:15:15Z">
         <w:r>
           <w:t xml:space="preserve">| Hospital wastewater (EG) | Human-clinical + built environment | 20 | Wastewater vs tap water | 4m 08s | 1.98 GB | Wastewater richer and compositionally distinct (PERMANOVA R² = 0.18, p = 3 × 10⁻⁴) |</w:t>
         </w:r>
@@ -4273,9 +4271,9 @@
       <w:pPr>
         <w:spacing w:after="120"/>
       </w:pPr>
-      <w:ins w:id="10583" w:author="Revision merge (HM+PL)" w:date="2026-09-09T12:54:58Z">
-        <w:r>
-          <w:t xml:space="preserve">| Wetlands (E. Atlantic Flyway) | Wildlife + environment | 24 | Impacted vs natural | 5m 54s | 3.46 GB | Higher virulome load at impacted sites (R² = 0.25, p_adj = 0.015; German subset, provisional) |</w:t>
+      <w:ins w:id="10583" w:author="Revision merge (HM+PL)" w:date="2026-09-09T13:15:15Z">
+        <w:r>
+          <w:t xml:space="preserve">| Wetlands (E. Atlantic Flyway) | Wildlife + environment | 24 | Impacted vs natural | 7m 37s | 3.59 GB | Higher virulome load at impacted sites (PERMANOVA R² = 0.088, p_adj = 0.037) |</w:t>
         </w:r>
       </w:ins>
     </w:p>
@@ -4301,12 +4299,12 @@
       <w:r>
         <w:t xml:space="preserve">MERIDIAN </w:t>
       </w:r>
-      <w:del w:id="10584" w:author="Revision merge (HM+PL)" w:date="2026-09-09T12:54:58Z">
+      <w:del w:id="10584" w:author="Revision merge (HM+PL)" w:date="2026-09-09T13:15:15Z">
         <w:r>
           <w:delText xml:space="preserve">consolidates</w:delText>
         </w:r>
       </w:del>
-      <w:ins w:id="10585" w:author="Revision merge (HM+PL)" w:date="2026-09-09T12:54:58Z">
+      <w:ins w:id="10585" w:author="Revision merge (HM+PL)" w:date="2026-09-09T13:15:15Z">
         <w:r>
           <w:t xml:space="preserve">integrates</w:t>
         </w:r>
@@ -4314,12 +4312,12 @@
       <w:r>
         <w:t xml:space="preserve"> community analyses, functional profiling, and an integrated network reconstruction into </w:t>
       </w:r>
-      <w:del w:id="10586" w:author="Revision merge (HM+PL)" w:date="2026-09-09T12:54:58Z">
+      <w:del w:id="10586" w:author="Revision merge (HM+PL)" w:date="2026-09-09T13:15:15Z">
         <w:r>
           <w:delText xml:space="preserve">one</w:delText>
         </w:r>
       </w:del>
-      <w:ins w:id="10587" w:author="Revision merge (HM+PL)" w:date="2026-09-09T12:54:58Z">
+      <w:ins w:id="10587" w:author="Revision merge (HM+PL)" w:date="2026-09-09T13:15:15Z">
         <w:r>
           <w:t xml:space="preserve">a single</w:t>
         </w:r>
@@ -4327,12 +4325,12 @@
       <w:r>
         <w:t xml:space="preserve"> configuration-driven R </w:t>
       </w:r>
-      <w:del w:id="10588" w:author="Revision merge (HM+PL)" w:date="2026-09-09T12:54:58Z">
+      <w:del w:id="10588" w:author="Revision merge (HM+PL)" w:date="2026-09-09T13:15:15Z">
         <w:r>
           <w:delText xml:space="preserve">project</w:delText>
         </w:r>
       </w:del>
-      <w:ins w:id="10589" w:author="Revision merge (HM+PL)" w:date="2026-09-09T12:54:58Z">
+      <w:ins w:id="10589" w:author="Revision merge (HM+PL)" w:date="2026-09-09T13:15:15Z">
         <w:r>
           <w:t xml:space="preserve">workflow</w:t>
         </w:r>
@@ -4340,7 +4338,7 @@
       <w:r>
         <w:t xml:space="preserve"> for long-read shotgun metagenomics. Single-thread end-to-end execution completes in minutes with a low memory footprint, scaling sublinearly with cohort size and grouping complexity. </w:t>
       </w:r>
-      <w:ins w:id="10590" w:author="Revision merge (HM+PL)" w:date="2026-09-09T12:54:58Z">
+      <w:ins w:id="10590" w:author="Revision merge (HM+PL)" w:date="2026-09-09T13:15:15Z">
         <w:r>
           <w:t xml:space="preserve">Beyond the development cohorts, it has been applied without modification to two independent public cohorts spanning the One Health continuum (hospital wastewater and wetland surveillance). </w:t>
         </w:r>
@@ -4348,12 +4346,12 @@
       <w:r>
         <w:t xml:space="preserve">It is </w:t>
       </w:r>
-      <w:del w:id="10591" w:author="Revision merge (HM+PL)" w:date="2026-09-09T12:54:58Z">
+      <w:del w:id="10591" w:author="Revision merge (HM+PL)" w:date="2026-09-09T13:15:15Z">
         <w:r>
           <w:delText xml:space="preserve">in</w:delText>
         </w:r>
       </w:del>
-      <w:ins w:id="10592" w:author="Revision merge (HM+PL)" w:date="2026-09-09T12:54:58Z">
+      <w:ins w:id="10592" w:author="Revision merge (HM+PL)" w:date="2026-09-09T13:15:15Z">
         <w:r>
           <w:t xml:space="preserve">currently under</w:t>
         </w:r>
@@ -4361,12 +4359,12 @@
       <w:r>
         <w:t xml:space="preserve"> active </w:t>
       </w:r>
-      <w:del w:id="10593" w:author="Revision merge (HM+PL)" w:date="2026-09-09T12:54:58Z">
+      <w:del w:id="10593" w:author="Revision merge (HM+PL)" w:date="2026-09-09T13:15:15Z">
         <w:r>
           <w:delText xml:space="preserve">development;</w:delText>
         </w:r>
       </w:del>
-      <w:ins w:id="10594" w:author="Revision merge (HM+PL)" w:date="2026-09-09T12:54:58Z">
+      <w:ins w:id="10594" w:author="Revision merge (HM+PL)" w:date="2026-09-09T13:15:15Z">
         <w:r>
           <w:t xml:space="preserve">development, and</w:t>
         </w:r>
@@ -4374,12 +4372,12 @@
       <w:r>
         <w:t xml:space="preserve"> we are releasing this </w:t>
       </w:r>
-      <w:del w:id="10595" w:author="Revision merge (HM+PL)" w:date="2026-09-09T12:54:58Z">
+      <w:del w:id="10595" w:author="Revision merge (HM+PL)" w:date="2026-09-09T13:15:15Z">
         <w:r>
           <w:delText xml:space="preserve">alpha-stage</w:delText>
         </w:r>
       </w:del>
-      <w:ins w:id="10596" w:author="Revision merge (HM+PL)" w:date="2026-09-09T12:54:58Z">
+      <w:ins w:id="10596" w:author="Revision merge (HM+PL)" w:date="2026-09-09T13:15:15Z">
         <w:r>
           <w:t xml:space="preserve">alpha</w:t>
         </w:r>
@@ -4387,12 +4385,12 @@
       <w:r>
         <w:t xml:space="preserve"> </w:t>
       </w:r>
-      <w:del w:id="10597" w:author="Revision merge (HM+PL)" w:date="2026-09-09T12:54:58Z">
+      <w:del w:id="10597" w:author="Revision merge (HM+PL)" w:date="2026-09-09T13:15:15Z">
         <w:r>
           <w:delText xml:space="preserve">workflow</w:delText>
         </w:r>
       </w:del>
-      <w:ins w:id="10598" w:author="Revision merge (HM+PL)" w:date="2026-09-09T12:54:58Z">
+      <w:ins w:id="10598" w:author="Revision merge (HM+PL)" w:date="2026-09-09T13:15:15Z">
         <w:r>
           <w:t xml:space="preserve">version</w:t>
         </w:r>
@@ -4400,7 +4398,7 @@
       <w:r>
         <w:t xml:space="preserve"> (v0.1.0) </w:t>
       </w:r>
-      <w:del w:id="10599" w:author="Revision merge (HM+PL)" w:date="2026-09-09T12:54:58Z">
+      <w:del w:id="10599" w:author="Revision merge (HM+PL)" w:date="2026-09-09T13:15:15Z">
         <w:r>
           <w:delText xml:space="preserve">now </w:delText>
         </w:r>
@@ -4408,12 +4406,12 @@
       <w:r>
         <w:t xml:space="preserve">to </w:t>
       </w:r>
-      <w:del w:id="10600" w:author="Revision merge (HM+PL)" w:date="2026-09-09T12:54:58Z">
+      <w:del w:id="10600" w:author="Revision merge (HM+PL)" w:date="2026-09-09T13:15:15Z">
         <w:r>
           <w:delText xml:space="preserve">invite</w:delText>
         </w:r>
       </w:del>
-      <w:ins w:id="10601" w:author="Revision merge (HM+PL)" w:date="2026-09-09T12:54:58Z">
+      <w:ins w:id="10601" w:author="Revision merge (HM+PL)" w:date="2026-09-09T13:15:15Z">
         <w:r>
           <w:t xml:space="preserve">solicit</w:t>
         </w:r>
@@ -4421,12 +4419,12 @@
       <w:r>
         <w:t xml:space="preserve"> feedback from </w:t>
       </w:r>
-      <w:del w:id="10602" w:author="Revision merge (HM+PL)" w:date="2026-09-09T12:54:58Z">
+      <w:del w:id="10602" w:author="Revision merge (HM+PL)" w:date="2026-09-09T13:15:15Z">
         <w:r>
           <w:delText xml:space="preserve">groups</w:delText>
         </w:r>
       </w:del>
-      <w:ins w:id="10603" w:author="Revision merge (HM+PL)" w:date="2026-09-09T12:54:58Z">
+      <w:ins w:id="10603" w:author="Revision merge (HM+PL)" w:date="2026-09-09T13:15:15Z">
         <w:r>
           <w:t xml:space="preserve">researchers</w:t>
         </w:r>
@@ -4434,12 +4432,12 @@
       <w:r>
         <w:t xml:space="preserve"> </w:t>
       </w:r>
-      <w:del w:id="10604" w:author="Revision merge (HM+PL)" w:date="2026-09-09T12:54:58Z">
+      <w:del w:id="10604" w:author="Revision merge (HM+PL)" w:date="2026-09-09T13:15:15Z">
         <w:r>
           <w:delText xml:space="preserve">running</w:delText>
         </w:r>
       </w:del>
-      <w:ins w:id="10605" w:author="Revision merge (HM+PL)" w:date="2026-09-09T12:54:58Z">
+      <w:ins w:id="10605" w:author="Revision merge (HM+PL)" w:date="2026-09-09T13:15:15Z">
         <w:r>
           <w:t xml:space="preserve">conducting</w:t>
         </w:r>
@@ -4447,12 +4445,12 @@
       <w:r>
         <w:t xml:space="preserve"> comparable </w:t>
       </w:r>
-      <w:del w:id="10606" w:author="Revision merge (HM+PL)" w:date="2026-09-09T12:54:58Z">
+      <w:del w:id="10606" w:author="Revision merge (HM+PL)" w:date="2026-09-09T13:15:15Z">
         <w:r>
           <w:delText xml:space="preserve">analyses.</w:delText>
         </w:r>
       </w:del>
-      <w:ins w:id="10607" w:author="Revision merge (HM+PL)" w:date="2026-09-09T12:54:58Z">
+      <w:ins w:id="10607" w:author="Revision merge (HM+PL)" w:date="2026-09-09T13:15:15Z">
         <w:r>
           <w:t xml:space="preserve">long-read metagenomic studies and to guide future development of the workflow.</w:t>
         </w:r>
@@ -4472,12 +4470,12 @@
       <w:r>
         <w:t xml:space="preserve">**Acknowledgements.** The authors thank the **Centre for Innovation in Genomics and Microbiome Sciences (CIGMiS)**, which generated the chicken caecum metagenomics datasets used to develop and validate the pipeline. We are grateful to **colleagues** for feedback on the configuration interface and Quarto report layout, and to the School of </w:t>
       </w:r>
-      <w:del w:id="10608" w:author="Revision merge (HM+PL)" w:date="2026-09-09T12:54:58Z">
+      <w:del w:id="10608" w:author="Revision merge (HM+PL)" w:date="2026-09-09T13:15:15Z">
         <w:r>
           <w:delText xml:space="preserve">Biomedical</w:delText>
         </w:r>
       </w:del>
-      <w:ins w:id="10609" w:author="Revision merge (HM+PL)" w:date="2026-09-09T12:54:58Z">
+      <w:ins w:id="10609" w:author="Revision merge (HM+PL)" w:date="2026-09-09T13:15:15Z">
         <w:r>
           <w:t xml:space="preserve">Medicine</w:t>
         </w:r>
@@ -4485,12 +4483,12 @@
       <w:r>
         <w:t xml:space="preserve"> </w:t>
       </w:r>
-      <w:del w:id="10610" w:author="Revision merge (HM+PL)" w:date="2026-09-09T12:54:58Z">
+      <w:del w:id="10610" w:author="Revision merge (HM+PL)" w:date="2026-09-09T13:15:15Z">
         <w:r>
           <w:delText xml:space="preserve">Science</w:delText>
         </w:r>
       </w:del>
-      <w:ins w:id="10611" w:author="Revision merge (HM+PL)" w:date="2026-09-09T12:54:58Z">
+      <w:ins w:id="10611" w:author="Revision merge (HM+PL)" w:date="2026-09-09T13:15:15Z">
         <w:r>
           <w:t xml:space="preserve">and Bioscience</w:t>
         </w:r>
@@ -4519,7 +4517,7 @@
       <w:pPr>
         <w:spacing w:after="120"/>
       </w:pPr>
-      <w:ins w:id="10612" w:author="Revision merge (HM+PL)" w:date="2026-09-09T12:54:58Z">
+      <w:ins w:id="10612" w:author="Revision merge (HM+PL)" w:date="2026-09-09T13:15:15Z">
         <w:r>
           <w:t xml:space="preserve">**Data Availability.** Sequence data for the primary validation cohort (`Chicken batch 1`) are available from NCBI under BioProject PRJNA1406192. Data for the second cohort (`Chicken batch 2`) will be released upon publication of the associated study. The MERIDIAN source code, documentation and configuration examples are available at https://github.com/Julio92-C/Metagenomics_pipeline_automation (release v0.1.0).</w:t>
         </w:r>

</xml_diff>

<commit_message>
docs(manuscript): note the single IncP1 hit in the wetlands mobilome sentence
Reword §3 from "absence of plasmid replicons" to "near-absence … a single
IncP1 hit via PlasmidFinder, too sparse to profile" — accurate to the raw
ABRicate (one IncP1 in FA1_1) while still matching the empty mobilome stage
and the source study. Refresh both tracked-changes docx.

Co-Authored-By: Claude Opus 4.8 <noreply@anthropic.com>
Claude-Session: https://claude.ai/code/session_011iYU9ZmVnXfPXhgvAmJ24Q
</commit_message>
<xml_diff>
--- a/docs/manuscript/applications_note_merged_tracked.docx
+++ b/docs/manuscript/applications_note_merged_tracked.docx
@@ -32,12 +32,12 @@
       <w:r>
         <w:t xml:space="preserve">Julio C. Ortega Cambara&lt;sup&gt;1&lt;/sup&gt;, Piotr </w:t>
       </w:r>
-      <w:del w:id="10001" w:author="Revision merge (HM+PL)" w:date="2026-09-09T13:15:15Z">
+      <w:del w:id="10001" w:author="Revision merge (HM+PL)" w:date="2026-09-09T13:17:57Z">
         <w:r>
           <w:delText xml:space="preserve">Cuber&lt;sup&gt;4&lt;/sup&gt;,</w:delText>
         </w:r>
       </w:del>
-      <w:ins w:id="10002" w:author="Revision merge (HM+PL)" w:date="2026-09-09T13:15:15Z">
+      <w:ins w:id="10002" w:author="Revision merge (HM+PL)" w:date="2026-09-09T13:17:57Z">
         <w:r>
           <w:t xml:space="preserve">Cuber&lt;sup&gt;2&lt;/sup&gt;,</w:t>
         </w:r>
@@ -45,7 +45,7 @@
       <w:r>
         <w:t xml:space="preserve"> Pedro Humberto Lebre&lt;sup&gt;1&lt;/sup&gt;, </w:t>
       </w:r>
-      <w:del w:id="10003" w:author="Revision merge (HM+PL)" w:date="2026-09-09T13:15:15Z">
+      <w:del w:id="10003" w:author="Revision merge (HM+PL)" w:date="2026-09-09T13:17:57Z">
         <w:r>
           <w:delText xml:space="preserve">Raju Misra&lt;sup&gt;2&lt;/sup&gt;, Timothy D. McHugh&lt;sup&gt;3&lt;/sup&gt;, Sylvia Rofael&lt;sup&gt;3&lt;/sup&gt;, David Lowe&lt;sup&gt;3&lt;/sup&gt;, </w:delText>
         </w:r>
@@ -53,7 +53,7 @@
       <w:r>
         <w:t xml:space="preserve">Hermine </w:t>
       </w:r>
-      <w:ins w:id="10004" w:author="Revision merge (HM+PL)" w:date="2026-09-09T13:15:15Z">
+      <w:ins w:id="10004" w:author="Revision merge (HM+PL)" w:date="2026-09-09T13:17:57Z">
         <w:r>
           <w:t xml:space="preserve">V </w:t>
         </w:r>
@@ -66,12 +66,12 @@
       <w:pPr>
         <w:spacing w:after="120"/>
       </w:pPr>
-      <w:del w:id="10005" w:author="Revision merge (HM+PL)" w:date="2026-09-09T13:15:15Z">
+      <w:del w:id="10005" w:author="Revision merge (HM+PL)" w:date="2026-09-09T13:17:57Z">
         <w:r>
           <w:delText xml:space="preserve">&lt;sup&gt;1&lt;/sup&gt;School</w:delText>
         </w:r>
       </w:del>
-      <w:ins w:id="10006" w:author="Revision merge (HM+PL)" w:date="2026-09-09T13:15:15Z">
+      <w:ins w:id="10006" w:author="Revision merge (HM+PL)" w:date="2026-09-09T13:17:57Z">
         <w:r>
           <w:t xml:space="preserve">&lt;sup&gt;1&lt;/sup&gt;Centre for Innovation in Genomics and Microbiome Sciences, School</w:t>
         </w:r>
@@ -79,12 +79,12 @@
       <w:r>
         <w:t xml:space="preserve"> of </w:t>
       </w:r>
-      <w:del w:id="10007" w:author="Revision merge (HM+PL)" w:date="2026-09-09T13:15:15Z">
+      <w:del w:id="10007" w:author="Revision merge (HM+PL)" w:date="2026-09-09T13:17:57Z">
         <w:r>
           <w:delText xml:space="preserve">Biomedical</w:delText>
         </w:r>
       </w:del>
-      <w:ins w:id="10008" w:author="Revision merge (HM+PL)" w:date="2026-09-09T13:15:15Z">
+      <w:ins w:id="10008" w:author="Revision merge (HM+PL)" w:date="2026-09-09T13:17:57Z">
         <w:r>
           <w:t xml:space="preserve">Medicine</w:t>
         </w:r>
@@ -92,12 +92,12 @@
       <w:r>
         <w:t xml:space="preserve"> </w:t>
       </w:r>
-      <w:del w:id="10009" w:author="Revision merge (HM+PL)" w:date="2026-09-09T13:15:15Z">
+      <w:del w:id="10009" w:author="Revision merge (HM+PL)" w:date="2026-09-09T13:17:57Z">
         <w:r>
           <w:delText xml:space="preserve">Science,</w:delText>
         </w:r>
       </w:del>
-      <w:ins w:id="10010" w:author="Revision merge (HM+PL)" w:date="2026-09-09T13:15:15Z">
+      <w:ins w:id="10010" w:author="Revision merge (HM+PL)" w:date="2026-09-09T13:17:57Z">
         <w:r>
           <w:t xml:space="preserve">and Bioscience,</w:t>
         </w:r>
@@ -105,12 +105,12 @@
       <w:r>
         <w:t xml:space="preserve"> University of West London, London, United Kingdom </w:t>
       </w:r>
-      <w:del w:id="10011" w:author="Revision merge (HM+PL)" w:date="2026-09-09T13:15:15Z">
+      <w:del w:id="10011" w:author="Revision merge (HM+PL)" w:date="2026-09-09T13:17:57Z">
         <w:r>
           <w:delText xml:space="preserve">&lt;sup&gt;2&lt;/sup&gt;UK Health Security Agency, London, United Kingdom &lt;sup&gt;3&lt;/sup&gt;Centre for Clinical Microbiology, University College London, London, United Kingdom &lt;sup&gt;4&lt;/sup&gt;Natural</w:delText>
         </w:r>
       </w:del>
-      <w:ins w:id="10012" w:author="Revision merge (HM+PL)" w:date="2026-09-09T13:15:15Z">
+      <w:ins w:id="10012" w:author="Revision merge (HM+PL)" w:date="2026-09-09T13:17:57Z">
         <w:r>
           <w:t xml:space="preserve">&lt;sup&gt;2&lt;/sup&gt;Natural</w:t>
         </w:r>
@@ -161,12 +161,12 @@
       <w:pPr>
         <w:spacing w:after="120"/>
       </w:pPr>
-      <w:del w:id="10013" w:author="Revision merge (HM+PL)" w:date="2026-09-09T13:15:15Z">
+      <w:del w:id="10013" w:author="Revision merge (HM+PL)" w:date="2026-09-09T13:17:57Z">
         <w:r>
           <w:delText xml:space="preserve">**Motivation.**</w:delText>
         </w:r>
       </w:del>
-      <w:ins w:id="10014" w:author="Revision merge (HM+PL)" w:date="2026-09-09T13:15:15Z">
+      <w:ins w:id="10014" w:author="Revision merge (HM+PL)" w:date="2026-09-09T13:17:57Z">
         <w:r>
           <w:t xml:space="preserve">**Background:**</w:t>
         </w:r>
@@ -174,12 +174,12 @@
       <w:r>
         <w:t xml:space="preserve"> Long-read shotgun metagenomics studies are </w:t>
       </w:r>
-      <w:del w:id="10015" w:author="Revision merge (HM+PL)" w:date="2026-09-09T13:15:15Z">
+      <w:del w:id="10015" w:author="Revision merge (HM+PL)" w:date="2026-09-09T13:17:57Z">
         <w:r>
           <w:delText xml:space="preserve">typically</w:delText>
         </w:r>
       </w:del>
-      <w:ins w:id="10016" w:author="Revision merge (HM+PL)" w:date="2026-09-09T13:15:15Z">
+      <w:ins w:id="10016" w:author="Revision merge (HM+PL)" w:date="2026-09-09T13:17:57Z">
         <w:r>
           <w:t xml:space="preserve">often</w:t>
         </w:r>
@@ -187,12 +187,12 @@
       <w:r>
         <w:t xml:space="preserve"> analysed </w:t>
       </w:r>
-      <w:del w:id="10017" w:author="Revision merge (HM+PL)" w:date="2026-09-09T13:15:15Z">
+      <w:del w:id="10017" w:author="Revision merge (HM+PL)" w:date="2026-09-09T13:17:57Z">
         <w:r>
           <w:delText xml:space="preserve">by</w:delText>
         </w:r>
       </w:del>
-      <w:ins w:id="10018" w:author="Revision merge (HM+PL)" w:date="2026-09-09T13:15:15Z">
+      <w:ins w:id="10018" w:author="Revision merge (HM+PL)" w:date="2026-09-09T13:17:57Z">
         <w:r>
           <w:t xml:space="preserve">using</w:t>
         </w:r>
@@ -200,12 +200,12 @@
       <w:r>
         <w:t xml:space="preserve"> </w:t>
       </w:r>
-      <w:del w:id="10019" w:author="Revision merge (HM+PL)" w:date="2026-09-09T13:15:15Z">
+      <w:del w:id="10019" w:author="Revision merge (HM+PL)" w:date="2026-09-09T13:17:57Z">
         <w:r>
           <w:delText xml:space="preserve">hand-editing</w:delText>
         </w:r>
       </w:del>
-      <w:ins w:id="10020" w:author="Revision merge (HM+PL)" w:date="2026-09-09T13:15:15Z">
+      <w:ins w:id="10020" w:author="Revision merge (HM+PL)" w:date="2026-09-09T13:17:57Z">
         <w:r>
           <w:t xml:space="preserve">project-specific</w:t>
         </w:r>
@@ -213,12 +213,12 @@
       <w:r>
         <w:t xml:space="preserve"> </w:t>
       </w:r>
-      <w:del w:id="10021" w:author="Revision merge (HM+PL)" w:date="2026-09-09T13:15:15Z">
+      <w:del w:id="10021" w:author="Revision merge (HM+PL)" w:date="2026-09-09T13:17:57Z">
         <w:r>
           <w:delText xml:space="preserve">dozens</w:delText>
         </w:r>
       </w:del>
-      <w:ins w:id="10022" w:author="Revision merge (HM+PL)" w:date="2026-09-09T13:15:15Z">
+      <w:ins w:id="10022" w:author="Revision merge (HM+PL)" w:date="2026-09-09T13:17:57Z">
         <w:r>
           <w:t xml:space="preserve">collections</w:t>
         </w:r>
@@ -226,7 +226,7 @@
       <w:r>
         <w:t xml:space="preserve"> of </w:t>
       </w:r>
-      <w:ins w:id="10023" w:author="Revision merge (HM+PL)" w:date="2026-09-09T13:15:15Z">
+      <w:ins w:id="10023" w:author="Revision merge (HM+PL)" w:date="2026-09-09T13:17:57Z">
         <w:r>
           <w:t xml:space="preserve">manually edited </w:t>
         </w:r>
@@ -234,12 +234,12 @@
       <w:r>
         <w:t xml:space="preserve">R </w:t>
       </w:r>
-      <w:del w:id="10024" w:author="Revision merge (HM+PL)" w:date="2026-09-09T13:15:15Z">
+      <w:del w:id="10024" w:author="Revision merge (HM+PL)" w:date="2026-09-09T13:17:57Z">
         <w:r>
           <w:delText xml:space="preserve">scripts</w:delText>
         </w:r>
       </w:del>
-      <w:ins w:id="10025" w:author="Revision merge (HM+PL)" w:date="2026-09-09T13:15:15Z">
+      <w:ins w:id="10025" w:author="Revision merge (HM+PL)" w:date="2026-09-09T13:17:57Z">
         <w:r>
           <w:t xml:space="preserve">scripts,</w:t>
         </w:r>
@@ -247,12 +247,12 @@
       <w:r>
         <w:t xml:space="preserve"> </w:t>
       </w:r>
-      <w:del w:id="10026" w:author="Revision merge (HM+PL)" w:date="2026-09-09T13:15:15Z">
+      <w:del w:id="10026" w:author="Revision merge (HM+PL)" w:date="2026-09-09T13:17:57Z">
         <w:r>
           <w:delText xml:space="preserve">per</w:delText>
         </w:r>
       </w:del>
-      <w:ins w:id="10027" w:author="Revision merge (HM+PL)" w:date="2026-09-09T13:15:15Z">
+      <w:ins w:id="10027" w:author="Revision merge (HM+PL)" w:date="2026-09-09T13:17:57Z">
         <w:r>
           <w:t xml:space="preserve">requiring</w:t>
         </w:r>
@@ -260,12 +260,12 @@
       <w:r>
         <w:t xml:space="preserve"> </w:t>
       </w:r>
-      <w:del w:id="10028" w:author="Revision merge (HM+PL)" w:date="2026-09-09T13:15:15Z">
+      <w:del w:id="10028" w:author="Revision merge (HM+PL)" w:date="2026-09-09T13:17:57Z">
         <w:r>
           <w:delText xml:space="preserve">project</w:delText>
         </w:r>
       </w:del>
-      <w:ins w:id="10029" w:author="Revision merge (HM+PL)" w:date="2026-09-09T13:15:15Z">
+      <w:ins w:id="10029" w:author="Revision merge (HM+PL)" w:date="2026-09-09T13:17:57Z">
         <w:r>
           <w:t xml:space="preserve">repeated</w:t>
         </w:r>
@@ -273,12 +273,12 @@
       <w:r>
         <w:t xml:space="preserve"> </w:t>
       </w:r>
-      <w:del w:id="10030" w:author="Revision merge (HM+PL)" w:date="2026-09-09T13:15:15Z">
+      <w:del w:id="10030" w:author="Revision merge (HM+PL)" w:date="2026-09-09T13:17:57Z">
         <w:r>
           <w:delText xml:space="preserve">—</w:delText>
         </w:r>
       </w:del>
-      <w:ins w:id="10031" w:author="Revision merge (HM+PL)" w:date="2026-09-09T13:15:15Z">
+      <w:ins w:id="10031" w:author="Revision merge (HM+PL)" w:date="2026-09-09T13:17:57Z">
         <w:r>
           <w:t xml:space="preserve">modifications</w:t>
         </w:r>
@@ -286,12 +286,12 @@
       <w:r>
         <w:t xml:space="preserve"> </w:t>
       </w:r>
-      <w:del w:id="10032" w:author="Revision merge (HM+PL)" w:date="2026-09-09T13:15:15Z">
+      <w:del w:id="10032" w:author="Revision merge (HM+PL)" w:date="2026-09-09T13:17:57Z">
         <w:r>
           <w:delText xml:space="preserve">pasting</w:delText>
         </w:r>
       </w:del>
-      <w:ins w:id="10033" w:author="Revision merge (HM+PL)" w:date="2026-09-09T13:15:15Z">
+      <w:ins w:id="10033" w:author="Revision merge (HM+PL)" w:date="2026-09-09T13:17:57Z">
         <w:r>
           <w:t xml:space="preserve">of</w:t>
         </w:r>
@@ -299,12 +299,12 @@
       <w:r>
         <w:t xml:space="preserve"> sample identifiers, </w:t>
       </w:r>
-      <w:del w:id="10034" w:author="Revision merge (HM+PL)" w:date="2026-09-09T13:15:15Z">
+      <w:del w:id="10034" w:author="Revision merge (HM+PL)" w:date="2026-09-09T13:17:57Z">
         <w:r>
           <w:delText xml:space="preserve">patching</w:delText>
         </w:r>
       </w:del>
-      <w:ins w:id="10035" w:author="Revision merge (HM+PL)" w:date="2026-09-09T13:15:15Z">
+      <w:ins w:id="10035" w:author="Revision merge (HM+PL)" w:date="2026-09-09T13:17:57Z">
         <w:r>
           <w:t xml:space="preserve">taxonomic</w:t>
         </w:r>
@@ -312,12 +312,12 @@
       <w:r>
         <w:t xml:space="preserve"> </w:t>
       </w:r>
-      <w:del w:id="10036" w:author="Revision merge (HM+PL)" w:date="2026-09-09T13:15:15Z">
+      <w:del w:id="10036" w:author="Revision merge (HM+PL)" w:date="2026-09-09T13:17:57Z">
         <w:r>
           <w:delText xml:space="preserve">taxonomy strings</w:delText>
         </w:r>
       </w:del>
-      <w:ins w:id="10037" w:author="Revision merge (HM+PL)" w:date="2026-09-09T13:15:15Z">
+      <w:ins w:id="10037" w:author="Revision merge (HM+PL)" w:date="2026-09-09T13:17:57Z">
         <w:r>
           <w:t xml:space="preserve">annotations</w:t>
         </w:r>
@@ -325,12 +325,12 @@
       <w:r>
         <w:t xml:space="preserve"> and </w:t>
       </w:r>
-      <w:del w:id="10038" w:author="Revision merge (HM+PL)" w:date="2026-09-09T13:15:15Z">
+      <w:del w:id="10038" w:author="Revision merge (HM+PL)" w:date="2026-09-09T13:17:57Z">
         <w:r>
           <w:delText xml:space="preserve">copying</w:delText>
         </w:r>
       </w:del>
-      <w:ins w:id="10039" w:author="Revision merge (HM+PL)" w:date="2026-09-09T13:15:15Z">
+      <w:ins w:id="10039" w:author="Revision merge (HM+PL)" w:date="2026-09-09T13:17:57Z">
         <w:r>
           <w:t xml:space="preserve">analysis</w:t>
         </w:r>
@@ -338,12 +338,12 @@
       <w:r>
         <w:t xml:space="preserve"> </w:t>
       </w:r>
-      <w:del w:id="10040" w:author="Revision merge (HM+PL)" w:date="2026-09-09T13:15:15Z">
+      <w:del w:id="10040" w:author="Revision merge (HM+PL)" w:date="2026-09-09T13:17:57Z">
         <w:r>
           <w:delText xml:space="preserve">chunks</w:delText>
         </w:r>
       </w:del>
-      <w:ins w:id="10041" w:author="Revision merge (HM+PL)" w:date="2026-09-09T13:15:15Z">
+      <w:ins w:id="10041" w:author="Revision merge (HM+PL)" w:date="2026-09-09T13:17:57Z">
         <w:r>
           <w:t xml:space="preserve">parameters,</w:t>
         </w:r>
@@ -351,12 +351,12 @@
       <w:r>
         <w:t xml:space="preserve"> </w:t>
       </w:r>
-      <w:del w:id="10042" w:author="Revision merge (HM+PL)" w:date="2026-09-09T13:15:15Z">
+      <w:del w:id="10042" w:author="Revision merge (HM+PL)" w:date="2026-09-09T13:17:57Z">
         <w:r>
           <w:delText xml:space="preserve">between</w:delText>
         </w:r>
       </w:del>
-      <w:ins w:id="10043" w:author="Revision merge (HM+PL)" w:date="2026-09-09T13:15:15Z">
+      <w:ins w:id="10043" w:author="Revision merge (HM+PL)" w:date="2026-09-09T13:17:57Z">
         <w:r>
           <w:t xml:space="preserve">or</w:t>
         </w:r>
@@ -364,12 +364,12 @@
       <w:r>
         <w:t xml:space="preserve"> </w:t>
       </w:r>
-      <w:del w:id="10044" w:author="Revision merge (HM+PL)" w:date="2026-09-09T13:15:15Z">
+      <w:del w:id="10044" w:author="Revision merge (HM+PL)" w:date="2026-09-09T13:17:57Z">
         <w:r>
           <w:delText xml:space="preserve">studies.</w:delText>
         </w:r>
       </w:del>
-      <w:ins w:id="10045" w:author="Revision merge (HM+PL)" w:date="2026-09-09T13:15:15Z">
+      <w:ins w:id="10045" w:author="Revision merge (HM+PL)" w:date="2026-09-09T13:17:57Z">
         <w:r>
           <w:t xml:space="preserve">else rely on resource-heavy pipelines that require access to high-performance computing (HPC) infrastructure.</w:t>
         </w:r>
@@ -377,12 +377,12 @@
       <w:r>
         <w:t xml:space="preserve"> Existing R workflows </w:t>
       </w:r>
-      <w:del w:id="10046" w:author="Revision merge (HM+PL)" w:date="2026-09-09T13:15:15Z">
+      <w:del w:id="10046" w:author="Revision merge (HM+PL)" w:date="2026-09-09T13:17:57Z">
         <w:r>
           <w:delText xml:space="preserve">largely</w:delText>
         </w:r>
       </w:del>
-      <w:ins w:id="10047" w:author="Revision merge (HM+PL)" w:date="2026-09-09T13:15:15Z">
+      <w:ins w:id="10047" w:author="Revision merge (HM+PL)" w:date="2026-09-09T13:17:57Z">
         <w:r>
           <w:t xml:space="preserve">predominantly</w:t>
         </w:r>
@@ -390,12 +390,12 @@
       <w:r>
         <w:t xml:space="preserve"> </w:t>
       </w:r>
-      <w:del w:id="10048" w:author="Revision merge (HM+PL)" w:date="2026-09-09T13:15:15Z">
+      <w:del w:id="10048" w:author="Revision merge (HM+PL)" w:date="2026-09-09T13:17:57Z">
         <w:r>
           <w:delText xml:space="preserve">target</w:delText>
         </w:r>
       </w:del>
-      <w:ins w:id="10049" w:author="Revision merge (HM+PL)" w:date="2026-09-09T13:15:15Z">
+      <w:ins w:id="10049" w:author="Revision merge (HM+PL)" w:date="2026-09-09T13:17:57Z">
         <w:r>
           <w:t xml:space="preserve">focus on</w:t>
         </w:r>
@@ -403,12 +403,12 @@
       <w:r>
         <w:t xml:space="preserve"> short-read amplicon data or </w:t>
       </w:r>
-      <w:del w:id="10050" w:author="Revision merge (HM+PL)" w:date="2026-09-09T13:15:15Z">
+      <w:del w:id="10050" w:author="Revision merge (HM+PL)" w:date="2026-09-09T13:17:57Z">
         <w:r>
           <w:delText xml:space="preserve">a</w:delText>
         </w:r>
       </w:del>
-      <w:ins w:id="10051" w:author="Revision merge (HM+PL)" w:date="2026-09-09T13:15:15Z">
+      <w:ins w:id="10051" w:author="Revision merge (HM+PL)" w:date="2026-09-09T13:17:57Z">
         <w:r>
           <w:t xml:space="preserve">isolated</w:t>
         </w:r>
@@ -416,12 +416,12 @@
       <w:r>
         <w:t xml:space="preserve"> </w:t>
       </w:r>
-      <w:del w:id="10052" w:author="Revision merge (HM+PL)" w:date="2026-09-09T13:15:15Z">
+      <w:del w:id="10052" w:author="Revision merge (HM+PL)" w:date="2026-09-09T13:17:57Z">
         <w:r>
           <w:delText xml:space="preserve">single</w:delText>
         </w:r>
       </w:del>
-      <w:ins w:id="10053" w:author="Revision merge (HM+PL)" w:date="2026-09-09T13:15:15Z">
+      <w:ins w:id="10053" w:author="Revision merge (HM+PL)" w:date="2026-09-09T13:17:57Z">
         <w:r>
           <w:t xml:space="preserve">analytical</w:t>
         </w:r>
@@ -429,12 +429,12 @@
       <w:r>
         <w:t xml:space="preserve"> </w:t>
       </w:r>
-      <w:del w:id="10054" w:author="Revision merge (HM+PL)" w:date="2026-09-09T13:15:15Z">
+      <w:del w:id="10054" w:author="Revision merge (HM+PL)" w:date="2026-09-09T13:17:57Z">
         <w:r>
           <w:delText xml:space="preserve">analysis</w:delText>
         </w:r>
       </w:del>
-      <w:ins w:id="10055" w:author="Revision merge (HM+PL)" w:date="2026-09-09T13:15:15Z">
+      <w:ins w:id="10055" w:author="Revision merge (HM+PL)" w:date="2026-09-09T13:17:57Z">
         <w:r>
           <w:t xml:space="preserve">tasks,</w:t>
         </w:r>
@@ -442,12 +442,12 @@
       <w:r>
         <w:t xml:space="preserve"> </w:t>
       </w:r>
-      <w:del w:id="10056" w:author="Revision merge (HM+PL)" w:date="2026-09-09T13:15:15Z">
+      <w:del w:id="10056" w:author="Revision merge (HM+PL)" w:date="2026-09-09T13:17:57Z">
         <w:r>
           <w:delText xml:space="preserve">(e.g.</w:delText>
         </w:r>
       </w:del>
-      <w:ins w:id="10057" w:author="Revision merge (HM+PL)" w:date="2026-09-09T13:15:15Z">
+      <w:ins w:id="10057" w:author="Revision merge (HM+PL)" w:date="2026-09-09T13:17:57Z">
         <w:r>
           <w:t xml:space="preserve">such as</w:t>
         </w:r>
@@ -455,12 +455,12 @@
       <w:r>
         <w:t xml:space="preserve"> resistome </w:t>
       </w:r>
-      <w:del w:id="10058" w:author="Revision merge (HM+PL)" w:date="2026-09-09T13:15:15Z">
+      <w:del w:id="10058" w:author="Revision merge (HM+PL)" w:date="2026-09-09T13:17:57Z">
         <w:r>
           <w:delText xml:space="preserve">risk scoring),</w:delText>
         </w:r>
       </w:del>
-      <w:ins w:id="10059" w:author="Revision merge (HM+PL)" w:date="2026-09-09T13:15:15Z">
+      <w:ins w:id="10059" w:author="Revision merge (HM+PL)" w:date="2026-09-09T13:17:57Z">
         <w:r>
           <w:t xml:space="preserve">profiling,</w:t>
         </w:r>
@@ -468,7 +468,7 @@
       <w:r>
         <w:t xml:space="preserve"> leaving</w:t>
       </w:r>
-      <w:ins w:id="10060" w:author="Revision merge (HM+PL)" w:date="2026-09-09T13:15:15Z">
+      <w:ins w:id="10060" w:author="Revision merge (HM+PL)" w:date="2026-09-09T13:17:57Z">
         <w:r>
           <w:t xml:space="preserve"> a gap in integrated, reproducible and sustainable solutions for</w:t>
         </w:r>
@@ -476,12 +476,12 @@
       <w:r>
         <w:t xml:space="preserve"> long-read shotgun </w:t>
       </w:r>
-      <w:del w:id="10061" w:author="Revision merge (HM+PL)" w:date="2026-09-09T13:15:15Z">
+      <w:del w:id="10061" w:author="Revision merge (HM+PL)" w:date="2026-09-09T13:17:57Z">
         <w:r>
           <w:delText xml:space="preserve">studies</w:delText>
         </w:r>
       </w:del>
-      <w:ins w:id="10062" w:author="Revision merge (HM+PL)" w:date="2026-09-09T13:15:15Z">
+      <w:ins w:id="10062" w:author="Revision merge (HM+PL)" w:date="2026-09-09T13:17:57Z">
         <w:r>
           <w:t xml:space="preserve">metagenomics.</w:t>
         </w:r>
@@ -489,12 +489,12 @@
       <w:r>
         <w:t xml:space="preserve"> </w:t>
       </w:r>
-      <w:del w:id="10063" w:author="Revision merge (HM+PL)" w:date="2026-09-09T13:15:15Z">
+      <w:del w:id="10063" w:author="Revision merge (HM+PL)" w:date="2026-09-09T13:17:57Z">
         <w:r>
           <w:delText xml:space="preserve">without</w:delText>
         </w:r>
       </w:del>
-      <w:ins w:id="10064" w:author="Revision merge (HM+PL)" w:date="2026-09-09T13:15:15Z">
+      <w:ins w:id="10064" w:author="Revision merge (HM+PL)" w:date="2026-09-09T13:17:57Z">
         <w:r>
           <w:t xml:space="preserve">Consequently,</w:t>
         </w:r>
@@ -502,12 +502,12 @@
       <w:r>
         <w:t xml:space="preserve"> </w:t>
       </w:r>
-      <w:del w:id="10065" w:author="Revision merge (HM+PL)" w:date="2026-09-09T13:15:15Z">
+      <w:del w:id="10065" w:author="Revision merge (HM+PL)" w:date="2026-09-09T13:17:57Z">
         <w:r>
           <w:delText xml:space="preserve">an</w:delText>
         </w:r>
       </w:del>
-      <w:ins w:id="10066" w:author="Revision merge (HM+PL)" w:date="2026-09-09T13:15:15Z">
+      <w:ins w:id="10066" w:author="Revision merge (HM+PL)" w:date="2026-09-09T13:17:57Z">
         <w:r>
           <w:t xml:space="preserve">researchers</w:t>
         </w:r>
@@ -515,12 +515,12 @@
       <w:r>
         <w:t xml:space="preserve"> </w:t>
       </w:r>
-      <w:del w:id="10067" w:author="Revision merge (HM+PL)" w:date="2026-09-09T13:15:15Z">
+      <w:del w:id="10067" w:author="Revision merge (HM+PL)" w:date="2026-09-09T13:17:57Z">
         <w:r>
           <w:delText xml:space="preserve">integrated,</w:delText>
         </w:r>
       </w:del>
-      <w:ins w:id="10068" w:author="Revision merge (HM+PL)" w:date="2026-09-09T13:15:15Z">
+      <w:ins w:id="10068" w:author="Revision merge (HM+PL)" w:date="2026-09-09T13:17:57Z">
         <w:r>
           <w:t xml:space="preserve">frequently</w:t>
         </w:r>
@@ -528,12 +528,12 @@
       <w:r>
         <w:t xml:space="preserve"> </w:t>
       </w:r>
-      <w:del w:id="10069" w:author="Revision merge (HM+PL)" w:date="2026-09-09T13:15:15Z">
+      <w:del w:id="10069" w:author="Revision merge (HM+PL)" w:date="2026-09-09T13:17:57Z">
         <w:r>
           <w:delText xml:space="preserve">configuration-driven</w:delText>
         </w:r>
       </w:del>
-      <w:ins w:id="10070" w:author="Revision merge (HM+PL)" w:date="2026-09-09T13:15:15Z">
+      <w:ins w:id="10070" w:author="Revision merge (HM+PL)" w:date="2026-09-09T13:17:57Z">
         <w:r>
           <w:t xml:space="preserve">rely</w:t>
         </w:r>
@@ -541,12 +541,12 @@
       <w:r>
         <w:t xml:space="preserve"> </w:t>
       </w:r>
-      <w:del w:id="10071" w:author="Revision merge (HM+PL)" w:date="2026-09-09T13:15:15Z">
+      <w:del w:id="10071" w:author="Revision merge (HM+PL)" w:date="2026-09-09T13:17:57Z">
         <w:r>
           <w:delText xml:space="preserve">option.</w:delText>
         </w:r>
       </w:del>
-      <w:ins w:id="10072" w:author="Revision merge (HM+PL)" w:date="2026-09-09T13:15:15Z">
+      <w:ins w:id="10072" w:author="Revision merge (HM+PL)" w:date="2026-09-09T13:17:57Z">
         <w:r>
           <w:t xml:space="preserve">on ad hoc scripting approaches that limit scalability, standardisation and reproducibility for efficient cross-study comparison.</w:t>
         </w:r>
@@ -556,12 +556,12 @@
       <w:pPr>
         <w:spacing w:after="120"/>
       </w:pPr>
-      <w:del w:id="10073" w:author="Revision merge (HM+PL)" w:date="2026-09-09T13:15:15Z">
+      <w:del w:id="10073" w:author="Revision merge (HM+PL)" w:date="2026-09-09T13:17:57Z">
         <w:r>
           <w:delText xml:space="preserve">**Results.**</w:delText>
         </w:r>
       </w:del>
-      <w:ins w:id="10074" w:author="Revision merge (HM+PL)" w:date="2026-09-09T13:15:15Z">
+      <w:ins w:id="10074" w:author="Revision merge (HM+PL)" w:date="2026-09-09T13:17:57Z">
         <w:r>
           <w:t xml:space="preserve">**Results:**</w:t>
         </w:r>
@@ -569,12 +569,12 @@
       <w:r>
         <w:t xml:space="preserve"> We present **MERIDIAN** (*Metagenomic Evaluation of Resistance, Identity &amp; Diversity through Integrated Analysis of Nanopore sequencing*), a modular R workflow </w:t>
       </w:r>
-      <w:del w:id="10075" w:author="Revision merge (HM+PL)" w:date="2026-09-09T13:15:15Z">
+      <w:del w:id="10075" w:author="Revision merge (HM+PL)" w:date="2026-09-09T13:17:57Z">
         <w:r>
           <w:delText xml:space="preserve">that</w:delText>
         </w:r>
       </w:del>
-      <w:ins w:id="10076" w:author="Revision merge (HM+PL)" w:date="2026-09-09T13:15:15Z">
+      <w:ins w:id="10076" w:author="Revision merge (HM+PL)" w:date="2026-09-09T13:17:57Z">
         <w:r>
           <w:t xml:space="preserve">designed</w:t>
         </w:r>
@@ -582,12 +582,12 @@
       <w:r>
         <w:t xml:space="preserve"> </w:t>
       </w:r>
-      <w:del w:id="10077" w:author="Revision merge (HM+PL)" w:date="2026-09-09T13:15:15Z">
+      <w:del w:id="10077" w:author="Revision merge (HM+PL)" w:date="2026-09-09T13:17:57Z">
         <w:r>
           <w:delText xml:space="preserve">consumes</w:delText>
         </w:r>
       </w:del>
-      <w:ins w:id="10078" w:author="Revision merge (HM+PL)" w:date="2026-09-09T13:15:15Z">
+      <w:ins w:id="10078" w:author="Revision merge (HM+PL)" w:date="2026-09-09T13:17:57Z">
         <w:r>
           <w:t xml:space="preserve">to standardise and automate downstream analysis of long-read metagenomic sequencing datasets. By consolidating outputs from multiple</w:t>
         </w:r>
@@ -595,12 +595,12 @@
       <w:r>
         <w:t xml:space="preserve"> bioinformatics </w:t>
       </w:r>
-      <w:del w:id="10079" w:author="Revision merge (HM+PL)" w:date="2026-09-09T13:15:15Z">
+      <w:del w:id="10079" w:author="Revision merge (HM+PL)" w:date="2026-09-09T13:17:57Z">
         <w:r>
           <w:delText xml:space="preserve">tools</w:delText>
         </w:r>
       </w:del>
-      <w:ins w:id="10080" w:author="Revision merge (HM+PL)" w:date="2026-09-09T13:15:15Z">
+      <w:ins w:id="10080" w:author="Revision merge (HM+PL)" w:date="2026-09-09T13:17:57Z">
         <w:r>
           <w:t xml:space="preserve">tools,</w:t>
         </w:r>
@@ -608,12 +608,12 @@
       <w:r>
         <w:t xml:space="preserve"> </w:t>
       </w:r>
-      <w:del w:id="10081" w:author="Revision merge (HM+PL)" w:date="2026-09-09T13:15:15Z">
+      <w:del w:id="10081" w:author="Revision merge (HM+PL)" w:date="2026-09-09T13:17:57Z">
         <w:r>
           <w:delText xml:space="preserve">outputs</w:delText>
         </w:r>
       </w:del>
-      <w:ins w:id="10082" w:author="Revision merge (HM+PL)" w:date="2026-09-09T13:15:15Z">
+      <w:ins w:id="10082" w:author="Revision merge (HM+PL)" w:date="2026-09-09T13:17:57Z">
         <w:r>
           <w:t xml:space="preserve">MERIDIAN</w:t>
         </w:r>
@@ -621,12 +621,12 @@
       <w:r>
         <w:t xml:space="preserve"> </w:t>
       </w:r>
-      <w:del w:id="10083" w:author="Revision merge (HM+PL)" w:date="2026-09-09T13:15:15Z">
+      <w:del w:id="10083" w:author="Revision merge (HM+PL)" w:date="2026-09-09T13:17:57Z">
         <w:r>
           <w:delText xml:space="preserve">and produces</w:delText>
         </w:r>
       </w:del>
-      <w:ins w:id="10084" w:author="Revision merge (HM+PL)" w:date="2026-09-09T13:15:15Z">
+      <w:ins w:id="10084" w:author="Revision merge (HM+PL)" w:date="2026-09-09T13:17:57Z">
         <w:r>
           <w:t xml:space="preserve">delivers</w:t>
         </w:r>
@@ -634,12 +634,12 @@
       <w:r>
         <w:t xml:space="preserve"> a </w:t>
       </w:r>
-      <w:del w:id="10085" w:author="Revision merge (HM+PL)" w:date="2026-09-09T13:15:15Z">
+      <w:del w:id="10085" w:author="Revision merge (HM+PL)" w:date="2026-09-09T13:17:57Z">
         <w:r>
           <w:delText xml:space="preserve">single</w:delText>
         </w:r>
       </w:del>
-      <w:ins w:id="10086" w:author="Revision merge (HM+PL)" w:date="2026-09-09T13:15:15Z">
+      <w:ins w:id="10086" w:author="Revision merge (HM+PL)" w:date="2026-09-09T13:17:57Z">
         <w:r>
           <w:t xml:space="preserve">comprehensive</w:t>
         </w:r>
@@ -647,7 +647,7 @@
       <w:r>
         <w:t xml:space="preserve"> Quarto HTML dashboard, publication-ready </w:t>
       </w:r>
-      <w:del w:id="10087" w:author="Revision merge (HM+PL)" w:date="2026-09-09T13:15:15Z">
+      <w:del w:id="10087" w:author="Revision merge (HM+PL)" w:date="2026-09-09T13:17:57Z">
         <w:r>
           <w:delText xml:space="preserve">composite </w:delText>
         </w:r>
@@ -655,7 +655,7 @@
       <w:r>
         <w:t xml:space="preserve">figures and </w:t>
       </w:r>
-      <w:del w:id="10088" w:author="Revision merge (HM+PL)" w:date="2026-09-09T13:15:15Z">
+      <w:del w:id="10088" w:author="Revision merge (HM+PL)" w:date="2026-09-09T13:17:57Z">
         <w:r>
           <w:delText xml:space="preserve">a </w:delText>
         </w:r>
@@ -663,12 +663,12 @@
       <w:r>
         <w:t xml:space="preserve">supplementary </w:t>
       </w:r>
-      <w:del w:id="10089" w:author="Revision merge (HM+PL)" w:date="2026-09-09T13:15:15Z">
+      <w:del w:id="10089" w:author="Revision merge (HM+PL)" w:date="2026-09-09T13:17:57Z">
         <w:r>
           <w:delText xml:space="preserve">tables</w:delText>
         </w:r>
       </w:del>
-      <w:ins w:id="10090" w:author="Revision merge (HM+PL)" w:date="2026-09-09T13:15:15Z">
+      <w:ins w:id="10090" w:author="Revision merge (HM+PL)" w:date="2026-09-09T13:17:57Z">
         <w:r>
           <w:t xml:space="preserve">result</w:t>
         </w:r>
@@ -676,12 +676,12 @@
       <w:r>
         <w:t xml:space="preserve"> </w:t>
       </w:r>
-      <w:del w:id="10091" w:author="Revision merge (HM+PL)" w:date="2026-09-09T13:15:15Z">
+      <w:del w:id="10091" w:author="Revision merge (HM+PL)" w:date="2026-09-09T13:17:57Z">
         <w:r>
           <w:delText xml:space="preserve">workbook.</w:delText>
         </w:r>
       </w:del>
-      <w:ins w:id="10092" w:author="Revision merge (HM+PL)" w:date="2026-09-09T13:15:15Z">
+      <w:ins w:id="10092" w:author="Revision merge (HM+PL)" w:date="2026-09-09T13:17:57Z">
         <w:r>
           <w:t xml:space="preserve">tables.</w:t>
         </w:r>
@@ -689,12 +689,12 @@
       <w:r>
         <w:t xml:space="preserve"> The workflow </w:t>
       </w:r>
-      <w:del w:id="10093" w:author="Revision merge (HM+PL)" w:date="2026-09-09T13:15:15Z">
+      <w:del w:id="10093" w:author="Revision merge (HM+PL)" w:date="2026-09-09T13:17:57Z">
         <w:r>
           <w:delText xml:space="preserve">covers</w:delText>
         </w:r>
       </w:del>
-      <w:ins w:id="10094" w:author="Revision merge (HM+PL)" w:date="2026-09-09T13:15:15Z">
+      <w:ins w:id="10094" w:author="Revision merge (HM+PL)" w:date="2026-09-09T13:17:57Z">
         <w:r>
           <w:t xml:space="preserve">supports end-to-end metagenomic characterisation, encompassing</w:t>
         </w:r>
@@ -702,12 +702,12 @@
       <w:r>
         <w:t xml:space="preserve"> decontamination, TPM normalisation, </w:t>
       </w:r>
-      <w:del w:id="10095" w:author="Revision merge (HM+PL)" w:date="2026-09-09T13:15:15Z">
+      <w:del w:id="10095" w:author="Revision merge (HM+PL)" w:date="2026-09-09T13:17:57Z">
         <w:r>
           <w:delText xml:space="preserve">taxonomy,</w:delText>
         </w:r>
       </w:del>
-      <w:ins w:id="10096" w:author="Revision merge (HM+PL)" w:date="2026-09-09T13:15:15Z">
+      <w:ins w:id="10096" w:author="Revision merge (HM+PL)" w:date="2026-09-09T13:17:57Z">
         <w:r>
           <w:t xml:space="preserve">taxonomic</w:t>
         </w:r>
@@ -715,12 +715,12 @@
       <w:r>
         <w:t xml:space="preserve"> </w:t>
       </w:r>
-      <w:del w:id="10097" w:author="Revision merge (HM+PL)" w:date="2026-09-09T13:15:15Z">
+      <w:del w:id="10097" w:author="Revision merge (HM+PL)" w:date="2026-09-09T13:17:57Z">
         <w:r>
           <w:delText xml:space="preserve">alpha/beta</w:delText>
         </w:r>
       </w:del>
-      <w:ins w:id="10098" w:author="Revision merge (HM+PL)" w:date="2026-09-09T13:15:15Z">
+      <w:ins w:id="10098" w:author="Revision merge (HM+PL)" w:date="2026-09-09T13:17:57Z">
         <w:r>
           <w:t xml:space="preserve">profiling, alpha and beta</w:t>
         </w:r>
@@ -728,7 +728,7 @@
       <w:r>
         <w:t xml:space="preserve"> diversity</w:t>
       </w:r>
-      <w:ins w:id="10099" w:author="Revision merge (HM+PL)" w:date="2026-09-09T13:15:15Z">
+      <w:ins w:id="10099" w:author="Revision merge (HM+PL)" w:date="2026-09-09T13:17:57Z">
         <w:r>
           <w:t xml:space="preserve"> analysis</w:t>
         </w:r>
@@ -736,12 +736,12 @@
       <w:r>
         <w:t xml:space="preserve"> with PERMANOVA, two-level ALDEx2 differential </w:t>
       </w:r>
-      <w:del w:id="10100" w:author="Revision merge (HM+PL)" w:date="2026-09-09T13:15:15Z">
+      <w:del w:id="10100" w:author="Revision merge (HM+PL)" w:date="2026-09-09T13:17:57Z">
         <w:r>
           <w:delText xml:space="preserve">abundance,</w:delText>
         </w:r>
       </w:del>
-      <w:ins w:id="10101" w:author="Revision merge (HM+PL)" w:date="2026-09-09T13:15:15Z">
+      <w:ins w:id="10101" w:author="Revision merge (HM+PL)" w:date="2026-09-09T13:17:57Z">
         <w:r>
           <w:t xml:space="preserve">abundance</w:t>
         </w:r>
@@ -749,12 +749,12 @@
       <w:r>
         <w:t xml:space="preserve"> </w:t>
       </w:r>
-      <w:del w:id="10102" w:author="Revision merge (HM+PL)" w:date="2026-09-09T13:15:15Z">
+      <w:del w:id="10102" w:author="Revision merge (HM+PL)" w:date="2026-09-09T13:17:57Z">
         <w:r>
           <w:delText xml:space="preserve">resistome, virulome,</w:delText>
         </w:r>
       </w:del>
-      <w:ins w:id="10103" w:author="Revision merge (HM+PL)" w:date="2026-09-09T13:15:15Z">
+      <w:ins w:id="10103" w:author="Revision merge (HM+PL)" w:date="2026-09-09T13:17:57Z">
         <w:r>
           <w:t xml:space="preserve">testing,</w:t>
         </w:r>
@@ -762,12 +762,12 @@
       <w:r>
         <w:t xml:space="preserve"> and </w:t>
       </w:r>
-      <w:del w:id="10104" w:author="Revision merge (HM+PL)" w:date="2026-09-09T13:15:15Z">
+      <w:del w:id="10104" w:author="Revision merge (HM+PL)" w:date="2026-09-09T13:17:57Z">
         <w:r>
           <w:delText xml:space="preserve">mobilome</w:delText>
         </w:r>
       </w:del>
-      <w:ins w:id="10105" w:author="Revision merge (HM+PL)" w:date="2026-09-09T13:15:15Z">
+      <w:ins w:id="10105" w:author="Revision merge (HM+PL)" w:date="2026-09-09T13:17:57Z">
         <w:r>
           <w:t xml:space="preserve">functional</w:t>
         </w:r>
@@ -775,12 +775,12 @@
       <w:r>
         <w:t xml:space="preserve"> </w:t>
       </w:r>
-      <w:del w:id="10106" w:author="Revision merge (HM+PL)" w:date="2026-09-09T13:15:15Z">
+      <w:del w:id="10106" w:author="Revision merge (HM+PL)" w:date="2026-09-09T13:17:57Z">
         <w:r>
           <w:delText xml:space="preserve">profiling,</w:delText>
         </w:r>
       </w:del>
-      <w:ins w:id="10107" w:author="Revision merge (HM+PL)" w:date="2026-09-09T13:15:15Z">
+      <w:ins w:id="10107" w:author="Revision merge (HM+PL)" w:date="2026-09-09T13:17:57Z">
         <w:r>
           <w:t xml:space="preserve">profiling of antimicrobial resistance (AMR), virulence</w:t>
         </w:r>
@@ -788,7 +788,7 @@
       <w:r>
         <w:t xml:space="preserve"> and</w:t>
       </w:r>
-      <w:ins w:id="10108" w:author="Revision merge (HM+PL)" w:date="2026-09-09T13:15:15Z">
+      <w:ins w:id="10108" w:author="Revision merge (HM+PL)" w:date="2026-09-09T13:17:57Z">
         <w:r>
           <w:t xml:space="preserve"> mobile genetic element repertoires. In addition, MERIDIAN infers</w:t>
         </w:r>
@@ -796,12 +796,12 @@
       <w:r>
         <w:t xml:space="preserve"> a tripartite sample × taxon × gene </w:t>
       </w:r>
-      <w:del w:id="10109" w:author="Revision merge (HM+PL)" w:date="2026-09-09T13:15:15Z">
+      <w:del w:id="10109" w:author="Revision merge (HM+PL)" w:date="2026-09-09T13:17:57Z">
         <w:r>
           <w:delText xml:space="preserve">network</w:delText>
         </w:r>
       </w:del>
-      <w:ins w:id="10110" w:author="Revision merge (HM+PL)" w:date="2026-09-09T13:15:15Z">
+      <w:ins w:id="10110" w:author="Revision merge (HM+PL)" w:date="2026-09-09T13:17:57Z">
         <w:r>
           <w:t xml:space="preserve">network,</w:t>
         </w:r>
@@ -809,12 +809,12 @@
       <w:r>
         <w:t xml:space="preserve"> </w:t>
       </w:r>
-      <w:del w:id="10111" w:author="Revision merge (HM+PL)" w:date="2026-09-09T13:15:15Z">
+      <w:del w:id="10111" w:author="Revision merge (HM+PL)" w:date="2026-09-09T13:17:57Z">
         <w:r>
           <w:delText xml:space="preserve">reconstruction.</w:delText>
         </w:r>
       </w:del>
-      <w:ins w:id="10112" w:author="Revision merge (HM+PL)" w:date="2026-09-09T13:15:15Z">
+      <w:ins w:id="10112" w:author="Revision merge (HM+PL)" w:date="2026-09-09T13:17:57Z">
         <w:r>
           <w:t xml:space="preserve">enabling</w:t>
         </w:r>
@@ -822,12 +822,12 @@
       <w:r>
         <w:t xml:space="preserve"> </w:t>
       </w:r>
-      <w:del w:id="10113" w:author="Revision merge (HM+PL)" w:date="2026-09-09T13:15:15Z">
+      <w:del w:id="10113" w:author="Revision merge (HM+PL)" w:date="2026-09-09T13:17:57Z">
         <w:r>
           <w:delText xml:space="preserve">A</w:delText>
         </w:r>
       </w:del>
-      <w:ins w:id="10114" w:author="Revision merge (HM+PL)" w:date="2026-09-09T13:15:15Z">
+      <w:ins w:id="10114" w:author="Revision merge (HM+PL)" w:date="2026-09-09T13:17:57Z">
         <w:r>
           <w:t xml:space="preserve">integrated</w:t>
         </w:r>
@@ -835,12 +835,12 @@
       <w:r>
         <w:t xml:space="preserve"> </w:t>
       </w:r>
-      <w:del w:id="10115" w:author="Revision merge (HM+PL)" w:date="2026-09-09T13:15:15Z">
+      <w:del w:id="10115" w:author="Revision merge (HM+PL)" w:date="2026-09-09T13:17:57Z">
         <w:r>
           <w:delText xml:space="preserve">study</w:delText>
         </w:r>
       </w:del>
-      <w:ins w:id="10116" w:author="Revision merge (HM+PL)" w:date="2026-09-09T13:15:15Z">
+      <w:ins w:id="10116" w:author="Revision merge (HM+PL)" w:date="2026-09-09T13:17:57Z">
         <w:r>
           <w:t xml:space="preserve">interrogation of taxonomic composition and functional gene distributions. Workflow execution</w:t>
         </w:r>
@@ -848,12 +848,12 @@
       <w:r>
         <w:t xml:space="preserve"> is </w:t>
       </w:r>
-      <w:del w:id="10117" w:author="Revision merge (HM+PL)" w:date="2026-09-09T13:15:15Z">
+      <w:del w:id="10117" w:author="Revision merge (HM+PL)" w:date="2026-09-09T13:17:57Z">
         <w:r>
           <w:delText xml:space="preserve">parameterised</w:delText>
         </w:r>
       </w:del>
-      <w:ins w:id="10118" w:author="Revision merge (HM+PL)" w:date="2026-09-09T13:15:15Z">
+      <w:ins w:id="10118" w:author="Revision merge (HM+PL)" w:date="2026-09-09T13:17:57Z">
         <w:r>
           <w:t xml:space="preserve">controlled</w:t>
         </w:r>
@@ -861,12 +861,12 @@
       <w:r>
         <w:t xml:space="preserve"> </w:t>
       </w:r>
-      <w:del w:id="10119" w:author="Revision merge (HM+PL)" w:date="2026-09-09T13:15:15Z">
+      <w:del w:id="10119" w:author="Revision merge (HM+PL)" w:date="2026-09-09T13:17:57Z">
         <w:r>
           <w:delText xml:space="preserve">by</w:delText>
         </w:r>
       </w:del>
-      <w:ins w:id="10120" w:author="Revision merge (HM+PL)" w:date="2026-09-09T13:15:15Z">
+      <w:ins w:id="10120" w:author="Revision merge (HM+PL)" w:date="2026-09-09T13:17:57Z">
         <w:r>
           <w:t xml:space="preserve">through</w:t>
         </w:r>
@@ -874,12 +874,12 @@
       <w:r>
         <w:t xml:space="preserve"> a single YAML </w:t>
       </w:r>
-      <w:del w:id="10121" w:author="Revision merge (HM+PL)" w:date="2026-09-09T13:15:15Z">
+      <w:del w:id="10121" w:author="Revision merge (HM+PL)" w:date="2026-09-09T13:17:57Z">
         <w:r>
           <w:delText xml:space="preserve">file;</w:delText>
         </w:r>
       </w:del>
-      <w:ins w:id="10122" w:author="Revision merge (HM+PL)" w:date="2026-09-09T13:15:15Z">
+      <w:ins w:id="10122" w:author="Revision merge (HM+PL)" w:date="2026-09-09T13:17:57Z">
         <w:r>
           <w:t xml:space="preserve">configuration</w:t>
         </w:r>
@@ -887,12 +887,12 @@
       <w:r>
         <w:t xml:space="preserve"> </w:t>
       </w:r>
-      <w:del w:id="10123" w:author="Revision merge (HM+PL)" w:date="2026-09-09T13:15:15Z">
+      <w:del w:id="10123" w:author="Revision merge (HM+PL)" w:date="2026-09-09T13:17:57Z">
         <w:r>
           <w:delText xml:space="preserve">module</w:delText>
         </w:r>
       </w:del>
-      <w:ins w:id="10124" w:author="Revision merge (HM+PL)" w:date="2026-09-09T13:15:15Z">
+      <w:ins w:id="10124" w:author="Revision merge (HM+PL)" w:date="2026-09-09T13:17:57Z">
         <w:r>
           <w:t xml:space="preserve">file,</w:t>
         </w:r>
@@ -900,12 +900,12 @@
       <w:r>
         <w:t xml:space="preserve"> </w:t>
       </w:r>
-      <w:del w:id="10125" w:author="Revision merge (HM+PL)" w:date="2026-09-09T13:15:15Z">
+      <w:del w:id="10125" w:author="Revision merge (HM+PL)" w:date="2026-09-09T13:17:57Z">
         <w:r>
           <w:delText xml:space="preserve">code</w:delText>
         </w:r>
       </w:del>
-      <w:ins w:id="10126" w:author="Revision merge (HM+PL)" w:date="2026-09-09T13:15:15Z">
+      <w:ins w:id="10126" w:author="Revision merge (HM+PL)" w:date="2026-09-09T13:17:57Z">
         <w:r>
           <w:t xml:space="preserve">ensuring</w:t>
         </w:r>
@@ -913,12 +913,12 @@
       <w:r>
         <w:t xml:space="preserve"> </w:t>
       </w:r>
-      <w:del w:id="10127" w:author="Revision merge (HM+PL)" w:date="2026-09-09T13:15:15Z">
+      <w:del w:id="10127" w:author="Revision merge (HM+PL)" w:date="2026-09-09T13:17:57Z">
         <w:r>
           <w:delText xml:space="preserve">is</w:delText>
         </w:r>
       </w:del>
-      <w:ins w:id="10128" w:author="Revision merge (HM+PL)" w:date="2026-09-09T13:15:15Z">
+      <w:ins w:id="10128" w:author="Revision merge (HM+PL)" w:date="2026-09-09T13:17:57Z">
         <w:r>
           <w:t xml:space="preserve">reproducible</w:t>
         </w:r>
@@ -926,12 +926,12 @@
       <w:r>
         <w:t xml:space="preserve"> </w:t>
       </w:r>
-      <w:del w:id="10129" w:author="Revision merge (HM+PL)" w:date="2026-09-09T13:15:15Z">
+      <w:del w:id="10129" w:author="Revision merge (HM+PL)" w:date="2026-09-09T13:17:57Z">
         <w:r>
           <w:delText xml:space="preserve">not</w:delText>
         </w:r>
       </w:del>
-      <w:ins w:id="10130" w:author="Revision merge (HM+PL)" w:date="2026-09-09T13:15:15Z">
+      <w:ins w:id="10130" w:author="Revision merge (HM+PL)" w:date="2026-09-09T13:17:57Z">
         <w:r>
           <w:t xml:space="preserve">execution</w:t>
         </w:r>
@@ -939,12 +939,12 @@
       <w:r>
         <w:t xml:space="preserve"> </w:t>
       </w:r>
-      <w:del w:id="10131" w:author="Revision merge (HM+PL)" w:date="2026-09-09T13:15:15Z">
+      <w:del w:id="10131" w:author="Revision merge (HM+PL)" w:date="2026-09-09T13:17:57Z">
         <w:r>
           <w:delText xml:space="preserve">edited</w:delText>
         </w:r>
       </w:del>
-      <w:ins w:id="10132" w:author="Revision merge (HM+PL)" w:date="2026-09-09T13:15:15Z">
+      <w:ins w:id="10132" w:author="Revision merge (HM+PL)" w:date="2026-09-09T13:17:57Z">
         <w:r>
           <w:t xml:space="preserve">without</w:t>
         </w:r>
@@ -952,12 +952,12 @@
       <w:r>
         <w:t xml:space="preserve"> </w:t>
       </w:r>
-      <w:del w:id="10133" w:author="Revision merge (HM+PL)" w:date="2026-09-09T13:15:15Z">
+      <w:del w:id="10133" w:author="Revision merge (HM+PL)" w:date="2026-09-09T13:17:57Z">
         <w:r>
           <w:delText xml:space="preserve">per</w:delText>
         </w:r>
       </w:del>
-      <w:ins w:id="10134" w:author="Revision merge (HM+PL)" w:date="2026-09-09T13:15:15Z">
+      <w:ins w:id="10134" w:author="Revision merge (HM+PL)" w:date="2026-09-09T13:17:57Z">
         <w:r>
           <w:t xml:space="preserve">modification</w:t>
         </w:r>
@@ -965,12 +965,12 @@
       <w:r>
         <w:t xml:space="preserve"> </w:t>
       </w:r>
-      <w:del w:id="10135" w:author="Revision merge (HM+PL)" w:date="2026-09-09T13:15:15Z">
+      <w:del w:id="10135" w:author="Revision merge (HM+PL)" w:date="2026-09-09T13:17:57Z">
         <w:r>
           <w:delText xml:space="preserve">project,</w:delText>
         </w:r>
       </w:del>
-      <w:ins w:id="10136" w:author="Revision merge (HM+PL)" w:date="2026-09-09T13:15:15Z">
+      <w:ins w:id="10136" w:author="Revision merge (HM+PL)" w:date="2026-09-09T13:17:57Z">
         <w:r>
           <w:t xml:space="preserve">of</w:t>
         </w:r>
@@ -978,12 +978,12 @@
       <w:r>
         <w:t xml:space="preserve"> </w:t>
       </w:r>
-      <w:del w:id="10137" w:author="Revision merge (HM+PL)" w:date="2026-09-09T13:15:15Z">
+      <w:del w:id="10137" w:author="Revision merge (HM+PL)" w:date="2026-09-09T13:17:57Z">
         <w:r>
           <w:delText xml:space="preserve">and</w:delText>
         </w:r>
       </w:del>
-      <w:ins w:id="10138" w:author="Revision merge (HM+PL)" w:date="2026-09-09T13:15:15Z">
+      <w:ins w:id="10138" w:author="Revision merge (HM+PL)" w:date="2026-09-09T13:17:57Z">
         <w:r>
           <w:t xml:space="preserve">source</w:t>
         </w:r>
@@ -991,12 +991,12 @@
       <w:r>
         <w:t xml:space="preserve"> </w:t>
       </w:r>
-      <w:del w:id="10139" w:author="Revision merge (HM+PL)" w:date="2026-09-09T13:15:15Z">
+      <w:del w:id="10139" w:author="Revision merge (HM+PL)" w:date="2026-09-09T13:17:57Z">
         <w:r>
           <w:delText xml:space="preserve">every</w:delText>
         </w:r>
       </w:del>
-      <w:ins w:id="10140" w:author="Revision merge (HM+PL)" w:date="2026-09-09T13:15:15Z">
+      <w:ins w:id="10140" w:author="Revision merge (HM+PL)" w:date="2026-09-09T13:17:57Z">
         <w:r>
           <w:t xml:space="preserve">code.</w:t>
         </w:r>
@@ -1004,12 +1004,12 @@
       <w:r>
         <w:t xml:space="preserve"> </w:t>
       </w:r>
-      <w:del w:id="10141" w:author="Revision merge (HM+PL)" w:date="2026-09-09T13:15:15Z">
+      <w:del w:id="10141" w:author="Revision merge (HM+PL)" w:date="2026-09-09T13:17:57Z">
         <w:r>
           <w:delText xml:space="preserve">run</w:delText>
         </w:r>
       </w:del>
-      <w:ins w:id="10142" w:author="Revision merge (HM+PL)" w:date="2026-09-09T13:15:15Z">
+      <w:ins w:id="10142" w:author="Revision merge (HM+PL)" w:date="2026-09-09T13:17:57Z">
         <w:r>
           <w:t xml:space="preserve">Each</w:t>
         </w:r>
@@ -1017,12 +1017,12 @@
       <w:r>
         <w:t xml:space="preserve"> </w:t>
       </w:r>
-      <w:del w:id="10143" w:author="Revision merge (HM+PL)" w:date="2026-09-09T13:15:15Z">
+      <w:del w:id="10143" w:author="Revision merge (HM+PL)" w:date="2026-09-09T13:17:57Z">
         <w:r>
           <w:delText xml:space="preserve">emits</w:delText>
         </w:r>
       </w:del>
-      <w:ins w:id="10144" w:author="Revision merge (HM+PL)" w:date="2026-09-09T13:15:15Z">
+      <w:ins w:id="10144" w:author="Revision merge (HM+PL)" w:date="2026-09-09T13:17:57Z">
         <w:r>
           <w:t xml:space="preserve">analysis automatically generates</w:t>
         </w:r>
@@ -1030,12 +1030,12 @@
       <w:r>
         <w:t xml:space="preserve"> a `manifest.json` artefact </w:t>
       </w:r>
-      <w:del w:id="10145" w:author="Revision merge (HM+PL)" w:date="2026-09-09T13:15:15Z">
+      <w:del w:id="10145" w:author="Revision merge (HM+PL)" w:date="2026-09-09T13:17:57Z">
         <w:r>
           <w:delText xml:space="preserve">catalogue</w:delText>
         </w:r>
       </w:del>
-      <w:ins w:id="10146" w:author="Revision merge (HM+PL)" w:date="2026-09-09T13:15:15Z">
+      <w:ins w:id="10146" w:author="Revision merge (HM+PL)" w:date="2026-09-09T13:17:57Z">
         <w:r>
           <w:t xml:space="preserve">catalogue,</w:t>
         </w:r>
@@ -1043,12 +1043,12 @@
       <w:r>
         <w:t xml:space="preserve"> </w:t>
       </w:r>
-      <w:del w:id="10147" w:author="Revision merge (HM+PL)" w:date="2026-09-09T13:15:15Z">
+      <w:del w:id="10147" w:author="Revision merge (HM+PL)" w:date="2026-09-09T13:17:57Z">
         <w:r>
           <w:delText xml:space="preserve">for</w:delText>
         </w:r>
       </w:del>
-      <w:ins w:id="10148" w:author="Revision merge (HM+PL)" w:date="2026-09-09T13:15:15Z">
+      <w:ins w:id="10148" w:author="Revision merge (HM+PL)" w:date="2026-09-09T13:17:57Z">
         <w:r>
           <w:t xml:space="preserve">thereby supporting reproducibility and</w:t>
         </w:r>
@@ -1056,7 +1056,7 @@
       <w:r>
         <w:t xml:space="preserve"> downstream </w:t>
       </w:r>
-      <w:ins w:id="10149" w:author="Revision merge (HM+PL)" w:date="2026-09-09T13:15:15Z">
+      <w:ins w:id="10149" w:author="Revision merge (HM+PL)" w:date="2026-09-09T13:17:57Z">
         <w:r>
           <w:t xml:space="preserve">computational </w:t>
         </w:r>
@@ -1072,7 +1072,7 @@
       <w:r>
         <w:t xml:space="preserve">**Availability and Implementation.** </w:t>
       </w:r>
-      <w:ins w:id="10150" w:author="Revision merge (HM+PL)" w:date="2026-09-09T13:15:15Z">
+      <w:ins w:id="10150" w:author="Revision merge (HM+PL)" w:date="2026-09-09T13:17:57Z">
         <w:r>
           <w:t xml:space="preserve">MERIDIAN is implemented in R and distributed under the MIT licence. </w:t>
         </w:r>
@@ -1080,7 +1080,7 @@
       <w:r>
         <w:t xml:space="preserve">Source</w:t>
       </w:r>
-      <w:ins w:id="10151" w:author="Revision merge (HM+PL)" w:date="2026-09-09T13:15:15Z">
+      <w:ins w:id="10151" w:author="Revision merge (HM+PL)" w:date="2026-09-09T13:17:57Z">
         <w:r>
           <w:t xml:space="preserve"> code and documentation are available</w:t>
         </w:r>
@@ -1088,12 +1088,12 @@
       <w:r>
         <w:t xml:space="preserve"> at </w:t>
       </w:r>
-      <w:del w:id="10152" w:author="Revision merge (HM+PL)" w:date="2026-09-09T13:15:15Z">
+      <w:del w:id="10152" w:author="Revision merge (HM+PL)" w:date="2026-09-09T13:17:57Z">
         <w:r>
           <w:delText xml:space="preserve">https://github.com/Julio92-C/Metagenomics_pipeline_automation (MIT).</w:delText>
         </w:r>
       </w:del>
-      <w:ins w:id="10153" w:author="Revision merge (HM+PL)" w:date="2026-09-09T13:15:15Z">
+      <w:ins w:id="10153" w:author="Revision merge (HM+PL)" w:date="2026-09-09T13:17:57Z">
         <w:r>
           <w:t xml:space="preserve">https://github.com/Julio92-C/Metagenomics_pipeline_automation.</w:t>
         </w:r>
@@ -1101,12 +1101,12 @@
       <w:r>
         <w:t xml:space="preserve"> This note describes release **v0.1.0** (https://github.com/Julio92-C/Metagenomics_pipeline_automation/releases/tag/v0.1.0). </w:t>
       </w:r>
-      <w:del w:id="10154" w:author="Revision merge (HM+PL)" w:date="2026-09-09T13:15:15Z">
+      <w:del w:id="10154" w:author="Revision merge (HM+PL)" w:date="2026-09-09T13:17:57Z">
         <w:r>
           <w:delText xml:space="preserve">Run</w:delText>
         </w:r>
       </w:del>
-      <w:ins w:id="10155" w:author="Revision merge (HM+PL)" w:date="2026-09-09T13:15:15Z">
+      <w:ins w:id="10155" w:author="Revision merge (HM+PL)" w:date="2026-09-09T13:17:57Z">
         <w:r>
           <w:t xml:space="preserve">Reproducible execution is supported through the R environment package `renv`; after restoring dependencies</w:t>
         </w:r>
@@ -1114,12 +1114,12 @@
       <w:r>
         <w:t xml:space="preserve"> with </w:t>
       </w:r>
-      <w:del w:id="10156" w:author="Revision merge (HM+PL)" w:date="2026-09-09T13:15:15Z">
+      <w:del w:id="10156" w:author="Revision merge (HM+PL)" w:date="2026-09-09T13:17:57Z">
         <w:r>
           <w:delText xml:space="preserve">`git</w:delText>
         </w:r>
       </w:del>
-      <w:ins w:id="10157" w:author="Revision merge (HM+PL)" w:date="2026-09-09T13:15:15Z">
+      <w:ins w:id="10157" w:author="Revision merge (HM+PL)" w:date="2026-09-09T13:17:57Z">
         <w:r>
           <w:t xml:space="preserve">`renv::restore()`,</w:t>
         </w:r>
@@ -1127,12 +1127,12 @@
       <w:r>
         <w:t xml:space="preserve"> </w:t>
       </w:r>
-      <w:del w:id="10158" w:author="Revision merge (HM+PL)" w:date="2026-09-09T13:15:15Z">
+      <w:del w:id="10158" w:author="Revision merge (HM+PL)" w:date="2026-09-09T13:17:57Z">
         <w:r>
           <w:delText xml:space="preserve">clone</w:delText>
         </w:r>
       </w:del>
-      <w:ins w:id="10159" w:author="Revision merge (HM+PL)" w:date="2026-09-09T13:15:15Z">
+      <w:ins w:id="10159" w:author="Revision merge (HM+PL)" w:date="2026-09-09T13:17:57Z">
         <w:r>
           <w:t xml:space="preserve">the</w:t>
         </w:r>
@@ -1140,12 +1140,12 @@
       <w:r>
         <w:t xml:space="preserve"> </w:t>
       </w:r>
-      <w:del w:id="10160" w:author="Revision merge (HM+PL)" w:date="2026-09-09T13:15:15Z">
+      <w:del w:id="10160" w:author="Revision merge (HM+PL)" w:date="2026-09-09T13:17:57Z">
         <w:r>
           <w:delText xml:space="preserve">--branch</w:delText>
         </w:r>
       </w:del>
-      <w:ins w:id="10161" w:author="Revision merge (HM+PL)" w:date="2026-09-09T13:15:15Z">
+      <w:ins w:id="10161" w:author="Revision merge (HM+PL)" w:date="2026-09-09T13:17:57Z">
         <w:r>
           <w:t xml:space="preserve">pipeline</w:t>
         </w:r>
@@ -1153,12 +1153,12 @@
       <w:r>
         <w:t xml:space="preserve"> </w:t>
       </w:r>
-      <w:del w:id="10162" w:author="Revision merge (HM+PL)" w:date="2026-09-09T13:15:15Z">
+      <w:del w:id="10162" w:author="Revision merge (HM+PL)" w:date="2026-09-09T13:17:57Z">
         <w:r>
           <w:delText xml:space="preserve">v0.1.0</w:delText>
         </w:r>
       </w:del>
-      <w:ins w:id="10163" w:author="Revision merge (HM+PL)" w:date="2026-09-09T13:15:15Z">
+      <w:ins w:id="10163" w:author="Revision merge (HM+PL)" w:date="2026-09-09T13:17:57Z">
         <w:r>
           <w:t xml:space="preserve">is</w:t>
         </w:r>
@@ -1166,12 +1166,12 @@
       <w:r>
         <w:t xml:space="preserve"> </w:t>
       </w:r>
-      <w:del w:id="10164" w:author="Revision merge (HM+PL)" w:date="2026-09-09T13:15:15Z">
+      <w:del w:id="10164" w:author="Revision merge (HM+PL)" w:date="2026-09-09T13:17:57Z">
         <w:r>
           <w:delText xml:space="preserve">&lt;repo&gt;</w:delText>
         </w:r>
       </w:del>
-      <w:ins w:id="10165" w:author="Revision merge (HM+PL)" w:date="2026-09-09T13:15:15Z">
+      <w:ins w:id="10165" w:author="Revision merge (HM+PL)" w:date="2026-09-09T13:17:57Z">
         <w:r>
           <w:t xml:space="preserve">launched</w:t>
         </w:r>
@@ -1179,12 +1179,12 @@
       <w:r>
         <w:t xml:space="preserve"> </w:t>
       </w:r>
-      <w:del w:id="10166" w:author="Revision merge (HM+PL)" w:date="2026-09-09T13:15:15Z">
+      <w:del w:id="10166" w:author="Revision merge (HM+PL)" w:date="2026-09-09T13:17:57Z">
         <w:r>
           <w:delText xml:space="preserve">&amp;&amp;</w:delText>
         </w:r>
       </w:del>
-      <w:ins w:id="10167" w:author="Revision merge (HM+PL)" w:date="2026-09-09T13:15:15Z">
+      <w:ins w:id="10167" w:author="Revision merge (HM+PL)" w:date="2026-09-09T13:17:57Z">
         <w:r>
           <w:t xml:space="preserve">with</w:t>
         </w:r>
@@ -1192,12 +1192,12 @@
       <w:r>
         <w:t xml:space="preserve"> </w:t>
       </w:r>
-      <w:del w:id="10168" w:author="Revision merge (HM+PL)" w:date="2026-09-09T13:15:15Z">
+      <w:del w:id="10168" w:author="Revision merge (HM+PL)" w:date="2026-09-09T13:17:57Z">
         <w:r>
           <w:delText xml:space="preserve">Rscript</w:delText>
         </w:r>
       </w:del>
-      <w:ins w:id="10169" w:author="Revision merge (HM+PL)" w:date="2026-09-09T13:15:15Z">
+      <w:ins w:id="10169" w:author="Revision merge (HM+PL)" w:date="2026-09-09T13:17:57Z">
         <w:r>
           <w:t xml:space="preserve">`Rscript</w:t>
         </w:r>
@@ -1205,12 +1205,12 @@
       <w:r>
         <w:t xml:space="preserve"> run_pipeline.R </w:t>
       </w:r>
-      <w:del w:id="10170" w:author="Revision merge (HM+PL)" w:date="2026-09-09T13:15:15Z">
+      <w:del w:id="10170" w:author="Revision merge (HM+PL)" w:date="2026-09-09T13:17:57Z">
         <w:r>
           <w:delText xml:space="preserve">config.yaml` after `renv::restore()`.</w:delText>
         </w:r>
       </w:del>
-      <w:ins w:id="10171" w:author="Revision merge (HM+PL)" w:date="2026-09-09T13:15:15Z">
+      <w:ins w:id="10171" w:author="Revision merge (HM+PL)" w:date="2026-09-09T13:17:57Z">
         <w:r>
           <w:t xml:space="preserve">config.yaml`.</w:t>
         </w:r>
@@ -1220,12 +1220,12 @@
       <w:pPr>
         <w:spacing w:after="120"/>
       </w:pPr>
-      <w:del w:id="10172" w:author="Revision merge (HM+PL)" w:date="2026-09-09T13:15:15Z">
+      <w:del w:id="10172" w:author="Revision merge (HM+PL)" w:date="2026-09-09T13:17:57Z">
         <w:r>
           <w:delText xml:space="preserve">**Contact.**</w:delText>
         </w:r>
       </w:del>
-      <w:ins w:id="10173" w:author="Revision merge (HM+PL)" w:date="2026-09-09T13:15:15Z">
+      <w:ins w:id="10173" w:author="Revision merge (HM+PL)" w:date="2026-09-09T13:17:57Z">
         <w:r>
           <w:t xml:space="preserve">**Corresponding author:**</w:t>
         </w:r>
@@ -1263,12 +1263,12 @@
       <w:r>
         <w:t xml:space="preserve">Long-read shotgun </w:t>
       </w:r>
-      <w:del w:id="10174" w:author="Revision merge (HM+PL)" w:date="2026-09-09T13:15:15Z">
+      <w:del w:id="10174" w:author="Revision merge (HM+PL)" w:date="2026-09-09T13:17:57Z">
         <w:r>
           <w:delText xml:space="preserve">metagenomics</w:delText>
         </w:r>
       </w:del>
-      <w:ins w:id="10175" w:author="Revision merge (HM+PL)" w:date="2026-09-09T13:15:15Z">
+      <w:ins w:id="10175" w:author="Revision merge (HM+PL)" w:date="2026-09-09T13:17:57Z">
         <w:r>
           <w:t xml:space="preserve">metagenomics,</w:t>
         </w:r>
@@ -1276,12 +1276,12 @@
       <w:r>
         <w:t xml:space="preserve"> </w:t>
       </w:r>
-      <w:del w:id="10176" w:author="Revision merge (HM+PL)" w:date="2026-09-09T13:15:15Z">
+      <w:del w:id="10176" w:author="Revision merge (HM+PL)" w:date="2026-09-09T13:17:57Z">
         <w:r>
           <w:delText xml:space="preserve">(Oxford</w:delText>
         </w:r>
       </w:del>
-      <w:ins w:id="10177" w:author="Revision merge (HM+PL)" w:date="2026-09-09T13:15:15Z">
+      <w:ins w:id="10177" w:author="Revision merge (HM+PL)" w:date="2026-09-09T13:17:57Z">
         <w:r>
           <w:t xml:space="preserve">enabled</w:t>
         </w:r>
@@ -1289,12 +1289,12 @@
       <w:r>
         <w:t xml:space="preserve"> </w:t>
       </w:r>
-      <w:del w:id="10178" w:author="Revision merge (HM+PL)" w:date="2026-09-09T13:15:15Z">
+      <w:del w:id="10178" w:author="Revision merge (HM+PL)" w:date="2026-09-09T13:17:57Z">
         <w:r>
           <w:delText xml:space="preserve">Nanopore,</w:delText>
         </w:r>
       </w:del>
-      <w:ins w:id="10179" w:author="Revision merge (HM+PL)" w:date="2026-09-09T13:15:15Z">
+      <w:ins w:id="10179" w:author="Revision merge (HM+PL)" w:date="2026-09-09T13:17:57Z">
         <w:r>
           <w:t xml:space="preserve">by</w:t>
         </w:r>
@@ -1302,12 +1302,12 @@
       <w:r>
         <w:t xml:space="preserve"> </w:t>
       </w:r>
-      <w:del w:id="10180" w:author="Revision merge (HM+PL)" w:date="2026-09-09T13:15:15Z">
+      <w:del w:id="10180" w:author="Revision merge (HM+PL)" w:date="2026-09-09T13:17:57Z">
         <w:r>
           <w:delText xml:space="preserve">PacBio)</w:delText>
         </w:r>
       </w:del>
-      <w:ins w:id="10181" w:author="Revision merge (HM+PL)" w:date="2026-09-09T13:15:15Z">
+      <w:ins w:id="10181" w:author="Revision merge (HM+PL)" w:date="2026-09-09T13:17:57Z">
         <w:r>
           <w:t xml:space="preserve">Oxford Nanopore and PacBio sequencing technologies,</w:t>
         </w:r>
@@ -1315,7 +1315,7 @@
       <w:r>
         <w:t xml:space="preserve"> is</w:t>
       </w:r>
-      <w:del w:id="10182" w:author="Revision merge (HM+PL)" w:date="2026-09-09T13:15:15Z">
+      <w:del w:id="10182" w:author="Revision merge (HM+PL)" w:date="2026-09-09T13:17:57Z">
         <w:r>
           <w:delText xml:space="preserve"> increasingly</w:delText>
         </w:r>
@@ -1323,12 +1323,12 @@
       <w:r>
         <w:t xml:space="preserve"> central to One Health surveillance, where </w:t>
       </w:r>
-      <w:del w:id="10183" w:author="Revision merge (HM+PL)" w:date="2026-09-09T13:15:15Z">
+      <w:del w:id="10183" w:author="Revision merge (HM+PL)" w:date="2026-09-09T13:17:57Z">
         <w:r>
           <w:delText xml:space="preserve">threats</w:delText>
         </w:r>
       </w:del>
-      <w:ins w:id="10184" w:author="Revision merge (HM+PL)" w:date="2026-09-09T13:15:15Z">
+      <w:ins w:id="10184" w:author="Revision merge (HM+PL)" w:date="2026-09-09T13:17:57Z">
         <w:r>
           <w:t xml:space="preserve">the</w:t>
         </w:r>
@@ -1336,12 +1336,12 @@
       <w:r>
         <w:t xml:space="preserve"> </w:t>
       </w:r>
-      <w:del w:id="10185" w:author="Revision merge (HM+PL)" w:date="2026-09-09T13:15:15Z">
+      <w:del w:id="10185" w:author="Revision merge (HM+PL)" w:date="2026-09-09T13:17:57Z">
         <w:r>
           <w:delText xml:space="preserve">intersect humans, animals</w:delText>
         </w:r>
       </w:del>
-      <w:ins w:id="10186" w:author="Revision merge (HM+PL)" w:date="2026-09-09T13:15:15Z">
+      <w:ins w:id="10186" w:author="Revision merge (HM+PL)" w:date="2026-09-09T13:17:57Z">
         <w:r>
           <w:t xml:space="preserve">emergence</w:t>
         </w:r>
@@ -1349,12 +1349,12 @@
       <w:r>
         <w:t xml:space="preserve"> and </w:t>
       </w:r>
-      <w:del w:id="10187" w:author="Revision merge (HM+PL)" w:date="2026-09-09T13:15:15Z">
+      <w:del w:id="10187" w:author="Revision merge (HM+PL)" w:date="2026-09-09T13:17:57Z">
         <w:r>
           <w:delText xml:space="preserve">ecosystems</w:delText>
         </w:r>
       </w:del>
-      <w:ins w:id="10188" w:author="Revision merge (HM+PL)" w:date="2026-09-09T13:15:15Z">
+      <w:ins w:id="10188" w:author="Revision merge (HM+PL)" w:date="2026-09-09T13:17:57Z">
         <w:r>
           <w:t xml:space="preserve">dissemination of biological threats occur at the interface of human, animal and environmental systems</w:t>
         </w:r>
@@ -1362,12 +1362,12 @@
       <w:r>
         <w:t xml:space="preserve"> [1]. </w:t>
       </w:r>
-      <w:del w:id="10189" w:author="Revision merge (HM+PL)" w:date="2026-09-09T13:15:15Z">
+      <w:del w:id="10189" w:author="Revision merge (HM+PL)" w:date="2026-09-09T13:17:57Z">
         <w:r>
           <w:delText xml:space="preserve">By</w:delText>
         </w:r>
       </w:del>
-      <w:ins w:id="10190" w:author="Revision merge (HM+PL)" w:date="2026-09-09T13:15:15Z">
+      <w:ins w:id="10190" w:author="Revision merge (HM+PL)" w:date="2026-09-09T13:17:57Z">
         <w:r>
           <w:t xml:space="preserve">Unlike</w:t>
         </w:r>
@@ -1375,12 +1375,12 @@
       <w:r>
         <w:t xml:space="preserve"> </w:t>
       </w:r>
-      <w:del w:id="10191" w:author="Revision merge (HM+PL)" w:date="2026-09-09T13:15:15Z">
+      <w:del w:id="10191" w:author="Revision merge (HM+PL)" w:date="2026-09-09T13:17:57Z">
         <w:r>
           <w:delText xml:space="preserve">profiling</w:delText>
         </w:r>
       </w:del>
-      <w:ins w:id="10192" w:author="Revision merge (HM+PL)" w:date="2026-09-09T13:15:15Z">
+      <w:ins w:id="10192" w:author="Revision merge (HM+PL)" w:date="2026-09-09T13:17:57Z">
         <w:r>
           <w:t xml:space="preserve">targeted approaches, shotgun metagenomics enables simultaneous characterisation of</w:t>
         </w:r>
@@ -1388,12 +1388,12 @@
       <w:r>
         <w:t xml:space="preserve"> microbial </w:t>
       </w:r>
-      <w:del w:id="10193" w:author="Revision merge (HM+PL)" w:date="2026-09-09T13:15:15Z">
+      <w:del w:id="10193" w:author="Revision merge (HM+PL)" w:date="2026-09-09T13:17:57Z">
         <w:r>
           <w:delText xml:space="preserve">communities</w:delText>
         </w:r>
       </w:del>
-      <w:ins w:id="10194" w:author="Revision merge (HM+PL)" w:date="2026-09-09T13:15:15Z">
+      <w:ins w:id="10194" w:author="Revision merge (HM+PL)" w:date="2026-09-09T13:17:57Z">
         <w:r>
           <w:t xml:space="preserve">community composition</w:t>
         </w:r>
@@ -1401,7 +1401,7 @@
       <w:r>
         <w:t xml:space="preserve"> and</w:t>
       </w:r>
-      <w:del w:id="10195" w:author="Revision merge (HM+PL)" w:date="2026-09-09T13:15:15Z">
+      <w:del w:id="10195" w:author="Revision merge (HM+PL)" w:date="2026-09-09T13:17:57Z">
         <w:r>
           <w:delText xml:space="preserve"> their</w:delText>
         </w:r>
@@ -1409,12 +1409,12 @@
       <w:r>
         <w:t xml:space="preserve"> functional genetic </w:t>
       </w:r>
-      <w:del w:id="10196" w:author="Revision merge (HM+PL)" w:date="2026-09-09T13:15:15Z">
+      <w:del w:id="10196" w:author="Revision merge (HM+PL)" w:date="2026-09-09T13:17:57Z">
         <w:r>
           <w:delText xml:space="preserve">elements</w:delText>
         </w:r>
       </w:del>
-      <w:ins w:id="10197" w:author="Revision merge (HM+PL)" w:date="2026-09-09T13:15:15Z">
+      <w:ins w:id="10197" w:author="Revision merge (HM+PL)" w:date="2026-09-09T13:17:57Z">
         <w:r>
           <w:t xml:space="preserve">content,</w:t>
         </w:r>
@@ -1422,12 +1422,12 @@
       <w:r>
         <w:t xml:space="preserve"> </w:t>
       </w:r>
-      <w:del w:id="10198" w:author="Revision merge (HM+PL)" w:date="2026-09-09T13:15:15Z">
+      <w:del w:id="10198" w:author="Revision merge (HM+PL)" w:date="2026-09-09T13:17:57Z">
         <w:r>
           <w:delText xml:space="preserve">in</w:delText>
         </w:r>
       </w:del>
-      <w:ins w:id="10199" w:author="Revision merge (HM+PL)" w:date="2026-09-09T13:15:15Z">
+      <w:ins w:id="10199" w:author="Revision merge (HM+PL)" w:date="2026-09-09T13:17:57Z">
         <w:r>
           <w:t xml:space="preserve">thereby</w:t>
         </w:r>
@@ -1435,12 +1435,12 @@
       <w:r>
         <w:t xml:space="preserve"> </w:t>
       </w:r>
-      <w:del w:id="10200" w:author="Revision merge (HM+PL)" w:date="2026-09-09T13:15:15Z">
+      <w:del w:id="10200" w:author="Revision merge (HM+PL)" w:date="2026-09-09T13:17:57Z">
         <w:r>
           <w:delText xml:space="preserve">a single experiment, it links</w:delText>
         </w:r>
       </w:del>
-      <w:ins w:id="10201" w:author="Revision merge (HM+PL)" w:date="2026-09-09T13:15:15Z">
+      <w:ins w:id="10201" w:author="Revision merge (HM+PL)" w:date="2026-09-09T13:17:57Z">
         <w:r>
           <w:t xml:space="preserve">linking</w:t>
         </w:r>
@@ -1448,7 +1448,7 @@
       <w:r>
         <w:t xml:space="preserve"> taxonomic identity to</w:t>
       </w:r>
-      <w:del w:id="10202" w:author="Revision merge (HM+PL)" w:date="2026-09-09T13:15:15Z">
+      <w:del w:id="10202" w:author="Revision merge (HM+PL)" w:date="2026-09-09T13:17:57Z">
         <w:r>
           <w:delText xml:space="preserve"> determinants of resistance, virulence, and mobility across environmental, clinical, and livestock matrices. The downstream analysis stack is well established — Kraken2 [2] and Bracken [3] for taxonomic assignment and abundance estimation, ABRicate [4] for screening</w:delText>
         </w:r>
@@ -1456,7 +1456,7 @@
       <w:r>
         <w:t xml:space="preserve"> antimicrobial resistance genes (ARGs), virulence factors (VFs) and mobile genetic elements (MGEs) </w:t>
       </w:r>
-      <w:ins w:id="10203" w:author="Revision merge (HM+PL)" w:date="2026-09-09T13:15:15Z">
+      <w:ins w:id="10203" w:author="Revision merge (HM+PL)" w:date="2026-09-09T13:17:57Z">
         <w:r>
           <w:t xml:space="preserve">within a single experiment. This capability is particularly valuable for tracking the ecology and transmission of high-risk microorganisms and their associated genetic determinants across clinical, agricultural and environmental reservoirs. The downstream analysis supporting long-read metagenomics is now well established. Widely adopted tools include Kraken2 [2] and Bracken [3] for taxonomic classification and abundance estimation, ABRicate [4] for screening ARGs, VFs and MGEs </w:t>
         </w:r>
@@ -1464,7 +1464,7 @@
       <w:r>
         <w:t xml:space="preserve">against</w:t>
       </w:r>
-      <w:ins w:id="10204" w:author="Revision merge (HM+PL)" w:date="2026-09-09T13:15:15Z">
+      <w:ins w:id="10204" w:author="Revision merge (HM+PL)" w:date="2026-09-09T13:17:57Z">
         <w:r>
           <w:t xml:space="preserve"> databases such as</w:t>
         </w:r>
@@ -1472,12 +1472,12 @@
       <w:r>
         <w:t xml:space="preserve"> CARD [5], VFDB [6] and PlasmidFinder [7], Re-centrifuge [8] for contamination assessment, and R packages </w:t>
       </w:r>
-      <w:del w:id="10205" w:author="Revision merge (HM+PL)" w:date="2026-09-09T13:15:15Z">
+      <w:del w:id="10205" w:author="Revision merge (HM+PL)" w:date="2026-09-09T13:17:57Z">
         <w:r>
           <w:delText xml:space="preserve">such as</w:delText>
         </w:r>
       </w:del>
-      <w:ins w:id="10206" w:author="Revision merge (HM+PL)" w:date="2026-09-09T13:15:15Z">
+      <w:ins w:id="10206" w:author="Revision merge (HM+PL)" w:date="2026-09-09T13:17:57Z">
         <w:r>
           <w:t xml:space="preserve">including</w:t>
         </w:r>
@@ -1485,12 +1485,12 @@
       <w:r>
         <w:t xml:space="preserve"> vegan [9] and ALDEx2 [10] for ecological and differential </w:t>
       </w:r>
-      <w:del w:id="10207" w:author="Revision merge (HM+PL)" w:date="2026-09-09T13:15:15Z">
+      <w:del w:id="10207" w:author="Revision merge (HM+PL)" w:date="2026-09-09T13:17:57Z">
         <w:r>
           <w:delText xml:space="preserve">analyses</w:delText>
         </w:r>
       </w:del>
-      <w:ins w:id="10208" w:author="Revision merge (HM+PL)" w:date="2026-09-09T13:15:15Z">
+      <w:ins w:id="10208" w:author="Revision merge (HM+PL)" w:date="2026-09-09T13:17:57Z">
         <w:r>
           <w:t xml:space="preserve">abundance</w:t>
         </w:r>
@@ -1498,12 +1498,12 @@
       <w:r>
         <w:t xml:space="preserve"> </w:t>
       </w:r>
-      <w:del w:id="10209" w:author="Revision merge (HM+PL)" w:date="2026-09-09T13:15:15Z">
+      <w:del w:id="10209" w:author="Revision merge (HM+PL)" w:date="2026-09-09T13:17:57Z">
         <w:r>
           <w:delText xml:space="preserve">—</w:delText>
         </w:r>
       </w:del>
-      <w:ins w:id="10210" w:author="Revision merge (HM+PL)" w:date="2026-09-09T13:15:15Z">
+      <w:ins w:id="10210" w:author="Revision merge (HM+PL)" w:date="2026-09-09T13:17:57Z">
         <w:r>
           <w:t xml:space="preserve">analyses.</w:t>
         </w:r>
@@ -1511,12 +1511,12 @@
       <w:r>
         <w:t xml:space="preserve"> </w:t>
       </w:r>
-      <w:del w:id="10211" w:author="Revision merge (HM+PL)" w:date="2026-09-09T13:15:15Z">
+      <w:del w:id="10211" w:author="Revision merge (HM+PL)" w:date="2026-09-09T13:17:57Z">
         <w:r>
           <w:delText xml:space="preserve">but</w:delText>
         </w:r>
       </w:del>
-      <w:ins w:id="10212" w:author="Revision merge (HM+PL)" w:date="2026-09-09T13:15:15Z">
+      <w:ins w:id="10212" w:author="Revision merge (HM+PL)" w:date="2026-09-09T13:17:57Z">
         <w:r>
           <w:t xml:space="preserve">However,</w:t>
         </w:r>
@@ -1524,12 +1524,12 @@
       <w:r>
         <w:t xml:space="preserve"> </w:t>
       </w:r>
-      <w:del w:id="10213" w:author="Revision merge (HM+PL)" w:date="2026-09-09T13:15:15Z">
+      <w:del w:id="10213" w:author="Revision merge (HM+PL)" w:date="2026-09-09T13:17:57Z">
         <w:r>
           <w:delText xml:space="preserve">the</w:delText>
         </w:r>
       </w:del>
-      <w:ins w:id="10214" w:author="Revision merge (HM+PL)" w:date="2026-09-09T13:15:15Z">
+      <w:ins w:id="10214" w:author="Revision merge (HM+PL)" w:date="2026-09-09T13:17:57Z">
         <w:r>
           <w:t xml:space="preserve">while these tools are individually well established, their</w:t>
         </w:r>
@@ -1537,12 +1537,12 @@
       <w:r>
         <w:t xml:space="preserve"> integration </w:t>
       </w:r>
-      <w:del w:id="10215" w:author="Revision merge (HM+PL)" w:date="2026-09-09T13:15:15Z">
+      <w:del w:id="10215" w:author="Revision merge (HM+PL)" w:date="2026-09-09T13:17:57Z">
         <w:r>
           <w:delText xml:space="preserve">between</w:delText>
         </w:r>
       </w:del>
-      <w:ins w:id="10216" w:author="Revision merge (HM+PL)" w:date="2026-09-09T13:15:15Z">
+      <w:ins w:id="10216" w:author="Revision merge (HM+PL)" w:date="2026-09-09T13:17:57Z">
         <w:r>
           <w:t xml:space="preserve">into</w:t>
         </w:r>
@@ -1550,12 +1550,12 @@
       <w:r>
         <w:t xml:space="preserve"> </w:t>
       </w:r>
-      <w:del w:id="10217" w:author="Revision merge (HM+PL)" w:date="2026-09-09T13:15:15Z">
+      <w:del w:id="10217" w:author="Revision merge (HM+PL)" w:date="2026-09-09T13:17:57Z">
         <w:r>
           <w:delText xml:space="preserve">them</w:delText>
         </w:r>
       </w:del>
-      <w:ins w:id="10218" w:author="Revision merge (HM+PL)" w:date="2026-09-09T13:15:15Z">
+      <w:ins w:id="10218" w:author="Revision merge (HM+PL)" w:date="2026-09-09T13:17:57Z">
         <w:r>
           <w:t xml:space="preserve">reproducible</w:t>
         </w:r>
@@ -1563,12 +1563,12 @@
       <w:r>
         <w:t xml:space="preserve"> </w:t>
       </w:r>
-      <w:del w:id="10219" w:author="Revision merge (HM+PL)" w:date="2026-09-09T13:15:15Z">
+      <w:del w:id="10219" w:author="Revision merge (HM+PL)" w:date="2026-09-09T13:17:57Z">
         <w:r>
           <w:delText xml:space="preserve">is</w:delText>
         </w:r>
       </w:del>
-      <w:ins w:id="10220" w:author="Revision merge (HM+PL)" w:date="2026-09-09T13:15:15Z">
+      <w:ins w:id="10220" w:author="Revision merge (HM+PL)" w:date="2026-09-09T13:17:57Z">
         <w:r>
           <w:t xml:space="preserve">and</w:t>
         </w:r>
@@ -1576,12 +1576,12 @@
       <w:r>
         <w:t xml:space="preserve"> </w:t>
       </w:r>
-      <w:del w:id="10221" w:author="Revision merge (HM+PL)" w:date="2026-09-09T13:15:15Z">
+      <w:del w:id="10221" w:author="Revision merge (HM+PL)" w:date="2026-09-09T13:17:57Z">
         <w:r>
           <w:delText xml:space="preserve">not.</w:delText>
         </w:r>
       </w:del>
-      <w:ins w:id="10222" w:author="Revision merge (HM+PL)" w:date="2026-09-09T13:15:15Z">
+      <w:ins w:id="10222" w:author="Revision merge (HM+PL)" w:date="2026-09-09T13:17:57Z">
         <w:r>
           <w:t xml:space="preserve">reusable workflows remains limited.</w:t>
         </w:r>
@@ -1594,12 +1594,12 @@
       <w:r>
         <w:t xml:space="preserve">In practice, </w:t>
       </w:r>
-      <w:del w:id="10223" w:author="Revision merge (HM+PL)" w:date="2026-09-09T13:15:15Z">
+      <w:del w:id="10223" w:author="Revision merge (HM+PL)" w:date="2026-09-09T13:17:57Z">
         <w:r>
           <w:delText xml:space="preserve">each</w:delText>
         </w:r>
       </w:del>
-      <w:ins w:id="10224" w:author="Revision merge (HM+PL)" w:date="2026-09-09T13:15:15Z">
+      <w:ins w:id="10224" w:author="Revision merge (HM+PL)" w:date="2026-09-09T13:17:57Z">
         <w:r>
           <w:t xml:space="preserve">downstream</w:t>
         </w:r>
@@ -1607,12 +1607,12 @@
       <w:r>
         <w:t xml:space="preserve"> </w:t>
       </w:r>
-      <w:del w:id="10225" w:author="Revision merge (HM+PL)" w:date="2026-09-09T13:15:15Z">
+      <w:del w:id="10225" w:author="Revision merge (HM+PL)" w:date="2026-09-09T13:17:57Z">
         <w:r>
           <w:delText xml:space="preserve">new</w:delText>
         </w:r>
       </w:del>
-      <w:ins w:id="10226" w:author="Revision merge (HM+PL)" w:date="2026-09-09T13:15:15Z">
+      <w:ins w:id="10226" w:author="Revision merge (HM+PL)" w:date="2026-09-09T13:17:57Z">
         <w:r>
           <w:t xml:space="preserve">analyses</w:t>
         </w:r>
@@ -1620,12 +1620,12 @@
       <w:r>
         <w:t xml:space="preserve"> </w:t>
       </w:r>
-      <w:del w:id="10227" w:author="Revision merge (HM+PL)" w:date="2026-09-09T13:15:15Z">
+      <w:del w:id="10227" w:author="Revision merge (HM+PL)" w:date="2026-09-09T13:17:57Z">
         <w:r>
           <w:delText xml:space="preserve">study</w:delText>
         </w:r>
       </w:del>
-      <w:ins w:id="10228" w:author="Revision merge (HM+PL)" w:date="2026-09-09T13:15:15Z">
+      <w:ins w:id="10228" w:author="Revision merge (HM+PL)" w:date="2026-09-09T13:17:57Z">
         <w:r>
           <w:t xml:space="preserve">continue</w:t>
         </w:r>
@@ -1633,12 +1633,12 @@
       <w:r>
         <w:t xml:space="preserve"> </w:t>
       </w:r>
-      <w:del w:id="10229" w:author="Revision merge (HM+PL)" w:date="2026-09-09T13:15:15Z">
+      <w:del w:id="10229" w:author="Revision merge (HM+PL)" w:date="2026-09-09T13:17:57Z">
         <w:r>
           <w:delText xml:space="preserve">is</w:delText>
         </w:r>
       </w:del>
-      <w:ins w:id="10230" w:author="Revision merge (HM+PL)" w:date="2026-09-09T13:15:15Z">
+      <w:ins w:id="10230" w:author="Revision merge (HM+PL)" w:date="2026-09-09T13:17:57Z">
         <w:r>
           <w:t xml:space="preserve">to</w:t>
         </w:r>
@@ -1646,12 +1646,12 @@
       <w:r>
         <w:t xml:space="preserve"> </w:t>
       </w:r>
-      <w:del w:id="10231" w:author="Revision merge (HM+PL)" w:date="2026-09-09T13:15:15Z">
+      <w:del w:id="10231" w:author="Revision merge (HM+PL)" w:date="2026-09-09T13:17:57Z">
         <w:r>
           <w:delText xml:space="preserve">analysed</w:delText>
         </w:r>
       </w:del>
-      <w:ins w:id="10232" w:author="Revision merge (HM+PL)" w:date="2026-09-09T13:15:15Z">
+      <w:ins w:id="10232" w:author="Revision merge (HM+PL)" w:date="2026-09-09T13:17:57Z">
         <w:r>
           <w:t xml:space="preserve">rely</w:t>
         </w:r>
@@ -1659,12 +1659,12 @@
       <w:r>
         <w:t xml:space="preserve"> </w:t>
       </w:r>
-      <w:del w:id="10233" w:author="Revision merge (HM+PL)" w:date="2026-09-09T13:15:15Z">
+      <w:del w:id="10233" w:author="Revision merge (HM+PL)" w:date="2026-09-09T13:17:57Z">
         <w:r>
           <w:delText xml:space="preserve">by adapting</w:delText>
         </w:r>
       </w:del>
-      <w:ins w:id="10234" w:author="Revision merge (HM+PL)" w:date="2026-09-09T13:15:15Z">
+      <w:ins w:id="10234" w:author="Revision merge (HM+PL)" w:date="2026-09-09T13:17:57Z">
         <w:r>
           <w:t xml:space="preserve">on</w:t>
         </w:r>
@@ -1672,12 +1672,12 @@
       <w:r>
         <w:t xml:space="preserve"> a set of bespoke R </w:t>
       </w:r>
-      <w:del w:id="10235" w:author="Revision merge (HM+PL)" w:date="2026-09-09T13:15:15Z">
+      <w:del w:id="10235" w:author="Revision merge (HM+PL)" w:date="2026-09-09T13:17:57Z">
         <w:r>
           <w:delText xml:space="preserve">scripts:</w:delText>
         </w:r>
       </w:del>
-      <w:ins w:id="10236" w:author="Revision merge (HM+PL)" w:date="2026-09-09T13:15:15Z">
+      <w:ins w:id="10236" w:author="Revision merge (HM+PL)" w:date="2026-09-09T13:17:57Z">
         <w:r>
           <w:t xml:space="preserve">scripts that have evolved incrementally over successive projects. These scripts frequently contain</w:t>
         </w:r>
@@ -1685,12 +1685,12 @@
       <w:r>
         <w:t xml:space="preserve"> hard-coded input paths, sample-identifier filters embedded as literal strings, per-study negative-control renames, and taxonomy fixes patched by row index. </w:t>
       </w:r>
-      <w:del w:id="10237" w:author="Revision merge (HM+PL)" w:date="2026-09-09T13:15:15Z">
+      <w:del w:id="10237" w:author="Revision merge (HM+PL)" w:date="2026-09-09T13:17:57Z">
         <w:r>
           <w:delText xml:space="preserve">Consequently,</w:delText>
         </w:r>
       </w:del>
-      <w:ins w:id="10238" w:author="Revision merge (HM+PL)" w:date="2026-09-09T13:15:15Z">
+      <w:ins w:id="10238" w:author="Revision merge (HM+PL)" w:date="2026-09-09T13:17:57Z">
         <w:r>
           <w:t xml:space="preserve">As a result,</w:t>
         </w:r>
@@ -1698,12 +1698,12 @@
       <w:r>
         <w:t xml:space="preserve"> individual script copies </w:t>
       </w:r>
-      <w:del w:id="10239" w:author="Revision merge (HM+PL)" w:date="2026-09-09T13:15:15Z">
+      <w:del w:id="10239" w:author="Revision merge (HM+PL)" w:date="2026-09-09T13:17:57Z">
         <w:r>
           <w:delText xml:space="preserve">diverge,</w:delText>
         </w:r>
       </w:del>
-      <w:ins w:id="10240" w:author="Revision merge (HM+PL)" w:date="2026-09-09T13:15:15Z">
+      <w:ins w:id="10240" w:author="Revision merge (HM+PL)" w:date="2026-09-09T13:17:57Z">
         <w:r>
           <w:t xml:space="preserve">diverge over time, reducing reproducibility and limiting portability,</w:t>
         </w:r>
@@ -1711,12 +1711,12 @@
       <w:r>
         <w:t xml:space="preserve"> and the </w:t>
       </w:r>
-      <w:del w:id="10241" w:author="Revision merge (HM+PL)" w:date="2026-09-09T13:15:15Z">
+      <w:del w:id="10241" w:author="Revision merge (HM+PL)" w:date="2026-09-09T13:17:57Z">
         <w:r>
           <w:delText xml:space="preserve">lack</w:delText>
         </w:r>
       </w:del>
-      <w:ins w:id="10242" w:author="Revision merge (HM+PL)" w:date="2026-09-09T13:15:15Z">
+      <w:ins w:id="10242" w:author="Revision merge (HM+PL)" w:date="2026-09-09T13:17:57Z">
         <w:r>
           <w:t xml:space="preserve">absence</w:t>
         </w:r>
@@ -1724,12 +1724,12 @@
       <w:r>
         <w:t xml:space="preserve"> of a shared interface prevents automated output logging. Comparing different studies requires manual reconciliation of both code and data. The reference cohort for the present work (`Chicken Batch 1`; ~46 hand-edited scripts) </w:t>
       </w:r>
-      <w:del w:id="10243" w:author="Revision merge (HM+PL)" w:date="2026-09-09T13:15:15Z">
+      <w:del w:id="10243" w:author="Revision merge (HM+PL)" w:date="2026-09-09T13:17:57Z">
         <w:r>
           <w:delText xml:space="preserve">typifies</w:delText>
         </w:r>
       </w:del>
-      <w:ins w:id="10244" w:author="Revision merge (HM+PL)" w:date="2026-09-09T13:15:15Z">
+      <w:ins w:id="10244" w:author="Revision merge (HM+PL)" w:date="2026-09-09T13:17:57Z">
         <w:r>
           <w:t xml:space="preserve">exemplifies</w:t>
         </w:r>
@@ -1737,12 +1737,12 @@
       <w:r>
         <w:t xml:space="preserve"> this pattern. The L-ARRAP pipeline [11] </w:t>
       </w:r>
-      <w:del w:id="10245" w:author="Revision merge (HM+PL)" w:date="2026-09-09T13:15:15Z">
+      <w:del w:id="10245" w:author="Revision merge (HM+PL)" w:date="2026-09-09T13:17:57Z">
         <w:r>
           <w:delText xml:space="preserve">addresses</w:delText>
         </w:r>
       </w:del>
-      <w:ins w:id="10246" w:author="Revision merge (HM+PL)" w:date="2026-09-09T13:15:15Z">
+      <w:ins w:id="10246" w:author="Revision merge (HM+PL)" w:date="2026-09-09T13:17:57Z">
         <w:r>
           <w:t xml:space="preserve">provides</w:t>
         </w:r>
@@ -1750,12 +1750,12 @@
       <w:r>
         <w:t xml:space="preserve"> </w:t>
       </w:r>
-      <w:del w:id="10247" w:author="Revision merge (HM+PL)" w:date="2026-09-09T13:15:15Z">
+      <w:del w:id="10247" w:author="Revision merge (HM+PL)" w:date="2026-09-09T13:17:57Z">
         <w:r>
           <w:delText xml:space="preserve">one</w:delText>
         </w:r>
       </w:del>
-      <w:ins w:id="10248" w:author="Revision merge (HM+PL)" w:date="2026-09-09T13:15:15Z">
+      <w:ins w:id="10248" w:author="Revision merge (HM+PL)" w:date="2026-09-09T13:17:57Z">
         <w:r>
           <w:t xml:space="preserve">a</w:t>
         </w:r>
@@ -1763,12 +1763,12 @@
       <w:r>
         <w:t xml:space="preserve"> </w:t>
       </w:r>
-      <w:del w:id="10249" w:author="Revision merge (HM+PL)" w:date="2026-09-09T13:15:15Z">
+      <w:del w:id="10249" w:author="Revision merge (HM+PL)" w:date="2026-09-09T13:17:57Z">
         <w:r>
           <w:delText xml:space="preserve">slice of this problem</w:delText>
         </w:r>
       </w:del>
-      <w:ins w:id="10250" w:author="Revision merge (HM+PL)" w:date="2026-09-09T13:15:15Z">
+      <w:ins w:id="10250" w:author="Revision merge (HM+PL)" w:date="2026-09-09T13:17:57Z">
         <w:r>
           <w:t xml:space="preserve">framework</w:t>
         </w:r>
@@ -1776,12 +1776,12 @@
       <w:r>
         <w:t xml:space="preserve"> for long-read resistome risk assessment, </w:t>
       </w:r>
-      <w:del w:id="10251" w:author="Revision merge (HM+PL)" w:date="2026-09-09T13:15:15Z">
+      <w:del w:id="10251" w:author="Revision merge (HM+PL)" w:date="2026-09-09T13:17:57Z">
         <w:r>
           <w:delText xml:space="preserve">and</w:delText>
         </w:r>
       </w:del>
-      <w:ins w:id="10252" w:author="Revision merge (HM+PL)" w:date="2026-09-09T13:15:15Z">
+      <w:ins w:id="10252" w:author="Revision merge (HM+PL)" w:date="2026-09-09T13:17:57Z">
         <w:r>
           <w:t xml:space="preserve">while</w:t>
         </w:r>
@@ -1789,12 +1789,12 @@
       <w:r>
         <w:t xml:space="preserve"> the rANOMALY workflow [12] demonstrates the </w:t>
       </w:r>
-      <w:del w:id="10253" w:author="Revision merge (HM+PL)" w:date="2026-09-09T13:15:15Z">
+      <w:del w:id="10253" w:author="Revision merge (HM+PL)" w:date="2026-09-09T13:17:57Z">
         <w:r>
           <w:delText xml:space="preserve">value</w:delText>
         </w:r>
       </w:del>
-      <w:ins w:id="10254" w:author="Revision merge (HM+PL)" w:date="2026-09-09T13:15:15Z">
+      <w:ins w:id="10254" w:author="Revision merge (HM+PL)" w:date="2026-09-09T13:17:57Z">
         <w:r>
           <w:t xml:space="preserve">advantages</w:t>
         </w:r>
@@ -1802,12 +1802,12 @@
       <w:r>
         <w:t xml:space="preserve"> of a </w:t>
       </w:r>
-      <w:del w:id="10255" w:author="Revision merge (HM+PL)" w:date="2026-09-09T13:15:15Z">
+      <w:del w:id="10255" w:author="Revision merge (HM+PL)" w:date="2026-09-09T13:17:57Z">
         <w:r>
           <w:delText xml:space="preserve">config-driven</w:delText>
         </w:r>
       </w:del>
-      <w:ins w:id="10256" w:author="Revision merge (HM+PL)" w:date="2026-09-09T13:15:15Z">
+      <w:ins w:id="10256" w:author="Revision merge (HM+PL)" w:date="2026-09-09T13:17:57Z">
         <w:r>
           <w:t xml:space="preserve">configuration-driven</w:t>
         </w:r>
@@ -1815,12 +1815,12 @@
       <w:r>
         <w:t xml:space="preserve"> R workflow with auto-generated reports for amplicon data. To our knowledge, no </w:t>
       </w:r>
-      <w:del w:id="10257" w:author="Revision merge (HM+PL)" w:date="2026-09-09T13:15:15Z">
+      <w:del w:id="10257" w:author="Revision merge (HM+PL)" w:date="2026-09-09T13:17:57Z">
         <w:r>
           <w:delText xml:space="preserve">comparable</w:delText>
         </w:r>
       </w:del>
-      <w:ins w:id="10258" w:author="Revision merge (HM+PL)" w:date="2026-09-09T13:15:15Z">
+      <w:ins w:id="10258" w:author="Revision merge (HM+PL)" w:date="2026-09-09T13:17:57Z">
         <w:r>
           <w:t xml:space="preserve">integrated end-to-end R</w:t>
         </w:r>
@@ -1828,12 +1828,12 @@
       <w:r>
         <w:t xml:space="preserve"> workflow </w:t>
       </w:r>
-      <w:del w:id="10259" w:author="Revision merge (HM+PL)" w:date="2026-09-09T13:15:15Z">
+      <w:del w:id="10259" w:author="Revision merge (HM+PL)" w:date="2026-09-09T13:17:57Z">
         <w:r>
           <w:delText xml:space="preserve">exists for end-to-end</w:delText>
         </w:r>
       </w:del>
-      <w:ins w:id="10260" w:author="Revision merge (HM+PL)" w:date="2026-09-09T13:15:15Z">
+      <w:ins w:id="10260" w:author="Revision merge (HM+PL)" w:date="2026-09-09T13:17:57Z">
         <w:r>
           <w:t xml:space="preserve">covers</w:t>
         </w:r>
@@ -1841,12 +1841,12 @@
       <w:r>
         <w:t xml:space="preserve"> long-read shotgun </w:t>
       </w:r>
-      <w:del w:id="10261" w:author="Revision merge (HM+PL)" w:date="2026-09-09T13:15:15Z">
+      <w:del w:id="10261" w:author="Revision merge (HM+PL)" w:date="2026-09-09T13:17:57Z">
         <w:r>
           <w:delText xml:space="preserve">metagenomics</w:delText>
         </w:r>
       </w:del>
-      <w:ins w:id="10262" w:author="Revision merge (HM+PL)" w:date="2026-09-09T13:15:15Z">
+      <w:ins w:id="10262" w:author="Revision merge (HM+PL)" w:date="2026-09-09T13:17:57Z">
         <w:r>
           <w:t xml:space="preserve">metagenomic</w:t>
         </w:r>
@@ -1854,12 +1854,12 @@
       <w:r>
         <w:t xml:space="preserve"> </w:t>
       </w:r>
-      <w:del w:id="10263" w:author="Revision merge (HM+PL)" w:date="2026-09-09T13:15:15Z">
+      <w:del w:id="10263" w:author="Revision merge (HM+PL)" w:date="2026-09-09T13:17:57Z">
         <w:r>
           <w:delText xml:space="preserve">that</w:delText>
         </w:r>
       </w:del>
-      <w:ins w:id="10264" w:author="Revision merge (HM+PL)" w:date="2026-09-09T13:15:15Z">
+      <w:ins w:id="10264" w:author="Revision merge (HM+PL)" w:date="2026-09-09T13:17:57Z">
         <w:r>
           <w:t xml:space="preserve">data</w:t>
         </w:r>
@@ -1867,12 +1867,12 @@
       <w:r>
         <w:t xml:space="preserve"> </w:t>
       </w:r>
-      <w:del w:id="10265" w:author="Revision merge (HM+PL)" w:date="2026-09-09T13:15:15Z">
+      <w:del w:id="10265" w:author="Revision merge (HM+PL)" w:date="2026-09-09T13:17:57Z">
         <w:r>
           <w:delText xml:space="preserve">covers</w:delText>
         </w:r>
       </w:del>
-      <w:ins w:id="10266" w:author="Revision merge (HM+PL)" w:date="2026-09-09T13:15:15Z">
+      <w:ins w:id="10266" w:author="Revision merge (HM+PL)" w:date="2026-09-09T13:17:57Z">
         <w:r>
           <w:t xml:space="preserve">spanning</w:t>
         </w:r>
@@ -1880,12 +1880,12 @@
       <w:r>
         <w:t xml:space="preserve"> </w:t>
       </w:r>
-      <w:del w:id="10267" w:author="Revision merge (HM+PL)" w:date="2026-09-09T13:15:15Z">
+      <w:del w:id="10267" w:author="Revision merge (HM+PL)" w:date="2026-09-09T13:17:57Z">
         <w:r>
           <w:delText xml:space="preserve">taxonomy,</w:delText>
         </w:r>
       </w:del>
-      <w:ins w:id="10268" w:author="Revision merge (HM+PL)" w:date="2026-09-09T13:15:15Z">
+      <w:ins w:id="10268" w:author="Revision merge (HM+PL)" w:date="2026-09-09T13:17:57Z">
         <w:r>
           <w:t xml:space="preserve">taxonomic composition, microbial</w:t>
         </w:r>
@@ -1893,12 +1893,12 @@
       <w:r>
         <w:t xml:space="preserve"> diversity, differential abundance, and </w:t>
       </w:r>
-      <w:del w:id="10269" w:author="Revision merge (HM+PL)" w:date="2026-09-09T13:15:15Z">
+      <w:del w:id="10269" w:author="Revision merge (HM+PL)" w:date="2026-09-09T13:17:57Z">
         <w:r>
           <w:delText xml:space="preserve">full</w:delText>
         </w:r>
       </w:del>
-      <w:ins w:id="10270" w:author="Revision merge (HM+PL)" w:date="2026-09-09T13:15:15Z">
+      <w:ins w:id="10270" w:author="Revision merge (HM+PL)" w:date="2026-09-09T13:17:57Z">
         <w:r>
           <w:t xml:space="preserve">comprehensive</w:t>
         </w:r>
@@ -1911,12 +1911,12 @@
       <w:pPr>
         <w:spacing w:after="120"/>
       </w:pPr>
-      <w:del w:id="10271" w:author="Revision merge (HM+PL)" w:date="2026-09-09T13:15:15Z">
+      <w:del w:id="10271" w:author="Revision merge (HM+PL)" w:date="2026-09-09T13:17:57Z">
         <w:r>
           <w:delText xml:space="preserve">We</w:delText>
         </w:r>
       </w:del>
-      <w:ins w:id="10272" w:author="Revision merge (HM+PL)" w:date="2026-09-09T13:15:15Z">
+      <w:ins w:id="10272" w:author="Revision merge (HM+PL)" w:date="2026-09-09T13:17:57Z">
         <w:r>
           <w:t xml:space="preserve">To</w:t>
         </w:r>
@@ -1924,12 +1924,12 @@
       <w:r>
         <w:t xml:space="preserve"> </w:t>
       </w:r>
-      <w:del w:id="10273" w:author="Revision merge (HM+PL)" w:date="2026-09-09T13:15:15Z">
+      <w:del w:id="10273" w:author="Revision merge (HM+PL)" w:date="2026-09-09T13:17:57Z">
         <w:r>
           <w:delText xml:space="preserve">present</w:delText>
         </w:r>
       </w:del>
-      <w:ins w:id="10274" w:author="Revision merge (HM+PL)" w:date="2026-09-09T13:15:15Z">
+      <w:ins w:id="10274" w:author="Revision merge (HM+PL)" w:date="2026-09-09T13:17:57Z">
         <w:r>
           <w:t xml:space="preserve">address this gap, we have developed</w:t>
         </w:r>
@@ -1937,12 +1937,12 @@
       <w:r>
         <w:t xml:space="preserve"> an alpha-stage R </w:t>
       </w:r>
-      <w:del w:id="10275" w:author="Revision merge (HM+PL)" w:date="2026-09-09T13:15:15Z">
+      <w:del w:id="10275" w:author="Revision merge (HM+PL)" w:date="2026-09-09T13:17:57Z">
         <w:r>
           <w:delText xml:space="preserve">workflow</w:delText>
         </w:r>
       </w:del>
-      <w:ins w:id="10276" w:author="Revision merge (HM+PL)" w:date="2026-09-09T13:15:15Z">
+      <w:ins w:id="10276" w:author="Revision merge (HM+PL)" w:date="2026-09-09T13:17:57Z">
         <w:r>
           <w:t xml:space="preserve">workflow.</w:t>
         </w:r>
@@ -1950,12 +1950,12 @@
       <w:r>
         <w:t xml:space="preserve"> </w:t>
       </w:r>
-      <w:del w:id="10277" w:author="Revision merge (HM+PL)" w:date="2026-09-09T13:15:15Z">
+      <w:del w:id="10277" w:author="Revision merge (HM+PL)" w:date="2026-09-09T13:17:57Z">
         <w:r>
           <w:delText xml:space="preserve">that</w:delText>
         </w:r>
       </w:del>
-      <w:ins w:id="10278" w:author="Revision merge (HM+PL)" w:date="2026-09-09T13:15:15Z">
+      <w:ins w:id="10278" w:author="Revision merge (HM+PL)" w:date="2026-09-09T13:17:57Z">
         <w:r>
           <w:t xml:space="preserve">Here,</w:t>
         </w:r>
@@ -1963,12 +1963,12 @@
       <w:r>
         <w:t xml:space="preserve"> </w:t>
       </w:r>
-      <w:del w:id="10279" w:author="Revision merge (HM+PL)" w:date="2026-09-09T13:15:15Z">
+      <w:del w:id="10279" w:author="Revision merge (HM+PL)" w:date="2026-09-09T13:17:57Z">
         <w:r>
           <w:delText xml:space="preserve">fills</w:delText>
         </w:r>
       </w:del>
-      <w:ins w:id="10280" w:author="Revision merge (HM+PL)" w:date="2026-09-09T13:15:15Z">
+      <w:ins w:id="10280" w:author="Revision merge (HM+PL)" w:date="2026-09-09T13:17:57Z">
         <w:r>
           <w:t xml:space="preserve">we</w:t>
         </w:r>
@@ -1976,12 +1976,12 @@
       <w:r>
         <w:t xml:space="preserve"> </w:t>
       </w:r>
-      <w:del w:id="10281" w:author="Revision merge (HM+PL)" w:date="2026-09-09T13:15:15Z">
+      <w:del w:id="10281" w:author="Revision merge (HM+PL)" w:date="2026-09-09T13:17:57Z">
         <w:r>
           <w:delText xml:space="preserve">this</w:delText>
         </w:r>
       </w:del>
-      <w:ins w:id="10282" w:author="Revision merge (HM+PL)" w:date="2026-09-09T13:15:15Z">
+      <w:ins w:id="10282" w:author="Revision merge (HM+PL)" w:date="2026-09-09T13:17:57Z">
         <w:r>
           <w:t xml:space="preserve">describe</w:t>
         </w:r>
@@ -1989,12 +1989,12 @@
       <w:r>
         <w:t xml:space="preserve"> </w:t>
       </w:r>
-      <w:del w:id="10283" w:author="Revision merge (HM+PL)" w:date="2026-09-09T13:15:15Z">
+      <w:del w:id="10283" w:author="Revision merge (HM+PL)" w:date="2026-09-09T13:17:57Z">
         <w:r>
           <w:delText xml:space="preserve">gap.</w:delText>
         </w:r>
       </w:del>
-      <w:ins w:id="10284" w:author="Revision merge (HM+PL)" w:date="2026-09-09T13:15:15Z">
+      <w:ins w:id="10284" w:author="Revision merge (HM+PL)" w:date="2026-09-09T13:17:57Z">
         <w:r>
           <w:t xml:space="preserve">the</w:t>
         </w:r>
@@ -2002,12 +2002,12 @@
       <w:r>
         <w:t xml:space="preserve"> </w:t>
       </w:r>
-      <w:del w:id="10285" w:author="Revision merge (HM+PL)" w:date="2026-09-09T13:15:15Z">
+      <w:del w:id="10285" w:author="Revision merge (HM+PL)" w:date="2026-09-09T13:17:57Z">
         <w:r>
           <w:delText xml:space="preserve">The tool is in active development; this note describes its</w:delText>
         </w:r>
       </w:del>
-      <w:ins w:id="10286" w:author="Revision merge (HM+PL)" w:date="2026-09-09T13:15:15Z">
+      <w:ins w:id="10286" w:author="Revision merge (HM+PL)" w:date="2026-09-09T13:17:57Z">
         <w:r>
           <w:t xml:space="preserve">workflow's</w:t>
         </w:r>
@@ -2015,12 +2015,12 @@
       <w:r>
         <w:t xml:space="preserve"> design, current scope, and the real-data validation strategy </w:t>
       </w:r>
-      <w:del w:id="10287" w:author="Revision merge (HM+PL)" w:date="2026-09-09T13:15:15Z">
+      <w:del w:id="10287" w:author="Revision merge (HM+PL)" w:date="2026-09-09T13:17:57Z">
         <w:r>
           <w:delText xml:space="preserve">we</w:delText>
         </w:r>
       </w:del>
-      <w:ins w:id="10288" w:author="Revision merge (HM+PL)" w:date="2026-09-09T13:15:15Z">
+      <w:ins w:id="10288" w:author="Revision merge (HM+PL)" w:date="2026-09-09T13:17:57Z">
         <w:r>
           <w:t xml:space="preserve">enabling</w:t>
         </w:r>
@@ -2028,12 +2028,12 @@
       <w:r>
         <w:t xml:space="preserve"> </w:t>
       </w:r>
-      <w:del w:id="10289" w:author="Revision merge (HM+PL)" w:date="2026-09-09T13:15:15Z">
+      <w:del w:id="10289" w:author="Revision merge (HM+PL)" w:date="2026-09-09T13:17:57Z">
         <w:r>
           <w:delText xml:space="preserve">are</w:delText>
         </w:r>
       </w:del>
-      <w:ins w:id="10290" w:author="Revision merge (HM+PL)" w:date="2026-09-09T13:15:15Z">
+      <w:ins w:id="10290" w:author="Revision merge (HM+PL)" w:date="2026-09-09T13:17:57Z">
         <w:r>
           <w:t xml:space="preserve">the</w:t>
         </w:r>
@@ -2041,12 +2041,12 @@
       <w:r>
         <w:t xml:space="preserve"> </w:t>
       </w:r>
-      <w:del w:id="10291" w:author="Revision merge (HM+PL)" w:date="2026-09-09T13:15:15Z">
+      <w:del w:id="10291" w:author="Revision merge (HM+PL)" w:date="2026-09-09T13:17:57Z">
         <w:r>
           <w:delText xml:space="preserve">using</w:delText>
         </w:r>
       </w:del>
-      <w:ins w:id="10292" w:author="Revision merge (HM+PL)" w:date="2026-09-09T13:15:15Z">
+      <w:ins w:id="10292" w:author="Revision merge (HM+PL)" w:date="2026-09-09T13:17:57Z">
         <w:r>
           <w:t xml:space="preserve">assessment</w:t>
         </w:r>
@@ -2054,12 +2054,12 @@
       <w:r>
         <w:t xml:space="preserve"> </w:t>
       </w:r>
-      <w:del w:id="10293" w:author="Revision merge (HM+PL)" w:date="2026-09-09T13:15:15Z">
+      <w:del w:id="10293" w:author="Revision merge (HM+PL)" w:date="2026-09-09T13:17:57Z">
         <w:r>
           <w:delText xml:space="preserve">to</w:delText>
         </w:r>
       </w:del>
-      <w:ins w:id="10294" w:author="Revision merge (HM+PL)" w:date="2026-09-09T13:15:15Z">
+      <w:ins w:id="10294" w:author="Revision merge (HM+PL)" w:date="2026-09-09T13:17:57Z">
         <w:r>
           <w:t xml:space="preserve">of</w:t>
         </w:r>
@@ -2067,12 +2067,12 @@
       <w:r>
         <w:t xml:space="preserve"> </w:t>
       </w:r>
-      <w:del w:id="10295" w:author="Revision merge (HM+PL)" w:date="2026-09-09T13:15:15Z">
+      <w:del w:id="10295" w:author="Revision merge (HM+PL)" w:date="2026-09-09T13:17:57Z">
         <w:r>
           <w:delText xml:space="preserve">harden</w:delText>
         </w:r>
       </w:del>
-      <w:ins w:id="10296" w:author="Revision merge (HM+PL)" w:date="2026-09-09T13:15:15Z">
+      <w:ins w:id="10296" w:author="Revision merge (HM+PL)" w:date="2026-09-09T13:17:57Z">
         <w:r>
           <w:t xml:space="preserve">its</w:t>
         </w:r>
@@ -2080,12 +2080,12 @@
       <w:r>
         <w:t xml:space="preserve"> </w:t>
       </w:r>
-      <w:del w:id="10297" w:author="Revision merge (HM+PL)" w:date="2026-09-09T13:15:15Z">
+      <w:del w:id="10297" w:author="Revision merge (HM+PL)" w:date="2026-09-09T13:17:57Z">
         <w:r>
           <w:delText xml:space="preserve">each stage.</w:delText>
         </w:r>
       </w:del>
-      <w:ins w:id="10298" w:author="Revision merge (HM+PL)" w:date="2026-09-09T13:15:15Z">
+      <w:ins w:id="10298" w:author="Revision merge (HM+PL)" w:date="2026-09-09T13:17:57Z">
         <w:r>
           <w:t xml:space="preserve">performance.</w:t>
         </w:r>
@@ -2113,7 +2113,7 @@
       <w:r>
         <w:t xml:space="preserve">The workflow is</w:t>
       </w:r>
-      <w:ins w:id="10299" w:author="Revision merge (HM+PL)" w:date="2026-09-09T13:15:15Z">
+      <w:ins w:id="10299" w:author="Revision merge (HM+PL)" w:date="2026-09-09T13:17:57Z">
         <w:r>
           <w:t xml:space="preserve"> implemented as</w:t>
         </w:r>
@@ -2121,12 +2121,12 @@
       <w:r>
         <w:t xml:space="preserve"> a stand-alone R project, </w:t>
       </w:r>
-      <w:del w:id="10300" w:author="Revision merge (HM+PL)" w:date="2026-09-09T13:15:15Z">
+      <w:del w:id="10300" w:author="Revision merge (HM+PL)" w:date="2026-09-09T13:17:57Z">
         <w:r>
           <w:delText xml:space="preserve">not</w:delText>
         </w:r>
       </w:del>
-      <w:ins w:id="10301" w:author="Revision merge (HM+PL)" w:date="2026-09-09T13:15:15Z">
+      <w:ins w:id="10301" w:author="Revision merge (HM+PL)" w:date="2026-09-09T13:17:57Z">
         <w:r>
           <w:t xml:space="preserve">rather than</w:t>
         </w:r>
@@ -2134,7 +2134,7 @@
       <w:r>
         <w:t xml:space="preserve"> an installable </w:t>
       </w:r>
-      <w:ins w:id="10302" w:author="Revision merge (HM+PL)" w:date="2026-09-09T13:15:15Z">
+      <w:ins w:id="10302" w:author="Revision merge (HM+PL)" w:date="2026-09-09T13:17:57Z">
         <w:r>
           <w:t xml:space="preserve">software </w:t>
         </w:r>
@@ -2142,12 +2142,12 @@
       <w:r>
         <w:t xml:space="preserve">package. </w:t>
       </w:r>
-      <w:del w:id="10303" w:author="Revision merge (HM+PL)" w:date="2026-09-09T13:15:15Z">
+      <w:del w:id="10303" w:author="Revision merge (HM+PL)" w:date="2026-09-09T13:17:57Z">
         <w:r>
           <w:delText xml:space="preserve">A</w:delText>
         </w:r>
       </w:del>
-      <w:ins w:id="10304" w:author="Revision merge (HM+PL)" w:date="2026-09-09T13:15:15Z">
+      <w:ins w:id="10304" w:author="Revision merge (HM+PL)" w:date="2026-09-09T13:17:57Z">
         <w:r>
           <w:t xml:space="preserve">Execution is initiated through a</w:t>
         </w:r>
@@ -2155,12 +2155,12 @@
       <w:r>
         <w:t xml:space="preserve"> single entry </w:t>
       </w:r>
-      <w:del w:id="10305" w:author="Revision merge (HM+PL)" w:date="2026-09-09T13:15:15Z">
+      <w:del w:id="10305" w:author="Revision merge (HM+PL)" w:date="2026-09-09T13:17:57Z">
         <w:r>
           <w:delText xml:space="preserve">point</w:delText>
         </w:r>
       </w:del>
-      <w:ins w:id="10306" w:author="Revision merge (HM+PL)" w:date="2026-09-09T13:15:15Z">
+      <w:ins w:id="10306" w:author="Revision merge (HM+PL)" w:date="2026-09-09T13:17:57Z">
         <w:r>
           <w:t xml:space="preserve">script</w:t>
         </w:r>
@@ -2168,12 +2168,12 @@
       <w:r>
         <w:t xml:space="preserve"> (`run_pipeline.R`) </w:t>
       </w:r>
-      <w:del w:id="10307" w:author="Revision merge (HM+PL)" w:date="2026-09-09T13:15:15Z">
+      <w:del w:id="10307" w:author="Revision merge (HM+PL)" w:date="2026-09-09T13:17:57Z">
         <w:r>
           <w:delText xml:space="preserve">consumes</w:delText>
         </w:r>
       </w:del>
-      <w:ins w:id="10308" w:author="Revision merge (HM+PL)" w:date="2026-09-09T13:15:15Z">
+      <w:ins w:id="10308" w:author="Revision merge (HM+PL)" w:date="2026-09-09T13:17:57Z">
         <w:r>
           <w:t xml:space="preserve">that reads</w:t>
         </w:r>
@@ -2181,12 +2181,12 @@
       <w:r>
         <w:t xml:space="preserve"> one YAML configuration file </w:t>
       </w:r>
-      <w:del w:id="10309" w:author="Revision merge (HM+PL)" w:date="2026-09-09T13:15:15Z">
+      <w:del w:id="10309" w:author="Revision merge (HM+PL)" w:date="2026-09-09T13:17:57Z">
         <w:r>
           <w:delText xml:space="preserve">per</w:delText>
         </w:r>
       </w:del>
-      <w:ins w:id="10310" w:author="Revision merge (HM+PL)" w:date="2026-09-09T13:15:15Z">
+      <w:ins w:id="10310" w:author="Revision merge (HM+PL)" w:date="2026-09-09T13:17:57Z">
         <w:r>
           <w:t xml:space="preserve">for each</w:t>
         </w:r>
@@ -2194,12 +2194,12 @@
       <w:r>
         <w:t xml:space="preserve"> study and dispatches </w:t>
       </w:r>
-      <w:del w:id="10311" w:author="Revision merge (HM+PL)" w:date="2026-09-09T13:15:15Z">
+      <w:del w:id="10311" w:author="Revision merge (HM+PL)" w:date="2026-09-09T13:17:57Z">
         <w:r>
           <w:delText xml:space="preserve">to</w:delText>
         </w:r>
       </w:del>
-      <w:ins w:id="10312" w:author="Revision merge (HM+PL)" w:date="2026-09-09T13:15:15Z">
+      <w:ins w:id="10312" w:author="Revision merge (HM+PL)" w:date="2026-09-09T13:17:57Z">
         <w:r>
           <w:t xml:space="preserve">the workflow across</w:t>
         </w:r>
@@ -2207,12 +2207,12 @@
       <w:r>
         <w:t xml:space="preserve"> fifteen modules (`R/00_setup.R` through `R/13_panels.R`; plus the manifest stage </w:t>
       </w:r>
-      <w:del w:id="10313" w:author="Revision merge (HM+PL)" w:date="2026-09-09T13:15:15Z">
+      <w:del w:id="10313" w:author="Revision merge (HM+PL)" w:date="2026-09-09T13:17:57Z">
         <w:r>
           <w:delText xml:space="preserve">`R/14`</w:delText>
         </w:r>
       </w:del>
-      <w:ins w:id="10314" w:author="Revision merge (HM+PL)" w:date="2026-09-09T13:15:15Z">
+      <w:ins w:id="10314" w:author="Revision merge (HM+PL)" w:date="2026-09-09T13:17:57Z">
         <w:r>
           <w:t xml:space="preserve">`R/14`,</w:t>
         </w:r>
@@ -2220,12 +2220,12 @@
       <w:r>
         <w:t xml:space="preserve"> which runs </w:t>
       </w:r>
-      <w:del w:id="10315" w:author="Revision merge (HM+PL)" w:date="2026-09-09T13:15:15Z">
+      <w:del w:id="10315" w:author="Revision merge (HM+PL)" w:date="2026-09-09T13:17:57Z">
         <w:r>
           <w:delText xml:space="preserve">last);</w:delText>
         </w:r>
       </w:del>
-      <w:ins w:id="10316" w:author="Revision merge (HM+PL)" w:date="2026-09-09T13:15:15Z">
+      <w:ins w:id="10316" w:author="Revision merge (HM+PL)" w:date="2026-09-09T13:17:57Z">
         <w:r>
           <w:t xml:space="preserve">last).</w:t>
         </w:r>
@@ -2233,12 +2233,12 @@
       <w:r>
         <w:t xml:space="preserve"> </w:t>
       </w:r>
-      <w:del w:id="10317" w:author="Revision merge (HM+PL)" w:date="2026-09-09T13:15:15Z">
+      <w:del w:id="10317" w:author="Revision merge (HM+PL)" w:date="2026-09-09T13:17:57Z">
         <w:r>
           <w:delText xml:space="preserve">a</w:delText>
         </w:r>
       </w:del>
-      <w:ins w:id="10318" w:author="Revision merge (HM+PL)" w:date="2026-09-09T13:15:15Z">
+      <w:ins w:id="10318" w:author="Revision merge (HM+PL)" w:date="2026-09-09T13:17:57Z">
         <w:r>
           <w:t xml:space="preserve">A</w:t>
         </w:r>
@@ -2246,12 +2246,12 @@
       <w:r>
         <w:t xml:space="preserve"> Quarto dashboard template (`templates/report.qmd`) renders all outputs into a single multi-page HTML </w:t>
       </w:r>
-      <w:del w:id="10319" w:author="Revision merge (HM+PL)" w:date="2026-09-09T13:15:15Z">
+      <w:del w:id="10319" w:author="Revision merge (HM+PL)" w:date="2026-09-09T13:17:57Z">
         <w:r>
           <w:delText xml:space="preserve">deliverable,</w:delText>
         </w:r>
       </w:del>
-      <w:ins w:id="10320" w:author="Revision merge (HM+PL)" w:date="2026-09-09T13:15:15Z">
+      <w:ins w:id="10320" w:author="Revision merge (HM+PL)" w:date="2026-09-09T13:17:57Z">
         <w:r>
           <w:t xml:space="preserve">deliverable.</w:t>
         </w:r>
@@ -2259,12 +2259,12 @@
       <w:r>
         <w:t xml:space="preserve"> </w:t>
       </w:r>
-      <w:del w:id="10321" w:author="Revision merge (HM+PL)" w:date="2026-09-09T13:15:15Z">
+      <w:del w:id="10321" w:author="Revision merge (HM+PL)" w:date="2026-09-09T13:17:57Z">
         <w:r>
           <w:delText xml:space="preserve">a</w:delText>
         </w:r>
       </w:del>
-      <w:ins w:id="10322" w:author="Revision merge (HM+PL)" w:date="2026-09-09T13:15:15Z">
+      <w:ins w:id="10322" w:author="Revision merge (HM+PL)" w:date="2026-09-09T13:17:57Z">
         <w:r>
           <w:t xml:space="preserve">A subsequent</w:t>
         </w:r>
@@ -2272,7 +2272,7 @@
       <w:r>
         <w:t xml:space="preserve"> publication-panels stage assembles </w:t>
       </w:r>
-      <w:ins w:id="10323" w:author="Revision merge (HM+PL)" w:date="2026-09-09T13:15:15Z">
+      <w:ins w:id="10323" w:author="Revision merge (HM+PL)" w:date="2026-09-09T13:17:57Z">
         <w:r>
           <w:t xml:space="preserve">publication-ready composite figures for the </w:t>
         </w:r>
@@ -2280,12 +2280,12 @@
       <w:r>
         <w:t xml:space="preserve">main and supplementary </w:t>
       </w:r>
-      <w:del w:id="10324" w:author="Revision merge (HM+PL)" w:date="2026-09-09T13:15:15Z">
+      <w:del w:id="10324" w:author="Revision merge (HM+PL)" w:date="2026-09-09T13:17:57Z">
         <w:r>
           <w:delText xml:space="preserve">composite</w:delText>
         </w:r>
       </w:del>
-      <w:ins w:id="10325" w:author="Revision merge (HM+PL)" w:date="2026-09-09T13:15:15Z">
+      <w:ins w:id="10325" w:author="Revision merge (HM+PL)" w:date="2026-09-09T13:17:57Z">
         <w:r>
           <w:t xml:space="preserve">datasets</w:t>
         </w:r>
@@ -2293,12 +2293,12 @@
       <w:r>
         <w:t xml:space="preserve"> </w:t>
       </w:r>
-      <w:del w:id="10326" w:author="Revision merge (HM+PL)" w:date="2026-09-09T13:15:15Z">
+      <w:del w:id="10326" w:author="Revision merge (HM+PL)" w:date="2026-09-09T13:17:57Z">
         <w:r>
           <w:delText xml:space="preserve">figures</w:delText>
         </w:r>
       </w:del>
-      <w:ins w:id="10327" w:author="Revision merge (HM+PL)" w:date="2026-09-09T13:15:15Z">
+      <w:ins w:id="10327" w:author="Revision merge (HM+PL)" w:date="2026-09-09T13:17:57Z">
         <w:r>
           <w:t xml:space="preserve">and</w:t>
         </w:r>
@@ -2306,12 +2306,12 @@
       <w:r>
         <w:t xml:space="preserve"> </w:t>
       </w:r>
-      <w:del w:id="10328" w:author="Revision merge (HM+PL)" w:date="2026-09-09T13:15:15Z">
+      <w:del w:id="10328" w:author="Revision merge (HM+PL)" w:date="2026-09-09T13:17:57Z">
         <w:r>
           <w:delText xml:space="preserve">plus</w:delText>
         </w:r>
       </w:del>
-      <w:ins w:id="10329" w:author="Revision merge (HM+PL)" w:date="2026-09-09T13:15:15Z">
+      <w:ins w:id="10329" w:author="Revision merge (HM+PL)" w:date="2026-09-09T13:17:57Z">
         <w:r>
           <w:t xml:space="preserve">compiles</w:t>
         </w:r>
@@ -2319,12 +2319,12 @@
       <w:r>
         <w:t xml:space="preserve"> </w:t>
       </w:r>
-      <w:del w:id="10330" w:author="Revision merge (HM+PL)" w:date="2026-09-09T13:15:15Z">
+      <w:del w:id="10330" w:author="Revision merge (HM+PL)" w:date="2026-09-09T13:17:57Z">
         <w:r>
           <w:delText xml:space="preserve">a</w:delText>
         </w:r>
       </w:del>
-      <w:ins w:id="10331" w:author="Revision merge (HM+PL)" w:date="2026-09-09T13:15:15Z">
+      <w:ins w:id="10331" w:author="Revision merge (HM+PL)" w:date="2026-09-09T13:17:57Z">
         <w:r>
           <w:t xml:space="preserve">the accompanying</w:t>
         </w:r>
@@ -2332,12 +2332,12 @@
       <w:r>
         <w:t xml:space="preserve"> supplementary tables </w:t>
       </w:r>
-      <w:del w:id="10332" w:author="Revision merge (HM+PL)" w:date="2026-09-09T13:15:15Z">
+      <w:del w:id="10332" w:author="Revision merge (HM+PL)" w:date="2026-09-09T13:17:57Z">
         <w:r>
           <w:delText xml:space="preserve">workbook,</w:delText>
         </w:r>
       </w:del>
-      <w:ins w:id="10333" w:author="Revision merge (HM+PL)" w:date="2026-09-09T13:15:15Z">
+      <w:ins w:id="10333" w:author="Revision merge (HM+PL)" w:date="2026-09-09T13:17:57Z">
         <w:r>
           <w:t xml:space="preserve">into</w:t>
         </w:r>
@@ -2345,12 +2345,12 @@
       <w:r>
         <w:t xml:space="preserve"> </w:t>
       </w:r>
-      <w:del w:id="10334" w:author="Revision merge (HM+PL)" w:date="2026-09-09T13:15:15Z">
+      <w:del w:id="10334" w:author="Revision merge (HM+PL)" w:date="2026-09-09T13:17:57Z">
         <w:r>
           <w:delText xml:space="preserve">and</w:delText>
         </w:r>
       </w:del>
-      <w:ins w:id="10335" w:author="Revision merge (HM+PL)" w:date="2026-09-09T13:15:15Z">
+      <w:ins w:id="10335" w:author="Revision merge (HM+PL)" w:date="2026-09-09T13:17:57Z">
         <w:r>
           <w:t xml:space="preserve">a workbook. The pipeline concludes with the generation of</w:t>
         </w:r>
@@ -2358,7 +2358,7 @@
       <w:r>
         <w:t xml:space="preserve"> a final </w:t>
       </w:r>
-      <w:del w:id="10336" w:author="Revision merge (HM+PL)" w:date="2026-09-09T13:15:15Z">
+      <w:del w:id="10336" w:author="Revision merge (HM+PL)" w:date="2026-09-09T13:17:57Z">
         <w:r>
           <w:delText xml:space="preserve">manifest stage emits </w:delText>
         </w:r>
@@ -2366,12 +2366,12 @@
       <w:r>
         <w:t xml:space="preserve">`manifest.json` </w:t>
       </w:r>
-      <w:del w:id="10337" w:author="Revision merge (HM+PL)" w:date="2026-09-09T13:15:15Z">
+      <w:del w:id="10337" w:author="Revision merge (HM+PL)" w:date="2026-09-09T13:17:57Z">
         <w:r>
           <w:delText xml:space="preserve">describing</w:delText>
         </w:r>
       </w:del>
-      <w:ins w:id="10338" w:author="Revision merge (HM+PL)" w:date="2026-09-09T13:15:15Z">
+      <w:ins w:id="10338" w:author="Revision merge (HM+PL)" w:date="2026-09-09T13:17:57Z">
         <w:r>
           <w:t xml:space="preserve">file,</w:t>
         </w:r>
@@ -2379,12 +2379,12 @@
       <w:r>
         <w:t xml:space="preserve"> </w:t>
       </w:r>
-      <w:del w:id="10339" w:author="Revision merge (HM+PL)" w:date="2026-09-09T13:15:15Z">
+      <w:del w:id="10339" w:author="Revision merge (HM+PL)" w:date="2026-09-09T13:17:57Z">
         <w:r>
           <w:delText xml:space="preserve">every</w:delText>
         </w:r>
       </w:del>
-      <w:ins w:id="10340" w:author="Revision merge (HM+PL)" w:date="2026-09-09T13:15:15Z">
+      <w:ins w:id="10340" w:author="Revision merge (HM+PL)" w:date="2026-09-09T13:17:57Z">
         <w:r>
           <w:t xml:space="preserve">providing</w:t>
         </w:r>
@@ -2392,12 +2392,12 @@
       <w:r>
         <w:t xml:space="preserve"> </w:t>
       </w:r>
-      <w:del w:id="10341" w:author="Revision merge (HM+PL)" w:date="2026-09-09T13:15:15Z">
+      <w:del w:id="10341" w:author="Revision merge (HM+PL)" w:date="2026-09-09T13:17:57Z">
         <w:r>
           <w:delText xml:space="preserve">artefact</w:delText>
         </w:r>
       </w:del>
-      <w:ins w:id="10342" w:author="Revision merge (HM+PL)" w:date="2026-09-09T13:15:15Z">
+      <w:ins w:id="10342" w:author="Revision merge (HM+PL)" w:date="2026-09-09T13:17:57Z">
         <w:r>
           <w:t xml:space="preserve">a complete record of all artefacts</w:t>
         </w:r>
@@ -2413,12 +2413,12 @@
       <w:r>
         <w:t xml:space="preserve">[FIGURE] **Figure 1.** MERIDIAN workflow. A single `config.yaml` drives fifteen R modules (R/00–R/14) </w:t>
       </w:r>
-      <w:del w:id="10343" w:author="Revision merge (HM+PL)" w:date="2026-09-09T13:15:15Z">
+      <w:del w:id="10343" w:author="Revision merge (HM+PL)" w:date="2026-09-09T13:17:57Z">
         <w:r>
           <w:delText xml:space="preserve">consuming</w:delText>
         </w:r>
       </w:del>
-      <w:ins w:id="10344" w:author="Revision merge (HM+PL)" w:date="2026-09-09T13:15:15Z">
+      <w:ins w:id="10344" w:author="Revision merge (HM+PL)" w:date="2026-09-09T13:17:57Z">
         <w:r>
           <w:t xml:space="preserve">that load</w:t>
         </w:r>
@@ -2434,12 +2434,12 @@
       <w:r>
         <w:t xml:space="preserve">**Configuration-driven.** </w:t>
       </w:r>
-      <w:del w:id="10345" w:author="Revision merge (HM+PL)" w:date="2026-09-09T13:15:15Z">
+      <w:del w:id="10345" w:author="Revision merge (HM+PL)" w:date="2026-09-09T13:17:57Z">
         <w:r>
           <w:delText xml:space="preserve">Everything</w:delText>
         </w:r>
       </w:del>
-      <w:ins w:id="10346" w:author="Revision merge (HM+PL)" w:date="2026-09-09T13:15:15Z">
+      <w:ins w:id="10346" w:author="Revision merge (HM+PL)" w:date="2026-09-09T13:17:57Z">
         <w:r>
           <w:t xml:space="preserve">All</w:t>
         </w:r>
@@ -2447,12 +2447,12 @@
       <w:r>
         <w:t xml:space="preserve"> </w:t>
       </w:r>
-      <w:del w:id="10347" w:author="Revision merge (HM+PL)" w:date="2026-09-09T13:15:15Z">
+      <w:del w:id="10347" w:author="Revision merge (HM+PL)" w:date="2026-09-09T13:17:57Z">
         <w:r>
           <w:delText xml:space="preserve">that</w:delText>
         </w:r>
       </w:del>
-      <w:ins w:id="10348" w:author="Revision merge (HM+PL)" w:date="2026-09-09T13:15:15Z">
+      <w:ins w:id="10348" w:author="Revision merge (HM+PL)" w:date="2026-09-09T13:17:57Z">
         <w:r>
           <w:t xml:space="preserve">study-specific</w:t>
         </w:r>
@@ -2460,12 +2460,12 @@
       <w:r>
         <w:t xml:space="preserve"> </w:t>
       </w:r>
-      <w:del w:id="10349" w:author="Revision merge (HM+PL)" w:date="2026-09-09T13:15:15Z">
+      <w:del w:id="10349" w:author="Revision merge (HM+PL)" w:date="2026-09-09T13:17:57Z">
         <w:r>
           <w:delText xml:space="preserve">varies between studies</w:delText>
         </w:r>
       </w:del>
-      <w:ins w:id="10350" w:author="Revision merge (HM+PL)" w:date="2026-09-09T13:15:15Z">
+      <w:ins w:id="10350" w:author="Revision merge (HM+PL)" w:date="2026-09-09T13:17:57Z">
         <w:r>
           <w:t xml:space="preserve">parameters</w:t>
         </w:r>
@@ -2473,12 +2473,12 @@
       <w:r>
         <w:t xml:space="preserve"> — metadata file </w:t>
       </w:r>
-      <w:del w:id="10351" w:author="Revision merge (HM+PL)" w:date="2026-09-09T13:15:15Z">
+      <w:del w:id="10351" w:author="Revision merge (HM+PL)" w:date="2026-09-09T13:17:57Z">
         <w:r>
           <w:delText xml:space="preserve">path,</w:delText>
         </w:r>
       </w:del>
-      <w:ins w:id="10352" w:author="Revision merge (HM+PL)" w:date="2026-09-09T13:15:15Z">
+      <w:ins w:id="10352" w:author="Revision merge (HM+PL)" w:date="2026-09-09T13:17:57Z">
         <w:r>
           <w:t xml:space="preserve">locations, sample</w:t>
         </w:r>
@@ -2486,12 +2486,12 @@
       <w:r>
         <w:t xml:space="preserve"> grouping </w:t>
       </w:r>
-      <w:del w:id="10353" w:author="Revision merge (HM+PL)" w:date="2026-09-09T13:15:15Z">
+      <w:del w:id="10353" w:author="Revision merge (HM+PL)" w:date="2026-09-09T13:17:57Z">
         <w:r>
           <w:delText xml:space="preserve">columns,</w:delText>
         </w:r>
       </w:del>
-      <w:ins w:id="10354" w:author="Revision merge (HM+PL)" w:date="2026-09-09T13:15:15Z">
+      <w:ins w:id="10354" w:author="Revision merge (HM+PL)" w:date="2026-09-09T13:17:57Z">
         <w:r>
           <w:t xml:space="preserve">variables,</w:t>
         </w:r>
@@ -2499,7 +2499,7 @@
       <w:r>
         <w:t xml:space="preserve"> negative-control identifiers, abundance </w:t>
       </w:r>
-      <w:ins w:id="10355" w:author="Revision merge (HM+PL)" w:date="2026-09-09T13:15:15Z">
+      <w:ins w:id="10355" w:author="Revision merge (HM+PL)" w:date="2026-09-09T13:17:57Z">
         <w:r>
           <w:t xml:space="preserve">filtering </w:t>
         </w:r>
@@ -2507,7 +2507,7 @@
       <w:r>
         <w:t xml:space="preserve">thresholds,</w:t>
       </w:r>
-      <w:ins w:id="10356" w:author="Revision merge (HM+PL)" w:date="2026-09-09T13:15:15Z">
+      <w:ins w:id="10356" w:author="Revision merge (HM+PL)" w:date="2026-09-09T13:17:57Z">
         <w:r>
           <w:t xml:space="preserve"> and</w:t>
         </w:r>
@@ -2515,7 +2515,7 @@
       <w:r>
         <w:t xml:space="preserve"> sample selection </w:t>
       </w:r>
-      <w:ins w:id="10357" w:author="Revision merge (HM+PL)" w:date="2026-09-09T13:15:15Z">
+      <w:ins w:id="10357" w:author="Revision merge (HM+PL)" w:date="2026-09-09T13:17:57Z">
         <w:r>
           <w:t xml:space="preserve">criteria </w:t>
         </w:r>
@@ -2523,12 +2523,12 @@
       <w:r>
         <w:t xml:space="preserve">— </w:t>
       </w:r>
-      <w:del w:id="10358" w:author="Revision merge (HM+PL)" w:date="2026-09-09T13:15:15Z">
+      <w:del w:id="10358" w:author="Revision merge (HM+PL)" w:date="2026-09-09T13:17:57Z">
         <w:r>
           <w:delText xml:space="preserve">is</w:delText>
         </w:r>
       </w:del>
-      <w:ins w:id="10359" w:author="Revision merge (HM+PL)" w:date="2026-09-09T13:15:15Z">
+      <w:ins w:id="10359" w:author="Revision merge (HM+PL)" w:date="2026-09-09T13:17:57Z">
         <w:r>
           <w:t xml:space="preserve">are</w:t>
         </w:r>
@@ -2536,12 +2536,12 @@
       <w:r>
         <w:t xml:space="preserve"> </w:t>
       </w:r>
-      <w:del w:id="10360" w:author="Revision merge (HM+PL)" w:date="2026-09-09T13:15:15Z">
+      <w:del w:id="10360" w:author="Revision merge (HM+PL)" w:date="2026-09-09T13:17:57Z">
         <w:r>
           <w:delText xml:space="preserve">declared</w:delText>
         </w:r>
       </w:del>
-      <w:ins w:id="10361" w:author="Revision merge (HM+PL)" w:date="2026-09-09T13:15:15Z">
+      <w:ins w:id="10361" w:author="Revision merge (HM+PL)" w:date="2026-09-09T13:17:57Z">
         <w:r>
           <w:t xml:space="preserve">defined</w:t>
         </w:r>
@@ -2549,12 +2549,12 @@
       <w:r>
         <w:t xml:space="preserve"> in `config.yaml`. </w:t>
       </w:r>
-      <w:del w:id="10362" w:author="Revision merge (HM+PL)" w:date="2026-09-09T13:15:15Z">
+      <w:del w:id="10362" w:author="Revision merge (HM+PL)" w:date="2026-09-09T13:17:57Z">
         <w:r>
           <w:delText xml:space="preserve">Module</w:delText>
         </w:r>
       </w:del>
-      <w:ins w:id="10363" w:author="Revision merge (HM+PL)" w:date="2026-09-09T13:15:15Z">
+      <w:ins w:id="10363" w:author="Revision merge (HM+PL)" w:date="2026-09-09T13:17:57Z">
         <w:r>
           <w:t xml:space="preserve">Consequently, module</w:t>
         </w:r>
@@ -2562,12 +2562,12 @@
       <w:r>
         <w:t xml:space="preserve"> code </w:t>
       </w:r>
-      <w:del w:id="10364" w:author="Revision merge (HM+PL)" w:date="2026-09-09T13:15:15Z">
+      <w:del w:id="10364" w:author="Revision merge (HM+PL)" w:date="2026-09-09T13:17:57Z">
         <w:r>
           <w:delText xml:space="preserve">is</w:delText>
         </w:r>
       </w:del>
-      <w:ins w:id="10365" w:author="Revision merge (HM+PL)" w:date="2026-09-09T13:15:15Z">
+      <w:ins w:id="10365" w:author="Revision merge (HM+PL)" w:date="2026-09-09T13:17:57Z">
         <w:r>
           <w:t xml:space="preserve">remains</w:t>
         </w:r>
@@ -2575,12 +2575,12 @@
       <w:r>
         <w:t xml:space="preserve"> </w:t>
       </w:r>
-      <w:del w:id="10366" w:author="Revision merge (HM+PL)" w:date="2026-09-09T13:15:15Z">
+      <w:del w:id="10366" w:author="Revision merge (HM+PL)" w:date="2026-09-09T13:17:57Z">
         <w:r>
           <w:delText xml:space="preserve">not</w:delText>
         </w:r>
       </w:del>
-      <w:ins w:id="10367" w:author="Revision merge (HM+PL)" w:date="2026-09-09T13:15:15Z">
+      <w:ins w:id="10367" w:author="Revision merge (HM+PL)" w:date="2026-09-09T13:17:57Z">
         <w:r>
           <w:t xml:space="preserve">invariant</w:t>
         </w:r>
@@ -2588,12 +2588,12 @@
       <w:r>
         <w:t xml:space="preserve"> </w:t>
       </w:r>
-      <w:del w:id="10368" w:author="Revision merge (HM+PL)" w:date="2026-09-09T13:15:15Z">
+      <w:del w:id="10368" w:author="Revision merge (HM+PL)" w:date="2026-09-09T13:17:57Z">
         <w:r>
           <w:delText xml:space="preserve">edited</w:delText>
         </w:r>
       </w:del>
-      <w:ins w:id="10369" w:author="Revision merge (HM+PL)" w:date="2026-09-09T13:15:15Z">
+      <w:ins w:id="10369" w:author="Revision merge (HM+PL)" w:date="2026-09-09T13:17:57Z">
         <w:r>
           <w:t xml:space="preserve">across</w:t>
         </w:r>
@@ -2601,12 +2601,12 @@
       <w:r>
         <w:t xml:space="preserve"> </w:t>
       </w:r>
-      <w:del w:id="10370" w:author="Revision merge (HM+PL)" w:date="2026-09-09T13:15:15Z">
+      <w:del w:id="10370" w:author="Revision merge (HM+PL)" w:date="2026-09-09T13:17:57Z">
         <w:r>
           <w:delText xml:space="preserve">per-project;</w:delText>
         </w:r>
       </w:del>
-      <w:ins w:id="10371" w:author="Revision merge (HM+PL)" w:date="2026-09-09T13:15:15Z">
+      <w:ins w:id="10371" w:author="Revision merge (HM+PL)" w:date="2026-09-09T13:17:57Z">
         <w:r>
           <w:t xml:space="preserve">projects, with</w:t>
         </w:r>
@@ -2614,12 +2614,12 @@
       <w:r>
         <w:t xml:space="preserve"> dataset-specific </w:t>
       </w:r>
-      <w:del w:id="10372" w:author="Revision merge (HM+PL)" w:date="2026-09-09T13:15:15Z">
+      <w:del w:id="10372" w:author="Revision merge (HM+PL)" w:date="2026-09-09T13:17:57Z">
         <w:r>
           <w:delText xml:space="preserve">adjustments</w:delText>
         </w:r>
       </w:del>
-      <w:ins w:id="10373" w:author="Revision merge (HM+PL)" w:date="2026-09-09T13:15:15Z">
+      <w:ins w:id="10373" w:author="Revision merge (HM+PL)" w:date="2026-09-09T13:17:57Z">
         <w:r>
           <w:t xml:space="preserve">customisation</w:t>
         </w:r>
@@ -2627,12 +2627,12 @@
       <w:r>
         <w:t xml:space="preserve"> </w:t>
       </w:r>
-      <w:del w:id="10374" w:author="Revision merge (HM+PL)" w:date="2026-09-09T13:15:15Z">
+      <w:del w:id="10374" w:author="Revision merge (HM+PL)" w:date="2026-09-09T13:17:57Z">
         <w:r>
           <w:delText xml:space="preserve">live</w:delText>
         </w:r>
       </w:del>
-      <w:ins w:id="10375" w:author="Revision merge (HM+PL)" w:date="2026-09-09T13:15:15Z">
+      <w:ins w:id="10375" w:author="Revision merge (HM+PL)" w:date="2026-09-09T13:17:57Z">
         <w:r>
           <w:t xml:space="preserve">implemented</w:t>
         </w:r>
@@ -2640,12 +2640,12 @@
       <w:r>
         <w:t xml:space="preserve"> </w:t>
       </w:r>
-      <w:del w:id="10376" w:author="Revision merge (HM+PL)" w:date="2026-09-09T13:15:15Z">
+      <w:del w:id="10376" w:author="Revision merge (HM+PL)" w:date="2026-09-09T13:17:57Z">
         <w:r>
           <w:delText xml:space="preserve">in</w:delText>
         </w:r>
       </w:del>
-      <w:ins w:id="10377" w:author="Revision merge (HM+PL)" w:date="2026-09-09T13:15:15Z">
+      <w:ins w:id="10377" w:author="Revision merge (HM+PL)" w:date="2026-09-09T13:17:57Z">
         <w:r>
           <w:t xml:space="preserve">exclusively through</w:t>
         </w:r>
@@ -2653,7 +2653,7 @@
       <w:r>
         <w:t xml:space="preserve"> `config.yaml` </w:t>
       </w:r>
-      <w:ins w:id="10378" w:author="Revision merge (HM+PL)" w:date="2026-09-09T13:15:15Z">
+      <w:ins w:id="10378" w:author="Revision merge (HM+PL)" w:date="2026-09-09T13:17:57Z">
         <w:r>
           <w:t xml:space="preserve">settings </w:t>
         </w:r>
@@ -2661,7 +2661,7 @@
       <w:r>
         <w:t xml:space="preserve">or</w:t>
       </w:r>
-      <w:del w:id="10379" w:author="Revision merge (HM+PL)" w:date="2026-09-09T13:15:15Z">
+      <w:del w:id="10379" w:author="Revision merge (HM+PL)" w:date="2026-09-09T13:17:57Z">
         <w:r>
           <w:delText xml:space="preserve"> in</w:delText>
         </w:r>
@@ -2669,12 +2669,12 @@
       <w:r>
         <w:t xml:space="preserve"> the structured fix tables it references. R/00 (setup) and R/01 (input loading) </w:t>
       </w:r>
-      <w:del w:id="10380" w:author="Revision merge (HM+PL)" w:date="2026-09-09T13:15:15Z">
+      <w:del w:id="10380" w:author="Revision merge (HM+PL)" w:date="2026-09-09T13:17:57Z">
         <w:r>
           <w:delText xml:space="preserve">run</w:delText>
         </w:r>
       </w:del>
-      <w:ins w:id="10381" w:author="Revision merge (HM+PL)" w:date="2026-09-09T13:15:15Z">
+      <w:ins w:id="10381" w:author="Revision merge (HM+PL)" w:date="2026-09-09T13:17:57Z">
         <w:r>
           <w:t xml:space="preserve">are executed</w:t>
         </w:r>
@@ -2682,12 +2682,12 @@
       <w:r>
         <w:t xml:space="preserve"> by </w:t>
       </w:r>
-      <w:del w:id="10382" w:author="Revision merge (HM+PL)" w:date="2026-09-09T13:15:15Z">
+      <w:del w:id="10382" w:author="Revision merge (HM+PL)" w:date="2026-09-09T13:17:57Z">
         <w:r>
           <w:delText xml:space="preserve">default;</w:delText>
         </w:r>
       </w:del>
-      <w:ins w:id="10383" w:author="Revision merge (HM+PL)" w:date="2026-09-09T13:15:15Z">
+      <w:ins w:id="10383" w:author="Revision merge (HM+PL)" w:date="2026-09-09T13:17:57Z">
         <w:r>
           <w:t xml:space="preserve">default,</w:t>
         </w:r>
@@ -2695,12 +2695,12 @@
       <w:r>
         <w:t xml:space="preserve"> </w:t>
       </w:r>
-      <w:del w:id="10384" w:author="Revision merge (HM+PL)" w:date="2026-09-09T13:15:15Z">
+      <w:del w:id="10384" w:author="Revision merge (HM+PL)" w:date="2026-09-09T13:17:57Z">
         <w:r>
           <w:delText xml:space="preserve">every</w:delText>
         </w:r>
       </w:del>
-      <w:ins w:id="10385" w:author="Revision merge (HM+PL)" w:date="2026-09-09T13:15:15Z">
+      <w:ins w:id="10385" w:author="Revision merge (HM+PL)" w:date="2026-09-09T13:17:57Z">
         <w:r>
           <w:t xml:space="preserve">whereas</w:t>
         </w:r>
@@ -2708,12 +2708,12 @@
       <w:r>
         <w:t xml:space="preserve"> </w:t>
       </w:r>
-      <w:del w:id="10386" w:author="Revision merge (HM+PL)" w:date="2026-09-09T13:15:15Z">
+      <w:del w:id="10386" w:author="Revision merge (HM+PL)" w:date="2026-09-09T13:17:57Z">
         <w:r>
           <w:delText xml:space="preserve">subsequent</w:delText>
         </w:r>
       </w:del>
-      <w:ins w:id="10387" w:author="Revision merge (HM+PL)" w:date="2026-09-09T13:15:15Z">
+      <w:ins w:id="10387" w:author="Revision merge (HM+PL)" w:date="2026-09-09T13:17:57Z">
         <w:r>
           <w:t xml:space="preserve">all</w:t>
         </w:r>
@@ -2721,12 +2721,12 @@
       <w:r>
         <w:t xml:space="preserve"> </w:t>
       </w:r>
-      <w:del w:id="10388" w:author="Revision merge (HM+PL)" w:date="2026-09-09T13:15:15Z">
+      <w:del w:id="10388" w:author="Revision merge (HM+PL)" w:date="2026-09-09T13:17:57Z">
         <w:r>
           <w:delText xml:space="preserve">stage</w:delText>
         </w:r>
       </w:del>
-      <w:ins w:id="10389" w:author="Revision merge (HM+PL)" w:date="2026-09-09T13:15:15Z">
+      <w:ins w:id="10389" w:author="Revision merge (HM+PL)" w:date="2026-09-09T13:17:57Z">
         <w:r>
           <w:t xml:space="preserve">downstream modules</w:t>
         </w:r>
@@ -2734,12 +2734,12 @@
       <w:r>
         <w:t xml:space="preserve"> can be </w:t>
       </w:r>
-      <w:del w:id="10390" w:author="Revision merge (HM+PL)" w:date="2026-09-09T13:15:15Z">
+      <w:del w:id="10390" w:author="Revision merge (HM+PL)" w:date="2026-09-09T13:17:57Z">
         <w:r>
           <w:delText xml:space="preserve">toggled</w:delText>
         </w:r>
       </w:del>
-      <w:ins w:id="10391" w:author="Revision merge (HM+PL)" w:date="2026-09-09T13:15:15Z">
+      <w:ins w:id="10391" w:author="Revision merge (HM+PL)" w:date="2026-09-09T13:17:57Z">
         <w:r>
           <w:t xml:space="preserve">selectively enabled or disabled</w:t>
         </w:r>
@@ -2747,12 +2747,12 @@
       <w:r>
         <w:t xml:space="preserve"> via `cfg$stages$*` </w:t>
       </w:r>
-      <w:del w:id="10392" w:author="Revision merge (HM+PL)" w:date="2026-09-09T13:15:15Z">
+      <w:del w:id="10392" w:author="Revision merge (HM+PL)" w:date="2026-09-09T13:17:57Z">
         <w:r>
           <w:delText xml:space="preserve">flags,</w:delText>
         </w:r>
       </w:del>
-      <w:ins w:id="10393" w:author="Revision merge (HM+PL)" w:date="2026-09-09T13:15:15Z">
+      <w:ins w:id="10393" w:author="Revision merge (HM+PL)" w:date="2026-09-09T13:17:57Z">
         <w:r>
           <w:t xml:space="preserve">flags;</w:t>
         </w:r>
@@ -2760,12 +2760,12 @@
       <w:r>
         <w:t xml:space="preserve"> </w:t>
       </w:r>
-      <w:del w:id="10394" w:author="Revision merge (HM+PL)" w:date="2026-09-09T13:15:15Z">
+      <w:del w:id="10394" w:author="Revision merge (HM+PL)" w:date="2026-09-09T13:17:57Z">
         <w:r>
           <w:delText xml:space="preserve">e.g,</w:delText>
         </w:r>
       </w:del>
-      <w:ins w:id="10395" w:author="Revision merge (HM+PL)" w:date="2026-09-09T13:15:15Z">
+      <w:ins w:id="10395" w:author="Revision merge (HM+PL)" w:date="2026-09-09T13:17:57Z">
         <w:r>
           <w:t xml:space="preserve">for example,</w:t>
         </w:r>
@@ -2773,12 +2773,12 @@
       <w:r>
         <w:t xml:space="preserve"> users can re-run only the resistome modules after revising thresholds. TPM normalisation (R/03) and all gene-element stages (R/09–R/11) </w:t>
       </w:r>
-      <w:del w:id="10396" w:author="Revision merge (HM+PL)" w:date="2026-09-09T13:15:15Z">
+      <w:del w:id="10396" w:author="Revision merge (HM+PL)" w:date="2026-09-09T13:17:57Z">
         <w:r>
           <w:delText xml:space="preserve">require</w:delText>
         </w:r>
       </w:del>
-      <w:ins w:id="10397" w:author="Revision merge (HM+PL)" w:date="2026-09-09T13:15:15Z">
+      <w:ins w:id="10397" w:author="Revision merge (HM+PL)" w:date="2026-09-09T13:17:57Z">
         <w:r>
           <w:t xml:space="preserve">are contingent upon</w:t>
         </w:r>
@@ -2786,12 +2786,12 @@
       <w:r>
         <w:t xml:space="preserve"> ABRicate outputs and are </w:t>
       </w:r>
-      <w:del w:id="10398" w:author="Revision merge (HM+PL)" w:date="2026-09-09T13:15:15Z">
+      <w:del w:id="10398" w:author="Revision merge (HM+PL)" w:date="2026-09-09T13:17:57Z">
         <w:r>
           <w:delText xml:space="preserve">skipped</w:delText>
         </w:r>
       </w:del>
-      <w:ins w:id="10399" w:author="Revision merge (HM+PL)" w:date="2026-09-09T13:15:15Z">
+      <w:ins w:id="10399" w:author="Revision merge (HM+PL)" w:date="2026-09-09T13:17:57Z">
         <w:r>
           <w:t xml:space="preserve">automatically</w:t>
         </w:r>
@@ -2799,12 +2799,12 @@
       <w:r>
         <w:t xml:space="preserve"> </w:t>
       </w:r>
-      <w:del w:id="10400" w:author="Revision merge (HM+PL)" w:date="2026-09-09T13:15:15Z">
+      <w:del w:id="10400" w:author="Revision merge (HM+PL)" w:date="2026-09-09T13:17:57Z">
         <w:r>
           <w:delText xml:space="preserve">otherwise.</w:delText>
         </w:r>
       </w:del>
-      <w:ins w:id="10401" w:author="Revision merge (HM+PL)" w:date="2026-09-09T13:15:15Z">
+      <w:ins w:id="10401" w:author="Revision merge (HM+PL)" w:date="2026-09-09T13:17:57Z">
         <w:r>
           <w:t xml:space="preserve">omitted</w:t>
         </w:r>
@@ -2812,12 +2812,12 @@
       <w:r>
         <w:t xml:space="preserve"> </w:t>
       </w:r>
-      <w:del w:id="10402" w:author="Revision merge (HM+PL)" w:date="2026-09-09T13:15:15Z">
+      <w:del w:id="10402" w:author="Revision merge (HM+PL)" w:date="2026-09-09T13:17:57Z">
         <w:r>
           <w:delText xml:space="preserve">Per-study</w:delText>
         </w:r>
       </w:del>
-      <w:ins w:id="10403" w:author="Revision merge (HM+PL)" w:date="2026-09-09T13:15:15Z">
+      <w:ins w:id="10403" w:author="Revision merge (HM+PL)" w:date="2026-09-09T13:17:57Z">
         <w:r>
           <w:t xml:space="preserve">when such inputs are absent. Study-specific corrections to</w:t>
         </w:r>
@@ -2825,12 +2825,12 @@
       <w:r>
         <w:t xml:space="preserve"> NCBI taxonomy </w:t>
       </w:r>
-      <w:del w:id="10404" w:author="Revision merge (HM+PL)" w:date="2026-09-09T13:15:15Z">
+      <w:del w:id="10404" w:author="Revision merge (HM+PL)" w:date="2026-09-09T13:17:57Z">
         <w:r>
           <w:delText xml:space="preserve">fixes,</w:delText>
         </w:r>
       </w:del>
-      <w:ins w:id="10405" w:author="Revision merge (HM+PL)" w:date="2026-09-09T13:15:15Z">
+      <w:ins w:id="10405" w:author="Revision merge (HM+PL)" w:date="2026-09-09T13:17:57Z">
         <w:r>
           <w:t xml:space="preserve">assignments,</w:t>
         </w:r>
@@ -2838,12 +2838,12 @@
       <w:r>
         <w:t xml:space="preserve"> </w:t>
       </w:r>
-      <w:del w:id="10406" w:author="Revision merge (HM+PL)" w:date="2026-09-09T13:15:15Z">
+      <w:del w:id="10406" w:author="Revision merge (HM+PL)" w:date="2026-09-09T13:17:57Z">
         <w:r>
           <w:delText xml:space="preserve">when</w:delText>
         </w:r>
       </w:del>
-      <w:ins w:id="10407" w:author="Revision merge (HM+PL)" w:date="2026-09-09T13:15:15Z">
+      <w:ins w:id="10407" w:author="Revision merge (HM+PL)" w:date="2026-09-09T13:17:57Z">
         <w:r>
           <w:t xml:space="preserve">where</w:t>
         </w:r>
@@ -2851,12 +2851,12 @@
       <w:r>
         <w:t xml:space="preserve"> </w:t>
       </w:r>
-      <w:del w:id="10408" w:author="Revision merge (HM+PL)" w:date="2026-09-09T13:15:15Z">
+      <w:del w:id="10408" w:author="Revision merge (HM+PL)" w:date="2026-09-09T13:17:57Z">
         <w:r>
           <w:delText xml:space="preserve">needed,</w:delText>
         </w:r>
       </w:del>
-      <w:ins w:id="10409" w:author="Revision merge (HM+PL)" w:date="2026-09-09T13:15:15Z">
+      <w:ins w:id="10409" w:author="Revision merge (HM+PL)" w:date="2026-09-09T13:17:57Z">
         <w:r>
           <w:t xml:space="preserve">required,</w:t>
         </w:r>
@@ -2864,12 +2864,12 @@
       <w:r>
         <w:t xml:space="preserve"> are </w:t>
       </w:r>
-      <w:del w:id="10410" w:author="Revision merge (HM+PL)" w:date="2026-09-09T13:15:15Z">
+      <w:del w:id="10410" w:author="Revision merge (HM+PL)" w:date="2026-09-09T13:17:57Z">
         <w:r>
           <w:delText xml:space="preserve">declared</w:delText>
         </w:r>
       </w:del>
-      <w:ins w:id="10411" w:author="Revision merge (HM+PL)" w:date="2026-09-09T13:15:15Z">
+      <w:ins w:id="10411" w:author="Revision merge (HM+PL)" w:date="2026-09-09T13:17:57Z">
         <w:r>
           <w:t xml:space="preserve">encoded</w:t>
         </w:r>
@@ -2877,7 +2877,7 @@
       <w:r>
         <w:t xml:space="preserve"> in a structured `taxid_fixes.csv` </w:t>
       </w:r>
-      <w:ins w:id="10412" w:author="Revision merge (HM+PL)" w:date="2026-09-09T13:15:15Z">
+      <w:ins w:id="10412" w:author="Revision merge (HM+PL)" w:date="2026-09-09T13:17:57Z">
         <w:r>
           <w:t xml:space="preserve">table </w:t>
         </w:r>
@@ -2885,7 +2885,7 @@
       <w:r>
         <w:t xml:space="preserve">rather than</w:t>
       </w:r>
-      <w:ins w:id="10413" w:author="Revision merge (HM+PL)" w:date="2026-09-09T13:15:15Z">
+      <w:ins w:id="10413" w:author="Revision merge (HM+PL)" w:date="2026-09-09T13:17:57Z">
         <w:r>
           <w:t xml:space="preserve"> implemented</w:t>
         </w:r>
@@ -2893,12 +2893,12 @@
       <w:r>
         <w:t xml:space="preserve"> as row-index edits. </w:t>
       </w:r>
-      <w:del w:id="10414" w:author="Revision merge (HM+PL)" w:date="2026-09-09T13:15:15Z">
+      <w:del w:id="10414" w:author="Revision merge (HM+PL)" w:date="2026-09-09T13:17:57Z">
         <w:r>
           <w:delText xml:space="preserve">A</w:delText>
         </w:r>
       </w:del>
-      <w:ins w:id="10415" w:author="Revision merge (HM+PL)" w:date="2026-09-09T13:15:15Z">
+      <w:ins w:id="10415" w:author="Revision merge (HM+PL)" w:date="2026-09-09T13:17:57Z">
         <w:r>
           <w:t xml:space="preserve">Multiple-testing</w:t>
         </w:r>
@@ -2906,12 +2906,12 @@
       <w:r>
         <w:t xml:space="preserve"> </w:t>
       </w:r>
-      <w:del w:id="10416" w:author="Revision merge (HM+PL)" w:date="2026-09-09T13:15:15Z">
+      <w:del w:id="10416" w:author="Revision merge (HM+PL)" w:date="2026-09-09T13:17:57Z">
         <w:r>
           <w:delText xml:space="preserve">single</w:delText>
         </w:r>
       </w:del>
-      <w:ins w:id="10417" w:author="Revision merge (HM+PL)" w:date="2026-09-09T13:15:15Z">
+      <w:ins w:id="10417" w:author="Revision merge (HM+PL)" w:date="2026-09-09T13:17:57Z">
         <w:r>
           <w:t xml:space="preserve">correction is controlled through the</w:t>
         </w:r>
@@ -2919,12 +2919,12 @@
       <w:r>
         <w:t xml:space="preserve"> `cfg$stats$padjust_method` </w:t>
       </w:r>
-      <w:del w:id="10418" w:author="Revision merge (HM+PL)" w:date="2026-09-09T13:15:15Z">
+      <w:del w:id="10418" w:author="Revision merge (HM+PL)" w:date="2026-09-09T13:17:57Z">
         <w:r>
           <w:delText xml:space="preserve">knob</w:delText>
         </w:r>
       </w:del>
-      <w:ins w:id="10419" w:author="Revision merge (HM+PL)" w:date="2026-09-09T13:15:15Z">
+      <w:ins w:id="10419" w:author="Revision merge (HM+PL)" w:date="2026-09-09T13:17:57Z">
         <w:r>
           <w:t xml:space="preserve">parameter,</w:t>
         </w:r>
@@ -2932,12 +2932,12 @@
       <w:r>
         <w:t xml:space="preserve"> </w:t>
       </w:r>
-      <w:del w:id="10420" w:author="Revision merge (HM+PL)" w:date="2026-09-09T13:15:15Z">
+      <w:del w:id="10420" w:author="Revision merge (HM+PL)" w:date="2026-09-09T13:17:57Z">
         <w:r>
           <w:delText xml:space="preserve">(Benjamini-Hochberg</w:delText>
         </w:r>
       </w:del>
-      <w:ins w:id="10421" w:author="Revision merge (HM+PL)" w:date="2026-09-09T13:15:15Z">
+      <w:ins w:id="10421" w:author="Revision merge (HM+PL)" w:date="2026-09-09T13:17:57Z">
         <w:r>
           <w:t xml:space="preserve">ensuring consistent application of the selected adjustment throughout the pipeline. The Benjamini-Hochberg false discovery rate</w:t>
         </w:r>
@@ -2945,12 +2945,12 @@
       <w:r>
         <w:t xml:space="preserve"> is used by </w:t>
       </w:r>
-      <w:del w:id="10422" w:author="Revision merge (HM+PL)" w:date="2026-09-09T13:15:15Z">
+      <w:del w:id="10422" w:author="Revision merge (HM+PL)" w:date="2026-09-09T13:17:57Z">
         <w:r>
           <w:delText xml:space="preserve">default;</w:delText>
         </w:r>
       </w:del>
-      <w:ins w:id="10423" w:author="Revision merge (HM+PL)" w:date="2026-09-09T13:15:15Z">
+      <w:ins w:id="10423" w:author="Revision merge (HM+PL)" w:date="2026-09-09T13:17:57Z">
         <w:r>
           <w:t xml:space="preserve">default,</w:t>
         </w:r>
@@ -2958,12 +2958,12 @@
       <w:r>
         <w:t xml:space="preserve"> </w:t>
       </w:r>
-      <w:del w:id="10424" w:author="Revision merge (HM+PL)" w:date="2026-09-09T13:15:15Z">
+      <w:del w:id="10424" w:author="Revision merge (HM+PL)" w:date="2026-09-09T13:17:57Z">
         <w:r>
           <w:delText xml:space="preserve">full</w:delText>
         </w:r>
       </w:del>
-      <w:ins w:id="10425" w:author="Revision merge (HM+PL)" w:date="2026-09-09T13:15:15Z">
+      <w:ins w:id="10425" w:author="Revision merge (HM+PL)" w:date="2026-09-09T13:17:57Z">
         <w:r>
           <w:t xml:space="preserve">although</w:t>
         </w:r>
@@ -2971,12 +2971,12 @@
       <w:r>
         <w:t xml:space="preserve"> </w:t>
       </w:r>
-      <w:del w:id="10426" w:author="Revision merge (HM+PL)" w:date="2026-09-09T13:15:15Z">
+      <w:del w:id="10426" w:author="Revision merge (HM+PL)" w:date="2026-09-09T13:17:57Z">
         <w:r>
           <w:delText xml:space="preserve">list</w:delText>
         </w:r>
       </w:del>
-      <w:ins w:id="10427" w:author="Revision merge (HM+PL)" w:date="2026-09-09T13:15:15Z">
+      <w:ins w:id="10427" w:author="Revision merge (HM+PL)" w:date="2026-09-09T13:17:57Z">
         <w:r>
           <w:t xml:space="preserve">alternative correction methods are supported and documented</w:t>
         </w:r>
@@ -2984,12 +2984,12 @@
       <w:r>
         <w:t xml:space="preserve"> in </w:t>
       </w:r>
-      <w:del w:id="10428" w:author="Revision merge (HM+PL)" w:date="2026-09-09T13:15:15Z">
+      <w:del w:id="10428" w:author="Revision merge (HM+PL)" w:date="2026-09-09T13:17:57Z">
         <w:r>
           <w:delText xml:space="preserve">`docs/STATISTICS.md`) routes every multiple-testing correction across the pipeline.</w:delText>
         </w:r>
       </w:del>
-      <w:ins w:id="10429" w:author="Revision merge (HM+PL)" w:date="2026-09-09T13:15:15Z">
+      <w:ins w:id="10429" w:author="Revision merge (HM+PL)" w:date="2026-09-09T13:17:57Z">
         <w:r>
           <w:t xml:space="preserve">`docs/STATISTICS.md`.</w:t>
         </w:r>
@@ -3002,12 +3002,12 @@
       <w:r>
         <w:t xml:space="preserve">**Stages.** The pipeline </w:t>
       </w:r>
-      <w:del w:id="10430" w:author="Revision merge (HM+PL)" w:date="2026-09-09T13:15:15Z">
+      <w:del w:id="10430" w:author="Revision merge (HM+PL)" w:date="2026-09-09T13:17:57Z">
         <w:r>
           <w:delText xml:space="preserve">organises</w:delText>
         </w:r>
       </w:del>
-      <w:ins w:id="10431" w:author="Revision merge (HM+PL)" w:date="2026-09-09T13:15:15Z">
+      <w:ins w:id="10431" w:author="Revision merge (HM+PL)" w:date="2026-09-09T13:17:57Z">
         <w:r>
           <w:t xml:space="preserve">is</w:t>
         </w:r>
@@ -3015,12 +3015,12 @@
       <w:r>
         <w:t xml:space="preserve"> </w:t>
       </w:r>
-      <w:del w:id="10432" w:author="Revision merge (HM+PL)" w:date="2026-09-09T13:15:15Z">
+      <w:del w:id="10432" w:author="Revision merge (HM+PL)" w:date="2026-09-09T13:17:57Z">
         <w:r>
           <w:delText xml:space="preserve">its work</w:delText>
         </w:r>
       </w:del>
-      <w:ins w:id="10433" w:author="Revision merge (HM+PL)" w:date="2026-09-09T13:15:15Z">
+      <w:ins w:id="10433" w:author="Revision merge (HM+PL)" w:date="2026-09-09T13:17:57Z">
         <w:r>
           <w:t xml:space="preserve">organised</w:t>
         </w:r>
@@ -3028,12 +3028,12 @@
       <w:r>
         <w:t xml:space="preserve"> into five conceptual </w:t>
       </w:r>
-      <w:del w:id="10434" w:author="Revision merge (HM+PL)" w:date="2026-09-09T13:15:15Z">
+      <w:del w:id="10434" w:author="Revision merge (HM+PL)" w:date="2026-09-09T13:17:57Z">
         <w:r>
           <w:delText xml:space="preserve">blocks.</w:delText>
         </w:r>
       </w:del>
-      <w:ins w:id="10435" w:author="Revision merge (HM+PL)" w:date="2026-09-09T13:15:15Z">
+      <w:ins w:id="10435" w:author="Revision merge (HM+PL)" w:date="2026-09-09T13:17:57Z">
         <w:r>
           <w:t xml:space="preserve">stages.</w:t>
         </w:r>
@@ -3046,12 +3046,12 @@
       <w:r>
         <w:t xml:space="preserve">(1) </w:t>
       </w:r>
-      <w:del w:id="10436" w:author="Revision merge (HM+PL)" w:date="2026-09-09T13:15:15Z">
+      <w:del w:id="10436" w:author="Revision merge (HM+PL)" w:date="2026-09-09T13:17:57Z">
         <w:r>
           <w:delText xml:space="preserve">*Ingest</w:delText>
         </w:r>
       </w:del>
-      <w:ins w:id="10437" w:author="Revision merge (HM+PL)" w:date="2026-09-09T13:15:15Z">
+      <w:ins w:id="10437" w:author="Revision merge (HM+PL)" w:date="2026-09-09T13:17:57Z">
         <w:r>
           <w:t xml:space="preserve">*Data input</w:t>
         </w:r>
@@ -3059,12 +3059,12 @@
       <w:r>
         <w:t xml:space="preserve"> and </w:t>
       </w:r>
-      <w:del w:id="10438" w:author="Revision merge (HM+PL)" w:date="2026-09-09T13:15:15Z">
+      <w:del w:id="10438" w:author="Revision merge (HM+PL)" w:date="2026-09-09T13:17:57Z">
         <w:r>
           <w:delText xml:space="preserve">cleaning*</w:delText>
         </w:r>
       </w:del>
-      <w:ins w:id="10439" w:author="Revision merge (HM+PL)" w:date="2026-09-09T13:15:15Z">
+      <w:ins w:id="10439" w:author="Revision merge (HM+PL)" w:date="2026-09-09T13:17:57Z">
         <w:r>
           <w:t xml:space="preserve">decontamination*</w:t>
         </w:r>
@@ -3072,12 +3072,12 @@
       <w:r>
         <w:t xml:space="preserve"> </w:t>
       </w:r>
-      <w:del w:id="10440" w:author="Revision merge (HM+PL)" w:date="2026-09-09T13:15:15Z">
+      <w:del w:id="10440" w:author="Revision merge (HM+PL)" w:date="2026-09-09T13:17:57Z">
         <w:r>
           <w:delText xml:space="preserve">(R/00–R/02)</w:delText>
         </w:r>
       </w:del>
-      <w:ins w:id="10441" w:author="Revision merge (HM+PL)" w:date="2026-09-09T13:15:15Z">
+      <w:ins w:id="10441" w:author="Revision merge (HM+PL)" w:date="2026-09-09T13:17:57Z">
         <w:r>
           <w:t xml:space="preserve">(R/00–R/02).</w:t>
         </w:r>
@@ -3085,12 +3085,12 @@
       <w:r>
         <w:t xml:space="preserve"> </w:t>
       </w:r>
-      <w:del w:id="10442" w:author="Revision merge (HM+PL)" w:date="2026-09-09T13:15:15Z">
+      <w:del w:id="10442" w:author="Revision merge (HM+PL)" w:date="2026-09-09T13:17:57Z">
         <w:r>
           <w:delText xml:space="preserve">load</w:delText>
         </w:r>
       </w:del>
-      <w:ins w:id="10443" w:author="Revision merge (HM+PL)" w:date="2026-09-09T13:15:15Z">
+      <w:ins w:id="10443" w:author="Revision merge (HM+PL)" w:date="2026-09-09T13:17:57Z">
         <w:r>
           <w:t xml:space="preserve">The pipeline imports</w:t>
         </w:r>
@@ -3098,12 +3098,12 @@
       <w:r>
         <w:t xml:space="preserve"> upstream </w:t>
       </w:r>
-      <w:del w:id="10444" w:author="Revision merge (HM+PL)" w:date="2026-09-09T13:15:15Z">
+      <w:del w:id="10444" w:author="Revision merge (HM+PL)" w:date="2026-09-09T13:17:57Z">
         <w:r>
           <w:delText xml:space="preserve">tables</w:delText>
         </w:r>
       </w:del>
-      <w:ins w:id="10445" w:author="Revision merge (HM+PL)" w:date="2026-09-09T13:15:15Z">
+      <w:ins w:id="10445" w:author="Revision merge (HM+PL)" w:date="2026-09-09T13:17:57Z">
         <w:r>
           <w:t xml:space="preserve">outputs</w:t>
         </w:r>
@@ -3111,12 +3111,12 @@
       <w:r>
         <w:t xml:space="preserve"> — Kraken2/Bracken, ABRicate, Re-centrifuge contamination </w:t>
       </w:r>
-      <w:del w:id="10446" w:author="Revision merge (HM+PL)" w:date="2026-09-09T13:15:15Z">
+      <w:del w:id="10446" w:author="Revision merge (HM+PL)" w:date="2026-09-09T13:17:57Z">
         <w:r>
           <w:delText xml:space="preserve">tags,</w:delText>
         </w:r>
       </w:del>
-      <w:ins w:id="10447" w:author="Revision merge (HM+PL)" w:date="2026-09-09T13:15:15Z">
+      <w:ins w:id="10447" w:author="Revision merge (HM+PL)" w:date="2026-09-09T13:17:57Z">
         <w:r>
           <w:t xml:space="preserve">tags and</w:t>
         </w:r>
@@ -3124,7 +3124,7 @@
       <w:r>
         <w:t xml:space="preserve"> study metadata</w:t>
       </w:r>
-      <w:ins w:id="10448" w:author="Revision merge (HM+PL)" w:date="2026-09-09T13:15:15Z">
+      <w:ins w:id="10448" w:author="Revision merge (HM+PL)" w:date="2026-09-09T13:17:57Z">
         <w:r>
           <w:t xml:space="preserve"> tables</w:t>
         </w:r>
@@ -3132,12 +3132,12 @@
       <w:r>
         <w:t xml:space="preserve"> — accommodating per-project input shapes rather than assuming a fixed column layout, </w:t>
       </w:r>
-      <w:del w:id="10449" w:author="Revision merge (HM+PL)" w:date="2026-09-09T13:15:15Z">
+      <w:del w:id="10449" w:author="Revision merge (HM+PL)" w:date="2026-09-09T13:17:57Z">
         <w:r>
           <w:delText xml:space="preserve">apply</w:delText>
         </w:r>
       </w:del>
-      <w:ins w:id="10450" w:author="Revision merge (HM+PL)" w:date="2026-09-09T13:15:15Z">
+      <w:ins w:id="10450" w:author="Revision merge (HM+PL)" w:date="2026-09-09T13:17:57Z">
         <w:r>
           <w:t xml:space="preserve">applies</w:t>
         </w:r>
@@ -3145,12 +3145,12 @@
       <w:r>
         <w:t xml:space="preserve"> optional negative-control subtraction, </w:t>
       </w:r>
-      <w:del w:id="10451" w:author="Revision merge (HM+PL)" w:date="2026-09-09T13:15:15Z">
+      <w:del w:id="10451" w:author="Revision merge (HM+PL)" w:date="2026-09-09T13:17:57Z">
         <w:r>
           <w:delText xml:space="preserve">merge</w:delText>
         </w:r>
       </w:del>
-      <w:ins w:id="10452" w:author="Revision merge (HM+PL)" w:date="2026-09-09T13:15:15Z">
+      <w:ins w:id="10452" w:author="Revision merge (HM+PL)" w:date="2026-09-09T13:17:57Z">
         <w:r>
           <w:t xml:space="preserve">merges</w:t>
         </w:r>
@@ -3158,12 +3158,12 @@
       <w:r>
         <w:t xml:space="preserve"> Bracken counts with the metadata covariates declared in `cfg$metadata$fixed_effects` / `random_effect`, and </w:t>
       </w:r>
-      <w:del w:id="10453" w:author="Revision merge (HM+PL)" w:date="2026-09-09T13:15:15Z">
+      <w:del w:id="10453" w:author="Revision merge (HM+PL)" w:date="2026-09-09T13:17:57Z">
         <w:r>
           <w:delText xml:space="preserve">link</w:delText>
         </w:r>
       </w:del>
-      <w:ins w:id="10454" w:author="Revision merge (HM+PL)" w:date="2026-09-09T13:15:15Z">
+      <w:ins w:id="10454" w:author="Revision merge (HM+PL)" w:date="2026-09-09T13:17:57Z">
         <w:r>
           <w:t xml:space="preserve">links</w:t>
         </w:r>
@@ -3179,12 +3179,12 @@
       <w:r>
         <w:t xml:space="preserve">(2) *Gene-element normalisation* (R/03) computes per-(sample, GENE) TPM </w:t>
       </w:r>
-      <w:del w:id="10455" w:author="Revision merge (HM+PL)" w:date="2026-09-09T13:15:15Z">
+      <w:del w:id="10455" w:author="Revision merge (HM+PL)" w:date="2026-09-09T13:17:57Z">
         <w:r>
           <w:delText xml:space="preserve">from</w:delText>
         </w:r>
       </w:del>
-      <w:ins w:id="10456" w:author="Revision merge (HM+PL)" w:date="2026-09-09T13:15:15Z">
+      <w:ins w:id="10456" w:author="Revision merge (HM+PL)" w:date="2026-09-09T13:17:57Z">
         <w:r>
           <w:t xml:space="preserve">based on</w:t>
         </w:r>
@@ -3192,12 +3192,12 @@
       <w:r>
         <w:t xml:space="preserve"> ABRicate </w:t>
       </w:r>
-      <w:del w:id="10457" w:author="Revision merge (HM+PL)" w:date="2026-09-09T13:15:15Z">
+      <w:del w:id="10457" w:author="Revision merge (HM+PL)" w:date="2026-09-09T13:17:57Z">
         <w:r>
           <w:delText xml:space="preserve">hits</w:delText>
         </w:r>
       </w:del>
-      <w:ins w:id="10458" w:author="Revision merge (HM+PL)" w:date="2026-09-09T13:15:15Z">
+      <w:ins w:id="10458" w:author="Revision merge (HM+PL)" w:date="2026-09-09T13:17:57Z">
         <w:r>
           <w:t xml:space="preserve">hit counts</w:t>
         </w:r>
@@ -3205,7 +3205,7 @@
       <w:r>
         <w:t xml:space="preserve"> and</w:t>
       </w:r>
-      <w:ins w:id="10459" w:author="Revision merge (HM+PL)" w:date="2026-09-09T13:15:15Z">
+      <w:ins w:id="10459" w:author="Revision merge (HM+PL)" w:date="2026-09-09T13:17:57Z">
         <w:r>
           <w:t xml:space="preserve"> annotated</w:t>
         </w:r>
@@ -3221,7 +3221,7 @@
       <w:r>
         <w:t xml:space="preserve">(3) *Community analyses* (R/04–R/08) cover the standard taxonomic toolkit. </w:t>
       </w:r>
-      <w:ins w:id="10460" w:author="Revision merge (HM+PL)" w:date="2026-09-09T13:15:15Z">
+      <w:ins w:id="10460" w:author="Revision merge (HM+PL)" w:date="2026-09-09T13:17:57Z">
         <w:r>
           <w:t xml:space="preserve">Following standardisation and cleaning of shared taxon names, </w:t>
         </w:r>
@@ -3229,12 +3229,12 @@
       <w:r>
         <w:t xml:space="preserve">R/04–R/05 </w:t>
       </w:r>
-      <w:del w:id="10461" w:author="Revision merge (HM+PL)" w:date="2026-09-09T13:15:15Z">
+      <w:del w:id="10461" w:author="Revision merge (HM+PL)" w:date="2026-09-09T13:17:57Z">
         <w:r>
           <w:delText xml:space="preserve">produce</w:delText>
         </w:r>
       </w:del>
-      <w:ins w:id="10462" w:author="Revision merge (HM+PL)" w:date="2026-09-09T13:15:15Z">
+      <w:ins w:id="10462" w:author="Revision merge (HM+PL)" w:date="2026-09-09T13:17:57Z">
         <w:r>
           <w:t xml:space="preserve">generate</w:t>
         </w:r>
@@ -3242,12 +3242,12 @@
       <w:r>
         <w:t xml:space="preserve"> Venn </w:t>
       </w:r>
-      <w:del w:id="10463" w:author="Revision merge (HM+PL)" w:date="2026-09-09T13:15:15Z">
+      <w:del w:id="10463" w:author="Revision merge (HM+PL)" w:date="2026-09-09T13:17:57Z">
         <w:r>
           <w:delText xml:space="preserve">diagrams and</w:delText>
         </w:r>
       </w:del>
-      <w:ins w:id="10464" w:author="Revision merge (HM+PL)" w:date="2026-09-09T13:15:15Z">
+      <w:ins w:id="10464" w:author="Revision merge (HM+PL)" w:date="2026-09-09T13:17:57Z">
         <w:r>
           <w:t xml:space="preserve">diagrams,</w:t>
         </w:r>
@@ -3255,12 +3255,12 @@
       <w:r>
         <w:t xml:space="preserve"> annotated </w:t>
       </w:r>
-      <w:del w:id="10465" w:author="Revision merge (HM+PL)" w:date="2026-09-09T13:15:15Z">
+      <w:del w:id="10465" w:author="Revision merge (HM+PL)" w:date="2026-09-09T13:17:57Z">
         <w:r>
           <w:delText xml:space="preserve">heatmaps</w:delText>
         </w:r>
       </w:del>
-      <w:ins w:id="10466" w:author="Revision merge (HM+PL)" w:date="2026-09-09T13:15:15Z">
+      <w:ins w:id="10466" w:author="Revision merge (HM+PL)" w:date="2026-09-09T13:17:57Z">
         <w:r>
           <w:t xml:space="preserve">heatmaps,</w:t>
         </w:r>
@@ -3268,12 +3268,12 @@
       <w:r>
         <w:t xml:space="preserve"> </w:t>
       </w:r>
-      <w:del w:id="10467" w:author="Revision merge (HM+PL)" w:date="2026-09-09T13:15:15Z">
+      <w:del w:id="10467" w:author="Revision merge (HM+PL)" w:date="2026-09-09T13:17:57Z">
         <w:r>
           <w:delText xml:space="preserve">after a shared taxa-name cleanup, plus</w:delText>
         </w:r>
       </w:del>
-      <w:ins w:id="10468" w:author="Revision merge (HM+PL)" w:date="2026-09-09T13:15:15Z">
+      <w:ins w:id="10468" w:author="Revision merge (HM+PL)" w:date="2026-09-09T13:17:57Z">
         <w:r>
           <w:t xml:space="preserve">and</w:t>
         </w:r>
@@ -3281,12 +3281,12 @@
       <w:r>
         <w:t xml:space="preserve"> top-N stacked-bar relative-abundance plots (static PNG and interactive plotly HTML) with paired total-count and sample-prevalence panels. Alpha diversity (R/06) reports Shannon, Simpson, richness, Pielou, and Fisher metrics with Kruskal-Wallis tests and violin/bar plots, preferring a pre-computed indices CSV (e.g., Oxford Nanopore wf-metagenomics output) and falling back to the vegan R package. Beta diversity (R/07) </w:t>
       </w:r>
-      <w:del w:id="10469" w:author="Revision merge (HM+PL)" w:date="2026-09-09T13:15:15Z">
+      <w:del w:id="10469" w:author="Revision merge (HM+PL)" w:date="2026-09-09T13:17:57Z">
         <w:r>
           <w:delText xml:space="preserve">computes</w:delText>
         </w:r>
       </w:del>
-      <w:ins w:id="10470" w:author="Revision merge (HM+PL)" w:date="2026-09-09T13:15:15Z">
+      <w:ins w:id="10470" w:author="Revision merge (HM+PL)" w:date="2026-09-09T13:17:57Z">
         <w:r>
           <w:t xml:space="preserve">assesses between-sample community differences using</w:t>
         </w:r>
@@ -3294,12 +3294,12 @@
       <w:r>
         <w:t xml:space="preserve"> PCoA on Hellinger-transformed Bray-Curtis distances with PERMANOVA (`adonis2`, 9999 permutations) and PERMDISP (`betadisper`) overlaid on the ordination. </w:t>
       </w:r>
-      <w:del w:id="10471" w:author="Revision merge (HM+PL)" w:date="2026-09-09T13:15:15Z">
+      <w:del w:id="10471" w:author="Revision merge (HM+PL)" w:date="2026-09-09T13:17:57Z">
         <w:r>
           <w:delText xml:space="preserve">ALDEx2 differential</w:delText>
         </w:r>
       </w:del>
-      <w:ins w:id="10472" w:author="Revision merge (HM+PL)" w:date="2026-09-09T13:15:15Z">
+      <w:ins w:id="10472" w:author="Revision merge (HM+PL)" w:date="2026-09-09T13:17:57Z">
         <w:r>
           <w:t xml:space="preserve">Differential</w:t>
         </w:r>
@@ -3307,7 +3307,7 @@
       <w:r>
         <w:t xml:space="preserve"> abundance </w:t>
       </w:r>
-      <w:ins w:id="10473" w:author="Revision merge (HM+PL)" w:date="2026-09-09T13:15:15Z">
+      <w:ins w:id="10473" w:author="Revision merge (HM+PL)" w:date="2026-09-09T13:17:57Z">
         <w:r>
           <w:t xml:space="preserve">analysis </w:t>
         </w:r>
@@ -3315,12 +3315,12 @@
       <w:r>
         <w:t xml:space="preserve">(R/08) </w:t>
       </w:r>
-      <w:del w:id="10474" w:author="Revision merge (HM+PL)" w:date="2026-09-09T13:15:15Z">
+      <w:del w:id="10474" w:author="Revision merge (HM+PL)" w:date="2026-09-09T13:17:57Z">
         <w:r>
           <w:delText xml:space="preserve">runs</w:delText>
         </w:r>
       </w:del>
-      <w:ins w:id="10475" w:author="Revision merge (HM+PL)" w:date="2026-09-09T13:15:15Z">
+      <w:ins w:id="10475" w:author="Revision merge (HM+PL)" w:date="2026-09-09T13:17:57Z">
         <w:r>
           <w:t xml:space="preserve">is performed</w:t>
         </w:r>
@@ -3328,12 +3328,12 @@
       <w:r>
         <w:t xml:space="preserve"> at </w:t>
       </w:r>
-      <w:del w:id="10476" w:author="Revision merge (HM+PL)" w:date="2026-09-09T13:15:15Z">
+      <w:del w:id="10476" w:author="Revision merge (HM+PL)" w:date="2026-09-09T13:17:57Z">
         <w:r>
           <w:delText xml:space="preserve">two</w:delText>
         </w:r>
       </w:del>
-      <w:ins w:id="10477" w:author="Revision merge (HM+PL)" w:date="2026-09-09T13:15:15Z">
+      <w:ins w:id="10477" w:author="Revision merge (HM+PL)" w:date="2026-09-09T13:17:57Z">
         <w:r>
           <w:t xml:space="preserve">both</w:t>
         </w:r>
@@ -3341,12 +3341,12 @@
       <w:r>
         <w:t xml:space="preserve"> </w:t>
       </w:r>
-      <w:del w:id="10478" w:author="Revision merge (HM+PL)" w:date="2026-09-09T13:15:15Z">
+      <w:del w:id="10478" w:author="Revision merge (HM+PL)" w:date="2026-09-09T13:17:57Z">
         <w:r>
           <w:delText xml:space="preserve">levels</w:delText>
         </w:r>
       </w:del>
-      <w:ins w:id="10479" w:author="Revision merge (HM+PL)" w:date="2026-09-09T13:15:15Z">
+      <w:ins w:id="10479" w:author="Revision merge (HM+PL)" w:date="2026-09-09T13:17:57Z">
         <w:r>
           <w:t xml:space="preserve">the</w:t>
         </w:r>
@@ -3354,12 +3354,12 @@
       <w:r>
         <w:t xml:space="preserve"> </w:t>
       </w:r>
-      <w:del w:id="10480" w:author="Revision merge (HM+PL)" w:date="2026-09-09T13:15:15Z">
+      <w:del w:id="10480" w:author="Revision merge (HM+PL)" w:date="2026-09-09T13:17:57Z">
         <w:r>
           <w:delText xml:space="preserve">— taxa (Bracken counts)</w:delText>
         </w:r>
       </w:del>
-      <w:ins w:id="10481" w:author="Revision merge (HM+PL)" w:date="2026-09-09T13:15:15Z">
+      <w:ins w:id="10481" w:author="Revision merge (HM+PL)" w:date="2026-09-09T13:17:57Z">
         <w:r>
           <w:t xml:space="preserve">taxonomic</w:t>
         </w:r>
@@ -3367,12 +3367,12 @@
       <w:r>
         <w:t xml:space="preserve"> and </w:t>
       </w:r>
-      <w:del w:id="10482" w:author="Revision merge (HM+PL)" w:date="2026-09-09T13:15:15Z">
+      <w:del w:id="10482" w:author="Revision merge (HM+PL)" w:date="2026-09-09T13:17:57Z">
         <w:r>
           <w:delText xml:space="preserve">genes</w:delText>
         </w:r>
       </w:del>
-      <w:ins w:id="10483" w:author="Revision merge (HM+PL)" w:date="2026-09-09T13:15:15Z">
+      <w:ins w:id="10483" w:author="Revision merge (HM+PL)" w:date="2026-09-09T13:17:57Z">
         <w:r>
           <w:t xml:space="preserve">functional</w:t>
         </w:r>
@@ -3380,12 +3380,12 @@
       <w:r>
         <w:t xml:space="preserve"> </w:t>
       </w:r>
-      <w:del w:id="10484" w:author="Revision merge (HM+PL)" w:date="2026-09-09T13:15:15Z">
+      <w:del w:id="10484" w:author="Revision merge (HM+PL)" w:date="2026-09-09T13:17:57Z">
         <w:r>
           <w:delText xml:space="preserve">(ABRicate</w:delText>
         </w:r>
       </w:del>
-      <w:ins w:id="10485" w:author="Revision merge (HM+PL)" w:date="2026-09-09T13:15:15Z">
+      <w:ins w:id="10485" w:author="Revision merge (HM+PL)" w:date="2026-09-09T13:17:57Z">
         <w:r>
           <w:t xml:space="preserve">level using ALDEx2: taxonomic analysis uses Bracken counts, whereas gene-level analysis uses ABRicate</w:t>
         </w:r>
@@ -3393,12 +3393,12 @@
       <w:r>
         <w:t xml:space="preserve"> contig hits per (sample, </w:t>
       </w:r>
-      <w:del w:id="10486" w:author="Revision merge (HM+PL)" w:date="2026-09-09T13:15:15Z">
+      <w:del w:id="10486" w:author="Revision merge (HM+PL)" w:date="2026-09-09T13:17:57Z">
         <w:r>
           <w:delText xml:space="preserve">GENE)),</w:delText>
         </w:r>
       </w:del>
-      <w:ins w:id="10487" w:author="Revision merge (HM+PL)" w:date="2026-09-09T13:15:15Z">
+      <w:ins w:id="10487" w:author="Revision merge (HM+PL)" w:date="2026-09-09T13:17:57Z">
         <w:r>
           <w:t xml:space="preserve">GENE).</w:t>
         </w:r>
@@ -3406,12 +3406,12 @@
       <w:r>
         <w:t xml:space="preserve"> </w:t>
       </w:r>
-      <w:del w:id="10488" w:author="Revision merge (HM+PL)" w:date="2026-09-09T13:15:15Z">
+      <w:del w:id="10488" w:author="Revision merge (HM+PL)" w:date="2026-09-09T13:17:57Z">
         <w:r>
           <w:delText xml:space="preserve">combining</w:delText>
         </w:r>
       </w:del>
-      <w:ins w:id="10489" w:author="Revision merge (HM+PL)" w:date="2026-09-09T13:15:15Z">
+      <w:ins w:id="10489" w:author="Revision merge (HM+PL)" w:date="2026-09-09T13:17:57Z">
         <w:r>
           <w:t xml:space="preserve">The workflow combines</w:t>
         </w:r>
@@ -3419,7 +3419,7 @@
       <w:r>
         <w:t xml:space="preserve"> an omnibus Kruskal-Wallis </w:t>
       </w:r>
-      <w:ins w:id="10490" w:author="Revision merge (HM+PL)" w:date="2026-09-09T13:15:15Z">
+      <w:ins w:id="10490" w:author="Revision merge (HM+PL)" w:date="2026-09-09T13:17:57Z">
         <w:r>
           <w:t xml:space="preserve">test </w:t>
         </w:r>
@@ -3427,12 +3427,12 @@
       <w:r>
         <w:t xml:space="preserve">with pairwise Welch's </w:t>
       </w:r>
-      <w:del w:id="10491" w:author="Revision merge (HM+PL)" w:date="2026-09-09T13:15:15Z">
+      <w:del w:id="10491" w:author="Revision merge (HM+PL)" w:date="2026-09-09T13:17:57Z">
         <w:r>
           <w:delText xml:space="preserve">t tests,</w:delText>
         </w:r>
       </w:del>
-      <w:ins w:id="10492" w:author="Revision merge (HM+PL)" w:date="2026-09-09T13:15:15Z">
+      <w:ins w:id="10492" w:author="Revision merge (HM+PL)" w:date="2026-09-09T13:17:57Z">
         <w:r>
           <w:t xml:space="preserve">t-tests,</w:t>
         </w:r>
@@ -3440,7 +3440,7 @@
       <w:r>
         <w:t xml:space="preserve"> with an optional `aldex.glm` design path for covariate-adjusted models.</w:t>
       </w:r>
-      <w:ins w:id="10493" w:author="Revision merge (HM+PL)" w:date="2026-09-09T13:15:15Z">
+      <w:ins w:id="10493" w:author="Revision merge (HM+PL)" w:date="2026-09-09T13:17:57Z">
         <w:r>
           <w:t xml:space="preserve"> This compositional approach is deliberate: ALDEx2 models counts through a centred log-ratio (CLR) transformation, which accounts for the compositional nature of sequencing data and avoids the spurious correlations that arise when raw or total counts are compared directly [10]; gene-level features are additionally length-normalised as TPM (R/03) so that genes of differing length remain comparable.</w:t>
         </w:r>
@@ -3453,12 +3453,12 @@
       <w:r>
         <w:t xml:space="preserve">(4) *Functional profiling* (R/09–R/11) runs a shared analysis engine three times against domain-specific databases: </w:t>
       </w:r>
-      <w:del w:id="10494" w:author="Revision merge (HM+PL)" w:date="2026-09-09T13:15:15Z">
+      <w:del w:id="10494" w:author="Revision merge (HM+PL)" w:date="2026-09-09T13:17:57Z">
         <w:r>
           <w:delText xml:space="preserve">the</w:delText>
         </w:r>
       </w:del>
-      <w:ins w:id="10495" w:author="Revision merge (HM+PL)" w:date="2026-09-09T13:15:15Z">
+      <w:ins w:id="10495" w:author="Revision merge (HM+PL)" w:date="2026-09-09T13:17:57Z">
         <w:r>
           <w:t xml:space="preserve">(i)</w:t>
         </w:r>
@@ -3466,12 +3466,12 @@
       <w:r>
         <w:t xml:space="preserve"> resistome </w:t>
       </w:r>
-      <w:del w:id="10496" w:author="Revision merge (HM+PL)" w:date="2026-09-09T13:15:15Z">
+      <w:del w:id="10496" w:author="Revision merge (HM+PL)" w:date="2026-09-09T13:17:57Z">
         <w:r>
           <w:delText xml:space="preserve">(ABRicate/CARD,</w:delText>
         </w:r>
       </w:del>
-      <w:ins w:id="10497" w:author="Revision merge (HM+PL)" w:date="2026-09-09T13:15:15Z">
+      <w:ins w:id="10497" w:author="Revision merge (HM+PL)" w:date="2026-09-09T13:17:57Z">
         <w:r>
           <w:t xml:space="preserve">profiling</w:t>
         </w:r>
@@ -3479,12 +3479,12 @@
       <w:r>
         <w:t xml:space="preserve"> </w:t>
       </w:r>
-      <w:del w:id="10498" w:author="Revision merge (HM+PL)" w:date="2026-09-09T13:15:15Z">
+      <w:del w:id="10498" w:author="Revision merge (HM+PL)" w:date="2026-09-09T13:17:57Z">
         <w:r>
           <w:delText xml:space="preserve">with</w:delText>
         </w:r>
       </w:del>
-      <w:ins w:id="10499" w:author="Revision merge (HM+PL)" w:date="2026-09-09T13:15:15Z">
+      <w:ins w:id="10499" w:author="Revision merge (HM+PL)" w:date="2026-09-09T13:17:57Z">
         <w:r>
           <w:t xml:space="preserve">using ABRicate/CARD annotations, including</w:t>
         </w:r>
@@ -3492,12 +3492,12 @@
       <w:r>
         <w:t xml:space="preserve"> drug-class </w:t>
       </w:r>
-      <w:del w:id="10500" w:author="Revision merge (HM+PL)" w:date="2026-09-09T13:15:15Z">
+      <w:del w:id="10500" w:author="Revision merge (HM+PL)" w:date="2026-09-09T13:17:57Z">
         <w:r>
           <w:delText xml:space="preserve">classification),</w:delText>
         </w:r>
       </w:del>
-      <w:ins w:id="10501" w:author="Revision merge (HM+PL)" w:date="2026-09-09T13:15:15Z">
+      <w:ins w:id="10501" w:author="Revision merge (HM+PL)" w:date="2026-09-09T13:17:57Z">
         <w:r>
           <w:t xml:space="preserve">classification;</w:t>
         </w:r>
@@ -3505,12 +3505,12 @@
       <w:r>
         <w:t xml:space="preserve"> </w:t>
       </w:r>
-      <w:del w:id="10502" w:author="Revision merge (HM+PL)" w:date="2026-09-09T13:15:15Z">
+      <w:del w:id="10502" w:author="Revision merge (HM+PL)" w:date="2026-09-09T13:17:57Z">
         <w:r>
           <w:delText xml:space="preserve">the</w:delText>
         </w:r>
       </w:del>
-      <w:ins w:id="10503" w:author="Revision merge (HM+PL)" w:date="2026-09-09T13:15:15Z">
+      <w:ins w:id="10503" w:author="Revision merge (HM+PL)" w:date="2026-09-09T13:17:57Z">
         <w:r>
           <w:t xml:space="preserve">(ii)</w:t>
         </w:r>
@@ -3518,12 +3518,12 @@
       <w:r>
         <w:t xml:space="preserve"> virulome </w:t>
       </w:r>
-      <w:del w:id="10504" w:author="Revision merge (HM+PL)" w:date="2026-09-09T13:15:15Z">
+      <w:del w:id="10504" w:author="Revision merge (HM+PL)" w:date="2026-09-09T13:17:57Z">
         <w:r>
           <w:delText xml:space="preserve">(VFDB,</w:delText>
         </w:r>
       </w:del>
-      <w:ins w:id="10505" w:author="Revision merge (HM+PL)" w:date="2026-09-09T13:15:15Z">
+      <w:ins w:id="10505" w:author="Revision merge (HM+PL)" w:date="2026-09-09T13:17:57Z">
         <w:r>
           <w:t xml:space="preserve">profiling using VFDB,</w:t>
         </w:r>
@@ -3531,12 +3531,12 @@
       <w:r>
         <w:t xml:space="preserve"> with functional categories extracted from the ABRicate `PRODUCT` </w:t>
       </w:r>
-      <w:del w:id="10506" w:author="Revision merge (HM+PL)" w:date="2026-09-09T13:15:15Z">
+      <w:del w:id="10506" w:author="Revision merge (HM+PL)" w:date="2026-09-09T13:17:57Z">
         <w:r>
           <w:delText xml:space="preserve">field)</w:delText>
         </w:r>
       </w:del>
-      <w:ins w:id="10507" w:author="Revision merge (HM+PL)" w:date="2026-09-09T13:15:15Z">
+      <w:ins w:id="10507" w:author="Revision merge (HM+PL)" w:date="2026-09-09T13:17:57Z">
         <w:r>
           <w:t xml:space="preserve">field;</w:t>
         </w:r>
@@ -3544,12 +3544,12 @@
       <w:r>
         <w:t xml:space="preserve"> </w:t>
       </w:r>
-      <w:del w:id="10508" w:author="Revision merge (HM+PL)" w:date="2026-09-09T13:15:15Z">
+      <w:del w:id="10508" w:author="Revision merge (HM+PL)" w:date="2026-09-09T13:17:57Z">
         <w:r>
           <w:delText xml:space="preserve">and the</w:delText>
         </w:r>
       </w:del>
-      <w:ins w:id="10509" w:author="Revision merge (HM+PL)" w:date="2026-09-09T13:15:15Z">
+      <w:ins w:id="10509" w:author="Revision merge (HM+PL)" w:date="2026-09-09T13:17:57Z">
         <w:r>
           <w:t xml:space="preserve">(iii)</w:t>
         </w:r>
@@ -3557,12 +3557,12 @@
       <w:r>
         <w:t xml:space="preserve"> mobilome </w:t>
       </w:r>
-      <w:del w:id="10510" w:author="Revision merge (HM+PL)" w:date="2026-09-09T13:15:15Z">
+      <w:del w:id="10510" w:author="Revision merge (HM+PL)" w:date="2026-09-09T13:17:57Z">
         <w:r>
           <w:delText xml:space="preserve">(PlasmidFinder,</w:delText>
         </w:r>
       </w:del>
-      <w:ins w:id="10511" w:author="Revision merge (HM+PL)" w:date="2026-09-09T13:15:15Z">
+      <w:ins w:id="10511" w:author="Revision merge (HM+PL)" w:date="2026-09-09T13:17:57Z">
         <w:r>
           <w:t xml:space="preserve">profiling</w:t>
         </w:r>
@@ -3570,12 +3570,12 @@
       <w:r>
         <w:t xml:space="preserve"> </w:t>
       </w:r>
-      <w:del w:id="10512" w:author="Revision merge (HM+PL)" w:date="2026-09-09T13:15:15Z">
+      <w:del w:id="10512" w:author="Revision merge (HM+PL)" w:date="2026-09-09T13:17:57Z">
         <w:r>
           <w:delText xml:space="preserve">with</w:delText>
         </w:r>
       </w:del>
-      <w:ins w:id="10513" w:author="Revision merge (HM+PL)" w:date="2026-09-09T13:15:15Z">
+      <w:ins w:id="10513" w:author="Revision merge (HM+PL)" w:date="2026-09-09T13:17:57Z">
         <w:r>
           <w:t xml:space="preserve">using PlasmidFinder, incorporating</w:t>
         </w:r>
@@ -3583,12 +3583,12 @@
       <w:r>
         <w:t xml:space="preserve"> configurable replicon-family classification </w:t>
       </w:r>
-      <w:del w:id="10514" w:author="Revision merge (HM+PL)" w:date="2026-09-09T13:15:15Z">
+      <w:del w:id="10514" w:author="Revision merge (HM+PL)" w:date="2026-09-09T13:17:57Z">
         <w:r>
           <w:delText xml:space="preserve">— Col-like,</w:delText>
         </w:r>
       </w:del>
-      <w:ins w:id="10515" w:author="Revision merge (HM+PL)" w:date="2026-09-09T13:15:15Z">
+      <w:ins w:id="10515" w:author="Revision merge (HM+PL)" w:date="2026-09-09T13:17:57Z">
         <w:r>
           <w:t xml:space="preserve">(Col-like,</w:t>
         </w:r>
@@ -3596,12 +3596,12 @@
       <w:r>
         <w:t xml:space="preserve"> IncF, IncX, other Inc). </w:t>
       </w:r>
-      <w:del w:id="10516" w:author="Revision merge (HM+PL)" w:date="2026-09-09T13:15:15Z">
+      <w:del w:id="10516" w:author="Revision merge (HM+PL)" w:date="2026-09-09T13:17:57Z">
         <w:r>
           <w:delText xml:space="preserve">Each</w:delText>
         </w:r>
       </w:del>
-      <w:ins w:id="10517" w:author="Revision merge (HM+PL)" w:date="2026-09-09T13:15:15Z">
+      <w:ins w:id="10517" w:author="Revision merge (HM+PL)" w:date="2026-09-09T13:17:57Z">
         <w:r>
           <w:t xml:space="preserve">For</w:t>
         </w:r>
@@ -3609,12 +3609,12 @@
       <w:r>
         <w:t xml:space="preserve"> </w:t>
       </w:r>
-      <w:del w:id="10518" w:author="Revision merge (HM+PL)" w:date="2026-09-09T13:15:15Z">
+      <w:del w:id="10518" w:author="Revision merge (HM+PL)" w:date="2026-09-09T13:17:57Z">
         <w:r>
           <w:delText xml:space="preserve">domain</w:delText>
         </w:r>
       </w:del>
-      <w:ins w:id="10519" w:author="Revision merge (HM+PL)" w:date="2026-09-09T13:15:15Z">
+      <w:ins w:id="10519" w:author="Revision merge (HM+PL)" w:date="2026-09-09T13:17:57Z">
         <w:r>
           <w:t xml:space="preserve">each</w:t>
         </w:r>
@@ -3622,12 +3622,12 @@
       <w:r>
         <w:t xml:space="preserve"> </w:t>
       </w:r>
-      <w:del w:id="10520" w:author="Revision merge (HM+PL)" w:date="2026-09-09T13:15:15Z">
+      <w:del w:id="10520" w:author="Revision merge (HM+PL)" w:date="2026-09-09T13:17:57Z">
         <w:r>
           <w:delText xml:space="preserve">emits</w:delText>
         </w:r>
       </w:del>
-      <w:ins w:id="10521" w:author="Revision merge (HM+PL)" w:date="2026-09-09T13:15:15Z">
+      <w:ins w:id="10521" w:author="Revision merge (HM+PL)" w:date="2026-09-09T13:17:57Z">
         <w:r>
           <w:t xml:space="preserve">domain,</w:t>
         </w:r>
@@ -3635,12 +3635,12 @@
       <w:r>
         <w:t xml:space="preserve"> </w:t>
       </w:r>
-      <w:del w:id="10522" w:author="Revision merge (HM+PL)" w:date="2026-09-09T13:15:15Z">
+      <w:del w:id="10522" w:author="Revision merge (HM+PL)" w:date="2026-09-09T13:17:57Z">
         <w:r>
           <w:delText xml:space="preserve">its</w:delText>
         </w:r>
       </w:del>
-      <w:ins w:id="10523" w:author="Revision merge (HM+PL)" w:date="2026-09-09T13:15:15Z">
+      <w:ins w:id="10523" w:author="Revision merge (HM+PL)" w:date="2026-09-09T13:17:57Z">
         <w:r>
           <w:t xml:space="preserve">the</w:t>
         </w:r>
@@ -3648,12 +3648,12 @@
       <w:r>
         <w:t xml:space="preserve"> </w:t>
       </w:r>
-      <w:del w:id="10524" w:author="Revision merge (HM+PL)" w:date="2026-09-09T13:15:15Z">
+      <w:del w:id="10524" w:author="Revision merge (HM+PL)" w:date="2026-09-09T13:17:57Z">
         <w:r>
           <w:delText xml:space="preserve">own</w:delText>
         </w:r>
       </w:del>
-      <w:ins w:id="10525" w:author="Revision merge (HM+PL)" w:date="2026-09-09T13:15:15Z">
+      <w:ins w:id="10525" w:author="Revision merge (HM+PL)" w:date="2026-09-09T13:17:57Z">
         <w:r>
           <w:t xml:space="preserve">pipeline generates</w:t>
         </w:r>
@@ -3661,12 +3661,12 @@
       <w:r>
         <w:t xml:space="preserve"> alpha </w:t>
       </w:r>
-      <w:del w:id="10526" w:author="Revision merge (HM+PL)" w:date="2026-09-09T13:15:15Z">
+      <w:del w:id="10526" w:author="Revision merge (HM+PL)" w:date="2026-09-09T13:17:57Z">
         <w:r>
           <w:delText xml:space="preserve">diversity,</w:delText>
         </w:r>
       </w:del>
-      <w:ins w:id="10527" w:author="Revision merge (HM+PL)" w:date="2026-09-09T13:15:15Z">
+      <w:ins w:id="10527" w:author="Revision merge (HM+PL)" w:date="2026-09-09T13:17:57Z">
         <w:r>
           <w:t xml:space="preserve">diversity metrics,</w:t>
         </w:r>
@@ -3674,12 +3674,12 @@
       <w:r>
         <w:t xml:space="preserve"> Venn </w:t>
       </w:r>
-      <w:del w:id="10528" w:author="Revision merge (HM+PL)" w:date="2026-09-09T13:15:15Z">
+      <w:del w:id="10528" w:author="Revision merge (HM+PL)" w:date="2026-09-09T13:17:57Z">
         <w:r>
           <w:delText xml:space="preserve">diagram,</w:delText>
         </w:r>
       </w:del>
-      <w:ins w:id="10529" w:author="Revision merge (HM+PL)" w:date="2026-09-09T13:15:15Z">
+      <w:ins w:id="10529" w:author="Revision merge (HM+PL)" w:date="2026-09-09T13:17:57Z">
         <w:r>
           <w:t xml:space="preserve">diagrams,</w:t>
         </w:r>
@@ -3695,7 +3695,7 @@
       <w:r>
         <w:t xml:space="preserve">(5) *Integration, reporting and manifest* (R/12–R/14).</w:t>
       </w:r>
-      <w:ins w:id="10530" w:author="Revision merge (HM+PL)" w:date="2026-09-09T13:15:15Z">
+      <w:ins w:id="10530" w:author="Revision merge (HM+PL)" w:date="2026-09-09T13:17:57Z">
         <w:r>
           <w:t xml:space="preserve"> The final stage integrates results across all domains and produces the reporting outputs.</w:t>
         </w:r>
@@ -3711,12 +3711,12 @@
       <w:r>
         <w:t xml:space="preserve">**Reporting.** </w:t>
       </w:r>
-      <w:del w:id="10531" w:author="Revision merge (HM+PL)" w:date="2026-09-09T13:15:15Z">
+      <w:del w:id="10531" w:author="Revision merge (HM+PL)" w:date="2026-09-09T13:17:57Z">
         <w:r>
           <w:delText xml:space="preserve">The</w:delText>
         </w:r>
       </w:del>
-      <w:ins w:id="10532" w:author="Revision merge (HM+PL)" w:date="2026-09-09T13:15:15Z">
+      <w:ins w:id="10532" w:author="Revision merge (HM+PL)" w:date="2026-09-09T13:17:57Z">
         <w:r>
           <w:t xml:space="preserve">Results are rendered through a</w:t>
         </w:r>
@@ -3724,7 +3724,7 @@
       <w:r>
         <w:t xml:space="preserve"> Quarto template</w:t>
       </w:r>
-      <w:del w:id="10533" w:author="Revision merge (HM+PL)" w:date="2026-09-09T13:15:15Z">
+      <w:del w:id="10533" w:author="Revision merge (HM+PL)" w:date="2026-09-09T13:17:57Z">
         <w:r>
           <w:delText xml:space="preserve"> renders all outputs</w:delText>
         </w:r>
@@ -3732,12 +3732,12 @@
       <w:r>
         <w:t xml:space="preserve"> as a multi-page HTML dashboard </w:t>
       </w:r>
-      <w:del w:id="10534" w:author="Revision merge (HM+PL)" w:date="2026-09-09T13:15:15Z">
+      <w:del w:id="10534" w:author="Revision merge (HM+PL)" w:date="2026-09-09T13:17:57Z">
         <w:r>
           <w:delText xml:space="preserve">with</w:delText>
         </w:r>
       </w:del>
-      <w:ins w:id="10535" w:author="Revision merge (HM+PL)" w:date="2026-09-09T13:15:15Z">
+      <w:ins w:id="10535" w:author="Revision merge (HM+PL)" w:date="2026-09-09T13:17:57Z">
         <w:r>
           <w:t xml:space="preserve">containing</w:t>
         </w:r>
@@ -3745,12 +3745,12 @@
       <w:r>
         <w:t xml:space="preserve"> </w:t>
       </w:r>
-      <w:del w:id="10536" w:author="Revision merge (HM+PL)" w:date="2026-09-09T13:15:15Z">
+      <w:del w:id="10536" w:author="Revision merge (HM+PL)" w:date="2026-09-09T13:17:57Z">
         <w:r>
           <w:delText xml:space="preserve">per-domain</w:delText>
         </w:r>
       </w:del>
-      <w:ins w:id="10537" w:author="Revision merge (HM+PL)" w:date="2026-09-09T13:15:15Z">
+      <w:ins w:id="10537" w:author="Revision merge (HM+PL)" w:date="2026-09-09T13:17:57Z">
         <w:r>
           <w:t xml:space="preserve">dedicated</w:t>
         </w:r>
@@ -3758,12 +3758,12 @@
       <w:r>
         <w:t xml:space="preserve"> panels </w:t>
       </w:r>
-      <w:del w:id="10538" w:author="Revision merge (HM+PL)" w:date="2026-09-09T13:15:15Z">
+      <w:del w:id="10538" w:author="Revision merge (HM+PL)" w:date="2026-09-09T13:17:57Z">
         <w:r>
           <w:delText xml:space="preserve">(taxonomy,</w:delText>
         </w:r>
       </w:del>
-      <w:ins w:id="10539" w:author="Revision merge (HM+PL)" w:date="2026-09-09T13:15:15Z">
+      <w:ins w:id="10539" w:author="Revision merge (HM+PL)" w:date="2026-09-09T13:17:57Z">
         <w:r>
           <w:t xml:space="preserve">for taxonomy,</w:t>
         </w:r>
@@ -3771,12 +3771,12 @@
       <w:r>
         <w:t xml:space="preserve"> diversity, differential abundance, resistome, virulome, </w:t>
       </w:r>
-      <w:del w:id="10540" w:author="Revision merge (HM+PL)" w:date="2026-09-09T13:15:15Z">
+      <w:del w:id="10540" w:author="Revision merge (HM+PL)" w:date="2026-09-09T13:17:57Z">
         <w:r>
           <w:delText xml:space="preserve">mobilome, network)</w:delText>
         </w:r>
       </w:del>
-      <w:ins w:id="10541" w:author="Revision merge (HM+PL)" w:date="2026-09-09T13:15:15Z">
+      <w:ins w:id="10541" w:author="Revision merge (HM+PL)" w:date="2026-09-09T13:17:57Z">
         <w:r>
           <w:t xml:space="preserve">mobilome</w:t>
         </w:r>
@@ -3784,7 +3784,7 @@
       <w:r>
         <w:t xml:space="preserve"> and</w:t>
       </w:r>
-      <w:ins w:id="10542" w:author="Revision merge (HM+PL)" w:date="2026-09-09T13:15:15Z">
+      <w:ins w:id="10542" w:author="Revision merge (HM+PL)" w:date="2026-09-09T13:17:57Z">
         <w:r>
           <w:t xml:space="preserve"> network, plus</w:t>
         </w:r>
@@ -3792,7 +3792,7 @@
       <w:r>
         <w:t xml:space="preserve"> embedded download links. Dependencies are pinned via `renv`, and the project requires R ≥ 4.5; external command-line tools (Kraken2, Bracken, ABRicate, Re-centrifuge) are assumed to have been run upstream.</w:t>
       </w:r>
-      <w:ins w:id="10543" w:author="Revision merge (HM+PL)" w:date="2026-09-09T13:15:15Z">
+      <w:ins w:id="10543" w:author="Revision merge (HM+PL)" w:date="2026-09-09T13:17:57Z">
         <w:r>
           <w:t xml:space="preserve"> Because MERIDIAN consumes these pre-computed outputs rather than the raw reads, its own footprint is modest and single-threaded (peaking at ~1.5 GB; Section 3), and is therefore decoupled from the substantial memory required by upstream taxonomic classification (for example, a full Kraken2 database), which can be run separately on high-memory or cloud infrastructure.</w:t>
         </w:r>
@@ -3820,12 +3820,12 @@
       <w:r>
         <w:t xml:space="preserve">We </w:t>
       </w:r>
-      <w:del w:id="10544" w:author="Revision merge (HM+PL)" w:date="2026-09-09T13:15:15Z">
+      <w:del w:id="10544" w:author="Revision merge (HM+PL)" w:date="2026-09-09T13:17:57Z">
         <w:r>
           <w:delText xml:space="preserve">are validating</w:delText>
         </w:r>
       </w:del>
-      <w:ins w:id="10545" w:author="Revision merge (HM+PL)" w:date="2026-09-09T13:15:15Z">
+      <w:ins w:id="10545" w:author="Revision merge (HM+PL)" w:date="2026-09-09T13:17:57Z">
         <w:r>
           <w:t xml:space="preserve">validated</w:t>
         </w:r>
@@ -3833,7 +3833,7 @@
       <w:r>
         <w:t xml:space="preserve"> the pipeline against two </w:t>
       </w:r>
-      <w:del w:id="10546" w:author="Revision merge (HM+PL)" w:date="2026-09-09T13:15:15Z">
+      <w:del w:id="10546" w:author="Revision merge (HM+PL)" w:date="2026-09-09T13:17:57Z">
         <w:r>
           <w:delText xml:space="preserve">real </w:delText>
         </w:r>
@@ -3841,12 +3841,12 @@
       <w:r>
         <w:t xml:space="preserve">long-read chicken caecum </w:t>
       </w:r>
-      <w:del w:id="10547" w:author="Revision merge (HM+PL)" w:date="2026-09-09T13:15:15Z">
+      <w:del w:id="10547" w:author="Revision merge (HM+PL)" w:date="2026-09-09T13:17:57Z">
         <w:r>
           <w:delText xml:space="preserve">metagenomics</w:delText>
         </w:r>
       </w:del>
-      <w:ins w:id="10548" w:author="Revision merge (HM+PL)" w:date="2026-09-09T13:15:15Z">
+      <w:ins w:id="10548" w:author="Revision merge (HM+PL)" w:date="2026-09-09T13:17:57Z">
         <w:r>
           <w:t xml:space="preserve">metagenomic</w:t>
         </w:r>
@@ -3854,12 +3854,12 @@
       <w:r>
         <w:t xml:space="preserve"> studies. The </w:t>
       </w:r>
-      <w:del w:id="10549" w:author="Revision merge (HM+PL)" w:date="2026-09-09T13:15:15Z">
+      <w:del w:id="10549" w:author="Revision merge (HM+PL)" w:date="2026-09-09T13:17:57Z">
         <w:r>
           <w:delText xml:space="preserve">reference</w:delText>
         </w:r>
       </w:del>
-      <w:ins w:id="10550" w:author="Revision merge (HM+PL)" w:date="2026-09-09T13:15:15Z">
+      <w:ins w:id="10550" w:author="Revision merge (HM+PL)" w:date="2026-09-09T13:17:57Z">
         <w:r>
           <w:t xml:space="preserve">primary</w:t>
         </w:r>
@@ -3867,12 +3867,12 @@
       <w:r>
         <w:t xml:space="preserve"> </w:t>
       </w:r>
-      <w:del w:id="10551" w:author="Revision merge (HM+PL)" w:date="2026-09-09T13:15:15Z">
+      <w:del w:id="10551" w:author="Revision merge (HM+PL)" w:date="2026-09-09T13:17:57Z">
         <w:r>
           <w:delText xml:space="preserve">cohort</w:delText>
         </w:r>
       </w:del>
-      <w:ins w:id="10552" w:author="Revision merge (HM+PL)" w:date="2026-09-09T13:15:15Z">
+      <w:ins w:id="10552" w:author="Revision merge (HM+PL)" w:date="2026-09-09T13:17:57Z">
         <w:r>
           <w:t xml:space="preserve">dataset</w:t>
         </w:r>
@@ -3880,7 +3880,7 @@
       <w:r>
         <w:t xml:space="preserve"> (`Chicken batch 1`, PC_JC_2024-11-29; 18 samples; 3 dietary groups — Dulse, Reference diet, Soyabean meal) </w:t>
       </w:r>
-      <w:ins w:id="10553" w:author="Revision merge (HM+PL)" w:date="2026-09-09T13:15:15Z">
+      <w:ins w:id="10553" w:author="Revision merge (HM+PL)" w:date="2026-09-09T13:17:57Z">
         <w:r>
           <w:t xml:space="preserve">is publicly available under NCBI BioProject PRJNA1406192 and </w:t>
         </w:r>
@@ -3888,12 +3888,12 @@
       <w:r>
         <w:t xml:space="preserve">has approximately 46 hand-edited R scripts </w:t>
       </w:r>
-      <w:del w:id="10554" w:author="Revision merge (HM+PL)" w:date="2026-09-09T13:15:15Z">
+      <w:del w:id="10554" w:author="Revision merge (HM+PL)" w:date="2026-09-09T13:17:57Z">
         <w:r>
           <w:delText xml:space="preserve">and</w:delText>
         </w:r>
       </w:del>
-      <w:ins w:id="10555" w:author="Revision merge (HM+PL)" w:date="2026-09-09T13:15:15Z">
+      <w:ins w:id="10555" w:author="Revision merge (HM+PL)" w:date="2026-09-09T13:17:57Z">
         <w:r>
           <w:t xml:space="preserve">with</w:t>
         </w:r>
@@ -3901,12 +3901,12 @@
       <w:r>
         <w:t xml:space="preserve"> </w:t>
       </w:r>
-      <w:del w:id="10556" w:author="Revision merge (HM+PL)" w:date="2026-09-09T13:15:15Z">
+      <w:del w:id="10556" w:author="Revision merge (HM+PL)" w:date="2026-09-09T13:17:57Z">
         <w:r>
           <w:delText xml:space="preserve">known-good</w:delText>
         </w:r>
       </w:del>
-      <w:ins w:id="10557" w:author="Revision merge (HM+PL)" w:date="2026-09-09T13:15:15Z">
+      <w:ins w:id="10557" w:author="Revision merge (HM+PL)" w:date="2026-09-09T13:17:57Z">
         <w:r>
           <w:t xml:space="preserve">corresponding validated</w:t>
         </w:r>
@@ -3914,12 +3914,12 @@
       <w:r>
         <w:t xml:space="preserve"> figures and </w:t>
       </w:r>
-      <w:del w:id="10558" w:author="Revision merge (HM+PL)" w:date="2026-09-09T13:15:15Z">
+      <w:del w:id="10558" w:author="Revision merge (HM+PL)" w:date="2026-09-09T13:17:57Z">
         <w:r>
           <w:delText xml:space="preserve">tables already in place,</w:delText>
         </w:r>
       </w:del>
-      <w:ins w:id="10559" w:author="Revision merge (HM+PL)" w:date="2026-09-09T13:15:15Z">
+      <w:ins w:id="10559" w:author="Revision merge (HM+PL)" w:date="2026-09-09T13:17:57Z">
         <w:r>
           <w:t xml:space="preserve">tables,</w:t>
         </w:r>
@@ -3927,12 +3927,12 @@
       <w:r>
         <w:t xml:space="preserve"> so each stage can be compared output-for-output against the corresponding ground-truth artefact. The </w:t>
       </w:r>
-      <w:del w:id="10560" w:author="Revision merge (HM+PL)" w:date="2026-09-09T13:15:15Z">
+      <w:del w:id="10560" w:author="Revision merge (HM+PL)" w:date="2026-09-09T13:17:57Z">
         <w:r>
           <w:delText xml:space="preserve">scaling</w:delText>
         </w:r>
       </w:del>
-      <w:ins w:id="10561" w:author="Revision merge (HM+PL)" w:date="2026-09-09T13:15:15Z">
+      <w:ins w:id="10561" w:author="Revision merge (HM+PL)" w:date="2026-09-09T13:17:57Z">
         <w:r>
           <w:t xml:space="preserve">second</w:t>
         </w:r>
@@ -3940,12 +3940,12 @@
       <w:r>
         <w:t xml:space="preserve"> </w:t>
       </w:r>
-      <w:del w:id="10562" w:author="Revision merge (HM+PL)" w:date="2026-09-09T13:15:15Z">
+      <w:del w:id="10562" w:author="Revision merge (HM+PL)" w:date="2026-09-09T13:17:57Z">
         <w:r>
           <w:delText xml:space="preserve">and feature-coverage cohort</w:delText>
         </w:r>
       </w:del>
-      <w:ins w:id="10563" w:author="Revision merge (HM+PL)" w:date="2026-09-09T13:15:15Z">
+      <w:ins w:id="10563" w:author="Revision merge (HM+PL)" w:date="2026-09-09T13:17:57Z">
         <w:r>
           <w:t xml:space="preserve">dataset</w:t>
         </w:r>
@@ -3953,12 +3953,12 @@
       <w:r>
         <w:t xml:space="preserve"> (`Chicken batch 2`, JC_FL_2025-05-20; 32 </w:t>
       </w:r>
-      <w:del w:id="10564" w:author="Revision merge (HM+PL)" w:date="2026-09-09T13:15:15Z">
+      <w:del w:id="10564" w:author="Revision merge (HM+PL)" w:date="2026-09-09T13:17:57Z">
         <w:r>
           <w:delText xml:space="preserve">samples;</w:delText>
         </w:r>
       </w:del>
-      <w:ins w:id="10565" w:author="Revision merge (HM+PL)" w:date="2026-09-09T13:15:15Z">
+      <w:ins w:id="10565" w:author="Revision merge (HM+PL)" w:date="2026-09-09T13:17:57Z">
         <w:r>
           <w:t xml:space="preserve">samples), for which public release is pending publication of the associated study, was used for scalability and feature coverage: samples were organised into a</w:t>
         </w:r>
@@ -3966,12 +3966,12 @@
       <w:r>
         <w:t xml:space="preserve"> 4-level composite `Treatment_Bird` grouping </w:t>
       </w:r>
-      <w:del w:id="10566" w:author="Revision merge (HM+PL)" w:date="2026-09-09T13:15:15Z">
+      <w:del w:id="10566" w:author="Revision merge (HM+PL)" w:date="2026-09-09T13:17:57Z">
         <w:r>
           <w:delText xml:space="preserve">— Control_W4,</w:delText>
         </w:r>
       </w:del>
-      <w:ins w:id="10567" w:author="Revision merge (HM+PL)" w:date="2026-09-09T13:15:15Z">
+      <w:ins w:id="10567" w:author="Revision merge (HM+PL)" w:date="2026-09-09T13:17:57Z">
         <w:r>
           <w:t xml:space="preserve">(Control_W4,</w:t>
         </w:r>
@@ -3979,12 +3979,12 @@
       <w:r>
         <w:t xml:space="preserve"> Control_W5, Dulse_W4, Dulse_W5) </w:t>
       </w:r>
-      <w:del w:id="10568" w:author="Revision merge (HM+PL)" w:date="2026-09-09T13:15:15Z">
+      <w:del w:id="10568" w:author="Revision merge (HM+PL)" w:date="2026-09-09T13:17:57Z">
         <w:r>
           <w:delText xml:space="preserve">exercises</w:delText>
         </w:r>
       </w:del>
-      <w:ins w:id="10569" w:author="Revision merge (HM+PL)" w:date="2026-09-09T13:15:15Z">
+      <w:ins w:id="10569" w:author="Revision merge (HM+PL)" w:date="2026-09-09T13:17:57Z">
         <w:r>
           <w:t xml:space="preserve">with</w:t>
         </w:r>
@@ -4141,7 +4141,7 @@
       <w:pPr>
         <w:spacing w:after="120"/>
       </w:pPr>
-      <w:del w:id="10570" w:author="Revision merge (HM+PL)" w:date="2026-09-09T13:15:15Z">
+      <w:del w:id="10570" w:author="Revision merge (HM+PL)" w:date="2026-09-09T13:17:57Z">
         <w:r>
           <w:delText xml:space="preserve">Across both cohorts (**Table 1**), every enabled stage produced its expected primary artefact under identical settings. Feature counts scale with cohort size and grouping complexity: B2 (n=32, 4-level `Treatment_Bird`) yields ~1.5–2× the resistome (648 vs 348 rows), virulome (492 vs 320) and mobilome (137 vs 65) rows of B1, with 53 vs 31 differentially abundant taxa across 6 vs 3 pairwise contrasts and a denser integrated network (576 edges/210 nodes/modularity 0.40 vs 247/100/0.31). The pipeline closes cleanly on both runs, producing a contract-v1.2 `manifest.json` (~80–85 kB) and a Quarto HTML dashboard (~14–18 MB). The performance profile (**Figure 2**) illustrated that the end-to-end runtime grew from 6m 41s on B1 to 8m 19s on B2 (+24 %, sublinear in both sample count and pairwise-contrast count), dominated on both cohorts by ALDEx2 differential abundance (32 % of B1 total, 40 % of B2). Peak R-process memory tracks the same monotone profile — climbing through the gene-element domains as the joint long-form `(sample × gene)` tables grow (~1 GB plateau) and tops out during R/13 panel assembly (1.33 GB on B1, 1.51 GB on B2), where every domain's PNGs and tables are loaded simultaneously to lay out; the `report` stage's modest peak (~0.6 GB) reflects work delegated to the external Quarto process.</w:delText>
         </w:r>
@@ -4151,7 +4151,7 @@
       <w:pPr>
         <w:spacing w:after="120"/>
       </w:pPr>
-      <w:del w:id="10571" w:author="Revision merge (HM+PL)" w:date="2026-09-09T13:15:15Z">
+      <w:del w:id="10571" w:author="Revision merge (HM+PL)" w:date="2026-09-09T13:17:57Z">
         <w:r>
           <w:delText xml:space="preserve">[FIGURE] **Figure 2.** Pipeline performance on the two validation cohorts. (A) Per-stage wall time (log scale) and (B) peak R-process heap, sorted by B2 runtime. (C) Cumulative wall time and (D) running peak memory in pipeline order. R 4.5.0 single-thread analysis, including PERMANOVA 9999 permutations, ALDEx2 `mc.samples` = 128. B1 = Chicken batch 1 (n=18, 3 dietary groups); B2 = Chicken batch 2 (n=32, 4-level `Treatment_Bird`, `block` random effect, two negative controls).</w:delText>
         </w:r>
@@ -4161,7 +4161,7 @@
       <w:pPr>
         <w:spacing w:after="120"/>
       </w:pPr>
-      <w:del w:id="10572" w:author="Revision merge (HM+PL)" w:date="2026-09-09T13:15:15Z">
+      <w:del w:id="10572" w:author="Revision merge (HM+PL)" w:date="2026-09-09T13:17:57Z">
         <w:r>
           <w:delText xml:space="preserve">One expected and deliberate divergence concerns the resistome stage: the ground-truth `cleanData.R` misparses taxids carrying variant suffixes, dropping the corresponding ABRicate rows. R/02 fixes this parsing bug, so the pipeline retains 110 additional (sample, GENE) rows relative to the hand-edited output (`scripts/diff_normdata.R` on the 2026-06-23 B1 run: pipeline = 733 rows, ground truth = 623; 121 rows gained by the parsing fix, 11 rows present in the ground truth that the pipeline currently drops — concentrated in a handful of plasmid replicon and accessory resistance calls, queued for inspection rather than treated as a regression). Jaccard agreement on the `(sample, GENE)` key set is 0.82. Across the other stages with directly comparable ground-truth artefacts, sample-set agreement is exact for alpha diversity (18/18), and Jaccard for the network Gephi exports against the most recent hand-edited snapshot is 0.85 (nodes) and 0.87 (edges). Per-stage comparisons against the remaining hand-edited artefacts — taxonomy, beta diversity, and differential abundance — are deferred to a separate validation effort. The Re-centrifuge column-slicing heuristic in R/02 is acknowledged as still coarse and is queued for rework.</w:delText>
         </w:r>
@@ -4171,7 +4171,7 @@
       <w:pPr>
         <w:spacing w:after="120"/>
       </w:pPr>
-      <w:ins w:id="10573" w:author="Revision merge (HM+PL)" w:date="2026-09-09T13:15:15Z">
+      <w:ins w:id="10573" w:author="Revision merge (HM+PL)" w:date="2026-09-09T13:17:57Z">
         <w:r>
           <w:t xml:space="preserve">Across both datasets (**Table 1**), every enabled stage produced its expected primary artefact under identical settings. Feature counts scale with cohort size and grouping complexity: B2 (n=32, 4-level `Treatment_Bird`) yields ~1.5–2× the resistome (648 vs 348 rows), virulome (492 vs 320) and mobilome (137 vs 65) rows of B1, with 53 vs 31 differentially abundant taxa across 6 vs 3 pairwise contrasts and a denser integrated network (576 edges/210 nodes/modularity 0.40 vs 247/100/0.31). The pipeline closes cleanly on both runs, producing a contract-v1.2 `manifest.json` (~80–85 kB) and a Quarto HTML dashboard (~14–18 MB). The performance profile (**Figure 2**) illustrated that the end-to-end runtime grew from 6m 41s on B1 to 8m 19s on B2 (+24 %, sublinear in both sample count and pairwise-contrast count), dominated on both cohorts by ALDEx2 differential abundance (32 % of B1 total, 40 % of B2). Peak R-process memory tracks the same monotone profile, climbing through the gene-element domains as the joint long-form `(sample × gene)` tables grow (~1 GB plateau) and tops out during R/13 panel assembly (1.33 GB on B1, 1.51 GB on B2), where every domain's PNGs and tables are loaded simultaneously to lay out; the `report` stage's modest peak (~0.6 GB) reflects work delegated to the external Quarto process.</w:t>
         </w:r>
@@ -4181,7 +4181,7 @@
       <w:pPr>
         <w:spacing w:after="120"/>
       </w:pPr>
-      <w:ins w:id="10574" w:author="Revision merge (HM+PL)" w:date="2026-09-09T13:15:15Z">
+      <w:ins w:id="10574" w:author="Revision merge (HM+PL)" w:date="2026-09-09T13:17:57Z">
         <w:r>
           <w:t xml:space="preserve">[FIGURE] **Figure 2.** Pipeline performance across four long-read metagenomic cohorts. (A) Per-stage wall time (log scale) and (B) peak R-process heap, sorted by B2 runtime. (C) Cumulative wall time and (D) running peak memory in pipeline order. R 4.5.0 single-thread analysis, including PERMANOVA 9999 permutations, ALDEx2 `mc.samples` = 128. B1 = Chicken batch 1 (n=18, 3 dietary groups); B2 = Chicken batch 2 (n=32, 4-level `Treatment_Bird`, `block` random effect, two negative controls); HW = Egyptian hospital wastewater (n=20); WL = East Atlantic Flyway wetlands (n=24).</w:t>
         </w:r>
@@ -4191,7 +4191,7 @@
       <w:pPr>
         <w:spacing w:after="120"/>
       </w:pPr>
-      <w:ins w:id="10575" w:author="Revision merge (HM+PL)" w:date="2026-09-09T13:15:15Z">
+      <w:ins w:id="10575" w:author="Revision merge (HM+PL)" w:date="2026-09-09T13:17:57Z">
         <w:r>
           <w:t xml:space="preserve">One anticipated and deliberate discrepancy arises at the resistome stage: the ground-truth `cleanData.R` misparses taxids carrying variant suffixes, dropping the corresponding ABRicate rows. R/02 corrects this parsing issue, so the pipeline retains 110 additional (sample, GENE) rows relative to the hand-edited output (`scripts/diff_normdata.R` on the 2026-06-23 B1 run: pipeline = 733 rows, ground truth = 623; 121 rows recovered by the parsing correction, and 11 rows present in the ground truth that the pipeline currently drops, concentrated in a handful of plasmid replicon and accessory resistance calls, queued for inspection rather than treated as a regression). Jaccard agreement on the `(sample, GENE)` key set is 0.82. For other stages with directly comparable ground-truth artefacts, sample-set agreement is exact for alpha diversity (18/18), and Jaccard for the network Gephi exports against the most recent hand-edited snapshot is 0.85 (nodes) and 0.87 (edges). Per-stage comparisons against the remaining hand-edited artefacts — taxonomy, beta diversity, and differential abundance — are deferred to a separate validation effort. The Re-centrifuge column-slicing heuristic in R/02 is acknowledged as still coarse and is queued for rework.</w:t>
         </w:r>
@@ -4201,17 +4201,17 @@
       <w:pPr>
         <w:spacing w:after="120"/>
       </w:pPr>
-      <w:ins w:id="10576" w:author="Revision merge (HM+PL)" w:date="2026-09-09T13:15:15Z">
-        <w:r>
-          <w:t xml:space="preserve">To assess portability beyond the development cohorts, we applied MERIDIAN unmodified — changing only `config.yaml` — to two independent, publicly available long-read (ONT) metagenomic studies spanning the One Health continuum: hospital wastewater versus tap water from five Egyptian hospitals (NCBI BioProject PRJNA1266479; 20 samples) and anthropogenically impacted versus natural wetland sites along the East Atlantic Flyway (ENA BioProject PRJEB96272; 24 samples). Both cohorts completed all fifteen stages in a single run (4m 08s and 7m 37s; peak 2.0 and 3.6 GB), each emitting a Quarto dashboard, publication panels and a contract-v1.2 `manifest.json`. The pipeline recovered biologically coherent structure: hospital wastewater was significantly richer and compositionally distinct from tap water (PERMANOVA R² = 0.18, p = 3 × 10⁻⁴), and wetland virulence-factor load was higher at anthropogenically impacted than natural sites across the flyway (PERMANOVA R² = 0.088, p_adj = 0.037; functional profiles available for 23 of 24 samples). Both datasets also exercised edge cases absent from the chicken cohorts — a single-group resistome/mobilome in the hospital cohort (tap water carried essentially no ARGs) and an absence of plasmid replicons in the wetland water (PlasmidFinder), consistent with the source study — which the pipeline handled by skipping the affected sub-analyses with logged notices rather than failing. As these datasets lack hand-curated ground-truth artefacts, they demonstrate portability and robustness across sample types rather than output-for-output correctness.</w:t>
-        </w:r>
-      </w:ins>
-    </w:p>
-    <w:p>
-      <w:pPr>
-        <w:spacing w:after="120"/>
-      </w:pPr>
-      <w:ins w:id="10577" w:author="Revision merge (HM+PL)" w:date="2026-09-09T13:15:15Z">
+      <w:ins w:id="10576" w:author="Revision merge (HM+PL)" w:date="2026-09-09T13:17:57Z">
+        <w:r>
+          <w:t xml:space="preserve">To assess portability beyond the development cohorts, we applied MERIDIAN unmodified — changing only `config.yaml` — to two independent, publicly available long-read (ONT) metagenomic studies spanning the One Health continuum: hospital wastewater versus tap water from five Egyptian hospitals (NCBI BioProject PRJNA1266479; 20 samples) and anthropogenically impacted versus natural wetland sites along the East Atlantic Flyway (ENA BioProject PRJEB96272; 24 samples). Both cohorts completed all fifteen stages in a single run (4m 08s and 7m 37s; peak 2.0 and 3.6 GB), each emitting a Quarto dashboard, publication panels and a contract-v1.2 `manifest.json`. The pipeline recovered biologically coherent structure: hospital wastewater was significantly richer and compositionally distinct from tap water (PERMANOVA R² = 0.18, p = 3 × 10⁻⁴), and wetland virulence-factor load was higher at anthropogenically impacted than natural sites across the flyway (PERMANOVA R² = 0.088, p_adj = 0.037; functional profiles available for 23 of 24 samples). Both datasets also exercised edge cases absent from the chicken cohorts — a single-group resistome/mobilome in the hospital cohort (tap water carried essentially no ARGs) and a near-absence of plasmid replicons in the wetland water (a single IncP1 hit via PlasmidFinder, too sparse to profile), consistent with the source study — which the pipeline handled by skipping the affected sub-analyses with logged notices rather than failing. As these datasets lack hand-curated ground-truth artefacts, they demonstrate portability and robustness across sample types rather than output-for-output correctness.</w:t>
+        </w:r>
+      </w:ins>
+    </w:p>
+    <w:p>
+      <w:pPr>
+        <w:spacing w:after="120"/>
+      </w:pPr>
+      <w:ins w:id="10577" w:author="Revision merge (HM+PL)" w:date="2026-09-09T13:17:57Z">
         <w:r>
           <w:t xml:space="preserve">**Table S1.** MERIDIAN applied across four long-read metagenomic cohorts spanning the One Health continuum. B1/B2 are the poultry development cohorts; the Egyptian hospital-wastewater and East Atlantic Flyway wetland cohorts are independent public datasets analysed with configuration changes only.</w:t>
         </w:r>
@@ -4221,7 +4221,7 @@
       <w:pPr>
         <w:spacing w:after="120"/>
       </w:pPr>
-      <w:ins w:id="10578" w:author="Revision merge (HM+PL)" w:date="2026-09-09T13:15:15Z">
+      <w:ins w:id="10578" w:author="Revision merge (HM+PL)" w:date="2026-09-09T13:17:57Z">
         <w:r>
           <w:t xml:space="preserve">| Cohort | One Health axis | n | Primary contrast | Runtime | Peak RAM | Headline result |</w:t>
         </w:r>
@@ -4231,7 +4231,7 @@
       <w:pPr>
         <w:spacing w:after="120"/>
       </w:pPr>
-      <w:ins w:id="10579" w:author="Revision merge (HM+PL)" w:date="2026-09-09T13:15:15Z">
+      <w:ins w:id="10579" w:author="Revision merge (HM+PL)" w:date="2026-09-09T13:17:57Z">
         <w:r>
           <w:t xml:space="preserve">| --- | --- | --- | --- | --- | --- | --- |</w:t>
         </w:r>
@@ -4241,7 +4241,7 @@
       <w:pPr>
         <w:spacing w:after="120"/>
       </w:pPr>
-      <w:ins w:id="10580" w:author="Revision merge (HM+PL)" w:date="2026-09-09T13:15:15Z">
+      <w:ins w:id="10580" w:author="Revision merge (HM+PL)" w:date="2026-09-09T13:17:57Z">
         <w:r>
           <w:t xml:space="preserve">| Chicken batch 1 | Livestock (poultry caecum) | 18 | Diet (3 groups) | 6m 41s | 1.33 GB | Ground-truth reference; R/02 parsing fix recovers 110 (sample, GENE) rows |</w:t>
         </w:r>
@@ -4251,7 +4251,7 @@
       <w:pPr>
         <w:spacing w:after="120"/>
       </w:pPr>
-      <w:ins w:id="10581" w:author="Revision merge (HM+PL)" w:date="2026-09-09T13:15:15Z">
+      <w:ins w:id="10581" w:author="Revision merge (HM+PL)" w:date="2026-09-09T13:17:57Z">
         <w:r>
           <w:t xml:space="preserve">| Chicken batch 2 | Livestock (poultry caecum) | 32 | Treatment × week (4-level) | 8m 19s | 1.51 GB | Sublinear scaling; denser integrated network |</w:t>
         </w:r>
@@ -4261,7 +4261,7 @@
       <w:pPr>
         <w:spacing w:after="120"/>
       </w:pPr>
-      <w:ins w:id="10582" w:author="Revision merge (HM+PL)" w:date="2026-09-09T13:15:15Z">
+      <w:ins w:id="10582" w:author="Revision merge (HM+PL)" w:date="2026-09-09T13:17:57Z">
         <w:r>
           <w:t xml:space="preserve">| Hospital wastewater (EG) | Human-clinical + built environment | 20 | Wastewater vs tap water | 4m 08s | 1.98 GB | Wastewater richer and compositionally distinct (PERMANOVA R² = 0.18, p = 3 × 10⁻⁴) |</w:t>
         </w:r>
@@ -4271,7 +4271,7 @@
       <w:pPr>
         <w:spacing w:after="120"/>
       </w:pPr>
-      <w:ins w:id="10583" w:author="Revision merge (HM+PL)" w:date="2026-09-09T13:15:15Z">
+      <w:ins w:id="10583" w:author="Revision merge (HM+PL)" w:date="2026-09-09T13:17:57Z">
         <w:r>
           <w:t xml:space="preserve">| Wetlands (E. Atlantic Flyway) | Wildlife + environment | 24 | Impacted vs natural | 7m 37s | 3.59 GB | Higher virulome load at impacted sites (PERMANOVA R² = 0.088, p_adj = 0.037) |</w:t>
         </w:r>
@@ -4299,12 +4299,12 @@
       <w:r>
         <w:t xml:space="preserve">MERIDIAN </w:t>
       </w:r>
-      <w:del w:id="10584" w:author="Revision merge (HM+PL)" w:date="2026-09-09T13:15:15Z">
+      <w:del w:id="10584" w:author="Revision merge (HM+PL)" w:date="2026-09-09T13:17:57Z">
         <w:r>
           <w:delText xml:space="preserve">consolidates</w:delText>
         </w:r>
       </w:del>
-      <w:ins w:id="10585" w:author="Revision merge (HM+PL)" w:date="2026-09-09T13:15:15Z">
+      <w:ins w:id="10585" w:author="Revision merge (HM+PL)" w:date="2026-09-09T13:17:57Z">
         <w:r>
           <w:t xml:space="preserve">integrates</w:t>
         </w:r>
@@ -4312,12 +4312,12 @@
       <w:r>
         <w:t xml:space="preserve"> community analyses, functional profiling, and an integrated network reconstruction into </w:t>
       </w:r>
-      <w:del w:id="10586" w:author="Revision merge (HM+PL)" w:date="2026-09-09T13:15:15Z">
+      <w:del w:id="10586" w:author="Revision merge (HM+PL)" w:date="2026-09-09T13:17:57Z">
         <w:r>
           <w:delText xml:space="preserve">one</w:delText>
         </w:r>
       </w:del>
-      <w:ins w:id="10587" w:author="Revision merge (HM+PL)" w:date="2026-09-09T13:15:15Z">
+      <w:ins w:id="10587" w:author="Revision merge (HM+PL)" w:date="2026-09-09T13:17:57Z">
         <w:r>
           <w:t xml:space="preserve">a single</w:t>
         </w:r>
@@ -4325,12 +4325,12 @@
       <w:r>
         <w:t xml:space="preserve"> configuration-driven R </w:t>
       </w:r>
-      <w:del w:id="10588" w:author="Revision merge (HM+PL)" w:date="2026-09-09T13:15:15Z">
+      <w:del w:id="10588" w:author="Revision merge (HM+PL)" w:date="2026-09-09T13:17:57Z">
         <w:r>
           <w:delText xml:space="preserve">project</w:delText>
         </w:r>
       </w:del>
-      <w:ins w:id="10589" w:author="Revision merge (HM+PL)" w:date="2026-09-09T13:15:15Z">
+      <w:ins w:id="10589" w:author="Revision merge (HM+PL)" w:date="2026-09-09T13:17:57Z">
         <w:r>
           <w:t xml:space="preserve">workflow</w:t>
         </w:r>
@@ -4338,7 +4338,7 @@
       <w:r>
         <w:t xml:space="preserve"> for long-read shotgun metagenomics. Single-thread end-to-end execution completes in minutes with a low memory footprint, scaling sublinearly with cohort size and grouping complexity. </w:t>
       </w:r>
-      <w:ins w:id="10590" w:author="Revision merge (HM+PL)" w:date="2026-09-09T13:15:15Z">
+      <w:ins w:id="10590" w:author="Revision merge (HM+PL)" w:date="2026-09-09T13:17:57Z">
         <w:r>
           <w:t xml:space="preserve">Beyond the development cohorts, it has been applied without modification to two independent public cohorts spanning the One Health continuum (hospital wastewater and wetland surveillance). </w:t>
         </w:r>
@@ -4346,12 +4346,12 @@
       <w:r>
         <w:t xml:space="preserve">It is </w:t>
       </w:r>
-      <w:del w:id="10591" w:author="Revision merge (HM+PL)" w:date="2026-09-09T13:15:15Z">
+      <w:del w:id="10591" w:author="Revision merge (HM+PL)" w:date="2026-09-09T13:17:57Z">
         <w:r>
           <w:delText xml:space="preserve">in</w:delText>
         </w:r>
       </w:del>
-      <w:ins w:id="10592" w:author="Revision merge (HM+PL)" w:date="2026-09-09T13:15:15Z">
+      <w:ins w:id="10592" w:author="Revision merge (HM+PL)" w:date="2026-09-09T13:17:57Z">
         <w:r>
           <w:t xml:space="preserve">currently under</w:t>
         </w:r>
@@ -4359,12 +4359,12 @@
       <w:r>
         <w:t xml:space="preserve"> active </w:t>
       </w:r>
-      <w:del w:id="10593" w:author="Revision merge (HM+PL)" w:date="2026-09-09T13:15:15Z">
+      <w:del w:id="10593" w:author="Revision merge (HM+PL)" w:date="2026-09-09T13:17:57Z">
         <w:r>
           <w:delText xml:space="preserve">development;</w:delText>
         </w:r>
       </w:del>
-      <w:ins w:id="10594" w:author="Revision merge (HM+PL)" w:date="2026-09-09T13:15:15Z">
+      <w:ins w:id="10594" w:author="Revision merge (HM+PL)" w:date="2026-09-09T13:17:57Z">
         <w:r>
           <w:t xml:space="preserve">development, and</w:t>
         </w:r>
@@ -4372,12 +4372,12 @@
       <w:r>
         <w:t xml:space="preserve"> we are releasing this </w:t>
       </w:r>
-      <w:del w:id="10595" w:author="Revision merge (HM+PL)" w:date="2026-09-09T13:15:15Z">
+      <w:del w:id="10595" w:author="Revision merge (HM+PL)" w:date="2026-09-09T13:17:57Z">
         <w:r>
           <w:delText xml:space="preserve">alpha-stage</w:delText>
         </w:r>
       </w:del>
-      <w:ins w:id="10596" w:author="Revision merge (HM+PL)" w:date="2026-09-09T13:15:15Z">
+      <w:ins w:id="10596" w:author="Revision merge (HM+PL)" w:date="2026-09-09T13:17:57Z">
         <w:r>
           <w:t xml:space="preserve">alpha</w:t>
         </w:r>
@@ -4385,12 +4385,12 @@
       <w:r>
         <w:t xml:space="preserve"> </w:t>
       </w:r>
-      <w:del w:id="10597" w:author="Revision merge (HM+PL)" w:date="2026-09-09T13:15:15Z">
+      <w:del w:id="10597" w:author="Revision merge (HM+PL)" w:date="2026-09-09T13:17:57Z">
         <w:r>
           <w:delText xml:space="preserve">workflow</w:delText>
         </w:r>
       </w:del>
-      <w:ins w:id="10598" w:author="Revision merge (HM+PL)" w:date="2026-09-09T13:15:15Z">
+      <w:ins w:id="10598" w:author="Revision merge (HM+PL)" w:date="2026-09-09T13:17:57Z">
         <w:r>
           <w:t xml:space="preserve">version</w:t>
         </w:r>
@@ -4398,7 +4398,7 @@
       <w:r>
         <w:t xml:space="preserve"> (v0.1.0) </w:t>
       </w:r>
-      <w:del w:id="10599" w:author="Revision merge (HM+PL)" w:date="2026-09-09T13:15:15Z">
+      <w:del w:id="10599" w:author="Revision merge (HM+PL)" w:date="2026-09-09T13:17:57Z">
         <w:r>
           <w:delText xml:space="preserve">now </w:delText>
         </w:r>
@@ -4406,12 +4406,12 @@
       <w:r>
         <w:t xml:space="preserve">to </w:t>
       </w:r>
-      <w:del w:id="10600" w:author="Revision merge (HM+PL)" w:date="2026-09-09T13:15:15Z">
+      <w:del w:id="10600" w:author="Revision merge (HM+PL)" w:date="2026-09-09T13:17:57Z">
         <w:r>
           <w:delText xml:space="preserve">invite</w:delText>
         </w:r>
       </w:del>
-      <w:ins w:id="10601" w:author="Revision merge (HM+PL)" w:date="2026-09-09T13:15:15Z">
+      <w:ins w:id="10601" w:author="Revision merge (HM+PL)" w:date="2026-09-09T13:17:57Z">
         <w:r>
           <w:t xml:space="preserve">solicit</w:t>
         </w:r>
@@ -4419,12 +4419,12 @@
       <w:r>
         <w:t xml:space="preserve"> feedback from </w:t>
       </w:r>
-      <w:del w:id="10602" w:author="Revision merge (HM+PL)" w:date="2026-09-09T13:15:15Z">
+      <w:del w:id="10602" w:author="Revision merge (HM+PL)" w:date="2026-09-09T13:17:57Z">
         <w:r>
           <w:delText xml:space="preserve">groups</w:delText>
         </w:r>
       </w:del>
-      <w:ins w:id="10603" w:author="Revision merge (HM+PL)" w:date="2026-09-09T13:15:15Z">
+      <w:ins w:id="10603" w:author="Revision merge (HM+PL)" w:date="2026-09-09T13:17:57Z">
         <w:r>
           <w:t xml:space="preserve">researchers</w:t>
         </w:r>
@@ -4432,12 +4432,12 @@
       <w:r>
         <w:t xml:space="preserve"> </w:t>
       </w:r>
-      <w:del w:id="10604" w:author="Revision merge (HM+PL)" w:date="2026-09-09T13:15:15Z">
+      <w:del w:id="10604" w:author="Revision merge (HM+PL)" w:date="2026-09-09T13:17:57Z">
         <w:r>
           <w:delText xml:space="preserve">running</w:delText>
         </w:r>
       </w:del>
-      <w:ins w:id="10605" w:author="Revision merge (HM+PL)" w:date="2026-09-09T13:15:15Z">
+      <w:ins w:id="10605" w:author="Revision merge (HM+PL)" w:date="2026-09-09T13:17:57Z">
         <w:r>
           <w:t xml:space="preserve">conducting</w:t>
         </w:r>
@@ -4445,12 +4445,12 @@
       <w:r>
         <w:t xml:space="preserve"> comparable </w:t>
       </w:r>
-      <w:del w:id="10606" w:author="Revision merge (HM+PL)" w:date="2026-09-09T13:15:15Z">
+      <w:del w:id="10606" w:author="Revision merge (HM+PL)" w:date="2026-09-09T13:17:57Z">
         <w:r>
           <w:delText xml:space="preserve">analyses.</w:delText>
         </w:r>
       </w:del>
-      <w:ins w:id="10607" w:author="Revision merge (HM+PL)" w:date="2026-09-09T13:15:15Z">
+      <w:ins w:id="10607" w:author="Revision merge (HM+PL)" w:date="2026-09-09T13:17:57Z">
         <w:r>
           <w:t xml:space="preserve">long-read metagenomic studies and to guide future development of the workflow.</w:t>
         </w:r>
@@ -4470,12 +4470,12 @@
       <w:r>
         <w:t xml:space="preserve">**Acknowledgements.** The authors thank the **Centre for Innovation in Genomics and Microbiome Sciences (CIGMiS)**, which generated the chicken caecum metagenomics datasets used to develop and validate the pipeline. We are grateful to **colleagues** for feedback on the configuration interface and Quarto report layout, and to the School of </w:t>
       </w:r>
-      <w:del w:id="10608" w:author="Revision merge (HM+PL)" w:date="2026-09-09T13:15:15Z">
+      <w:del w:id="10608" w:author="Revision merge (HM+PL)" w:date="2026-09-09T13:17:57Z">
         <w:r>
           <w:delText xml:space="preserve">Biomedical</w:delText>
         </w:r>
       </w:del>
-      <w:ins w:id="10609" w:author="Revision merge (HM+PL)" w:date="2026-09-09T13:15:15Z">
+      <w:ins w:id="10609" w:author="Revision merge (HM+PL)" w:date="2026-09-09T13:17:57Z">
         <w:r>
           <w:t xml:space="preserve">Medicine</w:t>
         </w:r>
@@ -4483,12 +4483,12 @@
       <w:r>
         <w:t xml:space="preserve"> </w:t>
       </w:r>
-      <w:del w:id="10610" w:author="Revision merge (HM+PL)" w:date="2026-09-09T13:15:15Z">
+      <w:del w:id="10610" w:author="Revision merge (HM+PL)" w:date="2026-09-09T13:17:57Z">
         <w:r>
           <w:delText xml:space="preserve">Science</w:delText>
         </w:r>
       </w:del>
-      <w:ins w:id="10611" w:author="Revision merge (HM+PL)" w:date="2026-09-09T13:15:15Z">
+      <w:ins w:id="10611" w:author="Revision merge (HM+PL)" w:date="2026-09-09T13:17:57Z">
         <w:r>
           <w:t xml:space="preserve">and Bioscience</w:t>
         </w:r>
@@ -4517,7 +4517,7 @@
       <w:pPr>
         <w:spacing w:after="120"/>
       </w:pPr>
-      <w:ins w:id="10612" w:author="Revision merge (HM+PL)" w:date="2026-09-09T13:15:15Z">
+      <w:ins w:id="10612" w:author="Revision merge (HM+PL)" w:date="2026-09-09T13:17:57Z">
         <w:r>
           <w:t xml:space="preserve">**Data Availability.** Sequence data for the primary validation cohort (`Chicken batch 1`) are available from NCBI under BioProject PRJNA1406192. Data for the second cohort (`Chicken batch 2`) will be released upon publication of the associated study. The MERIDIAN source code, documentation and configuration examples are available at https://github.com/Julio92-C/Metagenomics_pipeline_automation (release v0.1.0).</w:t>
         </w:r>

</xml_diff>